<commit_message>
Add Orion and Denobulan species; remove Half-Vulcan
Both new species get attribute adjustments, descriptions, and two species
advantages with companion complications, in the creator and the Players'
Guide. Saved Half-Vulcan characters load as a custom species with the same
adjustments and their species advantage kept as a custom one.

Co-Authored-By: Claude Opus 5.5 <noreply@anthropic.com>
Claude-Session: https://claude.ai/code/session_015SADCFzhKijkC2foUmXrpC
</commit_message>
<xml_diff>
--- a/uss-pelion/USS_Pelion_Players_Guide.docx
+++ b/uss-pelion/USS_Pelion_Players_Guide.docx
@@ -1541,39 +1541,6 @@
                 <w:b/>
                 <w:sz w:val="19"/>
               </w:rPr>
-              <w:t xml:space="preserve">Half-Vulcan</w:t>
-            </w:r>
-          </w:p>
-        </w:tc>
-        <w:tc>
-          <w:tcPr/>
-          <w:p>
-            <w:pPr>
-              <w:pStyle w:val="Compact"/>
-              <w:jc w:val="left"/>
-            </w:pPr>
-            <w:r>
-              <w:rPr>
-                <w:sz w:val="19"/>
-              </w:rPr>
-              <w:t xml:space="preserve">Intellect +1, Presence −1</w:t>
-            </w:r>
-          </w:p>
-        </w:tc>
-      </w:tr>
-      <w:tr>
-        <w:tc>
-          <w:tcPr/>
-          <w:p>
-            <w:pPr>
-              <w:pStyle w:val="Compact"/>
-              <w:jc w:val="left"/>
-            </w:pPr>
-            <w:r>
-              <w:rPr>
-                <w:b/>
-                <w:sz w:val="19"/>
-              </w:rPr>
               <w:t xml:space="preserve">Lanthanite</w:t>
             </w:r>
           </w:p>
@@ -1656,6 +1623,72 @@
                 <w:sz w:val="19"/>
               </w:rPr>
               <w:t xml:space="preserve">Agility +1, Intellect +1, Body −2</w:t>
+            </w:r>
+          </w:p>
+        </w:tc>
+      </w:tr>
+      <w:tr>
+        <w:tc>
+          <w:tcPr/>
+          <w:p>
+            <w:pPr>
+              <w:pStyle w:val="Compact"/>
+              <w:jc w:val="left"/>
+            </w:pPr>
+            <w:r>
+              <w:rPr>
+                <w:b/>
+                <w:sz w:val="19"/>
+              </w:rPr>
+              <w:t xml:space="preserve">Orion</w:t>
+            </w:r>
+          </w:p>
+        </w:tc>
+        <w:tc>
+          <w:tcPr/>
+          <w:p>
+            <w:pPr>
+              <w:pStyle w:val="Compact"/>
+              <w:jc w:val="left"/>
+            </w:pPr>
+            <w:r>
+              <w:rPr>
+                <w:sz w:val="19"/>
+              </w:rPr>
+              <w:t xml:space="preserve">Body +1, Presence +1, Intellect −1, Will −1</w:t>
+            </w:r>
+          </w:p>
+        </w:tc>
+      </w:tr>
+      <w:tr>
+        <w:tc>
+          <w:tcPr/>
+          <w:p>
+            <w:pPr>
+              <w:pStyle w:val="Compact"/>
+              <w:jc w:val="left"/>
+            </w:pPr>
+            <w:r>
+              <w:rPr>
+                <w:b/>
+                <w:sz w:val="19"/>
+              </w:rPr>
+              <w:t xml:space="preserve">Denobulan</w:t>
+            </w:r>
+          </w:p>
+        </w:tc>
+        <w:tc>
+          <w:tcPr/>
+          <w:p>
+            <w:pPr>
+              <w:pStyle w:val="Compact"/>
+              <w:jc w:val="left"/>
+            </w:pPr>
+            <w:r>
+              <w:rPr>
+                <w:sz w:val="19"/>
+              </w:rPr>
+              <w:t xml:space="preserve">Intellect +1, Presence +1, Body −1, Agility −1</w:t>
             </w:r>
           </w:p>
         </w:tc>
@@ -1859,24 +1892,6 @@
           <w:bCs/>
           <w:b/>
         </w:rPr>
-        <w:t xml:space="preserve">Half-Vulcan.</w:t>
-      </w:r>
-      <w:r>
-        <w:t xml:space="preserve"> </w:t>
-      </w:r>
-      <w:r>
-        <w:t xml:space="preserve">Raised between two cultures, like Spock. Vulcan training and a human heritage that does not always stay quiet.</w:t>
-      </w:r>
-    </w:p>
-    <w:p>
-      <w:pPr>
-        <w:pStyle w:val="BodyText"/>
-      </w:pPr>
-      <w:r>
-        <w:rPr>
-          <w:bCs/>
-          <w:b/>
-        </w:rPr>
         <w:t xml:space="preserve">Lanthanite.</w:t>
       </w:r>
       <w:r>
@@ -1920,6 +1935,42 @@
       </w:r>
       <w:r>
         <w:t xml:space="preserve">A winged, avian people known as scholars and historians, like Aleek-Om. Capable of flight, but light-boned and physically frail.</w:t>
+      </w:r>
+    </w:p>
+    <w:p>
+      <w:pPr>
+        <w:pStyle w:val="BodyText"/>
+      </w:pPr>
+      <w:r>
+        <w:rPr>
+          <w:bCs/>
+          <w:b/>
+        </w:rPr>
+        <w:t xml:space="preserve">Orion.</w:t>
+      </w:r>
+      <w:r>
+        <w:t xml:space="preserve"> </w:t>
+      </w:r>
+      <w:r>
+        <w:t xml:space="preserve">Green-skinned people whose homeworld is better known for the Orion Syndicate’s smugglers and pirates than for Starfleet service. Orions in uniform are rare in this era and often have to prove themselves.</w:t>
+      </w:r>
+    </w:p>
+    <w:p>
+      <w:pPr>
+        <w:pStyle w:val="BodyText"/>
+      </w:pPr>
+      <w:r>
+        <w:rPr>
+          <w:bCs/>
+          <w:b/>
+        </w:rPr>
+        <w:t xml:space="preserve">Denobulan.</w:t>
+      </w:r>
+      <w:r>
+        <w:t xml:space="preserve"> </w:t>
+      </w:r>
+      <w:r>
+        <w:t xml:space="preserve">Cheerful, sociable people with large extended families. They need little sleep most of the year, then hibernate for several days. Dr. Phlox served aboard Enterprise NX-01 a century earlier.</w:t>
       </w:r>
     </w:p>
     <w:bookmarkEnd w:id="28"/>
@@ -5560,7 +5611,7 @@
       </w:tr>
     </w:tbl>
     <w:bookmarkEnd w:id="62"/>
-    <w:bookmarkStart w:id="73" w:name="species-advantages"/>
+    <w:bookmarkStart w:id="74" w:name="species-advantages"/>
     <w:p>
       <w:pPr>
         <w:pStyle w:val="Heading1"/>
@@ -6971,13 +7022,13 @@
       </w:tr>
     </w:tbl>
     <w:bookmarkEnd w:id="68"/>
-    <w:bookmarkStart w:id="69" w:name="half-vulcan"/>
+    <w:bookmarkStart w:id="69" w:name="lanthanite"/>
     <w:p>
       <w:pPr>
         <w:pStyle w:val="Heading2"/>
       </w:pPr>
       <w:r>
-        <w:t xml:space="preserve">Half-Vulcan</w:t>
+        <w:t xml:space="preserve">Lanthanite</w:t>
       </w:r>
     </w:p>
     <w:tbl>
@@ -7072,22 +7123,22 @@
                 <w:b/>
                 <w:sz w:val="19"/>
               </w:rPr>
-              <w:t xml:space="preserve">Between Two Worlds</w:t>
-            </w:r>
-          </w:p>
-        </w:tc>
-        <w:tc>
-          <w:tcPr/>
-          <w:p>
-            <w:pPr>
-              <w:pStyle w:val="Compact"/>
-              <w:jc w:val="left"/>
-            </w:pPr>
-            <w:r>
-              <w:rPr>
-                <w:sz w:val="19"/>
-              </w:rPr>
-              <w:t xml:space="preserve">+2 to Diplomacy when mediating between logic-driven and emotional parties, or bridging a misunderstanding between Vulcan and human ways.</w:t>
+              <w:t xml:space="preserve">Centuries of Experience</w:t>
+            </w:r>
+          </w:p>
+        </w:tc>
+        <w:tc>
+          <w:tcPr/>
+          <w:p>
+            <w:pPr>
+              <w:pStyle w:val="Compact"/>
+              <w:jc w:val="left"/>
+            </w:pPr>
+            <w:r>
+              <w:rPr>
+                <w:sz w:val="19"/>
+              </w:rPr>
+              <w:t xml:space="preserve">+2 to Intellect rolls to recall a historical event, old custom, or obsolete technology you could plausibly have lived through.</w:t>
             </w:r>
           </w:p>
         </w:tc>
@@ -7104,7 +7155,7 @@
                 <w:b/>
                 <w:sz w:val="19"/>
               </w:rPr>
-              <w:t xml:space="preserve">Divided Self.</w:t>
+              <w:t xml:space="preserve">Secret Age.</w:t>
             </w:r>
             <w:r>
               <w:rPr>
@@ -7116,40 +7167,40 @@
               <w:rPr>
                 <w:sz w:val="19"/>
               </w:rPr>
-              <w:t xml:space="preserve">When a situation forces a choice between logic and feeling, your inner conflict surfaces. Accept hesitation or an emotional outburst.</w:t>
-            </w:r>
-          </w:p>
-        </w:tc>
-      </w:tr>
-      <w:tr>
-        <w:tc>
-          <w:tcPr/>
-          <w:p>
-            <w:pPr>
-              <w:pStyle w:val="Compact"/>
-              <w:jc w:val="left"/>
-            </w:pPr>
-            <w:r>
-              <w:rPr>
-                <w:b/>
-                <w:sz w:val="19"/>
-              </w:rPr>
-              <w:t xml:space="preserve">Vulcan Strength</w:t>
-            </w:r>
-          </w:p>
-        </w:tc>
-        <w:tc>
-          <w:tcPr/>
-          <w:p>
-            <w:pPr>
-              <w:pStyle w:val="Compact"/>
-              <w:jc w:val="left"/>
-            </w:pPr>
-            <w:r>
-              <w:rPr>
-                <w:sz w:val="19"/>
-              </w:rPr>
-              <w:t xml:space="preserve">+2 to Body when lifting, forcing, or holding something through raw strength.</w:t>
+              <w:t xml:space="preserve">You keep your true age quiet. When your history threatens to show, accept a lie, a slip, or a revealing consequence.</w:t>
+            </w:r>
+          </w:p>
+        </w:tc>
+      </w:tr>
+      <w:tr>
+        <w:tc>
+          <w:tcPr/>
+          <w:p>
+            <w:pPr>
+              <w:pStyle w:val="Compact"/>
+              <w:jc w:val="left"/>
+            </w:pPr>
+            <w:r>
+              <w:rPr>
+                <w:b/>
+                <w:sz w:val="19"/>
+              </w:rPr>
+              <w:t xml:space="preserve">Old Hand</w:t>
+            </w:r>
+          </w:p>
+        </w:tc>
+        <w:tc>
+          <w:tcPr/>
+          <w:p>
+            <w:pPr>
+              <w:pStyle w:val="Compact"/>
+              <w:jc w:val="left"/>
+            </w:pPr>
+            <w:r>
+              <w:rPr>
+                <w:sz w:val="19"/>
+              </w:rPr>
+              <w:t xml:space="preserve">+2 to Engineering when repairing antique, obsolete, or improvised equipment. It does not apply to current Starfleet systems.</w:t>
             </w:r>
           </w:p>
         </w:tc>
@@ -7166,7 +7217,7 @@
                 <w:b/>
                 <w:sz w:val="19"/>
               </w:rPr>
-              <w:t xml:space="preserve">Neither One Nor the Other.</w:t>
+              <w:t xml:space="preserve">Rules Are Temporary.</w:t>
             </w:r>
             <w:r>
               <w:rPr>
@@ -7178,20 +7229,20 @@
               <w:rPr>
                 <w:sz w:val="19"/>
               </w:rPr>
-              <w:t xml:space="preserve">Members of either culture doubt where you belong. Accept a slight, exclusion, or challenge to your judgment that matters.</w:t>
+              <w:t xml:space="preserve">After millennia, regulations seem fleeting. You skip a procedure and accept the consequences when it matters.</w:t>
             </w:r>
           </w:p>
         </w:tc>
       </w:tr>
     </w:tbl>
     <w:bookmarkEnd w:id="69"/>
-    <w:bookmarkStart w:id="70" w:name="lanthanite"/>
+    <w:bookmarkStart w:id="70" w:name="caitian"/>
     <w:p>
       <w:pPr>
         <w:pStyle w:val="Heading2"/>
       </w:pPr>
       <w:r>
-        <w:t xml:space="preserve">Lanthanite</w:t>
+        <w:t xml:space="preserve">Caitian</w:t>
       </w:r>
     </w:p>
     <w:tbl>
@@ -7286,22 +7337,22 @@
                 <w:b/>
                 <w:sz w:val="19"/>
               </w:rPr>
-              <w:t xml:space="preserve">Centuries of Experience</w:t>
-            </w:r>
-          </w:p>
-        </w:tc>
-        <w:tc>
-          <w:tcPr/>
-          <w:p>
-            <w:pPr>
-              <w:pStyle w:val="Compact"/>
-              <w:jc w:val="left"/>
-            </w:pPr>
-            <w:r>
-              <w:rPr>
-                <w:sz w:val="19"/>
-              </w:rPr>
-              <w:t xml:space="preserve">+2 to Intellect rolls to recall a historical event, old custom, or obsolete technology you could plausibly have lived through.</w:t>
+              <w:t xml:space="preserve">Feline Reflexes</w:t>
+            </w:r>
+          </w:p>
+        </w:tc>
+        <w:tc>
+          <w:tcPr/>
+          <w:p>
+            <w:pPr>
+              <w:pStyle w:val="Compact"/>
+              <w:jc w:val="left"/>
+            </w:pPr>
+            <w:r>
+              <w:rPr>
+                <w:sz w:val="19"/>
+              </w:rPr>
+              <w:t xml:space="preserve">+2 to Athletics when jumping, climbing, or landing safely from a fall.</w:t>
             </w:r>
           </w:p>
         </w:tc>
@@ -7318,7 +7369,7 @@
                 <w:b/>
                 <w:sz w:val="19"/>
               </w:rPr>
-              <w:t xml:space="preserve">Secret Age.</w:t>
+              <w:t xml:space="preserve">Chase Instinct.</w:t>
             </w:r>
             <w:r>
               <w:rPr>
@@ -7330,40 +7381,40 @@
               <w:rPr>
                 <w:sz w:val="19"/>
               </w:rPr>
-              <w:t xml:space="preserve">You keep your true age quiet. When your history threatens to show, accept a lie, a slip, or a revealing consequence.</w:t>
-            </w:r>
-          </w:p>
-        </w:tc>
-      </w:tr>
-      <w:tr>
-        <w:tc>
-          <w:tcPr/>
-          <w:p>
-            <w:pPr>
-              <w:pStyle w:val="Compact"/>
-              <w:jc w:val="left"/>
-            </w:pPr>
-            <w:r>
-              <w:rPr>
-                <w:b/>
-                <w:sz w:val="19"/>
-              </w:rPr>
-              <w:t xml:space="preserve">Old Hand</w:t>
-            </w:r>
-          </w:p>
-        </w:tc>
-        <w:tc>
-          <w:tcPr/>
-          <w:p>
-            <w:pPr>
-              <w:pStyle w:val="Compact"/>
-              <w:jc w:val="left"/>
-            </w:pPr>
-            <w:r>
-              <w:rPr>
-                <w:sz w:val="19"/>
-              </w:rPr>
-              <w:t xml:space="preserve">+2 to Engineering when repairing antique, obsolete, or improvised equipment. It does not apply to current Starfleet systems.</w:t>
+              <w:t xml:space="preserve">Sudden movement or a fleeing creature triggers a pursuit reflex. Accept a momentary distraction or a rash move.</w:t>
+            </w:r>
+          </w:p>
+        </w:tc>
+      </w:tr>
+      <w:tr>
+        <w:tc>
+          <w:tcPr/>
+          <w:p>
+            <w:pPr>
+              <w:pStyle w:val="Compact"/>
+              <w:jc w:val="left"/>
+            </w:pPr>
+            <w:r>
+              <w:rPr>
+                <w:b/>
+                <w:sz w:val="19"/>
+              </w:rPr>
+              <w:t xml:space="preserve">Keen Hearing</w:t>
+            </w:r>
+          </w:p>
+        </w:tc>
+        <w:tc>
+          <w:tcPr/>
+          <w:p>
+            <w:pPr>
+              <w:pStyle w:val="Compact"/>
+              <w:jc w:val="left"/>
+            </w:pPr>
+            <w:r>
+              <w:rPr>
+                <w:sz w:val="19"/>
+              </w:rPr>
+              <w:t xml:space="preserve">+2 to Intellect rolls to hear faint or distant sounds.</w:t>
             </w:r>
           </w:p>
         </w:tc>
@@ -7380,7 +7431,7 @@
                 <w:b/>
                 <w:sz w:val="19"/>
               </w:rPr>
-              <w:t xml:space="preserve">Rules Are Temporary.</w:t>
+              <w:t xml:space="preserve">Sensitive Ears.</w:t>
             </w:r>
             <w:r>
               <w:rPr>
@@ -7392,20 +7443,20 @@
               <w:rPr>
                 <w:sz w:val="19"/>
               </w:rPr>
-              <w:t xml:space="preserve">After millennia, regulations seem fleeting. You skip a procedure and accept the consequences when it matters.</w:t>
+              <w:t xml:space="preserve">Loud noise disorients you. When an alarm, explosion, or sonic weapon goes off nearby, accept −2 on your next action.</w:t>
             </w:r>
           </w:p>
         </w:tc>
       </w:tr>
     </w:tbl>
     <w:bookmarkEnd w:id="70"/>
-    <w:bookmarkStart w:id="71" w:name="caitian"/>
+    <w:bookmarkStart w:id="71" w:name="aurelian"/>
     <w:p>
       <w:pPr>
         <w:pStyle w:val="Heading2"/>
       </w:pPr>
       <w:r>
-        <w:t xml:space="preserve">Caitian</w:t>
+        <w:t xml:space="preserve">Aurelian</w:t>
       </w:r>
     </w:p>
     <w:tbl>
@@ -7500,22 +7551,22 @@
                 <w:b/>
                 <w:sz w:val="19"/>
               </w:rPr>
-              <w:t xml:space="preserve">Feline Reflexes</w:t>
-            </w:r>
-          </w:p>
-        </w:tc>
-        <w:tc>
-          <w:tcPr/>
-          <w:p>
-            <w:pPr>
-              <w:pStyle w:val="Compact"/>
-              <w:jc w:val="left"/>
-            </w:pPr>
-            <w:r>
-              <w:rPr>
-                <w:sz w:val="19"/>
-              </w:rPr>
-              <w:t xml:space="preserve">+2 to Athletics when jumping, climbing, or landing safely from a fall.</w:t>
+              <w:t xml:space="preserve">Flight</w:t>
+            </w:r>
+          </w:p>
+        </w:tc>
+        <w:tc>
+          <w:tcPr/>
+          <w:p>
+            <w:pPr>
+              <w:pStyle w:val="Compact"/>
+              <w:jc w:val="left"/>
+            </w:pPr>
+            <w:r>
+              <w:rPr>
+                <w:sz w:val="19"/>
+              </w:rPr>
+              <w:t xml:space="preserve">You can fly short distances in normal gravity and breathable air. Roll Athletics for difficult flying. It does not work in low pressure, high gravity, or cramped spaces.</w:t>
             </w:r>
           </w:p>
         </w:tc>
@@ -7532,7 +7583,7 @@
                 <w:b/>
                 <w:sz w:val="19"/>
               </w:rPr>
-              <w:t xml:space="preserve">Chase Instinct.</w:t>
+              <w:t xml:space="preserve">Fragile Bones.</w:t>
             </w:r>
             <w:r>
               <w:rPr>
@@ -7544,40 +7595,40 @@
               <w:rPr>
                 <w:sz w:val="19"/>
               </w:rPr>
-              <w:t xml:space="preserve">Sudden movement or a fleeing creature triggers a pursuit reflex. Accept a momentary distraction or a rash move.</w:t>
-            </w:r>
-          </w:p>
-        </w:tc>
-      </w:tr>
-      <w:tr>
-        <w:tc>
-          <w:tcPr/>
-          <w:p>
-            <w:pPr>
-              <w:pStyle w:val="Compact"/>
-              <w:jc w:val="left"/>
-            </w:pPr>
-            <w:r>
-              <w:rPr>
-                <w:b/>
-                <w:sz w:val="19"/>
-              </w:rPr>
-              <w:t xml:space="preserve">Keen Hearing</w:t>
-            </w:r>
-          </w:p>
-        </w:tc>
-        <w:tc>
-          <w:tcPr/>
-          <w:p>
-            <w:pPr>
-              <w:pStyle w:val="Compact"/>
-              <w:jc w:val="left"/>
-            </w:pPr>
-            <w:r>
-              <w:rPr>
-                <w:sz w:val="19"/>
-              </w:rPr>
-              <w:t xml:space="preserve">+2 to Intellect rolls to hear faint or distant sounds.</w:t>
+              <w:t xml:space="preserve">Your light bones break easily. When a fall, crush, or heavy blow hits you, accept the GM marking one extra injury box.</w:t>
+            </w:r>
+          </w:p>
+        </w:tc>
+      </w:tr>
+      <w:tr>
+        <w:tc>
+          <w:tcPr/>
+          <w:p>
+            <w:pPr>
+              <w:pStyle w:val="Compact"/>
+              <w:jc w:val="left"/>
+            </w:pPr>
+            <w:r>
+              <w:rPr>
+                <w:b/>
+                <w:sz w:val="19"/>
+              </w:rPr>
+              <w:t xml:space="preserve">Scholar’s Memory</w:t>
+            </w:r>
+          </w:p>
+        </w:tc>
+        <w:tc>
+          <w:tcPr/>
+          <w:p>
+            <w:pPr>
+              <w:pStyle w:val="Compact"/>
+              <w:jc w:val="left"/>
+            </w:pPr>
+            <w:r>
+              <w:rPr>
+                <w:sz w:val="19"/>
+              </w:rPr>
+              <w:t xml:space="preserve">+2 to Intellect rolls to recall the history, legends, or cultural records of another world.</w:t>
             </w:r>
           </w:p>
         </w:tc>
@@ -7594,7 +7645,7 @@
                 <w:b/>
                 <w:sz w:val="19"/>
               </w:rPr>
-              <w:t xml:space="preserve">Sensitive Ears.</w:t>
+              <w:t xml:space="preserve">Lost in History.</w:t>
             </w:r>
             <w:r>
               <w:rPr>
@@ -7606,20 +7657,20 @@
               <w:rPr>
                 <w:sz w:val="19"/>
               </w:rPr>
-              <w:t xml:space="preserve">Loud noise disorients you. When an alarm, explosion, or sonic weapon goes off nearby, accept −2 on your next action.</w:t>
+              <w:t xml:space="preserve">A historical find tempts you to stop and study it. Accept the lost time or the danger of lingering.</w:t>
             </w:r>
           </w:p>
         </w:tc>
       </w:tr>
     </w:tbl>
     <w:bookmarkEnd w:id="71"/>
-    <w:bookmarkStart w:id="72" w:name="aurelian"/>
+    <w:bookmarkStart w:id="72" w:name="orion"/>
     <w:p>
       <w:pPr>
         <w:pStyle w:val="Heading2"/>
       </w:pPr>
       <w:r>
-        <w:t xml:space="preserve">Aurelian</w:t>
+        <w:t xml:space="preserve">Orion</w:t>
       </w:r>
     </w:p>
     <w:tbl>
@@ -7714,22 +7765,22 @@
                 <w:b/>
                 <w:sz w:val="19"/>
               </w:rPr>
-              <w:t xml:space="preserve">Flight</w:t>
-            </w:r>
-          </w:p>
-        </w:tc>
-        <w:tc>
-          <w:tcPr/>
-          <w:p>
-            <w:pPr>
-              <w:pStyle w:val="Compact"/>
-              <w:jc w:val="left"/>
-            </w:pPr>
-            <w:r>
-              <w:rPr>
-                <w:sz w:val="19"/>
-              </w:rPr>
-              <w:t xml:space="preserve">You can fly short distances in normal gravity and breathable air. Roll Athletics for difficult flying. It does not work in low pressure, high gravity, or cramped spaces.</w:t>
+              <w:t xml:space="preserve">Orion Pheromones</w:t>
+            </w:r>
+          </w:p>
+        </w:tc>
+        <w:tc>
+          <w:tcPr/>
+          <w:p>
+            <w:pPr>
+              <w:pStyle w:val="Compact"/>
+              <w:jc w:val="left"/>
+            </w:pPr>
+            <w:r>
+              <w:rPr>
+                <w:sz w:val="19"/>
+              </w:rPr>
+              <w:t xml:space="preserve">+2 to Diplomacy when persuading someone face to face in close quarters, if their species is affected by Orion pheromones. Many species, including Vulcans, are not.</w:t>
             </w:r>
           </w:p>
         </w:tc>
@@ -7746,7 +7797,7 @@
                 <w:b/>
                 <w:sz w:val="19"/>
               </w:rPr>
-              <w:t xml:space="preserve">Fragile Bones.</w:t>
+              <w:t xml:space="preserve">Pheromone Suspicion.</w:t>
             </w:r>
             <w:r>
               <w:rPr>
@@ -7758,40 +7809,40 @@
               <w:rPr>
                 <w:sz w:val="19"/>
               </w:rPr>
-              <w:t xml:space="preserve">Your light bones break easily. When a fall, crush, or heavy blow hits you, accept the GM marking one extra injury box.</w:t>
-            </w:r>
-          </w:p>
-        </w:tc>
-      </w:tr>
-      <w:tr>
-        <w:tc>
-          <w:tcPr/>
-          <w:p>
-            <w:pPr>
-              <w:pStyle w:val="Compact"/>
-              <w:jc w:val="left"/>
-            </w:pPr>
-            <w:r>
-              <w:rPr>
-                <w:b/>
-                <w:sz w:val="19"/>
-              </w:rPr>
-              <w:t xml:space="preserve">Scholar’s Memory</w:t>
-            </w:r>
-          </w:p>
-        </w:tc>
-        <w:tc>
-          <w:tcPr/>
-          <w:p>
-            <w:pPr>
-              <w:pStyle w:val="Compact"/>
-              <w:jc w:val="left"/>
-            </w:pPr>
-            <w:r>
-              <w:rPr>
-                <w:sz w:val="19"/>
-              </w:rPr>
-              <w:t xml:space="preserve">+2 to Intellect rolls to recall the history, legends, or cultural records of another world.</w:t>
+              <w:t xml:space="preserve">Crewmates who know about Orion pheromones question whether they were persuaded or manipulated. Accept the distrust or a formal complaint when it matters.</w:t>
+            </w:r>
+          </w:p>
+        </w:tc>
+      </w:tr>
+      <w:tr>
+        <w:tc>
+          <w:tcPr/>
+          <w:p>
+            <w:pPr>
+              <w:pStyle w:val="Compact"/>
+              <w:jc w:val="left"/>
+            </w:pPr>
+            <w:r>
+              <w:rPr>
+                <w:b/>
+                <w:sz w:val="19"/>
+              </w:rPr>
+              <w:t xml:space="preserve">Syndicate Savvy</w:t>
+            </w:r>
+          </w:p>
+        </w:tc>
+        <w:tc>
+          <w:tcPr/>
+          <w:p>
+            <w:pPr>
+              <w:pStyle w:val="Compact"/>
+              <w:jc w:val="left"/>
+            </w:pPr>
+            <w:r>
+              <w:rPr>
+                <w:sz w:val="19"/>
+              </w:rPr>
+              <w:t xml:space="preserve">+2 to Psychology when spotting a con, a bribe, a smuggler’s trick, or a pirate’s bluff.</w:t>
             </w:r>
           </w:p>
         </w:tc>
@@ -7808,7 +7859,7 @@
                 <w:b/>
                 <w:sz w:val="19"/>
               </w:rPr>
-              <w:t xml:space="preserve">Lost in History.</w:t>
+              <w:t xml:space="preserve">Syndicate Ties.</w:t>
             </w:r>
             <w:r>
               <w:rPr>
@@ -7820,15 +7871,229 @@
               <w:rPr>
                 <w:sz w:val="19"/>
               </w:rPr>
-              <w:t xml:space="preserve">A historical find tempts you to stop and study it. Accept the lost time or the danger of lingering.</w:t>
+              <w:t xml:space="preserve">Someone from the Orion Syndicate knows you and wants something. Accept the obligation, the threat, or the suspicion that follows.</w:t>
             </w:r>
           </w:p>
         </w:tc>
       </w:tr>
     </w:tbl>
     <w:bookmarkEnd w:id="72"/>
+    <w:bookmarkStart w:id="73" w:name="denobulan"/>
+    <w:p>
+      <w:pPr>
+        <w:pStyle w:val="Heading2"/>
+      </w:pPr>
+      <w:r>
+        <w:t xml:space="preserve">Denobulan</w:t>
+      </w:r>
+    </w:p>
+    <w:tbl>
+      <w:tblPr>
+        <w:tblStyle w:val="Table"/>
+        <w:tblW w:type="pct" w:w="5000"/>
+        <w:tblLook w:firstRow="1" w:lastRow="0" w:firstColumn="0" w:lastColumn="0" w:noHBand="0" w:noVBand="0" w:val="0020"/>
+        <w:jc w:val="start"/>
+        <w:tblBorders>
+          <w:top w:val="single" w:sz="4" w:color="B8C2D3"/>
+          <w:left w:val="single" w:sz="4" w:color="B8C2D3"/>
+          <w:bottom w:val="single" w:sz="4" w:color="B8C2D3"/>
+          <w:right w:val="single" w:sz="4" w:color="B8C2D3"/>
+          <w:insideH w:val="single" w:sz="4" w:color="B8C2D3"/>
+          <w:insideV w:val="single" w:sz="4" w:color="B8C2D3"/>
+        </w:tblBorders>
+      </w:tblPr>
+      <w:tblGrid>
+        <w:gridCol w:w="2640"/>
+        <w:gridCol w:w="2640"/>
+        <w:gridCol w:w="2640"/>
+      </w:tblGrid>
+      <w:tr>
+        <w:trPr>
+          <w:tblHeader w:val="true"/>
+        </w:trPr>
+        <w:tc>
+          <w:tcPr>
+            <w:shd w:val="clear" w:fill="E9EEF6"/>
+          </w:tcPr>
+          <w:p>
+            <w:pPr>
+              <w:pStyle w:val="Compact"/>
+              <w:jc w:val="left"/>
+            </w:pPr>
+            <w:r>
+              <w:rPr>
+                <w:b/>
+                <w:sz w:val="19"/>
+              </w:rPr>
+              <w:t xml:space="preserve">Advantage</w:t>
+            </w:r>
+          </w:p>
+        </w:tc>
+        <w:tc>
+          <w:tcPr>
+            <w:shd w:val="clear" w:fill="E9EEF6"/>
+          </w:tcPr>
+          <w:p>
+            <w:pPr>
+              <w:pStyle w:val="Compact"/>
+              <w:jc w:val="left"/>
+            </w:pPr>
+            <w:r>
+              <w:rPr>
+                <w:b/>
+                <w:sz w:val="19"/>
+              </w:rPr>
+              <w:t xml:space="preserve">Effect</w:t>
+            </w:r>
+          </w:p>
+        </w:tc>
+        <w:tc>
+          <w:tcPr>
+            <w:shd w:val="clear" w:fill="E9EEF6"/>
+          </w:tcPr>
+          <w:p>
+            <w:pPr>
+              <w:pStyle w:val="Compact"/>
+              <w:jc w:val="left"/>
+            </w:pPr>
+            <w:r>
+              <w:rPr>
+                <w:b/>
+                <w:sz w:val="19"/>
+              </w:rPr>
+              <w:t xml:space="preserve">Companion complication</w:t>
+            </w:r>
+          </w:p>
+        </w:tc>
+      </w:tr>
+      <w:tr>
+        <w:tc>
+          <w:tcPr/>
+          <w:p>
+            <w:pPr>
+              <w:pStyle w:val="Compact"/>
+              <w:jc w:val="left"/>
+            </w:pPr>
+            <w:r>
+              <w:rPr>
+                <w:b/>
+                <w:sz w:val="19"/>
+              </w:rPr>
+              <w:t xml:space="preserve">Denobulan Pharmacopoeia</w:t>
+            </w:r>
+          </w:p>
+        </w:tc>
+        <w:tc>
+          <w:tcPr/>
+          <w:p>
+            <w:pPr>
+              <w:pStyle w:val="Compact"/>
+              <w:jc w:val="left"/>
+            </w:pPr>
+            <w:r>
+              <w:rPr>
+                <w:sz w:val="19"/>
+              </w:rPr>
+              <w:t xml:space="preserve">+2 to Medicine when treating a patient with an unconventional remedy, including medicinal organisms kept in sickbay.</w:t>
+            </w:r>
+          </w:p>
+        </w:tc>
+        <w:tc>
+          <w:tcPr/>
+          <w:p>
+            <w:pPr>
+              <w:pStyle w:val="Compact"/>
+              <w:jc w:val="left"/>
+            </w:pPr>
+            <w:r>
+              <w:rPr>
+                <w:bCs/>
+                <w:b/>
+                <w:sz w:val="19"/>
+              </w:rPr>
+              <w:t xml:space="preserve">Unorthodox Methods.</w:t>
+            </w:r>
+            <w:r>
+              <w:rPr>
+                <w:sz w:val="19"/>
+              </w:rPr>
+              <w:t xml:space="preserve"> </w:t>
+            </w:r>
+            <w:r>
+              <w:rPr>
+                <w:sz w:val="19"/>
+              </w:rPr>
+              <w:t xml:space="preserve">Patients and crewmates balk at your strange remedies. Accept a refusal, a delay, or a complaint to the captain.</w:t>
+            </w:r>
+          </w:p>
+        </w:tc>
+      </w:tr>
+      <w:tr>
+        <w:tc>
+          <w:tcPr/>
+          <w:p>
+            <w:pPr>
+              <w:pStyle w:val="Compact"/>
+              <w:jc w:val="left"/>
+            </w:pPr>
+            <w:r>
+              <w:rPr>
+                <w:b/>
+                <w:sz w:val="19"/>
+              </w:rPr>
+              <w:t xml:space="preserve">Wakeful</w:t>
+            </w:r>
+          </w:p>
+        </w:tc>
+        <w:tc>
+          <w:tcPr/>
+          <w:p>
+            <w:pPr>
+              <w:pStyle w:val="Compact"/>
+              <w:jc w:val="left"/>
+            </w:pPr>
+            <w:r>
+              <w:rPr>
+                <w:sz w:val="19"/>
+              </w:rPr>
+              <w:t xml:space="preserve">+2 to Body when resisting fatigue or going without sleep for days.</w:t>
+            </w:r>
+          </w:p>
+        </w:tc>
+        <w:tc>
+          <w:tcPr/>
+          <w:p>
+            <w:pPr>
+              <w:pStyle w:val="Compact"/>
+              <w:jc w:val="left"/>
+            </w:pPr>
+            <w:r>
+              <w:rPr>
+                <w:bCs/>
+                <w:b/>
+                <w:sz w:val="19"/>
+              </w:rPr>
+              <w:t xml:space="preserve">Hibernation Cycle.</w:t>
+            </w:r>
+            <w:r>
+              <w:rPr>
+                <w:sz w:val="19"/>
+              </w:rPr>
+              <w:t xml:space="preserve"> </w:t>
+            </w:r>
+            <w:r>
+              <w:rPr>
+                <w:sz w:val="19"/>
+              </w:rPr>
+              <w:t xml:space="preserve">Once a year you must hibernate for several days. When the cycle comes due at a bad moment, accept your absence or −2 on Intellect rolls until you rest.</w:t>
+            </w:r>
+          </w:p>
+        </w:tc>
+      </w:tr>
+    </w:tbl>
     <w:bookmarkEnd w:id="73"/>
-    <w:bookmarkStart w:id="75" w:name="complications"/>
+    <w:bookmarkEnd w:id="74"/>
+    <w:bookmarkStart w:id="76" w:name="complications"/>
     <w:p>
       <w:pPr>
         <w:pStyle w:val="Heading1"/>
@@ -8434,7 +8699,7 @@
         </w:tc>
       </w:tr>
     </w:tbl>
-    <w:bookmarkStart w:id="74" w:name="using-and-revising-traits"/>
+    <w:bookmarkStart w:id="75" w:name="using-and-revising-traits"/>
     <w:p>
       <w:pPr>
         <w:pStyle w:val="Heading2"/>
@@ -8451,9 +8716,9 @@
         <w:t xml:space="preserve">General advantages and complications describe individual crew members and can suit any species when appropriate. A Vulcan might choose Mental Discipline as a general advantage; species advantages are the only traits tied to a species. At a mission milestone, revise a trait when events change the character. Custom advantages follow the same narrow +2 benefit; custom complications need a clear trigger and a meaningful, accepted consequence.</w:t>
       </w:r>
     </w:p>
-    <w:bookmarkEnd w:id="74"/>
     <w:bookmarkEnd w:id="75"/>
-    <w:bookmarkStart w:id="79" w:name="quick-reference"/>
+    <w:bookmarkEnd w:id="76"/>
+    <w:bookmarkStart w:id="80" w:name="quick-reference"/>
     <w:p>
       <w:pPr>
         <w:pStyle w:val="Heading1"/>
@@ -8462,7 +8727,7 @@
         <w:t xml:space="preserve">Quick reference</w:t>
       </w:r>
     </w:p>
-    <w:bookmarkStart w:id="76" w:name="will-and-mental-resistance"/>
+    <w:bookmarkStart w:id="77" w:name="will-and-mental-resistance"/>
     <w:p>
       <w:pPr>
         <w:pStyle w:val="Heading2"/>
@@ -8495,8 +8760,8 @@
         <w:t xml:space="preserve">Will protects your resolve; Presence influences others. Leadership and Diplomacy still use Presence. Species adjustments may change your starting Will, but mental advantages apply only to their agreed, narrow circumstances.</w:t>
       </w:r>
     </w:p>
-    <w:bookmarkEnd w:id="76"/>
-    <w:bookmarkStart w:id="77" w:name="at-the-table"/>
+    <w:bookmarkEnd w:id="77"/>
+    <w:bookmarkStart w:id="78" w:name="at-the-table"/>
     <w:p>
       <w:pPr>
         <w:pStyle w:val="Heading2"/>
@@ -8565,8 +8830,8 @@
         <w:t xml:space="preserve">Apply the result and describe what changes.</w:t>
       </w:r>
     </w:p>
-    <w:bookmarkEnd w:id="77"/>
-    <w:bookmarkStart w:id="78" w:name="summary"/>
+    <w:bookmarkEnd w:id="78"/>
+    <w:bookmarkStart w:id="79" w:name="summary"/>
     <w:p>
       <w:pPr>
         <w:pStyle w:val="Heading2"/>
@@ -8719,8 +8984,8 @@
         <w:t xml:space="preserve">start each session with two. Spend one to reroll, reduce an injury by one box, or establish a plausible preparation. Earn one when an accepted complication, including a companion complication, creates a meaningful problem.</w:t>
       </w:r>
     </w:p>
-    <w:bookmarkEnd w:id="78"/>
     <w:bookmarkEnd w:id="79"/>
+    <w:bookmarkEnd w:id="80"/>
     <w:sectPr/>
   </w:body>
 </w:document>

</xml_diff>

<commit_message>
Make kill-setting hits deadly: three boxes and Dying
A phaser or disruptor on kill now marks three boxes and leaves the target
Dying: dead at the end of the scene unless stabilized. At three boxes,
another hit from a two-box or killing weapon is fatal. A Duty point still
reduces a kill shot to two boxes. The guide gains a Dying and death
section, and the creator's Condition panel a Dying toggle.

Co-Authored-By: Claude Opus 5.5 <noreply@anthropic.com>
Claude-Session: https://claude.ai/code/session_015SADCFzhKijkC2foUmXrpC
</commit_message>
<xml_diff>
--- a/uss-pelion/USS_Pelion_Players_Guide.docx
+++ b/uss-pelion/USS_Pelion_Players_Guide.docx
@@ -3691,7 +3691,7 @@
     </w:p>
     <w:bookmarkEnd w:id="43"/>
     <w:bookmarkEnd w:id="44"/>
-    <w:bookmarkStart w:id="50" w:name="personal-combat"/>
+    <w:bookmarkStart w:id="51" w:name="personal-combat"/>
     <w:p>
       <w:pPr>
         <w:pStyle w:val="Heading1"/>
@@ -3744,7 +3744,7 @@
       </w:r>
     </w:p>
     <w:bookmarkEnd w:id="46"/>
-    <w:bookmarkStart w:id="47" w:name="injury"/>
+    <w:bookmarkStart w:id="48" w:name="injury"/>
     <w:p>
       <w:pPr>
         <w:pStyle w:val="Heading2"/>
@@ -4030,11 +4030,116 @@
         <w:pStyle w:val="BodyText"/>
       </w:pPr>
       <w:r>
-        <w:t xml:space="preserve">A normal damaging hit marks one box. A powerful attack can mark two. Injury penalties replace each other rather than stacking. They apply to movement, attacks, Dodge, and other tasks the injury physically hinders. The GM announces especially lethal hazards before resolution where possible. Disintegration and comparable hazards can bypass the track; further injury at three boxes may be fatal.</w:t>
+        <w:t xml:space="preserve">A normal damaging hit marks one box. A powerful attack can mark two, and a killing weapon marks three (see Weapons and damage). Injury penalties replace each other rather than stacking. They apply to movement, attacks, Dodge, and other tasks the injury physically hinders. The GM announces especially lethal hazards before resolution where possible.</w:t>
+      </w:r>
+    </w:p>
+    <w:bookmarkStart w:id="47" w:name="dying-and-death"/>
+    <w:p>
+      <w:pPr>
+        <w:pStyle w:val="Heading3"/>
+      </w:pPr>
+      <w:r>
+        <w:t xml:space="preserve">Dying and death</w:t>
+      </w:r>
+    </w:p>
+    <w:p>
+      <w:pPr>
+        <w:pStyle w:val="FirstParagraph"/>
+      </w:pPr>
+      <w:r>
+        <w:t xml:space="preserve">Two boxes hurt; they don’t kill. Death comes from three things:</w:t>
+      </w:r>
+    </w:p>
+    <w:p>
+      <w:pPr>
+        <w:numPr>
+          <w:ilvl w:val="0"/>
+          <w:numId w:val="1005"/>
+        </w:numPr>
+        <w:pStyle w:val="Compact"/>
+      </w:pPr>
+      <w:r>
+        <w:rPr>
+          <w:bCs/>
+          <w:b/>
+        </w:rPr>
+        <w:t xml:space="preserve">Dying.</w:t>
+      </w:r>
+      <w:r>
+        <w:t xml:space="preserve"> </w:t>
+      </w:r>
+      <w:r>
+        <w:t xml:space="preserve">A hit from a killing weapon (a phaser or disruptor on kill) that takes you to three boxes leaves you Incapacitated and</w:t>
+      </w:r>
+      <w:r>
+        <w:t xml:space="preserve"> </w:t>
+      </w:r>
+      <w:r>
+        <w:rPr>
+          <w:bCs/>
+          <w:b/>
+        </w:rPr>
+        <w:t xml:space="preserve">Dying</w:t>
+      </w:r>
+      <w:r>
+        <w:t xml:space="preserve">. A Dying character dies at the end of the scene unless someone stabilizes them: one action and a successful Medicine roll with a medical kit. Once stabilized, you are still Incapacitated but no longer Dying.</w:t>
+      </w:r>
+    </w:p>
+    <w:p>
+      <w:pPr>
+        <w:numPr>
+          <w:ilvl w:val="0"/>
+          <w:numId w:val="1005"/>
+        </w:numPr>
+        <w:pStyle w:val="Compact"/>
+      </w:pPr>
+      <w:r>
+        <w:rPr>
+          <w:bCs/>
+          <w:b/>
+        </w:rPr>
+        <w:t xml:space="preserve">A further lethal hit.</w:t>
+      </w:r>
+      <w:r>
+        <w:t xml:space="preserve"> </w:t>
+      </w:r>
+      <w:r>
+        <w:t xml:space="preserve">While you are at three boxes, any hit from a weapon that marks two or more boxes (a heavy blade, a phaser or disruptor on kill, an explosion’s centre) kills you. Fists, clubs and knives just keep you down.</w:t>
+      </w:r>
+    </w:p>
+    <w:p>
+      <w:pPr>
+        <w:numPr>
+          <w:ilvl w:val="0"/>
+          <w:numId w:val="1005"/>
+        </w:numPr>
+        <w:pStyle w:val="Compact"/>
+      </w:pPr>
+      <w:r>
+        <w:rPr>
+          <w:bCs/>
+          <w:b/>
+        </w:rPr>
+        <w:t xml:space="preserve">Disintegration</w:t>
+      </w:r>
+      <w:r>
+        <w:t xml:space="preserve"> </w:t>
+      </w:r>
+      <w:r>
+        <w:t xml:space="preserve">and comparable hazards bypass the track entirely.</w:t>
+      </w:r>
+    </w:p>
+    <w:p>
+      <w:pPr>
+        <w:pStyle w:val="FirstParagraph"/>
+      </w:pPr>
+      <w:r>
+        <w:t xml:space="preserve">Your protection is avoiding the hit: Dodge, cover, and a Duty point, which reduces a kill shot from three boxes to two, leaving you Seriously wounded but on your feet.</w:t>
       </w:r>
     </w:p>
     <w:bookmarkEnd w:id="47"/>
-    <w:bookmarkStart w:id="48" w:name="weapons-and-damage"/>
+    <w:bookmarkEnd w:id="48"/>
+    <w:bookmarkStart w:id="49" w:name="weapons-and-damage"/>
     <w:p>
       <w:pPr>
         <w:pStyle w:val="Heading2"/>
@@ -4061,7 +4166,7 @@
         <w:t xml:space="preserve">weapon</w:t>
       </w:r>
       <w:r>
-        <w:t xml:space="preserve">, not on how well the attack roll succeeded. Apply it only after the hit survives any Dodge. This list sorts common weapons into the one-box and two-box categories above; the GM places anything else by comparison.</w:t>
+        <w:t xml:space="preserve">, not on how well the attack roll succeeded. Apply it only after the hit survives any Dodge. This list sorts common weapons into one-box, two-box and killing (three-box) categories; the GM places anything else by comparison.</w:t>
       </w:r>
     </w:p>
     <w:tbl>
@@ -4444,22 +4549,22 @@
                 <w:b/>
                 <w:sz w:val="19"/>
               </w:rPr>
-              <w:t xml:space="preserve">Phaser on a lethal setting</w:t>
-            </w:r>
-          </w:p>
-        </w:tc>
-        <w:tc>
-          <w:tcPr/>
-          <w:p>
-            <w:pPr>
-              <w:pStyle w:val="Compact"/>
-              <w:jc w:val="left"/>
-            </w:pPr>
-            <w:r>
-              <w:rPr>
-                <w:sz w:val="19"/>
-              </w:rPr>
-              <w:t xml:space="preserve">2</w:t>
+              <w:t xml:space="preserve">Phaser on kill</w:t>
+            </w:r>
+          </w:p>
+        </w:tc>
+        <w:tc>
+          <w:tcPr/>
+          <w:p>
+            <w:pPr>
+              <w:pStyle w:val="Compact"/>
+              <w:jc w:val="left"/>
+            </w:pPr>
+            <w:r>
+              <w:rPr>
+                <w:sz w:val="19"/>
+              </w:rPr>
+              <w:t xml:space="preserve">3, and Dying</w:t>
             </w:r>
           </w:p>
         </w:tc>
@@ -4507,7 +4612,7 @@
               <w:rPr>
                 <w:sz w:val="19"/>
               </w:rPr>
-              <w:t xml:space="preserve">2</w:t>
+              <w:t xml:space="preserve">3, and Dying</w:t>
             </w:r>
           </w:p>
         </w:tc>
@@ -4555,7 +4660,7 @@
               <w:rPr>
                 <w:sz w:val="19"/>
               </w:rPr>
-              <w:t xml:space="preserve">2, or disintegration if the GM rules it</w:t>
+              <w:t xml:space="preserve">3 and Dying, or disintegration if the GM rules it</w:t>
             </w:r>
           </w:p>
         </w:tc>
@@ -4687,7 +4792,7 @@
         <w:t xml:space="preserve"> </w:t>
       </w:r>
       <w:r>
-        <w:t xml:space="preserve">a Klingon’s punch leaves Ensign Reyes Wounded (−1). On the next round a d’k tahg slash marks a second box: Seriously wounded (−2). Had that second hit been a disruptor shot, it would have marked two boxes and taken Reyes to three: Incapacitated. Spending a Duty point when the disruptor hits would reduce it to one box, leaving Reyes Seriously wounded but still standing.</w:t>
+        <w:t xml:space="preserve">a Klingon’s punch leaves Ensign Reyes Wounded (−1). On the next round a d’k tahg slash marks a second box: Seriously wounded (−2). A disruptor shot instead, on an unhurt Reyes, would mark all three boxes: Incapacitated and Dying, with the end of the scene as the deadline for a medic. Spending a Duty point when the disruptor hits reduces it to two boxes, leaving Reyes Seriously wounded but still standing. If Reyes is already down at three boxes, another disruptor shot or a lirpa blow kills; a punch does not.</w:t>
       </w:r>
     </w:p>
     <w:p>
@@ -4698,8 +4803,8 @@
         <w:t xml:space="preserve">To take someone down without hurting them, use a phaser on stun, a grapple, or the Vulcan nerve pinch rather than a weapon from this list.</w:t>
       </w:r>
     </w:p>
-    <w:bookmarkEnd w:id="48"/>
-    <w:bookmarkStart w:id="49" w:name="phaser-settings"/>
+    <w:bookmarkEnd w:id="49"/>
+    <w:bookmarkStart w:id="50" w:name="phaser-settings"/>
     <w:p>
       <w:pPr>
         <w:pStyle w:val="Heading2"/>
@@ -4847,22 +4952,22 @@
                 <w:b/>
                 <w:sz w:val="19"/>
               </w:rPr>
-              <w:t xml:space="preserve">Lethal</w:t>
-            </w:r>
-          </w:p>
-        </w:tc>
-        <w:tc>
-          <w:tcPr/>
-          <w:p>
-            <w:pPr>
-              <w:pStyle w:val="Compact"/>
-              <w:jc w:val="left"/>
-            </w:pPr>
-            <w:r>
-              <w:rPr>
-                <w:sz w:val="19"/>
-              </w:rPr>
-              <w:t xml:space="preserve">Marks two injury boxes. Disintegration requires a deliberate setting and an exposed target; the GM determines whether it is possible.</w:t>
+              <w:t xml:space="preserve">Kill</w:t>
+            </w:r>
+          </w:p>
+        </w:tc>
+        <w:tc>
+          <w:tcPr/>
+          <w:p>
+            <w:pPr>
+              <w:pStyle w:val="Compact"/>
+              <w:jc w:val="left"/>
+            </w:pPr>
+            <w:r>
+              <w:rPr>
+                <w:sz w:val="19"/>
+              </w:rPr>
+              <w:t xml:space="preserve">Marks three injury boxes: the target is Incapacitated and Dying. Disintegration requires a deliberate setting and an exposed target; the GM determines whether it is possible.</w:t>
             </w:r>
           </w:p>
         </w:tc>
@@ -4876,9 +4981,9 @@
         <w:t xml:space="preserve">Declare the setting before firing. Stun effects do not stack; a later failed resistance roll still incapacitates the target. Unarmed strikes normally mark one box. A grapple uses an opposed Unarmed Combat contest; winning restrains the target while the hold is maintained. Escape uses an action and a new contest.</w:t>
       </w:r>
     </w:p>
-    <w:bookmarkEnd w:id="49"/>
     <w:bookmarkEnd w:id="50"/>
-    <w:bookmarkStart w:id="57" w:name="medical-care"/>
+    <w:bookmarkEnd w:id="51"/>
+    <w:bookmarkStart w:id="58" w:name="medical-care"/>
     <w:p>
       <w:pPr>
         <w:pStyle w:val="Heading1"/>
@@ -4895,7 +5000,7 @@
         <w:t xml:space="preserve">Starfleet physicians in 2268 have advanced diagnostic scanners, potent pharmaceuticals, portable emergency equipment, and sophisticated sickbay facilities. Familiar injuries often respond quickly to treatment. Severe trauma, incompatible biology, missing supplies, and unidentified conditions still challenge an experienced doctor. The treatment values below are campaign rules inspired by the series, rather than numerical rules stated in canon.</w:t>
       </w:r>
     </w:p>
-    <w:bookmarkStart w:id="51" w:name="diagnosis-and-stabilization"/>
+    <w:bookmarkStart w:id="52" w:name="diagnosis-and-stabilization"/>
     <w:p>
       <w:pPr>
         <w:pStyle w:val="Heading2"/>
@@ -4917,11 +5022,11 @@
         <w:pStyle w:val="BodyText"/>
       </w:pPr>
       <w:r>
-        <w:t xml:space="preserve">Emergency stabilization takes one action and a successful Medicine roll with a medical kit. It prevents deterioration from the treated injury while the patient is protected from further harm. Stabilization alone removes no injury boxes. A patient at three boxes remains incapacitated until treatment clears a box.</w:t>
-      </w:r>
-    </w:p>
-    <w:bookmarkEnd w:id="51"/>
-    <w:bookmarkStart w:id="52" w:name="field-treatment"/>
+        <w:t xml:space="preserve">Emergency stabilization takes one action and a successful Medicine roll with a medical kit. It prevents deterioration from the treated injury while the patient is protected from further harm, and it ends Dying. Stabilization alone removes no injury boxes. A patient at three boxes remains incapacitated until treatment clears a box.</w:t>
+      </w:r>
+    </w:p>
+    <w:bookmarkEnd w:id="52"/>
+    <w:bookmarkStart w:id="53" w:name="field-treatment"/>
     <w:p>
       <w:pPr>
         <w:pStyle w:val="Heading2"/>
@@ -4938,8 +5043,8 @@
         <w:t xml:space="preserve">With a medical kit and several uninterrupted minutes, successful Medicine removes one injury box. Success by 5 or more removes two. Each injury receives one field-treatment attempt, even if that attempt fails; further attempts require changed circumstances such as better equipment, new diagnostic information, or access to sickbay. New injuries can receive their own treatment, but cannot justify treating an old injury repeatedly.</w:t>
       </w:r>
     </w:p>
-    <w:bookmarkEnd w:id="52"/>
-    <w:bookmarkStart w:id="53" w:name="sickbay-treatment"/>
+    <w:bookmarkEnd w:id="53"/>
+    <w:bookmarkStart w:id="54" w:name="sickbay-treatment"/>
     <w:p>
       <w:pPr>
         <w:pStyle w:val="Heading2"/>
@@ -4964,8 +5069,8 @@
         <w:t xml:space="preserve">Removing injury boxes removes their associated penalties, but major organ damage, severe burns, and complex internal trauma can still require a procedure and recovery period set by the GM. The physician determines whether the patient is fit for duty. Pain suppression does not itself heal an injury. Stun normally wears off at the end of the scene; prolonged unconsciousness requires assessment.</w:t>
       </w:r>
     </w:p>
-    <w:bookmarkEnd w:id="53"/>
-    <w:bookmarkStart w:id="54" w:name="alien-medicine-and-limits"/>
+    <w:bookmarkEnd w:id="54"/>
+    <w:bookmarkStart w:id="55" w:name="alien-medicine-and-limits"/>
     <w:p>
       <w:pPr>
         <w:pStyle w:val="Heading2"/>
@@ -4990,8 +5095,8 @@
         <w:t xml:space="preserve">Crew of other species may need care suited to their biology. An Alien Physiology Specialist, or a physician with access to the right species data, keeps that care from becoming guesswork.</w:t>
       </w:r>
     </w:p>
-    <w:bookmarkEnd w:id="54"/>
-    <w:bookmarkStart w:id="56" w:name="examples-from-the-original-series"/>
+    <w:bookmarkEnd w:id="55"/>
+    <w:bookmarkStart w:id="57" w:name="examples-from-the-original-series"/>
     <w:p>
       <w:pPr>
         <w:pStyle w:val="Heading2"/>
@@ -5090,7 +5195,7 @@
       <w:r>
         <w:t xml:space="preserve"> </w:t>
       </w:r>
-      <w:hyperlink r:id="rId55">
+      <w:hyperlink r:id="rId56">
         <w:r>
           <w:rPr>
             <w:rStyle w:val="Hyperlink"/>
@@ -5099,9 +5204,9 @@
         </w:r>
       </w:hyperlink>
     </w:p>
-    <w:bookmarkEnd w:id="56"/>
     <w:bookmarkEnd w:id="57"/>
-    <w:bookmarkStart w:id="62" w:name="duty-points-and-bridge-duty"/>
+    <w:bookmarkEnd w:id="58"/>
+    <w:bookmarkStart w:id="63" w:name="duty-points-and-bridge-duty"/>
     <w:p>
       <w:pPr>
         <w:pStyle w:val="Heading1"/>
@@ -5110,7 +5215,7 @@
         <w:t xml:space="preserve">Duty points and bridge duty</w:t>
       </w:r>
     </w:p>
-    <w:bookmarkStart w:id="58" w:name="using-duty-points"/>
+    <w:bookmarkStart w:id="59" w:name="using-duty-points"/>
     <w:p>
       <w:pPr>
         <w:pStyle w:val="Heading2"/>
@@ -5313,8 +5418,8 @@
         <w:t xml:space="preserve">your curiosity tempts you to remain beside an anomaly while the team withdraws. If you accept the resulting separation and danger, the GM awards one Duty point. The point does not remove that danger.</w:t>
       </w:r>
     </w:p>
-    <w:bookmarkEnd w:id="58"/>
-    <w:bookmarkStart w:id="59" w:name="working-on-the-bridge"/>
+    <w:bookmarkEnd w:id="59"/>
+    <w:bookmarkStart w:id="60" w:name="working-on-the-bridge"/>
     <w:p>
       <w:pPr>
         <w:pStyle w:val="Heading2"/>
@@ -5631,8 +5736,8 @@
         <w:t xml:space="preserve">Leadership can assist another officer when orders or coordination meaningfully help. It uses the normal assistance rule and does not provide an automatic bonus to every station.</w:t>
       </w:r>
     </w:p>
-    <w:bookmarkEnd w:id="59"/>
-    <w:bookmarkStart w:id="60" w:name="ship-encounters"/>
+    <w:bookmarkEnd w:id="60"/>
+    <w:bookmarkStart w:id="61" w:name="ship-encounters"/>
     <w:p>
       <w:pPr>
         <w:pStyle w:val="Heading2"/>
@@ -5649,8 +5754,8 @@
         <w:t xml:space="preserve">Ship encounters use descriptive consequences. The GM states what is at stake before rolls and describes changes to shields, hull, systems, and position afterward. Numerical ship damage is outside this guide’s scope.</w:t>
       </w:r>
     </w:p>
-    <w:bookmarkEnd w:id="60"/>
-    <w:bookmarkStart w:id="61" w:name="advancement"/>
+    <w:bookmarkEnd w:id="61"/>
+    <w:bookmarkStart w:id="62" w:name="advancement"/>
     <w:p>
       <w:pPr>
         <w:pStyle w:val="Heading2"/>
@@ -5667,9 +5772,9 @@
         <w:t xml:space="preserve">After a significant mission, the GM may authorize one relevant skill to advance from Untrained to Trained or from Trained to Specialty, or allow revision of an advantage or complication to reflect events. Skills retain the same three training levels after advancement. Advancement follows mission milestones. Attribute and species changes require a separate agreement.</w:t>
       </w:r>
     </w:p>
-    <w:bookmarkEnd w:id="61"/>
     <w:bookmarkEnd w:id="62"/>
-    <w:bookmarkStart w:id="63" w:name="advantages"/>
+    <w:bookmarkEnd w:id="63"/>
+    <w:bookmarkStart w:id="64" w:name="advantages"/>
     <w:p>
       <w:pPr>
         <w:pStyle w:val="Heading1"/>
@@ -6275,8 +6380,8 @@
         </w:tc>
       </w:tr>
     </w:tbl>
-    <w:bookmarkEnd w:id="63"/>
-    <w:bookmarkStart w:id="75" w:name="species-advantages"/>
+    <w:bookmarkEnd w:id="64"/>
+    <w:bookmarkStart w:id="76" w:name="species-advantages"/>
     <w:p>
       <w:pPr>
         <w:pStyle w:val="Heading1"/>
@@ -6341,7 +6446,7 @@
         <w:t xml:space="preserve">A custom species advantage follows the same pattern: a narrow +2 or an ability with agreed limits, paired with a companion complication that has a clear trigger and a real consequence.</w:t>
       </w:r>
     </w:p>
-    <w:bookmarkStart w:id="64" w:name="human"/>
+    <w:bookmarkStart w:id="65" w:name="human"/>
     <w:p>
       <w:pPr>
         <w:pStyle w:val="Heading2"/>
@@ -6554,8 +6659,8 @@
         </w:tc>
       </w:tr>
     </w:tbl>
-    <w:bookmarkEnd w:id="64"/>
-    <w:bookmarkStart w:id="65" w:name="vulcan"/>
+    <w:bookmarkEnd w:id="65"/>
+    <w:bookmarkStart w:id="66" w:name="vulcan"/>
     <w:p>
       <w:pPr>
         <w:pStyle w:val="Heading2"/>
@@ -6830,8 +6935,8 @@
         </w:tc>
       </w:tr>
     </w:tbl>
-    <w:bookmarkEnd w:id="65"/>
-    <w:bookmarkStart w:id="66" w:name="andorian"/>
+    <w:bookmarkEnd w:id="66"/>
+    <w:bookmarkStart w:id="67" w:name="andorian"/>
     <w:p>
       <w:pPr>
         <w:pStyle w:val="Heading2"/>
@@ -7044,8 +7149,8 @@
         </w:tc>
       </w:tr>
     </w:tbl>
-    <w:bookmarkEnd w:id="66"/>
-    <w:bookmarkStart w:id="67" w:name="tellarite"/>
+    <w:bookmarkEnd w:id="67"/>
+    <w:bookmarkStart w:id="68" w:name="tellarite"/>
     <w:p>
       <w:pPr>
         <w:pStyle w:val="Heading2"/>
@@ -7258,8 +7363,8 @@
         </w:tc>
       </w:tr>
     </w:tbl>
-    <w:bookmarkEnd w:id="67"/>
-    <w:bookmarkStart w:id="68" w:name="aenar"/>
+    <w:bookmarkEnd w:id="68"/>
+    <w:bookmarkStart w:id="69" w:name="aenar"/>
     <w:p>
       <w:pPr>
         <w:pStyle w:val="Heading2"/>
@@ -7472,8 +7577,8 @@
         </w:tc>
       </w:tr>
     </w:tbl>
-    <w:bookmarkEnd w:id="68"/>
-    <w:bookmarkStart w:id="69" w:name="illyrian"/>
+    <w:bookmarkEnd w:id="69"/>
+    <w:bookmarkStart w:id="70" w:name="illyrian"/>
     <w:p>
       <w:pPr>
         <w:pStyle w:val="Heading2"/>
@@ -7686,8 +7791,8 @@
         </w:tc>
       </w:tr>
     </w:tbl>
-    <w:bookmarkEnd w:id="69"/>
-    <w:bookmarkStart w:id="70" w:name="lanthanite"/>
+    <w:bookmarkEnd w:id="70"/>
+    <w:bookmarkStart w:id="71" w:name="lanthanite"/>
     <w:p>
       <w:pPr>
         <w:pStyle w:val="Heading2"/>
@@ -7900,8 +8005,8 @@
         </w:tc>
       </w:tr>
     </w:tbl>
-    <w:bookmarkEnd w:id="70"/>
-    <w:bookmarkStart w:id="71" w:name="caitian"/>
+    <w:bookmarkEnd w:id="71"/>
+    <w:bookmarkStart w:id="72" w:name="caitian"/>
     <w:p>
       <w:pPr>
         <w:pStyle w:val="Heading2"/>
@@ -8114,8 +8219,8 @@
         </w:tc>
       </w:tr>
     </w:tbl>
-    <w:bookmarkEnd w:id="71"/>
-    <w:bookmarkStart w:id="72" w:name="aurelian"/>
+    <w:bookmarkEnd w:id="72"/>
+    <w:bookmarkStart w:id="73" w:name="aurelian"/>
     <w:p>
       <w:pPr>
         <w:pStyle w:val="Heading2"/>
@@ -8328,8 +8433,8 @@
         </w:tc>
       </w:tr>
     </w:tbl>
-    <w:bookmarkEnd w:id="72"/>
-    <w:bookmarkStart w:id="73" w:name="orion"/>
+    <w:bookmarkEnd w:id="73"/>
+    <w:bookmarkStart w:id="74" w:name="orion"/>
     <w:p>
       <w:pPr>
         <w:pStyle w:val="Heading2"/>
@@ -8542,8 +8647,8 @@
         </w:tc>
       </w:tr>
     </w:tbl>
-    <w:bookmarkEnd w:id="73"/>
-    <w:bookmarkStart w:id="74" w:name="denobulan"/>
+    <w:bookmarkEnd w:id="74"/>
+    <w:bookmarkStart w:id="75" w:name="denobulan"/>
     <w:p>
       <w:pPr>
         <w:pStyle w:val="Heading2"/>
@@ -8756,9 +8861,9 @@
         </w:tc>
       </w:tr>
     </w:tbl>
-    <w:bookmarkEnd w:id="74"/>
     <w:bookmarkEnd w:id="75"/>
-    <w:bookmarkStart w:id="77" w:name="complications"/>
+    <w:bookmarkEnd w:id="76"/>
+    <w:bookmarkStart w:id="78" w:name="complications"/>
     <w:p>
       <w:pPr>
         <w:pStyle w:val="Heading1"/>
@@ -9364,7 +9469,7 @@
         </w:tc>
       </w:tr>
     </w:tbl>
-    <w:bookmarkStart w:id="76" w:name="using-and-revising-traits"/>
+    <w:bookmarkStart w:id="77" w:name="using-and-revising-traits"/>
     <w:p>
       <w:pPr>
         <w:pStyle w:val="Heading2"/>
@@ -9381,9 +9486,9 @@
         <w:t xml:space="preserve">General advantages and complications describe individual crew members and can suit any species when appropriate. A Vulcan might choose Mental Discipline as a general advantage; species advantages are the only traits tied to a species. At a mission milestone, revise a trait when events change the character. Custom advantages follow the same narrow +2 benefit; custom complications need a clear trigger and a meaningful, accepted consequence.</w:t>
       </w:r>
     </w:p>
-    <w:bookmarkEnd w:id="76"/>
     <w:bookmarkEnd w:id="77"/>
-    <w:bookmarkStart w:id="81" w:name="quick-reference"/>
+    <w:bookmarkEnd w:id="78"/>
+    <w:bookmarkStart w:id="82" w:name="quick-reference"/>
     <w:p>
       <w:pPr>
         <w:pStyle w:val="Heading1"/>
@@ -9392,7 +9497,7 @@
         <w:t xml:space="preserve">Quick reference</w:t>
       </w:r>
     </w:p>
-    <w:bookmarkStart w:id="78" w:name="will-and-mental-resistance"/>
+    <w:bookmarkStart w:id="79" w:name="will-and-mental-resistance"/>
     <w:p>
       <w:pPr>
         <w:pStyle w:val="Heading2"/>
@@ -9425,8 +9530,8 @@
         <w:t xml:space="preserve">Will protects your resolve; Presence influences others. Leadership and Diplomacy still use Presence. Species adjustments may change your starting Will, but mental advantages apply only to their agreed, narrow circumstances.</w:t>
       </w:r>
     </w:p>
-    <w:bookmarkEnd w:id="78"/>
-    <w:bookmarkStart w:id="79" w:name="at-the-table"/>
+    <w:bookmarkEnd w:id="79"/>
+    <w:bookmarkStart w:id="80" w:name="at-the-table"/>
     <w:p>
       <w:pPr>
         <w:pStyle w:val="Heading2"/>
@@ -9439,7 +9544,7 @@
       <w:pPr>
         <w:numPr>
           <w:ilvl w:val="0"/>
-          <w:numId w:val="1005"/>
+          <w:numId w:val="1006"/>
         </w:numPr>
         <w:pStyle w:val="Compact"/>
       </w:pPr>
@@ -9451,7 +9556,7 @@
       <w:pPr>
         <w:numPr>
           <w:ilvl w:val="0"/>
-          <w:numId w:val="1005"/>
+          <w:numId w:val="1006"/>
         </w:numPr>
         <w:pStyle w:val="Compact"/>
       </w:pPr>
@@ -9463,7 +9568,7 @@
       <w:pPr>
         <w:numPr>
           <w:ilvl w:val="0"/>
-          <w:numId w:val="1005"/>
+          <w:numId w:val="1006"/>
         </w:numPr>
         <w:pStyle w:val="Compact"/>
       </w:pPr>
@@ -9475,7 +9580,7 @@
       <w:pPr>
         <w:numPr>
           <w:ilvl w:val="0"/>
-          <w:numId w:val="1005"/>
+          <w:numId w:val="1006"/>
         </w:numPr>
         <w:pStyle w:val="Compact"/>
       </w:pPr>
@@ -9487,7 +9592,7 @@
       <w:pPr>
         <w:numPr>
           <w:ilvl w:val="0"/>
-          <w:numId w:val="1005"/>
+          <w:numId w:val="1006"/>
         </w:numPr>
         <w:pStyle w:val="Compact"/>
       </w:pPr>
@@ -9495,8 +9600,8 @@
         <w:t xml:space="preserve">Apply the result and describe what changes.</w:t>
       </w:r>
     </w:p>
-    <w:bookmarkEnd w:id="79"/>
-    <w:bookmarkStart w:id="80" w:name="summary"/>
+    <w:bookmarkEnd w:id="80"/>
+    <w:bookmarkStart w:id="81" w:name="summary"/>
     <w:p>
       <w:pPr>
         <w:pStyle w:val="Heading2"/>
@@ -9610,7 +9715,7 @@
         <w:t xml:space="preserve"> </w:t>
       </w:r>
       <w:r>
-        <w:t xml:space="preserve">the weapon decides. Fists, clubs, knives, arrows and primitive firearms mark 1 box; heavy blades, phasers on a lethal setting and disruptors mark 2; stun marks none.</w:t>
+        <w:t xml:space="preserve">the weapon decides. Fists, clubs, knives, arrows and primitive firearms mark 1 box; heavy blades mark 2; a phaser or disruptor on kill marks 3 and leaves the target Dying (dead at the end of the scene unless stabilized); stun marks none. At three boxes, another hit from a 2-box or killing weapon is fatal.</w:t>
       </w:r>
     </w:p>
     <w:p>
@@ -9667,8 +9772,8 @@
         <w:t xml:space="preserve">start each session with two. Spend one to reroll, reduce an injury by one box, or establish a plausible preparation. Earn one when an accepted complication, including a companion complication, creates a meaningful problem.</w:t>
       </w:r>
     </w:p>
-    <w:bookmarkEnd w:id="80"/>
     <w:bookmarkEnd w:id="81"/>
+    <w:bookmarkEnd w:id="82"/>
     <w:sectPr/>
   </w:body>
 </w:document>
@@ -9952,6 +10057,9 @@
     <w:abstractNumId w:val="991"/>
   </w:num>
   <w:num w:numId="1005">
+    <w:abstractNumId w:val="991"/>
+  </w:num>
+  <w:num w:numId="1006">
     <w:abstractNumId w:val="99411"/>
     <w:lvlOverride w:ilvl="0">
       <w:startOverride w:val="1"/>

</xml_diff>

<commit_message>
Add natural recovery: one injury box per full day of rest
Rest (light duty only) clears one box a day, but not from three boxes,
where treatment must clear the first. Serious trauma can need a set
recovery period. Added to the guide's Medical care chapter, its summary,
and the creator's quick reference.

Co-Authored-By: Claude Opus 5.5 <noreply@anthropic.com>
Claude-Session: https://claude.ai/code/session_015SADCFzhKijkC2foUmXrpC
</commit_message>
<xml_diff>
--- a/uss-pelion/USS_Pelion_Players_Guide.docx
+++ b/uss-pelion/USS_Pelion_Players_Guide.docx
@@ -4983,7 +4983,7 @@
     </w:p>
     <w:bookmarkEnd w:id="50"/>
     <w:bookmarkEnd w:id="51"/>
-    <w:bookmarkStart w:id="58" w:name="medical-care"/>
+    <w:bookmarkStart w:id="59" w:name="medical-care"/>
     <w:p>
       <w:pPr>
         <w:pStyle w:val="Heading1"/>
@@ -5070,12 +5070,130 @@
       </w:r>
     </w:p>
     <w:bookmarkEnd w:id="54"/>
-    <w:bookmarkStart w:id="55" w:name="alien-medicine-and-limits"/>
+    <w:bookmarkStart w:id="55" w:name="natural-recovery"/>
     <w:p>
       <w:pPr>
         <w:pStyle w:val="Heading2"/>
       </w:pPr>
       <w:r>
+        <w:t xml:space="preserve">Natural recovery</w:t>
+      </w:r>
+    </w:p>
+    <w:p>
+      <w:pPr>
+        <w:pStyle w:val="FirstParagraph"/>
+      </w:pPr>
+      <w:r>
+        <w:t xml:space="preserve">Injuries also heal with time. Each</w:t>
+      </w:r>
+      <w:r>
+        <w:t xml:space="preserve"> </w:t>
+      </w:r>
+      <w:r>
+        <w:rPr>
+          <w:bCs/>
+          <w:b/>
+        </w:rPr>
+        <w:t xml:space="preserve">full day of rest</w:t>
+      </w:r>
+      <w:r>
+        <w:t xml:space="preserve"> </w:t>
+      </w:r>
+      <w:r>
+        <w:t xml:space="preserve">clears one injury box. Rest means light duty at most: no combat, no away missions, nothing strenuous. A day spent working hard or fighting clears nothing.</w:t>
+      </w:r>
+    </w:p>
+    <w:p>
+      <w:pPr>
+        <w:numPr>
+          <w:ilvl w:val="0"/>
+          <w:numId w:val="1006"/>
+        </w:numPr>
+        <w:pStyle w:val="Compact"/>
+      </w:pPr>
+      <w:r>
+        <w:rPr>
+          <w:bCs/>
+          <w:b/>
+        </w:rPr>
+        <w:t xml:space="preserve">At three boxes, rest alone clears nothing.</w:t>
+      </w:r>
+      <w:r>
+        <w:t xml:space="preserve"> </w:t>
+      </w:r>
+      <w:r>
+        <w:t xml:space="preserve">An Incapacitated patient needs treatment (field care or sickbay) to clear the first box; after that, rest takes over.</w:t>
+      </w:r>
+    </w:p>
+    <w:p>
+      <w:pPr>
+        <w:numPr>
+          <w:ilvl w:val="0"/>
+          <w:numId w:val="1006"/>
+        </w:numPr>
+        <w:pStyle w:val="Compact"/>
+      </w:pPr>
+      <w:r>
+        <w:rPr>
+          <w:bCs/>
+          <w:b/>
+        </w:rPr>
+        <w:t xml:space="preserve">Rest and medicine combine.</w:t>
+      </w:r>
+      <w:r>
+        <w:t xml:space="preserve"> </w:t>
+      </w:r>
+      <w:r>
+        <w:t xml:space="preserve">Treatment clears boxes immediately; rest clears what remains, one box a day.</w:t>
+      </w:r>
+    </w:p>
+    <w:p>
+      <w:pPr>
+        <w:numPr>
+          <w:ilvl w:val="0"/>
+          <w:numId w:val="1006"/>
+        </w:numPr>
+        <w:pStyle w:val="Compact"/>
+      </w:pPr>
+      <w:r>
+        <w:rPr>
+          <w:bCs/>
+          <w:b/>
+        </w:rPr>
+        <w:t xml:space="preserve">Serious trauma takes longer.</w:t>
+      </w:r>
+      <w:r>
+        <w:t xml:space="preserve"> </w:t>
+      </w:r>
+      <w:r>
+        <w:t xml:space="preserve">For major organ damage, severe burns, or complex internal trauma, the GM can require a set recovery period before rest clears anything, and the ship’s physician decides when the patient is fit for duty.</w:t>
+      </w:r>
+    </w:p>
+    <w:p>
+      <w:pPr>
+        <w:pStyle w:val="FirstParagraph"/>
+      </w:pPr>
+      <w:r>
+        <w:rPr>
+          <w:iCs/>
+          <w:i/>
+        </w:rPr>
+        <w:t xml:space="preserve">Example:</w:t>
+      </w:r>
+      <w:r>
+        <w:t xml:space="preserve"> </w:t>
+      </w:r>
+      <w:r>
+        <w:t xml:space="preserve">Ensign Reyes ends a mission Seriously wounded (two boxes). Sickbay is busy with worse cases, so Reyes rests in quarters: one box clears the first day and the second the next, and Reyes is back on duty on the third day.</w:t>
+      </w:r>
+    </w:p>
+    <w:bookmarkEnd w:id="55"/>
+    <w:bookmarkStart w:id="56" w:name="alien-medicine-and-limits"/>
+    <w:p>
+      <w:pPr>
+        <w:pStyle w:val="Heading2"/>
+      </w:pPr>
+      <w:r>
         <w:t xml:space="preserve">Alien medicine and limits</w:t>
       </w:r>
     </w:p>
@@ -5095,8 +5213,8 @@
         <w:t xml:space="preserve">Crew of other species may need care suited to their biology. An Alien Physiology Specialist, or a physician with access to the right species data, keeps that care from becoming guesswork.</w:t>
       </w:r>
     </w:p>
-    <w:bookmarkEnd w:id="55"/>
-    <w:bookmarkStart w:id="57" w:name="examples-from-the-original-series"/>
+    <w:bookmarkEnd w:id="56"/>
+    <w:bookmarkStart w:id="58" w:name="examples-from-the-original-series"/>
     <w:p>
       <w:pPr>
         <w:pStyle w:val="Heading2"/>
@@ -5195,7 +5313,7 @@
       <w:r>
         <w:t xml:space="preserve"> </w:t>
       </w:r>
-      <w:hyperlink r:id="rId56">
+      <w:hyperlink r:id="rId57">
         <w:r>
           <w:rPr>
             <w:rStyle w:val="Hyperlink"/>
@@ -5204,9 +5322,9 @@
         </w:r>
       </w:hyperlink>
     </w:p>
-    <w:bookmarkEnd w:id="57"/>
     <w:bookmarkEnd w:id="58"/>
-    <w:bookmarkStart w:id="63" w:name="duty-points-and-bridge-duty"/>
+    <w:bookmarkEnd w:id="59"/>
+    <w:bookmarkStart w:id="64" w:name="duty-points-and-bridge-duty"/>
     <w:p>
       <w:pPr>
         <w:pStyle w:val="Heading1"/>
@@ -5215,7 +5333,7 @@
         <w:t xml:space="preserve">Duty points and bridge duty</w:t>
       </w:r>
     </w:p>
-    <w:bookmarkStart w:id="59" w:name="using-duty-points"/>
+    <w:bookmarkStart w:id="60" w:name="using-duty-points"/>
     <w:p>
       <w:pPr>
         <w:pStyle w:val="Heading2"/>
@@ -5418,8 +5536,8 @@
         <w:t xml:space="preserve">your curiosity tempts you to remain beside an anomaly while the team withdraws. If you accept the resulting separation and danger, the GM awards one Duty point. The point does not remove that danger.</w:t>
       </w:r>
     </w:p>
-    <w:bookmarkEnd w:id="59"/>
-    <w:bookmarkStart w:id="60" w:name="working-on-the-bridge"/>
+    <w:bookmarkEnd w:id="60"/>
+    <w:bookmarkStart w:id="61" w:name="working-on-the-bridge"/>
     <w:p>
       <w:pPr>
         <w:pStyle w:val="Heading2"/>
@@ -5736,8 +5854,8 @@
         <w:t xml:space="preserve">Leadership can assist another officer when orders or coordination meaningfully help. It uses the normal assistance rule and does not provide an automatic bonus to every station.</w:t>
       </w:r>
     </w:p>
-    <w:bookmarkEnd w:id="60"/>
-    <w:bookmarkStart w:id="61" w:name="ship-encounters"/>
+    <w:bookmarkEnd w:id="61"/>
+    <w:bookmarkStart w:id="62" w:name="ship-encounters"/>
     <w:p>
       <w:pPr>
         <w:pStyle w:val="Heading2"/>
@@ -5754,8 +5872,8 @@
         <w:t xml:space="preserve">Ship encounters use descriptive consequences. The GM states what is at stake before rolls and describes changes to shields, hull, systems, and position afterward. Numerical ship damage is outside this guide’s scope.</w:t>
       </w:r>
     </w:p>
-    <w:bookmarkEnd w:id="61"/>
-    <w:bookmarkStart w:id="62" w:name="advancement"/>
+    <w:bookmarkEnd w:id="62"/>
+    <w:bookmarkStart w:id="63" w:name="advancement"/>
     <w:p>
       <w:pPr>
         <w:pStyle w:val="Heading2"/>
@@ -5772,9 +5890,9 @@
         <w:t xml:space="preserve">After a significant mission, the GM may authorize one relevant skill to advance from Untrained to Trained or from Trained to Specialty, or allow revision of an advantage or complication to reflect events. Skills retain the same three training levels after advancement. Advancement follows mission milestones. Attribute and species changes require a separate agreement.</w:t>
       </w:r>
     </w:p>
-    <w:bookmarkEnd w:id="62"/>
     <w:bookmarkEnd w:id="63"/>
-    <w:bookmarkStart w:id="64" w:name="advantages"/>
+    <w:bookmarkEnd w:id="64"/>
+    <w:bookmarkStart w:id="65" w:name="advantages"/>
     <w:p>
       <w:pPr>
         <w:pStyle w:val="Heading1"/>
@@ -6380,8 +6498,8 @@
         </w:tc>
       </w:tr>
     </w:tbl>
-    <w:bookmarkEnd w:id="64"/>
-    <w:bookmarkStart w:id="76" w:name="species-advantages"/>
+    <w:bookmarkEnd w:id="65"/>
+    <w:bookmarkStart w:id="77" w:name="species-advantages"/>
     <w:p>
       <w:pPr>
         <w:pStyle w:val="Heading1"/>
@@ -6446,7 +6564,7 @@
         <w:t xml:space="preserve">A custom species advantage follows the same pattern: a narrow +2 or an ability with agreed limits, paired with a companion complication that has a clear trigger and a real consequence.</w:t>
       </w:r>
     </w:p>
-    <w:bookmarkStart w:id="65" w:name="human"/>
+    <w:bookmarkStart w:id="66" w:name="human"/>
     <w:p>
       <w:pPr>
         <w:pStyle w:val="Heading2"/>
@@ -6659,8 +6777,8 @@
         </w:tc>
       </w:tr>
     </w:tbl>
-    <w:bookmarkEnd w:id="65"/>
-    <w:bookmarkStart w:id="66" w:name="vulcan"/>
+    <w:bookmarkEnd w:id="66"/>
+    <w:bookmarkStart w:id="67" w:name="vulcan"/>
     <w:p>
       <w:pPr>
         <w:pStyle w:val="Heading2"/>
@@ -6935,8 +7053,8 @@
         </w:tc>
       </w:tr>
     </w:tbl>
-    <w:bookmarkEnd w:id="66"/>
-    <w:bookmarkStart w:id="67" w:name="andorian"/>
+    <w:bookmarkEnd w:id="67"/>
+    <w:bookmarkStart w:id="68" w:name="andorian"/>
     <w:p>
       <w:pPr>
         <w:pStyle w:val="Heading2"/>
@@ -7149,8 +7267,8 @@
         </w:tc>
       </w:tr>
     </w:tbl>
-    <w:bookmarkEnd w:id="67"/>
-    <w:bookmarkStart w:id="68" w:name="tellarite"/>
+    <w:bookmarkEnd w:id="68"/>
+    <w:bookmarkStart w:id="69" w:name="tellarite"/>
     <w:p>
       <w:pPr>
         <w:pStyle w:val="Heading2"/>
@@ -7363,8 +7481,8 @@
         </w:tc>
       </w:tr>
     </w:tbl>
-    <w:bookmarkEnd w:id="68"/>
-    <w:bookmarkStart w:id="69" w:name="aenar"/>
+    <w:bookmarkEnd w:id="69"/>
+    <w:bookmarkStart w:id="70" w:name="aenar"/>
     <w:p>
       <w:pPr>
         <w:pStyle w:val="Heading2"/>
@@ -7577,8 +7695,8 @@
         </w:tc>
       </w:tr>
     </w:tbl>
-    <w:bookmarkEnd w:id="69"/>
-    <w:bookmarkStart w:id="70" w:name="illyrian"/>
+    <w:bookmarkEnd w:id="70"/>
+    <w:bookmarkStart w:id="71" w:name="illyrian"/>
     <w:p>
       <w:pPr>
         <w:pStyle w:val="Heading2"/>
@@ -7791,8 +7909,8 @@
         </w:tc>
       </w:tr>
     </w:tbl>
-    <w:bookmarkEnd w:id="70"/>
-    <w:bookmarkStart w:id="71" w:name="lanthanite"/>
+    <w:bookmarkEnd w:id="71"/>
+    <w:bookmarkStart w:id="72" w:name="lanthanite"/>
     <w:p>
       <w:pPr>
         <w:pStyle w:val="Heading2"/>
@@ -8005,8 +8123,8 @@
         </w:tc>
       </w:tr>
     </w:tbl>
-    <w:bookmarkEnd w:id="71"/>
-    <w:bookmarkStart w:id="72" w:name="caitian"/>
+    <w:bookmarkEnd w:id="72"/>
+    <w:bookmarkStart w:id="73" w:name="caitian"/>
     <w:p>
       <w:pPr>
         <w:pStyle w:val="Heading2"/>
@@ -8219,8 +8337,8 @@
         </w:tc>
       </w:tr>
     </w:tbl>
-    <w:bookmarkEnd w:id="72"/>
-    <w:bookmarkStart w:id="73" w:name="aurelian"/>
+    <w:bookmarkEnd w:id="73"/>
+    <w:bookmarkStart w:id="74" w:name="aurelian"/>
     <w:p>
       <w:pPr>
         <w:pStyle w:val="Heading2"/>
@@ -8433,8 +8551,8 @@
         </w:tc>
       </w:tr>
     </w:tbl>
-    <w:bookmarkEnd w:id="73"/>
-    <w:bookmarkStart w:id="74" w:name="orion"/>
+    <w:bookmarkEnd w:id="74"/>
+    <w:bookmarkStart w:id="75" w:name="orion"/>
     <w:p>
       <w:pPr>
         <w:pStyle w:val="Heading2"/>
@@ -8647,8 +8765,8 @@
         </w:tc>
       </w:tr>
     </w:tbl>
-    <w:bookmarkEnd w:id="74"/>
-    <w:bookmarkStart w:id="75" w:name="denobulan"/>
+    <w:bookmarkEnd w:id="75"/>
+    <w:bookmarkStart w:id="76" w:name="denobulan"/>
     <w:p>
       <w:pPr>
         <w:pStyle w:val="Heading2"/>
@@ -8861,9 +8979,9 @@
         </w:tc>
       </w:tr>
     </w:tbl>
-    <w:bookmarkEnd w:id="75"/>
     <w:bookmarkEnd w:id="76"/>
-    <w:bookmarkStart w:id="78" w:name="complications"/>
+    <w:bookmarkEnd w:id="77"/>
+    <w:bookmarkStart w:id="79" w:name="complications"/>
     <w:p>
       <w:pPr>
         <w:pStyle w:val="Heading1"/>
@@ -9469,7 +9587,7 @@
         </w:tc>
       </w:tr>
     </w:tbl>
-    <w:bookmarkStart w:id="77" w:name="using-and-revising-traits"/>
+    <w:bookmarkStart w:id="78" w:name="using-and-revising-traits"/>
     <w:p>
       <w:pPr>
         <w:pStyle w:val="Heading2"/>
@@ -9486,9 +9604,9 @@
         <w:t xml:space="preserve">General advantages and complications describe individual crew members and can suit any species when appropriate. A Vulcan might choose Mental Discipline as a general advantage; species advantages are the only traits tied to a species. At a mission milestone, revise a trait when events change the character. Custom advantages follow the same narrow +2 benefit; custom complications need a clear trigger and a meaningful, accepted consequence.</w:t>
       </w:r>
     </w:p>
-    <w:bookmarkEnd w:id="77"/>
     <w:bookmarkEnd w:id="78"/>
-    <w:bookmarkStart w:id="82" w:name="quick-reference"/>
+    <w:bookmarkEnd w:id="79"/>
+    <w:bookmarkStart w:id="83" w:name="quick-reference"/>
     <w:p>
       <w:pPr>
         <w:pStyle w:val="Heading1"/>
@@ -9497,7 +9615,7 @@
         <w:t xml:space="preserve">Quick reference</w:t>
       </w:r>
     </w:p>
-    <w:bookmarkStart w:id="79" w:name="will-and-mental-resistance"/>
+    <w:bookmarkStart w:id="80" w:name="will-and-mental-resistance"/>
     <w:p>
       <w:pPr>
         <w:pStyle w:val="Heading2"/>
@@ -9530,8 +9648,8 @@
         <w:t xml:space="preserve">Will protects your resolve; Presence influences others. Leadership and Diplomacy still use Presence. Species adjustments may change your starting Will, but mental advantages apply only to their agreed, narrow circumstances.</w:t>
       </w:r>
     </w:p>
-    <w:bookmarkEnd w:id="79"/>
-    <w:bookmarkStart w:id="80" w:name="at-the-table"/>
+    <w:bookmarkEnd w:id="80"/>
+    <w:bookmarkStart w:id="81" w:name="at-the-table"/>
     <w:p>
       <w:pPr>
         <w:pStyle w:val="Heading2"/>
@@ -9544,7 +9662,7 @@
       <w:pPr>
         <w:numPr>
           <w:ilvl w:val="0"/>
-          <w:numId w:val="1006"/>
+          <w:numId w:val="1007"/>
         </w:numPr>
         <w:pStyle w:val="Compact"/>
       </w:pPr>
@@ -9556,7 +9674,7 @@
       <w:pPr>
         <w:numPr>
           <w:ilvl w:val="0"/>
-          <w:numId w:val="1006"/>
+          <w:numId w:val="1007"/>
         </w:numPr>
         <w:pStyle w:val="Compact"/>
       </w:pPr>
@@ -9568,7 +9686,7 @@
       <w:pPr>
         <w:numPr>
           <w:ilvl w:val="0"/>
-          <w:numId w:val="1006"/>
+          <w:numId w:val="1007"/>
         </w:numPr>
         <w:pStyle w:val="Compact"/>
       </w:pPr>
@@ -9580,7 +9698,7 @@
       <w:pPr>
         <w:numPr>
           <w:ilvl w:val="0"/>
-          <w:numId w:val="1006"/>
+          <w:numId w:val="1007"/>
         </w:numPr>
         <w:pStyle w:val="Compact"/>
       </w:pPr>
@@ -9592,7 +9710,7 @@
       <w:pPr>
         <w:numPr>
           <w:ilvl w:val="0"/>
-          <w:numId w:val="1006"/>
+          <w:numId w:val="1007"/>
         </w:numPr>
         <w:pStyle w:val="Compact"/>
       </w:pPr>
@@ -9600,8 +9718,8 @@
         <w:t xml:space="preserve">Apply the result and describe what changes.</w:t>
       </w:r>
     </w:p>
-    <w:bookmarkEnd w:id="80"/>
-    <w:bookmarkStart w:id="81" w:name="summary"/>
+    <w:bookmarkEnd w:id="81"/>
+    <w:bookmarkStart w:id="82" w:name="summary"/>
     <w:p>
       <w:pPr>
         <w:pStyle w:val="Heading2"/>
@@ -9733,7 +9851,7 @@
         <w:t xml:space="preserve"> </w:t>
       </w:r>
       <w:r>
-        <w:t xml:space="preserve">one action to stabilize. Field care takes several minutes and clears one box, or two on success by 5. Sickbay grants +2 and clears two boxes, or three on success by 5. Major trauma may require further recovery.</w:t>
+        <w:t xml:space="preserve">one action to stabilize. Field care takes several minutes and clears one box, or two on success by 5. Sickbay grants +2 and clears two boxes, or three on success by 5. Major trauma may require further recovery. Rest clears one box per full day, but not from three boxes: treatment must clear the first one.</w:t>
       </w:r>
     </w:p>
     <w:p>
@@ -9772,8 +9890,8 @@
         <w:t xml:space="preserve">start each session with two. Spend one to reroll, reduce an injury by one box, or establish a plausible preparation. Earn one when an accepted complication, including a companion complication, creates a meaningful problem.</w:t>
       </w:r>
     </w:p>
-    <w:bookmarkEnd w:id="81"/>
     <w:bookmarkEnd w:id="82"/>
+    <w:bookmarkEnd w:id="83"/>
     <w:sectPr/>
   </w:body>
 </w:document>
@@ -10060,6 +10178,9 @@
     <w:abstractNumId w:val="991"/>
   </w:num>
   <w:num w:numId="1006">
+    <w:abstractNumId w:val="991"/>
+  </w:num>
+  <w:num w:numId="1007">
     <w:abstractNumId w:val="99411"/>
     <w:lvlOverride w:ilvl="0">
       <w:startOverride w:val="1"/>

</xml_diff>

<commit_message>
Add Trill as a playable species
Intellect +1, Body -1, with two joined-only species advantages: Memories
of Past Hosts (companion: The Secret of Joining) and A Past Life's Trade
(companion: Conflicting Memories). Added to the creator and the guide.

Co-Authored-By: Claude Opus 5.5 <noreply@anthropic.com>
Claude-Session: https://claude.ai/code/session_015SADCFzhKijkC2foUmXrpC
</commit_message>
<xml_diff>
--- a/uss-pelion/USS_Pelion_Players_Guide.docx
+++ b/uss-pelion/USS_Pelion_Players_Guide.docx
@@ -1693,6 +1693,39 @@
           </w:p>
         </w:tc>
       </w:tr>
+      <w:tr>
+        <w:tc>
+          <w:tcPr/>
+          <w:p>
+            <w:pPr>
+              <w:pStyle w:val="Compact"/>
+              <w:jc w:val="left"/>
+            </w:pPr>
+            <w:r>
+              <w:rPr>
+                <w:b/>
+                <w:sz w:val="19"/>
+              </w:rPr>
+              <w:t xml:space="preserve">Trill</w:t>
+            </w:r>
+          </w:p>
+        </w:tc>
+        <w:tc>
+          <w:tcPr/>
+          <w:p>
+            <w:pPr>
+              <w:pStyle w:val="Compact"/>
+              <w:jc w:val="left"/>
+            </w:pPr>
+            <w:r>
+              <w:rPr>
+                <w:sz w:val="19"/>
+              </w:rPr>
+              <w:t xml:space="preserve">Intellect +1, Body −1</w:t>
+            </w:r>
+          </w:p>
+        </w:tc>
+      </w:tr>
     </w:tbl>
     <w:bookmarkEnd w:id="26"/>
     <w:bookmarkStart w:id="27" w:name="spending-points"/>
@@ -1971,6 +2004,24 @@
       </w:r>
       <w:r>
         <w:t xml:space="preserve">Cheerful, sociable people with large extended families. They need little sleep most of the year, then hibernate for several days. Dr. Phlox served aboard Enterprise NX-01 a century earlier.</w:t>
+      </w:r>
+    </w:p>
+    <w:p>
+      <w:pPr>
+        <w:pStyle w:val="BodyText"/>
+      </w:pPr>
+      <w:r>
+        <w:rPr>
+          <w:bCs/>
+          <w:b/>
+        </w:rPr>
+        <w:t xml:space="preserve">Trill.</w:t>
+      </w:r>
+      <w:r>
+        <w:t xml:space="preserve"> </w:t>
+      </w:r>
+      <w:r>
+        <w:t xml:space="preserve">A spotted humanoid people, some of whom are joined with a long-lived symbiont that carries the memories of its earlier hosts. In this era the Trill keep joining a closely guarded secret from outsiders, Starfleet included. An unjoined Trill uses the same adjustments; the species advantages below need a symbiont.</w:t>
       </w:r>
     </w:p>
     <w:bookmarkEnd w:id="28"/>
@@ -6499,7 +6550,7 @@
       </w:tr>
     </w:tbl>
     <w:bookmarkEnd w:id="65"/>
-    <w:bookmarkStart w:id="77" w:name="species-advantages"/>
+    <w:bookmarkStart w:id="78" w:name="species-advantages"/>
     <w:p>
       <w:pPr>
         <w:pStyle w:val="Heading1"/>
@@ -8980,8 +9031,230 @@
       </w:tr>
     </w:tbl>
     <w:bookmarkEnd w:id="76"/>
+    <w:bookmarkStart w:id="77" w:name="trill"/>
+    <w:p>
+      <w:pPr>
+        <w:pStyle w:val="Heading2"/>
+      </w:pPr>
+      <w:r>
+        <w:t xml:space="preserve">Trill</w:t>
+      </w:r>
+    </w:p>
+    <w:p>
+      <w:pPr>
+        <w:pStyle w:val="FirstParagraph"/>
+      </w:pPr>
+      <w:r>
+        <w:t xml:space="preserve">Both Trill advantages require a joined character; agree with the GM before play that your Trill carries a symbiont.</w:t>
+      </w:r>
+    </w:p>
+    <w:tbl>
+      <w:tblPr>
+        <w:tblStyle w:val="Table"/>
+        <w:tblW w:type="pct" w:w="5000"/>
+        <w:tblLook w:firstRow="1" w:lastRow="0" w:firstColumn="0" w:lastColumn="0" w:noHBand="0" w:noVBand="0" w:val="0020"/>
+        <w:jc w:val="start"/>
+        <w:tblBorders>
+          <w:top w:val="single" w:sz="4" w:color="B8C2D3"/>
+          <w:left w:val="single" w:sz="4" w:color="B8C2D3"/>
+          <w:bottom w:val="single" w:sz="4" w:color="B8C2D3"/>
+          <w:right w:val="single" w:sz="4" w:color="B8C2D3"/>
+          <w:insideH w:val="single" w:sz="4" w:color="B8C2D3"/>
+          <w:insideV w:val="single" w:sz="4" w:color="B8C2D3"/>
+        </w:tblBorders>
+      </w:tblPr>
+      <w:tblGrid>
+        <w:gridCol w:w="2640"/>
+        <w:gridCol w:w="2640"/>
+        <w:gridCol w:w="2640"/>
+      </w:tblGrid>
+      <w:tr>
+        <w:trPr>
+          <w:tblHeader w:val="true"/>
+        </w:trPr>
+        <w:tc>
+          <w:tcPr>
+            <w:shd w:val="clear" w:fill="E9EEF6"/>
+          </w:tcPr>
+          <w:p>
+            <w:pPr>
+              <w:pStyle w:val="Compact"/>
+              <w:jc w:val="left"/>
+            </w:pPr>
+            <w:r>
+              <w:rPr>
+                <w:b/>
+                <w:sz w:val="19"/>
+              </w:rPr>
+              <w:t xml:space="preserve">Advantage</w:t>
+            </w:r>
+          </w:p>
+        </w:tc>
+        <w:tc>
+          <w:tcPr>
+            <w:shd w:val="clear" w:fill="E9EEF6"/>
+          </w:tcPr>
+          <w:p>
+            <w:pPr>
+              <w:pStyle w:val="Compact"/>
+              <w:jc w:val="left"/>
+            </w:pPr>
+            <w:r>
+              <w:rPr>
+                <w:b/>
+                <w:sz w:val="19"/>
+              </w:rPr>
+              <w:t xml:space="preserve">Effect</w:t>
+            </w:r>
+          </w:p>
+        </w:tc>
+        <w:tc>
+          <w:tcPr>
+            <w:shd w:val="clear" w:fill="E9EEF6"/>
+          </w:tcPr>
+          <w:p>
+            <w:pPr>
+              <w:pStyle w:val="Compact"/>
+              <w:jc w:val="left"/>
+            </w:pPr>
+            <w:r>
+              <w:rPr>
+                <w:b/>
+                <w:sz w:val="19"/>
+              </w:rPr>
+              <w:t xml:space="preserve">Companion complication</w:t>
+            </w:r>
+          </w:p>
+        </w:tc>
+      </w:tr>
+      <w:tr>
+        <w:tc>
+          <w:tcPr/>
+          <w:p>
+            <w:pPr>
+              <w:pStyle w:val="Compact"/>
+              <w:jc w:val="left"/>
+            </w:pPr>
+            <w:r>
+              <w:rPr>
+                <w:b/>
+                <w:sz w:val="19"/>
+              </w:rPr>
+              <w:t xml:space="preserve">Memories of Past Hosts</w:t>
+            </w:r>
+          </w:p>
+        </w:tc>
+        <w:tc>
+          <w:tcPr/>
+          <w:p>
+            <w:pPr>
+              <w:pStyle w:val="Compact"/>
+              <w:jc w:val="left"/>
+            </w:pPr>
+            <w:r>
+              <w:rPr>
+                <w:sz w:val="19"/>
+              </w:rPr>
+              <w:t xml:space="preserve">+2 to Intellect rolls to recall something a previous host of your symbiont knew or lived through: a place, a person, an old technique.</w:t>
+            </w:r>
+          </w:p>
+        </w:tc>
+        <w:tc>
+          <w:tcPr/>
+          <w:p>
+            <w:pPr>
+              <w:pStyle w:val="Compact"/>
+              <w:jc w:val="left"/>
+            </w:pPr>
+            <w:r>
+              <w:rPr>
+                <w:bCs/>
+                <w:b/>
+                <w:sz w:val="19"/>
+              </w:rPr>
+              <w:t xml:space="preserve">The Secret of Joining.</w:t>
+            </w:r>
+            <w:r>
+              <w:rPr>
+                <w:sz w:val="19"/>
+              </w:rPr>
+              <w:t xml:space="preserve"> </w:t>
+            </w:r>
+            <w:r>
+              <w:rPr>
+                <w:sz w:val="19"/>
+              </w:rPr>
+              <w:t xml:space="preserve">Joining is a secret your people guard from outsiders. When a medical scan, a transporter reading, or a curious crewmate could reveal your symbiont, accept the lie, the risk, or a revealing choice.</w:t>
+            </w:r>
+          </w:p>
+        </w:tc>
+      </w:tr>
+      <w:tr>
+        <w:tc>
+          <w:tcPr/>
+          <w:p>
+            <w:pPr>
+              <w:pStyle w:val="Compact"/>
+              <w:jc w:val="left"/>
+            </w:pPr>
+            <w:r>
+              <w:rPr>
+                <w:b/>
+                <w:sz w:val="19"/>
+              </w:rPr>
+              <w:t xml:space="preserve">A Past Life’s Trade</w:t>
+            </w:r>
+          </w:p>
+        </w:tc>
+        <w:tc>
+          <w:tcPr/>
+          <w:p>
+            <w:pPr>
+              <w:pStyle w:val="Compact"/>
+              <w:jc w:val="left"/>
+            </w:pPr>
+            <w:r>
+              <w:rPr>
+                <w:sz w:val="19"/>
+              </w:rPr>
+              <w:t xml:space="preserve">Agree with the GM on one previous host’s profession. +2 to the matching skill for tasks that profession knew well, such as a former freighter pilot’s Helm in hazardous atmospheric flight.</w:t>
+            </w:r>
+          </w:p>
+        </w:tc>
+        <w:tc>
+          <w:tcPr/>
+          <w:p>
+            <w:pPr>
+              <w:pStyle w:val="Compact"/>
+              <w:jc w:val="left"/>
+            </w:pPr>
+            <w:r>
+              <w:rPr>
+                <w:bCs/>
+                <w:b/>
+                <w:sz w:val="19"/>
+              </w:rPr>
+              <w:t xml:space="preserve">Conflicting Memories.</w:t>
+            </w:r>
+            <w:r>
+              <w:rPr>
+                <w:sz w:val="19"/>
+              </w:rPr>
+              <w:t xml:space="preserve"> </w:t>
+            </w:r>
+            <w:r>
+              <w:rPr>
+                <w:sz w:val="19"/>
+              </w:rPr>
+              <w:t xml:space="preserve">A past host’s habit, loyalty, or old grudge surfaces at a bad moment. Accept the distraction or the trouble it brings.</w:t>
+            </w:r>
+          </w:p>
+        </w:tc>
+      </w:tr>
+    </w:tbl>
     <w:bookmarkEnd w:id="77"/>
-    <w:bookmarkStart w:id="79" w:name="complications"/>
+    <w:bookmarkEnd w:id="78"/>
+    <w:bookmarkStart w:id="80" w:name="complications"/>
     <w:p>
       <w:pPr>
         <w:pStyle w:val="Heading1"/>
@@ -9587,7 +9860,7 @@
         </w:tc>
       </w:tr>
     </w:tbl>
-    <w:bookmarkStart w:id="78" w:name="using-and-revising-traits"/>
+    <w:bookmarkStart w:id="79" w:name="using-and-revising-traits"/>
     <w:p>
       <w:pPr>
         <w:pStyle w:val="Heading2"/>
@@ -9604,9 +9877,9 @@
         <w:t xml:space="preserve">General advantages and complications describe individual crew members and can suit any species when appropriate. A Vulcan might choose Mental Discipline as a general advantage; species advantages are the only traits tied to a species. At a mission milestone, revise a trait when events change the character. Custom advantages follow the same narrow +2 benefit; custom complications need a clear trigger and a meaningful, accepted consequence.</w:t>
       </w:r>
     </w:p>
-    <w:bookmarkEnd w:id="78"/>
     <w:bookmarkEnd w:id="79"/>
-    <w:bookmarkStart w:id="83" w:name="quick-reference"/>
+    <w:bookmarkEnd w:id="80"/>
+    <w:bookmarkStart w:id="84" w:name="quick-reference"/>
     <w:p>
       <w:pPr>
         <w:pStyle w:val="Heading1"/>
@@ -9615,7 +9888,7 @@
         <w:t xml:space="preserve">Quick reference</w:t>
       </w:r>
     </w:p>
-    <w:bookmarkStart w:id="80" w:name="will-and-mental-resistance"/>
+    <w:bookmarkStart w:id="81" w:name="will-and-mental-resistance"/>
     <w:p>
       <w:pPr>
         <w:pStyle w:val="Heading2"/>
@@ -9648,8 +9921,8 @@
         <w:t xml:space="preserve">Will protects your resolve; Presence influences others. Leadership and Diplomacy still use Presence. Species adjustments may change your starting Will, but mental advantages apply only to their agreed, narrow circumstances.</w:t>
       </w:r>
     </w:p>
-    <w:bookmarkEnd w:id="80"/>
-    <w:bookmarkStart w:id="81" w:name="at-the-table"/>
+    <w:bookmarkEnd w:id="81"/>
+    <w:bookmarkStart w:id="82" w:name="at-the-table"/>
     <w:p>
       <w:pPr>
         <w:pStyle w:val="Heading2"/>
@@ -9718,8 +9991,8 @@
         <w:t xml:space="preserve">Apply the result and describe what changes.</w:t>
       </w:r>
     </w:p>
-    <w:bookmarkEnd w:id="81"/>
-    <w:bookmarkStart w:id="82" w:name="summary"/>
+    <w:bookmarkEnd w:id="82"/>
+    <w:bookmarkStart w:id="83" w:name="summary"/>
     <w:p>
       <w:pPr>
         <w:pStyle w:val="Heading2"/>
@@ -9890,8 +10163,8 @@
         <w:t xml:space="preserve">start each session with two. Spend one to reroll, reduce an injury by one box, or establish a plausible preparation. Earn one when an accepted complication, including a companion complication, creates a meaningful problem.</w:t>
       </w:r>
     </w:p>
-    <w:bookmarkEnd w:id="82"/>
     <w:bookmarkEnd w:id="83"/>
+    <w:bookmarkEnd w:id="84"/>
     <w:sectPr/>
   </w:body>
 </w:document>

</xml_diff>

<commit_message>
Add Saurian as a playable species
Body +1, Intellect +1, Agility -1, Presence -1, with Scaled Hide
(companion: Cold-Blooded) and Low-Light Eyes (companion: Glare
Sensitivity). Added to the creator and the guide.

Co-Authored-By: Claude Opus 5.5 <noreply@anthropic.com>
Claude-Session: https://claude.ai/code/session_015SADCFzhKijkC2foUmXrpC
</commit_message>
<xml_diff>
--- a/uss-pelion/USS_Pelion_Players_Guide.docx
+++ b/uss-pelion/USS_Pelion_Players_Guide.docx
@@ -1726,6 +1726,39 @@
           </w:p>
         </w:tc>
       </w:tr>
+      <w:tr>
+        <w:tc>
+          <w:tcPr/>
+          <w:p>
+            <w:pPr>
+              <w:pStyle w:val="Compact"/>
+              <w:jc w:val="left"/>
+            </w:pPr>
+            <w:r>
+              <w:rPr>
+                <w:b/>
+                <w:sz w:val="19"/>
+              </w:rPr>
+              <w:t xml:space="preserve">Saurian</w:t>
+            </w:r>
+          </w:p>
+        </w:tc>
+        <w:tc>
+          <w:tcPr/>
+          <w:p>
+            <w:pPr>
+              <w:pStyle w:val="Compact"/>
+              <w:jc w:val="left"/>
+            </w:pPr>
+            <w:r>
+              <w:rPr>
+                <w:sz w:val="19"/>
+              </w:rPr>
+              <w:t xml:space="preserve">Body +1, Intellect +1, Agility −1, Presence −1</w:t>
+            </w:r>
+          </w:p>
+        </w:tc>
+      </w:tr>
     </w:tbl>
     <w:bookmarkEnd w:id="26"/>
     <w:bookmarkStart w:id="27" w:name="spending-points"/>
@@ -2022,6 +2055,24 @@
       </w:r>
       <w:r>
         <w:t xml:space="preserve">A spotted humanoid people, some of whom are joined with a long-lived symbiont that carries the memories of its earlier hosts. In this era the Trill keep joining a closely guarded secret from outsiders, Starfleet included. An unjoined Trill uses the same adjustments; the species advantages below need a symbiont.</w:t>
+      </w:r>
+    </w:p>
+    <w:p>
+      <w:pPr>
+        <w:pStyle w:val="BodyText"/>
+      </w:pPr>
+      <w:r>
+        <w:rPr>
+          <w:bCs/>
+          <w:b/>
+        </w:rPr>
+        <w:t xml:space="preserve">Saurian.</w:t>
+      </w:r>
+      <w:r>
+        <w:t xml:space="preserve"> </w:t>
+      </w:r>
+      <w:r>
+        <w:t xml:space="preserve">A reptilian people with tough scaled skin and large, dark eyes, known across the quadrant for Saurian brandy. Lt. Linus served aboard USS Discovery in the 2250s.</w:t>
       </w:r>
     </w:p>
     <w:bookmarkEnd w:id="28"/>
@@ -6550,7 +6601,7 @@
       </w:tr>
     </w:tbl>
     <w:bookmarkEnd w:id="65"/>
-    <w:bookmarkStart w:id="78" w:name="species-advantages"/>
+    <w:bookmarkStart w:id="79" w:name="species-advantages"/>
     <w:p>
       <w:pPr>
         <w:pStyle w:val="Heading1"/>
@@ -9253,8 +9304,222 @@
       </w:tr>
     </w:tbl>
     <w:bookmarkEnd w:id="77"/>
+    <w:bookmarkStart w:id="78" w:name="saurian"/>
+    <w:p>
+      <w:pPr>
+        <w:pStyle w:val="Heading2"/>
+      </w:pPr>
+      <w:r>
+        <w:t xml:space="preserve">Saurian</w:t>
+      </w:r>
+    </w:p>
+    <w:tbl>
+      <w:tblPr>
+        <w:tblStyle w:val="Table"/>
+        <w:tblW w:type="pct" w:w="5000"/>
+        <w:tblLook w:firstRow="1" w:lastRow="0" w:firstColumn="0" w:lastColumn="0" w:noHBand="0" w:noVBand="0" w:val="0020"/>
+        <w:jc w:val="start"/>
+        <w:tblBorders>
+          <w:top w:val="single" w:sz="4" w:color="B8C2D3"/>
+          <w:left w:val="single" w:sz="4" w:color="B8C2D3"/>
+          <w:bottom w:val="single" w:sz="4" w:color="B8C2D3"/>
+          <w:right w:val="single" w:sz="4" w:color="B8C2D3"/>
+          <w:insideH w:val="single" w:sz="4" w:color="B8C2D3"/>
+          <w:insideV w:val="single" w:sz="4" w:color="B8C2D3"/>
+        </w:tblBorders>
+      </w:tblPr>
+      <w:tblGrid>
+        <w:gridCol w:w="2640"/>
+        <w:gridCol w:w="2640"/>
+        <w:gridCol w:w="2640"/>
+      </w:tblGrid>
+      <w:tr>
+        <w:trPr>
+          <w:tblHeader w:val="true"/>
+        </w:trPr>
+        <w:tc>
+          <w:tcPr>
+            <w:shd w:val="clear" w:fill="E9EEF6"/>
+          </w:tcPr>
+          <w:p>
+            <w:pPr>
+              <w:pStyle w:val="Compact"/>
+              <w:jc w:val="left"/>
+            </w:pPr>
+            <w:r>
+              <w:rPr>
+                <w:b/>
+                <w:sz w:val="19"/>
+              </w:rPr>
+              <w:t xml:space="preserve">Advantage</w:t>
+            </w:r>
+          </w:p>
+        </w:tc>
+        <w:tc>
+          <w:tcPr>
+            <w:shd w:val="clear" w:fill="E9EEF6"/>
+          </w:tcPr>
+          <w:p>
+            <w:pPr>
+              <w:pStyle w:val="Compact"/>
+              <w:jc w:val="left"/>
+            </w:pPr>
+            <w:r>
+              <w:rPr>
+                <w:b/>
+                <w:sz w:val="19"/>
+              </w:rPr>
+              <w:t xml:space="preserve">Effect</w:t>
+            </w:r>
+          </w:p>
+        </w:tc>
+        <w:tc>
+          <w:tcPr>
+            <w:shd w:val="clear" w:fill="E9EEF6"/>
+          </w:tcPr>
+          <w:p>
+            <w:pPr>
+              <w:pStyle w:val="Compact"/>
+              <w:jc w:val="left"/>
+            </w:pPr>
+            <w:r>
+              <w:rPr>
+                <w:b/>
+                <w:sz w:val="19"/>
+              </w:rPr>
+              <w:t xml:space="preserve">Companion complication</w:t>
+            </w:r>
+          </w:p>
+        </w:tc>
+      </w:tr>
+      <w:tr>
+        <w:tc>
+          <w:tcPr/>
+          <w:p>
+            <w:pPr>
+              <w:pStyle w:val="Compact"/>
+              <w:jc w:val="left"/>
+            </w:pPr>
+            <w:r>
+              <w:rPr>
+                <w:b/>
+                <w:sz w:val="19"/>
+              </w:rPr>
+              <w:t xml:space="preserve">Scaled Hide</w:t>
+            </w:r>
+          </w:p>
+        </w:tc>
+        <w:tc>
+          <w:tcPr/>
+          <w:p>
+            <w:pPr>
+              <w:pStyle w:val="Compact"/>
+              <w:jc w:val="left"/>
+            </w:pPr>
+            <w:r>
+              <w:rPr>
+                <w:sz w:val="19"/>
+              </w:rPr>
+              <w:t xml:space="preserve">+2 to Body when resisting heat, harsh sunlight, or a toxic atmosphere. It does not protect against weapons, vacuum, or radiation.</w:t>
+            </w:r>
+          </w:p>
+        </w:tc>
+        <w:tc>
+          <w:tcPr/>
+          <w:p>
+            <w:pPr>
+              <w:pStyle w:val="Compact"/>
+              <w:jc w:val="left"/>
+            </w:pPr>
+            <w:r>
+              <w:rPr>
+                <w:bCs/>
+                <w:b/>
+                <w:sz w:val="19"/>
+              </w:rPr>
+              <w:t xml:space="preserve">Cold-Blooded.</w:t>
+            </w:r>
+            <w:r>
+              <w:rPr>
+                <w:sz w:val="19"/>
+              </w:rPr>
+              <w:t xml:space="preserve"> </w:t>
+            </w:r>
+            <w:r>
+              <w:rPr>
+                <w:sz w:val="19"/>
+              </w:rPr>
+              <w:t xml:space="preserve">Cold slows you down. When cold is a real factor, accept −2 on physical actions for the scene or stop to warm up.</w:t>
+            </w:r>
+          </w:p>
+        </w:tc>
+      </w:tr>
+      <w:tr>
+        <w:tc>
+          <w:tcPr/>
+          <w:p>
+            <w:pPr>
+              <w:pStyle w:val="Compact"/>
+              <w:jc w:val="left"/>
+            </w:pPr>
+            <w:r>
+              <w:rPr>
+                <w:b/>
+                <w:sz w:val="19"/>
+              </w:rPr>
+              <w:t xml:space="preserve">Low-Light Eyes</w:t>
+            </w:r>
+          </w:p>
+        </w:tc>
+        <w:tc>
+          <w:tcPr/>
+          <w:p>
+            <w:pPr>
+              <w:pStyle w:val="Compact"/>
+              <w:jc w:val="left"/>
+            </w:pPr>
+            <w:r>
+              <w:rPr>
+                <w:sz w:val="19"/>
+              </w:rPr>
+              <w:t xml:space="preserve">+2 to Intellect rolls to notice movement or detail in dim light or near-darkness.</w:t>
+            </w:r>
+          </w:p>
+        </w:tc>
+        <w:tc>
+          <w:tcPr/>
+          <w:p>
+            <w:pPr>
+              <w:pStyle w:val="Compact"/>
+              <w:jc w:val="left"/>
+            </w:pPr>
+            <w:r>
+              <w:rPr>
+                <w:bCs/>
+                <w:b/>
+                <w:sz w:val="19"/>
+              </w:rPr>
+              <w:t xml:space="preserve">Glare Sensitivity.</w:t>
+            </w:r>
+            <w:r>
+              <w:rPr>
+                <w:sz w:val="19"/>
+              </w:rPr>
+              <w:t xml:space="preserve"> </w:t>
+            </w:r>
+            <w:r>
+              <w:rPr>
+                <w:sz w:val="19"/>
+              </w:rPr>
+              <w:t xml:space="preserve">Sudden bright light dazzles you. When a flare, a phaser flash in the dark, or harsh sunlight hits, accept −2 on your next action.</w:t>
+            </w:r>
+          </w:p>
+        </w:tc>
+      </w:tr>
+    </w:tbl>
     <w:bookmarkEnd w:id="78"/>
-    <w:bookmarkStart w:id="80" w:name="complications"/>
+    <w:bookmarkEnd w:id="79"/>
+    <w:bookmarkStart w:id="81" w:name="complications"/>
     <w:p>
       <w:pPr>
         <w:pStyle w:val="Heading1"/>
@@ -9860,7 +10125,7 @@
         </w:tc>
       </w:tr>
     </w:tbl>
-    <w:bookmarkStart w:id="79" w:name="using-and-revising-traits"/>
+    <w:bookmarkStart w:id="80" w:name="using-and-revising-traits"/>
     <w:p>
       <w:pPr>
         <w:pStyle w:val="Heading2"/>
@@ -9877,9 +10142,9 @@
         <w:t xml:space="preserve">General advantages and complications describe individual crew members and can suit any species when appropriate. A Vulcan might choose Mental Discipline as a general advantage; species advantages are the only traits tied to a species. At a mission milestone, revise a trait when events change the character. Custom advantages follow the same narrow +2 benefit; custom complications need a clear trigger and a meaningful, accepted consequence.</w:t>
       </w:r>
     </w:p>
-    <w:bookmarkEnd w:id="79"/>
     <w:bookmarkEnd w:id="80"/>
-    <w:bookmarkStart w:id="84" w:name="quick-reference"/>
+    <w:bookmarkEnd w:id="81"/>
+    <w:bookmarkStart w:id="85" w:name="quick-reference"/>
     <w:p>
       <w:pPr>
         <w:pStyle w:val="Heading1"/>
@@ -9888,7 +10153,7 @@
         <w:t xml:space="preserve">Quick reference</w:t>
       </w:r>
     </w:p>
-    <w:bookmarkStart w:id="81" w:name="will-and-mental-resistance"/>
+    <w:bookmarkStart w:id="82" w:name="will-and-mental-resistance"/>
     <w:p>
       <w:pPr>
         <w:pStyle w:val="Heading2"/>
@@ -9921,8 +10186,8 @@
         <w:t xml:space="preserve">Will protects your resolve; Presence influences others. Leadership and Diplomacy still use Presence. Species adjustments may change your starting Will, but mental advantages apply only to their agreed, narrow circumstances.</w:t>
       </w:r>
     </w:p>
-    <w:bookmarkEnd w:id="81"/>
-    <w:bookmarkStart w:id="82" w:name="at-the-table"/>
+    <w:bookmarkEnd w:id="82"/>
+    <w:bookmarkStart w:id="83" w:name="at-the-table"/>
     <w:p>
       <w:pPr>
         <w:pStyle w:val="Heading2"/>
@@ -9991,8 +10256,8 @@
         <w:t xml:space="preserve">Apply the result and describe what changes.</w:t>
       </w:r>
     </w:p>
-    <w:bookmarkEnd w:id="82"/>
-    <w:bookmarkStart w:id="83" w:name="summary"/>
+    <w:bookmarkEnd w:id="83"/>
+    <w:bookmarkStart w:id="84" w:name="summary"/>
     <w:p>
       <w:pPr>
         <w:pStyle w:val="Heading2"/>
@@ -10163,8 +10428,8 @@
         <w:t xml:space="preserve">start each session with two. Spend one to reroll, reduce an injury by one box, or establish a plausible preparation. Earn one when an accepted complication, including a companion complication, creates a meaningful problem.</w:t>
       </w:r>
     </w:p>
-    <w:bookmarkEnd w:id="83"/>
     <w:bookmarkEnd w:id="84"/>
+    <w:bookmarkEnd w:id="85"/>
     <w:sectPr/>
   </w:body>
 </w:document>

</xml_diff>

<commit_message>
Add a Top 10 reasons for joining Starfleet quick pick
A dropdown above "Why you serve" fills in one of ten reasons, replacing an
empty box or an earlier pick and adding to anything the player wrote. The
same list is in the Players' Guide under Step 4.

Co-Authored-By: Claude Opus 5.5 <noreply@anthropic.com>
Claude-Session: https://claude.ai/code/session_015SADCFzhKijkC2foUmXrpC
</commit_message>
<xml_diff>
--- a/uss-pelion/USS_Pelion_Players_Guide.docx
+++ b/uss-pelion/USS_Pelion_Players_Guide.docx
@@ -260,7 +260,7 @@
       </w:r>
     </w:p>
     <w:bookmarkEnd w:id="22"/>
-    <w:bookmarkStart w:id="35" w:name="create-your-character"/>
+    <w:bookmarkStart w:id="36" w:name="create-your-character"/>
     <w:p>
       <w:pPr>
         <w:pStyle w:val="Heading1"/>
@@ -2161,7 +2161,7 @@
       </w:r>
     </w:p>
     <w:bookmarkEnd w:id="31"/>
-    <w:bookmarkStart w:id="32" w:name="step-4-describe-your-character"/>
+    <w:bookmarkStart w:id="33" w:name="step-4-describe-your-character"/>
     <w:p>
       <w:pPr>
         <w:pStyle w:val="Heading2"/>
@@ -2207,6 +2207,23 @@
         <w:t xml:space="preserve">.</w:t>
       </w:r>
     </w:p>
+    <w:bookmarkStart w:id="32" w:name="top-10-reasons-for-joining-starfleet"/>
+    <w:p>
+      <w:pPr>
+        <w:pStyle w:val="Heading3"/>
+      </w:pPr>
+      <w:r>
+        <w:t xml:space="preserve">Top 10 reasons for joining Starfleet</w:t>
+      </w:r>
+    </w:p>
+    <w:p>
+      <w:pPr>
+        <w:pStyle w:val="FirstParagraph"/>
+      </w:pPr>
+      <w:r>
+        <w:t xml:space="preserve">Pick one as a starting point and make it your own, or write something else entirely.</w:t>
+      </w:r>
+    </w:p>
     <w:p>
       <w:pPr>
         <w:numPr>
@@ -2220,13 +2237,13 @@
           <w:bCs/>
           <w:b/>
         </w:rPr>
-        <w:t xml:space="preserve">Advantage.</w:t>
+        <w:t xml:space="preserve">Explore the unknown.</w:t>
       </w:r>
       <w:r>
         <w:t xml:space="preserve"> </w:t>
       </w:r>
       <w:r>
-        <w:t xml:space="preserve">Choose either a general advantage or one of your species’ advantages. A species advantage replaces the general advantage and always brings its companion complication.</w:t>
+        <w:t xml:space="preserve">To see what’s out there: strange new worlds and phenomena no one has charted yet.</w:t>
       </w:r>
     </w:p>
     <w:p>
@@ -2242,6 +2259,226 @@
           <w:bCs/>
           <w:b/>
         </w:rPr>
+        <w:t xml:space="preserve">Family tradition.</w:t>
+      </w:r>
+      <w:r>
+        <w:t xml:space="preserve"> </w:t>
+      </w:r>
+      <w:r>
+        <w:t xml:space="preserve">Starfleet runs in my family, and I mean to live up to the name.</w:t>
+      </w:r>
+    </w:p>
+    <w:p>
+      <w:pPr>
+        <w:numPr>
+          <w:ilvl w:val="0"/>
+          <w:numId w:val="1003"/>
+        </w:numPr>
+        <w:pStyle w:val="Compact"/>
+      </w:pPr>
+      <w:r>
+        <w:rPr>
+          <w:bCs/>
+          <w:b/>
+        </w:rPr>
+        <w:t xml:space="preserve">Science and discovery.</w:t>
+      </w:r>
+      <w:r>
+        <w:t xml:space="preserve"> </w:t>
+      </w:r>
+      <w:r>
+        <w:t xml:space="preserve">The best laboratory in the galaxy is a starship on the frontier.</w:t>
+      </w:r>
+    </w:p>
+    <w:p>
+      <w:pPr>
+        <w:numPr>
+          <w:ilvl w:val="0"/>
+          <w:numId w:val="1003"/>
+        </w:numPr>
+        <w:pStyle w:val="Compact"/>
+      </w:pPr>
+      <w:r>
+        <w:rPr>
+          <w:bCs/>
+          <w:b/>
+        </w:rPr>
+        <w:t xml:space="preserve">Protect others.</w:t>
+      </w:r>
+      <w:r>
+        <w:t xml:space="preserve"> </w:t>
+      </w:r>
+      <w:r>
+        <w:t xml:space="preserve">To protect the Federation and the people who can’t protect themselves.</w:t>
+      </w:r>
+    </w:p>
+    <w:p>
+      <w:pPr>
+        <w:numPr>
+          <w:ilvl w:val="0"/>
+          <w:numId w:val="1003"/>
+        </w:numPr>
+        <w:pStyle w:val="Compact"/>
+      </w:pPr>
+      <w:r>
+        <w:rPr>
+          <w:bCs/>
+          <w:b/>
+        </w:rPr>
+        <w:t xml:space="preserve">Inspired by a hero.</w:t>
+      </w:r>
+      <w:r>
+        <w:t xml:space="preserve"> </w:t>
+      </w:r>
+      <w:r>
+        <w:t xml:space="preserve">A Starfleet officer once saved my home, and I want to be that person for someone else.</w:t>
+      </w:r>
+    </w:p>
+    <w:p>
+      <w:pPr>
+        <w:numPr>
+          <w:ilvl w:val="0"/>
+          <w:numId w:val="1003"/>
+        </w:numPr>
+        <w:pStyle w:val="Compact"/>
+      </w:pPr>
+      <w:r>
+        <w:rPr>
+          <w:bCs/>
+          <w:b/>
+        </w:rPr>
+        <w:t xml:space="preserve">Believe in the ideals.</w:t>
+      </w:r>
+      <w:r>
+        <w:t xml:space="preserve"> </w:t>
+      </w:r>
+      <w:r>
+        <w:t xml:space="preserve">I believe in what the Federation stands for and want to serve it.</w:t>
+      </w:r>
+    </w:p>
+    <w:p>
+      <w:pPr>
+        <w:numPr>
+          <w:ilvl w:val="0"/>
+          <w:numId w:val="1003"/>
+        </w:numPr>
+        <w:pStyle w:val="Compact"/>
+      </w:pPr>
+      <w:r>
+        <w:rPr>
+          <w:bCs/>
+          <w:b/>
+        </w:rPr>
+        <w:t xml:space="preserve">Prove myself.</w:t>
+      </w:r>
+      <w:r>
+        <w:t xml:space="preserve"> </w:t>
+      </w:r>
+      <w:r>
+        <w:t xml:space="preserve">To prove I’m good enough, to everyone who doubted me and to myself.</w:t>
+      </w:r>
+    </w:p>
+    <w:p>
+      <w:pPr>
+        <w:numPr>
+          <w:ilvl w:val="0"/>
+          <w:numId w:val="1003"/>
+        </w:numPr>
+        <w:pStyle w:val="Compact"/>
+      </w:pPr>
+      <w:r>
+        <w:rPr>
+          <w:bCs/>
+          <w:b/>
+        </w:rPr>
+        <w:t xml:space="preserve">Leave the past behind.</w:t>
+      </w:r>
+      <w:r>
+        <w:t xml:space="preserve"> </w:t>
+      </w:r>
+      <w:r>
+        <w:t xml:space="preserve">To leave behind a past, a world, or a life that was too small for me.</w:t>
+      </w:r>
+    </w:p>
+    <w:p>
+      <w:pPr>
+        <w:numPr>
+          <w:ilvl w:val="0"/>
+          <w:numId w:val="1003"/>
+        </w:numPr>
+        <w:pStyle w:val="Compact"/>
+      </w:pPr>
+      <w:r>
+        <w:rPr>
+          <w:bCs/>
+          <w:b/>
+        </w:rPr>
+        <w:t xml:space="preserve">Make amends.</w:t>
+      </w:r>
+      <w:r>
+        <w:t xml:space="preserve"> </w:t>
+      </w:r>
+      <w:r>
+        <w:t xml:space="preserve">To make up for a mistake I can’t undo.</w:t>
+      </w:r>
+    </w:p>
+    <w:p>
+      <w:pPr>
+        <w:numPr>
+          <w:ilvl w:val="0"/>
+          <w:numId w:val="1003"/>
+        </w:numPr>
+        <w:pStyle w:val="Compact"/>
+      </w:pPr>
+      <w:r>
+        <w:rPr>
+          <w:bCs/>
+          <w:b/>
+        </w:rPr>
+        <w:t xml:space="preserve">Build bridges.</w:t>
+      </w:r>
+      <w:r>
+        <w:t xml:space="preserve"> </w:t>
+      </w:r>
+      <w:r>
+        <w:t xml:space="preserve">To build bridges between my people and the rest of the Federation.</w:t>
+      </w:r>
+    </w:p>
+    <w:p>
+      <w:pPr>
+        <w:numPr>
+          <w:ilvl w:val="0"/>
+          <w:numId w:val="1004"/>
+        </w:numPr>
+        <w:pStyle w:val="Compact"/>
+      </w:pPr>
+      <w:r>
+        <w:rPr>
+          <w:bCs/>
+          <w:b/>
+        </w:rPr>
+        <w:t xml:space="preserve">Advantage.</w:t>
+      </w:r>
+      <w:r>
+        <w:t xml:space="preserve"> </w:t>
+      </w:r>
+      <w:r>
+        <w:t xml:space="preserve">Choose either a general advantage or one of your species’ advantages. A species advantage replaces the general advantage and always brings its companion complication.</w:t>
+      </w:r>
+    </w:p>
+    <w:p>
+      <w:pPr>
+        <w:numPr>
+          <w:ilvl w:val="0"/>
+          <w:numId w:val="1004"/>
+        </w:numPr>
+        <w:pStyle w:val="Compact"/>
+      </w:pPr>
+      <w:r>
+        <w:rPr>
+          <w:bCs/>
+          <w:b/>
+        </w:rPr>
         <w:t xml:space="preserve">Complication.</w:t>
       </w:r>
       <w:r>
@@ -2278,7 +2515,8 @@
       </w:r>
     </w:p>
     <w:bookmarkEnd w:id="32"/>
-    <w:bookmarkStart w:id="33" w:name="step-5-prepare-for-duty"/>
+    <w:bookmarkEnd w:id="33"/>
+    <w:bookmarkStart w:id="34" w:name="step-5-prepare-for-duty"/>
     <w:p>
       <w:pPr>
         <w:pStyle w:val="Heading2"/>
@@ -2295,8 +2533,8 @@
         <w:t xml:space="preserve">Your Dodge is Agility −2, plus your Athletics training bonus: +0 if Untrained, +1 if Trained, or +2 if a Specialty. Begin uninjured, with two Duty points and your assigned equipment. Describe one connection to another crew member.</w:t>
       </w:r>
     </w:p>
-    <w:bookmarkEnd w:id="33"/>
-    <w:bookmarkStart w:id="34" w:name="example-science-officer"/>
+    <w:bookmarkEnd w:id="34"/>
+    <w:bookmarkStart w:id="35" w:name="example-science-officer"/>
     <w:p>
       <w:pPr>
         <w:pStyle w:val="Heading2"/>
@@ -2317,7 +2555,7 @@
       <w:pPr>
         <w:numPr>
           <w:ilvl w:val="0"/>
-          <w:numId w:val="1004"/>
+          <w:numId w:val="1005"/>
         </w:numPr>
         <w:pStyle w:val="Compact"/>
       </w:pPr>
@@ -2339,7 +2577,7 @@
       <w:pPr>
         <w:numPr>
           <w:ilvl w:val="0"/>
-          <w:numId w:val="1004"/>
+          <w:numId w:val="1005"/>
         </w:numPr>
         <w:pStyle w:val="Compact"/>
       </w:pPr>
@@ -2361,7 +2599,7 @@
       <w:pPr>
         <w:numPr>
           <w:ilvl w:val="0"/>
-          <w:numId w:val="1004"/>
+          <w:numId w:val="1005"/>
         </w:numPr>
         <w:pStyle w:val="Compact"/>
       </w:pPr>
@@ -2383,7 +2621,7 @@
       <w:pPr>
         <w:numPr>
           <w:ilvl w:val="0"/>
-          <w:numId w:val="1004"/>
+          <w:numId w:val="1005"/>
         </w:numPr>
         <w:pStyle w:val="Compact"/>
       </w:pPr>
@@ -2417,9 +2655,9 @@
         <w:t xml:space="preserve">Cannot Leave a Mystery Alone.</w:t>
       </w:r>
     </w:p>
-    <w:bookmarkEnd w:id="34"/>
     <w:bookmarkEnd w:id="35"/>
-    <w:bookmarkStart w:id="38" w:name="skills-and-equipment"/>
+    <w:bookmarkEnd w:id="36"/>
+    <w:bookmarkStart w:id="39" w:name="skills-and-equipment"/>
     <w:p>
       <w:pPr>
         <w:pStyle w:val="Heading1"/>
@@ -3380,7 +3618,7 @@
         </w:tc>
       </w:tr>
     </w:tbl>
-    <w:bookmarkStart w:id="36" w:name="untrained-actions"/>
+    <w:bookmarkStart w:id="37" w:name="untrained-actions"/>
     <w:p>
       <w:pPr>
         <w:pStyle w:val="Heading2"/>
@@ -3397,8 +3635,8 @@
         <w:t xml:space="preserve">A plausible untrained attempt uses attribute −4. Specialized procedures such as surgery or warp-core repair require relevant training or direct guidance. Guidance permits an attempt only when the GM finds it credible; it does not automatically grant the expert’s skill.</w:t>
       </w:r>
     </w:p>
-    <w:bookmarkEnd w:id="36"/>
-    <w:bookmarkStart w:id="37" w:name="standard-equipment"/>
+    <w:bookmarkEnd w:id="37"/>
+    <w:bookmarkStart w:id="38" w:name="standard-equipment"/>
     <w:p>
       <w:pPr>
         <w:pStyle w:val="Heading2"/>
@@ -3423,9 +3661,9 @@
         <w:t xml:space="preserve">Transporters, computers, and scanners have limits set by the situation. State the information or destination you need. A successful scan reveals useful evidence, not necessarily the complete explanation.</w:t>
       </w:r>
     </w:p>
-    <w:bookmarkEnd w:id="37"/>
     <w:bookmarkEnd w:id="38"/>
-    <w:bookmarkStart w:id="44" w:name="actions-and-teamwork"/>
+    <w:bookmarkEnd w:id="39"/>
+    <w:bookmarkStart w:id="45" w:name="actions-and-teamwork"/>
     <w:p>
       <w:pPr>
         <w:pStyle w:val="Heading1"/>
@@ -3434,7 +3672,7 @@
         <w:t xml:space="preserve">Actions and teamwork</w:t>
       </w:r>
     </w:p>
-    <w:bookmarkStart w:id="39" w:name="when-to-roll"/>
+    <w:bookmarkStart w:id="40" w:name="when-to-roll"/>
     <w:p>
       <w:pPr>
         <w:pStyle w:val="Heading2"/>
@@ -3685,8 +3923,8 @@
         <w:t xml:space="preserve">Apply the main circumstance modifier once. Add separately specified effects such as assistance or injury when they apply. The GM avoids charging twice for the same obstacle.</w:t>
       </w:r>
     </w:p>
-    <w:bookmarkEnd w:id="39"/>
-    <w:bookmarkStart w:id="40" w:name="results-and-margins"/>
+    <w:bookmarkEnd w:id="40"/>
+    <w:bookmarkStart w:id="41" w:name="results-and-margins"/>
     <w:p>
       <w:pPr>
         <w:pStyle w:val="Heading2"/>
@@ -3719,8 +3957,8 @@
         <w:t xml:space="preserve">In an opposed contest, each side rolls its relevant skill. One success beats one failure. If both succeed, the larger success margin wins. A tie, or two failures, favors the defender or preserves the situation. For an automatic success above its target, count its contest margin as zero.</w:t>
       </w:r>
     </w:p>
-    <w:bookmarkEnd w:id="40"/>
-    <w:bookmarkStart w:id="41" w:name="assistance"/>
+    <w:bookmarkEnd w:id="41"/>
+    <w:bookmarkStart w:id="42" w:name="assistance"/>
     <w:p>
       <w:pPr>
         <w:pStyle w:val="Heading2"/>
@@ -3755,8 +3993,8 @@
         <w:t xml:space="preserve">Engineering detects that an alien device is building an overload. A science officer assists with Physical Sciences 14 and rolls 9, succeeding by 5. The engineer receives +2 to the repair attempt. Each officer contributes a different kind of expertise.</w:t>
       </w:r>
     </w:p>
-    <w:bookmarkEnd w:id="41"/>
-    <w:bookmarkStart w:id="42" w:name="failure-and-another-attempt"/>
+    <w:bookmarkEnd w:id="42"/>
+    <w:bookmarkStart w:id="43" w:name="failure-and-another-attempt"/>
     <w:p>
       <w:pPr>
         <w:pStyle w:val="Heading2"/>
@@ -3773,8 +4011,8 @@
         <w:t xml:space="preserve">Failure changes the situation: time passes, information remains incomplete, resources are consumed, or danger increases. Do not repeat an unchanged roll until it succeeds. A new approach, new evidence, better tools, or additional time may justify another attempt.</w:t>
       </w:r>
     </w:p>
-    <w:bookmarkEnd w:id="42"/>
-    <w:bookmarkStart w:id="43" w:name="investigation-and-social-scenes"/>
+    <w:bookmarkEnd w:id="43"/>
+    <w:bookmarkStart w:id="44" w:name="investigation-and-social-scenes"/>
     <w:p>
       <w:pPr>
         <w:pStyle w:val="Heading2"/>
@@ -3791,9 +4029,9 @@
         <w:t xml:space="preserve">Ask concrete questions and explain your approach. Evidence may require several different tasks. Diplomacy can secure cooperation or concessions, while Psychology offers insight into behavior. A successful roll does not force someone to abandon a core belief or provide information they do not possess.</w:t>
       </w:r>
     </w:p>
-    <w:bookmarkEnd w:id="43"/>
     <w:bookmarkEnd w:id="44"/>
-    <w:bookmarkStart w:id="51" w:name="personal-combat"/>
+    <w:bookmarkEnd w:id="45"/>
+    <w:bookmarkStart w:id="52" w:name="personal-combat"/>
     <w:p>
       <w:pPr>
         <w:pStyle w:val="Heading1"/>
@@ -3802,7 +4040,7 @@
         <w:t xml:space="preserve">Personal combat</w:t>
       </w:r>
     </w:p>
-    <w:bookmarkStart w:id="45" w:name="turn-order-and-actions"/>
+    <w:bookmarkStart w:id="46" w:name="turn-order-and-actions"/>
     <w:p>
       <w:pPr>
         <w:pStyle w:val="Heading2"/>
@@ -3819,8 +4057,8 @@
         <w:t xml:space="preserve">Act in descending Agility order. Players choose the order of tied crew members; the GM resolves other ties. A round lasts a few seconds. On your turn, move a short distance and take one meaningful action, such as attacking, using equipment, helping, or attempting a task. The GM judges movement by the scene; there is no fixed grid scale.</w:t>
       </w:r>
     </w:p>
-    <w:bookmarkEnd w:id="45"/>
-    <w:bookmarkStart w:id="46" w:name="attacking-and-defending"/>
+    <w:bookmarkEnd w:id="46"/>
+    <w:bookmarkStart w:id="47" w:name="attacking-and-defending"/>
     <w:p>
       <w:pPr>
         <w:pStyle w:val="Heading2"/>
@@ -3845,8 +4083,8 @@
         <w:t xml:space="preserve">Solid cover blocks a shot. Partial cover imposes −2 on the attack. Other difficult conditions use the normal modifier scale. Weapon effects apply after a hit survives any Dodge. Success margin does not increase damage under these rules.</w:t>
       </w:r>
     </w:p>
-    <w:bookmarkEnd w:id="46"/>
-    <w:bookmarkStart w:id="48" w:name="injury"/>
+    <w:bookmarkEnd w:id="47"/>
+    <w:bookmarkStart w:id="49" w:name="injury"/>
     <w:p>
       <w:pPr>
         <w:pStyle w:val="Heading2"/>
@@ -4135,7 +4373,7 @@
         <w:t xml:space="preserve">A normal damaging hit marks one box. A powerful attack can mark two, and a killing weapon marks three (see Weapons and damage). Injury penalties replace each other rather than stacking. They apply to movement, attacks, Dodge, and other tasks the injury physically hinders. The GM announces especially lethal hazards before resolution where possible.</w:t>
       </w:r>
     </w:p>
-    <w:bookmarkStart w:id="47" w:name="dying-and-death"/>
+    <w:bookmarkStart w:id="48" w:name="dying-and-death"/>
     <w:p>
       <w:pPr>
         <w:pStyle w:val="Heading3"/>
@@ -4156,7 +4394,7 @@
       <w:pPr>
         <w:numPr>
           <w:ilvl w:val="0"/>
-          <w:numId w:val="1005"/>
+          <w:numId w:val="1006"/>
         </w:numPr>
         <w:pStyle w:val="Compact"/>
       </w:pPr>
@@ -4191,7 +4429,7 @@
       <w:pPr>
         <w:numPr>
           <w:ilvl w:val="0"/>
-          <w:numId w:val="1005"/>
+          <w:numId w:val="1006"/>
         </w:numPr>
         <w:pStyle w:val="Compact"/>
       </w:pPr>
@@ -4213,7 +4451,7 @@
       <w:pPr>
         <w:numPr>
           <w:ilvl w:val="0"/>
-          <w:numId w:val="1005"/>
+          <w:numId w:val="1006"/>
         </w:numPr>
         <w:pStyle w:val="Compact"/>
       </w:pPr>
@@ -4239,9 +4477,9 @@
         <w:t xml:space="preserve">Your protection is avoiding the hit: Dodge, cover, and a Duty point, which reduces a kill shot from three boxes to two, leaving you Seriously wounded but on your feet.</w:t>
       </w:r>
     </w:p>
-    <w:bookmarkEnd w:id="47"/>
     <w:bookmarkEnd w:id="48"/>
-    <w:bookmarkStart w:id="49" w:name="weapons-and-damage"/>
+    <w:bookmarkEnd w:id="49"/>
+    <w:bookmarkStart w:id="50" w:name="weapons-and-damage"/>
     <w:p>
       <w:pPr>
         <w:pStyle w:val="Heading2"/>
@@ -4905,8 +5143,8 @@
         <w:t xml:space="preserve">To take someone down without hurting them, use a phaser on stun, a grapple, or the Vulcan nerve pinch rather than a weapon from this list.</w:t>
       </w:r>
     </w:p>
-    <w:bookmarkEnd w:id="49"/>
-    <w:bookmarkStart w:id="50" w:name="phaser-settings"/>
+    <w:bookmarkEnd w:id="50"/>
+    <w:bookmarkStart w:id="51" w:name="phaser-settings"/>
     <w:p>
       <w:pPr>
         <w:pStyle w:val="Heading2"/>
@@ -5083,9 +5321,9 @@
         <w:t xml:space="preserve">Declare the setting before firing. Stun effects do not stack; a later failed resistance roll still incapacitates the target. Unarmed strikes normally mark one box. A grapple uses an opposed Unarmed Combat contest; winning restrains the target while the hold is maintained. Escape uses an action and a new contest.</w:t>
       </w:r>
     </w:p>
-    <w:bookmarkEnd w:id="50"/>
     <w:bookmarkEnd w:id="51"/>
-    <w:bookmarkStart w:id="59" w:name="medical-care"/>
+    <w:bookmarkEnd w:id="52"/>
+    <w:bookmarkStart w:id="60" w:name="medical-care"/>
     <w:p>
       <w:pPr>
         <w:pStyle w:val="Heading1"/>
@@ -5102,7 +5340,7 @@
         <w:t xml:space="preserve">Starfleet physicians in 2268 have advanced diagnostic scanners, potent pharmaceuticals, portable emergency equipment, and sophisticated sickbay facilities. Familiar injuries often respond quickly to treatment. Severe trauma, incompatible biology, missing supplies, and unidentified conditions still challenge an experienced doctor. The treatment values below are campaign rules inspired by the series, rather than numerical rules stated in canon.</w:t>
       </w:r>
     </w:p>
-    <w:bookmarkStart w:id="52" w:name="diagnosis-and-stabilization"/>
+    <w:bookmarkStart w:id="53" w:name="diagnosis-and-stabilization"/>
     <w:p>
       <w:pPr>
         <w:pStyle w:val="Heading2"/>
@@ -5127,8 +5365,8 @@
         <w:t xml:space="preserve">Emergency stabilization takes one action and a successful Medicine roll with a medical kit. It prevents deterioration from the treated injury while the patient is protected from further harm, and it ends Dying. Stabilization alone removes no injury boxes. A patient at three boxes remains incapacitated until treatment clears a box.</w:t>
       </w:r>
     </w:p>
-    <w:bookmarkEnd w:id="52"/>
-    <w:bookmarkStart w:id="53" w:name="field-treatment"/>
+    <w:bookmarkEnd w:id="53"/>
+    <w:bookmarkStart w:id="54" w:name="field-treatment"/>
     <w:p>
       <w:pPr>
         <w:pStyle w:val="Heading2"/>
@@ -5145,8 +5383,8 @@
         <w:t xml:space="preserve">With a medical kit and several uninterrupted minutes, successful Medicine removes one injury box. Success by 5 or more removes two. Each injury receives one field-treatment attempt, even if that attempt fails; further attempts require changed circumstances such as better equipment, new diagnostic information, or access to sickbay. New injuries can receive their own treatment, but cannot justify treating an old injury repeatedly.</w:t>
       </w:r>
     </w:p>
-    <w:bookmarkEnd w:id="53"/>
-    <w:bookmarkStart w:id="54" w:name="sickbay-treatment"/>
+    <w:bookmarkEnd w:id="54"/>
+    <w:bookmarkStart w:id="55" w:name="sickbay-treatment"/>
     <w:p>
       <w:pPr>
         <w:pStyle w:val="Heading2"/>
@@ -5171,8 +5409,8 @@
         <w:t xml:space="preserve">Removing injury boxes removes their associated penalties, but major organ damage, severe burns, and complex internal trauma can still require a procedure and recovery period set by the GM. The physician determines whether the patient is fit for duty. Pain suppression does not itself heal an injury. Stun normally wears off at the end of the scene; prolonged unconsciousness requires assessment.</w:t>
       </w:r>
     </w:p>
-    <w:bookmarkEnd w:id="54"/>
-    <w:bookmarkStart w:id="55" w:name="natural-recovery"/>
+    <w:bookmarkEnd w:id="55"/>
+    <w:bookmarkStart w:id="56" w:name="natural-recovery"/>
     <w:p>
       <w:pPr>
         <w:pStyle w:val="Heading2"/>
@@ -5209,7 +5447,7 @@
       <w:pPr>
         <w:numPr>
           <w:ilvl w:val="0"/>
-          <w:numId w:val="1006"/>
+          <w:numId w:val="1007"/>
         </w:numPr>
         <w:pStyle w:val="Compact"/>
       </w:pPr>
@@ -5231,7 +5469,7 @@
       <w:pPr>
         <w:numPr>
           <w:ilvl w:val="0"/>
-          <w:numId w:val="1006"/>
+          <w:numId w:val="1007"/>
         </w:numPr>
         <w:pStyle w:val="Compact"/>
       </w:pPr>
@@ -5253,7 +5491,7 @@
       <w:pPr>
         <w:numPr>
           <w:ilvl w:val="0"/>
-          <w:numId w:val="1006"/>
+          <w:numId w:val="1007"/>
         </w:numPr>
         <w:pStyle w:val="Compact"/>
       </w:pPr>
@@ -5289,8 +5527,8 @@
         <w:t xml:space="preserve">Ensign Reyes ends a mission Seriously wounded (two boxes). Sickbay is busy with worse cases, so Reyes rests in quarters: one box clears the first day and the second the next, and Reyes is back on duty on the third day.</w:t>
       </w:r>
     </w:p>
-    <w:bookmarkEnd w:id="55"/>
-    <w:bookmarkStart w:id="56" w:name="alien-medicine-and-limits"/>
+    <w:bookmarkEnd w:id="56"/>
+    <w:bookmarkStart w:id="57" w:name="alien-medicine-and-limits"/>
     <w:p>
       <w:pPr>
         <w:pStyle w:val="Heading2"/>
@@ -5315,8 +5553,8 @@
         <w:t xml:space="preserve">Crew of other species may need care suited to their biology. An Alien Physiology Specialist, or a physician with access to the right species data, keeps that care from becoming guesswork.</w:t>
       </w:r>
     </w:p>
-    <w:bookmarkEnd w:id="56"/>
-    <w:bookmarkStart w:id="58" w:name="examples-from-the-original-series"/>
+    <w:bookmarkEnd w:id="57"/>
+    <w:bookmarkStart w:id="59" w:name="examples-from-the-original-series"/>
     <w:p>
       <w:pPr>
         <w:pStyle w:val="Heading2"/>
@@ -5415,7 +5653,7 @@
       <w:r>
         <w:t xml:space="preserve"> </w:t>
       </w:r>
-      <w:hyperlink r:id="rId57">
+      <w:hyperlink r:id="rId58">
         <w:r>
           <w:rPr>
             <w:rStyle w:val="Hyperlink"/>
@@ -5424,9 +5662,9 @@
         </w:r>
       </w:hyperlink>
     </w:p>
-    <w:bookmarkEnd w:id="58"/>
     <w:bookmarkEnd w:id="59"/>
-    <w:bookmarkStart w:id="64" w:name="duty-points-and-bridge-duty"/>
+    <w:bookmarkEnd w:id="60"/>
+    <w:bookmarkStart w:id="65" w:name="duty-points-and-bridge-duty"/>
     <w:p>
       <w:pPr>
         <w:pStyle w:val="Heading1"/>
@@ -5435,7 +5673,7 @@
         <w:t xml:space="preserve">Duty points and bridge duty</w:t>
       </w:r>
     </w:p>
-    <w:bookmarkStart w:id="60" w:name="using-duty-points"/>
+    <w:bookmarkStart w:id="61" w:name="using-duty-points"/>
     <w:p>
       <w:pPr>
         <w:pStyle w:val="Heading2"/>
@@ -5638,8 +5876,8 @@
         <w:t xml:space="preserve">your curiosity tempts you to remain beside an anomaly while the team withdraws. If you accept the resulting separation and danger, the GM awards one Duty point. The point does not remove that danger.</w:t>
       </w:r>
     </w:p>
-    <w:bookmarkEnd w:id="60"/>
-    <w:bookmarkStart w:id="61" w:name="working-on-the-bridge"/>
+    <w:bookmarkEnd w:id="61"/>
+    <w:bookmarkStart w:id="62" w:name="working-on-the-bridge"/>
     <w:p>
       <w:pPr>
         <w:pStyle w:val="Heading2"/>
@@ -5956,8 +6194,8 @@
         <w:t xml:space="preserve">Leadership can assist another officer when orders or coordination meaningfully help. It uses the normal assistance rule and does not provide an automatic bonus to every station.</w:t>
       </w:r>
     </w:p>
-    <w:bookmarkEnd w:id="61"/>
-    <w:bookmarkStart w:id="62" w:name="ship-encounters"/>
+    <w:bookmarkEnd w:id="62"/>
+    <w:bookmarkStart w:id="63" w:name="ship-encounters"/>
     <w:p>
       <w:pPr>
         <w:pStyle w:val="Heading2"/>
@@ -5974,8 +6212,8 @@
         <w:t xml:space="preserve">Ship encounters use descriptive consequences. The GM states what is at stake before rolls and describes changes to shields, hull, systems, and position afterward. Numerical ship damage is outside this guide’s scope.</w:t>
       </w:r>
     </w:p>
-    <w:bookmarkEnd w:id="62"/>
-    <w:bookmarkStart w:id="63" w:name="advancement"/>
+    <w:bookmarkEnd w:id="63"/>
+    <w:bookmarkStart w:id="64" w:name="advancement"/>
     <w:p>
       <w:pPr>
         <w:pStyle w:val="Heading2"/>
@@ -5992,9 +6230,9 @@
         <w:t xml:space="preserve">After a significant mission, the GM may authorize one relevant skill to advance from Untrained to Trained or from Trained to Specialty, or allow revision of an advantage or complication to reflect events. Skills retain the same three training levels after advancement. Advancement follows mission milestones. Attribute and species changes require a separate agreement.</w:t>
       </w:r>
     </w:p>
-    <w:bookmarkEnd w:id="63"/>
     <w:bookmarkEnd w:id="64"/>
-    <w:bookmarkStart w:id="65" w:name="advantages"/>
+    <w:bookmarkEnd w:id="65"/>
+    <w:bookmarkStart w:id="66" w:name="advantages"/>
     <w:p>
       <w:pPr>
         <w:pStyle w:val="Heading1"/>
@@ -6600,8 +6838,8 @@
         </w:tc>
       </w:tr>
     </w:tbl>
-    <w:bookmarkEnd w:id="65"/>
-    <w:bookmarkStart w:id="79" w:name="species-advantages"/>
+    <w:bookmarkEnd w:id="66"/>
+    <w:bookmarkStart w:id="80" w:name="species-advantages"/>
     <w:p>
       <w:pPr>
         <w:pStyle w:val="Heading1"/>
@@ -6666,7 +6904,7 @@
         <w:t xml:space="preserve">A custom species advantage follows the same pattern: a narrow +2 or an ability with agreed limits, paired with a companion complication that has a clear trigger and a real consequence.</w:t>
       </w:r>
     </w:p>
-    <w:bookmarkStart w:id="66" w:name="human"/>
+    <w:bookmarkStart w:id="67" w:name="human"/>
     <w:p>
       <w:pPr>
         <w:pStyle w:val="Heading2"/>
@@ -6879,8 +7117,8 @@
         </w:tc>
       </w:tr>
     </w:tbl>
-    <w:bookmarkEnd w:id="66"/>
-    <w:bookmarkStart w:id="67" w:name="vulcan"/>
+    <w:bookmarkEnd w:id="67"/>
+    <w:bookmarkStart w:id="68" w:name="vulcan"/>
     <w:p>
       <w:pPr>
         <w:pStyle w:val="Heading2"/>
@@ -7155,8 +7393,8 @@
         </w:tc>
       </w:tr>
     </w:tbl>
-    <w:bookmarkEnd w:id="67"/>
-    <w:bookmarkStart w:id="68" w:name="andorian"/>
+    <w:bookmarkEnd w:id="68"/>
+    <w:bookmarkStart w:id="69" w:name="andorian"/>
     <w:p>
       <w:pPr>
         <w:pStyle w:val="Heading2"/>
@@ -7369,8 +7607,8 @@
         </w:tc>
       </w:tr>
     </w:tbl>
-    <w:bookmarkEnd w:id="68"/>
-    <w:bookmarkStart w:id="69" w:name="tellarite"/>
+    <w:bookmarkEnd w:id="69"/>
+    <w:bookmarkStart w:id="70" w:name="tellarite"/>
     <w:p>
       <w:pPr>
         <w:pStyle w:val="Heading2"/>
@@ -7583,8 +7821,8 @@
         </w:tc>
       </w:tr>
     </w:tbl>
-    <w:bookmarkEnd w:id="69"/>
-    <w:bookmarkStart w:id="70" w:name="aenar"/>
+    <w:bookmarkEnd w:id="70"/>
+    <w:bookmarkStart w:id="71" w:name="aenar"/>
     <w:p>
       <w:pPr>
         <w:pStyle w:val="Heading2"/>
@@ -7797,8 +8035,8 @@
         </w:tc>
       </w:tr>
     </w:tbl>
-    <w:bookmarkEnd w:id="70"/>
-    <w:bookmarkStart w:id="71" w:name="illyrian"/>
+    <w:bookmarkEnd w:id="71"/>
+    <w:bookmarkStart w:id="72" w:name="illyrian"/>
     <w:p>
       <w:pPr>
         <w:pStyle w:val="Heading2"/>
@@ -8011,8 +8249,8 @@
         </w:tc>
       </w:tr>
     </w:tbl>
-    <w:bookmarkEnd w:id="71"/>
-    <w:bookmarkStart w:id="72" w:name="lanthanite"/>
+    <w:bookmarkEnd w:id="72"/>
+    <w:bookmarkStart w:id="73" w:name="lanthanite"/>
     <w:p>
       <w:pPr>
         <w:pStyle w:val="Heading2"/>
@@ -8225,8 +8463,8 @@
         </w:tc>
       </w:tr>
     </w:tbl>
-    <w:bookmarkEnd w:id="72"/>
-    <w:bookmarkStart w:id="73" w:name="caitian"/>
+    <w:bookmarkEnd w:id="73"/>
+    <w:bookmarkStart w:id="74" w:name="caitian"/>
     <w:p>
       <w:pPr>
         <w:pStyle w:val="Heading2"/>
@@ -8439,8 +8677,8 @@
         </w:tc>
       </w:tr>
     </w:tbl>
-    <w:bookmarkEnd w:id="73"/>
-    <w:bookmarkStart w:id="74" w:name="aurelian"/>
+    <w:bookmarkEnd w:id="74"/>
+    <w:bookmarkStart w:id="75" w:name="aurelian"/>
     <w:p>
       <w:pPr>
         <w:pStyle w:val="Heading2"/>
@@ -8653,8 +8891,8 @@
         </w:tc>
       </w:tr>
     </w:tbl>
-    <w:bookmarkEnd w:id="74"/>
-    <w:bookmarkStart w:id="75" w:name="orion"/>
+    <w:bookmarkEnd w:id="75"/>
+    <w:bookmarkStart w:id="76" w:name="orion"/>
     <w:p>
       <w:pPr>
         <w:pStyle w:val="Heading2"/>
@@ -8867,8 +9105,8 @@
         </w:tc>
       </w:tr>
     </w:tbl>
-    <w:bookmarkEnd w:id="75"/>
-    <w:bookmarkStart w:id="76" w:name="denobulan"/>
+    <w:bookmarkEnd w:id="76"/>
+    <w:bookmarkStart w:id="77" w:name="denobulan"/>
     <w:p>
       <w:pPr>
         <w:pStyle w:val="Heading2"/>
@@ -9081,8 +9319,8 @@
         </w:tc>
       </w:tr>
     </w:tbl>
-    <w:bookmarkEnd w:id="76"/>
-    <w:bookmarkStart w:id="77" w:name="trill"/>
+    <w:bookmarkEnd w:id="77"/>
+    <w:bookmarkStart w:id="78" w:name="trill"/>
     <w:p>
       <w:pPr>
         <w:pStyle w:val="Heading2"/>
@@ -9303,8 +9541,8 @@
         </w:tc>
       </w:tr>
     </w:tbl>
-    <w:bookmarkEnd w:id="77"/>
-    <w:bookmarkStart w:id="78" w:name="saurian"/>
+    <w:bookmarkEnd w:id="78"/>
+    <w:bookmarkStart w:id="79" w:name="saurian"/>
     <w:p>
       <w:pPr>
         <w:pStyle w:val="Heading2"/>
@@ -9517,9 +9755,9 @@
         </w:tc>
       </w:tr>
     </w:tbl>
-    <w:bookmarkEnd w:id="78"/>
     <w:bookmarkEnd w:id="79"/>
-    <w:bookmarkStart w:id="81" w:name="complications"/>
+    <w:bookmarkEnd w:id="80"/>
+    <w:bookmarkStart w:id="82" w:name="complications"/>
     <w:p>
       <w:pPr>
         <w:pStyle w:val="Heading1"/>
@@ -10125,7 +10363,7 @@
         </w:tc>
       </w:tr>
     </w:tbl>
-    <w:bookmarkStart w:id="80" w:name="using-and-revising-traits"/>
+    <w:bookmarkStart w:id="81" w:name="using-and-revising-traits"/>
     <w:p>
       <w:pPr>
         <w:pStyle w:val="Heading2"/>
@@ -10142,9 +10380,9 @@
         <w:t xml:space="preserve">General advantages and complications describe individual crew members and can suit any species when appropriate. A Vulcan might choose Mental Discipline as a general advantage; species advantages are the only traits tied to a species. At a mission milestone, revise a trait when events change the character. Custom advantages follow the same narrow +2 benefit; custom complications need a clear trigger and a meaningful, accepted consequence.</w:t>
       </w:r>
     </w:p>
-    <w:bookmarkEnd w:id="80"/>
     <w:bookmarkEnd w:id="81"/>
-    <w:bookmarkStart w:id="85" w:name="quick-reference"/>
+    <w:bookmarkEnd w:id="82"/>
+    <w:bookmarkStart w:id="86" w:name="quick-reference"/>
     <w:p>
       <w:pPr>
         <w:pStyle w:val="Heading1"/>
@@ -10153,7 +10391,7 @@
         <w:t xml:space="preserve">Quick reference</w:t>
       </w:r>
     </w:p>
-    <w:bookmarkStart w:id="82" w:name="will-and-mental-resistance"/>
+    <w:bookmarkStart w:id="83" w:name="will-and-mental-resistance"/>
     <w:p>
       <w:pPr>
         <w:pStyle w:val="Heading2"/>
@@ -10186,8 +10424,8 @@
         <w:t xml:space="preserve">Will protects your resolve; Presence influences others. Leadership and Diplomacy still use Presence. Species adjustments may change your starting Will, but mental advantages apply only to their agreed, narrow circumstances.</w:t>
       </w:r>
     </w:p>
-    <w:bookmarkEnd w:id="82"/>
-    <w:bookmarkStart w:id="83" w:name="at-the-table"/>
+    <w:bookmarkEnd w:id="83"/>
+    <w:bookmarkStart w:id="84" w:name="at-the-table"/>
     <w:p>
       <w:pPr>
         <w:pStyle w:val="Heading2"/>
@@ -10200,7 +10438,7 @@
       <w:pPr>
         <w:numPr>
           <w:ilvl w:val="0"/>
-          <w:numId w:val="1007"/>
+          <w:numId w:val="1008"/>
         </w:numPr>
         <w:pStyle w:val="Compact"/>
       </w:pPr>
@@ -10212,7 +10450,7 @@
       <w:pPr>
         <w:numPr>
           <w:ilvl w:val="0"/>
-          <w:numId w:val="1007"/>
+          <w:numId w:val="1008"/>
         </w:numPr>
         <w:pStyle w:val="Compact"/>
       </w:pPr>
@@ -10224,7 +10462,7 @@
       <w:pPr>
         <w:numPr>
           <w:ilvl w:val="0"/>
-          <w:numId w:val="1007"/>
+          <w:numId w:val="1008"/>
         </w:numPr>
         <w:pStyle w:val="Compact"/>
       </w:pPr>
@@ -10236,7 +10474,7 @@
       <w:pPr>
         <w:numPr>
           <w:ilvl w:val="0"/>
-          <w:numId w:val="1007"/>
+          <w:numId w:val="1008"/>
         </w:numPr>
         <w:pStyle w:val="Compact"/>
       </w:pPr>
@@ -10248,7 +10486,7 @@
       <w:pPr>
         <w:numPr>
           <w:ilvl w:val="0"/>
-          <w:numId w:val="1007"/>
+          <w:numId w:val="1008"/>
         </w:numPr>
         <w:pStyle w:val="Compact"/>
       </w:pPr>
@@ -10256,8 +10494,8 @@
         <w:t xml:space="preserve">Apply the result and describe what changes.</w:t>
       </w:r>
     </w:p>
-    <w:bookmarkEnd w:id="83"/>
-    <w:bookmarkStart w:id="84" w:name="summary"/>
+    <w:bookmarkEnd w:id="84"/>
+    <w:bookmarkStart w:id="85" w:name="summary"/>
     <w:p>
       <w:pPr>
         <w:pStyle w:val="Heading2"/>
@@ -10428,8 +10666,8 @@
         <w:t xml:space="preserve">start each session with two. Spend one to reroll, reduce an injury by one box, or establish a plausible preparation. Earn one when an accepted complication, including a companion complication, creates a meaningful problem.</w:t>
       </w:r>
     </w:p>
-    <w:bookmarkEnd w:id="84"/>
     <w:bookmarkEnd w:id="85"/>
+    <w:bookmarkEnd w:id="86"/>
     <w:sectPr/>
   </w:body>
 </w:document>
@@ -10707,7 +10945,34 @@
     <w:abstractNumId w:val="991"/>
   </w:num>
   <w:num w:numId="1003">
-    <w:abstractNumId w:val="991"/>
+    <w:abstractNumId w:val="99411"/>
+    <w:lvlOverride w:ilvl="0">
+      <w:startOverride w:val="1"/>
+    </w:lvlOverride>
+    <w:lvlOverride w:ilvl="1">
+      <w:startOverride w:val="1"/>
+    </w:lvlOverride>
+    <w:lvlOverride w:ilvl="2">
+      <w:startOverride w:val="1"/>
+    </w:lvlOverride>
+    <w:lvlOverride w:ilvl="3">
+      <w:startOverride w:val="1"/>
+    </w:lvlOverride>
+    <w:lvlOverride w:ilvl="4">
+      <w:startOverride w:val="1"/>
+    </w:lvlOverride>
+    <w:lvlOverride w:ilvl="5">
+      <w:startOverride w:val="1"/>
+    </w:lvlOverride>
+    <w:lvlOverride w:ilvl="6">
+      <w:startOverride w:val="1"/>
+    </w:lvlOverride>
+    <w:lvlOverride w:ilvl="7">
+      <w:startOverride w:val="1"/>
+    </w:lvlOverride>
+    <w:lvlOverride w:ilvl="8">
+      <w:startOverride w:val="1"/>
+    </w:lvlOverride>
   </w:num>
   <w:num w:numId="1004">
     <w:abstractNumId w:val="991"/>
@@ -10719,6 +10984,9 @@
     <w:abstractNumId w:val="991"/>
   </w:num>
   <w:num w:numId="1007">
+    <w:abstractNumId w:val="991"/>
+  </w:num>
+  <w:num w:numId="1008">
     <w:abstractNumId w:val="99411"/>
     <w:lvlOverride w:ilvl="0">
       <w:startOverride w:val="1"/>

</xml_diff>

<commit_message>
Add a Top 10 connections to a crewmate quick pick
Same behaviour as the reasons picker: fills an empty box, replaces an
earlier pick, and adds to the player's own text. The list is also in the
Players' Guide under Step 5.

Co-Authored-By: Claude Opus 5.5 <noreply@anthropic.com>
Claude-Session: https://claude.ai/code/session_015SADCFzhKijkC2foUmXrpC
</commit_message>
<xml_diff>
--- a/uss-pelion/USS_Pelion_Players_Guide.docx
+++ b/uss-pelion/USS_Pelion_Players_Guide.docx
@@ -260,7 +260,7 @@
       </w:r>
     </w:p>
     <w:bookmarkEnd w:id="22"/>
-    <w:bookmarkStart w:id="36" w:name="create-your-character"/>
+    <w:bookmarkStart w:id="37" w:name="create-your-character"/>
     <w:p>
       <w:pPr>
         <w:pStyle w:val="Heading1"/>
@@ -2516,7 +2516,7 @@
     </w:p>
     <w:bookmarkEnd w:id="32"/>
     <w:bookmarkEnd w:id="33"/>
-    <w:bookmarkStart w:id="34" w:name="step-5-prepare-for-duty"/>
+    <w:bookmarkStart w:id="35" w:name="step-5-prepare-for-duty"/>
     <w:p>
       <w:pPr>
         <w:pStyle w:val="Heading2"/>
@@ -2533,14 +2533,13 @@
         <w:t xml:space="preserve">Your Dodge is Agility −2, plus your Athletics training bonus: +0 if Untrained, +1 if Trained, or +2 if a Specialty. Begin uninjured, with two Duty points and your assigned equipment. Describe one connection to another crew member.</w:t>
       </w:r>
     </w:p>
-    <w:bookmarkEnd w:id="34"/>
-    <w:bookmarkStart w:id="35" w:name="example-science-officer"/>
-    <w:p>
-      <w:pPr>
-        <w:pStyle w:val="Heading2"/>
-      </w:pPr>
-      <w:r>
-        <w:t xml:space="preserve">Example science officer</w:t>
+    <w:bookmarkStart w:id="34" w:name="top-10-connections-to-a-crewmate"/>
+    <w:p>
+      <w:pPr>
+        <w:pStyle w:val="Heading3"/>
+      </w:pPr>
+      <w:r>
+        <w:t xml:space="preserve">Top 10 connections to a crewmate</w:t>
       </w:r>
     </w:p>
     <w:p>
@@ -2548,7 +2547,7 @@
         <w:pStyle w:val="FirstParagraph"/>
       </w:pPr>
       <w:r>
-        <w:t xml:space="preserve">Human. Body 10, Agility 10, Intellect 13, Presence 11, Will 11.</w:t>
+        <w:t xml:space="preserve">Pick one, name the crewmate with their player, and agree on the details together.</w:t>
       </w:r>
     </w:p>
     <w:p>
@@ -2564,13 +2563,13 @@
           <w:bCs/>
           <w:b/>
         </w:rPr>
-        <w:t xml:space="preserve">Specialty:</w:t>
+        <w:t xml:space="preserve">Academy roommates.</w:t>
       </w:r>
       <w:r>
         <w:t xml:space="preserve"> </w:t>
       </w:r>
       <w:r>
-        <w:t xml:space="preserve">Sensors 16.</w:t>
+        <w:t xml:space="preserve">We shared quarters at Starfleet Academy and still look out for each other.</w:t>
       </w:r>
     </w:p>
     <w:p>
@@ -2586,13 +2585,13 @@
           <w:bCs/>
           <w:b/>
         </w:rPr>
-        <w:t xml:space="preserve">Trained:</w:t>
+        <w:t xml:space="preserve">They saved my life.</w:t>
       </w:r>
       <w:r>
         <w:t xml:space="preserve"> </w:t>
       </w:r>
       <w:r>
-        <w:t xml:space="preserve">Physical Sciences 14, Computers 14, Electronics 14, Life Sciences 14, Medicine 14, Engineering 14, Communications 14, Diplomacy 12, Phasers 11.</w:t>
+        <w:t xml:space="preserve">They pulled me out of a burning shuttle, and I owe them my life.</w:t>
       </w:r>
     </w:p>
     <w:p>
@@ -2608,13 +2607,13 @@
           <w:bCs/>
           <w:b/>
         </w:rPr>
-        <w:t xml:space="preserve">Dodge:</w:t>
+        <w:t xml:space="preserve">I saved theirs.</w:t>
       </w:r>
       <w:r>
         <w:t xml:space="preserve"> </w:t>
       </w:r>
       <w:r>
-        <w:t xml:space="preserve">Athletics is Untrained, so Dodge is 8.</w:t>
+        <w:t xml:space="preserve">I saved their life on a past posting, and they haven’t forgotten it.</w:t>
       </w:r>
     </w:p>
     <w:p>
@@ -2630,6 +2629,245 @@
           <w:bCs/>
           <w:b/>
         </w:rPr>
+        <w:t xml:space="preserve">Mentor.</w:t>
+      </w:r>
+      <w:r>
+        <w:t xml:space="preserve"> </w:t>
+      </w:r>
+      <w:r>
+        <w:t xml:space="preserve">They took me under their wing when I first came aboard.</w:t>
+      </w:r>
+    </w:p>
+    <w:p>
+      <w:pPr>
+        <w:numPr>
+          <w:ilvl w:val="0"/>
+          <w:numId w:val="1005"/>
+        </w:numPr>
+        <w:pStyle w:val="Compact"/>
+      </w:pPr>
+      <w:r>
+        <w:rPr>
+          <w:bCs/>
+          <w:b/>
+        </w:rPr>
+        <w:t xml:space="preserve">Friendly rivals.</w:t>
+      </w:r>
+      <w:r>
+        <w:t xml:space="preserve"> </w:t>
+      </w:r>
+      <w:r>
+        <w:t xml:space="preserve">We competed for the same posting, and the rivalry is still mostly friendly.</w:t>
+      </w:r>
+    </w:p>
+    <w:p>
+      <w:pPr>
+        <w:numPr>
+          <w:ilvl w:val="0"/>
+          <w:numId w:val="1005"/>
+        </w:numPr>
+        <w:pStyle w:val="Compact"/>
+      </w:pPr>
+      <w:r>
+        <w:rPr>
+          <w:bCs/>
+          <w:b/>
+        </w:rPr>
+        <w:t xml:space="preserve">Same homeworld.</w:t>
+      </w:r>
+      <w:r>
+        <w:t xml:space="preserve"> </w:t>
+      </w:r>
+      <w:r>
+        <w:t xml:space="preserve">We grew up on the same world and know each other’s families.</w:t>
+      </w:r>
+    </w:p>
+    <w:p>
+      <w:pPr>
+        <w:numPr>
+          <w:ilvl w:val="0"/>
+          <w:numId w:val="1005"/>
+        </w:numPr>
+        <w:pStyle w:val="Compact"/>
+      </w:pPr>
+      <w:r>
+        <w:rPr>
+          <w:bCs/>
+          <w:b/>
+        </w:rPr>
+        <w:t xml:space="preserve">An unpaid favor.</w:t>
+      </w:r>
+      <w:r>
+        <w:t xml:space="preserve"> </w:t>
+      </w:r>
+      <w:r>
+        <w:t xml:space="preserve">I owe them a favor I haven’t repaid yet.</w:t>
+      </w:r>
+    </w:p>
+    <w:p>
+      <w:pPr>
+        <w:numPr>
+          <w:ilvl w:val="0"/>
+          <w:numId w:val="1005"/>
+        </w:numPr>
+        <w:pStyle w:val="Compact"/>
+      </w:pPr>
+      <w:r>
+        <w:rPr>
+          <w:bCs/>
+          <w:b/>
+        </w:rPr>
+        <w:t xml:space="preserve">A shared secret.</w:t>
+      </w:r>
+      <w:r>
+        <w:t xml:space="preserve"> </w:t>
+      </w:r>
+      <w:r>
+        <w:t xml:space="preserve">We share a secret from a mission neither of us talks about.</w:t>
+      </w:r>
+    </w:p>
+    <w:p>
+      <w:pPr>
+        <w:numPr>
+          <w:ilvl w:val="0"/>
+          <w:numId w:val="1005"/>
+        </w:numPr>
+        <w:pStyle w:val="Compact"/>
+      </w:pPr>
+      <w:r>
+        <w:rPr>
+          <w:bCs/>
+          <w:b/>
+        </w:rPr>
+        <w:t xml:space="preserve">Off-duty friends.</w:t>
+      </w:r>
+      <w:r>
+        <w:t xml:space="preserve"> </w:t>
+      </w:r>
+      <w:r>
+        <w:t xml:space="preserve">We meet every week in the rec room for chess, cards, or music.</w:t>
+      </w:r>
+    </w:p>
+    <w:p>
+      <w:pPr>
+        <w:numPr>
+          <w:ilvl w:val="0"/>
+          <w:numId w:val="1005"/>
+        </w:numPr>
+        <w:pStyle w:val="Compact"/>
+      </w:pPr>
+      <w:r>
+        <w:rPr>
+          <w:bCs/>
+          <w:b/>
+        </w:rPr>
+        <w:t xml:space="preserve">Unfinished business.</w:t>
+      </w:r>
+      <w:r>
+        <w:t xml:space="preserve"> </w:t>
+      </w:r>
+      <w:r>
+        <w:t xml:space="preserve">They blame me for something that went wrong on a past mission.</w:t>
+      </w:r>
+    </w:p>
+    <w:bookmarkEnd w:id="34"/>
+    <w:bookmarkEnd w:id="35"/>
+    <w:bookmarkStart w:id="36" w:name="example-science-officer"/>
+    <w:p>
+      <w:pPr>
+        <w:pStyle w:val="Heading2"/>
+      </w:pPr>
+      <w:r>
+        <w:t xml:space="preserve">Example science officer</w:t>
+      </w:r>
+    </w:p>
+    <w:p>
+      <w:pPr>
+        <w:pStyle w:val="FirstParagraph"/>
+      </w:pPr>
+      <w:r>
+        <w:t xml:space="preserve">Human. Body 10, Agility 10, Intellect 13, Presence 11, Will 11.</w:t>
+      </w:r>
+    </w:p>
+    <w:p>
+      <w:pPr>
+        <w:numPr>
+          <w:ilvl w:val="0"/>
+          <w:numId w:val="1006"/>
+        </w:numPr>
+        <w:pStyle w:val="Compact"/>
+      </w:pPr>
+      <w:r>
+        <w:rPr>
+          <w:bCs/>
+          <w:b/>
+        </w:rPr>
+        <w:t xml:space="preserve">Specialty:</w:t>
+      </w:r>
+      <w:r>
+        <w:t xml:space="preserve"> </w:t>
+      </w:r>
+      <w:r>
+        <w:t xml:space="preserve">Sensors 16.</w:t>
+      </w:r>
+    </w:p>
+    <w:p>
+      <w:pPr>
+        <w:numPr>
+          <w:ilvl w:val="0"/>
+          <w:numId w:val="1006"/>
+        </w:numPr>
+        <w:pStyle w:val="Compact"/>
+      </w:pPr>
+      <w:r>
+        <w:rPr>
+          <w:bCs/>
+          <w:b/>
+        </w:rPr>
+        <w:t xml:space="preserve">Trained:</w:t>
+      </w:r>
+      <w:r>
+        <w:t xml:space="preserve"> </w:t>
+      </w:r>
+      <w:r>
+        <w:t xml:space="preserve">Physical Sciences 14, Computers 14, Electronics 14, Life Sciences 14, Medicine 14, Engineering 14, Communications 14, Diplomacy 12, Phasers 11.</w:t>
+      </w:r>
+    </w:p>
+    <w:p>
+      <w:pPr>
+        <w:numPr>
+          <w:ilvl w:val="0"/>
+          <w:numId w:val="1006"/>
+        </w:numPr>
+        <w:pStyle w:val="Compact"/>
+      </w:pPr>
+      <w:r>
+        <w:rPr>
+          <w:bCs/>
+          <w:b/>
+        </w:rPr>
+        <w:t xml:space="preserve">Dodge:</w:t>
+      </w:r>
+      <w:r>
+        <w:t xml:space="preserve"> </w:t>
+      </w:r>
+      <w:r>
+        <w:t xml:space="preserve">Athletics is Untrained, so Dodge is 8.</w:t>
+      </w:r>
+    </w:p>
+    <w:p>
+      <w:pPr>
+        <w:numPr>
+          <w:ilvl w:val="0"/>
+          <w:numId w:val="1006"/>
+        </w:numPr>
+        <w:pStyle w:val="Compact"/>
+      </w:pPr>
+      <w:r>
+        <w:rPr>
+          <w:bCs/>
+          <w:b/>
+        </w:rPr>
         <w:t xml:space="preserve">Advantage:</w:t>
       </w:r>
       <w:r>
@@ -2655,9 +2893,9 @@
         <w:t xml:space="preserve">Cannot Leave a Mystery Alone.</w:t>
       </w:r>
     </w:p>
-    <w:bookmarkEnd w:id="35"/>
     <w:bookmarkEnd w:id="36"/>
-    <w:bookmarkStart w:id="39" w:name="skills-and-equipment"/>
+    <w:bookmarkEnd w:id="37"/>
+    <w:bookmarkStart w:id="40" w:name="skills-and-equipment"/>
     <w:p>
       <w:pPr>
         <w:pStyle w:val="Heading1"/>
@@ -3618,7 +3856,7 @@
         </w:tc>
       </w:tr>
     </w:tbl>
-    <w:bookmarkStart w:id="37" w:name="untrained-actions"/>
+    <w:bookmarkStart w:id="38" w:name="untrained-actions"/>
     <w:p>
       <w:pPr>
         <w:pStyle w:val="Heading2"/>
@@ -3635,8 +3873,8 @@
         <w:t xml:space="preserve">A plausible untrained attempt uses attribute −4. Specialized procedures such as surgery or warp-core repair require relevant training or direct guidance. Guidance permits an attempt only when the GM finds it credible; it does not automatically grant the expert’s skill.</w:t>
       </w:r>
     </w:p>
-    <w:bookmarkEnd w:id="37"/>
-    <w:bookmarkStart w:id="38" w:name="standard-equipment"/>
+    <w:bookmarkEnd w:id="38"/>
+    <w:bookmarkStart w:id="39" w:name="standard-equipment"/>
     <w:p>
       <w:pPr>
         <w:pStyle w:val="Heading2"/>
@@ -3661,9 +3899,9 @@
         <w:t xml:space="preserve">Transporters, computers, and scanners have limits set by the situation. State the information or destination you need. A successful scan reveals useful evidence, not necessarily the complete explanation.</w:t>
       </w:r>
     </w:p>
-    <w:bookmarkEnd w:id="38"/>
     <w:bookmarkEnd w:id="39"/>
-    <w:bookmarkStart w:id="45" w:name="actions-and-teamwork"/>
+    <w:bookmarkEnd w:id="40"/>
+    <w:bookmarkStart w:id="46" w:name="actions-and-teamwork"/>
     <w:p>
       <w:pPr>
         <w:pStyle w:val="Heading1"/>
@@ -3672,7 +3910,7 @@
         <w:t xml:space="preserve">Actions and teamwork</w:t>
       </w:r>
     </w:p>
-    <w:bookmarkStart w:id="40" w:name="when-to-roll"/>
+    <w:bookmarkStart w:id="41" w:name="when-to-roll"/>
     <w:p>
       <w:pPr>
         <w:pStyle w:val="Heading2"/>
@@ -3923,8 +4161,8 @@
         <w:t xml:space="preserve">Apply the main circumstance modifier once. Add separately specified effects such as assistance or injury when they apply. The GM avoids charging twice for the same obstacle.</w:t>
       </w:r>
     </w:p>
-    <w:bookmarkEnd w:id="40"/>
-    <w:bookmarkStart w:id="41" w:name="results-and-margins"/>
+    <w:bookmarkEnd w:id="41"/>
+    <w:bookmarkStart w:id="42" w:name="results-and-margins"/>
     <w:p>
       <w:pPr>
         <w:pStyle w:val="Heading2"/>
@@ -3957,8 +4195,8 @@
         <w:t xml:space="preserve">In an opposed contest, each side rolls its relevant skill. One success beats one failure. If both succeed, the larger success margin wins. A tie, or two failures, favors the defender or preserves the situation. For an automatic success above its target, count its contest margin as zero.</w:t>
       </w:r>
     </w:p>
-    <w:bookmarkEnd w:id="41"/>
-    <w:bookmarkStart w:id="42" w:name="assistance"/>
+    <w:bookmarkEnd w:id="42"/>
+    <w:bookmarkStart w:id="43" w:name="assistance"/>
     <w:p>
       <w:pPr>
         <w:pStyle w:val="Heading2"/>
@@ -3993,8 +4231,8 @@
         <w:t xml:space="preserve">Engineering detects that an alien device is building an overload. A science officer assists with Physical Sciences 14 and rolls 9, succeeding by 5. The engineer receives +2 to the repair attempt. Each officer contributes a different kind of expertise.</w:t>
       </w:r>
     </w:p>
-    <w:bookmarkEnd w:id="42"/>
-    <w:bookmarkStart w:id="43" w:name="failure-and-another-attempt"/>
+    <w:bookmarkEnd w:id="43"/>
+    <w:bookmarkStart w:id="44" w:name="failure-and-another-attempt"/>
     <w:p>
       <w:pPr>
         <w:pStyle w:val="Heading2"/>
@@ -4011,8 +4249,8 @@
         <w:t xml:space="preserve">Failure changes the situation: time passes, information remains incomplete, resources are consumed, or danger increases. Do not repeat an unchanged roll until it succeeds. A new approach, new evidence, better tools, or additional time may justify another attempt.</w:t>
       </w:r>
     </w:p>
-    <w:bookmarkEnd w:id="43"/>
-    <w:bookmarkStart w:id="44" w:name="investigation-and-social-scenes"/>
+    <w:bookmarkEnd w:id="44"/>
+    <w:bookmarkStart w:id="45" w:name="investigation-and-social-scenes"/>
     <w:p>
       <w:pPr>
         <w:pStyle w:val="Heading2"/>
@@ -4029,9 +4267,9 @@
         <w:t xml:space="preserve">Ask concrete questions and explain your approach. Evidence may require several different tasks. Diplomacy can secure cooperation or concessions, while Psychology offers insight into behavior. A successful roll does not force someone to abandon a core belief or provide information they do not possess.</w:t>
       </w:r>
     </w:p>
-    <w:bookmarkEnd w:id="44"/>
     <w:bookmarkEnd w:id="45"/>
-    <w:bookmarkStart w:id="52" w:name="personal-combat"/>
+    <w:bookmarkEnd w:id="46"/>
+    <w:bookmarkStart w:id="53" w:name="personal-combat"/>
     <w:p>
       <w:pPr>
         <w:pStyle w:val="Heading1"/>
@@ -4040,7 +4278,7 @@
         <w:t xml:space="preserve">Personal combat</w:t>
       </w:r>
     </w:p>
-    <w:bookmarkStart w:id="46" w:name="turn-order-and-actions"/>
+    <w:bookmarkStart w:id="47" w:name="turn-order-and-actions"/>
     <w:p>
       <w:pPr>
         <w:pStyle w:val="Heading2"/>
@@ -4057,8 +4295,8 @@
         <w:t xml:space="preserve">Act in descending Agility order. Players choose the order of tied crew members; the GM resolves other ties. A round lasts a few seconds. On your turn, move a short distance and take one meaningful action, such as attacking, using equipment, helping, or attempting a task. The GM judges movement by the scene; there is no fixed grid scale.</w:t>
       </w:r>
     </w:p>
-    <w:bookmarkEnd w:id="46"/>
-    <w:bookmarkStart w:id="47" w:name="attacking-and-defending"/>
+    <w:bookmarkEnd w:id="47"/>
+    <w:bookmarkStart w:id="48" w:name="attacking-and-defending"/>
     <w:p>
       <w:pPr>
         <w:pStyle w:val="Heading2"/>
@@ -4083,8 +4321,8 @@
         <w:t xml:space="preserve">Solid cover blocks a shot. Partial cover imposes −2 on the attack. Other difficult conditions use the normal modifier scale. Weapon effects apply after a hit survives any Dodge. Success margin does not increase damage under these rules.</w:t>
       </w:r>
     </w:p>
-    <w:bookmarkEnd w:id="47"/>
-    <w:bookmarkStart w:id="49" w:name="injury"/>
+    <w:bookmarkEnd w:id="48"/>
+    <w:bookmarkStart w:id="50" w:name="injury"/>
     <w:p>
       <w:pPr>
         <w:pStyle w:val="Heading2"/>
@@ -4373,7 +4611,7 @@
         <w:t xml:space="preserve">A normal damaging hit marks one box. A powerful attack can mark two, and a killing weapon marks three (see Weapons and damage). Injury penalties replace each other rather than stacking. They apply to movement, attacks, Dodge, and other tasks the injury physically hinders. The GM announces especially lethal hazards before resolution where possible.</w:t>
       </w:r>
     </w:p>
-    <w:bookmarkStart w:id="48" w:name="dying-and-death"/>
+    <w:bookmarkStart w:id="49" w:name="dying-and-death"/>
     <w:p>
       <w:pPr>
         <w:pStyle w:val="Heading3"/>
@@ -4394,7 +4632,7 @@
       <w:pPr>
         <w:numPr>
           <w:ilvl w:val="0"/>
-          <w:numId w:val="1006"/>
+          <w:numId w:val="1007"/>
         </w:numPr>
         <w:pStyle w:val="Compact"/>
       </w:pPr>
@@ -4429,7 +4667,7 @@
       <w:pPr>
         <w:numPr>
           <w:ilvl w:val="0"/>
-          <w:numId w:val="1006"/>
+          <w:numId w:val="1007"/>
         </w:numPr>
         <w:pStyle w:val="Compact"/>
       </w:pPr>
@@ -4451,7 +4689,7 @@
       <w:pPr>
         <w:numPr>
           <w:ilvl w:val="0"/>
-          <w:numId w:val="1006"/>
+          <w:numId w:val="1007"/>
         </w:numPr>
         <w:pStyle w:val="Compact"/>
       </w:pPr>
@@ -4477,9 +4715,9 @@
         <w:t xml:space="preserve">Your protection is avoiding the hit: Dodge, cover, and a Duty point, which reduces a kill shot from three boxes to two, leaving you Seriously wounded but on your feet.</w:t>
       </w:r>
     </w:p>
-    <w:bookmarkEnd w:id="48"/>
     <w:bookmarkEnd w:id="49"/>
-    <w:bookmarkStart w:id="50" w:name="weapons-and-damage"/>
+    <w:bookmarkEnd w:id="50"/>
+    <w:bookmarkStart w:id="51" w:name="weapons-and-damage"/>
     <w:p>
       <w:pPr>
         <w:pStyle w:val="Heading2"/>
@@ -5143,8 +5381,8 @@
         <w:t xml:space="preserve">To take someone down without hurting them, use a phaser on stun, a grapple, or the Vulcan nerve pinch rather than a weapon from this list.</w:t>
       </w:r>
     </w:p>
-    <w:bookmarkEnd w:id="50"/>
-    <w:bookmarkStart w:id="51" w:name="phaser-settings"/>
+    <w:bookmarkEnd w:id="51"/>
+    <w:bookmarkStart w:id="52" w:name="phaser-settings"/>
     <w:p>
       <w:pPr>
         <w:pStyle w:val="Heading2"/>
@@ -5321,9 +5559,9 @@
         <w:t xml:space="preserve">Declare the setting before firing. Stun effects do not stack; a later failed resistance roll still incapacitates the target. Unarmed strikes normally mark one box. A grapple uses an opposed Unarmed Combat contest; winning restrains the target while the hold is maintained. Escape uses an action and a new contest.</w:t>
       </w:r>
     </w:p>
-    <w:bookmarkEnd w:id="51"/>
     <w:bookmarkEnd w:id="52"/>
-    <w:bookmarkStart w:id="60" w:name="medical-care"/>
+    <w:bookmarkEnd w:id="53"/>
+    <w:bookmarkStart w:id="61" w:name="medical-care"/>
     <w:p>
       <w:pPr>
         <w:pStyle w:val="Heading1"/>
@@ -5340,7 +5578,7 @@
         <w:t xml:space="preserve">Starfleet physicians in 2268 have advanced diagnostic scanners, potent pharmaceuticals, portable emergency equipment, and sophisticated sickbay facilities. Familiar injuries often respond quickly to treatment. Severe trauma, incompatible biology, missing supplies, and unidentified conditions still challenge an experienced doctor. The treatment values below are campaign rules inspired by the series, rather than numerical rules stated in canon.</w:t>
       </w:r>
     </w:p>
-    <w:bookmarkStart w:id="53" w:name="diagnosis-and-stabilization"/>
+    <w:bookmarkStart w:id="54" w:name="diagnosis-and-stabilization"/>
     <w:p>
       <w:pPr>
         <w:pStyle w:val="Heading2"/>
@@ -5365,8 +5603,8 @@
         <w:t xml:space="preserve">Emergency stabilization takes one action and a successful Medicine roll with a medical kit. It prevents deterioration from the treated injury while the patient is protected from further harm, and it ends Dying. Stabilization alone removes no injury boxes. A patient at three boxes remains incapacitated until treatment clears a box.</w:t>
       </w:r>
     </w:p>
-    <w:bookmarkEnd w:id="53"/>
-    <w:bookmarkStart w:id="54" w:name="field-treatment"/>
+    <w:bookmarkEnd w:id="54"/>
+    <w:bookmarkStart w:id="55" w:name="field-treatment"/>
     <w:p>
       <w:pPr>
         <w:pStyle w:val="Heading2"/>
@@ -5383,8 +5621,8 @@
         <w:t xml:space="preserve">With a medical kit and several uninterrupted minutes, successful Medicine removes one injury box. Success by 5 or more removes two. Each injury receives one field-treatment attempt, even if that attempt fails; further attempts require changed circumstances such as better equipment, new diagnostic information, or access to sickbay. New injuries can receive their own treatment, but cannot justify treating an old injury repeatedly.</w:t>
       </w:r>
     </w:p>
-    <w:bookmarkEnd w:id="54"/>
-    <w:bookmarkStart w:id="55" w:name="sickbay-treatment"/>
+    <w:bookmarkEnd w:id="55"/>
+    <w:bookmarkStart w:id="56" w:name="sickbay-treatment"/>
     <w:p>
       <w:pPr>
         <w:pStyle w:val="Heading2"/>
@@ -5409,8 +5647,8 @@
         <w:t xml:space="preserve">Removing injury boxes removes their associated penalties, but major organ damage, severe burns, and complex internal trauma can still require a procedure and recovery period set by the GM. The physician determines whether the patient is fit for duty. Pain suppression does not itself heal an injury. Stun normally wears off at the end of the scene; prolonged unconsciousness requires assessment.</w:t>
       </w:r>
     </w:p>
-    <w:bookmarkEnd w:id="55"/>
-    <w:bookmarkStart w:id="56" w:name="natural-recovery"/>
+    <w:bookmarkEnd w:id="56"/>
+    <w:bookmarkStart w:id="57" w:name="natural-recovery"/>
     <w:p>
       <w:pPr>
         <w:pStyle w:val="Heading2"/>
@@ -5447,7 +5685,7 @@
       <w:pPr>
         <w:numPr>
           <w:ilvl w:val="0"/>
-          <w:numId w:val="1007"/>
+          <w:numId w:val="1008"/>
         </w:numPr>
         <w:pStyle w:val="Compact"/>
       </w:pPr>
@@ -5469,7 +5707,7 @@
       <w:pPr>
         <w:numPr>
           <w:ilvl w:val="0"/>
-          <w:numId w:val="1007"/>
+          <w:numId w:val="1008"/>
         </w:numPr>
         <w:pStyle w:val="Compact"/>
       </w:pPr>
@@ -5491,7 +5729,7 @@
       <w:pPr>
         <w:numPr>
           <w:ilvl w:val="0"/>
-          <w:numId w:val="1007"/>
+          <w:numId w:val="1008"/>
         </w:numPr>
         <w:pStyle w:val="Compact"/>
       </w:pPr>
@@ -5527,8 +5765,8 @@
         <w:t xml:space="preserve">Ensign Reyes ends a mission Seriously wounded (two boxes). Sickbay is busy with worse cases, so Reyes rests in quarters: one box clears the first day and the second the next, and Reyes is back on duty on the third day.</w:t>
       </w:r>
     </w:p>
-    <w:bookmarkEnd w:id="56"/>
-    <w:bookmarkStart w:id="57" w:name="alien-medicine-and-limits"/>
+    <w:bookmarkEnd w:id="57"/>
+    <w:bookmarkStart w:id="58" w:name="alien-medicine-and-limits"/>
     <w:p>
       <w:pPr>
         <w:pStyle w:val="Heading2"/>
@@ -5553,8 +5791,8 @@
         <w:t xml:space="preserve">Crew of other species may need care suited to their biology. An Alien Physiology Specialist, or a physician with access to the right species data, keeps that care from becoming guesswork.</w:t>
       </w:r>
     </w:p>
-    <w:bookmarkEnd w:id="57"/>
-    <w:bookmarkStart w:id="59" w:name="examples-from-the-original-series"/>
+    <w:bookmarkEnd w:id="58"/>
+    <w:bookmarkStart w:id="60" w:name="examples-from-the-original-series"/>
     <w:p>
       <w:pPr>
         <w:pStyle w:val="Heading2"/>
@@ -5653,7 +5891,7 @@
       <w:r>
         <w:t xml:space="preserve"> </w:t>
       </w:r>
-      <w:hyperlink r:id="rId58">
+      <w:hyperlink r:id="rId59">
         <w:r>
           <w:rPr>
             <w:rStyle w:val="Hyperlink"/>
@@ -5662,9 +5900,9 @@
         </w:r>
       </w:hyperlink>
     </w:p>
-    <w:bookmarkEnd w:id="59"/>
     <w:bookmarkEnd w:id="60"/>
-    <w:bookmarkStart w:id="65" w:name="duty-points-and-bridge-duty"/>
+    <w:bookmarkEnd w:id="61"/>
+    <w:bookmarkStart w:id="66" w:name="duty-points-and-bridge-duty"/>
     <w:p>
       <w:pPr>
         <w:pStyle w:val="Heading1"/>
@@ -5673,7 +5911,7 @@
         <w:t xml:space="preserve">Duty points and bridge duty</w:t>
       </w:r>
     </w:p>
-    <w:bookmarkStart w:id="61" w:name="using-duty-points"/>
+    <w:bookmarkStart w:id="62" w:name="using-duty-points"/>
     <w:p>
       <w:pPr>
         <w:pStyle w:val="Heading2"/>
@@ -5876,8 +6114,8 @@
         <w:t xml:space="preserve">your curiosity tempts you to remain beside an anomaly while the team withdraws. If you accept the resulting separation and danger, the GM awards one Duty point. The point does not remove that danger.</w:t>
       </w:r>
     </w:p>
-    <w:bookmarkEnd w:id="61"/>
-    <w:bookmarkStart w:id="62" w:name="working-on-the-bridge"/>
+    <w:bookmarkEnd w:id="62"/>
+    <w:bookmarkStart w:id="63" w:name="working-on-the-bridge"/>
     <w:p>
       <w:pPr>
         <w:pStyle w:val="Heading2"/>
@@ -6194,8 +6432,8 @@
         <w:t xml:space="preserve">Leadership can assist another officer when orders or coordination meaningfully help. It uses the normal assistance rule and does not provide an automatic bonus to every station.</w:t>
       </w:r>
     </w:p>
-    <w:bookmarkEnd w:id="62"/>
-    <w:bookmarkStart w:id="63" w:name="ship-encounters"/>
+    <w:bookmarkEnd w:id="63"/>
+    <w:bookmarkStart w:id="64" w:name="ship-encounters"/>
     <w:p>
       <w:pPr>
         <w:pStyle w:val="Heading2"/>
@@ -6212,8 +6450,8 @@
         <w:t xml:space="preserve">Ship encounters use descriptive consequences. The GM states what is at stake before rolls and describes changes to shields, hull, systems, and position afterward. Numerical ship damage is outside this guide’s scope.</w:t>
       </w:r>
     </w:p>
-    <w:bookmarkEnd w:id="63"/>
-    <w:bookmarkStart w:id="64" w:name="advancement"/>
+    <w:bookmarkEnd w:id="64"/>
+    <w:bookmarkStart w:id="65" w:name="advancement"/>
     <w:p>
       <w:pPr>
         <w:pStyle w:val="Heading2"/>
@@ -6230,9 +6468,9 @@
         <w:t xml:space="preserve">After a significant mission, the GM may authorize one relevant skill to advance from Untrained to Trained or from Trained to Specialty, or allow revision of an advantage or complication to reflect events. Skills retain the same three training levels after advancement. Advancement follows mission milestones. Attribute and species changes require a separate agreement.</w:t>
       </w:r>
     </w:p>
-    <w:bookmarkEnd w:id="64"/>
     <w:bookmarkEnd w:id="65"/>
-    <w:bookmarkStart w:id="66" w:name="advantages"/>
+    <w:bookmarkEnd w:id="66"/>
+    <w:bookmarkStart w:id="67" w:name="advantages"/>
     <w:p>
       <w:pPr>
         <w:pStyle w:val="Heading1"/>
@@ -6838,8 +7076,8 @@
         </w:tc>
       </w:tr>
     </w:tbl>
-    <w:bookmarkEnd w:id="66"/>
-    <w:bookmarkStart w:id="80" w:name="species-advantages"/>
+    <w:bookmarkEnd w:id="67"/>
+    <w:bookmarkStart w:id="81" w:name="species-advantages"/>
     <w:p>
       <w:pPr>
         <w:pStyle w:val="Heading1"/>
@@ -6904,7 +7142,7 @@
         <w:t xml:space="preserve">A custom species advantage follows the same pattern: a narrow +2 or an ability with agreed limits, paired with a companion complication that has a clear trigger and a real consequence.</w:t>
       </w:r>
     </w:p>
-    <w:bookmarkStart w:id="67" w:name="human"/>
+    <w:bookmarkStart w:id="68" w:name="human"/>
     <w:p>
       <w:pPr>
         <w:pStyle w:val="Heading2"/>
@@ -7117,8 +7355,8 @@
         </w:tc>
       </w:tr>
     </w:tbl>
-    <w:bookmarkEnd w:id="67"/>
-    <w:bookmarkStart w:id="68" w:name="vulcan"/>
+    <w:bookmarkEnd w:id="68"/>
+    <w:bookmarkStart w:id="69" w:name="vulcan"/>
     <w:p>
       <w:pPr>
         <w:pStyle w:val="Heading2"/>
@@ -7393,8 +7631,8 @@
         </w:tc>
       </w:tr>
     </w:tbl>
-    <w:bookmarkEnd w:id="68"/>
-    <w:bookmarkStart w:id="69" w:name="andorian"/>
+    <w:bookmarkEnd w:id="69"/>
+    <w:bookmarkStart w:id="70" w:name="andorian"/>
     <w:p>
       <w:pPr>
         <w:pStyle w:val="Heading2"/>
@@ -7607,8 +7845,8 @@
         </w:tc>
       </w:tr>
     </w:tbl>
-    <w:bookmarkEnd w:id="69"/>
-    <w:bookmarkStart w:id="70" w:name="tellarite"/>
+    <w:bookmarkEnd w:id="70"/>
+    <w:bookmarkStart w:id="71" w:name="tellarite"/>
     <w:p>
       <w:pPr>
         <w:pStyle w:val="Heading2"/>
@@ -7821,8 +8059,8 @@
         </w:tc>
       </w:tr>
     </w:tbl>
-    <w:bookmarkEnd w:id="70"/>
-    <w:bookmarkStart w:id="71" w:name="aenar"/>
+    <w:bookmarkEnd w:id="71"/>
+    <w:bookmarkStart w:id="72" w:name="aenar"/>
     <w:p>
       <w:pPr>
         <w:pStyle w:val="Heading2"/>
@@ -8035,8 +8273,8 @@
         </w:tc>
       </w:tr>
     </w:tbl>
-    <w:bookmarkEnd w:id="71"/>
-    <w:bookmarkStart w:id="72" w:name="illyrian"/>
+    <w:bookmarkEnd w:id="72"/>
+    <w:bookmarkStart w:id="73" w:name="illyrian"/>
     <w:p>
       <w:pPr>
         <w:pStyle w:val="Heading2"/>
@@ -8249,8 +8487,8 @@
         </w:tc>
       </w:tr>
     </w:tbl>
-    <w:bookmarkEnd w:id="72"/>
-    <w:bookmarkStart w:id="73" w:name="lanthanite"/>
+    <w:bookmarkEnd w:id="73"/>
+    <w:bookmarkStart w:id="74" w:name="lanthanite"/>
     <w:p>
       <w:pPr>
         <w:pStyle w:val="Heading2"/>
@@ -8463,8 +8701,8 @@
         </w:tc>
       </w:tr>
     </w:tbl>
-    <w:bookmarkEnd w:id="73"/>
-    <w:bookmarkStart w:id="74" w:name="caitian"/>
+    <w:bookmarkEnd w:id="74"/>
+    <w:bookmarkStart w:id="75" w:name="caitian"/>
     <w:p>
       <w:pPr>
         <w:pStyle w:val="Heading2"/>
@@ -8677,8 +8915,8 @@
         </w:tc>
       </w:tr>
     </w:tbl>
-    <w:bookmarkEnd w:id="74"/>
-    <w:bookmarkStart w:id="75" w:name="aurelian"/>
+    <w:bookmarkEnd w:id="75"/>
+    <w:bookmarkStart w:id="76" w:name="aurelian"/>
     <w:p>
       <w:pPr>
         <w:pStyle w:val="Heading2"/>
@@ -8891,8 +9129,8 @@
         </w:tc>
       </w:tr>
     </w:tbl>
-    <w:bookmarkEnd w:id="75"/>
-    <w:bookmarkStart w:id="76" w:name="orion"/>
+    <w:bookmarkEnd w:id="76"/>
+    <w:bookmarkStart w:id="77" w:name="orion"/>
     <w:p>
       <w:pPr>
         <w:pStyle w:val="Heading2"/>
@@ -9105,8 +9343,8 @@
         </w:tc>
       </w:tr>
     </w:tbl>
-    <w:bookmarkEnd w:id="76"/>
-    <w:bookmarkStart w:id="77" w:name="denobulan"/>
+    <w:bookmarkEnd w:id="77"/>
+    <w:bookmarkStart w:id="78" w:name="denobulan"/>
     <w:p>
       <w:pPr>
         <w:pStyle w:val="Heading2"/>
@@ -9319,8 +9557,8 @@
         </w:tc>
       </w:tr>
     </w:tbl>
-    <w:bookmarkEnd w:id="77"/>
-    <w:bookmarkStart w:id="78" w:name="trill"/>
+    <w:bookmarkEnd w:id="78"/>
+    <w:bookmarkStart w:id="79" w:name="trill"/>
     <w:p>
       <w:pPr>
         <w:pStyle w:val="Heading2"/>
@@ -9541,8 +9779,8 @@
         </w:tc>
       </w:tr>
     </w:tbl>
-    <w:bookmarkEnd w:id="78"/>
-    <w:bookmarkStart w:id="79" w:name="saurian"/>
+    <w:bookmarkEnd w:id="79"/>
+    <w:bookmarkStart w:id="80" w:name="saurian"/>
     <w:p>
       <w:pPr>
         <w:pStyle w:val="Heading2"/>
@@ -9755,9 +9993,9 @@
         </w:tc>
       </w:tr>
     </w:tbl>
-    <w:bookmarkEnd w:id="79"/>
     <w:bookmarkEnd w:id="80"/>
-    <w:bookmarkStart w:id="82" w:name="complications"/>
+    <w:bookmarkEnd w:id="81"/>
+    <w:bookmarkStart w:id="83" w:name="complications"/>
     <w:p>
       <w:pPr>
         <w:pStyle w:val="Heading1"/>
@@ -10363,7 +10601,7 @@
         </w:tc>
       </w:tr>
     </w:tbl>
-    <w:bookmarkStart w:id="81" w:name="using-and-revising-traits"/>
+    <w:bookmarkStart w:id="82" w:name="using-and-revising-traits"/>
     <w:p>
       <w:pPr>
         <w:pStyle w:val="Heading2"/>
@@ -10380,9 +10618,9 @@
         <w:t xml:space="preserve">General advantages and complications describe individual crew members and can suit any species when appropriate. A Vulcan might choose Mental Discipline as a general advantage; species advantages are the only traits tied to a species. At a mission milestone, revise a trait when events change the character. Custom advantages follow the same narrow +2 benefit; custom complications need a clear trigger and a meaningful, accepted consequence.</w:t>
       </w:r>
     </w:p>
-    <w:bookmarkEnd w:id="81"/>
     <w:bookmarkEnd w:id="82"/>
-    <w:bookmarkStart w:id="86" w:name="quick-reference"/>
+    <w:bookmarkEnd w:id="83"/>
+    <w:bookmarkStart w:id="87" w:name="quick-reference"/>
     <w:p>
       <w:pPr>
         <w:pStyle w:val="Heading1"/>
@@ -10391,7 +10629,7 @@
         <w:t xml:space="preserve">Quick reference</w:t>
       </w:r>
     </w:p>
-    <w:bookmarkStart w:id="83" w:name="will-and-mental-resistance"/>
+    <w:bookmarkStart w:id="84" w:name="will-and-mental-resistance"/>
     <w:p>
       <w:pPr>
         <w:pStyle w:val="Heading2"/>
@@ -10424,8 +10662,8 @@
         <w:t xml:space="preserve">Will protects your resolve; Presence influences others. Leadership and Diplomacy still use Presence. Species adjustments may change your starting Will, but mental advantages apply only to their agreed, narrow circumstances.</w:t>
       </w:r>
     </w:p>
-    <w:bookmarkEnd w:id="83"/>
-    <w:bookmarkStart w:id="84" w:name="at-the-table"/>
+    <w:bookmarkEnd w:id="84"/>
+    <w:bookmarkStart w:id="85" w:name="at-the-table"/>
     <w:p>
       <w:pPr>
         <w:pStyle w:val="Heading2"/>
@@ -10438,7 +10676,7 @@
       <w:pPr>
         <w:numPr>
           <w:ilvl w:val="0"/>
-          <w:numId w:val="1008"/>
+          <w:numId w:val="1009"/>
         </w:numPr>
         <w:pStyle w:val="Compact"/>
       </w:pPr>
@@ -10450,7 +10688,7 @@
       <w:pPr>
         <w:numPr>
           <w:ilvl w:val="0"/>
-          <w:numId w:val="1008"/>
+          <w:numId w:val="1009"/>
         </w:numPr>
         <w:pStyle w:val="Compact"/>
       </w:pPr>
@@ -10462,7 +10700,7 @@
       <w:pPr>
         <w:numPr>
           <w:ilvl w:val="0"/>
-          <w:numId w:val="1008"/>
+          <w:numId w:val="1009"/>
         </w:numPr>
         <w:pStyle w:val="Compact"/>
       </w:pPr>
@@ -10474,7 +10712,7 @@
       <w:pPr>
         <w:numPr>
           <w:ilvl w:val="0"/>
-          <w:numId w:val="1008"/>
+          <w:numId w:val="1009"/>
         </w:numPr>
         <w:pStyle w:val="Compact"/>
       </w:pPr>
@@ -10486,7 +10724,7 @@
       <w:pPr>
         <w:numPr>
           <w:ilvl w:val="0"/>
-          <w:numId w:val="1008"/>
+          <w:numId w:val="1009"/>
         </w:numPr>
         <w:pStyle w:val="Compact"/>
       </w:pPr>
@@ -10494,8 +10732,8 @@
         <w:t xml:space="preserve">Apply the result and describe what changes.</w:t>
       </w:r>
     </w:p>
-    <w:bookmarkEnd w:id="84"/>
-    <w:bookmarkStart w:id="85" w:name="summary"/>
+    <w:bookmarkEnd w:id="85"/>
+    <w:bookmarkStart w:id="86" w:name="summary"/>
     <w:p>
       <w:pPr>
         <w:pStyle w:val="Heading2"/>
@@ -10666,8 +10904,8 @@
         <w:t xml:space="preserve">start each session with two. Spend one to reroll, reduce an injury by one box, or establish a plausible preparation. Earn one when an accepted complication, including a companion complication, creates a meaningful problem.</w:t>
       </w:r>
     </w:p>
-    <w:bookmarkEnd w:id="85"/>
     <w:bookmarkEnd w:id="86"/>
+    <w:bookmarkEnd w:id="87"/>
     <w:sectPr/>
   </w:body>
 </w:document>
@@ -10978,7 +11216,34 @@
     <w:abstractNumId w:val="991"/>
   </w:num>
   <w:num w:numId="1005">
-    <w:abstractNumId w:val="991"/>
+    <w:abstractNumId w:val="99411"/>
+    <w:lvlOverride w:ilvl="0">
+      <w:startOverride w:val="1"/>
+    </w:lvlOverride>
+    <w:lvlOverride w:ilvl="1">
+      <w:startOverride w:val="1"/>
+    </w:lvlOverride>
+    <w:lvlOverride w:ilvl="2">
+      <w:startOverride w:val="1"/>
+    </w:lvlOverride>
+    <w:lvlOverride w:ilvl="3">
+      <w:startOverride w:val="1"/>
+    </w:lvlOverride>
+    <w:lvlOverride w:ilvl="4">
+      <w:startOverride w:val="1"/>
+    </w:lvlOverride>
+    <w:lvlOverride w:ilvl="5">
+      <w:startOverride w:val="1"/>
+    </w:lvlOverride>
+    <w:lvlOverride w:ilvl="6">
+      <w:startOverride w:val="1"/>
+    </w:lvlOverride>
+    <w:lvlOverride w:ilvl="7">
+      <w:startOverride w:val="1"/>
+    </w:lvlOverride>
+    <w:lvlOverride w:ilvl="8">
+      <w:startOverride w:val="1"/>
+    </w:lvlOverride>
   </w:num>
   <w:num w:numId="1006">
     <w:abstractNumId w:val="991"/>
@@ -10987,6 +11252,9 @@
     <w:abstractNumId w:val="991"/>
   </w:num>
   <w:num w:numId="1008">
+    <w:abstractNumId w:val="991"/>
+  </w:num>
+  <w:num w:numId="1009">
     <w:abstractNumId w:val="99411"/>
     <w:lvlOverride w:ilvl="0">
       <w:startOverride w:val="1"/>

</xml_diff>

<commit_message>
General Services specialists and complication trigger quick picks
General Services characters take one Expert skill at attribute +5 and
seven Trained skills instead of a Specialty (+3) and nine Trained.
Switching department adjusts automatically; commissioning to an officer
department turns Expert into Specialty. Each general complication now
offers three suggested triggers. The guide covers both, plus the
commission rule.

Co-Authored-By: Claude Opus 5.5 <noreply@anthropic.com>
Claude-Session: https://claude.ai/code/session_015SADCFzhKijkC2foUmXrpC
</commit_message>
<xml_diff>
--- a/uss-pelion/USS_Pelion_Players_Guide.docx
+++ b/uss-pelion/USS_Pelion_Players_Guide.docx
@@ -260,7 +260,7 @@
       </w:r>
     </w:p>
     <w:bookmarkEnd w:id="22"/>
-    <w:bookmarkStart w:id="37" w:name="create-your-character"/>
+    <w:bookmarkStart w:id="38" w:name="create-your-character"/>
     <w:p>
       <w:pPr>
         <w:pStyle w:val="Heading1"/>
@@ -990,7 +990,7 @@
         <w:t xml:space="preserve"> </w:t>
       </w:r>
       <w:r>
-        <w:t xml:space="preserve">is the division for enlisted crew: Crewman 3rd, 2nd, and 1st Class, Crewman, and Yeoman 3rd, 2nd, and 1st Class, and Yeoman. A character with a Crewman or Yeoman rank belongs to General Services. Enlisted crew use exactly the same creation rules as officers.</w:t>
+        <w:t xml:space="preserve">is the division for enlisted crew: Crewman 3rd, 2nd, and 1st Class, Crewman, and Yeoman 3rd, 2nd, and 1st Class, and Yeoman. A character with a Crewman or Yeoman rank belongs to General Services. Enlisted crew use the same creation rules as officers, except for their skills (see Step 3): they are specialists rather than generalists.</w:t>
       </w:r>
     </w:p>
     <w:bookmarkEnd w:id="23"/>
@@ -2095,7 +2095,7 @@
     </w:p>
     <w:bookmarkEnd w:id="29"/>
     <w:bookmarkEnd w:id="30"/>
-    <w:bookmarkStart w:id="31" w:name="step-3-choose-trained-skills"/>
+    <w:bookmarkStart w:id="32" w:name="step-3-choose-trained-skills"/>
     <w:p>
       <w:pPr>
         <w:pStyle w:val="Heading2"/>
@@ -2160,8 +2160,99 @@
         <w:t xml:space="preserve">at attribute −4 when an attempt is plausible. Use these same three training levels for every skill. Each skill has its own final target number; do not add the attribute again when rolling.</w:t>
       </w:r>
     </w:p>
+    <w:bookmarkStart w:id="31" w:name="general-services-specialists"/>
+    <w:p>
+      <w:pPr>
+        <w:pStyle w:val="Heading3"/>
+      </w:pPr>
+      <w:r>
+        <w:t xml:space="preserve">General Services: specialists</w:t>
+      </w:r>
+    </w:p>
+    <w:p>
+      <w:pPr>
+        <w:pStyle w:val="FirstParagraph"/>
+      </w:pPr>
+      <w:r>
+        <w:t xml:space="preserve">Enlisted crew in General Services trade breadth for depth. Instead of a Specialty and nine Trained skills, they choose</w:t>
+      </w:r>
+      <w:r>
+        <w:t xml:space="preserve"> </w:t>
+      </w:r>
+      <w:r>
+        <w:rPr>
+          <w:bCs/>
+          <w:b/>
+        </w:rPr>
+        <w:t xml:space="preserve">one Expert skill at its attribute +5</w:t>
+      </w:r>
+      <w:r>
+        <w:t xml:space="preserve"> </w:t>
+      </w:r>
+      <w:r>
+        <w:t xml:space="preserve">and</w:t>
+      </w:r>
+      <w:r>
+        <w:t xml:space="preserve"> </w:t>
+      </w:r>
+      <w:r>
+        <w:rPr>
+          <w:bCs/>
+          <w:b/>
+        </w:rPr>
+        <w:t xml:space="preserve">seven Trained skills at attribute +1</w:t>
+      </w:r>
+      <w:r>
+        <w:t xml:space="preserve">. Everything else is Untrained at attribute −4, as usual.</w:t>
+      </w:r>
+    </w:p>
+    <w:p>
+      <w:pPr>
+        <w:pStyle w:val="BodyText"/>
+      </w:pPr>
+      <w:r>
+        <w:t xml:space="preserve">The extra bonus matters most when the work is hard. With Intellect 13, an Expert transporter chief has a target of 18, which only natural 17–18 can fail; under a −4</w:t>
+      </w:r>
+      <w:r>
+        <w:t xml:space="preserve"> </w:t>
+      </w:r>
+      <w:r>
+        <w:t xml:space="preserve">“</w:t>
+      </w:r>
+      <w:r>
+        <w:t xml:space="preserve">very difficult</w:t>
+      </w:r>
+      <w:r>
+        <w:t xml:space="preserve">”</w:t>
+      </w:r>
+      <w:r>
+        <w:t xml:space="preserve"> </w:t>
+      </w:r>
+      <w:r>
+        <w:t xml:space="preserve">penalty the target is still 14, a 91% chance, where an officer’s Specialty would be at 12, a 74% chance. If Athletics is the Expert skill, Dodge adds +2, the same as a Specialty.</w:t>
+      </w:r>
+    </w:p>
+    <w:p>
+      <w:pPr>
+        <w:pStyle w:val="BodyText"/>
+      </w:pPr>
+      <w:r>
+        <w:rPr>
+          <w:bCs/>
+          <w:b/>
+        </w:rPr>
+        <w:t xml:space="preserve">Earning a commission.</w:t>
+      </w:r>
+      <w:r>
+        <w:t xml:space="preserve"> </w:t>
+      </w:r>
+      <w:r>
+        <w:t xml:space="preserve">If a General Services character is commissioned (the GM’s call, usually after distinguished service), they move to the officer package: the Expert skill becomes a Specialty at +3, and they can raise two more skills to Trained to reach nine. Rank and department change to match.</w:t>
+      </w:r>
+    </w:p>
     <w:bookmarkEnd w:id="31"/>
-    <w:bookmarkStart w:id="33" w:name="step-4-describe-your-character"/>
+    <w:bookmarkEnd w:id="32"/>
+    <w:bookmarkStart w:id="34" w:name="step-4-describe-your-character"/>
     <w:p>
       <w:pPr>
         <w:pStyle w:val="Heading2"/>
@@ -2207,7 +2298,7 @@
         <w:t xml:space="preserve">.</w:t>
       </w:r>
     </w:p>
-    <w:bookmarkStart w:id="32" w:name="top-10-reasons-for-joining-starfleet"/>
+    <w:bookmarkStart w:id="33" w:name="top-10-reasons-for-joining-starfleet"/>
     <w:p>
       <w:pPr>
         <w:pStyle w:val="Heading3"/>
@@ -2514,9 +2605,9 @@
         <w:t xml:space="preserve">Steady Hands gives +2 to delicate medical procedures. Subspace Specialist gives +2 when analyzing subspace phenomena. Complications might be Cannot Leave a Mystery Alone, Distrusts Command Decisions, or Protects Others at Personal Risk. Define their triggers with the GM.</w:t>
       </w:r>
     </w:p>
-    <w:bookmarkEnd w:id="32"/>
     <w:bookmarkEnd w:id="33"/>
-    <w:bookmarkStart w:id="35" w:name="step-5-prepare-for-duty"/>
+    <w:bookmarkEnd w:id="34"/>
+    <w:bookmarkStart w:id="36" w:name="step-5-prepare-for-duty"/>
     <w:p>
       <w:pPr>
         <w:pStyle w:val="Heading2"/>
@@ -2533,7 +2624,7 @@
         <w:t xml:space="preserve">Your Dodge is Agility −2, plus your Athletics training bonus: +0 if Untrained, +1 if Trained, or +2 if a Specialty. Begin uninjured, with two Duty points and your assigned equipment. Describe one connection to another crew member.</w:t>
       </w:r>
     </w:p>
-    <w:bookmarkStart w:id="34" w:name="top-10-connections-to-a-crewmate"/>
+    <w:bookmarkStart w:id="35" w:name="top-10-connections-to-a-crewmate"/>
     <w:p>
       <w:pPr>
         <w:pStyle w:val="Heading3"/>
@@ -2770,9 +2861,9 @@
         <w:t xml:space="preserve">They blame me for something that went wrong on a past mission.</w:t>
       </w:r>
     </w:p>
-    <w:bookmarkEnd w:id="34"/>
     <w:bookmarkEnd w:id="35"/>
-    <w:bookmarkStart w:id="36" w:name="example-science-officer"/>
+    <w:bookmarkEnd w:id="36"/>
+    <w:bookmarkStart w:id="37" w:name="example-science-officer"/>
     <w:p>
       <w:pPr>
         <w:pStyle w:val="Heading2"/>
@@ -2893,9 +2984,9 @@
         <w:t xml:space="preserve">Cannot Leave a Mystery Alone.</w:t>
       </w:r>
     </w:p>
-    <w:bookmarkEnd w:id="36"/>
     <w:bookmarkEnd w:id="37"/>
-    <w:bookmarkStart w:id="40" w:name="skills-and-equipment"/>
+    <w:bookmarkEnd w:id="38"/>
+    <w:bookmarkStart w:id="41" w:name="skills-and-equipment"/>
     <w:p>
       <w:pPr>
         <w:pStyle w:val="Heading1"/>
@@ -3856,7 +3947,7 @@
         </w:tc>
       </w:tr>
     </w:tbl>
-    <w:bookmarkStart w:id="38" w:name="untrained-actions"/>
+    <w:bookmarkStart w:id="39" w:name="untrained-actions"/>
     <w:p>
       <w:pPr>
         <w:pStyle w:val="Heading2"/>
@@ -3873,8 +3964,8 @@
         <w:t xml:space="preserve">A plausible untrained attempt uses attribute −4. Specialized procedures such as surgery or warp-core repair require relevant training or direct guidance. Guidance permits an attempt only when the GM finds it credible; it does not automatically grant the expert’s skill.</w:t>
       </w:r>
     </w:p>
-    <w:bookmarkEnd w:id="38"/>
-    <w:bookmarkStart w:id="39" w:name="standard-equipment"/>
+    <w:bookmarkEnd w:id="39"/>
+    <w:bookmarkStart w:id="40" w:name="standard-equipment"/>
     <w:p>
       <w:pPr>
         <w:pStyle w:val="Heading2"/>
@@ -3899,9 +3990,9 @@
         <w:t xml:space="preserve">Transporters, computers, and scanners have limits set by the situation. State the information or destination you need. A successful scan reveals useful evidence, not necessarily the complete explanation.</w:t>
       </w:r>
     </w:p>
-    <w:bookmarkEnd w:id="39"/>
     <w:bookmarkEnd w:id="40"/>
-    <w:bookmarkStart w:id="46" w:name="actions-and-teamwork"/>
+    <w:bookmarkEnd w:id="41"/>
+    <w:bookmarkStart w:id="47" w:name="actions-and-teamwork"/>
     <w:p>
       <w:pPr>
         <w:pStyle w:val="Heading1"/>
@@ -3910,7 +4001,7 @@
         <w:t xml:space="preserve">Actions and teamwork</w:t>
       </w:r>
     </w:p>
-    <w:bookmarkStart w:id="41" w:name="when-to-roll"/>
+    <w:bookmarkStart w:id="42" w:name="when-to-roll"/>
     <w:p>
       <w:pPr>
         <w:pStyle w:val="Heading2"/>
@@ -4161,8 +4252,8 @@
         <w:t xml:space="preserve">Apply the main circumstance modifier once. Add separately specified effects such as assistance or injury when they apply. The GM avoids charging twice for the same obstacle.</w:t>
       </w:r>
     </w:p>
-    <w:bookmarkEnd w:id="41"/>
-    <w:bookmarkStart w:id="42" w:name="results-and-margins"/>
+    <w:bookmarkEnd w:id="42"/>
+    <w:bookmarkStart w:id="43" w:name="results-and-margins"/>
     <w:p>
       <w:pPr>
         <w:pStyle w:val="Heading2"/>
@@ -4195,8 +4286,8 @@
         <w:t xml:space="preserve">In an opposed contest, each side rolls its relevant skill. One success beats one failure. If both succeed, the larger success margin wins. A tie, or two failures, favors the defender or preserves the situation. For an automatic success above its target, count its contest margin as zero.</w:t>
       </w:r>
     </w:p>
-    <w:bookmarkEnd w:id="42"/>
-    <w:bookmarkStart w:id="43" w:name="assistance"/>
+    <w:bookmarkEnd w:id="43"/>
+    <w:bookmarkStart w:id="44" w:name="assistance"/>
     <w:p>
       <w:pPr>
         <w:pStyle w:val="Heading2"/>
@@ -4231,8 +4322,8 @@
         <w:t xml:space="preserve">Engineering detects that an alien device is building an overload. A science officer assists with Physical Sciences 14 and rolls 9, succeeding by 5. The engineer receives +2 to the repair attempt. Each officer contributes a different kind of expertise.</w:t>
       </w:r>
     </w:p>
-    <w:bookmarkEnd w:id="43"/>
-    <w:bookmarkStart w:id="44" w:name="failure-and-another-attempt"/>
+    <w:bookmarkEnd w:id="44"/>
+    <w:bookmarkStart w:id="45" w:name="failure-and-another-attempt"/>
     <w:p>
       <w:pPr>
         <w:pStyle w:val="Heading2"/>
@@ -4249,8 +4340,8 @@
         <w:t xml:space="preserve">Failure changes the situation: time passes, information remains incomplete, resources are consumed, or danger increases. Do not repeat an unchanged roll until it succeeds. A new approach, new evidence, better tools, or additional time may justify another attempt.</w:t>
       </w:r>
     </w:p>
-    <w:bookmarkEnd w:id="44"/>
-    <w:bookmarkStart w:id="45" w:name="investigation-and-social-scenes"/>
+    <w:bookmarkEnd w:id="45"/>
+    <w:bookmarkStart w:id="46" w:name="investigation-and-social-scenes"/>
     <w:p>
       <w:pPr>
         <w:pStyle w:val="Heading2"/>
@@ -4267,9 +4358,9 @@
         <w:t xml:space="preserve">Ask concrete questions and explain your approach. Evidence may require several different tasks. Diplomacy can secure cooperation or concessions, while Psychology offers insight into behavior. A successful roll does not force someone to abandon a core belief or provide information they do not possess.</w:t>
       </w:r>
     </w:p>
-    <w:bookmarkEnd w:id="45"/>
     <w:bookmarkEnd w:id="46"/>
-    <w:bookmarkStart w:id="53" w:name="personal-combat"/>
+    <w:bookmarkEnd w:id="47"/>
+    <w:bookmarkStart w:id="54" w:name="personal-combat"/>
     <w:p>
       <w:pPr>
         <w:pStyle w:val="Heading1"/>
@@ -4278,7 +4369,7 @@
         <w:t xml:space="preserve">Personal combat</w:t>
       </w:r>
     </w:p>
-    <w:bookmarkStart w:id="47" w:name="turn-order-and-actions"/>
+    <w:bookmarkStart w:id="48" w:name="turn-order-and-actions"/>
     <w:p>
       <w:pPr>
         <w:pStyle w:val="Heading2"/>
@@ -4295,8 +4386,8 @@
         <w:t xml:space="preserve">Act in descending Agility order. Players choose the order of tied crew members; the GM resolves other ties. A round lasts a few seconds. On your turn, move a short distance and take one meaningful action, such as attacking, using equipment, helping, or attempting a task. The GM judges movement by the scene; there is no fixed grid scale.</w:t>
       </w:r>
     </w:p>
-    <w:bookmarkEnd w:id="47"/>
-    <w:bookmarkStart w:id="48" w:name="attacking-and-defending"/>
+    <w:bookmarkEnd w:id="48"/>
+    <w:bookmarkStart w:id="49" w:name="attacking-and-defending"/>
     <w:p>
       <w:pPr>
         <w:pStyle w:val="Heading2"/>
@@ -4321,8 +4412,8 @@
         <w:t xml:space="preserve">Solid cover blocks a shot. Partial cover imposes −2 on the attack. Other difficult conditions use the normal modifier scale. Weapon effects apply after a hit survives any Dodge. Success margin does not increase damage under these rules.</w:t>
       </w:r>
     </w:p>
-    <w:bookmarkEnd w:id="48"/>
-    <w:bookmarkStart w:id="50" w:name="injury"/>
+    <w:bookmarkEnd w:id="49"/>
+    <w:bookmarkStart w:id="51" w:name="injury"/>
     <w:p>
       <w:pPr>
         <w:pStyle w:val="Heading2"/>
@@ -4611,7 +4702,7 @@
         <w:t xml:space="preserve">A normal damaging hit marks one box. A powerful attack can mark two, and a killing weapon marks three (see Weapons and damage). Injury penalties replace each other rather than stacking. They apply to movement, attacks, Dodge, and other tasks the injury physically hinders. The GM announces especially lethal hazards before resolution where possible.</w:t>
       </w:r>
     </w:p>
-    <w:bookmarkStart w:id="49" w:name="dying-and-death"/>
+    <w:bookmarkStart w:id="50" w:name="dying-and-death"/>
     <w:p>
       <w:pPr>
         <w:pStyle w:val="Heading3"/>
@@ -4715,9 +4806,9 @@
         <w:t xml:space="preserve">Your protection is avoiding the hit: Dodge, cover, and a Duty point, which reduces a kill shot from three boxes to two, leaving you Seriously wounded but on your feet.</w:t>
       </w:r>
     </w:p>
-    <w:bookmarkEnd w:id="49"/>
     <w:bookmarkEnd w:id="50"/>
-    <w:bookmarkStart w:id="51" w:name="weapons-and-damage"/>
+    <w:bookmarkEnd w:id="51"/>
+    <w:bookmarkStart w:id="52" w:name="weapons-and-damage"/>
     <w:p>
       <w:pPr>
         <w:pStyle w:val="Heading2"/>
@@ -5381,8 +5472,8 @@
         <w:t xml:space="preserve">To take someone down without hurting them, use a phaser on stun, a grapple, or the Vulcan nerve pinch rather than a weapon from this list.</w:t>
       </w:r>
     </w:p>
-    <w:bookmarkEnd w:id="51"/>
-    <w:bookmarkStart w:id="52" w:name="phaser-settings"/>
+    <w:bookmarkEnd w:id="52"/>
+    <w:bookmarkStart w:id="53" w:name="phaser-settings"/>
     <w:p>
       <w:pPr>
         <w:pStyle w:val="Heading2"/>
@@ -5559,9 +5650,9 @@
         <w:t xml:space="preserve">Declare the setting before firing. Stun effects do not stack; a later failed resistance roll still incapacitates the target. Unarmed strikes normally mark one box. A grapple uses an opposed Unarmed Combat contest; winning restrains the target while the hold is maintained. Escape uses an action and a new contest.</w:t>
       </w:r>
     </w:p>
-    <w:bookmarkEnd w:id="52"/>
     <w:bookmarkEnd w:id="53"/>
-    <w:bookmarkStart w:id="61" w:name="medical-care"/>
+    <w:bookmarkEnd w:id="54"/>
+    <w:bookmarkStart w:id="62" w:name="medical-care"/>
     <w:p>
       <w:pPr>
         <w:pStyle w:val="Heading1"/>
@@ -5578,7 +5669,7 @@
         <w:t xml:space="preserve">Starfleet physicians in 2268 have advanced diagnostic scanners, potent pharmaceuticals, portable emergency equipment, and sophisticated sickbay facilities. Familiar injuries often respond quickly to treatment. Severe trauma, incompatible biology, missing supplies, and unidentified conditions still challenge an experienced doctor. The treatment values below are campaign rules inspired by the series, rather than numerical rules stated in canon.</w:t>
       </w:r>
     </w:p>
-    <w:bookmarkStart w:id="54" w:name="diagnosis-and-stabilization"/>
+    <w:bookmarkStart w:id="55" w:name="diagnosis-and-stabilization"/>
     <w:p>
       <w:pPr>
         <w:pStyle w:val="Heading2"/>
@@ -5603,8 +5694,8 @@
         <w:t xml:space="preserve">Emergency stabilization takes one action and a successful Medicine roll with a medical kit. It prevents deterioration from the treated injury while the patient is protected from further harm, and it ends Dying. Stabilization alone removes no injury boxes. A patient at three boxes remains incapacitated until treatment clears a box.</w:t>
       </w:r>
     </w:p>
-    <w:bookmarkEnd w:id="54"/>
-    <w:bookmarkStart w:id="55" w:name="field-treatment"/>
+    <w:bookmarkEnd w:id="55"/>
+    <w:bookmarkStart w:id="56" w:name="field-treatment"/>
     <w:p>
       <w:pPr>
         <w:pStyle w:val="Heading2"/>
@@ -5621,8 +5712,8 @@
         <w:t xml:space="preserve">With a medical kit and several uninterrupted minutes, successful Medicine removes one injury box. Success by 5 or more removes two. Each injury receives one field-treatment attempt, even if that attempt fails; further attempts require changed circumstances such as better equipment, new diagnostic information, or access to sickbay. New injuries can receive their own treatment, but cannot justify treating an old injury repeatedly.</w:t>
       </w:r>
     </w:p>
-    <w:bookmarkEnd w:id="55"/>
-    <w:bookmarkStart w:id="56" w:name="sickbay-treatment"/>
+    <w:bookmarkEnd w:id="56"/>
+    <w:bookmarkStart w:id="57" w:name="sickbay-treatment"/>
     <w:p>
       <w:pPr>
         <w:pStyle w:val="Heading2"/>
@@ -5647,8 +5738,8 @@
         <w:t xml:space="preserve">Removing injury boxes removes their associated penalties, but major organ damage, severe burns, and complex internal trauma can still require a procedure and recovery period set by the GM. The physician determines whether the patient is fit for duty. Pain suppression does not itself heal an injury. Stun normally wears off at the end of the scene; prolonged unconsciousness requires assessment.</w:t>
       </w:r>
     </w:p>
-    <w:bookmarkEnd w:id="56"/>
-    <w:bookmarkStart w:id="57" w:name="natural-recovery"/>
+    <w:bookmarkEnd w:id="57"/>
+    <w:bookmarkStart w:id="58" w:name="natural-recovery"/>
     <w:p>
       <w:pPr>
         <w:pStyle w:val="Heading2"/>
@@ -5765,8 +5856,8 @@
         <w:t xml:space="preserve">Ensign Reyes ends a mission Seriously wounded (two boxes). Sickbay is busy with worse cases, so Reyes rests in quarters: one box clears the first day and the second the next, and Reyes is back on duty on the third day.</w:t>
       </w:r>
     </w:p>
-    <w:bookmarkEnd w:id="57"/>
-    <w:bookmarkStart w:id="58" w:name="alien-medicine-and-limits"/>
+    <w:bookmarkEnd w:id="58"/>
+    <w:bookmarkStart w:id="59" w:name="alien-medicine-and-limits"/>
     <w:p>
       <w:pPr>
         <w:pStyle w:val="Heading2"/>
@@ -5791,8 +5882,8 @@
         <w:t xml:space="preserve">Crew of other species may need care suited to their biology. An Alien Physiology Specialist, or a physician with access to the right species data, keeps that care from becoming guesswork.</w:t>
       </w:r>
     </w:p>
-    <w:bookmarkEnd w:id="58"/>
-    <w:bookmarkStart w:id="60" w:name="examples-from-the-original-series"/>
+    <w:bookmarkEnd w:id="59"/>
+    <w:bookmarkStart w:id="61" w:name="examples-from-the-original-series"/>
     <w:p>
       <w:pPr>
         <w:pStyle w:val="Heading2"/>
@@ -5891,7 +5982,7 @@
       <w:r>
         <w:t xml:space="preserve"> </w:t>
       </w:r>
-      <w:hyperlink r:id="rId59">
+      <w:hyperlink r:id="rId60">
         <w:r>
           <w:rPr>
             <w:rStyle w:val="Hyperlink"/>
@@ -5900,9 +5991,9 @@
         </w:r>
       </w:hyperlink>
     </w:p>
-    <w:bookmarkEnd w:id="60"/>
     <w:bookmarkEnd w:id="61"/>
-    <w:bookmarkStart w:id="66" w:name="duty-points-and-bridge-duty"/>
+    <w:bookmarkEnd w:id="62"/>
+    <w:bookmarkStart w:id="67" w:name="duty-points-and-bridge-duty"/>
     <w:p>
       <w:pPr>
         <w:pStyle w:val="Heading1"/>
@@ -5911,7 +6002,7 @@
         <w:t xml:space="preserve">Duty points and bridge duty</w:t>
       </w:r>
     </w:p>
-    <w:bookmarkStart w:id="62" w:name="using-duty-points"/>
+    <w:bookmarkStart w:id="63" w:name="using-duty-points"/>
     <w:p>
       <w:pPr>
         <w:pStyle w:val="Heading2"/>
@@ -6114,8 +6205,8 @@
         <w:t xml:space="preserve">your curiosity tempts you to remain beside an anomaly while the team withdraws. If you accept the resulting separation and danger, the GM awards one Duty point. The point does not remove that danger.</w:t>
       </w:r>
     </w:p>
-    <w:bookmarkEnd w:id="62"/>
-    <w:bookmarkStart w:id="63" w:name="working-on-the-bridge"/>
+    <w:bookmarkEnd w:id="63"/>
+    <w:bookmarkStart w:id="64" w:name="working-on-the-bridge"/>
     <w:p>
       <w:pPr>
         <w:pStyle w:val="Heading2"/>
@@ -6432,8 +6523,8 @@
         <w:t xml:space="preserve">Leadership can assist another officer when orders or coordination meaningfully help. It uses the normal assistance rule and does not provide an automatic bonus to every station.</w:t>
       </w:r>
     </w:p>
-    <w:bookmarkEnd w:id="63"/>
-    <w:bookmarkStart w:id="64" w:name="ship-encounters"/>
+    <w:bookmarkEnd w:id="64"/>
+    <w:bookmarkStart w:id="65" w:name="ship-encounters"/>
     <w:p>
       <w:pPr>
         <w:pStyle w:val="Heading2"/>
@@ -6450,8 +6541,8 @@
         <w:t xml:space="preserve">Ship encounters use descriptive consequences. The GM states what is at stake before rolls and describes changes to shields, hull, systems, and position afterward. Numerical ship damage is outside this guide’s scope.</w:t>
       </w:r>
     </w:p>
-    <w:bookmarkEnd w:id="64"/>
-    <w:bookmarkStart w:id="65" w:name="advancement"/>
+    <w:bookmarkEnd w:id="65"/>
+    <w:bookmarkStart w:id="66" w:name="advancement"/>
     <w:p>
       <w:pPr>
         <w:pStyle w:val="Heading2"/>
@@ -6465,12 +6556,12 @@
         <w:pStyle w:val="FirstParagraph"/>
       </w:pPr>
       <w:r>
-        <w:t xml:space="preserve">After a significant mission, the GM may authorize one relevant skill to advance from Untrained to Trained or from Trained to Specialty, or allow revision of an advantage or complication to reflect events. Skills retain the same three training levels after advancement. Advancement follows mission milestones. Attribute and species changes require a separate agreement.</w:t>
-      </w:r>
-    </w:p>
-    <w:bookmarkEnd w:id="65"/>
+        <w:t xml:space="preserve">After a significant mission, the GM may authorize one relevant skill to advance from Untrained to Trained or from Trained to Specialty, or allow revision of an advantage or complication to reflect events. Skills retain the same three training levels after advancement. Advancement follows mission milestones. Attribute and species changes require a separate agreement. General Services characters advance the same way, but only their starting skill is Expert; a skill raised later tops out at Specialty (+3) unless they are commissioned (see Step 3).</w:t>
+      </w:r>
+    </w:p>
     <w:bookmarkEnd w:id="66"/>
-    <w:bookmarkStart w:id="67" w:name="advantages"/>
+    <w:bookmarkEnd w:id="67"/>
+    <w:bookmarkStart w:id="68" w:name="advantages"/>
     <w:p>
       <w:pPr>
         <w:pStyle w:val="Heading1"/>
@@ -7076,8 +7167,8 @@
         </w:tc>
       </w:tr>
     </w:tbl>
-    <w:bookmarkEnd w:id="67"/>
-    <w:bookmarkStart w:id="81" w:name="species-advantages"/>
+    <w:bookmarkEnd w:id="68"/>
+    <w:bookmarkStart w:id="82" w:name="species-advantages"/>
     <w:p>
       <w:pPr>
         <w:pStyle w:val="Heading1"/>
@@ -7142,7 +7233,7 @@
         <w:t xml:space="preserve">A custom species advantage follows the same pattern: a narrow +2 or an ability with agreed limits, paired with a companion complication that has a clear trigger and a real consequence.</w:t>
       </w:r>
     </w:p>
-    <w:bookmarkStart w:id="68" w:name="human"/>
+    <w:bookmarkStart w:id="69" w:name="human"/>
     <w:p>
       <w:pPr>
         <w:pStyle w:val="Heading2"/>
@@ -7355,8 +7446,8 @@
         </w:tc>
       </w:tr>
     </w:tbl>
-    <w:bookmarkEnd w:id="68"/>
-    <w:bookmarkStart w:id="69" w:name="vulcan"/>
+    <w:bookmarkEnd w:id="69"/>
+    <w:bookmarkStart w:id="70" w:name="vulcan"/>
     <w:p>
       <w:pPr>
         <w:pStyle w:val="Heading2"/>
@@ -7631,8 +7722,8 @@
         </w:tc>
       </w:tr>
     </w:tbl>
-    <w:bookmarkEnd w:id="69"/>
-    <w:bookmarkStart w:id="70" w:name="andorian"/>
+    <w:bookmarkEnd w:id="70"/>
+    <w:bookmarkStart w:id="71" w:name="andorian"/>
     <w:p>
       <w:pPr>
         <w:pStyle w:val="Heading2"/>
@@ -7845,8 +7936,8 @@
         </w:tc>
       </w:tr>
     </w:tbl>
-    <w:bookmarkEnd w:id="70"/>
-    <w:bookmarkStart w:id="71" w:name="tellarite"/>
+    <w:bookmarkEnd w:id="71"/>
+    <w:bookmarkStart w:id="72" w:name="tellarite"/>
     <w:p>
       <w:pPr>
         <w:pStyle w:val="Heading2"/>
@@ -8059,8 +8150,8 @@
         </w:tc>
       </w:tr>
     </w:tbl>
-    <w:bookmarkEnd w:id="71"/>
-    <w:bookmarkStart w:id="72" w:name="aenar"/>
+    <w:bookmarkEnd w:id="72"/>
+    <w:bookmarkStart w:id="73" w:name="aenar"/>
     <w:p>
       <w:pPr>
         <w:pStyle w:val="Heading2"/>
@@ -8273,8 +8364,8 @@
         </w:tc>
       </w:tr>
     </w:tbl>
-    <w:bookmarkEnd w:id="72"/>
-    <w:bookmarkStart w:id="73" w:name="illyrian"/>
+    <w:bookmarkEnd w:id="73"/>
+    <w:bookmarkStart w:id="74" w:name="illyrian"/>
     <w:p>
       <w:pPr>
         <w:pStyle w:val="Heading2"/>
@@ -8487,8 +8578,8 @@
         </w:tc>
       </w:tr>
     </w:tbl>
-    <w:bookmarkEnd w:id="73"/>
-    <w:bookmarkStart w:id="74" w:name="lanthanite"/>
+    <w:bookmarkEnd w:id="74"/>
+    <w:bookmarkStart w:id="75" w:name="lanthanite"/>
     <w:p>
       <w:pPr>
         <w:pStyle w:val="Heading2"/>
@@ -8701,8 +8792,8 @@
         </w:tc>
       </w:tr>
     </w:tbl>
-    <w:bookmarkEnd w:id="74"/>
-    <w:bookmarkStart w:id="75" w:name="caitian"/>
+    <w:bookmarkEnd w:id="75"/>
+    <w:bookmarkStart w:id="76" w:name="caitian"/>
     <w:p>
       <w:pPr>
         <w:pStyle w:val="Heading2"/>
@@ -8915,8 +9006,8 @@
         </w:tc>
       </w:tr>
     </w:tbl>
-    <w:bookmarkEnd w:id="75"/>
-    <w:bookmarkStart w:id="76" w:name="aurelian"/>
+    <w:bookmarkEnd w:id="76"/>
+    <w:bookmarkStart w:id="77" w:name="aurelian"/>
     <w:p>
       <w:pPr>
         <w:pStyle w:val="Heading2"/>
@@ -9129,8 +9220,8 @@
         </w:tc>
       </w:tr>
     </w:tbl>
-    <w:bookmarkEnd w:id="76"/>
-    <w:bookmarkStart w:id="77" w:name="orion"/>
+    <w:bookmarkEnd w:id="77"/>
+    <w:bookmarkStart w:id="78" w:name="orion"/>
     <w:p>
       <w:pPr>
         <w:pStyle w:val="Heading2"/>
@@ -9343,8 +9434,8 @@
         </w:tc>
       </w:tr>
     </w:tbl>
-    <w:bookmarkEnd w:id="77"/>
-    <w:bookmarkStart w:id="78" w:name="denobulan"/>
+    <w:bookmarkEnd w:id="78"/>
+    <w:bookmarkStart w:id="79" w:name="denobulan"/>
     <w:p>
       <w:pPr>
         <w:pStyle w:val="Heading2"/>
@@ -9557,8 +9648,8 @@
         </w:tc>
       </w:tr>
     </w:tbl>
-    <w:bookmarkEnd w:id="78"/>
-    <w:bookmarkStart w:id="79" w:name="trill"/>
+    <w:bookmarkEnd w:id="79"/>
+    <w:bookmarkStart w:id="80" w:name="trill"/>
     <w:p>
       <w:pPr>
         <w:pStyle w:val="Heading2"/>
@@ -9779,8 +9870,8 @@
         </w:tc>
       </w:tr>
     </w:tbl>
-    <w:bookmarkEnd w:id="79"/>
-    <w:bookmarkStart w:id="80" w:name="saurian"/>
+    <w:bookmarkEnd w:id="80"/>
+    <w:bookmarkStart w:id="81" w:name="saurian"/>
     <w:p>
       <w:pPr>
         <w:pStyle w:val="Heading2"/>
@@ -9993,9 +10084,9 @@
         </w:tc>
       </w:tr>
     </w:tbl>
-    <w:bookmarkEnd w:id="80"/>
     <w:bookmarkEnd w:id="81"/>
-    <w:bookmarkStart w:id="83" w:name="complications"/>
+    <w:bookmarkEnd w:id="82"/>
+    <w:bookmarkStart w:id="84" w:name="complications"/>
     <w:p>
       <w:pPr>
         <w:pStyle w:val="Heading1"/>
@@ -10010,6 +10101,14 @@
       </w:pPr>
       <w:r>
         <w:t xml:space="preserve">Choose one complication. These are sources of meaningful choices, not constant penalties. The GM proposes a concrete problem and offers one Duty point if you accept it. You may decline without penalty. A personality description, harmless habit, or repeated inconvenience earns no point by itself. Agree on boundaries before a complication affects another player’s character.</w:t>
+      </w:r>
+    </w:p>
+    <w:p>
+      <w:pPr>
+        <w:pStyle w:val="BodyText"/>
+      </w:pPr>
+      <w:r>
+        <w:t xml:space="preserve">Every complication needs a trigger: the concrete situation that brings it into play. The creator suggests three for each complication below; pick one, combine them, or write your own with the GM.</w:t>
       </w:r>
     </w:p>
     <w:tbl>
@@ -10601,7 +10700,7 @@
         </w:tc>
       </w:tr>
     </w:tbl>
-    <w:bookmarkStart w:id="82" w:name="using-and-revising-traits"/>
+    <w:bookmarkStart w:id="83" w:name="using-and-revising-traits"/>
     <w:p>
       <w:pPr>
         <w:pStyle w:val="Heading2"/>
@@ -10618,9 +10717,9 @@
         <w:t xml:space="preserve">General advantages and complications describe individual crew members and can suit any species when appropriate. A Vulcan might choose Mental Discipline as a general advantage; species advantages are the only traits tied to a species. At a mission milestone, revise a trait when events change the character. Custom advantages follow the same narrow +2 benefit; custom complications need a clear trigger and a meaningful, accepted consequence.</w:t>
       </w:r>
     </w:p>
-    <w:bookmarkEnd w:id="82"/>
     <w:bookmarkEnd w:id="83"/>
-    <w:bookmarkStart w:id="87" w:name="quick-reference"/>
+    <w:bookmarkEnd w:id="84"/>
+    <w:bookmarkStart w:id="88" w:name="quick-reference"/>
     <w:p>
       <w:pPr>
         <w:pStyle w:val="Heading1"/>
@@ -10629,7 +10728,7 @@
         <w:t xml:space="preserve">Quick reference</w:t>
       </w:r>
     </w:p>
-    <w:bookmarkStart w:id="84" w:name="will-and-mental-resistance"/>
+    <w:bookmarkStart w:id="85" w:name="will-and-mental-resistance"/>
     <w:p>
       <w:pPr>
         <w:pStyle w:val="Heading2"/>
@@ -10662,8 +10761,8 @@
         <w:t xml:space="preserve">Will protects your resolve; Presence influences others. Leadership and Diplomacy still use Presence. Species adjustments may change your starting Will, but mental advantages apply only to their agreed, narrow circumstances.</w:t>
       </w:r>
     </w:p>
-    <w:bookmarkEnd w:id="84"/>
-    <w:bookmarkStart w:id="85" w:name="at-the-table"/>
+    <w:bookmarkEnd w:id="85"/>
+    <w:bookmarkStart w:id="86" w:name="at-the-table"/>
     <w:p>
       <w:pPr>
         <w:pStyle w:val="Heading2"/>
@@ -10732,8 +10831,8 @@
         <w:t xml:space="preserve">Apply the result and describe what changes.</w:t>
       </w:r>
     </w:p>
-    <w:bookmarkEnd w:id="85"/>
-    <w:bookmarkStart w:id="86" w:name="summary"/>
+    <w:bookmarkEnd w:id="86"/>
+    <w:bookmarkStart w:id="87" w:name="summary"/>
     <w:p>
       <w:pPr>
         <w:pStyle w:val="Heading2"/>
@@ -10757,7 +10856,7 @@
         <w:t xml:space="preserve"> </w:t>
       </w:r>
       <w:r>
-        <w:t xml:space="preserve">attributes start at 10, adjusted by species (always totaling zero), plus 5 points; maximum 13 plus any species bonus. One Specialty and nine Trained skills. One advantage (general or species) and one complication; a species advantage brings its companion complication.</w:t>
+        <w:t xml:space="preserve">attributes start at 10, adjusted by species (always totaling zero), plus 5 points; maximum 13 plus any species bonus. One Specialty and nine Trained skills (General Services: one Expert at +5 and seven Trained). One advantage (general or species) and one complication; a species advantage brings its companion complication.</w:t>
       </w:r>
     </w:p>
     <w:p>
@@ -10775,7 +10874,7 @@
         <w:t xml:space="preserve"> </w:t>
       </w:r>
       <w:r>
-        <w:t xml:space="preserve">Untrained = attribute −4; Trained = attribute +1; Specialty = attribute +3.</w:t>
+        <w:t xml:space="preserve">Untrained = attribute −4; Trained = attribute +1; Specialty = attribute +3; Expert (General Services only) = attribute +5.</w:t>
       </w:r>
     </w:p>
     <w:p>
@@ -10904,8 +11003,8 @@
         <w:t xml:space="preserve">start each session with two. Spend one to reroll, reduce an injury by one box, or establish a plausible preparation. Earn one when an accepted complication, including a companion complication, creates a meaningful problem.</w:t>
       </w:r>
     </w:p>
-    <w:bookmarkEnd w:id="86"/>
     <w:bookmarkEnd w:id="87"/>
+    <w:bookmarkEnd w:id="88"/>
     <w:sectPr/>
   </w:body>
 </w:document>

</xml_diff>

<commit_message>
Add six ready-made crew members
Command (Andorian), science (Vulcan), medical (Denobulan), engineering
(Tellarite), security (Human) and General Services (Caitian), each valid
under the creation rules and connected to one another. Load one from the
creator's Ready-made crew menu as a fresh copy; the guide gains a
Ready-made crew chapter with each one's numbers.

Co-Authored-By: Claude Opus 5.5 <noreply@anthropic.com>
Claude-Session: https://claude.ai/code/session_015SADCFzhKijkC2foUmXrpC
</commit_message>
<xml_diff>
--- a/uss-pelion/USS_Pelion_Players_Guide.docx
+++ b/uss-pelion/USS_Pelion_Players_Guide.docx
@@ -7211,7 +7211,1025 @@
     </w:p>
     <w:bookmarkEnd w:id="68"/>
     <w:bookmarkEnd w:id="69"/>
-    <w:bookmarkStart w:id="70" w:name="threats"/>
+    <w:bookmarkStart w:id="76" w:name="ready-made-crew"/>
+    <w:p>
+      <w:pPr>
+        <w:pStyle w:val="Heading1"/>
+      </w:pPr>
+      <w:r>
+        <w:t xml:space="preserve">Ready-made crew</w:t>
+      </w:r>
+    </w:p>
+    <w:p>
+      <w:pPr>
+        <w:pStyle w:val="FirstParagraph"/>
+      </w:pPr>
+      <w:r>
+        <w:t xml:space="preserve">Six crew members ready to play, for one-shots, new players, or a crew in a hurry. Each follows the creation rules exactly, and their connections tie them to one another. In the creator, choose</w:t>
+      </w:r>
+      <w:r>
+        <w:t xml:space="preserve"> </w:t>
+      </w:r>
+      <w:r>
+        <w:rPr>
+          <w:bCs/>
+          <w:b/>
+        </w:rPr>
+        <w:t xml:space="preserve">Load a ready-made crew member</w:t>
+      </w:r>
+      <w:r>
+        <w:t xml:space="preserve"> </w:t>
+      </w:r>
+      <w:r>
+        <w:t xml:space="preserve">to open one and make it your own.</w:t>
+      </w:r>
+    </w:p>
+    <w:bookmarkStart w:id="70" w:name="thelan-shvari"/>
+    <w:p>
+      <w:pPr>
+        <w:pStyle w:val="Heading2"/>
+      </w:pPr>
+      <w:r>
+        <w:t xml:space="preserve">Thelan sh’Vari</w:t>
+      </w:r>
+    </w:p>
+    <w:p>
+      <w:pPr>
+        <w:pStyle w:val="FirstParagraph"/>
+      </w:pPr>
+      <w:r>
+        <w:rPr>
+          <w:iCs/>
+          <w:i/>
+        </w:rPr>
+        <w:t xml:space="preserve">Lieutenant Commander, Command. Andorian.</w:t>
+      </w:r>
+      <w:r>
+        <w:t xml:space="preserve"> </w:t>
+      </w:r>
+      <w:r>
+        <w:t xml:space="preserve">First officer: keeps the crew moving when the captain’s plan meets reality, and keeps the captain honest.</w:t>
+      </w:r>
+    </w:p>
+    <w:p>
+      <w:pPr>
+        <w:numPr>
+          <w:ilvl w:val="0"/>
+          <w:numId w:val="1010"/>
+        </w:numPr>
+        <w:pStyle w:val="Compact"/>
+      </w:pPr>
+      <w:r>
+        <w:rPr>
+          <w:bCs/>
+          <w:b/>
+        </w:rPr>
+        <w:t xml:space="preserve">Attributes:</w:t>
+      </w:r>
+      <w:r>
+        <w:t xml:space="preserve"> </w:t>
+      </w:r>
+      <w:r>
+        <w:t xml:space="preserve">Body 10, Agility 12, Intellect 10, Presence 13, Will 10.</w:t>
+      </w:r>
+      <w:r>
+        <w:t xml:space="preserve"> </w:t>
+      </w:r>
+      <w:r>
+        <w:rPr>
+          <w:bCs/>
+          <w:b/>
+        </w:rPr>
+        <w:t xml:space="preserve">Dodge</w:t>
+      </w:r>
+      <w:r>
+        <w:t xml:space="preserve"> </w:t>
+      </w:r>
+      <w:r>
+        <w:t xml:space="preserve">11.</w:t>
+      </w:r>
+    </w:p>
+    <w:p>
+      <w:pPr>
+        <w:numPr>
+          <w:ilvl w:val="0"/>
+          <w:numId w:val="1010"/>
+        </w:numPr>
+        <w:pStyle w:val="Compact"/>
+      </w:pPr>
+      <w:r>
+        <w:rPr>
+          <w:bCs/>
+          <w:b/>
+        </w:rPr>
+        <w:t xml:space="preserve">Skills:</w:t>
+      </w:r>
+      <w:r>
+        <w:t xml:space="preserve"> </w:t>
+      </w:r>
+      <w:r>
+        <w:t xml:space="preserve">Leadership 16 (Specialty). Trained: Diplomacy 14, Helm 13, Phasers 13, Unarmed Combat 13, Navigation 11, Psychology 11, Athletics 11, Sensors 11, Communications 11.</w:t>
+      </w:r>
+    </w:p>
+    <w:p>
+      <w:pPr>
+        <w:numPr>
+          <w:ilvl w:val="0"/>
+          <w:numId w:val="1010"/>
+        </w:numPr>
+        <w:pStyle w:val="Compact"/>
+      </w:pPr>
+      <w:r>
+        <w:rPr>
+          <w:bCs/>
+          <w:b/>
+        </w:rPr>
+        <w:t xml:space="preserve">Advantage:</w:t>
+      </w:r>
+      <w:r>
+        <w:t xml:space="preserve"> </w:t>
+      </w:r>
+      <w:r>
+        <w:t xml:space="preserve">Crisis Leader.</w:t>
+      </w:r>
+      <w:r>
+        <w:t xml:space="preserve"> </w:t>
+      </w:r>
+      <w:r>
+        <w:rPr>
+          <w:bCs/>
+          <w:b/>
+        </w:rPr>
+        <w:t xml:space="preserve">Complication:</w:t>
+      </w:r>
+      <w:r>
+        <w:t xml:space="preserve"> </w:t>
+      </w:r>
+      <w:r>
+        <w:t xml:space="preserve">Reputation to Uphold; trigger: someone questions your competence in front of others.</w:t>
+      </w:r>
+    </w:p>
+    <w:p>
+      <w:pPr>
+        <w:numPr>
+          <w:ilvl w:val="0"/>
+          <w:numId w:val="1010"/>
+        </w:numPr>
+        <w:pStyle w:val="Compact"/>
+      </w:pPr>
+      <w:r>
+        <w:rPr>
+          <w:bCs/>
+          <w:b/>
+        </w:rPr>
+        <w:t xml:space="preserve">Why I serve:</w:t>
+      </w:r>
+      <w:r>
+        <w:t xml:space="preserve"> </w:t>
+      </w:r>
+      <w:r>
+        <w:t xml:space="preserve">Starfleet runs in my family, and I mean to live up to the name.</w:t>
+      </w:r>
+      <w:r>
+        <w:t xml:space="preserve"> </w:t>
+      </w:r>
+      <w:r>
+        <w:rPr>
+          <w:bCs/>
+          <w:b/>
+        </w:rPr>
+        <w:t xml:space="preserve">Connection:</w:t>
+      </w:r>
+      <w:r>
+        <w:t xml:space="preserve"> </w:t>
+      </w:r>
+      <w:r>
+        <w:t xml:space="preserve">Took Yeoman Rrinn under their wing when Rrinn first came aboard.</w:t>
+      </w:r>
+    </w:p>
+    <w:bookmarkEnd w:id="70"/>
+    <w:bookmarkStart w:id="71" w:name="sevek"/>
+    <w:p>
+      <w:pPr>
+        <w:pStyle w:val="Heading2"/>
+      </w:pPr>
+      <w:r>
+        <w:t xml:space="preserve">Sevek</w:t>
+      </w:r>
+    </w:p>
+    <w:p>
+      <w:pPr>
+        <w:pStyle w:val="FirstParagraph"/>
+      </w:pPr>
+      <w:r>
+        <w:rPr>
+          <w:iCs/>
+          <w:i/>
+        </w:rPr>
+        <w:t xml:space="preserve">Lieutenant, Science. Vulcan.</w:t>
+      </w:r>
+      <w:r>
+        <w:t xml:space="preserve"> </w:t>
+      </w:r>
+      <w:r>
+        <w:t xml:space="preserve">Ship’s sciences officer: reads the anomaly, names the risk, and calculates the odds no one asked for.</w:t>
+      </w:r>
+    </w:p>
+    <w:p>
+      <w:pPr>
+        <w:numPr>
+          <w:ilvl w:val="0"/>
+          <w:numId w:val="1011"/>
+        </w:numPr>
+        <w:pStyle w:val="Compact"/>
+      </w:pPr>
+      <w:r>
+        <w:rPr>
+          <w:bCs/>
+          <w:b/>
+        </w:rPr>
+        <w:t xml:space="preserve">Attributes:</w:t>
+      </w:r>
+      <w:r>
+        <w:t xml:space="preserve"> </w:t>
+      </w:r>
+      <w:r>
+        <w:t xml:space="preserve">Body 11, Agility 11, Intellect 13, Presence 8, Will 12.</w:t>
+      </w:r>
+      <w:r>
+        <w:t xml:space="preserve"> </w:t>
+      </w:r>
+      <w:r>
+        <w:rPr>
+          <w:bCs/>
+          <w:b/>
+        </w:rPr>
+        <w:t xml:space="preserve">Dodge</w:t>
+      </w:r>
+      <w:r>
+        <w:t xml:space="preserve"> </w:t>
+      </w:r>
+      <w:r>
+        <w:t xml:space="preserve">10.</w:t>
+      </w:r>
+    </w:p>
+    <w:p>
+      <w:pPr>
+        <w:numPr>
+          <w:ilvl w:val="0"/>
+          <w:numId w:val="1011"/>
+        </w:numPr>
+        <w:pStyle w:val="Compact"/>
+      </w:pPr>
+      <w:r>
+        <w:rPr>
+          <w:bCs/>
+          <w:b/>
+        </w:rPr>
+        <w:t xml:space="preserve">Skills:</w:t>
+      </w:r>
+      <w:r>
+        <w:t xml:space="preserve"> </w:t>
+      </w:r>
+      <w:r>
+        <w:t xml:space="preserve">Physical Sciences 16 (Specialty). Trained: Sensors 14, Computers 14, Life Sciences 14, Navigation 14, Engineering 14, Electronics 14, Psychology 14, Unarmed Combat 12, Athletics 12.</w:t>
+      </w:r>
+    </w:p>
+    <w:p>
+      <w:pPr>
+        <w:numPr>
+          <w:ilvl w:val="0"/>
+          <w:numId w:val="1011"/>
+        </w:numPr>
+        <w:pStyle w:val="Compact"/>
+      </w:pPr>
+      <w:r>
+        <w:rPr>
+          <w:bCs/>
+          <w:b/>
+        </w:rPr>
+        <w:t xml:space="preserve">Advantage:</w:t>
+      </w:r>
+      <w:r>
+        <w:t xml:space="preserve"> </w:t>
+      </w:r>
+      <w:r>
+        <w:t xml:space="preserve">Eidetic Recall (species; companion: Suppressed Emotion).</w:t>
+      </w:r>
+      <w:r>
+        <w:t xml:space="preserve"> </w:t>
+      </w:r>
+      <w:r>
+        <w:rPr>
+          <w:bCs/>
+          <w:b/>
+        </w:rPr>
+        <w:t xml:space="preserve">Complication:</w:t>
+      </w:r>
+      <w:r>
+        <w:t xml:space="preserve"> </w:t>
+      </w:r>
+      <w:r>
+        <w:t xml:space="preserve">Cannot Leave a Mystery Alone; trigger: sensor data that contradicts known science.</w:t>
+      </w:r>
+    </w:p>
+    <w:p>
+      <w:pPr>
+        <w:numPr>
+          <w:ilvl w:val="0"/>
+          <w:numId w:val="1011"/>
+        </w:numPr>
+        <w:pStyle w:val="Compact"/>
+      </w:pPr>
+      <w:r>
+        <w:rPr>
+          <w:bCs/>
+          <w:b/>
+        </w:rPr>
+        <w:t xml:space="preserve">Why I serve:</w:t>
+      </w:r>
+      <w:r>
+        <w:t xml:space="preserve"> </w:t>
+      </w:r>
+      <w:r>
+        <w:t xml:space="preserve">The best laboratory in the galaxy is a starship on the frontier.</w:t>
+      </w:r>
+      <w:r>
+        <w:t xml:space="preserve"> </w:t>
+      </w:r>
+      <w:r>
+        <w:rPr>
+          <w:bCs/>
+          <w:b/>
+        </w:rPr>
+        <w:t xml:space="preserve">Connection:</w:t>
+      </w:r>
+      <w:r>
+        <w:t xml:space="preserve"> </w:t>
+      </w:r>
+      <w:r>
+        <w:t xml:space="preserve">Friendly rivals with Lt. Grath: they argue every engineering theory, and both enjoy it.</w:t>
+      </w:r>
+    </w:p>
+    <w:bookmarkEnd w:id="71"/>
+    <w:bookmarkStart w:id="72" w:name="dr.-vessik"/>
+    <w:p>
+      <w:pPr>
+        <w:pStyle w:val="Heading2"/>
+      </w:pPr>
+      <w:r>
+        <w:t xml:space="preserve">Dr. Vessik</w:t>
+      </w:r>
+    </w:p>
+    <w:p>
+      <w:pPr>
+        <w:pStyle w:val="FirstParagraph"/>
+      </w:pPr>
+      <w:r>
+        <w:rPr>
+          <w:iCs/>
+          <w:i/>
+        </w:rPr>
+        <w:t xml:space="preserve">Lieutenant Commander, Medical. Denobulan.</w:t>
+      </w:r>
+      <w:r>
+        <w:t xml:space="preserve"> </w:t>
+      </w:r>
+      <w:r>
+        <w:t xml:space="preserve">Chief medical officer: patches up the crew, argues with the captain, and keeps an alarming menagerie of medicinal creatures in sickbay.</w:t>
+      </w:r>
+    </w:p>
+    <w:p>
+      <w:pPr>
+        <w:numPr>
+          <w:ilvl w:val="0"/>
+          <w:numId w:val="1012"/>
+        </w:numPr>
+        <w:pStyle w:val="Compact"/>
+      </w:pPr>
+      <w:r>
+        <w:rPr>
+          <w:bCs/>
+          <w:b/>
+        </w:rPr>
+        <w:t xml:space="preserve">Attributes:</w:t>
+      </w:r>
+      <w:r>
+        <w:t xml:space="preserve"> </w:t>
+      </w:r>
+      <w:r>
+        <w:t xml:space="preserve">Body 9, Agility 9, Intellect 13, Presence 12, Will 12.</w:t>
+      </w:r>
+      <w:r>
+        <w:t xml:space="preserve"> </w:t>
+      </w:r>
+      <w:r>
+        <w:rPr>
+          <w:bCs/>
+          <w:b/>
+        </w:rPr>
+        <w:t xml:space="preserve">Dodge</w:t>
+      </w:r>
+      <w:r>
+        <w:t xml:space="preserve"> </w:t>
+      </w:r>
+      <w:r>
+        <w:t xml:space="preserve">7.</w:t>
+      </w:r>
+    </w:p>
+    <w:p>
+      <w:pPr>
+        <w:numPr>
+          <w:ilvl w:val="0"/>
+          <w:numId w:val="1012"/>
+        </w:numPr>
+        <w:pStyle w:val="Compact"/>
+      </w:pPr>
+      <w:r>
+        <w:rPr>
+          <w:bCs/>
+          <w:b/>
+        </w:rPr>
+        <w:t xml:space="preserve">Skills:</w:t>
+      </w:r>
+      <w:r>
+        <w:t xml:space="preserve"> </w:t>
+      </w:r>
+      <w:r>
+        <w:t xml:space="preserve">Medicine 16 (Specialty). Trained: Life Sciences 14, Psychology 14, Sensors 14, Computers 14, Electronics 14, Survival 14, Communications 14, Diplomacy 13, Leadership 13.</w:t>
+      </w:r>
+    </w:p>
+    <w:p>
+      <w:pPr>
+        <w:numPr>
+          <w:ilvl w:val="0"/>
+          <w:numId w:val="1012"/>
+        </w:numPr>
+        <w:pStyle w:val="Compact"/>
+      </w:pPr>
+      <w:r>
+        <w:rPr>
+          <w:bCs/>
+          <w:b/>
+        </w:rPr>
+        <w:t xml:space="preserve">Advantage:</w:t>
+      </w:r>
+      <w:r>
+        <w:t xml:space="preserve"> </w:t>
+      </w:r>
+      <w:r>
+        <w:t xml:space="preserve">Denobulan Pharmacopoeia (species; companion: Unorthodox Methods).</w:t>
+      </w:r>
+      <w:r>
+        <w:t xml:space="preserve"> </w:t>
+      </w:r>
+      <w:r>
+        <w:rPr>
+          <w:bCs/>
+          <w:b/>
+        </w:rPr>
+        <w:t xml:space="preserve">Complication:</w:t>
+      </w:r>
+      <w:r>
+        <w:t xml:space="preserve"> </w:t>
+      </w:r>
+      <w:r>
+        <w:t xml:space="preserve">Protects Others at Personal Risk; trigger: civilians are caught in the danger.</w:t>
+      </w:r>
+    </w:p>
+    <w:p>
+      <w:pPr>
+        <w:numPr>
+          <w:ilvl w:val="0"/>
+          <w:numId w:val="1012"/>
+        </w:numPr>
+        <w:pStyle w:val="Compact"/>
+      </w:pPr>
+      <w:r>
+        <w:rPr>
+          <w:bCs/>
+          <w:b/>
+        </w:rPr>
+        <w:t xml:space="preserve">Why I serve:</w:t>
+      </w:r>
+      <w:r>
+        <w:t xml:space="preserve"> </w:t>
+      </w:r>
+      <w:r>
+        <w:t xml:space="preserve">To protect the Federation and the people who can’t protect themselves.</w:t>
+      </w:r>
+      <w:r>
+        <w:t xml:space="preserve"> </w:t>
+      </w:r>
+      <w:r>
+        <w:rPr>
+          <w:bCs/>
+          <w:b/>
+        </w:rPr>
+        <w:t xml:space="preserve">Connection:</w:t>
+      </w:r>
+      <w:r>
+        <w:t xml:space="preserve"> </w:t>
+      </w:r>
+      <w:r>
+        <w:t xml:space="preserve">Pulled Lt. Reyes out of a burning shuttle on a survey mission; Reyes has never let the doctor pay for a drink since.</w:t>
+      </w:r>
+    </w:p>
+    <w:bookmarkEnd w:id="72"/>
+    <w:bookmarkStart w:id="73" w:name="grath"/>
+    <w:p>
+      <w:pPr>
+        <w:pStyle w:val="Heading2"/>
+      </w:pPr>
+      <w:r>
+        <w:t xml:space="preserve">Grath</w:t>
+      </w:r>
+    </w:p>
+    <w:p>
+      <w:pPr>
+        <w:pStyle w:val="FirstParagraph"/>
+      </w:pPr>
+      <w:r>
+        <w:rPr>
+          <w:iCs/>
+          <w:i/>
+        </w:rPr>
+        <w:t xml:space="preserve">Lieutenant, Engineering. Tellarite.</w:t>
+      </w:r>
+      <w:r>
+        <w:t xml:space="preserve"> </w:t>
+      </w:r>
+      <w:r>
+        <w:t xml:space="preserve">Engineer: keeps the Pelion’s power flowing and will tell you, at length, exactly why your idea won’t work.</w:t>
+      </w:r>
+    </w:p>
+    <w:p>
+      <w:pPr>
+        <w:numPr>
+          <w:ilvl w:val="0"/>
+          <w:numId w:val="1013"/>
+        </w:numPr>
+        <w:pStyle w:val="Compact"/>
+      </w:pPr>
+      <w:r>
+        <w:rPr>
+          <w:bCs/>
+          <w:b/>
+        </w:rPr>
+        <w:t xml:space="preserve">Attributes:</w:t>
+      </w:r>
+      <w:r>
+        <w:t xml:space="preserve"> </w:t>
+      </w:r>
+      <w:r>
+        <w:t xml:space="preserve">Body 12, Agility 10, Intellect 13, Presence 9, Will 11.</w:t>
+      </w:r>
+      <w:r>
+        <w:t xml:space="preserve"> </w:t>
+      </w:r>
+      <w:r>
+        <w:rPr>
+          <w:bCs/>
+          <w:b/>
+        </w:rPr>
+        <w:t xml:space="preserve">Dodge</w:t>
+      </w:r>
+      <w:r>
+        <w:t xml:space="preserve"> </w:t>
+      </w:r>
+      <w:r>
+        <w:t xml:space="preserve">9.</w:t>
+      </w:r>
+    </w:p>
+    <w:p>
+      <w:pPr>
+        <w:numPr>
+          <w:ilvl w:val="0"/>
+          <w:numId w:val="1013"/>
+        </w:numPr>
+        <w:pStyle w:val="Compact"/>
+      </w:pPr>
+      <w:r>
+        <w:rPr>
+          <w:bCs/>
+          <w:b/>
+        </w:rPr>
+        <w:t xml:space="preserve">Skills:</w:t>
+      </w:r>
+      <w:r>
+        <w:t xml:space="preserve"> </w:t>
+      </w:r>
+      <w:r>
+        <w:t xml:space="preserve">Engineering 16 (Specialty). Trained: Electronics 14, Computers 14, Physical Sciences 14, Sensors 14, Communications 14, Survival 14, Athletics 13, Helm 11, Unarmed Combat 11.</w:t>
+      </w:r>
+    </w:p>
+    <w:p>
+      <w:pPr>
+        <w:numPr>
+          <w:ilvl w:val="0"/>
+          <w:numId w:val="1013"/>
+        </w:numPr>
+        <w:pStyle w:val="Compact"/>
+      </w:pPr>
+      <w:r>
+        <w:rPr>
+          <w:bCs/>
+          <w:b/>
+        </w:rPr>
+        <w:t xml:space="preserve">Advantage:</w:t>
+      </w:r>
+      <w:r>
+        <w:t xml:space="preserve"> </w:t>
+      </w:r>
+      <w:r>
+        <w:t xml:space="preserve">Improvisational Engineer.</w:t>
+      </w:r>
+      <w:r>
+        <w:t xml:space="preserve"> </w:t>
+      </w:r>
+      <w:r>
+        <w:rPr>
+          <w:bCs/>
+          <w:b/>
+        </w:rPr>
+        <w:t xml:space="preserve">Complication:</w:t>
+      </w:r>
+      <w:r>
+        <w:t xml:space="preserve"> </w:t>
+      </w:r>
+      <w:r>
+        <w:t xml:space="preserve">Experimental Enthusiasm; trigger: an untested device or technique could solve the problem.</w:t>
+      </w:r>
+    </w:p>
+    <w:p>
+      <w:pPr>
+        <w:numPr>
+          <w:ilvl w:val="0"/>
+          <w:numId w:val="1013"/>
+        </w:numPr>
+        <w:pStyle w:val="Compact"/>
+      </w:pPr>
+      <w:r>
+        <w:rPr>
+          <w:bCs/>
+          <w:b/>
+        </w:rPr>
+        <w:t xml:space="preserve">Why I serve:</w:t>
+      </w:r>
+      <w:r>
+        <w:t xml:space="preserve"> </w:t>
+      </w:r>
+      <w:r>
+        <w:t xml:space="preserve">To prove I’m good enough, to everyone who doubted me and to myself.</w:t>
+      </w:r>
+      <w:r>
+        <w:t xml:space="preserve"> </w:t>
+      </w:r>
+      <w:r>
+        <w:rPr>
+          <w:bCs/>
+          <w:b/>
+        </w:rPr>
+        <w:t xml:space="preserve">Connection:</w:t>
+      </w:r>
+      <w:r>
+        <w:t xml:space="preserve"> </w:t>
+      </w:r>
+      <w:r>
+        <w:t xml:space="preserve">Off-duty friends with Commander sh’Vari: a weekly game of Andorian chess in which both of them cheat.</w:t>
+      </w:r>
+    </w:p>
+    <w:bookmarkEnd w:id="73"/>
+    <w:bookmarkStart w:id="74" w:name="marisol-reyes"/>
+    <w:p>
+      <w:pPr>
+        <w:pStyle w:val="Heading2"/>
+      </w:pPr>
+      <w:r>
+        <w:t xml:space="preserve">Marisol Reyes</w:t>
+      </w:r>
+    </w:p>
+    <w:p>
+      <w:pPr>
+        <w:pStyle w:val="FirstParagraph"/>
+      </w:pPr>
+      <w:r>
+        <w:rPr>
+          <w:iCs/>
+          <w:i/>
+        </w:rPr>
+        <w:t xml:space="preserve">Lieutenant (j.g.), Security. Human.</w:t>
+      </w:r>
+      <w:r>
+        <w:t xml:space="preserve"> </w:t>
+      </w:r>
+      <w:r>
+        <w:t xml:space="preserve">Security officer: first through the door on every away mission, and the last to set a phaser to kill.</w:t>
+      </w:r>
+    </w:p>
+    <w:p>
+      <w:pPr>
+        <w:numPr>
+          <w:ilvl w:val="0"/>
+          <w:numId w:val="1014"/>
+        </w:numPr>
+        <w:pStyle w:val="Compact"/>
+      </w:pPr>
+      <w:r>
+        <w:rPr>
+          <w:bCs/>
+          <w:b/>
+        </w:rPr>
+        <w:t xml:space="preserve">Attributes:</w:t>
+      </w:r>
+      <w:r>
+        <w:t xml:space="preserve"> </w:t>
+      </w:r>
+      <w:r>
+        <w:t xml:space="preserve">Body 12, Agility 13, Intellect 10, Presence 10, Will 10.</w:t>
+      </w:r>
+      <w:r>
+        <w:t xml:space="preserve"> </w:t>
+      </w:r>
+      <w:r>
+        <w:rPr>
+          <w:bCs/>
+          <w:b/>
+        </w:rPr>
+        <w:t xml:space="preserve">Dodge</w:t>
+      </w:r>
+      <w:r>
+        <w:t xml:space="preserve"> </w:t>
+      </w:r>
+      <w:r>
+        <w:t xml:space="preserve">12.</w:t>
+      </w:r>
+    </w:p>
+    <w:p>
+      <w:pPr>
+        <w:numPr>
+          <w:ilvl w:val="0"/>
+          <w:numId w:val="1014"/>
+        </w:numPr>
+        <w:pStyle w:val="Compact"/>
+      </w:pPr>
+      <w:r>
+        <w:rPr>
+          <w:bCs/>
+          <w:b/>
+        </w:rPr>
+        <w:t xml:space="preserve">Skills:</w:t>
+      </w:r>
+      <w:r>
+        <w:t xml:space="preserve"> </w:t>
+      </w:r>
+      <w:r>
+        <w:t xml:space="preserve">Phasers 16 (Specialty). Trained: Unarmed Combat 14, Stealth 14, Helm 14, Athletics 13, Survival 11, Sensors 11, Medicine 11, Leadership 11, Communications 11.</w:t>
+      </w:r>
+    </w:p>
+    <w:p>
+      <w:pPr>
+        <w:numPr>
+          <w:ilvl w:val="0"/>
+          <w:numId w:val="1014"/>
+        </w:numPr>
+        <w:pStyle w:val="Compact"/>
+      </w:pPr>
+      <w:r>
+        <w:rPr>
+          <w:bCs/>
+          <w:b/>
+        </w:rPr>
+        <w:t xml:space="preserve">Advantage:</w:t>
+      </w:r>
+      <w:r>
+        <w:t xml:space="preserve"> </w:t>
+      </w:r>
+      <w:r>
+        <w:t xml:space="preserve">Careful Marksman.</w:t>
+      </w:r>
+      <w:r>
+        <w:t xml:space="preserve"> </w:t>
+      </w:r>
+      <w:r>
+        <w:rPr>
+          <w:bCs/>
+          <w:b/>
+        </w:rPr>
+        <w:t xml:space="preserve">Complication:</w:t>
+      </w:r>
+      <w:r>
+        <w:t xml:space="preserve"> </w:t>
+      </w:r>
+      <w:r>
+        <w:t xml:space="preserve">Reluctant to Use Lethal Force; trigger: a hostile refuses to surrender.</w:t>
+      </w:r>
+    </w:p>
+    <w:p>
+      <w:pPr>
+        <w:numPr>
+          <w:ilvl w:val="0"/>
+          <w:numId w:val="1014"/>
+        </w:numPr>
+        <w:pStyle w:val="Compact"/>
+      </w:pPr>
+      <w:r>
+        <w:rPr>
+          <w:bCs/>
+          <w:b/>
+        </w:rPr>
+        <w:t xml:space="preserve">Why I serve:</w:t>
+      </w:r>
+      <w:r>
+        <w:t xml:space="preserve"> </w:t>
+      </w:r>
+      <w:r>
+        <w:t xml:space="preserve">A Starfleet officer once saved my home, and I want to be that person for someone else.</w:t>
+      </w:r>
+      <w:r>
+        <w:t xml:space="preserve"> </w:t>
+      </w:r>
+      <w:r>
+        <w:rPr>
+          <w:bCs/>
+          <w:b/>
+        </w:rPr>
+        <w:t xml:space="preserve">Connection:</w:t>
+      </w:r>
+      <w:r>
+        <w:t xml:space="preserve"> </w:t>
+      </w:r>
+      <w:r>
+        <w:t xml:space="preserve">Owes Dr. Vessik their life after a shuttle crash, and never lets the doctor forget it.</w:t>
+      </w:r>
+    </w:p>
+    <w:bookmarkEnd w:id="74"/>
+    <w:bookmarkStart w:id="75" w:name="rrinn"/>
+    <w:p>
+      <w:pPr>
+        <w:pStyle w:val="Heading2"/>
+      </w:pPr>
+      <w:r>
+        <w:t xml:space="preserve">Rrinn</w:t>
+      </w:r>
+    </w:p>
+    <w:p>
+      <w:pPr>
+        <w:pStyle w:val="FirstParagraph"/>
+      </w:pPr>
+      <w:r>
+        <w:rPr>
+          <w:iCs/>
+          <w:i/>
+        </w:rPr>
+        <w:t xml:space="preserve">Yeoman 2nd Class, General Services. Caitian.</w:t>
+      </w:r>
+      <w:r>
+        <w:t xml:space="preserve"> </w:t>
+      </w:r>
+      <w:r>
+        <w:t xml:space="preserve">Captain’s yeoman: keeps the records, carries the orders, and hears everything said on the bridge.</w:t>
+      </w:r>
+    </w:p>
+    <w:p>
+      <w:pPr>
+        <w:numPr>
+          <w:ilvl w:val="0"/>
+          <w:numId w:val="1015"/>
+        </w:numPr>
+        <w:pStyle w:val="Compact"/>
+      </w:pPr>
+      <w:r>
+        <w:rPr>
+          <w:bCs/>
+          <w:b/>
+        </w:rPr>
+        <w:t xml:space="preserve">Attributes:</w:t>
+      </w:r>
+      <w:r>
+        <w:t xml:space="preserve"> </w:t>
+      </w:r>
+      <w:r>
+        <w:t xml:space="preserve">Body 9, Agility 12, Intellect 13, Presence 11, Will 10.</w:t>
+      </w:r>
+      <w:r>
+        <w:t xml:space="preserve"> </w:t>
+      </w:r>
+      <w:r>
+        <w:rPr>
+          <w:bCs/>
+          <w:b/>
+        </w:rPr>
+        <w:t xml:space="preserve">Dodge</w:t>
+      </w:r>
+      <w:r>
+        <w:t xml:space="preserve"> </w:t>
+      </w:r>
+      <w:r>
+        <w:t xml:space="preserve">11.</w:t>
+      </w:r>
+    </w:p>
+    <w:p>
+      <w:pPr>
+        <w:numPr>
+          <w:ilvl w:val="0"/>
+          <w:numId w:val="1015"/>
+        </w:numPr>
+        <w:pStyle w:val="Compact"/>
+      </w:pPr>
+      <w:r>
+        <w:rPr>
+          <w:bCs/>
+          <w:b/>
+        </w:rPr>
+        <w:t xml:space="preserve">Skills:</w:t>
+      </w:r>
+      <w:r>
+        <w:t xml:space="preserve"> </w:t>
+      </w:r>
+      <w:r>
+        <w:t xml:space="preserve">Computers 18 (Expert). Trained: Communications 14, Psychology 14, Sensors 14, Electronics 14, Stealth 13, Diplomacy 12, Athletics 10.</w:t>
+      </w:r>
+    </w:p>
+    <w:p>
+      <w:pPr>
+        <w:numPr>
+          <w:ilvl w:val="0"/>
+          <w:numId w:val="1015"/>
+        </w:numPr>
+        <w:pStyle w:val="Compact"/>
+      </w:pPr>
+      <w:r>
+        <w:rPr>
+          <w:bCs/>
+          <w:b/>
+        </w:rPr>
+        <w:t xml:space="preserve">Advantage:</w:t>
+      </w:r>
+      <w:r>
+        <w:t xml:space="preserve"> </w:t>
+      </w:r>
+      <w:r>
+        <w:t xml:space="preserve">Keen Hearing (species; companion: Sensitive Ears).</w:t>
+      </w:r>
+      <w:r>
+        <w:t xml:space="preserve"> </w:t>
+      </w:r>
+      <w:r>
+        <w:rPr>
+          <w:bCs/>
+          <w:b/>
+        </w:rPr>
+        <w:t xml:space="preserve">Complication:</w:t>
+      </w:r>
+      <w:r>
+        <w:t xml:space="preserve"> </w:t>
+      </w:r>
+      <w:r>
+        <w:t xml:space="preserve">Someone Back Home; trigger: a message from home arrives.</w:t>
+      </w:r>
+    </w:p>
+    <w:p>
+      <w:pPr>
+        <w:numPr>
+          <w:ilvl w:val="0"/>
+          <w:numId w:val="1015"/>
+        </w:numPr>
+        <w:pStyle w:val="Compact"/>
+      </w:pPr>
+      <w:r>
+        <w:rPr>
+          <w:bCs/>
+          <w:b/>
+        </w:rPr>
+        <w:t xml:space="preserve">Why I serve:</w:t>
+      </w:r>
+      <w:r>
+        <w:t xml:space="preserve"> </w:t>
+      </w:r>
+      <w:r>
+        <w:t xml:space="preserve">To leave behind a past, a world, or a life that was too small for me.</w:t>
+      </w:r>
+      <w:r>
+        <w:t xml:space="preserve"> </w:t>
+      </w:r>
+      <w:r>
+        <w:rPr>
+          <w:bCs/>
+          <w:b/>
+        </w:rPr>
+        <w:t xml:space="preserve">Connection:</w:t>
+      </w:r>
+      <w:r>
+        <w:t xml:space="preserve"> </w:t>
+      </w:r>
+      <w:r>
+        <w:t xml:space="preserve">Shares a secret with Lt. Sevek from a mission neither of them talks about.</w:t>
+      </w:r>
+    </w:p>
+    <w:bookmarkEnd w:id="75"/>
+    <w:bookmarkEnd w:id="76"/>
+    <w:bookmarkStart w:id="77" w:name="threats"/>
     <w:p>
       <w:pPr>
         <w:pStyle w:val="Heading1"/>
@@ -8270,8 +9288,8 @@
         <w:t xml:space="preserve">For a tougher version, add +1 to its targets and one box; for a weaker one, subtract. Starships use the ship tracks above: a Klingon battle cruiser has Shields 3, Hull 4, and Phasers 12 for its gunners.</w:t>
       </w:r>
     </w:p>
-    <w:bookmarkEnd w:id="70"/>
-    <w:bookmarkStart w:id="71" w:name="advantages"/>
+    <w:bookmarkEnd w:id="77"/>
+    <w:bookmarkStart w:id="78" w:name="advantages"/>
     <w:p>
       <w:pPr>
         <w:pStyle w:val="Heading1"/>
@@ -8877,8 +9895,8 @@
         </w:tc>
       </w:tr>
     </w:tbl>
-    <w:bookmarkEnd w:id="71"/>
-    <w:bookmarkStart w:id="85" w:name="species-advantages"/>
+    <w:bookmarkEnd w:id="78"/>
+    <w:bookmarkStart w:id="92" w:name="species-advantages"/>
     <w:p>
       <w:pPr>
         <w:pStyle w:val="Heading1"/>
@@ -8943,7 +9961,7 @@
         <w:t xml:space="preserve">A custom species advantage follows the same pattern: a narrow +2 or an ability with agreed limits, paired with a companion complication that has a clear trigger and a real consequence.</w:t>
       </w:r>
     </w:p>
-    <w:bookmarkStart w:id="72" w:name="human"/>
+    <w:bookmarkStart w:id="79" w:name="human"/>
     <w:p>
       <w:pPr>
         <w:pStyle w:val="Heading2"/>
@@ -9156,8 +10174,8 @@
         </w:tc>
       </w:tr>
     </w:tbl>
-    <w:bookmarkEnd w:id="72"/>
-    <w:bookmarkStart w:id="73" w:name="vulcan"/>
+    <w:bookmarkEnd w:id="79"/>
+    <w:bookmarkStart w:id="80" w:name="vulcan"/>
     <w:p>
       <w:pPr>
         <w:pStyle w:val="Heading2"/>
@@ -9432,8 +10450,8 @@
         </w:tc>
       </w:tr>
     </w:tbl>
-    <w:bookmarkEnd w:id="73"/>
-    <w:bookmarkStart w:id="74" w:name="andorian"/>
+    <w:bookmarkEnd w:id="80"/>
+    <w:bookmarkStart w:id="81" w:name="andorian"/>
     <w:p>
       <w:pPr>
         <w:pStyle w:val="Heading2"/>
@@ -9646,8 +10664,8 @@
         </w:tc>
       </w:tr>
     </w:tbl>
-    <w:bookmarkEnd w:id="74"/>
-    <w:bookmarkStart w:id="75" w:name="tellarite"/>
+    <w:bookmarkEnd w:id="81"/>
+    <w:bookmarkStart w:id="82" w:name="tellarite"/>
     <w:p>
       <w:pPr>
         <w:pStyle w:val="Heading2"/>
@@ -9860,8 +10878,8 @@
         </w:tc>
       </w:tr>
     </w:tbl>
-    <w:bookmarkEnd w:id="75"/>
-    <w:bookmarkStart w:id="76" w:name="aenar"/>
+    <w:bookmarkEnd w:id="82"/>
+    <w:bookmarkStart w:id="83" w:name="aenar"/>
     <w:p>
       <w:pPr>
         <w:pStyle w:val="Heading2"/>
@@ -10074,8 +11092,8 @@
         </w:tc>
       </w:tr>
     </w:tbl>
-    <w:bookmarkEnd w:id="76"/>
-    <w:bookmarkStart w:id="77" w:name="illyrian"/>
+    <w:bookmarkEnd w:id="83"/>
+    <w:bookmarkStart w:id="84" w:name="illyrian"/>
     <w:p>
       <w:pPr>
         <w:pStyle w:val="Heading2"/>
@@ -10288,8 +11306,8 @@
         </w:tc>
       </w:tr>
     </w:tbl>
-    <w:bookmarkEnd w:id="77"/>
-    <w:bookmarkStart w:id="78" w:name="lanthanite"/>
+    <w:bookmarkEnd w:id="84"/>
+    <w:bookmarkStart w:id="85" w:name="lanthanite"/>
     <w:p>
       <w:pPr>
         <w:pStyle w:val="Heading2"/>
@@ -10502,8 +11520,8 @@
         </w:tc>
       </w:tr>
     </w:tbl>
-    <w:bookmarkEnd w:id="78"/>
-    <w:bookmarkStart w:id="79" w:name="caitian"/>
+    <w:bookmarkEnd w:id="85"/>
+    <w:bookmarkStart w:id="86" w:name="caitian"/>
     <w:p>
       <w:pPr>
         <w:pStyle w:val="Heading2"/>
@@ -10716,8 +11734,8 @@
         </w:tc>
       </w:tr>
     </w:tbl>
-    <w:bookmarkEnd w:id="79"/>
-    <w:bookmarkStart w:id="80" w:name="aurelian"/>
+    <w:bookmarkEnd w:id="86"/>
+    <w:bookmarkStart w:id="87" w:name="aurelian"/>
     <w:p>
       <w:pPr>
         <w:pStyle w:val="Heading2"/>
@@ -10930,8 +11948,8 @@
         </w:tc>
       </w:tr>
     </w:tbl>
-    <w:bookmarkEnd w:id="80"/>
-    <w:bookmarkStart w:id="81" w:name="orion"/>
+    <w:bookmarkEnd w:id="87"/>
+    <w:bookmarkStart w:id="88" w:name="orion"/>
     <w:p>
       <w:pPr>
         <w:pStyle w:val="Heading2"/>
@@ -11144,8 +12162,8 @@
         </w:tc>
       </w:tr>
     </w:tbl>
-    <w:bookmarkEnd w:id="81"/>
-    <w:bookmarkStart w:id="82" w:name="denobulan"/>
+    <w:bookmarkEnd w:id="88"/>
+    <w:bookmarkStart w:id="89" w:name="denobulan"/>
     <w:p>
       <w:pPr>
         <w:pStyle w:val="Heading2"/>
@@ -11358,8 +12376,8 @@
         </w:tc>
       </w:tr>
     </w:tbl>
-    <w:bookmarkEnd w:id="82"/>
-    <w:bookmarkStart w:id="83" w:name="trill"/>
+    <w:bookmarkEnd w:id="89"/>
+    <w:bookmarkStart w:id="90" w:name="trill"/>
     <w:p>
       <w:pPr>
         <w:pStyle w:val="Heading2"/>
@@ -11580,8 +12598,8 @@
         </w:tc>
       </w:tr>
     </w:tbl>
-    <w:bookmarkEnd w:id="83"/>
-    <w:bookmarkStart w:id="84" w:name="saurian"/>
+    <w:bookmarkEnd w:id="90"/>
+    <w:bookmarkStart w:id="91" w:name="saurian"/>
     <w:p>
       <w:pPr>
         <w:pStyle w:val="Heading2"/>
@@ -11794,9 +12812,9 @@
         </w:tc>
       </w:tr>
     </w:tbl>
-    <w:bookmarkEnd w:id="84"/>
-    <w:bookmarkEnd w:id="85"/>
-    <w:bookmarkStart w:id="87" w:name="complications"/>
+    <w:bookmarkEnd w:id="91"/>
+    <w:bookmarkEnd w:id="92"/>
+    <w:bookmarkStart w:id="94" w:name="complications"/>
     <w:p>
       <w:pPr>
         <w:pStyle w:val="Heading1"/>
@@ -12410,7 +13428,7 @@
         </w:tc>
       </w:tr>
     </w:tbl>
-    <w:bookmarkStart w:id="86" w:name="using-and-revising-traits"/>
+    <w:bookmarkStart w:id="93" w:name="using-and-revising-traits"/>
     <w:p>
       <w:pPr>
         <w:pStyle w:val="Heading2"/>
@@ -12427,9 +13445,9 @@
         <w:t xml:space="preserve">General advantages and complications describe individual crew members and can suit any species when appropriate. A Vulcan might choose Mental Discipline as a general advantage; species advantages are the only traits tied to a species. At a mission milestone, revise a trait when events change the character. Custom advantages follow the same narrow +2 benefit; custom complications need a clear trigger and a meaningful, accepted consequence.</w:t>
       </w:r>
     </w:p>
-    <w:bookmarkEnd w:id="86"/>
-    <w:bookmarkEnd w:id="87"/>
-    <w:bookmarkStart w:id="91" w:name="quick-reference"/>
+    <w:bookmarkEnd w:id="93"/>
+    <w:bookmarkEnd w:id="94"/>
+    <w:bookmarkStart w:id="98" w:name="quick-reference"/>
     <w:p>
       <w:pPr>
         <w:pStyle w:val="Heading1"/>
@@ -12438,7 +13456,7 @@
         <w:t xml:space="preserve">Quick reference</w:t>
       </w:r>
     </w:p>
-    <w:bookmarkStart w:id="88" w:name="will-and-mental-resistance"/>
+    <w:bookmarkStart w:id="95" w:name="will-and-mental-resistance"/>
     <w:p>
       <w:pPr>
         <w:pStyle w:val="Heading2"/>
@@ -12471,8 +13489,8 @@
         <w:t xml:space="preserve">Will protects your resolve; Presence influences others. Leadership and Diplomacy still use Presence. Species adjustments may change your starting Will, but mental advantages apply only to their agreed, narrow circumstances.</w:t>
       </w:r>
     </w:p>
-    <w:bookmarkEnd w:id="88"/>
-    <w:bookmarkStart w:id="89" w:name="at-the-table"/>
+    <w:bookmarkEnd w:id="95"/>
+    <w:bookmarkStart w:id="96" w:name="at-the-table"/>
     <w:p>
       <w:pPr>
         <w:pStyle w:val="Heading2"/>
@@ -12485,7 +13503,7 @@
       <w:pPr>
         <w:numPr>
           <w:ilvl w:val="0"/>
-          <w:numId w:val="1010"/>
+          <w:numId w:val="1016"/>
         </w:numPr>
         <w:pStyle w:val="Compact"/>
       </w:pPr>
@@ -12497,7 +13515,7 @@
       <w:pPr>
         <w:numPr>
           <w:ilvl w:val="0"/>
-          <w:numId w:val="1010"/>
+          <w:numId w:val="1016"/>
         </w:numPr>
         <w:pStyle w:val="Compact"/>
       </w:pPr>
@@ -12509,7 +13527,7 @@
       <w:pPr>
         <w:numPr>
           <w:ilvl w:val="0"/>
-          <w:numId w:val="1010"/>
+          <w:numId w:val="1016"/>
         </w:numPr>
         <w:pStyle w:val="Compact"/>
       </w:pPr>
@@ -12521,7 +13539,7 @@
       <w:pPr>
         <w:numPr>
           <w:ilvl w:val="0"/>
-          <w:numId w:val="1010"/>
+          <w:numId w:val="1016"/>
         </w:numPr>
         <w:pStyle w:val="Compact"/>
       </w:pPr>
@@ -12533,7 +13551,7 @@
       <w:pPr>
         <w:numPr>
           <w:ilvl w:val="0"/>
-          <w:numId w:val="1010"/>
+          <w:numId w:val="1016"/>
         </w:numPr>
         <w:pStyle w:val="Compact"/>
       </w:pPr>
@@ -12541,8 +13559,8 @@
         <w:t xml:space="preserve">Apply the result and describe what changes.</w:t>
       </w:r>
     </w:p>
-    <w:bookmarkEnd w:id="89"/>
-    <w:bookmarkStart w:id="90" w:name="summary"/>
+    <w:bookmarkEnd w:id="96"/>
+    <w:bookmarkStart w:id="97" w:name="summary"/>
     <w:p>
       <w:pPr>
         <w:pStyle w:val="Heading2"/>
@@ -12767,8 +13785,8 @@
         <w:t xml:space="preserve">start each session with two. Spend one to reroll, reduce an injury by one box, or establish a plausible preparation. Earn one when an accepted complication, including a companion complication, creates a meaningful problem.</w:t>
       </w:r>
     </w:p>
-    <w:bookmarkEnd w:id="90"/>
-    <w:bookmarkEnd w:id="91"/>
+    <w:bookmarkEnd w:id="97"/>
+    <w:bookmarkEnd w:id="98"/>
     <w:sectPr/>
   </w:body>
 </w:document>
@@ -13121,6 +14139,24 @@
     <w:abstractNumId w:val="991"/>
   </w:num>
   <w:num w:numId="1010">
+    <w:abstractNumId w:val="991"/>
+  </w:num>
+  <w:num w:numId="1011">
+    <w:abstractNumId w:val="991"/>
+  </w:num>
+  <w:num w:numId="1012">
+    <w:abstractNumId w:val="991"/>
+  </w:num>
+  <w:num w:numId="1013">
+    <w:abstractNumId w:val="991"/>
+  </w:num>
+  <w:num w:numId="1014">
+    <w:abstractNumId w:val="991"/>
+  </w:num>
+  <w:num w:numId="1015">
+    <w:abstractNumId w:val="991"/>
+  </w:num>
+  <w:num w:numId="1016">
     <w:abstractNumId w:val="99411"/>
     <w:lvlOverride w:ilvl="0">
       <w:startOverride w:val="1"/>

</xml_diff>

<commit_message>
Add mission seeds, captain's log, and skill advancement
GM view: a mission seed generator over six d12 tables with per-part
re-rolls, copy, and a button that starts the seed's clock; and a captain's
log (stardate, outcome, notes, commendations) that can apply one skill
advancement per crew member and saves with the crew file. Crew cards gain
Save officer file. Characters now record advancements, which raise the
Specialty and Trained limits; a General Services character's later
Specialty is +3, not Expert. The guide gains a Running missions chapter
with the tables and the log questions.

Co-Authored-By: Claude Opus 5.5 <noreply@anthropic.com>
Claude-Session: https://claude.ai/code/session_015SADCFzhKijkC2foUmXrpC
</commit_message>
<xml_diff>
--- a/uss-pelion/USS_Pelion_Players_Guide.docx
+++ b/uss-pelion/USS_Pelion_Players_Guide.docx
@@ -7211,13 +7211,22 @@
     </w:p>
     <w:bookmarkEnd w:id="68"/>
     <w:bookmarkEnd w:id="69"/>
-    <w:bookmarkStart w:id="76" w:name="ready-made-crew"/>
+    <w:bookmarkStart w:id="72" w:name="running-missions"/>
     <w:p>
       <w:pPr>
         <w:pStyle w:val="Heading1"/>
       </w:pPr>
       <w:r>
-        <w:t xml:space="preserve">Ready-made crew</w:t>
+        <w:t xml:space="preserve">Running missions</w:t>
+      </w:r>
+    </w:p>
+    <w:bookmarkStart w:id="70" w:name="mission-seeds"/>
+    <w:p>
+      <w:pPr>
+        <w:pStyle w:val="Heading2"/>
+      </w:pPr>
+      <w:r>
+        <w:t xml:space="preserve">Mission seeds</w:t>
       </w:r>
     </w:p>
     <w:p>
@@ -7225,7 +7234,1856 @@
         <w:pStyle w:val="FirstParagraph"/>
       </w:pPr>
       <w:r>
-        <w:t xml:space="preserve">Six crew members ready to play, for one-shots, new players, or a crew in a hurry. Each follows the creation rules exactly, and their connections tie them to one another. In the creator, choose</w:t>
+        <w:t xml:space="preserve">Short of a plot? Roll 1d12 on each table, or pick what you like. Read the results together: a</w:t>
+      </w:r>
+      <w:r>
+        <w:t xml:space="preserve"> </w:t>
+      </w:r>
+      <w:r>
+        <w:rPr>
+          <w:iCs/>
+          <w:i/>
+        </w:rPr>
+        <w:t xml:space="preserve">mission</w:t>
+      </w:r>
+      <w:r>
+        <w:t xml:space="preserve"> </w:t>
+      </w:r>
+      <w:r>
+        <w:t xml:space="preserve">in a</w:t>
+      </w:r>
+      <w:r>
+        <w:t xml:space="preserve"> </w:t>
+      </w:r>
+      <w:r>
+        <w:rPr>
+          <w:iCs/>
+          <w:i/>
+        </w:rPr>
+        <w:t xml:space="preserve">place</w:t>
+      </w:r>
+      <w:r>
+        <w:t xml:space="preserve">, made strange by</w:t>
+      </w:r>
+      <w:r>
+        <w:t xml:space="preserve"> </w:t>
+      </w:r>
+      <w:r>
+        <w:rPr>
+          <w:iCs/>
+          <w:i/>
+        </w:rPr>
+        <w:t xml:space="preserve">something strange</w:t>
+      </w:r>
+      <w:r>
+        <w:t xml:space="preserve">, turned by a</w:t>
+      </w:r>
+      <w:r>
+        <w:t xml:space="preserve"> </w:t>
+      </w:r>
+      <w:r>
+        <w:rPr>
+          <w:iCs/>
+          <w:i/>
+        </w:rPr>
+        <w:t xml:space="preserve">twist</w:t>
+      </w:r>
+      <w:r>
+        <w:t xml:space="preserve">, against a</w:t>
+      </w:r>
+      <w:r>
+        <w:t xml:space="preserve"> </w:t>
+      </w:r>
+      <w:r>
+        <w:rPr>
+          <w:iCs/>
+          <w:i/>
+        </w:rPr>
+        <w:t xml:space="preserve">ticking clock</w:t>
+      </w:r>
+      <w:r>
+        <w:t xml:space="preserve">, with a</w:t>
+      </w:r>
+      <w:r>
+        <w:t xml:space="preserve"> </w:t>
+      </w:r>
+      <w:r>
+        <w:rPr>
+          <w:iCs/>
+          <w:i/>
+        </w:rPr>
+        <w:t xml:space="preserve">key character</w:t>
+      </w:r>
+      <w:r>
+        <w:t xml:space="preserve"> </w:t>
+      </w:r>
+      <w:r>
+        <w:t xml:space="preserve">at its heart. The GM view in the creator rolls these for you and can start the clock.</w:t>
+      </w:r>
+    </w:p>
+    <w:tbl>
+      <w:tblPr>
+        <w:tblStyle w:val="Table"/>
+        <w:tblW w:type="pct" w:w="5000"/>
+        <w:tblLook w:firstRow="1" w:lastRow="0" w:firstColumn="0" w:lastColumn="0" w:noHBand="0" w:noVBand="0" w:val="0020"/>
+        <w:jc w:val="start"/>
+        <w:tblBorders>
+          <w:top w:val="single" w:sz="4" w:color="B8C2D3"/>
+          <w:left w:val="single" w:sz="4" w:color="B8C2D3"/>
+          <w:bottom w:val="single" w:sz="4" w:color="B8C2D3"/>
+          <w:right w:val="single" w:sz="4" w:color="B8C2D3"/>
+          <w:insideH w:val="single" w:sz="4" w:color="B8C2D3"/>
+          <w:insideV w:val="single" w:sz="4" w:color="B8C2D3"/>
+        </w:tblBorders>
+      </w:tblPr>
+      <w:tblGrid>
+        <w:gridCol w:w="1980"/>
+        <w:gridCol w:w="1980"/>
+        <w:gridCol w:w="1980"/>
+        <w:gridCol w:w="1980"/>
+      </w:tblGrid>
+      <w:tr>
+        <w:trPr>
+          <w:tblHeader w:val="true"/>
+        </w:trPr>
+        <w:tc>
+          <w:tcPr>
+            <w:shd w:val="clear" w:fill="E9EEF6"/>
+          </w:tcPr>
+          <w:p>
+            <w:pPr>
+              <w:pStyle w:val="Compact"/>
+              <w:jc w:val="left"/>
+            </w:pPr>
+            <w:r>
+              <w:rPr>
+                <w:b/>
+                <w:sz w:val="19"/>
+              </w:rPr>
+              <w:t xml:space="preserve">d12</w:t>
+            </w:r>
+          </w:p>
+        </w:tc>
+        <w:tc>
+          <w:tcPr>
+            <w:shd w:val="clear" w:fill="E9EEF6"/>
+          </w:tcPr>
+          <w:p>
+            <w:pPr>
+              <w:pStyle w:val="Compact"/>
+              <w:jc w:val="left"/>
+            </w:pPr>
+            <w:r>
+              <w:rPr>
+                <w:b/>
+                <w:sz w:val="19"/>
+              </w:rPr>
+              <w:t xml:space="preserve">Mission</w:t>
+            </w:r>
+          </w:p>
+        </w:tc>
+        <w:tc>
+          <w:tcPr>
+            <w:shd w:val="clear" w:fill="E9EEF6"/>
+          </w:tcPr>
+          <w:p>
+            <w:pPr>
+              <w:pStyle w:val="Compact"/>
+              <w:jc w:val="left"/>
+            </w:pPr>
+            <w:r>
+              <w:rPr>
+                <w:b/>
+                <w:sz w:val="19"/>
+              </w:rPr>
+              <w:t xml:space="preserve">Place</w:t>
+            </w:r>
+          </w:p>
+        </w:tc>
+        <w:tc>
+          <w:tcPr>
+            <w:shd w:val="clear" w:fill="E9EEF6"/>
+          </w:tcPr>
+          <w:p>
+            <w:pPr>
+              <w:pStyle w:val="Compact"/>
+              <w:jc w:val="left"/>
+            </w:pPr>
+            <w:r>
+              <w:rPr>
+                <w:b/>
+                <w:sz w:val="19"/>
+              </w:rPr>
+              <w:t xml:space="preserve">Something strange</w:t>
+            </w:r>
+          </w:p>
+        </w:tc>
+      </w:tr>
+      <w:tr>
+        <w:tc>
+          <w:tcPr/>
+          <w:p>
+            <w:pPr>
+              <w:pStyle w:val="Compact"/>
+              <w:jc w:val="left"/>
+            </w:pPr>
+            <w:r>
+              <w:rPr>
+                <w:b/>
+                <w:sz w:val="19"/>
+              </w:rPr>
+              <w:t xml:space="preserve">1</w:t>
+            </w:r>
+          </w:p>
+        </w:tc>
+        <w:tc>
+          <w:tcPr/>
+          <w:p>
+            <w:pPr>
+              <w:pStyle w:val="Compact"/>
+              <w:jc w:val="left"/>
+            </w:pPr>
+            <w:r>
+              <w:rPr>
+                <w:sz w:val="19"/>
+              </w:rPr>
+              <w:t xml:space="preserve">Answer a distress call</w:t>
+            </w:r>
+          </w:p>
+        </w:tc>
+        <w:tc>
+          <w:tcPr/>
+          <w:p>
+            <w:pPr>
+              <w:pStyle w:val="Compact"/>
+              <w:jc w:val="left"/>
+            </w:pPr>
+            <w:r>
+              <w:rPr>
+                <w:sz w:val="19"/>
+              </w:rPr>
+              <w:t xml:space="preserve">A storm-wracked ocean world</w:t>
+            </w:r>
+          </w:p>
+        </w:tc>
+        <w:tc>
+          <w:tcPr/>
+          <w:p>
+            <w:pPr>
+              <w:pStyle w:val="Compact"/>
+              <w:jc w:val="left"/>
+            </w:pPr>
+            <w:r>
+              <w:rPr>
+                <w:sz w:val="19"/>
+              </w:rPr>
+              <w:t xml:space="preserve">A subspace anomaly that distorts time</w:t>
+            </w:r>
+          </w:p>
+        </w:tc>
+      </w:tr>
+      <w:tr>
+        <w:tc>
+          <w:tcPr/>
+          <w:p>
+            <w:pPr>
+              <w:pStyle w:val="Compact"/>
+              <w:jc w:val="left"/>
+            </w:pPr>
+            <w:r>
+              <w:rPr>
+                <w:b/>
+                <w:sz w:val="19"/>
+              </w:rPr>
+              <w:t xml:space="preserve">2</w:t>
+            </w:r>
+          </w:p>
+        </w:tc>
+        <w:tc>
+          <w:tcPr/>
+          <w:p>
+            <w:pPr>
+              <w:pStyle w:val="Compact"/>
+              <w:jc w:val="left"/>
+            </w:pPr>
+            <w:r>
+              <w:rPr>
+                <w:sz w:val="19"/>
+              </w:rPr>
+              <w:t xml:space="preserve">Survey an uncharted system</w:t>
+            </w:r>
+          </w:p>
+        </w:tc>
+        <w:tc>
+          <w:tcPr/>
+          <w:p>
+            <w:pPr>
+              <w:pStyle w:val="Compact"/>
+              <w:jc w:val="left"/>
+            </w:pPr>
+            <w:r>
+              <w:rPr>
+                <w:sz w:val="19"/>
+              </w:rPr>
+              <w:t xml:space="preserve">A dead world with ancient ruins</w:t>
+            </w:r>
+          </w:p>
+        </w:tc>
+        <w:tc>
+          <w:tcPr/>
+          <w:p>
+            <w:pPr>
+              <w:pStyle w:val="Compact"/>
+              <w:jc w:val="left"/>
+            </w:pPr>
+            <w:r>
+              <w:rPr>
+                <w:sz w:val="19"/>
+              </w:rPr>
+              <w:t xml:space="preserve">A non-corporeal life form</w:t>
+            </w:r>
+          </w:p>
+        </w:tc>
+      </w:tr>
+      <w:tr>
+        <w:tc>
+          <w:tcPr/>
+          <w:p>
+            <w:pPr>
+              <w:pStyle w:val="Compact"/>
+              <w:jc w:val="left"/>
+            </w:pPr>
+            <w:r>
+              <w:rPr>
+                <w:b/>
+                <w:sz w:val="19"/>
+              </w:rPr>
+              <w:t xml:space="preserve">3</w:t>
+            </w:r>
+          </w:p>
+        </w:tc>
+        <w:tc>
+          <w:tcPr/>
+          <w:p>
+            <w:pPr>
+              <w:pStyle w:val="Compact"/>
+              <w:jc w:val="left"/>
+            </w:pPr>
+            <w:r>
+              <w:rPr>
+                <w:sz w:val="19"/>
+              </w:rPr>
+              <w:t xml:space="preserve">Make first contact</w:t>
+            </w:r>
+          </w:p>
+        </w:tc>
+        <w:tc>
+          <w:tcPr/>
+          <w:p>
+            <w:pPr>
+              <w:pStyle w:val="Compact"/>
+              <w:jc w:val="left"/>
+            </w:pPr>
+            <w:r>
+              <w:rPr>
+                <w:sz w:val="19"/>
+              </w:rPr>
+              <w:t xml:space="preserve">A struggling frontier colony</w:t>
+            </w:r>
+          </w:p>
+        </w:tc>
+        <w:tc>
+          <w:tcPr/>
+          <w:p>
+            <w:pPr>
+              <w:pStyle w:val="Compact"/>
+              <w:jc w:val="left"/>
+            </w:pPr>
+            <w:r>
+              <w:rPr>
+                <w:sz w:val="19"/>
+              </w:rPr>
+              <w:t xml:space="preserve">An ancient machine that still works</w:t>
+            </w:r>
+          </w:p>
+        </w:tc>
+      </w:tr>
+      <w:tr>
+        <w:tc>
+          <w:tcPr/>
+          <w:p>
+            <w:pPr>
+              <w:pStyle w:val="Compact"/>
+              <w:jc w:val="left"/>
+            </w:pPr>
+            <w:r>
+              <w:rPr>
+                <w:b/>
+                <w:sz w:val="19"/>
+              </w:rPr>
+              <w:t xml:space="preserve">4</w:t>
+            </w:r>
+          </w:p>
+        </w:tc>
+        <w:tc>
+          <w:tcPr/>
+          <w:p>
+            <w:pPr>
+              <w:pStyle w:val="Compact"/>
+              <w:jc w:val="left"/>
+            </w:pPr>
+            <w:r>
+              <w:rPr>
+                <w:sz w:val="19"/>
+              </w:rPr>
+              <w:t xml:space="preserve">Escort a diplomatic delegation</w:t>
+            </w:r>
+          </w:p>
+        </w:tc>
+        <w:tc>
+          <w:tcPr/>
+          <w:p>
+            <w:pPr>
+              <w:pStyle w:val="Compact"/>
+              <w:jc w:val="left"/>
+            </w:pPr>
+            <w:r>
+              <w:rPr>
+                <w:sz w:val="19"/>
+              </w:rPr>
+              <w:t xml:space="preserve">An asteroid mining station</w:t>
+            </w:r>
+          </w:p>
+        </w:tc>
+        <w:tc>
+          <w:tcPr/>
+          <w:p>
+            <w:pPr>
+              <w:pStyle w:val="Compact"/>
+              <w:jc w:val="left"/>
+            </w:pPr>
+            <w:r>
+              <w:rPr>
+                <w:sz w:val="19"/>
+              </w:rPr>
+              <w:t xml:space="preserve">Duplicates of the crew</w:t>
+            </w:r>
+          </w:p>
+        </w:tc>
+      </w:tr>
+      <w:tr>
+        <w:tc>
+          <w:tcPr/>
+          <w:p>
+            <w:pPr>
+              <w:pStyle w:val="Compact"/>
+              <w:jc w:val="left"/>
+            </w:pPr>
+            <w:r>
+              <w:rPr>
+                <w:b/>
+                <w:sz w:val="19"/>
+              </w:rPr>
+              <w:t xml:space="preserve">5</w:t>
+            </w:r>
+          </w:p>
+        </w:tc>
+        <w:tc>
+          <w:tcPr/>
+          <w:p>
+            <w:pPr>
+              <w:pStyle w:val="Compact"/>
+              <w:jc w:val="left"/>
+            </w:pPr>
+            <w:r>
+              <w:rPr>
+                <w:sz w:val="19"/>
+              </w:rPr>
+              <w:t xml:space="preserve">Find a missing ship or outpost</w:t>
+            </w:r>
+          </w:p>
+        </w:tc>
+        <w:tc>
+          <w:tcPr/>
+          <w:p>
+            <w:pPr>
+              <w:pStyle w:val="Compact"/>
+              <w:jc w:val="left"/>
+            </w:pPr>
+            <w:r>
+              <w:rPr>
+                <w:sz w:val="19"/>
+              </w:rPr>
+              <w:t xml:space="preserve">A drifting derelict starship</w:t>
+            </w:r>
+          </w:p>
+        </w:tc>
+        <w:tc>
+          <w:tcPr/>
+          <w:p>
+            <w:pPr>
+              <w:pStyle w:val="Compact"/>
+              <w:jc w:val="left"/>
+            </w:pPr>
+            <w:r>
+              <w:rPr>
+                <w:sz w:val="19"/>
+              </w:rPr>
+              <w:t xml:space="preserve">A signal repeating a crew member’s name</w:t>
+            </w:r>
+          </w:p>
+        </w:tc>
+      </w:tr>
+      <w:tr>
+        <w:tc>
+          <w:tcPr/>
+          <w:p>
+            <w:pPr>
+              <w:pStyle w:val="Compact"/>
+              <w:jc w:val="left"/>
+            </w:pPr>
+            <w:r>
+              <w:rPr>
+                <w:b/>
+                <w:sz w:val="19"/>
+              </w:rPr>
+              <w:t xml:space="preserve">6</w:t>
+            </w:r>
+          </w:p>
+        </w:tc>
+        <w:tc>
+          <w:tcPr/>
+          <w:p>
+            <w:pPr>
+              <w:pStyle w:val="Compact"/>
+              <w:jc w:val="left"/>
+            </w:pPr>
+            <w:r>
+              <w:rPr>
+                <w:sz w:val="19"/>
+              </w:rPr>
+              <w:t xml:space="preserve">Deliver urgent medical supplies</w:t>
+            </w:r>
+          </w:p>
+        </w:tc>
+        <w:tc>
+          <w:tcPr/>
+          <w:p>
+            <w:pPr>
+              <w:pStyle w:val="Compact"/>
+              <w:jc w:val="left"/>
+            </w:pPr>
+            <w:r>
+              <w:rPr>
+                <w:sz w:val="19"/>
+              </w:rPr>
+              <w:t xml:space="preserve">An ice-covered moon of a gas giant</w:t>
+            </w:r>
+          </w:p>
+        </w:tc>
+        <w:tc>
+          <w:tcPr/>
+          <w:p>
+            <w:pPr>
+              <w:pStyle w:val="Compact"/>
+              <w:jc w:val="left"/>
+            </w:pPr>
+            <w:r>
+              <w:rPr>
+                <w:sz w:val="19"/>
+              </w:rPr>
+              <w:t xml:space="preserve">A planet-wide illusion</w:t>
+            </w:r>
+          </w:p>
+        </w:tc>
+      </w:tr>
+      <w:tr>
+        <w:tc>
+          <w:tcPr/>
+          <w:p>
+            <w:pPr>
+              <w:pStyle w:val="Compact"/>
+              <w:jc w:val="left"/>
+            </w:pPr>
+            <w:r>
+              <w:rPr>
+                <w:b/>
+                <w:sz w:val="19"/>
+              </w:rPr>
+              <w:t xml:space="preserve">7</w:t>
+            </w:r>
+          </w:p>
+        </w:tc>
+        <w:tc>
+          <w:tcPr/>
+          <w:p>
+            <w:pPr>
+              <w:pStyle w:val="Compact"/>
+              <w:jc w:val="left"/>
+            </w:pPr>
+            <w:r>
+              <w:rPr>
+                <w:sz w:val="19"/>
+              </w:rPr>
+              <w:t xml:space="preserve">Evacuate a colony</w:t>
+            </w:r>
+          </w:p>
+        </w:tc>
+        <w:tc>
+          <w:tcPr/>
+          <w:p>
+            <w:pPr>
+              <w:pStyle w:val="Compact"/>
+              <w:jc w:val="left"/>
+            </w:pPr>
+            <w:r>
+              <w:rPr>
+                <w:sz w:val="19"/>
+              </w:rPr>
+              <w:t xml:space="preserve">A pre-warp civilization’s world</w:t>
+            </w:r>
+          </w:p>
+        </w:tc>
+        <w:tc>
+          <w:tcPr/>
+          <w:p>
+            <w:pPr>
+              <w:pStyle w:val="Compact"/>
+              <w:jc w:val="left"/>
+            </w:pPr>
+            <w:r>
+              <w:rPr>
+                <w:sz w:val="19"/>
+              </w:rPr>
+              <w:t xml:space="preserve">A rift into another universe</w:t>
+            </w:r>
+          </w:p>
+        </w:tc>
+      </w:tr>
+      <w:tr>
+        <w:tc>
+          <w:tcPr/>
+          <w:p>
+            <w:pPr>
+              <w:pStyle w:val="Compact"/>
+              <w:jc w:val="left"/>
+            </w:pPr>
+            <w:r>
+              <w:rPr>
+                <w:b/>
+                <w:sz w:val="19"/>
+              </w:rPr>
+              <w:t xml:space="preserve">8</w:t>
+            </w:r>
+          </w:p>
+        </w:tc>
+        <w:tc>
+          <w:tcPr/>
+          <w:p>
+            <w:pPr>
+              <w:pStyle w:val="Compact"/>
+              <w:jc w:val="left"/>
+            </w:pPr>
+            <w:r>
+              <w:rPr>
+                <w:sz w:val="19"/>
+              </w:rPr>
+              <w:t xml:space="preserve">Patrol the Neutral Zone border</w:t>
+            </w:r>
+          </w:p>
+        </w:tc>
+        <w:tc>
+          <w:tcPr/>
+          <w:p>
+            <w:pPr>
+              <w:pStyle w:val="Compact"/>
+              <w:jc w:val="left"/>
+            </w:pPr>
+            <w:r>
+              <w:rPr>
+                <w:sz w:val="19"/>
+              </w:rPr>
+              <w:t xml:space="preserve">A nebula that blinds the sensors</w:t>
+            </w:r>
+          </w:p>
+        </w:tc>
+        <w:tc>
+          <w:tcPr/>
+          <w:p>
+            <w:pPr>
+              <w:pStyle w:val="Compact"/>
+              <w:jc w:val="left"/>
+            </w:pPr>
+            <w:r>
+              <w:rPr>
+                <w:sz w:val="19"/>
+              </w:rPr>
+              <w:t xml:space="preserve">A disease no one recognizes</w:t>
+            </w:r>
+          </w:p>
+        </w:tc>
+      </w:tr>
+      <w:tr>
+        <w:tc>
+          <w:tcPr/>
+          <w:p>
+            <w:pPr>
+              <w:pStyle w:val="Compact"/>
+              <w:jc w:val="left"/>
+            </w:pPr>
+            <w:r>
+              <w:rPr>
+                <w:b/>
+                <w:sz w:val="19"/>
+              </w:rPr>
+              <w:t xml:space="preserve">9</w:t>
+            </w:r>
+          </w:p>
+        </w:tc>
+        <w:tc>
+          <w:tcPr/>
+          <w:p>
+            <w:pPr>
+              <w:pStyle w:val="Compact"/>
+              <w:jc w:val="left"/>
+            </w:pPr>
+            <w:r>
+              <w:rPr>
+                <w:sz w:val="19"/>
+              </w:rPr>
+              <w:t xml:space="preserve">Recover a lost probe or artifact</w:t>
+            </w:r>
+          </w:p>
+        </w:tc>
+        <w:tc>
+          <w:tcPr/>
+          <w:p>
+            <w:pPr>
+              <w:pStyle w:val="Compact"/>
+              <w:jc w:val="left"/>
+            </w:pPr>
+            <w:r>
+              <w:rPr>
+                <w:sz w:val="19"/>
+              </w:rPr>
+              <w:t xml:space="preserve">A starbase in crisis</w:t>
+            </w:r>
+          </w:p>
+        </w:tc>
+        <w:tc>
+          <w:tcPr/>
+          <w:p>
+            <w:pPr>
+              <w:pStyle w:val="Compact"/>
+              <w:jc w:val="left"/>
+            </w:pPr>
+            <w:r>
+              <w:rPr>
+                <w:sz w:val="19"/>
+              </w:rPr>
+              <w:t xml:space="preserve">A gravity well that traps ships</w:t>
+            </w:r>
+          </w:p>
+        </w:tc>
+      </w:tr>
+      <w:tr>
+        <w:tc>
+          <w:tcPr/>
+          <w:p>
+            <w:pPr>
+              <w:pStyle w:val="Compact"/>
+              <w:jc w:val="left"/>
+            </w:pPr>
+            <w:r>
+              <w:rPr>
+                <w:b/>
+                <w:sz w:val="19"/>
+              </w:rPr>
+              <w:t xml:space="preserve">10</w:t>
+            </w:r>
+          </w:p>
+        </w:tc>
+        <w:tc>
+          <w:tcPr/>
+          <w:p>
+            <w:pPr>
+              <w:pStyle w:val="Compact"/>
+              <w:jc w:val="left"/>
+            </w:pPr>
+            <w:r>
+              <w:rPr>
+                <w:sz w:val="19"/>
+              </w:rPr>
+              <w:t xml:space="preserve">Mediate a dispute between two worlds</w:t>
+            </w:r>
+          </w:p>
+        </w:tc>
+        <w:tc>
+          <w:tcPr/>
+          <w:p>
+            <w:pPr>
+              <w:pStyle w:val="Compact"/>
+              <w:jc w:val="left"/>
+            </w:pPr>
+            <w:r>
+              <w:rPr>
+                <w:sz w:val="19"/>
+              </w:rPr>
+              <w:t xml:space="preserve">A world that seems too perfect</w:t>
+            </w:r>
+          </w:p>
+        </w:tc>
+        <w:tc>
+          <w:tcPr/>
+          <w:p>
+            <w:pPr>
+              <w:pStyle w:val="Compact"/>
+              <w:jc w:val="left"/>
+            </w:pPr>
+            <w:r>
+              <w:rPr>
+                <w:sz w:val="19"/>
+              </w:rPr>
+              <w:t xml:space="preserve">A godlike being testing the crew</w:t>
+            </w:r>
+          </w:p>
+        </w:tc>
+      </w:tr>
+      <w:tr>
+        <w:tc>
+          <w:tcPr/>
+          <w:p>
+            <w:pPr>
+              <w:pStyle w:val="Compact"/>
+              <w:jc w:val="left"/>
+            </w:pPr>
+            <w:r>
+              <w:rPr>
+                <w:b/>
+                <w:sz w:val="19"/>
+              </w:rPr>
+              <w:t xml:space="preserve">11</w:t>
+            </w:r>
+          </w:p>
+        </w:tc>
+        <w:tc>
+          <w:tcPr/>
+          <w:p>
+            <w:pPr>
+              <w:pStyle w:val="Compact"/>
+              <w:jc w:val="left"/>
+            </w:pPr>
+            <w:r>
+              <w:rPr>
+                <w:sz w:val="19"/>
+              </w:rPr>
+              <w:t xml:space="preserve">Test experimental technology</w:t>
+            </w:r>
+          </w:p>
+        </w:tc>
+        <w:tc>
+          <w:tcPr/>
+          <w:p>
+            <w:pPr>
+              <w:pStyle w:val="Compact"/>
+              <w:jc w:val="left"/>
+            </w:pPr>
+            <w:r>
+              <w:rPr>
+                <w:sz w:val="19"/>
+              </w:rPr>
+              <w:t xml:space="preserve">A jungle planet thick with life</w:t>
+            </w:r>
+          </w:p>
+        </w:tc>
+        <w:tc>
+          <w:tcPr/>
+          <w:p>
+            <w:pPr>
+              <w:pStyle w:val="Compact"/>
+              <w:jc w:val="left"/>
+            </w:pPr>
+            <w:r>
+              <w:rPr>
+                <w:sz w:val="19"/>
+              </w:rPr>
+              <w:t xml:space="preserve">An alien probe draining power</w:t>
+            </w:r>
+          </w:p>
+        </w:tc>
+      </w:tr>
+      <w:tr>
+        <w:tc>
+          <w:tcPr/>
+          <w:p>
+            <w:pPr>
+              <w:pStyle w:val="Compact"/>
+              <w:jc w:val="left"/>
+            </w:pPr>
+            <w:r>
+              <w:rPr>
+                <w:b/>
+                <w:sz w:val="19"/>
+              </w:rPr>
+              <w:t xml:space="preserve">12</w:t>
+            </w:r>
+          </w:p>
+        </w:tc>
+        <w:tc>
+          <w:tcPr/>
+          <w:p>
+            <w:pPr>
+              <w:pStyle w:val="Compact"/>
+              <w:jc w:val="left"/>
+            </w:pPr>
+            <w:r>
+              <w:rPr>
+                <w:sz w:val="19"/>
+              </w:rPr>
+              <w:t xml:space="preserve">Shore leave that goes wrong</w:t>
+            </w:r>
+          </w:p>
+        </w:tc>
+        <w:tc>
+          <w:tcPr/>
+          <w:p>
+            <w:pPr>
+              <w:pStyle w:val="Compact"/>
+              <w:jc w:val="left"/>
+            </w:pPr>
+            <w:r>
+              <w:rPr>
+                <w:sz w:val="19"/>
+              </w:rPr>
+              <w:t xml:space="preserve">Deep space between the stars</w:t>
+            </w:r>
+          </w:p>
+        </w:tc>
+        <w:tc>
+          <w:tcPr/>
+          <w:p>
+            <w:pPr>
+              <w:pStyle w:val="Compact"/>
+              <w:jc w:val="left"/>
+            </w:pPr>
+            <w:r>
+              <w:rPr>
+                <w:sz w:val="19"/>
+              </w:rPr>
+              <w:t xml:space="preserve">Memories that aren’t the crew’s own</w:t>
+            </w:r>
+          </w:p>
+        </w:tc>
+      </w:tr>
+    </w:tbl>
+    <w:p/>
+    <w:tbl>
+      <w:tblPr>
+        <w:tblStyle w:val="Table"/>
+        <w:tblW w:type="pct" w:w="5000"/>
+        <w:tblLook w:firstRow="1" w:lastRow="0" w:firstColumn="0" w:lastColumn="0" w:noHBand="0" w:noVBand="0" w:val="0020"/>
+        <w:jc w:val="start"/>
+        <w:tblBorders>
+          <w:top w:val="single" w:sz="4" w:color="B8C2D3"/>
+          <w:left w:val="single" w:sz="4" w:color="B8C2D3"/>
+          <w:bottom w:val="single" w:sz="4" w:color="B8C2D3"/>
+          <w:right w:val="single" w:sz="4" w:color="B8C2D3"/>
+          <w:insideH w:val="single" w:sz="4" w:color="B8C2D3"/>
+          <w:insideV w:val="single" w:sz="4" w:color="B8C2D3"/>
+        </w:tblBorders>
+      </w:tblPr>
+      <w:tblGrid>
+        <w:gridCol w:w="1980"/>
+        <w:gridCol w:w="1980"/>
+        <w:gridCol w:w="1980"/>
+        <w:gridCol w:w="1980"/>
+      </w:tblGrid>
+      <w:tr>
+        <w:trPr>
+          <w:tblHeader w:val="true"/>
+        </w:trPr>
+        <w:tc>
+          <w:tcPr>
+            <w:shd w:val="clear" w:fill="E9EEF6"/>
+          </w:tcPr>
+          <w:p>
+            <w:pPr>
+              <w:pStyle w:val="Compact"/>
+              <w:jc w:val="left"/>
+            </w:pPr>
+            <w:r>
+              <w:rPr>
+                <w:b/>
+                <w:sz w:val="19"/>
+              </w:rPr>
+              <w:t xml:space="preserve">d12</w:t>
+            </w:r>
+          </w:p>
+        </w:tc>
+        <w:tc>
+          <w:tcPr>
+            <w:shd w:val="clear" w:fill="E9EEF6"/>
+          </w:tcPr>
+          <w:p>
+            <w:pPr>
+              <w:pStyle w:val="Compact"/>
+              <w:jc w:val="left"/>
+            </w:pPr>
+            <w:r>
+              <w:rPr>
+                <w:b/>
+                <w:sz w:val="19"/>
+              </w:rPr>
+              <w:t xml:space="preserve">Twist</w:t>
+            </w:r>
+          </w:p>
+        </w:tc>
+        <w:tc>
+          <w:tcPr>
+            <w:shd w:val="clear" w:fill="E9EEF6"/>
+          </w:tcPr>
+          <w:p>
+            <w:pPr>
+              <w:pStyle w:val="Compact"/>
+              <w:jc w:val="left"/>
+            </w:pPr>
+            <w:r>
+              <w:rPr>
+                <w:b/>
+                <w:sz w:val="19"/>
+              </w:rPr>
+              <w:t xml:space="preserve">Ticking clock (segments)</w:t>
+            </w:r>
+          </w:p>
+        </w:tc>
+        <w:tc>
+          <w:tcPr>
+            <w:shd w:val="clear" w:fill="E9EEF6"/>
+          </w:tcPr>
+          <w:p>
+            <w:pPr>
+              <w:pStyle w:val="Compact"/>
+              <w:jc w:val="left"/>
+            </w:pPr>
+            <w:r>
+              <w:rPr>
+                <w:b/>
+                <w:sz w:val="19"/>
+              </w:rPr>
+              <w:t xml:space="preserve">Key character</w:t>
+            </w:r>
+          </w:p>
+        </w:tc>
+      </w:tr>
+      <w:tr>
+        <w:tc>
+          <w:tcPr/>
+          <w:p>
+            <w:pPr>
+              <w:pStyle w:val="Compact"/>
+              <w:jc w:val="left"/>
+            </w:pPr>
+            <w:r>
+              <w:rPr>
+                <w:b/>
+                <w:sz w:val="19"/>
+              </w:rPr>
+              <w:t xml:space="preserve">1</w:t>
+            </w:r>
+          </w:p>
+        </w:tc>
+        <w:tc>
+          <w:tcPr/>
+          <w:p>
+            <w:pPr>
+              <w:pStyle w:val="Compact"/>
+              <w:jc w:val="left"/>
+            </w:pPr>
+            <w:r>
+              <w:rPr>
+                <w:sz w:val="19"/>
+              </w:rPr>
+              <w:t xml:space="preserve">Klingons arrive with their own claim</w:t>
+            </w:r>
+          </w:p>
+        </w:tc>
+        <w:tc>
+          <w:tcPr/>
+          <w:p>
+            <w:pPr>
+              <w:pStyle w:val="Compact"/>
+              <w:jc w:val="left"/>
+            </w:pPr>
+            <w:r>
+              <w:rPr>
+                <w:sz w:val="19"/>
+              </w:rPr>
+              <w:t xml:space="preserve">Orbit decays (6)</w:t>
+            </w:r>
+          </w:p>
+        </w:tc>
+        <w:tc>
+          <w:tcPr/>
+          <w:p>
+            <w:pPr>
+              <w:pStyle w:val="Compact"/>
+              <w:jc w:val="left"/>
+            </w:pPr>
+            <w:r>
+              <w:rPr>
+                <w:sz w:val="19"/>
+              </w:rPr>
+              <w:t xml:space="preserve">An idealistic Federation ambassador</w:t>
+            </w:r>
+          </w:p>
+        </w:tc>
+      </w:tr>
+      <w:tr>
+        <w:tc>
+          <w:tcPr/>
+          <w:p>
+            <w:pPr>
+              <w:pStyle w:val="Compact"/>
+              <w:jc w:val="left"/>
+            </w:pPr>
+            <w:r>
+              <w:rPr>
+                <w:b/>
+                <w:sz w:val="19"/>
+              </w:rPr>
+              <w:t xml:space="preserve">2</w:t>
+            </w:r>
+          </w:p>
+        </w:tc>
+        <w:tc>
+          <w:tcPr/>
+          <w:p>
+            <w:pPr>
+              <w:pStyle w:val="Compact"/>
+              <w:jc w:val="left"/>
+            </w:pPr>
+            <w:r>
+              <w:rPr>
+                <w:sz w:val="19"/>
+              </w:rPr>
+              <w:t xml:space="preserve">The people asking for help are lying</w:t>
+            </w:r>
+          </w:p>
+        </w:tc>
+        <w:tc>
+          <w:tcPr/>
+          <w:p>
+            <w:pPr>
+              <w:pStyle w:val="Compact"/>
+              <w:jc w:val="left"/>
+            </w:pPr>
+            <w:r>
+              <w:rPr>
+                <w:sz w:val="19"/>
+              </w:rPr>
+              <w:t xml:space="preserve">Warp core breach (4)</w:t>
+            </w:r>
+          </w:p>
+        </w:tc>
+        <w:tc>
+          <w:tcPr/>
+          <w:p>
+            <w:pPr>
+              <w:pStyle w:val="Compact"/>
+              <w:jc w:val="left"/>
+            </w:pPr>
+            <w:r>
+              <w:rPr>
+                <w:sz w:val="19"/>
+              </w:rPr>
+              <w:t xml:space="preserve">A Klingon captain with a grudge</w:t>
+            </w:r>
+          </w:p>
+        </w:tc>
+      </w:tr>
+      <w:tr>
+        <w:tc>
+          <w:tcPr/>
+          <w:p>
+            <w:pPr>
+              <w:pStyle w:val="Compact"/>
+              <w:jc w:val="left"/>
+            </w:pPr>
+            <w:r>
+              <w:rPr>
+                <w:b/>
+                <w:sz w:val="19"/>
+              </w:rPr>
+              <w:t xml:space="preserve">3</w:t>
+            </w:r>
+          </w:p>
+        </w:tc>
+        <w:tc>
+          <w:tcPr/>
+          <w:p>
+            <w:pPr>
+              <w:pStyle w:val="Compact"/>
+              <w:jc w:val="left"/>
+            </w:pPr>
+            <w:r>
+              <w:rPr>
+                <w:sz w:val="19"/>
+              </w:rPr>
+              <w:t xml:space="preserve">A crew member’s complication comes into play</w:t>
+            </w:r>
+          </w:p>
+        </w:tc>
+        <w:tc>
+          <w:tcPr/>
+          <w:p>
+            <w:pPr>
+              <w:pStyle w:val="Compact"/>
+              <w:jc w:val="left"/>
+            </w:pPr>
+            <w:r>
+              <w:rPr>
+                <w:sz w:val="19"/>
+              </w:rPr>
+              <w:t xml:space="preserve">Klingon battle cruiser arrives (6)</w:t>
+            </w:r>
+          </w:p>
+        </w:tc>
+        <w:tc>
+          <w:tcPr/>
+          <w:p>
+            <w:pPr>
+              <w:pStyle w:val="Compact"/>
+              <w:jc w:val="left"/>
+            </w:pPr>
+            <w:r>
+              <w:rPr>
+                <w:sz w:val="19"/>
+              </w:rPr>
+              <w:t xml:space="preserve">A stranded Orion trader</w:t>
+            </w:r>
+          </w:p>
+        </w:tc>
+      </w:tr>
+      <w:tr>
+        <w:tc>
+          <w:tcPr/>
+          <w:p>
+            <w:pPr>
+              <w:pStyle w:val="Compact"/>
+              <w:jc w:val="left"/>
+            </w:pPr>
+            <w:r>
+              <w:rPr>
+                <w:b/>
+                <w:sz w:val="19"/>
+              </w:rPr>
+              <w:t xml:space="preserve">4</w:t>
+            </w:r>
+          </w:p>
+        </w:tc>
+        <w:tc>
+          <w:tcPr/>
+          <w:p>
+            <w:pPr>
+              <w:pStyle w:val="Compact"/>
+              <w:jc w:val="left"/>
+            </w:pPr>
+            <w:r>
+              <w:rPr>
+                <w:sz w:val="19"/>
+              </w:rPr>
+              <w:t xml:space="preserve">Orders conflict with doing the right thing</w:t>
+            </w:r>
+          </w:p>
+        </w:tc>
+        <w:tc>
+          <w:tcPr/>
+          <w:p>
+            <w:pPr>
+              <w:pStyle w:val="Compact"/>
+              <w:jc w:val="left"/>
+            </w:pPr>
+            <w:r>
+              <w:rPr>
+                <w:sz w:val="19"/>
+              </w:rPr>
+              <w:t xml:space="preserve">The disease reaches the ship (8)</w:t>
+            </w:r>
+          </w:p>
+        </w:tc>
+        <w:tc>
+          <w:tcPr/>
+          <w:p>
+            <w:pPr>
+              <w:pStyle w:val="Compact"/>
+              <w:jc w:val="left"/>
+            </w:pPr>
+            <w:r>
+              <w:rPr>
+                <w:sz w:val="19"/>
+              </w:rPr>
+              <w:t xml:space="preserve">A brilliant, reckless scientist</w:t>
+            </w:r>
+          </w:p>
+        </w:tc>
+      </w:tr>
+      <w:tr>
+        <w:tc>
+          <w:tcPr/>
+          <w:p>
+            <w:pPr>
+              <w:pStyle w:val="Compact"/>
+              <w:jc w:val="left"/>
+            </w:pPr>
+            <w:r>
+              <w:rPr>
+                <w:b/>
+                <w:sz w:val="19"/>
+              </w:rPr>
+              <w:t xml:space="preserve">5</w:t>
+            </w:r>
+          </w:p>
+        </w:tc>
+        <w:tc>
+          <w:tcPr/>
+          <w:p>
+            <w:pPr>
+              <w:pStyle w:val="Compact"/>
+              <w:jc w:val="left"/>
+            </w:pPr>
+            <w:r>
+              <w:rPr>
+                <w:sz w:val="19"/>
+              </w:rPr>
+              <w:t xml:space="preserve">The Prime Directive forbids interfering</w:t>
+            </w:r>
+          </w:p>
+        </w:tc>
+        <w:tc>
+          <w:tcPr/>
+          <w:p>
+            <w:pPr>
+              <w:pStyle w:val="Compact"/>
+              <w:jc w:val="left"/>
+            </w:pPr>
+            <w:r>
+              <w:rPr>
+                <w:sz w:val="19"/>
+              </w:rPr>
+              <w:t xml:space="preserve">The storm closes the beam-out window (4)</w:t>
+            </w:r>
+          </w:p>
+        </w:tc>
+        <w:tc>
+          <w:tcPr/>
+          <w:p>
+            <w:pPr>
+              <w:pStyle w:val="Compact"/>
+              <w:jc w:val="left"/>
+            </w:pPr>
+            <w:r>
+              <w:rPr>
+                <w:sz w:val="19"/>
+              </w:rPr>
+              <w:t xml:space="preserve">A colony leader hiding a secret</w:t>
+            </w:r>
+          </w:p>
+        </w:tc>
+      </w:tr>
+      <w:tr>
+        <w:tc>
+          <w:tcPr/>
+          <w:p>
+            <w:pPr>
+              <w:pStyle w:val="Compact"/>
+              <w:jc w:val="left"/>
+            </w:pPr>
+            <w:r>
+              <w:rPr>
+                <w:b/>
+                <w:sz w:val="19"/>
+              </w:rPr>
+              <w:t xml:space="preserve">6</w:t>
+            </w:r>
+          </w:p>
+        </w:tc>
+        <w:tc>
+          <w:tcPr/>
+          <w:p>
+            <w:pPr>
+              <w:pStyle w:val="Compact"/>
+              <w:jc w:val="left"/>
+            </w:pPr>
+            <w:r>
+              <w:rPr>
+                <w:sz w:val="19"/>
+              </w:rPr>
+              <w:t xml:space="preserve">A cloaked Romulan ship is watching</w:t>
+            </w:r>
+          </w:p>
+        </w:tc>
+        <w:tc>
+          <w:tcPr/>
+          <w:p>
+            <w:pPr>
+              <w:pStyle w:val="Compact"/>
+              <w:jc w:val="left"/>
+            </w:pPr>
+            <w:r>
+              <w:rPr>
+                <w:sz w:val="19"/>
+              </w:rPr>
+              <w:t xml:space="preserve">Life support fails on the station (6)</w:t>
+            </w:r>
+          </w:p>
+        </w:tc>
+        <w:tc>
+          <w:tcPr/>
+          <w:p>
+            <w:pPr>
+              <w:pStyle w:val="Compact"/>
+              <w:jc w:val="left"/>
+            </w:pPr>
+            <w:r>
+              <w:rPr>
+                <w:sz w:val="19"/>
+              </w:rPr>
+              <w:t xml:space="preserve">A former Starfleet officer gone rogue</w:t>
+            </w:r>
+          </w:p>
+        </w:tc>
+      </w:tr>
+      <w:tr>
+        <w:tc>
+          <w:tcPr/>
+          <w:p>
+            <w:pPr>
+              <w:pStyle w:val="Compact"/>
+              <w:jc w:val="left"/>
+            </w:pPr>
+            <w:r>
+              <w:rPr>
+                <w:b/>
+                <w:sz w:val="19"/>
+              </w:rPr>
+              <w:t xml:space="preserve">7</w:t>
+            </w:r>
+          </w:p>
+        </w:tc>
+        <w:tc>
+          <w:tcPr/>
+          <w:p>
+            <w:pPr>
+              <w:pStyle w:val="Compact"/>
+              <w:jc w:val="left"/>
+            </w:pPr>
+            <w:r>
+              <w:rPr>
+                <w:sz w:val="19"/>
+              </w:rPr>
+              <w:t xml:space="preserve">Orion pirates want the same prize</w:t>
+            </w:r>
+          </w:p>
+        </w:tc>
+        <w:tc>
+          <w:tcPr/>
+          <w:p>
+            <w:pPr>
+              <w:pStyle w:val="Compact"/>
+              <w:jc w:val="left"/>
+            </w:pPr>
+            <w:r>
+              <w:rPr>
+                <w:sz w:val="19"/>
+              </w:rPr>
+              <w:t xml:space="preserve">The anomaly collapses (6)</w:t>
+            </w:r>
+          </w:p>
+        </w:tc>
+        <w:tc>
+          <w:tcPr/>
+          <w:p>
+            <w:pPr>
+              <w:pStyle w:val="Compact"/>
+              <w:jc w:val="left"/>
+            </w:pPr>
+            <w:r>
+              <w:rPr>
+                <w:sz w:val="19"/>
+              </w:rPr>
+              <w:t xml:space="preserve">A local child who has seen too much</w:t>
+            </w:r>
+          </w:p>
+        </w:tc>
+      </w:tr>
+      <w:tr>
+        <w:tc>
+          <w:tcPr/>
+          <w:p>
+            <w:pPr>
+              <w:pStyle w:val="Compact"/>
+              <w:jc w:val="left"/>
+            </w:pPr>
+            <w:r>
+              <w:rPr>
+                <w:b/>
+                <w:sz w:val="19"/>
+              </w:rPr>
+              <w:t xml:space="preserve">8</w:t>
+            </w:r>
+          </w:p>
+        </w:tc>
+        <w:tc>
+          <w:tcPr/>
+          <w:p>
+            <w:pPr>
+              <w:pStyle w:val="Compact"/>
+              <w:jc w:val="left"/>
+            </w:pPr>
+            <w:r>
+              <w:rPr>
+                <w:sz w:val="19"/>
+              </w:rPr>
+              <w:t xml:space="preserve">The Pelion’s systems start failing</w:t>
+            </w:r>
+          </w:p>
+        </w:tc>
+        <w:tc>
+          <w:tcPr/>
+          <w:p>
+            <w:pPr>
+              <w:pStyle w:val="Compact"/>
+              <w:jc w:val="left"/>
+            </w:pPr>
+            <w:r>
+              <w:rPr>
+                <w:sz w:val="19"/>
+              </w:rPr>
+              <w:t xml:space="preserve">Peace talks break down (8)</w:t>
+            </w:r>
+          </w:p>
+        </w:tc>
+        <w:tc>
+          <w:tcPr/>
+          <w:p>
+            <w:pPr>
+              <w:pStyle w:val="Compact"/>
+              <w:jc w:val="left"/>
+            </w:pPr>
+            <w:r>
+              <w:rPr>
+                <w:sz w:val="19"/>
+              </w:rPr>
+              <w:t xml:space="preserve">A disapproving Vulcan observer</w:t>
+            </w:r>
+          </w:p>
+        </w:tc>
+      </w:tr>
+      <w:tr>
+        <w:tc>
+          <w:tcPr/>
+          <w:p>
+            <w:pPr>
+              <w:pStyle w:val="Compact"/>
+              <w:jc w:val="left"/>
+            </w:pPr>
+            <w:r>
+              <w:rPr>
+                <w:b/>
+                <w:sz w:val="19"/>
+              </w:rPr>
+              <w:t xml:space="preserve">9</w:t>
+            </w:r>
+          </w:p>
+        </w:tc>
+        <w:tc>
+          <w:tcPr/>
+          <w:p>
+            <w:pPr>
+              <w:pStyle w:val="Compact"/>
+              <w:jc w:val="left"/>
+            </w:pPr>
+            <w:r>
+              <w:rPr>
+                <w:sz w:val="19"/>
+              </w:rPr>
+              <w:t xml:space="preserve">A respected visitor has a hidden agenda</w:t>
+            </w:r>
+          </w:p>
+        </w:tc>
+        <w:tc>
+          <w:tcPr/>
+          <w:p>
+            <w:pPr>
+              <w:pStyle w:val="Compact"/>
+              <w:jc w:val="left"/>
+            </w:pPr>
+            <w:r>
+              <w:rPr>
+                <w:sz w:val="19"/>
+              </w:rPr>
+              <w:t xml:space="preserve">The hostages’ air runs out (4)</w:t>
+            </w:r>
+          </w:p>
+        </w:tc>
+        <w:tc>
+          <w:tcPr/>
+          <w:p>
+            <w:pPr>
+              <w:pStyle w:val="Compact"/>
+              <w:jc w:val="left"/>
+            </w:pPr>
+            <w:r>
+              <w:rPr>
+                <w:sz w:val="19"/>
+              </w:rPr>
+              <w:t xml:space="preserve">An old friend of one of the crew</w:t>
+            </w:r>
+          </w:p>
+        </w:tc>
+      </w:tr>
+      <w:tr>
+        <w:tc>
+          <w:tcPr/>
+          <w:p>
+            <w:pPr>
+              <w:pStyle w:val="Compact"/>
+              <w:jc w:val="left"/>
+            </w:pPr>
+            <w:r>
+              <w:rPr>
+                <w:b/>
+                <w:sz w:val="19"/>
+              </w:rPr>
+              <w:t xml:space="preserve">10</w:t>
+            </w:r>
+          </w:p>
+        </w:tc>
+        <w:tc>
+          <w:tcPr/>
+          <w:p>
+            <w:pPr>
+              <w:pStyle w:val="Compact"/>
+              <w:jc w:val="left"/>
+            </w:pPr>
+            <w:r>
+              <w:rPr>
+                <w:sz w:val="19"/>
+              </w:rPr>
+              <w:t xml:space="preserve">The</w:t>
+            </w:r>
+            <w:r>
+              <w:rPr>
+                <w:sz w:val="19"/>
+              </w:rPr>
+              <w:t xml:space="preserve"> </w:t>
+            </w:r>
+            <w:r>
+              <w:rPr>
+                <w:sz w:val="19"/>
+              </w:rPr>
+              <w:t xml:space="preserve">‘</w:t>
+            </w:r>
+            <w:r>
+              <w:rPr>
+                <w:sz w:val="19"/>
+              </w:rPr>
+              <w:t xml:space="preserve">threat</w:t>
+            </w:r>
+            <w:r>
+              <w:rPr>
+                <w:sz w:val="19"/>
+              </w:rPr>
+              <w:t xml:space="preserve">’</w:t>
+            </w:r>
+            <w:r>
+              <w:rPr>
+                <w:sz w:val="19"/>
+              </w:rPr>
+              <w:t xml:space="preserve"> </w:t>
+            </w:r>
+            <w:r>
+              <w:rPr>
+                <w:sz w:val="19"/>
+              </w:rPr>
+              <w:t xml:space="preserve">is only defending itself</w:t>
+            </w:r>
+          </w:p>
+        </w:tc>
+        <w:tc>
+          <w:tcPr/>
+          <w:p>
+            <w:pPr>
+              <w:pStyle w:val="Compact"/>
+              <w:jc w:val="left"/>
+            </w:pPr>
+            <w:r>
+              <w:rPr>
+                <w:sz w:val="19"/>
+              </w:rPr>
+              <w:t xml:space="preserve">The star goes nova (8)</w:t>
+            </w:r>
+          </w:p>
+        </w:tc>
+        <w:tc>
+          <w:tcPr/>
+          <w:p>
+            <w:pPr>
+              <w:pStyle w:val="Compact"/>
+              <w:jc w:val="left"/>
+            </w:pPr>
+            <w:r>
+              <w:rPr>
+                <w:sz w:val="19"/>
+              </w:rPr>
+              <w:t xml:space="preserve">A Romulan who wants to defect</w:t>
+            </w:r>
+          </w:p>
+        </w:tc>
+      </w:tr>
+      <w:tr>
+        <w:tc>
+          <w:tcPr/>
+          <w:p>
+            <w:pPr>
+              <w:pStyle w:val="Compact"/>
+              <w:jc w:val="left"/>
+            </w:pPr>
+            <w:r>
+              <w:rPr>
+                <w:b/>
+                <w:sz w:val="19"/>
+              </w:rPr>
+              <w:t xml:space="preserve">11</w:t>
+            </w:r>
+          </w:p>
+        </w:tc>
+        <w:tc>
+          <w:tcPr/>
+          <w:p>
+            <w:pPr>
+              <w:pStyle w:val="Compact"/>
+              <w:jc w:val="left"/>
+            </w:pPr>
+            <w:r>
+              <w:rPr>
+                <w:sz w:val="19"/>
+              </w:rPr>
+              <w:t xml:space="preserve">Contact with Starfleet is cut off</w:t>
+            </w:r>
+          </w:p>
+        </w:tc>
+        <w:tc>
+          <w:tcPr/>
+          <w:p>
+            <w:pPr>
+              <w:pStyle w:val="Compact"/>
+              <w:jc w:val="left"/>
+            </w:pPr>
+            <w:r>
+              <w:rPr>
+                <w:sz w:val="19"/>
+              </w:rPr>
+              <w:t xml:space="preserve">Shields fail under bombardment (4)</w:t>
+            </w:r>
+          </w:p>
+        </w:tc>
+        <w:tc>
+          <w:tcPr/>
+          <w:p>
+            <w:pPr>
+              <w:pStyle w:val="Compact"/>
+              <w:jc w:val="left"/>
+            </w:pPr>
+            <w:r>
+              <w:rPr>
+                <w:sz w:val="19"/>
+              </w:rPr>
+              <w:t xml:space="preserve">A Starfleet admiral with sealed orders</w:t>
+            </w:r>
+          </w:p>
+        </w:tc>
+      </w:tr>
+      <w:tr>
+        <w:tc>
+          <w:tcPr/>
+          <w:p>
+            <w:pPr>
+              <w:pStyle w:val="Compact"/>
+              <w:jc w:val="left"/>
+            </w:pPr>
+            <w:r>
+              <w:rPr>
+                <w:b/>
+                <w:sz w:val="19"/>
+              </w:rPr>
+              <w:t xml:space="preserve">12</w:t>
+            </w:r>
+          </w:p>
+        </w:tc>
+        <w:tc>
+          <w:tcPr/>
+          <w:p>
+            <w:pPr>
+              <w:pStyle w:val="Compact"/>
+              <w:jc w:val="left"/>
+            </w:pPr>
+            <w:r>
+              <w:rPr>
+                <w:sz w:val="19"/>
+              </w:rPr>
+              <w:t xml:space="preserve">A civilian is trapped out of reach</w:t>
+            </w:r>
+          </w:p>
+        </w:tc>
+        <w:tc>
+          <w:tcPr/>
+          <w:p>
+            <w:pPr>
+              <w:pStyle w:val="Compact"/>
+              <w:jc w:val="left"/>
+            </w:pPr>
+            <w:r>
+              <w:rPr>
+                <w:sz w:val="19"/>
+              </w:rPr>
+              <w:t xml:space="preserve">The away team is discovered (6)</w:t>
+            </w:r>
+          </w:p>
+        </w:tc>
+        <w:tc>
+          <w:tcPr/>
+          <w:p>
+            <w:pPr>
+              <w:pStyle w:val="Compact"/>
+              <w:jc w:val="left"/>
+            </w:pPr>
+            <w:r>
+              <w:rPr>
+                <w:sz w:val="19"/>
+              </w:rPr>
+              <w:t xml:space="preserve">An android that wants to be free</w:t>
+            </w:r>
+          </w:p>
+        </w:tc>
+      </w:tr>
+    </w:tbl>
+    <w:p>
+      <w:pPr>
+        <w:pStyle w:val="BodyText"/>
+      </w:pPr>
+      <w:r>
+        <w:rPr>
+          <w:iCs/>
+          <w:i/>
+        </w:rPr>
+        <w:t xml:space="preserve">Example:</w:t>
+      </w:r>
+      <w:r>
+        <w:t xml:space="preserve"> </w:t>
+      </w:r>
+      <w:r>
+        <w:t xml:space="preserve">3, 9, 5, 10, 2, 4 gives</w:t>
       </w:r>
       <w:r>
         <w:t xml:space="preserve"> </w:t>
@@ -7235,22 +9093,136 @@
           <w:bCs/>
           <w:b/>
         </w:rPr>
-        <w:t xml:space="preserve">Load a ready-made crew member</w:t>
-      </w:r>
-      <w:r>
-        <w:t xml:space="preserve"> </w:t>
-      </w:r>
-      <w:r>
-        <w:t xml:space="preserve">to open one and make it your own.</w:t>
-      </w:r>
-    </w:p>
-    <w:bookmarkStart w:id="70" w:name="thelan-shvari"/>
+        <w:t xml:space="preserve">first contact</w:t>
+      </w:r>
+      <w:r>
+        <w:t xml:space="preserve"> </w:t>
+      </w:r>
+      <w:r>
+        <w:t xml:space="preserve">at</w:t>
+      </w:r>
+      <w:r>
+        <w:t xml:space="preserve"> </w:t>
+      </w:r>
+      <w:r>
+        <w:rPr>
+          <w:bCs/>
+          <w:b/>
+        </w:rPr>
+        <w:t xml:space="preserve">a starbase in crisis</w:t>
+      </w:r>
+      <w:r>
+        <w:t xml:space="preserve">, where</w:t>
+      </w:r>
+      <w:r>
+        <w:t xml:space="preserve"> </w:t>
+      </w:r>
+      <w:r>
+        <w:rPr>
+          <w:bCs/>
+          <w:b/>
+        </w:rPr>
+        <w:t xml:space="preserve">a signal repeats a crew member’s name</w:t>
+      </w:r>
+      <w:r>
+        <w:t xml:space="preserve">;</w:t>
+      </w:r>
+      <w:r>
+        <w:t xml:space="preserve"> </w:t>
+      </w:r>
+      <w:r>
+        <w:rPr>
+          <w:bCs/>
+          <w:b/>
+        </w:rPr>
+        <w:t xml:space="preserve">the</w:t>
+      </w:r>
+      <w:r>
+        <w:rPr>
+          <w:bCs/>
+          <w:b/>
+        </w:rPr>
+        <w:t xml:space="preserve"> </w:t>
+      </w:r>
+      <w:r>
+        <w:rPr>
+          <w:bCs/>
+          <w:b/>
+        </w:rPr>
+        <w:t xml:space="preserve">“</w:t>
+      </w:r>
+      <w:r>
+        <w:rPr>
+          <w:bCs/>
+          <w:b/>
+        </w:rPr>
+        <w:t xml:space="preserve">threat</w:t>
+      </w:r>
+      <w:r>
+        <w:rPr>
+          <w:bCs/>
+          <w:b/>
+        </w:rPr>
+        <w:t xml:space="preserve">”</w:t>
+      </w:r>
+      <w:r>
+        <w:rPr>
+          <w:bCs/>
+          <w:b/>
+        </w:rPr>
+        <w:t xml:space="preserve"> </w:t>
+      </w:r>
+      <w:r>
+        <w:rPr>
+          <w:bCs/>
+          <w:b/>
+        </w:rPr>
+        <w:t xml:space="preserve">is only defending itself</w:t>
+      </w:r>
+      <w:r>
+        <w:t xml:space="preserve">, a</w:t>
+      </w:r>
+      <w:r>
+        <w:t xml:space="preserve"> </w:t>
+      </w:r>
+      <w:r>
+        <w:rPr>
+          <w:bCs/>
+          <w:b/>
+        </w:rPr>
+        <w:t xml:space="preserve">warp core breach</w:t>
+      </w:r>
+      <w:r>
+        <w:t xml:space="preserve"> </w:t>
+      </w:r>
+      <w:r>
+        <w:t xml:space="preserve">clock (4) is ticking, and</w:t>
+      </w:r>
+      <w:r>
+        <w:t xml:space="preserve"> </w:t>
+      </w:r>
+      <w:r>
+        <w:rPr>
+          <w:bCs/>
+          <w:b/>
+        </w:rPr>
+        <w:t xml:space="preserve">a brilliant, reckless scientist</w:t>
+      </w:r>
+      <w:r>
+        <w:t xml:space="preserve"> </w:t>
+      </w:r>
+      <w:r>
+        <w:t xml:space="preserve">is in the middle of it.</w:t>
+      </w:r>
+    </w:p>
+    <w:bookmarkEnd w:id="70"/>
+    <w:bookmarkStart w:id="71" w:name="captains-log"/>
     <w:p>
       <w:pPr>
         <w:pStyle w:val="Heading2"/>
       </w:pPr>
       <w:r>
-        <w:t xml:space="preserve">Thelan sh’Vari</w:t>
+        <w:t xml:space="preserve">Captain’s log</w:t>
       </w:r>
     </w:p>
     <w:p>
@@ -7258,17 +9230,7 @@
         <w:pStyle w:val="FirstParagraph"/>
       </w:pPr>
       <w:r>
-        <w:rPr>
-          <w:iCs/>
-          <w:i/>
-        </w:rPr>
-        <w:t xml:space="preserve">Lieutenant Commander, Command. Andorian.</w:t>
-      </w:r>
-      <w:r>
-        <w:t xml:space="preserve"> </w:t>
-      </w:r>
-      <w:r>
-        <w:t xml:space="preserve">First officer: keeps the crew moving when the captain’s plan meets reality, and keeps the captain honest.</w:t>
+        <w:t xml:space="preserve">End each mission with a short log, written together:</w:t>
       </w:r>
     </w:p>
     <w:p>
@@ -7284,29 +9246,13 @@
           <w:bCs/>
           <w:b/>
         </w:rPr>
-        <w:t xml:space="preserve">Attributes:</w:t>
-      </w:r>
-      <w:r>
-        <w:t xml:space="preserve"> </w:t>
-      </w:r>
-      <w:r>
-        <w:t xml:space="preserve">Body 10, Agility 12, Intellect 10, Presence 13, Will 10.</w:t>
-      </w:r>
-      <w:r>
-        <w:t xml:space="preserve"> </w:t>
-      </w:r>
-      <w:r>
-        <w:rPr>
-          <w:bCs/>
-          <w:b/>
-        </w:rPr>
-        <w:t xml:space="preserve">Dodge</w:t>
-      </w:r>
-      <w:r>
-        <w:t xml:space="preserve"> </w:t>
-      </w:r>
-      <w:r>
-        <w:t xml:space="preserve">11.</w:t>
+        <w:t xml:space="preserve">The mission.</w:t>
+      </w:r>
+      <w:r>
+        <w:t xml:space="preserve"> </w:t>
+      </w:r>
+      <w:r>
+        <w:t xml:space="preserve">What were we sent to do, and did we do it: completed, partly, or failed?</w:t>
       </w:r>
     </w:p>
     <w:p>
@@ -7322,13 +9268,13 @@
           <w:bCs/>
           <w:b/>
         </w:rPr>
-        <w:t xml:space="preserve">Skills:</w:t>
-      </w:r>
-      <w:r>
-        <w:t xml:space="preserve"> </w:t>
-      </w:r>
-      <w:r>
-        <w:t xml:space="preserve">Leadership 16 (Specialty). Trained: Diplomacy 14, Helm 13, Phasers 13, Unarmed Combat 13, Navigation 11, Psychology 11, Athletics 11, Sensors 11, Communications 11.</w:t>
+        <w:t xml:space="preserve">Who stood out?</w:t>
+      </w:r>
+      <w:r>
+        <w:t xml:space="preserve"> </w:t>
+      </w:r>
+      <w:r>
+        <w:t xml:space="preserve">Name a commendation, or a moment worth remembering.</w:t>
       </w:r>
     </w:p>
     <w:p>
@@ -7344,29 +9290,13 @@
           <w:bCs/>
           <w:b/>
         </w:rPr>
-        <w:t xml:space="preserve">Advantage:</w:t>
-      </w:r>
-      <w:r>
-        <w:t xml:space="preserve"> </w:t>
-      </w:r>
-      <w:r>
-        <w:t xml:space="preserve">Crisis Leader.</w:t>
-      </w:r>
-      <w:r>
-        <w:t xml:space="preserve"> </w:t>
-      </w:r>
-      <w:r>
-        <w:rPr>
-          <w:bCs/>
-          <w:b/>
-        </w:rPr>
-        <w:t xml:space="preserve">Complication:</w:t>
-      </w:r>
-      <w:r>
-        <w:t xml:space="preserve"> </w:t>
-      </w:r>
-      <w:r>
-        <w:t xml:space="preserve">Reputation to Uphold; trigger: someone questions your competence in front of others.</w:t>
+        <w:t xml:space="preserve">Complications.</w:t>
+      </w:r>
+      <w:r>
+        <w:t xml:space="preserve"> </w:t>
+      </w:r>
+      <w:r>
+        <w:t xml:space="preserve">Which ones came into play, and what did they cost?</w:t>
       </w:r>
     </w:p>
     <w:p>
@@ -7382,39 +9312,87 @@
           <w:bCs/>
           <w:b/>
         </w:rPr>
-        <w:t xml:space="preserve">Why I serve:</w:t>
-      </w:r>
-      <w:r>
-        <w:t xml:space="preserve"> </w:t>
-      </w:r>
-      <w:r>
-        <w:t xml:space="preserve">Starfleet runs in my family, and I mean to live up to the name.</w:t>
-      </w:r>
-      <w:r>
-        <w:t xml:space="preserve"> </w:t>
-      </w:r>
+        <w:t xml:space="preserve">What changed?</w:t>
+      </w:r>
+      <w:r>
+        <w:t xml:space="preserve"> </w:t>
+      </w:r>
+      <w:r>
+        <w:t xml:space="preserve">Damage to the ship, new allies or enemies, open threads for next time.</w:t>
+      </w:r>
+    </w:p>
+    <w:p>
+      <w:pPr>
+        <w:numPr>
+          <w:ilvl w:val="0"/>
+          <w:numId w:val="1010"/>
+        </w:numPr>
+        <w:pStyle w:val="Compact"/>
+      </w:pPr>
       <w:r>
         <w:rPr>
           <w:bCs/>
           <w:b/>
         </w:rPr>
-        <w:t xml:space="preserve">Connection:</w:t>
-      </w:r>
-      <w:r>
-        <w:t xml:space="preserve"> </w:t>
-      </w:r>
-      <w:r>
-        <w:t xml:space="preserve">Took Yeoman Rrinn under their wing when Rrinn first came aboard.</w:t>
-      </w:r>
-    </w:p>
-    <w:bookmarkEnd w:id="70"/>
-    <w:bookmarkStart w:id="71" w:name="sevek"/>
+        <w:t xml:space="preserve">Advancement.</w:t>
+      </w:r>
+      <w:r>
+        <w:t xml:space="preserve"> </w:t>
+      </w:r>
+      <w:r>
+        <w:t xml:space="preserve">After a significant mission, the GM may authorize one skill step for each crew member (Untrained to Trained, or Trained to Specialty), or a revision of an advantage or complication.</w:t>
+      </w:r>
+    </w:p>
+    <w:p>
+      <w:pPr>
+        <w:pStyle w:val="FirstParagraph"/>
+      </w:pPr>
+      <w:r>
+        <w:t xml:space="preserve">The creator’s GM view keeps the log, applies each crew member’s advancement to the GM’s copy, and saves both with the crew file. Players record an approved advancement on their own sheet under Step 3, so their character still passes the checklist.</w:t>
+      </w:r>
+    </w:p>
+    <w:bookmarkEnd w:id="71"/>
+    <w:bookmarkEnd w:id="72"/>
+    <w:bookmarkStart w:id="79" w:name="ready-made-crew"/>
+    <w:p>
+      <w:pPr>
+        <w:pStyle w:val="Heading1"/>
+      </w:pPr>
+      <w:r>
+        <w:t xml:space="preserve">Ready-made crew</w:t>
+      </w:r>
+    </w:p>
+    <w:p>
+      <w:pPr>
+        <w:pStyle w:val="FirstParagraph"/>
+      </w:pPr>
+      <w:r>
+        <w:t xml:space="preserve">Six crew members ready to play, for one-shots, new players, or a crew in a hurry. Each follows the creation rules exactly, and their connections tie them to one another. In the creator, choose</w:t>
+      </w:r>
+      <w:r>
+        <w:t xml:space="preserve"> </w:t>
+      </w:r>
+      <w:r>
+        <w:rPr>
+          <w:bCs/>
+          <w:b/>
+        </w:rPr>
+        <w:t xml:space="preserve">Load a ready-made crew member</w:t>
+      </w:r>
+      <w:r>
+        <w:t xml:space="preserve"> </w:t>
+      </w:r>
+      <w:r>
+        <w:t xml:space="preserve">to open one and make it your own.</w:t>
+      </w:r>
+    </w:p>
+    <w:bookmarkStart w:id="73" w:name="thelan-shvari"/>
     <w:p>
       <w:pPr>
         <w:pStyle w:val="Heading2"/>
       </w:pPr>
       <w:r>
-        <w:t xml:space="preserve">Sevek</w:t>
+        <w:t xml:space="preserve">Thelan sh’Vari</w:t>
       </w:r>
     </w:p>
     <w:p>
@@ -7426,13 +9404,13 @@
           <w:iCs/>
           <w:i/>
         </w:rPr>
-        <w:t xml:space="preserve">Lieutenant, Science. Vulcan.</w:t>
-      </w:r>
-      <w:r>
-        <w:t xml:space="preserve"> </w:t>
-      </w:r>
-      <w:r>
-        <w:t xml:space="preserve">Ship’s sciences officer: reads the anomaly, names the risk, and calculates the odds no one asked for.</w:t>
+        <w:t xml:space="preserve">Lieutenant Commander, Command. Andorian.</w:t>
+      </w:r>
+      <w:r>
+        <w:t xml:space="preserve"> </w:t>
+      </w:r>
+      <w:r>
+        <w:t xml:space="preserve">First officer: keeps the crew moving when the captain’s plan meets reality, and keeps the captain honest.</w:t>
       </w:r>
     </w:p>
     <w:p>
@@ -7454,7 +9432,7 @@
         <w:t xml:space="preserve"> </w:t>
       </w:r>
       <w:r>
-        <w:t xml:space="preserve">Body 11, Agility 11, Intellect 13, Presence 8, Will 12.</w:t>
+        <w:t xml:space="preserve">Body 10, Agility 12, Intellect 10, Presence 13, Will 10.</w:t>
       </w:r>
       <w:r>
         <w:t xml:space="preserve"> </w:t>
@@ -7470,7 +9448,7 @@
         <w:t xml:space="preserve"> </w:t>
       </w:r>
       <w:r>
-        <w:t xml:space="preserve">10.</w:t>
+        <w:t xml:space="preserve">11.</w:t>
       </w:r>
     </w:p>
     <w:p>
@@ -7492,7 +9470,7 @@
         <w:t xml:space="preserve"> </w:t>
       </w:r>
       <w:r>
-        <w:t xml:space="preserve">Physical Sciences 16 (Specialty). Trained: Sensors 14, Computers 14, Life Sciences 14, Navigation 14, Engineering 14, Electronics 14, Psychology 14, Unarmed Combat 12, Athletics 12.</w:t>
+        <w:t xml:space="preserve">Leadership 16 (Specialty). Trained: Diplomacy 14, Helm 13, Phasers 13, Unarmed Combat 13, Navigation 11, Psychology 11, Athletics 11, Sensors 11, Communications 11.</w:t>
       </w:r>
     </w:p>
     <w:p>
@@ -7514,7 +9492,7 @@
         <w:t xml:space="preserve"> </w:t>
       </w:r>
       <w:r>
-        <w:t xml:space="preserve">Eidetic Recall (species; companion: Suppressed Emotion).</w:t>
+        <w:t xml:space="preserve">Crisis Leader.</w:t>
       </w:r>
       <w:r>
         <w:t xml:space="preserve"> </w:t>
@@ -7530,7 +9508,7 @@
         <w:t xml:space="preserve"> </w:t>
       </w:r>
       <w:r>
-        <w:t xml:space="preserve">Cannot Leave a Mystery Alone; trigger: sensor data that contradicts known science.</w:t>
+        <w:t xml:space="preserve">Reputation to Uphold; trigger: someone questions your competence in front of others.</w:t>
       </w:r>
     </w:p>
     <w:p>
@@ -7552,7 +9530,7 @@
         <w:t xml:space="preserve"> </w:t>
       </w:r>
       <w:r>
-        <w:t xml:space="preserve">The best laboratory in the galaxy is a starship on the frontier.</w:t>
+        <w:t xml:space="preserve">Starfleet runs in my family, and I mean to live up to the name.</w:t>
       </w:r>
       <w:r>
         <w:t xml:space="preserve"> </w:t>
@@ -7568,17 +9546,17 @@
         <w:t xml:space="preserve"> </w:t>
       </w:r>
       <w:r>
-        <w:t xml:space="preserve">Friendly rivals with Lt. Grath: they argue every engineering theory, and both enjoy it.</w:t>
-      </w:r>
-    </w:p>
-    <w:bookmarkEnd w:id="71"/>
-    <w:bookmarkStart w:id="72" w:name="dr.-vessik"/>
+        <w:t xml:space="preserve">Took Yeoman Rrinn under their wing when Rrinn first came aboard.</w:t>
+      </w:r>
+    </w:p>
+    <w:bookmarkEnd w:id="73"/>
+    <w:bookmarkStart w:id="74" w:name="sevek"/>
     <w:p>
       <w:pPr>
         <w:pStyle w:val="Heading2"/>
       </w:pPr>
       <w:r>
-        <w:t xml:space="preserve">Dr. Vessik</w:t>
+        <w:t xml:space="preserve">Sevek</w:t>
       </w:r>
     </w:p>
     <w:p>
@@ -7590,13 +9568,13 @@
           <w:iCs/>
           <w:i/>
         </w:rPr>
-        <w:t xml:space="preserve">Lieutenant Commander, Medical. Denobulan.</w:t>
-      </w:r>
-      <w:r>
-        <w:t xml:space="preserve"> </w:t>
-      </w:r>
-      <w:r>
-        <w:t xml:space="preserve">Chief medical officer: patches up the crew, argues with the captain, and keeps an alarming menagerie of medicinal creatures in sickbay.</w:t>
+        <w:t xml:space="preserve">Lieutenant, Science. Vulcan.</w:t>
+      </w:r>
+      <w:r>
+        <w:t xml:space="preserve"> </w:t>
+      </w:r>
+      <w:r>
+        <w:t xml:space="preserve">Ship’s sciences officer: reads the anomaly, names the risk, and calculates the odds no one asked for.</w:t>
       </w:r>
     </w:p>
     <w:p>
@@ -7618,7 +9596,7 @@
         <w:t xml:space="preserve"> </w:t>
       </w:r>
       <w:r>
-        <w:t xml:space="preserve">Body 9, Agility 9, Intellect 13, Presence 12, Will 12.</w:t>
+        <w:t xml:space="preserve">Body 11, Agility 11, Intellect 13, Presence 8, Will 12.</w:t>
       </w:r>
       <w:r>
         <w:t xml:space="preserve"> </w:t>
@@ -7634,7 +9612,7 @@
         <w:t xml:space="preserve"> </w:t>
       </w:r>
       <w:r>
-        <w:t xml:space="preserve">7.</w:t>
+        <w:t xml:space="preserve">10.</w:t>
       </w:r>
     </w:p>
     <w:p>
@@ -7656,7 +9634,7 @@
         <w:t xml:space="preserve"> </w:t>
       </w:r>
       <w:r>
-        <w:t xml:space="preserve">Medicine 16 (Specialty). Trained: Life Sciences 14, Psychology 14, Sensors 14, Computers 14, Electronics 14, Survival 14, Communications 14, Diplomacy 13, Leadership 13.</w:t>
+        <w:t xml:space="preserve">Physical Sciences 16 (Specialty). Trained: Sensors 14, Computers 14, Life Sciences 14, Navigation 14, Engineering 14, Electronics 14, Psychology 14, Unarmed Combat 12, Athletics 12.</w:t>
       </w:r>
     </w:p>
     <w:p>
@@ -7678,7 +9656,7 @@
         <w:t xml:space="preserve"> </w:t>
       </w:r>
       <w:r>
-        <w:t xml:space="preserve">Denobulan Pharmacopoeia (species; companion: Unorthodox Methods).</w:t>
+        <w:t xml:space="preserve">Eidetic Recall (species; companion: Suppressed Emotion).</w:t>
       </w:r>
       <w:r>
         <w:t xml:space="preserve"> </w:t>
@@ -7694,7 +9672,7 @@
         <w:t xml:space="preserve"> </w:t>
       </w:r>
       <w:r>
-        <w:t xml:space="preserve">Protects Others at Personal Risk; trigger: civilians are caught in the danger.</w:t>
+        <w:t xml:space="preserve">Cannot Leave a Mystery Alone; trigger: sensor data that contradicts known science.</w:t>
       </w:r>
     </w:p>
     <w:p>
@@ -7716,7 +9694,7 @@
         <w:t xml:space="preserve"> </w:t>
       </w:r>
       <w:r>
-        <w:t xml:space="preserve">To protect the Federation and the people who can’t protect themselves.</w:t>
+        <w:t xml:space="preserve">The best laboratory in the galaxy is a starship on the frontier.</w:t>
       </w:r>
       <w:r>
         <w:t xml:space="preserve"> </w:t>
@@ -7732,17 +9710,17 @@
         <w:t xml:space="preserve"> </w:t>
       </w:r>
       <w:r>
-        <w:t xml:space="preserve">Pulled Lt. Reyes out of a burning shuttle on a survey mission; Reyes has never let the doctor pay for a drink since.</w:t>
-      </w:r>
-    </w:p>
-    <w:bookmarkEnd w:id="72"/>
-    <w:bookmarkStart w:id="73" w:name="grath"/>
+        <w:t xml:space="preserve">Friendly rivals with Lt. Grath: they argue every engineering theory, and both enjoy it.</w:t>
+      </w:r>
+    </w:p>
+    <w:bookmarkEnd w:id="74"/>
+    <w:bookmarkStart w:id="75" w:name="dr.-vessik"/>
     <w:p>
       <w:pPr>
         <w:pStyle w:val="Heading2"/>
       </w:pPr>
       <w:r>
-        <w:t xml:space="preserve">Grath</w:t>
+        <w:t xml:space="preserve">Dr. Vessik</w:t>
       </w:r>
     </w:p>
     <w:p>
@@ -7754,13 +9732,13 @@
           <w:iCs/>
           <w:i/>
         </w:rPr>
-        <w:t xml:space="preserve">Lieutenant, Engineering. Tellarite.</w:t>
-      </w:r>
-      <w:r>
-        <w:t xml:space="preserve"> </w:t>
-      </w:r>
-      <w:r>
-        <w:t xml:space="preserve">Engineer: keeps the Pelion’s power flowing and will tell you, at length, exactly why your idea won’t work.</w:t>
+        <w:t xml:space="preserve">Lieutenant Commander, Medical. Denobulan.</w:t>
+      </w:r>
+      <w:r>
+        <w:t xml:space="preserve"> </w:t>
+      </w:r>
+      <w:r>
+        <w:t xml:space="preserve">Chief medical officer: patches up the crew, argues with the captain, and keeps an alarming menagerie of medicinal creatures in sickbay.</w:t>
       </w:r>
     </w:p>
     <w:p>
@@ -7782,7 +9760,7 @@
         <w:t xml:space="preserve"> </w:t>
       </w:r>
       <w:r>
-        <w:t xml:space="preserve">Body 12, Agility 10, Intellect 13, Presence 9, Will 11.</w:t>
+        <w:t xml:space="preserve">Body 9, Agility 9, Intellect 13, Presence 12, Will 12.</w:t>
       </w:r>
       <w:r>
         <w:t xml:space="preserve"> </w:t>
@@ -7798,7 +9776,7 @@
         <w:t xml:space="preserve"> </w:t>
       </w:r>
       <w:r>
-        <w:t xml:space="preserve">9.</w:t>
+        <w:t xml:space="preserve">7.</w:t>
       </w:r>
     </w:p>
     <w:p>
@@ -7820,7 +9798,7 @@
         <w:t xml:space="preserve"> </w:t>
       </w:r>
       <w:r>
-        <w:t xml:space="preserve">Engineering 16 (Specialty). Trained: Electronics 14, Computers 14, Physical Sciences 14, Sensors 14, Communications 14, Survival 14, Athletics 13, Helm 11, Unarmed Combat 11.</w:t>
+        <w:t xml:space="preserve">Medicine 16 (Specialty). Trained: Life Sciences 14, Psychology 14, Sensors 14, Computers 14, Electronics 14, Survival 14, Communications 14, Diplomacy 13, Leadership 13.</w:t>
       </w:r>
     </w:p>
     <w:p>
@@ -7842,7 +9820,7 @@
         <w:t xml:space="preserve"> </w:t>
       </w:r>
       <w:r>
-        <w:t xml:space="preserve">Improvisational Engineer.</w:t>
+        <w:t xml:space="preserve">Denobulan Pharmacopoeia (species; companion: Unorthodox Methods).</w:t>
       </w:r>
       <w:r>
         <w:t xml:space="preserve"> </w:t>
@@ -7858,7 +9836,7 @@
         <w:t xml:space="preserve"> </w:t>
       </w:r>
       <w:r>
-        <w:t xml:space="preserve">Experimental Enthusiasm; trigger: an untested device or technique could solve the problem.</w:t>
+        <w:t xml:space="preserve">Protects Others at Personal Risk; trigger: civilians are caught in the danger.</w:t>
       </w:r>
     </w:p>
     <w:p>
@@ -7880,7 +9858,7 @@
         <w:t xml:space="preserve"> </w:t>
       </w:r>
       <w:r>
-        <w:t xml:space="preserve">To prove I’m good enough, to everyone who doubted me and to myself.</w:t>
+        <w:t xml:space="preserve">To protect the Federation and the people who can’t protect themselves.</w:t>
       </w:r>
       <w:r>
         <w:t xml:space="preserve"> </w:t>
@@ -7896,17 +9874,17 @@
         <w:t xml:space="preserve"> </w:t>
       </w:r>
       <w:r>
-        <w:t xml:space="preserve">Off-duty friends with Commander sh’Vari: a weekly game of Andorian chess in which both of them cheat.</w:t>
-      </w:r>
-    </w:p>
-    <w:bookmarkEnd w:id="73"/>
-    <w:bookmarkStart w:id="74" w:name="marisol-reyes"/>
+        <w:t xml:space="preserve">Pulled Lt. Reyes out of a burning shuttle on a survey mission; Reyes has never let the doctor pay for a drink since.</w:t>
+      </w:r>
+    </w:p>
+    <w:bookmarkEnd w:id="75"/>
+    <w:bookmarkStart w:id="76" w:name="grath"/>
     <w:p>
       <w:pPr>
         <w:pStyle w:val="Heading2"/>
       </w:pPr>
       <w:r>
-        <w:t xml:space="preserve">Marisol Reyes</w:t>
+        <w:t xml:space="preserve">Grath</w:t>
       </w:r>
     </w:p>
     <w:p>
@@ -7918,13 +9896,13 @@
           <w:iCs/>
           <w:i/>
         </w:rPr>
-        <w:t xml:space="preserve">Lieutenant (j.g.), Security. Human.</w:t>
-      </w:r>
-      <w:r>
-        <w:t xml:space="preserve"> </w:t>
-      </w:r>
-      <w:r>
-        <w:t xml:space="preserve">Security officer: first through the door on every away mission, and the last to set a phaser to kill.</w:t>
+        <w:t xml:space="preserve">Lieutenant, Engineering. Tellarite.</w:t>
+      </w:r>
+      <w:r>
+        <w:t xml:space="preserve"> </w:t>
+      </w:r>
+      <w:r>
+        <w:t xml:space="preserve">Engineer: keeps the Pelion’s power flowing and will tell you, at length, exactly why your idea won’t work.</w:t>
       </w:r>
     </w:p>
     <w:p>
@@ -7946,7 +9924,7 @@
         <w:t xml:space="preserve"> </w:t>
       </w:r>
       <w:r>
-        <w:t xml:space="preserve">Body 12, Agility 13, Intellect 10, Presence 10, Will 10.</w:t>
+        <w:t xml:space="preserve">Body 12, Agility 10, Intellect 13, Presence 9, Will 11.</w:t>
       </w:r>
       <w:r>
         <w:t xml:space="preserve"> </w:t>
@@ -7962,7 +9940,7 @@
         <w:t xml:space="preserve"> </w:t>
       </w:r>
       <w:r>
-        <w:t xml:space="preserve">12.</w:t>
+        <w:t xml:space="preserve">9.</w:t>
       </w:r>
     </w:p>
     <w:p>
@@ -7984,7 +9962,7 @@
         <w:t xml:space="preserve"> </w:t>
       </w:r>
       <w:r>
-        <w:t xml:space="preserve">Phasers 16 (Specialty). Trained: Unarmed Combat 14, Stealth 14, Helm 14, Athletics 13, Survival 11, Sensors 11, Medicine 11, Leadership 11, Communications 11.</w:t>
+        <w:t xml:space="preserve">Engineering 16 (Specialty). Trained: Electronics 14, Computers 14, Physical Sciences 14, Sensors 14, Communications 14, Survival 14, Athletics 13, Helm 11, Unarmed Combat 11.</w:t>
       </w:r>
     </w:p>
     <w:p>
@@ -8006,7 +9984,7 @@
         <w:t xml:space="preserve"> </w:t>
       </w:r>
       <w:r>
-        <w:t xml:space="preserve">Careful Marksman.</w:t>
+        <w:t xml:space="preserve">Improvisational Engineer.</w:t>
       </w:r>
       <w:r>
         <w:t xml:space="preserve"> </w:t>
@@ -8022,7 +10000,7 @@
         <w:t xml:space="preserve"> </w:t>
       </w:r>
       <w:r>
-        <w:t xml:space="preserve">Reluctant to Use Lethal Force; trigger: a hostile refuses to surrender.</w:t>
+        <w:t xml:space="preserve">Experimental Enthusiasm; trigger: an untested device or technique could solve the problem.</w:t>
       </w:r>
     </w:p>
     <w:p>
@@ -8044,7 +10022,7 @@
         <w:t xml:space="preserve"> </w:t>
       </w:r>
       <w:r>
-        <w:t xml:space="preserve">A Starfleet officer once saved my home, and I want to be that person for someone else.</w:t>
+        <w:t xml:space="preserve">To prove I’m good enough, to everyone who doubted me and to myself.</w:t>
       </w:r>
       <w:r>
         <w:t xml:space="preserve"> </w:t>
@@ -8060,17 +10038,17 @@
         <w:t xml:space="preserve"> </w:t>
       </w:r>
       <w:r>
-        <w:t xml:space="preserve">Owes Dr. Vessik their life after a shuttle crash, and never lets the doctor forget it.</w:t>
-      </w:r>
-    </w:p>
-    <w:bookmarkEnd w:id="74"/>
-    <w:bookmarkStart w:id="75" w:name="rrinn"/>
+        <w:t xml:space="preserve">Off-duty friends with Commander sh’Vari: a weekly game of Andorian chess in which both of them cheat.</w:t>
+      </w:r>
+    </w:p>
+    <w:bookmarkEnd w:id="76"/>
+    <w:bookmarkStart w:id="77" w:name="marisol-reyes"/>
     <w:p>
       <w:pPr>
         <w:pStyle w:val="Heading2"/>
       </w:pPr>
       <w:r>
-        <w:t xml:space="preserve">Rrinn</w:t>
+        <w:t xml:space="preserve">Marisol Reyes</w:t>
       </w:r>
     </w:p>
     <w:p>
@@ -8082,13 +10060,13 @@
           <w:iCs/>
           <w:i/>
         </w:rPr>
-        <w:t xml:space="preserve">Yeoman 2nd Class, General Services. Caitian.</w:t>
-      </w:r>
-      <w:r>
-        <w:t xml:space="preserve"> </w:t>
-      </w:r>
-      <w:r>
-        <w:t xml:space="preserve">Captain’s yeoman: keeps the records, carries the orders, and hears everything said on the bridge.</w:t>
+        <w:t xml:space="preserve">Lieutenant (j.g.), Security. Human.</w:t>
+      </w:r>
+      <w:r>
+        <w:t xml:space="preserve"> </w:t>
+      </w:r>
+      <w:r>
+        <w:t xml:space="preserve">Security officer: first through the door on every away mission, and the last to set a phaser to kill.</w:t>
       </w:r>
     </w:p>
     <w:p>
@@ -8110,7 +10088,7 @@
         <w:t xml:space="preserve"> </w:t>
       </w:r>
       <w:r>
-        <w:t xml:space="preserve">Body 9, Agility 12, Intellect 13, Presence 11, Will 10.</w:t>
+        <w:t xml:space="preserve">Body 12, Agility 13, Intellect 10, Presence 10, Will 10.</w:t>
       </w:r>
       <w:r>
         <w:t xml:space="preserve"> </w:t>
@@ -8126,7 +10104,7 @@
         <w:t xml:space="preserve"> </w:t>
       </w:r>
       <w:r>
-        <w:t xml:space="preserve">11.</w:t>
+        <w:t xml:space="preserve">12.</w:t>
       </w:r>
     </w:p>
     <w:p>
@@ -8148,7 +10126,7 @@
         <w:t xml:space="preserve"> </w:t>
       </w:r>
       <w:r>
-        <w:t xml:space="preserve">Computers 18 (Expert). Trained: Communications 14, Psychology 14, Sensors 14, Electronics 14, Stealth 13, Diplomacy 12, Athletics 10.</w:t>
+        <w:t xml:space="preserve">Phasers 16 (Specialty). Trained: Unarmed Combat 14, Stealth 14, Helm 14, Athletics 13, Survival 11, Sensors 11, Medicine 11, Leadership 11, Communications 11.</w:t>
       </w:r>
     </w:p>
     <w:p>
@@ -8170,7 +10148,7 @@
         <w:t xml:space="preserve"> </w:t>
       </w:r>
       <w:r>
-        <w:t xml:space="preserve">Keen Hearing (species; companion: Sensitive Ears).</w:t>
+        <w:t xml:space="preserve">Careful Marksman.</w:t>
       </w:r>
       <w:r>
         <w:t xml:space="preserve"> </w:t>
@@ -8186,7 +10164,7 @@
         <w:t xml:space="preserve"> </w:t>
       </w:r>
       <w:r>
-        <w:t xml:space="preserve">Someone Back Home; trigger: a message from home arrives.</w:t>
+        <w:t xml:space="preserve">Reluctant to Use Lethal Force; trigger: a hostile refuses to surrender.</w:t>
       </w:r>
     </w:p>
     <w:p>
@@ -8208,7 +10186,7 @@
         <w:t xml:space="preserve"> </w:t>
       </w:r>
       <w:r>
-        <w:t xml:space="preserve">To leave behind a past, a world, or a life that was too small for me.</w:t>
+        <w:t xml:space="preserve">A Starfleet officer once saved my home, and I want to be that person for someone else.</w:t>
       </w:r>
       <w:r>
         <w:t xml:space="preserve"> </w:t>
@@ -8224,12 +10202,176 @@
         <w:t xml:space="preserve"> </w:t>
       </w:r>
       <w:r>
+        <w:t xml:space="preserve">Owes Dr. Vessik their life after a shuttle crash, and never lets the doctor forget it.</w:t>
+      </w:r>
+    </w:p>
+    <w:bookmarkEnd w:id="77"/>
+    <w:bookmarkStart w:id="78" w:name="rrinn"/>
+    <w:p>
+      <w:pPr>
+        <w:pStyle w:val="Heading2"/>
+      </w:pPr>
+      <w:r>
+        <w:t xml:space="preserve">Rrinn</w:t>
+      </w:r>
+    </w:p>
+    <w:p>
+      <w:pPr>
+        <w:pStyle w:val="FirstParagraph"/>
+      </w:pPr>
+      <w:r>
+        <w:rPr>
+          <w:iCs/>
+          <w:i/>
+        </w:rPr>
+        <w:t xml:space="preserve">Yeoman 2nd Class, General Services. Caitian.</w:t>
+      </w:r>
+      <w:r>
+        <w:t xml:space="preserve"> </w:t>
+      </w:r>
+      <w:r>
+        <w:t xml:space="preserve">Captain’s yeoman: keeps the records, carries the orders, and hears everything said on the bridge.</w:t>
+      </w:r>
+    </w:p>
+    <w:p>
+      <w:pPr>
+        <w:numPr>
+          <w:ilvl w:val="0"/>
+          <w:numId w:val="1016"/>
+        </w:numPr>
+        <w:pStyle w:val="Compact"/>
+      </w:pPr>
+      <w:r>
+        <w:rPr>
+          <w:bCs/>
+          <w:b/>
+        </w:rPr>
+        <w:t xml:space="preserve">Attributes:</w:t>
+      </w:r>
+      <w:r>
+        <w:t xml:space="preserve"> </w:t>
+      </w:r>
+      <w:r>
+        <w:t xml:space="preserve">Body 9, Agility 12, Intellect 13, Presence 11, Will 10.</w:t>
+      </w:r>
+      <w:r>
+        <w:t xml:space="preserve"> </w:t>
+      </w:r>
+      <w:r>
+        <w:rPr>
+          <w:bCs/>
+          <w:b/>
+        </w:rPr>
+        <w:t xml:space="preserve">Dodge</w:t>
+      </w:r>
+      <w:r>
+        <w:t xml:space="preserve"> </w:t>
+      </w:r>
+      <w:r>
+        <w:t xml:space="preserve">11.</w:t>
+      </w:r>
+    </w:p>
+    <w:p>
+      <w:pPr>
+        <w:numPr>
+          <w:ilvl w:val="0"/>
+          <w:numId w:val="1016"/>
+        </w:numPr>
+        <w:pStyle w:val="Compact"/>
+      </w:pPr>
+      <w:r>
+        <w:rPr>
+          <w:bCs/>
+          <w:b/>
+        </w:rPr>
+        <w:t xml:space="preserve">Skills:</w:t>
+      </w:r>
+      <w:r>
+        <w:t xml:space="preserve"> </w:t>
+      </w:r>
+      <w:r>
+        <w:t xml:space="preserve">Computers 18 (Expert). Trained: Communications 14, Psychology 14, Sensors 14, Electronics 14, Stealth 13, Diplomacy 12, Athletics 10.</w:t>
+      </w:r>
+    </w:p>
+    <w:p>
+      <w:pPr>
+        <w:numPr>
+          <w:ilvl w:val="0"/>
+          <w:numId w:val="1016"/>
+        </w:numPr>
+        <w:pStyle w:val="Compact"/>
+      </w:pPr>
+      <w:r>
+        <w:rPr>
+          <w:bCs/>
+          <w:b/>
+        </w:rPr>
+        <w:t xml:space="preserve">Advantage:</w:t>
+      </w:r>
+      <w:r>
+        <w:t xml:space="preserve"> </w:t>
+      </w:r>
+      <w:r>
+        <w:t xml:space="preserve">Keen Hearing (species; companion: Sensitive Ears).</w:t>
+      </w:r>
+      <w:r>
+        <w:t xml:space="preserve"> </w:t>
+      </w:r>
+      <w:r>
+        <w:rPr>
+          <w:bCs/>
+          <w:b/>
+        </w:rPr>
+        <w:t xml:space="preserve">Complication:</w:t>
+      </w:r>
+      <w:r>
+        <w:t xml:space="preserve"> </w:t>
+      </w:r>
+      <w:r>
+        <w:t xml:space="preserve">Someone Back Home; trigger: a message from home arrives.</w:t>
+      </w:r>
+    </w:p>
+    <w:p>
+      <w:pPr>
+        <w:numPr>
+          <w:ilvl w:val="0"/>
+          <w:numId w:val="1016"/>
+        </w:numPr>
+        <w:pStyle w:val="Compact"/>
+      </w:pPr>
+      <w:r>
+        <w:rPr>
+          <w:bCs/>
+          <w:b/>
+        </w:rPr>
+        <w:t xml:space="preserve">Why I serve:</w:t>
+      </w:r>
+      <w:r>
+        <w:t xml:space="preserve"> </w:t>
+      </w:r>
+      <w:r>
+        <w:t xml:space="preserve">To leave behind a past, a world, or a life that was too small for me.</w:t>
+      </w:r>
+      <w:r>
+        <w:t xml:space="preserve"> </w:t>
+      </w:r>
+      <w:r>
+        <w:rPr>
+          <w:bCs/>
+          <w:b/>
+        </w:rPr>
+        <w:t xml:space="preserve">Connection:</w:t>
+      </w:r>
+      <w:r>
+        <w:t xml:space="preserve"> </w:t>
+      </w:r>
+      <w:r>
         <w:t xml:space="preserve">Shares a secret with Lt. Sevek from a mission neither of them talks about.</w:t>
       </w:r>
     </w:p>
-    <w:bookmarkEnd w:id="75"/>
-    <w:bookmarkEnd w:id="76"/>
-    <w:bookmarkStart w:id="77" w:name="threats"/>
+    <w:bookmarkEnd w:id="78"/>
+    <w:bookmarkEnd w:id="79"/>
+    <w:bookmarkStart w:id="80" w:name="threats"/>
     <w:p>
       <w:pPr>
         <w:pStyle w:val="Heading1"/>
@@ -9288,8 +11430,8 @@
         <w:t xml:space="preserve">For a tougher version, add +1 to its targets and one box; for a weaker one, subtract. Starships use the ship tracks above: a Klingon battle cruiser has Shields 3, Hull 4, and Phasers 12 for its gunners.</w:t>
       </w:r>
     </w:p>
-    <w:bookmarkEnd w:id="77"/>
-    <w:bookmarkStart w:id="78" w:name="advantages"/>
+    <w:bookmarkEnd w:id="80"/>
+    <w:bookmarkStart w:id="81" w:name="advantages"/>
     <w:p>
       <w:pPr>
         <w:pStyle w:val="Heading1"/>
@@ -9895,8 +12037,8 @@
         </w:tc>
       </w:tr>
     </w:tbl>
-    <w:bookmarkEnd w:id="78"/>
-    <w:bookmarkStart w:id="92" w:name="species-advantages"/>
+    <w:bookmarkEnd w:id="81"/>
+    <w:bookmarkStart w:id="95" w:name="species-advantages"/>
     <w:p>
       <w:pPr>
         <w:pStyle w:val="Heading1"/>
@@ -9961,7 +12103,7 @@
         <w:t xml:space="preserve">A custom species advantage follows the same pattern: a narrow +2 or an ability with agreed limits, paired with a companion complication that has a clear trigger and a real consequence.</w:t>
       </w:r>
     </w:p>
-    <w:bookmarkStart w:id="79" w:name="human"/>
+    <w:bookmarkStart w:id="82" w:name="human"/>
     <w:p>
       <w:pPr>
         <w:pStyle w:val="Heading2"/>
@@ -10174,8 +12316,8 @@
         </w:tc>
       </w:tr>
     </w:tbl>
-    <w:bookmarkEnd w:id="79"/>
-    <w:bookmarkStart w:id="80" w:name="vulcan"/>
+    <w:bookmarkEnd w:id="82"/>
+    <w:bookmarkStart w:id="83" w:name="vulcan"/>
     <w:p>
       <w:pPr>
         <w:pStyle w:val="Heading2"/>
@@ -10450,8 +12592,8 @@
         </w:tc>
       </w:tr>
     </w:tbl>
-    <w:bookmarkEnd w:id="80"/>
-    <w:bookmarkStart w:id="81" w:name="andorian"/>
+    <w:bookmarkEnd w:id="83"/>
+    <w:bookmarkStart w:id="84" w:name="andorian"/>
     <w:p>
       <w:pPr>
         <w:pStyle w:val="Heading2"/>
@@ -10664,8 +12806,8 @@
         </w:tc>
       </w:tr>
     </w:tbl>
-    <w:bookmarkEnd w:id="81"/>
-    <w:bookmarkStart w:id="82" w:name="tellarite"/>
+    <w:bookmarkEnd w:id="84"/>
+    <w:bookmarkStart w:id="85" w:name="tellarite"/>
     <w:p>
       <w:pPr>
         <w:pStyle w:val="Heading2"/>
@@ -10878,8 +13020,8 @@
         </w:tc>
       </w:tr>
     </w:tbl>
-    <w:bookmarkEnd w:id="82"/>
-    <w:bookmarkStart w:id="83" w:name="aenar"/>
+    <w:bookmarkEnd w:id="85"/>
+    <w:bookmarkStart w:id="86" w:name="aenar"/>
     <w:p>
       <w:pPr>
         <w:pStyle w:val="Heading2"/>
@@ -11092,8 +13234,8 @@
         </w:tc>
       </w:tr>
     </w:tbl>
-    <w:bookmarkEnd w:id="83"/>
-    <w:bookmarkStart w:id="84" w:name="illyrian"/>
+    <w:bookmarkEnd w:id="86"/>
+    <w:bookmarkStart w:id="87" w:name="illyrian"/>
     <w:p>
       <w:pPr>
         <w:pStyle w:val="Heading2"/>
@@ -11306,8 +13448,8 @@
         </w:tc>
       </w:tr>
     </w:tbl>
-    <w:bookmarkEnd w:id="84"/>
-    <w:bookmarkStart w:id="85" w:name="lanthanite"/>
+    <w:bookmarkEnd w:id="87"/>
+    <w:bookmarkStart w:id="88" w:name="lanthanite"/>
     <w:p>
       <w:pPr>
         <w:pStyle w:val="Heading2"/>
@@ -11520,8 +13662,8 @@
         </w:tc>
       </w:tr>
     </w:tbl>
-    <w:bookmarkEnd w:id="85"/>
-    <w:bookmarkStart w:id="86" w:name="caitian"/>
+    <w:bookmarkEnd w:id="88"/>
+    <w:bookmarkStart w:id="89" w:name="caitian"/>
     <w:p>
       <w:pPr>
         <w:pStyle w:val="Heading2"/>
@@ -11734,8 +13876,8 @@
         </w:tc>
       </w:tr>
     </w:tbl>
-    <w:bookmarkEnd w:id="86"/>
-    <w:bookmarkStart w:id="87" w:name="aurelian"/>
+    <w:bookmarkEnd w:id="89"/>
+    <w:bookmarkStart w:id="90" w:name="aurelian"/>
     <w:p>
       <w:pPr>
         <w:pStyle w:val="Heading2"/>
@@ -11948,8 +14090,8 @@
         </w:tc>
       </w:tr>
     </w:tbl>
-    <w:bookmarkEnd w:id="87"/>
-    <w:bookmarkStart w:id="88" w:name="orion"/>
+    <w:bookmarkEnd w:id="90"/>
+    <w:bookmarkStart w:id="91" w:name="orion"/>
     <w:p>
       <w:pPr>
         <w:pStyle w:val="Heading2"/>
@@ -12162,8 +14304,8 @@
         </w:tc>
       </w:tr>
     </w:tbl>
-    <w:bookmarkEnd w:id="88"/>
-    <w:bookmarkStart w:id="89" w:name="denobulan"/>
+    <w:bookmarkEnd w:id="91"/>
+    <w:bookmarkStart w:id="92" w:name="denobulan"/>
     <w:p>
       <w:pPr>
         <w:pStyle w:val="Heading2"/>
@@ -12376,8 +14518,8 @@
         </w:tc>
       </w:tr>
     </w:tbl>
-    <w:bookmarkEnd w:id="89"/>
-    <w:bookmarkStart w:id="90" w:name="trill"/>
+    <w:bookmarkEnd w:id="92"/>
+    <w:bookmarkStart w:id="93" w:name="trill"/>
     <w:p>
       <w:pPr>
         <w:pStyle w:val="Heading2"/>
@@ -12598,8 +14740,8 @@
         </w:tc>
       </w:tr>
     </w:tbl>
-    <w:bookmarkEnd w:id="90"/>
-    <w:bookmarkStart w:id="91" w:name="saurian"/>
+    <w:bookmarkEnd w:id="93"/>
+    <w:bookmarkStart w:id="94" w:name="saurian"/>
     <w:p>
       <w:pPr>
         <w:pStyle w:val="Heading2"/>
@@ -12812,9 +14954,9 @@
         </w:tc>
       </w:tr>
     </w:tbl>
-    <w:bookmarkEnd w:id="91"/>
-    <w:bookmarkEnd w:id="92"/>
-    <w:bookmarkStart w:id="94" w:name="complications"/>
+    <w:bookmarkEnd w:id="94"/>
+    <w:bookmarkEnd w:id="95"/>
+    <w:bookmarkStart w:id="97" w:name="complications"/>
     <w:p>
       <w:pPr>
         <w:pStyle w:val="Heading1"/>
@@ -13428,7 +15570,7 @@
         </w:tc>
       </w:tr>
     </w:tbl>
-    <w:bookmarkStart w:id="93" w:name="using-and-revising-traits"/>
+    <w:bookmarkStart w:id="96" w:name="using-and-revising-traits"/>
     <w:p>
       <w:pPr>
         <w:pStyle w:val="Heading2"/>
@@ -13445,9 +15587,9 @@
         <w:t xml:space="preserve">General advantages and complications describe individual crew members and can suit any species when appropriate. A Vulcan might choose Mental Discipline as a general advantage; species advantages are the only traits tied to a species. At a mission milestone, revise a trait when events change the character. Custom advantages follow the same narrow +2 benefit; custom complications need a clear trigger and a meaningful, accepted consequence.</w:t>
       </w:r>
     </w:p>
-    <w:bookmarkEnd w:id="93"/>
-    <w:bookmarkEnd w:id="94"/>
-    <w:bookmarkStart w:id="98" w:name="quick-reference"/>
+    <w:bookmarkEnd w:id="96"/>
+    <w:bookmarkEnd w:id="97"/>
+    <w:bookmarkStart w:id="101" w:name="quick-reference"/>
     <w:p>
       <w:pPr>
         <w:pStyle w:val="Heading1"/>
@@ -13456,7 +15598,7 @@
         <w:t xml:space="preserve">Quick reference</w:t>
       </w:r>
     </w:p>
-    <w:bookmarkStart w:id="95" w:name="will-and-mental-resistance"/>
+    <w:bookmarkStart w:id="98" w:name="will-and-mental-resistance"/>
     <w:p>
       <w:pPr>
         <w:pStyle w:val="Heading2"/>
@@ -13489,8 +15631,8 @@
         <w:t xml:space="preserve">Will protects your resolve; Presence influences others. Leadership and Diplomacy still use Presence. Species adjustments may change your starting Will, but mental advantages apply only to their agreed, narrow circumstances.</w:t>
       </w:r>
     </w:p>
-    <w:bookmarkEnd w:id="95"/>
-    <w:bookmarkStart w:id="96" w:name="at-the-table"/>
+    <w:bookmarkEnd w:id="98"/>
+    <w:bookmarkStart w:id="99" w:name="at-the-table"/>
     <w:p>
       <w:pPr>
         <w:pStyle w:val="Heading2"/>
@@ -13503,7 +15645,7 @@
       <w:pPr>
         <w:numPr>
           <w:ilvl w:val="0"/>
-          <w:numId w:val="1016"/>
+          <w:numId w:val="1017"/>
         </w:numPr>
         <w:pStyle w:val="Compact"/>
       </w:pPr>
@@ -13515,7 +15657,7 @@
       <w:pPr>
         <w:numPr>
           <w:ilvl w:val="0"/>
-          <w:numId w:val="1016"/>
+          <w:numId w:val="1017"/>
         </w:numPr>
         <w:pStyle w:val="Compact"/>
       </w:pPr>
@@ -13527,7 +15669,7 @@
       <w:pPr>
         <w:numPr>
           <w:ilvl w:val="0"/>
-          <w:numId w:val="1016"/>
+          <w:numId w:val="1017"/>
         </w:numPr>
         <w:pStyle w:val="Compact"/>
       </w:pPr>
@@ -13539,7 +15681,7 @@
       <w:pPr>
         <w:numPr>
           <w:ilvl w:val="0"/>
-          <w:numId w:val="1016"/>
+          <w:numId w:val="1017"/>
         </w:numPr>
         <w:pStyle w:val="Compact"/>
       </w:pPr>
@@ -13551,7 +15693,7 @@
       <w:pPr>
         <w:numPr>
           <w:ilvl w:val="0"/>
-          <w:numId w:val="1016"/>
+          <w:numId w:val="1017"/>
         </w:numPr>
         <w:pStyle w:val="Compact"/>
       </w:pPr>
@@ -13559,8 +15701,8 @@
         <w:t xml:space="preserve">Apply the result and describe what changes.</w:t>
       </w:r>
     </w:p>
-    <w:bookmarkEnd w:id="96"/>
-    <w:bookmarkStart w:id="97" w:name="summary"/>
+    <w:bookmarkEnd w:id="99"/>
+    <w:bookmarkStart w:id="100" w:name="summary"/>
     <w:p>
       <w:pPr>
         <w:pStyle w:val="Heading2"/>
@@ -13785,8 +15927,8 @@
         <w:t xml:space="preserve">start each session with two. Spend one to reroll, reduce an injury by one box, or establish a plausible preparation. Earn one when an accepted complication, including a companion complication, creates a meaningful problem.</w:t>
       </w:r>
     </w:p>
-    <w:bookmarkEnd w:id="97"/>
-    <w:bookmarkEnd w:id="98"/>
+    <w:bookmarkEnd w:id="100"/>
+    <w:bookmarkEnd w:id="101"/>
     <w:sectPr/>
   </w:body>
 </w:document>
@@ -14139,7 +16281,34 @@
     <w:abstractNumId w:val="991"/>
   </w:num>
   <w:num w:numId="1010">
-    <w:abstractNumId w:val="991"/>
+    <w:abstractNumId w:val="99411"/>
+    <w:lvlOverride w:ilvl="0">
+      <w:startOverride w:val="1"/>
+    </w:lvlOverride>
+    <w:lvlOverride w:ilvl="1">
+      <w:startOverride w:val="1"/>
+    </w:lvlOverride>
+    <w:lvlOverride w:ilvl="2">
+      <w:startOverride w:val="1"/>
+    </w:lvlOverride>
+    <w:lvlOverride w:ilvl="3">
+      <w:startOverride w:val="1"/>
+    </w:lvlOverride>
+    <w:lvlOverride w:ilvl="4">
+      <w:startOverride w:val="1"/>
+    </w:lvlOverride>
+    <w:lvlOverride w:ilvl="5">
+      <w:startOverride w:val="1"/>
+    </w:lvlOverride>
+    <w:lvlOverride w:ilvl="6">
+      <w:startOverride w:val="1"/>
+    </w:lvlOverride>
+    <w:lvlOverride w:ilvl="7">
+      <w:startOverride w:val="1"/>
+    </w:lvlOverride>
+    <w:lvlOverride w:ilvl="8">
+      <w:startOverride w:val="1"/>
+    </w:lvlOverride>
   </w:num>
   <w:num w:numId="1011">
     <w:abstractNumId w:val="991"/>
@@ -14157,6 +16326,9 @@
     <w:abstractNumId w:val="991"/>
   </w:num>
   <w:num w:numId="1016">
+    <w:abstractNumId w:val="991"/>
+  </w:num>
+  <w:num w:numId="1017">
     <w:abstractNumId w:val="99411"/>
     <w:lvlOverride w:ilvl="0">
       <w:startOverride w:val="1"/>

</xml_diff>

<commit_message>
Track hand phaser power
Phasers now hold power (Type 1: 8, Type 2: 16, rifle: 30) and each setting
costs power (stun 1, heat/cut 1, kill 2, wide-beam stun 3, disintegrate 4).
The Duty station has a Phaser power panel with a meter, firing buttons,
spare cells, recharge, and overload; rolling Phasers with a hand weapon
picks a setting and spends its power (a Duty point reroll costs nothing).
The GM view shows each crew member's power. The guide gains a Phaser power
section and quick-reference line.

Co-Authored-By: Claude Opus 5.5 <noreply@anthropic.com>
Claude-Session: https://claude.ai/code/session_015SADCFzhKijkC2foUmXrpC
</commit_message>
<xml_diff>
--- a/uss-pelion/USS_Pelion_Players_Guide.docx
+++ b/uss-pelion/USS_Pelion_Players_Guide.docx
@@ -4580,7 +4580,7 @@
     </w:p>
     <w:bookmarkEnd w:id="48"/>
     <w:bookmarkEnd w:id="49"/>
-    <w:bookmarkStart w:id="56" w:name="personal-combat"/>
+    <w:bookmarkStart w:id="57" w:name="personal-combat"/>
     <w:p>
       <w:pPr>
         <w:pStyle w:val="Heading1"/>
@@ -5871,14 +5871,13 @@
       </w:r>
     </w:p>
     <w:bookmarkEnd w:id="55"/>
-    <w:bookmarkEnd w:id="56"/>
-    <w:bookmarkStart w:id="64" w:name="medical-care"/>
-    <w:p>
-      <w:pPr>
-        <w:pStyle w:val="Heading1"/>
-      </w:pPr>
-      <w:r>
-        <w:t xml:space="preserve">Medical care</w:t>
+    <w:bookmarkStart w:id="56" w:name="phaser-power"/>
+    <w:p>
+      <w:pPr>
+        <w:pStyle w:val="Heading2"/>
+      </w:pPr>
+      <w:r>
+        <w:t xml:space="preserve">Phaser power</w:t>
       </w:r>
     </w:p>
     <w:p>
@@ -5886,359 +5885,170 @@
         <w:pStyle w:val="FirstParagraph"/>
       </w:pPr>
       <w:r>
-        <w:t xml:space="preserve">Starfleet physicians in 2268 have advanced diagnostic scanners, potent pharmaceuticals, portable emergency equipment, and sophisticated sickbay facilities. Familiar injuries often respond quickly to treatment. Severe trauma, incompatible biology, missing supplies, and unidentified conditions still challenge an experienced doctor. The treatment values below are campaign rules inspired by the series, rather than numerical rules stated in canon.</w:t>
-      </w:r>
-    </w:p>
-    <w:bookmarkStart w:id="57" w:name="diagnosis-and-stabilization"/>
-    <w:p>
-      <w:pPr>
-        <w:pStyle w:val="Heading2"/>
-      </w:pPr>
-      <w:r>
-        <w:t xml:space="preserve">Diagnosis and stabilization</w:t>
-      </w:r>
-    </w:p>
-    <w:p>
-      <w:pPr>
-        <w:pStyle w:val="FirstParagraph"/>
-      </w:pPr>
-      <w:r>
-        <w:t xml:space="preserve">A medical scanner identifies ordinary injuries automatically. Roll Medicine when the diagnosis is uncertain, physiology is unfamiliar, or an urgent treatment decision has meaningful consequences. Routine established treatments also succeed automatically when qualified staff have sufficient time and facilities.</w:t>
-      </w:r>
-    </w:p>
-    <w:p>
-      <w:pPr>
-        <w:pStyle w:val="BodyText"/>
-      </w:pPr>
-      <w:r>
-        <w:t xml:space="preserve">Emergency stabilization takes one action and a successful Medicine roll with a medical kit. It prevents deterioration from the treated injury while the patient is protected from further harm, and it ends Dying. Stabilization alone removes no injury boxes. A patient at three boxes remains incapacitated until treatment clears a box.</w:t>
-      </w:r>
-    </w:p>
-    <w:bookmarkEnd w:id="57"/>
-    <w:bookmarkStart w:id="58" w:name="field-treatment"/>
-    <w:p>
-      <w:pPr>
-        <w:pStyle w:val="Heading2"/>
-      </w:pPr>
-      <w:r>
-        <w:t xml:space="preserve">Field treatment</w:t>
-      </w:r>
-    </w:p>
-    <w:p>
-      <w:pPr>
-        <w:pStyle w:val="FirstParagraph"/>
-      </w:pPr>
-      <w:r>
-        <w:t xml:space="preserve">With a medical kit and several uninterrupted minutes, successful Medicine removes one injury box. Success by 5 or more removes two. Each injury receives one field-treatment attempt, even if that attempt fails; further attempts require changed circumstances such as better equipment, new diagnostic information, or access to sickbay. New injuries can receive their own treatment, but cannot justify treating an old injury repeatedly.</w:t>
-      </w:r>
-    </w:p>
-    <w:bookmarkEnd w:id="58"/>
-    <w:bookmarkStart w:id="59" w:name="sickbay-treatment"/>
-    <w:p>
-      <w:pPr>
-        <w:pStyle w:val="Heading2"/>
-      </w:pPr>
-      <w:r>
-        <w:t xml:space="preserve">Sickbay treatment</w:t>
-      </w:r>
-    </w:p>
-    <w:p>
-      <w:pPr>
-        <w:pStyle w:val="FirstParagraph"/>
-      </w:pPr>
-      <w:r>
-        <w:t xml:space="preserve">A functioning, equipped sickbay grants +2 to Medicine for diagnosis and treatment. A successful treatment removes two injury boxes; success by 5 or more removes three. Allow the time the procedure requires rather than completing surgery in one combat action. Sickbay care can follow field treatment. Do not repeat an unsuccessful procedure without a meaningful change in the situation.</w:t>
-      </w:r>
-    </w:p>
-    <w:p>
-      <w:pPr>
-        <w:pStyle w:val="BodyText"/>
-      </w:pPr>
-      <w:r>
-        <w:t xml:space="preserve">Removing injury boxes removes their associated penalties, but major organ damage, severe burns, and complex internal trauma can still require a procedure and recovery period set by the GM. The physician determines whether the patient is fit for duty. Pain suppression does not itself heal an injury. Stun normally wears off at the end of the scene; prolonged unconsciousness requires assessment.</w:t>
-      </w:r>
-    </w:p>
-    <w:bookmarkEnd w:id="59"/>
-    <w:bookmarkStart w:id="60" w:name="natural-recovery"/>
-    <w:p>
-      <w:pPr>
-        <w:pStyle w:val="Heading2"/>
-      </w:pPr>
-      <w:r>
-        <w:t xml:space="preserve">Natural recovery</w:t>
-      </w:r>
-    </w:p>
-    <w:p>
-      <w:pPr>
-        <w:pStyle w:val="FirstParagraph"/>
-      </w:pPr>
-      <w:r>
-        <w:t xml:space="preserve">Injuries also heal with time. Each</w:t>
-      </w:r>
-      <w:r>
-        <w:t xml:space="preserve"> </w:t>
-      </w:r>
-      <w:r>
-        <w:rPr>
-          <w:bCs/>
-          <w:b/>
-        </w:rPr>
-        <w:t xml:space="preserve">full day of rest</w:t>
-      </w:r>
-      <w:r>
-        <w:t xml:space="preserve"> </w:t>
-      </w:r>
-      <w:r>
-        <w:t xml:space="preserve">clears one injury box. Rest means light duty at most: no combat, no away missions, nothing strenuous. A day spent working hard or fighting clears nothing.</w:t>
-      </w:r>
-    </w:p>
-    <w:p>
-      <w:pPr>
-        <w:numPr>
-          <w:ilvl w:val="0"/>
-          <w:numId w:val="1009"/>
-        </w:numPr>
-        <w:pStyle w:val="Compact"/>
-      </w:pPr>
-      <w:r>
-        <w:rPr>
-          <w:bCs/>
-          <w:b/>
-        </w:rPr>
-        <w:t xml:space="preserve">At three boxes, rest alone clears nothing.</w:t>
-      </w:r>
-      <w:r>
-        <w:t xml:space="preserve"> </w:t>
-      </w:r>
-      <w:r>
-        <w:t xml:space="preserve">An Incapacitated patient needs treatment (field care or sickbay) to clear the first box; after that, rest takes over.</w:t>
-      </w:r>
-    </w:p>
-    <w:p>
-      <w:pPr>
-        <w:numPr>
-          <w:ilvl w:val="0"/>
-          <w:numId w:val="1009"/>
-        </w:numPr>
-        <w:pStyle w:val="Compact"/>
-      </w:pPr>
-      <w:r>
-        <w:rPr>
-          <w:bCs/>
-          <w:b/>
-        </w:rPr>
-        <w:t xml:space="preserve">Rest and medicine combine.</w:t>
-      </w:r>
-      <w:r>
-        <w:t xml:space="preserve"> </w:t>
-      </w:r>
-      <w:r>
-        <w:t xml:space="preserve">Treatment clears boxes immediately; rest clears what remains, one box a day.</w:t>
-      </w:r>
-    </w:p>
-    <w:p>
-      <w:pPr>
-        <w:numPr>
-          <w:ilvl w:val="0"/>
-          <w:numId w:val="1009"/>
-        </w:numPr>
-        <w:pStyle w:val="Compact"/>
-      </w:pPr>
-      <w:r>
-        <w:rPr>
-          <w:bCs/>
-          <w:b/>
-        </w:rPr>
-        <w:t xml:space="preserve">Serious trauma takes longer.</w:t>
-      </w:r>
-      <w:r>
-        <w:t xml:space="preserve"> </w:t>
-      </w:r>
-      <w:r>
-        <w:t xml:space="preserve">For major organ damage, severe burns, or complex internal trauma, the GM can require a set recovery period before rest clears anything, and the ship’s physician decides when the patient is fit for duty.</w:t>
-      </w:r>
-    </w:p>
-    <w:p>
-      <w:pPr>
-        <w:pStyle w:val="FirstParagraph"/>
-      </w:pPr>
-      <w:r>
-        <w:rPr>
-          <w:iCs/>
-          <w:i/>
-        </w:rPr>
-        <w:t xml:space="preserve">Example:</w:t>
-      </w:r>
-      <w:r>
-        <w:t xml:space="preserve"> </w:t>
-      </w:r>
-      <w:r>
-        <w:t xml:space="preserve">Ensign Reyes ends a mission Seriously wounded (two boxes). Sickbay is busy with worse cases, so Reyes rests in quarters: one box clears the first day and the second the next, and Reyes is back on duty on the third day.</w:t>
-      </w:r>
-    </w:p>
-    <w:bookmarkEnd w:id="60"/>
-    <w:bookmarkStart w:id="61" w:name="alien-medicine-and-limits"/>
-    <w:p>
-      <w:pPr>
-        <w:pStyle w:val="Heading2"/>
-      </w:pPr>
-      <w:r>
-        <w:t xml:space="preserve">Alien medicine and limits</w:t>
-      </w:r>
-    </w:p>
-    <w:p>
-      <w:pPr>
-        <w:pStyle w:val="FirstParagraph"/>
-      </w:pPr>
-      <w:r>
-        <w:t xml:space="preserve">Unknown illness or physiology requires discovering the cause and a suitable treatment before boxes can be restored. Medicine can receive assistance from Life Sciences, Sensors, or Computers. Existing assistance limits apply. Missing essential equipment or incompatible supplies can prevent a procedure. Disintegration and other unsurvivable injuries cannot be reversed by an ordinary Medicine roll.</w:t>
-      </w:r>
-    </w:p>
-    <w:p>
-      <w:pPr>
-        <w:pStyle w:val="BodyText"/>
-      </w:pPr>
-      <w:r>
-        <w:t xml:space="preserve">Crew of other species may need care suited to their biology. An Alien Physiology Specialist, or a physician with access to the right species data, keeps that care from becoming guesswork.</w:t>
-      </w:r>
-    </w:p>
-    <w:bookmarkEnd w:id="61"/>
-    <w:bookmarkStart w:id="63" w:name="examples-from-the-original-series"/>
-    <w:p>
-      <w:pPr>
-        <w:pStyle w:val="Heading2"/>
-      </w:pPr>
-      <w:r>
-        <w:t xml:space="preserve">Examples from the original series</w:t>
-      </w:r>
-    </w:p>
-    <w:p>
-      <w:pPr>
-        <w:pStyle w:val="FirstParagraph"/>
-      </w:pPr>
-      <w:r>
-        <w:rPr>
-          <w:iCs/>
-          <w:i/>
-        </w:rPr>
-        <w:t xml:space="preserve">Journey to Babel:</w:t>
-      </w:r>
-      <w:r>
-        <w:t xml:space="preserve"> </w:t>
-      </w:r>
-      <w:r>
-        <w:t xml:space="preserve">McCoy performs complex surgery on Sarek during a ship crisis; compatible blood and postoperative care remain important.</w:t>
-      </w:r>
-      <w:r>
-        <w:t xml:space="preserve"> </w:t>
-      </w:r>
-      <w:r>
-        <w:rPr>
-          <w:iCs/>
-          <w:i/>
-        </w:rPr>
-        <w:t xml:space="preserve">The Devil in the Dark:</w:t>
-      </w:r>
-      <w:r>
-        <w:t xml:space="preserve"> </w:t>
-      </w:r>
-      <w:r>
-        <w:t xml:space="preserve">McCoy improvises a treatment suited to the Horta’s unusual biology.</w:t>
-      </w:r>
-      <w:r>
-        <w:t xml:space="preserve"> </w:t>
-      </w:r>
-      <w:r>
-        <w:rPr>
-          <w:iCs/>
-          <w:i/>
-        </w:rPr>
-        <w:t xml:space="preserve">Miri:</w:t>
-      </w:r>
-      <w:r>
-        <w:t xml:space="preserve"> </w:t>
-      </w:r>
-      <w:r>
-        <w:t xml:space="preserve">diagnosing an unfamiliar disease and establishing a safe treatment require investigation. These stories support powerful medicine whose limits come from the medical problem and available resources.</w:t>
-      </w:r>
-    </w:p>
-    <w:p>
-      <w:pPr>
-        <w:pStyle w:val="BodyText"/>
-      </w:pPr>
-      <w:r>
-        <w:t xml:space="preserve">Canon reference: StarTrek.com,</w:t>
-      </w:r>
-      <w:r>
-        <w:t xml:space="preserve"> </w:t>
-      </w:r>
-      <w:r>
-        <w:t xml:space="preserve">“</w:t>
-      </w:r>
-      <w:r>
-        <w:t xml:space="preserve">8 Times Leonard</w:t>
-      </w:r>
-      <w:r>
-        <w:t xml:space="preserve"> </w:t>
-      </w:r>
-      <w:r>
-        <w:t xml:space="preserve">‘</w:t>
-      </w:r>
-      <w:r>
-        <w:t xml:space="preserve">Bones</w:t>
-      </w:r>
-      <w:r>
-        <w:t xml:space="preserve">’</w:t>
-      </w:r>
-      <w:r>
-        <w:t xml:space="preserve"> </w:t>
-      </w:r>
-      <w:r>
-        <w:t xml:space="preserve">McCoy’s Medical Knowledge Saved the Day.</w:t>
-      </w:r>
-      <w:r>
-        <w:t xml:space="preserve">”</w:t>
-      </w:r>
-      <w:r>
-        <w:t xml:space="preserve"> </w:t>
-      </w:r>
-      <w:hyperlink r:id="rId62">
-        <w:r>
-          <w:rPr>
-            <w:rStyle w:val="Hyperlink"/>
-          </w:rPr>
-          <w:t xml:space="preserve">https://www.startrek.com/news/mccoys-medical-knowledge-saved-the-day</w:t>
-        </w:r>
-      </w:hyperlink>
-    </w:p>
-    <w:bookmarkEnd w:id="63"/>
-    <w:bookmarkEnd w:id="64"/>
-    <w:bookmarkStart w:id="69" w:name="duty-points-and-bridge-duty"/>
-    <w:p>
-      <w:pPr>
-        <w:pStyle w:val="Heading1"/>
-      </w:pPr>
-      <w:r>
-        <w:t xml:space="preserve">Duty points and bridge duty</w:t>
-      </w:r>
-    </w:p>
-    <w:bookmarkStart w:id="65" w:name="using-duty-points"/>
-    <w:p>
-      <w:pPr>
-        <w:pStyle w:val="Heading2"/>
-      </w:pPr>
-      <w:r>
-        <w:t xml:space="preserve">Using Duty points</w:t>
-      </w:r>
-    </w:p>
-    <w:p>
-      <w:pPr>
-        <w:pStyle w:val="FirstParagraph"/>
-      </w:pPr>
-      <w:r>
-        <w:t xml:space="preserve">Begin each session with two Duty points; unused points do not carry into the next session. Spend no more than one point on a single roll or injury event. Duty points belong to your character and cannot be transferred.</w:t>
-      </w:r>
-    </w:p>
+        <w:t xml:space="preserve">Hand phasers run on power cells, and every shot draws on them. This is a campaign rule; the GM tracks opponents’ weapons loosely.</w:t>
+      </w:r>
+    </w:p>
+    <w:tbl>
+      <w:tblPr>
+        <w:tblStyle w:val="Table"/>
+        <w:tblW w:type="auto" w:w="0"/>
+        <w:tblLook w:firstRow="1" w:lastRow="0" w:firstColumn="0" w:lastColumn="0" w:noHBand="0" w:noVBand="0" w:val="0020"/>
+        <w:jc w:val="start"/>
+        <w:tblBorders>
+          <w:top w:val="single" w:sz="4" w:color="B8C2D3"/>
+          <w:left w:val="single" w:sz="4" w:color="B8C2D3"/>
+          <w:bottom w:val="single" w:sz="4" w:color="B8C2D3"/>
+          <w:right w:val="single" w:sz="4" w:color="B8C2D3"/>
+          <w:insideH w:val="single" w:sz="4" w:color="B8C2D3"/>
+          <w:insideV w:val="single" w:sz="4" w:color="B8C2D3"/>
+        </w:tblBorders>
+      </w:tblPr>
+      <w:tblGrid>
+        <w:gridCol w:w="3960"/>
+        <w:gridCol w:w="3960"/>
+      </w:tblGrid>
+      <w:tr>
+        <w:trPr>
+          <w:tblHeader w:val="true"/>
+        </w:trPr>
+        <w:tc>
+          <w:tcPr>
+            <w:shd w:val="clear" w:fill="E9EEF6"/>
+          </w:tcPr>
+          <w:p>
+            <w:pPr>
+              <w:pStyle w:val="Compact"/>
+              <w:jc w:val="left"/>
+            </w:pPr>
+            <w:r>
+              <w:rPr>
+                <w:b/>
+                <w:sz w:val="19"/>
+              </w:rPr>
+              <w:t xml:space="preserve">Phaser</w:t>
+            </w:r>
+          </w:p>
+        </w:tc>
+        <w:tc>
+          <w:tcPr>
+            <w:shd w:val="clear" w:fill="E9EEF6"/>
+          </w:tcPr>
+          <w:p>
+            <w:pPr>
+              <w:pStyle w:val="Compact"/>
+              <w:jc w:val="left"/>
+            </w:pPr>
+            <w:r>
+              <w:rPr>
+                <w:b/>
+                <w:sz w:val="19"/>
+              </w:rPr>
+              <w:t xml:space="preserve">Power</w:t>
+            </w:r>
+          </w:p>
+        </w:tc>
+      </w:tr>
+      <w:tr>
+        <w:tc>
+          <w:tcPr/>
+          <w:p>
+            <w:pPr>
+              <w:pStyle w:val="Compact"/>
+              <w:jc w:val="left"/>
+            </w:pPr>
+            <w:r>
+              <w:rPr>
+                <w:b/>
+                <w:sz w:val="19"/>
+              </w:rPr>
+              <w:t xml:space="preserve">Type 1 hand phaser</w:t>
+            </w:r>
+          </w:p>
+        </w:tc>
+        <w:tc>
+          <w:tcPr/>
+          <w:p>
+            <w:pPr>
+              <w:pStyle w:val="Compact"/>
+              <w:jc w:val="left"/>
+            </w:pPr>
+            <w:r>
+              <w:rPr>
+                <w:sz w:val="19"/>
+              </w:rPr>
+              <w:t xml:space="preserve">8</w:t>
+            </w:r>
+          </w:p>
+        </w:tc>
+      </w:tr>
+      <w:tr>
+        <w:tc>
+          <w:tcPr/>
+          <w:p>
+            <w:pPr>
+              <w:pStyle w:val="Compact"/>
+              <w:jc w:val="left"/>
+            </w:pPr>
+            <w:r>
+              <w:rPr>
+                <w:b/>
+                <w:sz w:val="19"/>
+              </w:rPr>
+              <w:t xml:space="preserve">Type 2 phaser pistol</w:t>
+            </w:r>
+          </w:p>
+        </w:tc>
+        <w:tc>
+          <w:tcPr/>
+          <w:p>
+            <w:pPr>
+              <w:pStyle w:val="Compact"/>
+              <w:jc w:val="left"/>
+            </w:pPr>
+            <w:r>
+              <w:rPr>
+                <w:sz w:val="19"/>
+              </w:rPr>
+              <w:t xml:space="preserve">16</w:t>
+            </w:r>
+          </w:p>
+        </w:tc>
+      </w:tr>
+      <w:tr>
+        <w:tc>
+          <w:tcPr/>
+          <w:p>
+            <w:pPr>
+              <w:pStyle w:val="Compact"/>
+              <w:jc w:val="left"/>
+            </w:pPr>
+            <w:r>
+              <w:rPr>
+                <w:b/>
+                <w:sz w:val="19"/>
+              </w:rPr>
+              <w:t xml:space="preserve">Phaser rifle</w:t>
+            </w:r>
+          </w:p>
+        </w:tc>
+        <w:tc>
+          <w:tcPr/>
+          <w:p>
+            <w:pPr>
+              <w:pStyle w:val="Compact"/>
+              <w:jc w:val="left"/>
+            </w:pPr>
+            <w:r>
+              <w:rPr>
+                <w:sz w:val="19"/>
+              </w:rPr>
+              <w:t xml:space="preserve">30</w:t>
+            </w:r>
+          </w:p>
+        </w:tc>
+      </w:tr>
+    </w:tbl>
+    <w:p/>
     <w:tbl>
       <w:tblPr>
         <w:tblStyle w:val="Table"/>
@@ -6276,7 +6086,7 @@
                 <w:b/>
                 <w:sz w:val="19"/>
               </w:rPr>
-              <w:t xml:space="preserve">Spend one point to</w:t>
+              <w:t xml:space="preserve">Setting</w:t>
             </w:r>
           </w:p>
         </w:tc>
@@ -6294,106 +6104,172 @@
                 <w:b/>
                 <w:sz w:val="19"/>
               </w:rPr>
-              <w:t xml:space="preserve">Timing and limits</w:t>
-            </w:r>
-          </w:p>
-        </w:tc>
-      </w:tr>
-      <w:tr>
-        <w:tc>
-          <w:tcPr/>
-          <w:p>
-            <w:pPr>
-              <w:pStyle w:val="Compact"/>
-              <w:jc w:val="left"/>
-            </w:pPr>
-            <w:r>
-              <w:rPr>
-                <w:b/>
-                <w:sz w:val="19"/>
-              </w:rPr>
-              <w:t xml:space="preserve">Reroll your own roll</w:t>
-            </w:r>
-          </w:p>
-        </w:tc>
-        <w:tc>
-          <w:tcPr/>
-          <w:p>
-            <w:pPr>
-              <w:pStyle w:val="Compact"/>
-              <w:jc w:val="left"/>
-            </w:pPr>
-            <w:r>
-              <w:rPr>
-                <w:sz w:val="19"/>
-              </w:rPr>
-              <w:t xml:space="preserve">Declare after seeing the result but before its consequences are resolved. Keep the second result, even if worse.</w:t>
-            </w:r>
-          </w:p>
-        </w:tc>
-      </w:tr>
-      <w:tr>
-        <w:tc>
-          <w:tcPr/>
-          <w:p>
-            <w:pPr>
-              <w:pStyle w:val="Compact"/>
-              <w:jc w:val="left"/>
-            </w:pPr>
-            <w:r>
-              <w:rPr>
-                <w:b/>
-                <w:sz w:val="19"/>
-              </w:rPr>
-              <w:t xml:space="preserve">Reduce an injury by one box</w:t>
-            </w:r>
-          </w:p>
-        </w:tc>
-        <w:tc>
-          <w:tcPr/>
-          <w:p>
-            <w:pPr>
-              <w:pStyle w:val="Compact"/>
-              <w:jc w:val="left"/>
-            </w:pPr>
-            <w:r>
-              <w:rPr>
-                <w:sz w:val="19"/>
-              </w:rPr>
-              <w:t xml:space="preserve">Declare when a hit would mark boxes, before applying them. Does not prevent disintegration or another hazard that bypasses the injury track.</w:t>
-            </w:r>
-          </w:p>
-        </w:tc>
-      </w:tr>
-      <w:tr>
-        <w:tc>
-          <w:tcPr/>
-          <w:p>
-            <w:pPr>
-              <w:pStyle w:val="Compact"/>
-              <w:jc w:val="left"/>
-            </w:pPr>
-            <w:r>
-              <w:rPr>
-                <w:b/>
-                <w:sz w:val="19"/>
-              </w:rPr>
-              <w:t xml:space="preserve">Establish a small preparation</w:t>
-            </w:r>
-          </w:p>
-        </w:tc>
-        <w:tc>
-          <w:tcPr/>
-          <w:p>
-            <w:pPr>
-              <w:pStyle w:val="Compact"/>
-              <w:jc w:val="left"/>
-            </w:pPr>
-            <w:r>
-              <w:rPr>
-                <w:sz w:val="19"/>
-              </w:rPr>
-              <w:t xml:space="preserve">Propose a plausible detail, such as having brought a field kit. GM approval is required; it cannot contradict established facts or solve the mission outright.</w:t>
+              <w:t xml:space="preserve">Power per use</w:t>
+            </w:r>
+          </w:p>
+        </w:tc>
+      </w:tr>
+      <w:tr>
+        <w:tc>
+          <w:tcPr/>
+          <w:p>
+            <w:pPr>
+              <w:pStyle w:val="Compact"/>
+              <w:jc w:val="left"/>
+            </w:pPr>
+            <w:r>
+              <w:rPr>
+                <w:b/>
+                <w:sz w:val="19"/>
+              </w:rPr>
+              <w:t xml:space="preserve">Stun</w:t>
+            </w:r>
+          </w:p>
+        </w:tc>
+        <w:tc>
+          <w:tcPr/>
+          <w:p>
+            <w:pPr>
+              <w:pStyle w:val="Compact"/>
+              <w:jc w:val="left"/>
+            </w:pPr>
+            <w:r>
+              <w:rPr>
+                <w:sz w:val="19"/>
+              </w:rPr>
+              <w:t xml:space="preserve">1</w:t>
+            </w:r>
+          </w:p>
+        </w:tc>
+      </w:tr>
+      <w:tr>
+        <w:tc>
+          <w:tcPr/>
+          <w:p>
+            <w:pPr>
+              <w:pStyle w:val="Compact"/>
+              <w:jc w:val="left"/>
+            </w:pPr>
+            <w:r>
+              <w:rPr>
+                <w:b/>
+                <w:sz w:val="19"/>
+              </w:rPr>
+              <w:t xml:space="preserve">Heat or cut</w:t>
+            </w:r>
+          </w:p>
+        </w:tc>
+        <w:tc>
+          <w:tcPr/>
+          <w:p>
+            <w:pPr>
+              <w:pStyle w:val="Compact"/>
+              <w:jc w:val="left"/>
+            </w:pPr>
+            <w:r>
+              <w:rPr>
+                <w:sz w:val="19"/>
+              </w:rPr>
+              <w:t xml:space="preserve">1 per use as a tool</w:t>
+            </w:r>
+          </w:p>
+        </w:tc>
+      </w:tr>
+      <w:tr>
+        <w:tc>
+          <w:tcPr/>
+          <w:p>
+            <w:pPr>
+              <w:pStyle w:val="Compact"/>
+              <w:jc w:val="left"/>
+            </w:pPr>
+            <w:r>
+              <w:rPr>
+                <w:b/>
+                <w:sz w:val="19"/>
+              </w:rPr>
+              <w:t xml:space="preserve">Kill</w:t>
+            </w:r>
+          </w:p>
+        </w:tc>
+        <w:tc>
+          <w:tcPr/>
+          <w:p>
+            <w:pPr>
+              <w:pStyle w:val="Compact"/>
+              <w:jc w:val="left"/>
+            </w:pPr>
+            <w:r>
+              <w:rPr>
+                <w:sz w:val="19"/>
+              </w:rPr>
+              <w:t xml:space="preserve">2</w:t>
+            </w:r>
+          </w:p>
+        </w:tc>
+      </w:tr>
+      <w:tr>
+        <w:tc>
+          <w:tcPr/>
+          <w:p>
+            <w:pPr>
+              <w:pStyle w:val="Compact"/>
+              <w:jc w:val="left"/>
+            </w:pPr>
+            <w:r>
+              <w:rPr>
+                <w:b/>
+                <w:sz w:val="19"/>
+              </w:rPr>
+              <w:t xml:space="preserve">Wide-beam stun (everyone in a small area; each target makes the stun roll)</w:t>
+            </w:r>
+          </w:p>
+        </w:tc>
+        <w:tc>
+          <w:tcPr/>
+          <w:p>
+            <w:pPr>
+              <w:pStyle w:val="Compact"/>
+              <w:jc w:val="left"/>
+            </w:pPr>
+            <w:r>
+              <w:rPr>
+                <w:sz w:val="19"/>
+              </w:rPr>
+              <w:t xml:space="preserve">3</w:t>
+            </w:r>
+          </w:p>
+        </w:tc>
+      </w:tr>
+      <w:tr>
+        <w:tc>
+          <w:tcPr/>
+          <w:p>
+            <w:pPr>
+              <w:pStyle w:val="Compact"/>
+              <w:jc w:val="left"/>
+            </w:pPr>
+            <w:r>
+              <w:rPr>
+                <w:b/>
+                <w:sz w:val="19"/>
+              </w:rPr>
+              <w:t xml:space="preserve">Disintegrate (when the GM allows it)</w:t>
+            </w:r>
+          </w:p>
+        </w:tc>
+        <w:tc>
+          <w:tcPr/>
+          <w:p>
+            <w:pPr>
+              <w:pStyle w:val="Compact"/>
+              <w:jc w:val="left"/>
+            </w:pPr>
+            <w:r>
+              <w:rPr>
+                <w:sz w:val="19"/>
+              </w:rPr>
+              <w:t xml:space="preserve">4</w:t>
             </w:r>
           </w:p>
         </w:tc>
@@ -6401,38 +6277,442 @@
     </w:tbl>
     <w:p>
       <w:pPr>
-        <w:pStyle w:val="BodyText"/>
-      </w:pPr>
-      <w:r>
-        <w:t xml:space="preserve">Gain one point when one of your complications creates a meaningful problem you accept. This includes a companion complication from a species advantage. The GM offers or approves the award. You can decline the proposed complication without a penalty. Repeating a harmless habit does not earn points.</w:t>
-      </w:r>
-    </w:p>
-    <w:p>
-      <w:pPr>
-        <w:pStyle w:val="BodyText"/>
-      </w:pPr>
+        <w:numPr>
+          <w:ilvl w:val="0"/>
+          <w:numId w:val="1009"/>
+        </w:numPr>
+        <w:pStyle w:val="Compact"/>
+      </w:pPr>
+      <w:r>
+        <w:rPr>
+          <w:bCs/>
+          <w:b/>
+        </w:rPr>
+        <w:t xml:space="preserve">Firing spends power whether the shot hits or misses.</w:t>
+      </w:r>
+      <w:r>
+        <w:t xml:space="preserve"> </w:t>
+      </w:r>
+      <w:r>
+        <w:t xml:space="preserve">A Duty point reroll repeats the same shot and costs nothing extra.</w:t>
+      </w:r>
+    </w:p>
+    <w:p>
+      <w:pPr>
+        <w:numPr>
+          <w:ilvl w:val="0"/>
+          <w:numId w:val="1009"/>
+        </w:numPr>
+        <w:pStyle w:val="Compact"/>
+      </w:pPr>
+      <w:r>
+        <w:rPr>
+          <w:bCs/>
+          <w:b/>
+        </w:rPr>
+        <w:t xml:space="preserve">A drained phaser won’t fire.</w:t>
+      </w:r>
+      <w:r>
+        <w:t xml:space="preserve"> </w:t>
+      </w:r>
+      <w:r>
+        <w:t xml:space="preserve">Swap in a spare power cell (one action) to refill it, or recharge it fully in the ship’s armory between missions. Having packed a spare cell is a good use of a Duty point’s</w:t>
+      </w:r>
+      <w:r>
+        <w:t xml:space="preserve"> </w:t>
+      </w:r>
       <w:r>
         <w:rPr>
           <w:iCs/>
           <w:i/>
         </w:rPr>
+        <w:t xml:space="preserve">small preparation</w:t>
+      </w:r>
+      <w:r>
+        <w:t xml:space="preserve">.</w:t>
+      </w:r>
+    </w:p>
+    <w:p>
+      <w:pPr>
+        <w:numPr>
+          <w:ilvl w:val="0"/>
+          <w:numId w:val="1009"/>
+        </w:numPr>
+        <w:pStyle w:val="Compact"/>
+      </w:pPr>
+      <w:r>
+        <w:rPr>
+          <w:bCs/>
+          <w:b/>
+        </w:rPr>
+        <w:t xml:space="preserve">Overload.</w:t>
+      </w:r>
+      <w:r>
+        <w:t xml:space="preserve"> </w:t>
+      </w:r>
+      <w:r>
+        <w:t xml:space="preserve">A phaser with at least 4 power left can be set to overload: it whines for a round and explodes at the end of the next round, as an explosion (1 box to everyone nearby, 2 at the centre). The phaser is destroyed.</w:t>
+      </w:r>
+    </w:p>
+    <w:bookmarkEnd w:id="56"/>
+    <w:bookmarkEnd w:id="57"/>
+    <w:bookmarkStart w:id="65" w:name="medical-care"/>
+    <w:p>
+      <w:pPr>
+        <w:pStyle w:val="Heading1"/>
+      </w:pPr>
+      <w:r>
+        <w:t xml:space="preserve">Medical care</w:t>
+      </w:r>
+    </w:p>
+    <w:p>
+      <w:pPr>
+        <w:pStyle w:val="FirstParagraph"/>
+      </w:pPr>
+      <w:r>
+        <w:t xml:space="preserve">Starfleet physicians in 2268 have advanced diagnostic scanners, potent pharmaceuticals, portable emergency equipment, and sophisticated sickbay facilities. Familiar injuries often respond quickly to treatment. Severe trauma, incompatible biology, missing supplies, and unidentified conditions still challenge an experienced doctor. The treatment values below are campaign rules inspired by the series, rather than numerical rules stated in canon.</w:t>
+      </w:r>
+    </w:p>
+    <w:bookmarkStart w:id="58" w:name="diagnosis-and-stabilization"/>
+    <w:p>
+      <w:pPr>
+        <w:pStyle w:val="Heading2"/>
+      </w:pPr>
+      <w:r>
+        <w:t xml:space="preserve">Diagnosis and stabilization</w:t>
+      </w:r>
+    </w:p>
+    <w:p>
+      <w:pPr>
+        <w:pStyle w:val="FirstParagraph"/>
+      </w:pPr>
+      <w:r>
+        <w:t xml:space="preserve">A medical scanner identifies ordinary injuries automatically. Roll Medicine when the diagnosis is uncertain, physiology is unfamiliar, or an urgent treatment decision has meaningful consequences. Routine established treatments also succeed automatically when qualified staff have sufficient time and facilities.</w:t>
+      </w:r>
+    </w:p>
+    <w:p>
+      <w:pPr>
+        <w:pStyle w:val="BodyText"/>
+      </w:pPr>
+      <w:r>
+        <w:t xml:space="preserve">Emergency stabilization takes one action and a successful Medicine roll with a medical kit. It prevents deterioration from the treated injury while the patient is protected from further harm, and it ends Dying. Stabilization alone removes no injury boxes. A patient at three boxes remains incapacitated until treatment clears a box.</w:t>
+      </w:r>
+    </w:p>
+    <w:bookmarkEnd w:id="58"/>
+    <w:bookmarkStart w:id="59" w:name="field-treatment"/>
+    <w:p>
+      <w:pPr>
+        <w:pStyle w:val="Heading2"/>
+      </w:pPr>
+      <w:r>
+        <w:t xml:space="preserve">Field treatment</w:t>
+      </w:r>
+    </w:p>
+    <w:p>
+      <w:pPr>
+        <w:pStyle w:val="FirstParagraph"/>
+      </w:pPr>
+      <w:r>
+        <w:t xml:space="preserve">With a medical kit and several uninterrupted minutes, successful Medicine removes one injury box. Success by 5 or more removes two. Each injury receives one field-treatment attempt, even if that attempt fails; further attempts require changed circumstances such as better equipment, new diagnostic information, or access to sickbay. New injuries can receive their own treatment, but cannot justify treating an old injury repeatedly.</w:t>
+      </w:r>
+    </w:p>
+    <w:bookmarkEnd w:id="59"/>
+    <w:bookmarkStart w:id="60" w:name="sickbay-treatment"/>
+    <w:p>
+      <w:pPr>
+        <w:pStyle w:val="Heading2"/>
+      </w:pPr>
+      <w:r>
+        <w:t xml:space="preserve">Sickbay treatment</w:t>
+      </w:r>
+    </w:p>
+    <w:p>
+      <w:pPr>
+        <w:pStyle w:val="FirstParagraph"/>
+      </w:pPr>
+      <w:r>
+        <w:t xml:space="preserve">A functioning, equipped sickbay grants +2 to Medicine for diagnosis and treatment. A successful treatment removes two injury boxes; success by 5 or more removes three. Allow the time the procedure requires rather than completing surgery in one combat action. Sickbay care can follow field treatment. Do not repeat an unsuccessful procedure without a meaningful change in the situation.</w:t>
+      </w:r>
+    </w:p>
+    <w:p>
+      <w:pPr>
+        <w:pStyle w:val="BodyText"/>
+      </w:pPr>
+      <w:r>
+        <w:t xml:space="preserve">Removing injury boxes removes their associated penalties, but major organ damage, severe burns, and complex internal trauma can still require a procedure and recovery period set by the GM. The physician determines whether the patient is fit for duty. Pain suppression does not itself heal an injury. Stun normally wears off at the end of the scene; prolonged unconsciousness requires assessment.</w:t>
+      </w:r>
+    </w:p>
+    <w:bookmarkEnd w:id="60"/>
+    <w:bookmarkStart w:id="61" w:name="natural-recovery"/>
+    <w:p>
+      <w:pPr>
+        <w:pStyle w:val="Heading2"/>
+      </w:pPr>
+      <w:r>
+        <w:t xml:space="preserve">Natural recovery</w:t>
+      </w:r>
+    </w:p>
+    <w:p>
+      <w:pPr>
+        <w:pStyle w:val="FirstParagraph"/>
+      </w:pPr>
+      <w:r>
+        <w:t xml:space="preserve">Injuries also heal with time. Each</w:t>
+      </w:r>
+      <w:r>
+        <w:t xml:space="preserve"> </w:t>
+      </w:r>
+      <w:r>
+        <w:rPr>
+          <w:bCs/>
+          <w:b/>
+        </w:rPr>
+        <w:t xml:space="preserve">full day of rest</w:t>
+      </w:r>
+      <w:r>
+        <w:t xml:space="preserve"> </w:t>
+      </w:r>
+      <w:r>
+        <w:t xml:space="preserve">clears one injury box. Rest means light duty at most: no combat, no away missions, nothing strenuous. A day spent working hard or fighting clears nothing.</w:t>
+      </w:r>
+    </w:p>
+    <w:p>
+      <w:pPr>
+        <w:numPr>
+          <w:ilvl w:val="0"/>
+          <w:numId w:val="1010"/>
+        </w:numPr>
+        <w:pStyle w:val="Compact"/>
+      </w:pPr>
+      <w:r>
+        <w:rPr>
+          <w:bCs/>
+          <w:b/>
+        </w:rPr>
+        <w:t xml:space="preserve">At three boxes, rest alone clears nothing.</w:t>
+      </w:r>
+      <w:r>
+        <w:t xml:space="preserve"> </w:t>
+      </w:r>
+      <w:r>
+        <w:t xml:space="preserve">An Incapacitated patient needs treatment (field care or sickbay) to clear the first box; after that, rest takes over.</w:t>
+      </w:r>
+    </w:p>
+    <w:p>
+      <w:pPr>
+        <w:numPr>
+          <w:ilvl w:val="0"/>
+          <w:numId w:val="1010"/>
+        </w:numPr>
+        <w:pStyle w:val="Compact"/>
+      </w:pPr>
+      <w:r>
+        <w:rPr>
+          <w:bCs/>
+          <w:b/>
+        </w:rPr>
+        <w:t xml:space="preserve">Rest and medicine combine.</w:t>
+      </w:r>
+      <w:r>
+        <w:t xml:space="preserve"> </w:t>
+      </w:r>
+      <w:r>
+        <w:t xml:space="preserve">Treatment clears boxes immediately; rest clears what remains, one box a day.</w:t>
+      </w:r>
+    </w:p>
+    <w:p>
+      <w:pPr>
+        <w:numPr>
+          <w:ilvl w:val="0"/>
+          <w:numId w:val="1010"/>
+        </w:numPr>
+        <w:pStyle w:val="Compact"/>
+      </w:pPr>
+      <w:r>
+        <w:rPr>
+          <w:bCs/>
+          <w:b/>
+        </w:rPr>
+        <w:t xml:space="preserve">Serious trauma takes longer.</w:t>
+      </w:r>
+      <w:r>
+        <w:t xml:space="preserve"> </w:t>
+      </w:r>
+      <w:r>
+        <w:t xml:space="preserve">For major organ damage, severe burns, or complex internal trauma, the GM can require a set recovery period before rest clears anything, and the ship’s physician decides when the patient is fit for duty.</w:t>
+      </w:r>
+    </w:p>
+    <w:p>
+      <w:pPr>
+        <w:pStyle w:val="FirstParagraph"/>
+      </w:pPr>
+      <w:r>
+        <w:rPr>
+          <w:iCs/>
+          <w:i/>
+        </w:rPr>
         <w:t xml:space="preserve">Example:</w:t>
       </w:r>
       <w:r>
         <w:t xml:space="preserve"> </w:t>
       </w:r>
       <w:r>
-        <w:t xml:space="preserve">your curiosity tempts you to remain beside an anomaly while the team withdraws. If you accept the resulting separation and danger, the GM awards one Duty point. The point does not remove that danger.</w:t>
-      </w:r>
-    </w:p>
+        <w:t xml:space="preserve">Ensign Reyes ends a mission Seriously wounded (two boxes). Sickbay is busy with worse cases, so Reyes rests in quarters: one box clears the first day and the second the next, and Reyes is back on duty on the third day.</w:t>
+      </w:r>
+    </w:p>
+    <w:bookmarkEnd w:id="61"/>
+    <w:bookmarkStart w:id="62" w:name="alien-medicine-and-limits"/>
+    <w:p>
+      <w:pPr>
+        <w:pStyle w:val="Heading2"/>
+      </w:pPr>
+      <w:r>
+        <w:t xml:space="preserve">Alien medicine and limits</w:t>
+      </w:r>
+    </w:p>
+    <w:p>
+      <w:pPr>
+        <w:pStyle w:val="FirstParagraph"/>
+      </w:pPr>
+      <w:r>
+        <w:t xml:space="preserve">Unknown illness or physiology requires discovering the cause and a suitable treatment before boxes can be restored. Medicine can receive assistance from Life Sciences, Sensors, or Computers. Existing assistance limits apply. Missing essential equipment or incompatible supplies can prevent a procedure. Disintegration and other unsurvivable injuries cannot be reversed by an ordinary Medicine roll.</w:t>
+      </w:r>
+    </w:p>
+    <w:p>
+      <w:pPr>
+        <w:pStyle w:val="BodyText"/>
+      </w:pPr>
+      <w:r>
+        <w:t xml:space="preserve">Crew of other species may need care suited to their biology. An Alien Physiology Specialist, or a physician with access to the right species data, keeps that care from becoming guesswork.</w:t>
+      </w:r>
+    </w:p>
+    <w:bookmarkEnd w:id="62"/>
+    <w:bookmarkStart w:id="64" w:name="examples-from-the-original-series"/>
+    <w:p>
+      <w:pPr>
+        <w:pStyle w:val="Heading2"/>
+      </w:pPr>
+      <w:r>
+        <w:t xml:space="preserve">Examples from the original series</w:t>
+      </w:r>
+    </w:p>
+    <w:p>
+      <w:pPr>
+        <w:pStyle w:val="FirstParagraph"/>
+      </w:pPr>
+      <w:r>
+        <w:rPr>
+          <w:iCs/>
+          <w:i/>
+        </w:rPr>
+        <w:t xml:space="preserve">Journey to Babel:</w:t>
+      </w:r>
+      <w:r>
+        <w:t xml:space="preserve"> </w:t>
+      </w:r>
+      <w:r>
+        <w:t xml:space="preserve">McCoy performs complex surgery on Sarek during a ship crisis; compatible blood and postoperative care remain important.</w:t>
+      </w:r>
+      <w:r>
+        <w:t xml:space="preserve"> </w:t>
+      </w:r>
+      <w:r>
+        <w:rPr>
+          <w:iCs/>
+          <w:i/>
+        </w:rPr>
+        <w:t xml:space="preserve">The Devil in the Dark:</w:t>
+      </w:r>
+      <w:r>
+        <w:t xml:space="preserve"> </w:t>
+      </w:r>
+      <w:r>
+        <w:t xml:space="preserve">McCoy improvises a treatment suited to the Horta’s unusual biology.</w:t>
+      </w:r>
+      <w:r>
+        <w:t xml:space="preserve"> </w:t>
+      </w:r>
+      <w:r>
+        <w:rPr>
+          <w:iCs/>
+          <w:i/>
+        </w:rPr>
+        <w:t xml:space="preserve">Miri:</w:t>
+      </w:r>
+      <w:r>
+        <w:t xml:space="preserve"> </w:t>
+      </w:r>
+      <w:r>
+        <w:t xml:space="preserve">diagnosing an unfamiliar disease and establishing a safe treatment require investigation. These stories support powerful medicine whose limits come from the medical problem and available resources.</w:t>
+      </w:r>
+    </w:p>
+    <w:p>
+      <w:pPr>
+        <w:pStyle w:val="BodyText"/>
+      </w:pPr>
+      <w:r>
+        <w:t xml:space="preserve">Canon reference: StarTrek.com,</w:t>
+      </w:r>
+      <w:r>
+        <w:t xml:space="preserve"> </w:t>
+      </w:r>
+      <w:r>
+        <w:t xml:space="preserve">“</w:t>
+      </w:r>
+      <w:r>
+        <w:t xml:space="preserve">8 Times Leonard</w:t>
+      </w:r>
+      <w:r>
+        <w:t xml:space="preserve"> </w:t>
+      </w:r>
+      <w:r>
+        <w:t xml:space="preserve">‘</w:t>
+      </w:r>
+      <w:r>
+        <w:t xml:space="preserve">Bones</w:t>
+      </w:r>
+      <w:r>
+        <w:t xml:space="preserve">’</w:t>
+      </w:r>
+      <w:r>
+        <w:t xml:space="preserve"> </w:t>
+      </w:r>
+      <w:r>
+        <w:t xml:space="preserve">McCoy’s Medical Knowledge Saved the Day.</w:t>
+      </w:r>
+      <w:r>
+        <w:t xml:space="preserve">”</w:t>
+      </w:r>
+      <w:r>
+        <w:t xml:space="preserve"> </w:t>
+      </w:r>
+      <w:hyperlink r:id="rId63">
+        <w:r>
+          <w:rPr>
+            <w:rStyle w:val="Hyperlink"/>
+          </w:rPr>
+          <w:t xml:space="preserve">https://www.startrek.com/news/mccoys-medical-knowledge-saved-the-day</w:t>
+        </w:r>
+      </w:hyperlink>
+    </w:p>
+    <w:bookmarkEnd w:id="64"/>
     <w:bookmarkEnd w:id="65"/>
-    <w:bookmarkStart w:id="66" w:name="working-on-the-bridge"/>
+    <w:bookmarkStart w:id="70" w:name="duty-points-and-bridge-duty"/>
+    <w:p>
+      <w:pPr>
+        <w:pStyle w:val="Heading1"/>
+      </w:pPr>
+      <w:r>
+        <w:t xml:space="preserve">Duty points and bridge duty</w:t>
+      </w:r>
+    </w:p>
+    <w:bookmarkStart w:id="66" w:name="using-duty-points"/>
     <w:p>
       <w:pPr>
         <w:pStyle w:val="Heading2"/>
       </w:pPr>
       <w:r>
-        <w:t xml:space="preserve">Working on the bridge</w:t>
+        <w:t xml:space="preserve">Using Duty points</w:t>
       </w:r>
     </w:p>
     <w:p>
@@ -6440,7 +6720,7 @@
         <w:pStyle w:val="FirstParagraph"/>
       </w:pPr>
       <w:r>
-        <w:t xml:space="preserve">Describe the effect you want before selecting a skill. Each exchange gives occupied stations a chance to contribute. Roll for consequential decisions and uncertain work; routine station operation needs no roll.</w:t>
+        <w:t xml:space="preserve">Begin each session with two Duty points; unused points do not carry into the next session. Spend no more than one point on a single roll or injury event. Duty points belong to your character and cannot be transferred.</w:t>
       </w:r>
     </w:p>
     <w:tbl>
@@ -6480,7 +6760,7 @@
                 <w:b/>
                 <w:sz w:val="19"/>
               </w:rPr>
-              <w:t xml:space="preserve">Station</w:t>
+              <w:t xml:space="preserve">Spend one point to</w:t>
             </w:r>
           </w:p>
         </w:tc>
@@ -6498,6 +6778,210 @@
                 <w:b/>
                 <w:sz w:val="19"/>
               </w:rPr>
+              <w:t xml:space="preserve">Timing and limits</w:t>
+            </w:r>
+          </w:p>
+        </w:tc>
+      </w:tr>
+      <w:tr>
+        <w:tc>
+          <w:tcPr/>
+          <w:p>
+            <w:pPr>
+              <w:pStyle w:val="Compact"/>
+              <w:jc w:val="left"/>
+            </w:pPr>
+            <w:r>
+              <w:rPr>
+                <w:b/>
+                <w:sz w:val="19"/>
+              </w:rPr>
+              <w:t xml:space="preserve">Reroll your own roll</w:t>
+            </w:r>
+          </w:p>
+        </w:tc>
+        <w:tc>
+          <w:tcPr/>
+          <w:p>
+            <w:pPr>
+              <w:pStyle w:val="Compact"/>
+              <w:jc w:val="left"/>
+            </w:pPr>
+            <w:r>
+              <w:rPr>
+                <w:sz w:val="19"/>
+              </w:rPr>
+              <w:t xml:space="preserve">Declare after seeing the result but before its consequences are resolved. Keep the second result, even if worse.</w:t>
+            </w:r>
+          </w:p>
+        </w:tc>
+      </w:tr>
+      <w:tr>
+        <w:tc>
+          <w:tcPr/>
+          <w:p>
+            <w:pPr>
+              <w:pStyle w:val="Compact"/>
+              <w:jc w:val="left"/>
+            </w:pPr>
+            <w:r>
+              <w:rPr>
+                <w:b/>
+                <w:sz w:val="19"/>
+              </w:rPr>
+              <w:t xml:space="preserve">Reduce an injury by one box</w:t>
+            </w:r>
+          </w:p>
+        </w:tc>
+        <w:tc>
+          <w:tcPr/>
+          <w:p>
+            <w:pPr>
+              <w:pStyle w:val="Compact"/>
+              <w:jc w:val="left"/>
+            </w:pPr>
+            <w:r>
+              <w:rPr>
+                <w:sz w:val="19"/>
+              </w:rPr>
+              <w:t xml:space="preserve">Declare when a hit would mark boxes, before applying them. Does not prevent disintegration or another hazard that bypasses the injury track.</w:t>
+            </w:r>
+          </w:p>
+        </w:tc>
+      </w:tr>
+      <w:tr>
+        <w:tc>
+          <w:tcPr/>
+          <w:p>
+            <w:pPr>
+              <w:pStyle w:val="Compact"/>
+              <w:jc w:val="left"/>
+            </w:pPr>
+            <w:r>
+              <w:rPr>
+                <w:b/>
+                <w:sz w:val="19"/>
+              </w:rPr>
+              <w:t xml:space="preserve">Establish a small preparation</w:t>
+            </w:r>
+          </w:p>
+        </w:tc>
+        <w:tc>
+          <w:tcPr/>
+          <w:p>
+            <w:pPr>
+              <w:pStyle w:val="Compact"/>
+              <w:jc w:val="left"/>
+            </w:pPr>
+            <w:r>
+              <w:rPr>
+                <w:sz w:val="19"/>
+              </w:rPr>
+              <w:t xml:space="preserve">Propose a plausible detail, such as having brought a field kit. GM approval is required; it cannot contradict established facts or solve the mission outright.</w:t>
+            </w:r>
+          </w:p>
+        </w:tc>
+      </w:tr>
+    </w:tbl>
+    <w:p>
+      <w:pPr>
+        <w:pStyle w:val="BodyText"/>
+      </w:pPr>
+      <w:r>
+        <w:t xml:space="preserve">Gain one point when one of your complications creates a meaningful problem you accept. This includes a companion complication from a species advantage. The GM offers or approves the award. You can decline the proposed complication without a penalty. Repeating a harmless habit does not earn points.</w:t>
+      </w:r>
+    </w:p>
+    <w:p>
+      <w:pPr>
+        <w:pStyle w:val="BodyText"/>
+      </w:pPr>
+      <w:r>
+        <w:rPr>
+          <w:iCs/>
+          <w:i/>
+        </w:rPr>
+        <w:t xml:space="preserve">Example:</w:t>
+      </w:r>
+      <w:r>
+        <w:t xml:space="preserve"> </w:t>
+      </w:r>
+      <w:r>
+        <w:t xml:space="preserve">your curiosity tempts you to remain beside an anomaly while the team withdraws. If you accept the resulting separation and danger, the GM awards one Duty point. The point does not remove that danger.</w:t>
+      </w:r>
+    </w:p>
+    <w:bookmarkEnd w:id="66"/>
+    <w:bookmarkStart w:id="67" w:name="working-on-the-bridge"/>
+    <w:p>
+      <w:pPr>
+        <w:pStyle w:val="Heading2"/>
+      </w:pPr>
+      <w:r>
+        <w:t xml:space="preserve">Working on the bridge</w:t>
+      </w:r>
+    </w:p>
+    <w:p>
+      <w:pPr>
+        <w:pStyle w:val="FirstParagraph"/>
+      </w:pPr>
+      <w:r>
+        <w:t xml:space="preserve">Describe the effect you want before selecting a skill. Each exchange gives occupied stations a chance to contribute. Roll for consequential decisions and uncertain work; routine station operation needs no roll.</w:t>
+      </w:r>
+    </w:p>
+    <w:tbl>
+      <w:tblPr>
+        <w:tblStyle w:val="Table"/>
+        <w:tblW w:type="pct" w:w="5000"/>
+        <w:tblLook w:firstRow="1" w:lastRow="0" w:firstColumn="0" w:lastColumn="0" w:noHBand="0" w:noVBand="0" w:val="0020"/>
+        <w:jc w:val="start"/>
+        <w:tblBorders>
+          <w:top w:val="single" w:sz="4" w:color="B8C2D3"/>
+          <w:left w:val="single" w:sz="4" w:color="B8C2D3"/>
+          <w:bottom w:val="single" w:sz="4" w:color="B8C2D3"/>
+          <w:right w:val="single" w:sz="4" w:color="B8C2D3"/>
+          <w:insideH w:val="single" w:sz="4" w:color="B8C2D3"/>
+          <w:insideV w:val="single" w:sz="4" w:color="B8C2D3"/>
+        </w:tblBorders>
+      </w:tblPr>
+      <w:tblGrid>
+        <w:gridCol w:w="3960"/>
+        <w:gridCol w:w="3960"/>
+      </w:tblGrid>
+      <w:tr>
+        <w:trPr>
+          <w:tblHeader w:val="true"/>
+        </w:trPr>
+        <w:tc>
+          <w:tcPr>
+            <w:shd w:val="clear" w:fill="E9EEF6"/>
+          </w:tcPr>
+          <w:p>
+            <w:pPr>
+              <w:pStyle w:val="Compact"/>
+              <w:jc w:val="left"/>
+            </w:pPr>
+            <w:r>
+              <w:rPr>
+                <w:b/>
+                <w:sz w:val="19"/>
+              </w:rPr>
+              <w:t xml:space="preserve">Station</w:t>
+            </w:r>
+          </w:p>
+        </w:tc>
+        <w:tc>
+          <w:tcPr>
+            <w:shd w:val="clear" w:fill="E9EEF6"/>
+          </w:tcPr>
+          <w:p>
+            <w:pPr>
+              <w:pStyle w:val="Compact"/>
+              <w:jc w:val="left"/>
+            </w:pPr>
+            <w:r>
+              <w:rPr>
+                <w:b/>
+                <w:sz w:val="19"/>
+              </w:rPr>
               <w:t xml:space="preserve">Skill and contribution</w:t>
             </w:r>
           </w:p>
@@ -6743,8 +7227,8 @@
         <w:t xml:space="preserve">Leadership can assist another officer when orders or coordination meaningfully help. It uses the normal assistance rule and does not provide an automatic bonus to every station.</w:t>
       </w:r>
     </w:p>
-    <w:bookmarkEnd w:id="66"/>
-    <w:bookmarkStart w:id="67" w:name="the-uss-pelion"/>
+    <w:bookmarkEnd w:id="67"/>
+    <w:bookmarkStart w:id="68" w:name="the-uss-pelion"/>
     <w:p>
       <w:pPr>
         <w:pStyle w:val="Heading2"/>
@@ -7191,8 +7675,8 @@
         <w:t xml:space="preserve">for ship weapons, against the enemy ship’s own tracks, which the GM keeps the same way.</w:t>
       </w:r>
     </w:p>
-    <w:bookmarkEnd w:id="67"/>
-    <w:bookmarkStart w:id="68" w:name="advancement"/>
+    <w:bookmarkEnd w:id="68"/>
+    <w:bookmarkStart w:id="69" w:name="advancement"/>
     <w:p>
       <w:pPr>
         <w:pStyle w:val="Heading2"/>
@@ -7209,9 +7693,9 @@
         <w:t xml:space="preserve">After a significant mission, the GM may authorize one relevant skill to advance from Untrained to Trained or from Trained to Specialty, or allow revision of an advantage or complication to reflect events. Skills retain the same three training levels after advancement. Advancement follows mission milestones. Attribute and species changes require a separate agreement. General Services characters advance the same way, but only their starting skill is Expert; a skill raised later tops out at Specialty (+3) unless they are commissioned (see Step 3).</w:t>
       </w:r>
     </w:p>
-    <w:bookmarkEnd w:id="68"/>
     <w:bookmarkEnd w:id="69"/>
-    <w:bookmarkStart w:id="72" w:name="running-missions"/>
+    <w:bookmarkEnd w:id="70"/>
+    <w:bookmarkStart w:id="73" w:name="running-missions"/>
     <w:p>
       <w:pPr>
         <w:pStyle w:val="Heading1"/>
@@ -7220,7 +7704,7 @@
         <w:t xml:space="preserve">Running missions</w:t>
       </w:r>
     </w:p>
-    <w:bookmarkStart w:id="70" w:name="mission-seeds"/>
+    <w:bookmarkStart w:id="71" w:name="mission-seeds"/>
     <w:p>
       <w:pPr>
         <w:pStyle w:val="Heading2"/>
@@ -9215,8 +9699,8 @@
         <w:t xml:space="preserve">is in the middle of it.</w:t>
       </w:r>
     </w:p>
-    <w:bookmarkEnd w:id="70"/>
-    <w:bookmarkStart w:id="71" w:name="captains-log"/>
+    <w:bookmarkEnd w:id="71"/>
+    <w:bookmarkStart w:id="72" w:name="captains-log"/>
     <w:p>
       <w:pPr>
         <w:pStyle w:val="Heading2"/>
@@ -9231,186 +9715,6 @@
       </w:pPr>
       <w:r>
         <w:t xml:space="preserve">End each mission with a short log, written together:</w:t>
-      </w:r>
-    </w:p>
-    <w:p>
-      <w:pPr>
-        <w:numPr>
-          <w:ilvl w:val="0"/>
-          <w:numId w:val="1010"/>
-        </w:numPr>
-        <w:pStyle w:val="Compact"/>
-      </w:pPr>
-      <w:r>
-        <w:rPr>
-          <w:bCs/>
-          <w:b/>
-        </w:rPr>
-        <w:t xml:space="preserve">The mission.</w:t>
-      </w:r>
-      <w:r>
-        <w:t xml:space="preserve"> </w:t>
-      </w:r>
-      <w:r>
-        <w:t xml:space="preserve">What were we sent to do, and did we do it: completed, partly, or failed?</w:t>
-      </w:r>
-    </w:p>
-    <w:p>
-      <w:pPr>
-        <w:numPr>
-          <w:ilvl w:val="0"/>
-          <w:numId w:val="1010"/>
-        </w:numPr>
-        <w:pStyle w:val="Compact"/>
-      </w:pPr>
-      <w:r>
-        <w:rPr>
-          <w:bCs/>
-          <w:b/>
-        </w:rPr>
-        <w:t xml:space="preserve">Who stood out?</w:t>
-      </w:r>
-      <w:r>
-        <w:t xml:space="preserve"> </w:t>
-      </w:r>
-      <w:r>
-        <w:t xml:space="preserve">Name a commendation, or a moment worth remembering.</w:t>
-      </w:r>
-    </w:p>
-    <w:p>
-      <w:pPr>
-        <w:numPr>
-          <w:ilvl w:val="0"/>
-          <w:numId w:val="1010"/>
-        </w:numPr>
-        <w:pStyle w:val="Compact"/>
-      </w:pPr>
-      <w:r>
-        <w:rPr>
-          <w:bCs/>
-          <w:b/>
-        </w:rPr>
-        <w:t xml:space="preserve">Complications.</w:t>
-      </w:r>
-      <w:r>
-        <w:t xml:space="preserve"> </w:t>
-      </w:r>
-      <w:r>
-        <w:t xml:space="preserve">Which ones came into play, and what did they cost?</w:t>
-      </w:r>
-    </w:p>
-    <w:p>
-      <w:pPr>
-        <w:numPr>
-          <w:ilvl w:val="0"/>
-          <w:numId w:val="1010"/>
-        </w:numPr>
-        <w:pStyle w:val="Compact"/>
-      </w:pPr>
-      <w:r>
-        <w:rPr>
-          <w:bCs/>
-          <w:b/>
-        </w:rPr>
-        <w:t xml:space="preserve">What changed?</w:t>
-      </w:r>
-      <w:r>
-        <w:t xml:space="preserve"> </w:t>
-      </w:r>
-      <w:r>
-        <w:t xml:space="preserve">Damage to the ship, new allies or enemies, open threads for next time.</w:t>
-      </w:r>
-    </w:p>
-    <w:p>
-      <w:pPr>
-        <w:numPr>
-          <w:ilvl w:val="0"/>
-          <w:numId w:val="1010"/>
-        </w:numPr>
-        <w:pStyle w:val="Compact"/>
-      </w:pPr>
-      <w:r>
-        <w:rPr>
-          <w:bCs/>
-          <w:b/>
-        </w:rPr>
-        <w:t xml:space="preserve">Advancement.</w:t>
-      </w:r>
-      <w:r>
-        <w:t xml:space="preserve"> </w:t>
-      </w:r>
-      <w:r>
-        <w:t xml:space="preserve">After a significant mission, the GM may authorize one skill step for each crew member (Untrained to Trained, or Trained to Specialty), or a revision of an advantage or complication.</w:t>
-      </w:r>
-    </w:p>
-    <w:p>
-      <w:pPr>
-        <w:pStyle w:val="FirstParagraph"/>
-      </w:pPr>
-      <w:r>
-        <w:t xml:space="preserve">The creator’s GM view keeps the log, applies each crew member’s advancement to the GM’s copy, and saves both with the crew file. Players record an approved advancement on their own sheet under Step 3, so their character still passes the checklist.</w:t>
-      </w:r>
-    </w:p>
-    <w:bookmarkEnd w:id="71"/>
-    <w:bookmarkEnd w:id="72"/>
-    <w:bookmarkStart w:id="79" w:name="ready-made-crew"/>
-    <w:p>
-      <w:pPr>
-        <w:pStyle w:val="Heading1"/>
-      </w:pPr>
-      <w:r>
-        <w:t xml:space="preserve">Ready-made crew</w:t>
-      </w:r>
-    </w:p>
-    <w:p>
-      <w:pPr>
-        <w:pStyle w:val="FirstParagraph"/>
-      </w:pPr>
-      <w:r>
-        <w:t xml:space="preserve">Six crew members ready to play, for one-shots, new players, or a crew in a hurry. Each follows the creation rules exactly, and their connections tie them to one another. In the creator, choose</w:t>
-      </w:r>
-      <w:r>
-        <w:t xml:space="preserve"> </w:t>
-      </w:r>
-      <w:r>
-        <w:rPr>
-          <w:bCs/>
-          <w:b/>
-        </w:rPr>
-        <w:t xml:space="preserve">Load a ready-made crew member</w:t>
-      </w:r>
-      <w:r>
-        <w:t xml:space="preserve"> </w:t>
-      </w:r>
-      <w:r>
-        <w:t xml:space="preserve">to open one and make it your own.</w:t>
-      </w:r>
-    </w:p>
-    <w:bookmarkStart w:id="73" w:name="thelan-shvari"/>
-    <w:p>
-      <w:pPr>
-        <w:pStyle w:val="Heading2"/>
-      </w:pPr>
-      <w:r>
-        <w:t xml:space="preserve">Thelan sh’Vari</w:t>
-      </w:r>
-    </w:p>
-    <w:p>
-      <w:pPr>
-        <w:pStyle w:val="FirstParagraph"/>
-      </w:pPr>
-      <w:r>
-        <w:rPr>
-          <w:iCs/>
-          <w:i/>
-        </w:rPr>
-        <w:t xml:space="preserve">Lieutenant Commander, Command. Andorian.</w:t>
-      </w:r>
-      <w:r>
-        <w:t xml:space="preserve"> </w:t>
-      </w:r>
-      <w:r>
-        <w:t xml:space="preserve">First officer: keeps the crew moving when the captain’s plan meets reality, and keeps the captain honest.</w:t>
       </w:r>
     </w:p>
     <w:p>
@@ -9426,29 +9730,13 @@
           <w:bCs/>
           <w:b/>
         </w:rPr>
-        <w:t xml:space="preserve">Attributes:</w:t>
-      </w:r>
-      <w:r>
-        <w:t xml:space="preserve"> </w:t>
-      </w:r>
-      <w:r>
-        <w:t xml:space="preserve">Body 10, Agility 12, Intellect 10, Presence 13, Will 10.</w:t>
-      </w:r>
-      <w:r>
-        <w:t xml:space="preserve"> </w:t>
-      </w:r>
-      <w:r>
-        <w:rPr>
-          <w:bCs/>
-          <w:b/>
-        </w:rPr>
-        <w:t xml:space="preserve">Dodge</w:t>
-      </w:r>
-      <w:r>
-        <w:t xml:space="preserve"> </w:t>
-      </w:r>
-      <w:r>
-        <w:t xml:space="preserve">11.</w:t>
+        <w:t xml:space="preserve">The mission.</w:t>
+      </w:r>
+      <w:r>
+        <w:t xml:space="preserve"> </w:t>
+      </w:r>
+      <w:r>
+        <w:t xml:space="preserve">What were we sent to do, and did we do it: completed, partly, or failed?</w:t>
       </w:r>
     </w:p>
     <w:p>
@@ -9464,13 +9752,13 @@
           <w:bCs/>
           <w:b/>
         </w:rPr>
-        <w:t xml:space="preserve">Skills:</w:t>
-      </w:r>
-      <w:r>
-        <w:t xml:space="preserve"> </w:t>
-      </w:r>
-      <w:r>
-        <w:t xml:space="preserve">Leadership 16 (Specialty). Trained: Diplomacy 14, Helm 13, Phasers 13, Unarmed Combat 13, Navigation 11, Psychology 11, Athletics 11, Sensors 11, Communications 11.</w:t>
+        <w:t xml:space="preserve">Who stood out?</w:t>
+      </w:r>
+      <w:r>
+        <w:t xml:space="preserve"> </w:t>
+      </w:r>
+      <w:r>
+        <w:t xml:space="preserve">Name a commendation, or a moment worth remembering.</w:t>
       </w:r>
     </w:p>
     <w:p>
@@ -9486,29 +9774,13 @@
           <w:bCs/>
           <w:b/>
         </w:rPr>
-        <w:t xml:space="preserve">Advantage:</w:t>
-      </w:r>
-      <w:r>
-        <w:t xml:space="preserve"> </w:t>
-      </w:r>
-      <w:r>
-        <w:t xml:space="preserve">Crisis Leader.</w:t>
-      </w:r>
-      <w:r>
-        <w:t xml:space="preserve"> </w:t>
-      </w:r>
-      <w:r>
-        <w:rPr>
-          <w:bCs/>
-          <w:b/>
-        </w:rPr>
-        <w:t xml:space="preserve">Complication:</w:t>
-      </w:r>
-      <w:r>
-        <w:t xml:space="preserve"> </w:t>
-      </w:r>
-      <w:r>
-        <w:t xml:space="preserve">Reputation to Uphold; trigger: someone questions your competence in front of others.</w:t>
+        <w:t xml:space="preserve">Complications.</w:t>
+      </w:r>
+      <w:r>
+        <w:t xml:space="preserve"> </w:t>
+      </w:r>
+      <w:r>
+        <w:t xml:space="preserve">Which ones came into play, and what did they cost?</w:t>
       </w:r>
     </w:p>
     <w:p>
@@ -9524,39 +9796,87 @@
           <w:bCs/>
           <w:b/>
         </w:rPr>
-        <w:t xml:space="preserve">Why I serve:</w:t>
-      </w:r>
-      <w:r>
-        <w:t xml:space="preserve"> </w:t>
-      </w:r>
-      <w:r>
-        <w:t xml:space="preserve">Starfleet runs in my family, and I mean to live up to the name.</w:t>
-      </w:r>
-      <w:r>
-        <w:t xml:space="preserve"> </w:t>
-      </w:r>
+        <w:t xml:space="preserve">What changed?</w:t>
+      </w:r>
+      <w:r>
+        <w:t xml:space="preserve"> </w:t>
+      </w:r>
+      <w:r>
+        <w:t xml:space="preserve">Damage to the ship, new allies or enemies, open threads for next time.</w:t>
+      </w:r>
+    </w:p>
+    <w:p>
+      <w:pPr>
+        <w:numPr>
+          <w:ilvl w:val="0"/>
+          <w:numId w:val="1011"/>
+        </w:numPr>
+        <w:pStyle w:val="Compact"/>
+      </w:pPr>
       <w:r>
         <w:rPr>
           <w:bCs/>
           <w:b/>
         </w:rPr>
-        <w:t xml:space="preserve">Connection:</w:t>
-      </w:r>
-      <w:r>
-        <w:t xml:space="preserve"> </w:t>
-      </w:r>
-      <w:r>
-        <w:t xml:space="preserve">Took Yeoman Rrinn under their wing when Rrinn first came aboard.</w:t>
-      </w:r>
-    </w:p>
+        <w:t xml:space="preserve">Advancement.</w:t>
+      </w:r>
+      <w:r>
+        <w:t xml:space="preserve"> </w:t>
+      </w:r>
+      <w:r>
+        <w:t xml:space="preserve">After a significant mission, the GM may authorize one skill step for each crew member (Untrained to Trained, or Trained to Specialty), or a revision of an advantage or complication.</w:t>
+      </w:r>
+    </w:p>
+    <w:p>
+      <w:pPr>
+        <w:pStyle w:val="FirstParagraph"/>
+      </w:pPr>
+      <w:r>
+        <w:t xml:space="preserve">The creator’s GM view keeps the log, applies each crew member’s advancement to the GM’s copy, and saves both with the crew file. Players record an approved advancement on their own sheet under Step 3, so their character still passes the checklist.</w:t>
+      </w:r>
+    </w:p>
+    <w:bookmarkEnd w:id="72"/>
     <w:bookmarkEnd w:id="73"/>
-    <w:bookmarkStart w:id="74" w:name="sevek"/>
+    <w:bookmarkStart w:id="80" w:name="ready-made-crew"/>
+    <w:p>
+      <w:pPr>
+        <w:pStyle w:val="Heading1"/>
+      </w:pPr>
+      <w:r>
+        <w:t xml:space="preserve">Ready-made crew</w:t>
+      </w:r>
+    </w:p>
+    <w:p>
+      <w:pPr>
+        <w:pStyle w:val="FirstParagraph"/>
+      </w:pPr>
+      <w:r>
+        <w:t xml:space="preserve">Six crew members ready to play, for one-shots, new players, or a crew in a hurry. Each follows the creation rules exactly, and their connections tie them to one another. In the creator, choose</w:t>
+      </w:r>
+      <w:r>
+        <w:t xml:space="preserve"> </w:t>
+      </w:r>
+      <w:r>
+        <w:rPr>
+          <w:bCs/>
+          <w:b/>
+        </w:rPr>
+        <w:t xml:space="preserve">Load a ready-made crew member</w:t>
+      </w:r>
+      <w:r>
+        <w:t xml:space="preserve"> </w:t>
+      </w:r>
+      <w:r>
+        <w:t xml:space="preserve">to open one and make it your own.</w:t>
+      </w:r>
+    </w:p>
+    <w:bookmarkStart w:id="74" w:name="thelan-shvari"/>
     <w:p>
       <w:pPr>
         <w:pStyle w:val="Heading2"/>
       </w:pPr>
       <w:r>
-        <w:t xml:space="preserve">Sevek</w:t>
+        <w:t xml:space="preserve">Thelan sh’Vari</w:t>
       </w:r>
     </w:p>
     <w:p>
@@ -9568,13 +9888,13 @@
           <w:iCs/>
           <w:i/>
         </w:rPr>
-        <w:t xml:space="preserve">Lieutenant, Science. Vulcan.</w:t>
-      </w:r>
-      <w:r>
-        <w:t xml:space="preserve"> </w:t>
-      </w:r>
-      <w:r>
-        <w:t xml:space="preserve">Ship’s sciences officer: reads the anomaly, names the risk, and calculates the odds no one asked for.</w:t>
+        <w:t xml:space="preserve">Lieutenant Commander, Command. Andorian.</w:t>
+      </w:r>
+      <w:r>
+        <w:t xml:space="preserve"> </w:t>
+      </w:r>
+      <w:r>
+        <w:t xml:space="preserve">First officer: keeps the crew moving when the captain’s plan meets reality, and keeps the captain honest.</w:t>
       </w:r>
     </w:p>
     <w:p>
@@ -9596,7 +9916,7 @@
         <w:t xml:space="preserve"> </w:t>
       </w:r>
       <w:r>
-        <w:t xml:space="preserve">Body 11, Agility 11, Intellect 13, Presence 8, Will 12.</w:t>
+        <w:t xml:space="preserve">Body 10, Agility 12, Intellect 10, Presence 13, Will 10.</w:t>
       </w:r>
       <w:r>
         <w:t xml:space="preserve"> </w:t>
@@ -9612,7 +9932,7 @@
         <w:t xml:space="preserve"> </w:t>
       </w:r>
       <w:r>
-        <w:t xml:space="preserve">10.</w:t>
+        <w:t xml:space="preserve">11.</w:t>
       </w:r>
     </w:p>
     <w:p>
@@ -9634,7 +9954,7 @@
         <w:t xml:space="preserve"> </w:t>
       </w:r>
       <w:r>
-        <w:t xml:space="preserve">Physical Sciences 16 (Specialty). Trained: Sensors 14, Computers 14, Life Sciences 14, Navigation 14, Engineering 14, Electronics 14, Psychology 14, Unarmed Combat 12, Athletics 12.</w:t>
+        <w:t xml:space="preserve">Leadership 16 (Specialty). Trained: Diplomacy 14, Helm 13, Phasers 13, Unarmed Combat 13, Navigation 11, Psychology 11, Athletics 11, Sensors 11, Communications 11.</w:t>
       </w:r>
     </w:p>
     <w:p>
@@ -9656,7 +9976,7 @@
         <w:t xml:space="preserve"> </w:t>
       </w:r>
       <w:r>
-        <w:t xml:space="preserve">Eidetic Recall (species; companion: Suppressed Emotion).</w:t>
+        <w:t xml:space="preserve">Crisis Leader.</w:t>
       </w:r>
       <w:r>
         <w:t xml:space="preserve"> </w:t>
@@ -9672,7 +9992,7 @@
         <w:t xml:space="preserve"> </w:t>
       </w:r>
       <w:r>
-        <w:t xml:space="preserve">Cannot Leave a Mystery Alone; trigger: sensor data that contradicts known science.</w:t>
+        <w:t xml:space="preserve">Reputation to Uphold; trigger: someone questions your competence in front of others.</w:t>
       </w:r>
     </w:p>
     <w:p>
@@ -9694,7 +10014,7 @@
         <w:t xml:space="preserve"> </w:t>
       </w:r>
       <w:r>
-        <w:t xml:space="preserve">The best laboratory in the galaxy is a starship on the frontier.</w:t>
+        <w:t xml:space="preserve">Starfleet runs in my family, and I mean to live up to the name.</w:t>
       </w:r>
       <w:r>
         <w:t xml:space="preserve"> </w:t>
@@ -9710,17 +10030,17 @@
         <w:t xml:space="preserve"> </w:t>
       </w:r>
       <w:r>
-        <w:t xml:space="preserve">Friendly rivals with Lt. Grath: they argue every engineering theory, and both enjoy it.</w:t>
+        <w:t xml:space="preserve">Took Yeoman Rrinn under their wing when Rrinn first came aboard.</w:t>
       </w:r>
     </w:p>
     <w:bookmarkEnd w:id="74"/>
-    <w:bookmarkStart w:id="75" w:name="dr.-vessik"/>
+    <w:bookmarkStart w:id="75" w:name="sevek"/>
     <w:p>
       <w:pPr>
         <w:pStyle w:val="Heading2"/>
       </w:pPr>
       <w:r>
-        <w:t xml:space="preserve">Dr. Vessik</w:t>
+        <w:t xml:space="preserve">Sevek</w:t>
       </w:r>
     </w:p>
     <w:p>
@@ -9732,13 +10052,13 @@
           <w:iCs/>
           <w:i/>
         </w:rPr>
-        <w:t xml:space="preserve">Lieutenant Commander, Medical. Denobulan.</w:t>
-      </w:r>
-      <w:r>
-        <w:t xml:space="preserve"> </w:t>
-      </w:r>
-      <w:r>
-        <w:t xml:space="preserve">Chief medical officer: patches up the crew, argues with the captain, and keeps an alarming menagerie of medicinal creatures in sickbay.</w:t>
+        <w:t xml:space="preserve">Lieutenant, Science. Vulcan.</w:t>
+      </w:r>
+      <w:r>
+        <w:t xml:space="preserve"> </w:t>
+      </w:r>
+      <w:r>
+        <w:t xml:space="preserve">Ship’s sciences officer: reads the anomaly, names the risk, and calculates the odds no one asked for.</w:t>
       </w:r>
     </w:p>
     <w:p>
@@ -9760,7 +10080,7 @@
         <w:t xml:space="preserve"> </w:t>
       </w:r>
       <w:r>
-        <w:t xml:space="preserve">Body 9, Agility 9, Intellect 13, Presence 12, Will 12.</w:t>
+        <w:t xml:space="preserve">Body 11, Agility 11, Intellect 13, Presence 8, Will 12.</w:t>
       </w:r>
       <w:r>
         <w:t xml:space="preserve"> </w:t>
@@ -9776,7 +10096,7 @@
         <w:t xml:space="preserve"> </w:t>
       </w:r>
       <w:r>
-        <w:t xml:space="preserve">7.</w:t>
+        <w:t xml:space="preserve">10.</w:t>
       </w:r>
     </w:p>
     <w:p>
@@ -9798,7 +10118,7 @@
         <w:t xml:space="preserve"> </w:t>
       </w:r>
       <w:r>
-        <w:t xml:space="preserve">Medicine 16 (Specialty). Trained: Life Sciences 14, Psychology 14, Sensors 14, Computers 14, Electronics 14, Survival 14, Communications 14, Diplomacy 13, Leadership 13.</w:t>
+        <w:t xml:space="preserve">Physical Sciences 16 (Specialty). Trained: Sensors 14, Computers 14, Life Sciences 14, Navigation 14, Engineering 14, Electronics 14, Psychology 14, Unarmed Combat 12, Athletics 12.</w:t>
       </w:r>
     </w:p>
     <w:p>
@@ -9820,7 +10140,7 @@
         <w:t xml:space="preserve"> </w:t>
       </w:r>
       <w:r>
-        <w:t xml:space="preserve">Denobulan Pharmacopoeia (species; companion: Unorthodox Methods).</w:t>
+        <w:t xml:space="preserve">Eidetic Recall (species; companion: Suppressed Emotion).</w:t>
       </w:r>
       <w:r>
         <w:t xml:space="preserve"> </w:t>
@@ -9836,7 +10156,7 @@
         <w:t xml:space="preserve"> </w:t>
       </w:r>
       <w:r>
-        <w:t xml:space="preserve">Protects Others at Personal Risk; trigger: civilians are caught in the danger.</w:t>
+        <w:t xml:space="preserve">Cannot Leave a Mystery Alone; trigger: sensor data that contradicts known science.</w:t>
       </w:r>
     </w:p>
     <w:p>
@@ -9858,7 +10178,7 @@
         <w:t xml:space="preserve"> </w:t>
       </w:r>
       <w:r>
-        <w:t xml:space="preserve">To protect the Federation and the people who can’t protect themselves.</w:t>
+        <w:t xml:space="preserve">The best laboratory in the galaxy is a starship on the frontier.</w:t>
       </w:r>
       <w:r>
         <w:t xml:space="preserve"> </w:t>
@@ -9874,17 +10194,17 @@
         <w:t xml:space="preserve"> </w:t>
       </w:r>
       <w:r>
-        <w:t xml:space="preserve">Pulled Lt. Reyes out of a burning shuttle on a survey mission; Reyes has never let the doctor pay for a drink since.</w:t>
+        <w:t xml:space="preserve">Friendly rivals with Lt. Grath: they argue every engineering theory, and both enjoy it.</w:t>
       </w:r>
     </w:p>
     <w:bookmarkEnd w:id="75"/>
-    <w:bookmarkStart w:id="76" w:name="grath"/>
+    <w:bookmarkStart w:id="76" w:name="dr.-vessik"/>
     <w:p>
       <w:pPr>
         <w:pStyle w:val="Heading2"/>
       </w:pPr>
       <w:r>
-        <w:t xml:space="preserve">Grath</w:t>
+        <w:t xml:space="preserve">Dr. Vessik</w:t>
       </w:r>
     </w:p>
     <w:p>
@@ -9896,13 +10216,13 @@
           <w:iCs/>
           <w:i/>
         </w:rPr>
-        <w:t xml:space="preserve">Lieutenant, Engineering. Tellarite.</w:t>
-      </w:r>
-      <w:r>
-        <w:t xml:space="preserve"> </w:t>
-      </w:r>
-      <w:r>
-        <w:t xml:space="preserve">Engineer: keeps the Pelion’s power flowing and will tell you, at length, exactly why your idea won’t work.</w:t>
+        <w:t xml:space="preserve">Lieutenant Commander, Medical. Denobulan.</w:t>
+      </w:r>
+      <w:r>
+        <w:t xml:space="preserve"> </w:t>
+      </w:r>
+      <w:r>
+        <w:t xml:space="preserve">Chief medical officer: patches up the crew, argues with the captain, and keeps an alarming menagerie of medicinal creatures in sickbay.</w:t>
       </w:r>
     </w:p>
     <w:p>
@@ -9924,7 +10244,7 @@
         <w:t xml:space="preserve"> </w:t>
       </w:r>
       <w:r>
-        <w:t xml:space="preserve">Body 12, Agility 10, Intellect 13, Presence 9, Will 11.</w:t>
+        <w:t xml:space="preserve">Body 9, Agility 9, Intellect 13, Presence 12, Will 12.</w:t>
       </w:r>
       <w:r>
         <w:t xml:space="preserve"> </w:t>
@@ -9940,7 +10260,7 @@
         <w:t xml:space="preserve"> </w:t>
       </w:r>
       <w:r>
-        <w:t xml:space="preserve">9.</w:t>
+        <w:t xml:space="preserve">7.</w:t>
       </w:r>
     </w:p>
     <w:p>
@@ -9962,7 +10282,7 @@
         <w:t xml:space="preserve"> </w:t>
       </w:r>
       <w:r>
-        <w:t xml:space="preserve">Engineering 16 (Specialty). Trained: Electronics 14, Computers 14, Physical Sciences 14, Sensors 14, Communications 14, Survival 14, Athletics 13, Helm 11, Unarmed Combat 11.</w:t>
+        <w:t xml:space="preserve">Medicine 16 (Specialty). Trained: Life Sciences 14, Psychology 14, Sensors 14, Computers 14, Electronics 14, Survival 14, Communications 14, Diplomacy 13, Leadership 13.</w:t>
       </w:r>
     </w:p>
     <w:p>
@@ -9984,7 +10304,7 @@
         <w:t xml:space="preserve"> </w:t>
       </w:r>
       <w:r>
-        <w:t xml:space="preserve">Improvisational Engineer.</w:t>
+        <w:t xml:space="preserve">Denobulan Pharmacopoeia (species; companion: Unorthodox Methods).</w:t>
       </w:r>
       <w:r>
         <w:t xml:space="preserve"> </w:t>
@@ -10000,7 +10320,7 @@
         <w:t xml:space="preserve"> </w:t>
       </w:r>
       <w:r>
-        <w:t xml:space="preserve">Experimental Enthusiasm; trigger: an untested device or technique could solve the problem.</w:t>
+        <w:t xml:space="preserve">Protects Others at Personal Risk; trigger: civilians are caught in the danger.</w:t>
       </w:r>
     </w:p>
     <w:p>
@@ -10022,7 +10342,7 @@
         <w:t xml:space="preserve"> </w:t>
       </w:r>
       <w:r>
-        <w:t xml:space="preserve">To prove I’m good enough, to everyone who doubted me and to myself.</w:t>
+        <w:t xml:space="preserve">To protect the Federation and the people who can’t protect themselves.</w:t>
       </w:r>
       <w:r>
         <w:t xml:space="preserve"> </w:t>
@@ -10038,17 +10358,17 @@
         <w:t xml:space="preserve"> </w:t>
       </w:r>
       <w:r>
-        <w:t xml:space="preserve">Off-duty friends with Commander sh’Vari: a weekly game of Andorian chess in which both of them cheat.</w:t>
+        <w:t xml:space="preserve">Pulled Lt. Reyes out of a burning shuttle on a survey mission; Reyes has never let the doctor pay for a drink since.</w:t>
       </w:r>
     </w:p>
     <w:bookmarkEnd w:id="76"/>
-    <w:bookmarkStart w:id="77" w:name="marisol-reyes"/>
+    <w:bookmarkStart w:id="77" w:name="grath"/>
     <w:p>
       <w:pPr>
         <w:pStyle w:val="Heading2"/>
       </w:pPr>
       <w:r>
-        <w:t xml:space="preserve">Marisol Reyes</w:t>
+        <w:t xml:space="preserve">Grath</w:t>
       </w:r>
     </w:p>
     <w:p>
@@ -10060,13 +10380,13 @@
           <w:iCs/>
           <w:i/>
         </w:rPr>
-        <w:t xml:space="preserve">Lieutenant (j.g.), Security. Human.</w:t>
-      </w:r>
-      <w:r>
-        <w:t xml:space="preserve"> </w:t>
-      </w:r>
-      <w:r>
-        <w:t xml:space="preserve">Security officer: first through the door on every away mission, and the last to set a phaser to kill.</w:t>
+        <w:t xml:space="preserve">Lieutenant, Engineering. Tellarite.</w:t>
+      </w:r>
+      <w:r>
+        <w:t xml:space="preserve"> </w:t>
+      </w:r>
+      <w:r>
+        <w:t xml:space="preserve">Engineer: keeps the Pelion’s power flowing and will tell you, at length, exactly why your idea won’t work.</w:t>
       </w:r>
     </w:p>
     <w:p>
@@ -10088,7 +10408,7 @@
         <w:t xml:space="preserve"> </w:t>
       </w:r>
       <w:r>
-        <w:t xml:space="preserve">Body 12, Agility 13, Intellect 10, Presence 10, Will 10.</w:t>
+        <w:t xml:space="preserve">Body 12, Agility 10, Intellect 13, Presence 9, Will 11.</w:t>
       </w:r>
       <w:r>
         <w:t xml:space="preserve"> </w:t>
@@ -10104,7 +10424,7 @@
         <w:t xml:space="preserve"> </w:t>
       </w:r>
       <w:r>
-        <w:t xml:space="preserve">12.</w:t>
+        <w:t xml:space="preserve">9.</w:t>
       </w:r>
     </w:p>
     <w:p>
@@ -10126,7 +10446,7 @@
         <w:t xml:space="preserve"> </w:t>
       </w:r>
       <w:r>
-        <w:t xml:space="preserve">Phasers 16 (Specialty). Trained: Unarmed Combat 14, Stealth 14, Helm 14, Athletics 13, Survival 11, Sensors 11, Medicine 11, Leadership 11, Communications 11.</w:t>
+        <w:t xml:space="preserve">Engineering 16 (Specialty). Trained: Electronics 14, Computers 14, Physical Sciences 14, Sensors 14, Communications 14, Survival 14, Athletics 13, Helm 11, Unarmed Combat 11.</w:t>
       </w:r>
     </w:p>
     <w:p>
@@ -10148,7 +10468,7 @@
         <w:t xml:space="preserve"> </w:t>
       </w:r>
       <w:r>
-        <w:t xml:space="preserve">Careful Marksman.</w:t>
+        <w:t xml:space="preserve">Improvisational Engineer.</w:t>
       </w:r>
       <w:r>
         <w:t xml:space="preserve"> </w:t>
@@ -10164,7 +10484,7 @@
         <w:t xml:space="preserve"> </w:t>
       </w:r>
       <w:r>
-        <w:t xml:space="preserve">Reluctant to Use Lethal Force; trigger: a hostile refuses to surrender.</w:t>
+        <w:t xml:space="preserve">Experimental Enthusiasm; trigger: an untested device or technique could solve the problem.</w:t>
       </w:r>
     </w:p>
     <w:p>
@@ -10186,7 +10506,7 @@
         <w:t xml:space="preserve"> </w:t>
       </w:r>
       <w:r>
-        <w:t xml:space="preserve">A Starfleet officer once saved my home, and I want to be that person for someone else.</w:t>
+        <w:t xml:space="preserve">To prove I’m good enough, to everyone who doubted me and to myself.</w:t>
       </w:r>
       <w:r>
         <w:t xml:space="preserve"> </w:t>
@@ -10202,17 +10522,17 @@
         <w:t xml:space="preserve"> </w:t>
       </w:r>
       <w:r>
-        <w:t xml:space="preserve">Owes Dr. Vessik their life after a shuttle crash, and never lets the doctor forget it.</w:t>
+        <w:t xml:space="preserve">Off-duty friends with Commander sh’Vari: a weekly game of Andorian chess in which both of them cheat.</w:t>
       </w:r>
     </w:p>
     <w:bookmarkEnd w:id="77"/>
-    <w:bookmarkStart w:id="78" w:name="rrinn"/>
+    <w:bookmarkStart w:id="78" w:name="marisol-reyes"/>
     <w:p>
       <w:pPr>
         <w:pStyle w:val="Heading2"/>
       </w:pPr>
       <w:r>
-        <w:t xml:space="preserve">Rrinn</w:t>
+        <w:t xml:space="preserve">Marisol Reyes</w:t>
       </w:r>
     </w:p>
     <w:p>
@@ -10224,13 +10544,13 @@
           <w:iCs/>
           <w:i/>
         </w:rPr>
-        <w:t xml:space="preserve">Yeoman 2nd Class, General Services. Caitian.</w:t>
-      </w:r>
-      <w:r>
-        <w:t xml:space="preserve"> </w:t>
-      </w:r>
-      <w:r>
-        <w:t xml:space="preserve">Captain’s yeoman: keeps the records, carries the orders, and hears everything said on the bridge.</w:t>
+        <w:t xml:space="preserve">Lieutenant (j.g.), Security. Human.</w:t>
+      </w:r>
+      <w:r>
+        <w:t xml:space="preserve"> </w:t>
+      </w:r>
+      <w:r>
+        <w:t xml:space="preserve">Security officer: first through the door on every away mission, and the last to set a phaser to kill.</w:t>
       </w:r>
     </w:p>
     <w:p>
@@ -10252,7 +10572,7 @@
         <w:t xml:space="preserve"> </w:t>
       </w:r>
       <w:r>
-        <w:t xml:space="preserve">Body 9, Agility 12, Intellect 13, Presence 11, Will 10.</w:t>
+        <w:t xml:space="preserve">Body 12, Agility 13, Intellect 10, Presence 10, Will 10.</w:t>
       </w:r>
       <w:r>
         <w:t xml:space="preserve"> </w:t>
@@ -10268,7 +10588,7 @@
         <w:t xml:space="preserve"> </w:t>
       </w:r>
       <w:r>
-        <w:t xml:space="preserve">11.</w:t>
+        <w:t xml:space="preserve">12.</w:t>
       </w:r>
     </w:p>
     <w:p>
@@ -10290,7 +10610,7 @@
         <w:t xml:space="preserve"> </w:t>
       </w:r>
       <w:r>
-        <w:t xml:space="preserve">Computers 18 (Expert). Trained: Communications 14, Psychology 14, Sensors 14, Electronics 14, Stealth 13, Diplomacy 12, Athletics 10.</w:t>
+        <w:t xml:space="preserve">Phasers 16 (Specialty). Trained: Unarmed Combat 14, Stealth 14, Helm 14, Athletics 13, Survival 11, Sensors 11, Medicine 11, Leadership 11, Communications 11.</w:t>
       </w:r>
     </w:p>
     <w:p>
@@ -10312,7 +10632,7 @@
         <w:t xml:space="preserve"> </w:t>
       </w:r>
       <w:r>
-        <w:t xml:space="preserve">Keen Hearing (species; companion: Sensitive Ears).</w:t>
+        <w:t xml:space="preserve">Careful Marksman.</w:t>
       </w:r>
       <w:r>
         <w:t xml:space="preserve"> </w:t>
@@ -10328,7 +10648,7 @@
         <w:t xml:space="preserve"> </w:t>
       </w:r>
       <w:r>
-        <w:t xml:space="preserve">Someone Back Home; trigger: a message from home arrives.</w:t>
+        <w:t xml:space="preserve">Reluctant to Use Lethal Force; trigger: a hostile refuses to surrender.</w:t>
       </w:r>
     </w:p>
     <w:p>
@@ -10350,7 +10670,7 @@
         <w:t xml:space="preserve"> </w:t>
       </w:r>
       <w:r>
-        <w:t xml:space="preserve">To leave behind a past, a world, or a life that was too small for me.</w:t>
+        <w:t xml:space="preserve">A Starfleet officer once saved my home, and I want to be that person for someone else.</w:t>
       </w:r>
       <w:r>
         <w:t xml:space="preserve"> </w:t>
@@ -10366,12 +10686,176 @@
         <w:t xml:space="preserve"> </w:t>
       </w:r>
       <w:r>
+        <w:t xml:space="preserve">Owes Dr. Vessik their life after a shuttle crash, and never lets the doctor forget it.</w:t>
+      </w:r>
+    </w:p>
+    <w:bookmarkEnd w:id="78"/>
+    <w:bookmarkStart w:id="79" w:name="rrinn"/>
+    <w:p>
+      <w:pPr>
+        <w:pStyle w:val="Heading2"/>
+      </w:pPr>
+      <w:r>
+        <w:t xml:space="preserve">Rrinn</w:t>
+      </w:r>
+    </w:p>
+    <w:p>
+      <w:pPr>
+        <w:pStyle w:val="FirstParagraph"/>
+      </w:pPr>
+      <w:r>
+        <w:rPr>
+          <w:iCs/>
+          <w:i/>
+        </w:rPr>
+        <w:t xml:space="preserve">Yeoman 2nd Class, General Services. Caitian.</w:t>
+      </w:r>
+      <w:r>
+        <w:t xml:space="preserve"> </w:t>
+      </w:r>
+      <w:r>
+        <w:t xml:space="preserve">Captain’s yeoman: keeps the records, carries the orders, and hears everything said on the bridge.</w:t>
+      </w:r>
+    </w:p>
+    <w:p>
+      <w:pPr>
+        <w:numPr>
+          <w:ilvl w:val="0"/>
+          <w:numId w:val="1017"/>
+        </w:numPr>
+        <w:pStyle w:val="Compact"/>
+      </w:pPr>
+      <w:r>
+        <w:rPr>
+          <w:bCs/>
+          <w:b/>
+        </w:rPr>
+        <w:t xml:space="preserve">Attributes:</w:t>
+      </w:r>
+      <w:r>
+        <w:t xml:space="preserve"> </w:t>
+      </w:r>
+      <w:r>
+        <w:t xml:space="preserve">Body 9, Agility 12, Intellect 13, Presence 11, Will 10.</w:t>
+      </w:r>
+      <w:r>
+        <w:t xml:space="preserve"> </w:t>
+      </w:r>
+      <w:r>
+        <w:rPr>
+          <w:bCs/>
+          <w:b/>
+        </w:rPr>
+        <w:t xml:space="preserve">Dodge</w:t>
+      </w:r>
+      <w:r>
+        <w:t xml:space="preserve"> </w:t>
+      </w:r>
+      <w:r>
+        <w:t xml:space="preserve">11.</w:t>
+      </w:r>
+    </w:p>
+    <w:p>
+      <w:pPr>
+        <w:numPr>
+          <w:ilvl w:val="0"/>
+          <w:numId w:val="1017"/>
+        </w:numPr>
+        <w:pStyle w:val="Compact"/>
+      </w:pPr>
+      <w:r>
+        <w:rPr>
+          <w:bCs/>
+          <w:b/>
+        </w:rPr>
+        <w:t xml:space="preserve">Skills:</w:t>
+      </w:r>
+      <w:r>
+        <w:t xml:space="preserve"> </w:t>
+      </w:r>
+      <w:r>
+        <w:t xml:space="preserve">Computers 18 (Expert). Trained: Communications 14, Psychology 14, Sensors 14, Electronics 14, Stealth 13, Diplomacy 12, Athletics 10.</w:t>
+      </w:r>
+    </w:p>
+    <w:p>
+      <w:pPr>
+        <w:numPr>
+          <w:ilvl w:val="0"/>
+          <w:numId w:val="1017"/>
+        </w:numPr>
+        <w:pStyle w:val="Compact"/>
+      </w:pPr>
+      <w:r>
+        <w:rPr>
+          <w:bCs/>
+          <w:b/>
+        </w:rPr>
+        <w:t xml:space="preserve">Advantage:</w:t>
+      </w:r>
+      <w:r>
+        <w:t xml:space="preserve"> </w:t>
+      </w:r>
+      <w:r>
+        <w:t xml:space="preserve">Keen Hearing (species; companion: Sensitive Ears).</w:t>
+      </w:r>
+      <w:r>
+        <w:t xml:space="preserve"> </w:t>
+      </w:r>
+      <w:r>
+        <w:rPr>
+          <w:bCs/>
+          <w:b/>
+        </w:rPr>
+        <w:t xml:space="preserve">Complication:</w:t>
+      </w:r>
+      <w:r>
+        <w:t xml:space="preserve"> </w:t>
+      </w:r>
+      <w:r>
+        <w:t xml:space="preserve">Someone Back Home; trigger: a message from home arrives.</w:t>
+      </w:r>
+    </w:p>
+    <w:p>
+      <w:pPr>
+        <w:numPr>
+          <w:ilvl w:val="0"/>
+          <w:numId w:val="1017"/>
+        </w:numPr>
+        <w:pStyle w:val="Compact"/>
+      </w:pPr>
+      <w:r>
+        <w:rPr>
+          <w:bCs/>
+          <w:b/>
+        </w:rPr>
+        <w:t xml:space="preserve">Why I serve:</w:t>
+      </w:r>
+      <w:r>
+        <w:t xml:space="preserve"> </w:t>
+      </w:r>
+      <w:r>
+        <w:t xml:space="preserve">To leave behind a past, a world, or a life that was too small for me.</w:t>
+      </w:r>
+      <w:r>
+        <w:t xml:space="preserve"> </w:t>
+      </w:r>
+      <w:r>
+        <w:rPr>
+          <w:bCs/>
+          <w:b/>
+        </w:rPr>
+        <w:t xml:space="preserve">Connection:</w:t>
+      </w:r>
+      <w:r>
+        <w:t xml:space="preserve"> </w:t>
+      </w:r>
+      <w:r>
         <w:t xml:space="preserve">Shares a secret with Lt. Sevek from a mission neither of them talks about.</w:t>
       </w:r>
     </w:p>
-    <w:bookmarkEnd w:id="78"/>
     <w:bookmarkEnd w:id="79"/>
-    <w:bookmarkStart w:id="80" w:name="threats"/>
+    <w:bookmarkEnd w:id="80"/>
+    <w:bookmarkStart w:id="81" w:name="threats"/>
     <w:p>
       <w:pPr>
         <w:pStyle w:val="Heading1"/>
@@ -11430,8 +11914,8 @@
         <w:t xml:space="preserve">For a tougher version, add +1 to its targets and one box; for a weaker one, subtract. Starships use the ship tracks above: a Klingon battle cruiser has Shields 3, Hull 4, and Phasers 12 for its gunners.</w:t>
       </w:r>
     </w:p>
-    <w:bookmarkEnd w:id="80"/>
-    <w:bookmarkStart w:id="81" w:name="advantages"/>
+    <w:bookmarkEnd w:id="81"/>
+    <w:bookmarkStart w:id="82" w:name="advantages"/>
     <w:p>
       <w:pPr>
         <w:pStyle w:val="Heading1"/>
@@ -12037,8 +12521,8 @@
         </w:tc>
       </w:tr>
     </w:tbl>
-    <w:bookmarkEnd w:id="81"/>
-    <w:bookmarkStart w:id="95" w:name="species-advantages"/>
+    <w:bookmarkEnd w:id="82"/>
+    <w:bookmarkStart w:id="96" w:name="species-advantages"/>
     <w:p>
       <w:pPr>
         <w:pStyle w:val="Heading1"/>
@@ -12103,7 +12587,7 @@
         <w:t xml:space="preserve">A custom species advantage follows the same pattern: a narrow +2 or an ability with agreed limits, paired with a companion complication that has a clear trigger and a real consequence.</w:t>
       </w:r>
     </w:p>
-    <w:bookmarkStart w:id="82" w:name="human"/>
+    <w:bookmarkStart w:id="83" w:name="human"/>
     <w:p>
       <w:pPr>
         <w:pStyle w:val="Heading2"/>
@@ -12316,8 +12800,8 @@
         </w:tc>
       </w:tr>
     </w:tbl>
-    <w:bookmarkEnd w:id="82"/>
-    <w:bookmarkStart w:id="83" w:name="vulcan"/>
+    <w:bookmarkEnd w:id="83"/>
+    <w:bookmarkStart w:id="84" w:name="vulcan"/>
     <w:p>
       <w:pPr>
         <w:pStyle w:val="Heading2"/>
@@ -12592,8 +13076,8 @@
         </w:tc>
       </w:tr>
     </w:tbl>
-    <w:bookmarkEnd w:id="83"/>
-    <w:bookmarkStart w:id="84" w:name="andorian"/>
+    <w:bookmarkEnd w:id="84"/>
+    <w:bookmarkStart w:id="85" w:name="andorian"/>
     <w:p>
       <w:pPr>
         <w:pStyle w:val="Heading2"/>
@@ -12806,8 +13290,8 @@
         </w:tc>
       </w:tr>
     </w:tbl>
-    <w:bookmarkEnd w:id="84"/>
-    <w:bookmarkStart w:id="85" w:name="tellarite"/>
+    <w:bookmarkEnd w:id="85"/>
+    <w:bookmarkStart w:id="86" w:name="tellarite"/>
     <w:p>
       <w:pPr>
         <w:pStyle w:val="Heading2"/>
@@ -13020,8 +13504,8 @@
         </w:tc>
       </w:tr>
     </w:tbl>
-    <w:bookmarkEnd w:id="85"/>
-    <w:bookmarkStart w:id="86" w:name="aenar"/>
+    <w:bookmarkEnd w:id="86"/>
+    <w:bookmarkStart w:id="87" w:name="aenar"/>
     <w:p>
       <w:pPr>
         <w:pStyle w:val="Heading2"/>
@@ -13234,8 +13718,8 @@
         </w:tc>
       </w:tr>
     </w:tbl>
-    <w:bookmarkEnd w:id="86"/>
-    <w:bookmarkStart w:id="87" w:name="illyrian"/>
+    <w:bookmarkEnd w:id="87"/>
+    <w:bookmarkStart w:id="88" w:name="illyrian"/>
     <w:p>
       <w:pPr>
         <w:pStyle w:val="Heading2"/>
@@ -13448,8 +13932,8 @@
         </w:tc>
       </w:tr>
     </w:tbl>
-    <w:bookmarkEnd w:id="87"/>
-    <w:bookmarkStart w:id="88" w:name="lanthanite"/>
+    <w:bookmarkEnd w:id="88"/>
+    <w:bookmarkStart w:id="89" w:name="lanthanite"/>
     <w:p>
       <w:pPr>
         <w:pStyle w:val="Heading2"/>
@@ -13662,8 +14146,8 @@
         </w:tc>
       </w:tr>
     </w:tbl>
-    <w:bookmarkEnd w:id="88"/>
-    <w:bookmarkStart w:id="89" w:name="caitian"/>
+    <w:bookmarkEnd w:id="89"/>
+    <w:bookmarkStart w:id="90" w:name="caitian"/>
     <w:p>
       <w:pPr>
         <w:pStyle w:val="Heading2"/>
@@ -13876,8 +14360,8 @@
         </w:tc>
       </w:tr>
     </w:tbl>
-    <w:bookmarkEnd w:id="89"/>
-    <w:bookmarkStart w:id="90" w:name="aurelian"/>
+    <w:bookmarkEnd w:id="90"/>
+    <w:bookmarkStart w:id="91" w:name="aurelian"/>
     <w:p>
       <w:pPr>
         <w:pStyle w:val="Heading2"/>
@@ -14090,8 +14574,8 @@
         </w:tc>
       </w:tr>
     </w:tbl>
-    <w:bookmarkEnd w:id="90"/>
-    <w:bookmarkStart w:id="91" w:name="orion"/>
+    <w:bookmarkEnd w:id="91"/>
+    <w:bookmarkStart w:id="92" w:name="orion"/>
     <w:p>
       <w:pPr>
         <w:pStyle w:val="Heading2"/>
@@ -14304,8 +14788,8 @@
         </w:tc>
       </w:tr>
     </w:tbl>
-    <w:bookmarkEnd w:id="91"/>
-    <w:bookmarkStart w:id="92" w:name="denobulan"/>
+    <w:bookmarkEnd w:id="92"/>
+    <w:bookmarkStart w:id="93" w:name="denobulan"/>
     <w:p>
       <w:pPr>
         <w:pStyle w:val="Heading2"/>
@@ -14518,8 +15002,8 @@
         </w:tc>
       </w:tr>
     </w:tbl>
-    <w:bookmarkEnd w:id="92"/>
-    <w:bookmarkStart w:id="93" w:name="trill"/>
+    <w:bookmarkEnd w:id="93"/>
+    <w:bookmarkStart w:id="94" w:name="trill"/>
     <w:p>
       <w:pPr>
         <w:pStyle w:val="Heading2"/>
@@ -14740,8 +15224,8 @@
         </w:tc>
       </w:tr>
     </w:tbl>
-    <w:bookmarkEnd w:id="93"/>
-    <w:bookmarkStart w:id="94" w:name="saurian"/>
+    <w:bookmarkEnd w:id="94"/>
+    <w:bookmarkStart w:id="95" w:name="saurian"/>
     <w:p>
       <w:pPr>
         <w:pStyle w:val="Heading2"/>
@@ -14954,9 +15438,9 @@
         </w:tc>
       </w:tr>
     </w:tbl>
-    <w:bookmarkEnd w:id="94"/>
     <w:bookmarkEnd w:id="95"/>
-    <w:bookmarkStart w:id="97" w:name="complications"/>
+    <w:bookmarkEnd w:id="96"/>
+    <w:bookmarkStart w:id="98" w:name="complications"/>
     <w:p>
       <w:pPr>
         <w:pStyle w:val="Heading1"/>
@@ -15570,7 +16054,7 @@
         </w:tc>
       </w:tr>
     </w:tbl>
-    <w:bookmarkStart w:id="96" w:name="using-and-revising-traits"/>
+    <w:bookmarkStart w:id="97" w:name="using-and-revising-traits"/>
     <w:p>
       <w:pPr>
         <w:pStyle w:val="Heading2"/>
@@ -15587,9 +16071,9 @@
         <w:t xml:space="preserve">General advantages and complications describe individual crew members and can suit any species when appropriate. A Vulcan might choose Mental Discipline as a general advantage; species advantages are the only traits tied to a species. At a mission milestone, revise a trait when events change the character. Custom advantages follow the same narrow +2 benefit; custom complications need a clear trigger and a meaningful, accepted consequence.</w:t>
       </w:r>
     </w:p>
-    <w:bookmarkEnd w:id="96"/>
     <w:bookmarkEnd w:id="97"/>
-    <w:bookmarkStart w:id="101" w:name="quick-reference"/>
+    <w:bookmarkEnd w:id="98"/>
+    <w:bookmarkStart w:id="102" w:name="quick-reference"/>
     <w:p>
       <w:pPr>
         <w:pStyle w:val="Heading1"/>
@@ -15598,7 +16082,7 @@
         <w:t xml:space="preserve">Quick reference</w:t>
       </w:r>
     </w:p>
-    <w:bookmarkStart w:id="98" w:name="will-and-mental-resistance"/>
+    <w:bookmarkStart w:id="99" w:name="will-and-mental-resistance"/>
     <w:p>
       <w:pPr>
         <w:pStyle w:val="Heading2"/>
@@ -15631,8 +16115,8 @@
         <w:t xml:space="preserve">Will protects your resolve; Presence influences others. Leadership and Diplomacy still use Presence. Species adjustments may change your starting Will, but mental advantages apply only to their agreed, narrow circumstances.</w:t>
       </w:r>
     </w:p>
-    <w:bookmarkEnd w:id="98"/>
-    <w:bookmarkStart w:id="99" w:name="at-the-table"/>
+    <w:bookmarkEnd w:id="99"/>
+    <w:bookmarkStart w:id="100" w:name="at-the-table"/>
     <w:p>
       <w:pPr>
         <w:pStyle w:val="Heading2"/>
@@ -15645,7 +16129,7 @@
       <w:pPr>
         <w:numPr>
           <w:ilvl w:val="0"/>
-          <w:numId w:val="1017"/>
+          <w:numId w:val="1018"/>
         </w:numPr>
         <w:pStyle w:val="Compact"/>
       </w:pPr>
@@ -15657,7 +16141,7 @@
       <w:pPr>
         <w:numPr>
           <w:ilvl w:val="0"/>
-          <w:numId w:val="1017"/>
+          <w:numId w:val="1018"/>
         </w:numPr>
         <w:pStyle w:val="Compact"/>
       </w:pPr>
@@ -15669,7 +16153,7 @@
       <w:pPr>
         <w:numPr>
           <w:ilvl w:val="0"/>
-          <w:numId w:val="1017"/>
+          <w:numId w:val="1018"/>
         </w:numPr>
         <w:pStyle w:val="Compact"/>
       </w:pPr>
@@ -15681,7 +16165,7 @@
       <w:pPr>
         <w:numPr>
           <w:ilvl w:val="0"/>
-          <w:numId w:val="1017"/>
+          <w:numId w:val="1018"/>
         </w:numPr>
         <w:pStyle w:val="Compact"/>
       </w:pPr>
@@ -15693,7 +16177,7 @@
       <w:pPr>
         <w:numPr>
           <w:ilvl w:val="0"/>
-          <w:numId w:val="1017"/>
+          <w:numId w:val="1018"/>
         </w:numPr>
         <w:pStyle w:val="Compact"/>
       </w:pPr>
@@ -15701,8 +16185,8 @@
         <w:t xml:space="preserve">Apply the result and describe what changes.</w:t>
       </w:r>
     </w:p>
-    <w:bookmarkEnd w:id="99"/>
-    <w:bookmarkStart w:id="100" w:name="summary"/>
+    <w:bookmarkEnd w:id="100"/>
+    <w:bookmarkStart w:id="101" w:name="summary"/>
     <w:p>
       <w:pPr>
         <w:pStyle w:val="Heading2"/>
@@ -15864,13 +16348,13 @@
           <w:bCs/>
           <w:b/>
         </w:rPr>
-        <w:t xml:space="preserve">Ship:</w:t>
-      </w:r>
-      <w:r>
-        <w:t xml:space="preserve"> </w:t>
-      </w:r>
-      <w:r>
-        <w:t xml:space="preserve">Shields (3) take hits first; then Hull (4) and a system (3 each: −2, −4, offline). Normal hit 1 box, heavy hit 2. Helm evades once per exchange; Engineering clears a box.</w:t>
+        <w:t xml:space="preserve">Phaser power:</w:t>
+      </w:r>
+      <w:r>
+        <w:t xml:space="preserve"> </w:t>
+      </w:r>
+      <w:r>
+        <w:t xml:space="preserve">Type 1 holds 8, Type 2 16, rifle 30. Stun 1, heat/cut 1, kill 2, wide-beam stun 3, disintegrate 4. Spare cell refills; overload needs 4+.</w:t>
       </w:r>
     </w:p>
     <w:p>
@@ -15882,13 +16366,13 @@
           <w:bCs/>
           <w:b/>
         </w:rPr>
-        <w:t xml:space="preserve">Medicine:</w:t>
-      </w:r>
-      <w:r>
-        <w:t xml:space="preserve"> </w:t>
-      </w:r>
-      <w:r>
-        <w:t xml:space="preserve">one action to stabilize. Field care takes several minutes and clears one box, or two on success by 5. Sickbay grants +2 and clears two boxes, or three on success by 5. Major trauma may require further recovery. Rest clears one box per full day, but not from three boxes: treatment must clear the first one.</w:t>
+        <w:t xml:space="preserve">Ship:</w:t>
+      </w:r>
+      <w:r>
+        <w:t xml:space="preserve"> </w:t>
+      </w:r>
+      <w:r>
+        <w:t xml:space="preserve">Shields (3) take hits first; then Hull (4) and a system (3 each: −2, −4, offline). Normal hit 1 box, heavy hit 2. Helm evades once per exchange; Engineering clears a box.</w:t>
       </w:r>
     </w:p>
     <w:p>
@@ -15900,13 +16384,13 @@
           <w:bCs/>
           <w:b/>
         </w:rPr>
-        <w:t xml:space="preserve">Will:</w:t>
-      </w:r>
-      <w:r>
-        <w:t xml:space="preserve"> </w:t>
-      </w:r>
-      <w:r>
-        <w:t xml:space="preserve">resist overwhelming fear or mental intrusion and maintain concentration. Ordinary danger needs no roll. Fear or distraction failure normally causes hesitation or −2 on your next action.</w:t>
+        <w:t xml:space="preserve">Medicine:</w:t>
+      </w:r>
+      <w:r>
+        <w:t xml:space="preserve"> </w:t>
+      </w:r>
+      <w:r>
+        <w:t xml:space="preserve">one action to stabilize. Field care takes several minutes and clears one box, or two on success by 5. Sickbay grants +2 and clears two boxes, or three on success by 5. Major trauma may require further recovery. Rest clears one box per full day, but not from three boxes: treatment must clear the first one.</w:t>
       </w:r>
     </w:p>
     <w:p>
@@ -15918,6 +16402,24 @@
           <w:bCs/>
           <w:b/>
         </w:rPr>
+        <w:t xml:space="preserve">Will:</w:t>
+      </w:r>
+      <w:r>
+        <w:t xml:space="preserve"> </w:t>
+      </w:r>
+      <w:r>
+        <w:t xml:space="preserve">resist overwhelming fear or mental intrusion and maintain concentration. Ordinary danger needs no roll. Fear or distraction failure normally causes hesitation or −2 on your next action.</w:t>
+      </w:r>
+    </w:p>
+    <w:p>
+      <w:pPr>
+        <w:pStyle w:val="BodyText"/>
+      </w:pPr>
+      <w:r>
+        <w:rPr>
+          <w:bCs/>
+          <w:b/>
+        </w:rPr>
         <w:t xml:space="preserve">Duty points:</w:t>
       </w:r>
       <w:r>
@@ -15927,8 +16429,8 @@
         <w:t xml:space="preserve">start each session with two. Spend one to reroll, reduce an injury by one box, or establish a plausible preparation. Earn one when an accepted complication, including a companion complication, creates a meaningful problem.</w:t>
       </w:r>
     </w:p>
-    <w:bookmarkEnd w:id="100"/>
     <w:bookmarkEnd w:id="101"/>
+    <w:bookmarkEnd w:id="102"/>
     <w:sectPr/>
   </w:body>
 </w:document>
@@ -16281,6 +16783,9 @@
     <w:abstractNumId w:val="991"/>
   </w:num>
   <w:num w:numId="1010">
+    <w:abstractNumId w:val="991"/>
+  </w:num>
+  <w:num w:numId="1011">
     <w:abstractNumId w:val="99411"/>
     <w:lvlOverride w:ilvl="0">
       <w:startOverride w:val="1"/>
@@ -16310,9 +16815,6 @@
       <w:startOverride w:val="1"/>
     </w:lvlOverride>
   </w:num>
-  <w:num w:numId="1011">
-    <w:abstractNumId w:val="991"/>
-  </w:num>
   <w:num w:numId="1012">
     <w:abstractNumId w:val="991"/>
   </w:num>
@@ -16329,6 +16831,9 @@
     <w:abstractNumId w:val="991"/>
   </w:num>
   <w:num w:numId="1017">
+    <w:abstractNumId w:val="991"/>
+  </w:num>
+  <w:num w:numId="1018">
     <w:abstractNumId w:val="99411"/>
     <w:lvlOverride w:ilvl="0">
       <w:startOverride w:val="1"/>

</xml_diff>

<commit_message>
Add a standard equipment list, and copy clocks for Discord
Eleven items (communicator, tricorder, medical scanner, kits, hand phaser,
universal translator, environmental suit, field kit, emergency transponder,
anti-grav sled), each with a one-line effect in the guide's Standard
equipment table and beside its checkbox in the creator. The Clocks panel
can copy its clocks as Discord-ready text.

Co-Authored-By: Claude Opus 5.5 <noreply@anthropic.com>
Claude-Session: https://claude.ai/code/session_015SADCFzhKijkC2foUmXrpC
</commit_message>
<xml_diff>
--- a/uss-pelion/USS_Pelion_Players_Guide.docx
+++ b/uss-pelion/USS_Pelion_Players_Guide.docx
@@ -3979,7 +3979,439 @@
         <w:pStyle w:val="FirstParagraph"/>
       </w:pPr>
       <w:r>
-        <w:t xml:space="preserve">A communicator provides contact when range and interference permit. A tricorder gathers readings using Sensors; interpreting unusual results may need a science skill. An engineering kit or medical kit enables appropriate work. Ordinary equipment grants no blanket bonus; exceptional tools or preparation may justify +2. Missing essential tools can make a task impossible.</w:t>
+        <w:t xml:space="preserve">Equipment makes tasks possible rather than easier. Ordinary equipment grants no blanket bonus; exceptional tools or preparation may justify +2. Missing essential tools can make a task impossible, or very difficult (−4) when the GM finds an attempt plausible. Every crew member carries a communicator; the rest is issued for the mission.</w:t>
+      </w:r>
+    </w:p>
+    <w:tbl>
+      <w:tblPr>
+        <w:tblStyle w:val="Table"/>
+        <w:tblW w:type="pct" w:w="5000"/>
+        <w:tblLook w:firstRow="1" w:lastRow="0" w:firstColumn="0" w:lastColumn="0" w:noHBand="0" w:noVBand="0" w:val="0020"/>
+        <w:jc w:val="start"/>
+        <w:tblBorders>
+          <w:top w:val="single" w:sz="4" w:color="B8C2D3"/>
+          <w:left w:val="single" w:sz="4" w:color="B8C2D3"/>
+          <w:bottom w:val="single" w:sz="4" w:color="B8C2D3"/>
+          <w:right w:val="single" w:sz="4" w:color="B8C2D3"/>
+          <w:insideH w:val="single" w:sz="4" w:color="B8C2D3"/>
+          <w:insideV w:val="single" w:sz="4" w:color="B8C2D3"/>
+        </w:tblBorders>
+      </w:tblPr>
+      <w:tblGrid>
+        <w:gridCol w:w="3960"/>
+        <w:gridCol w:w="3960"/>
+      </w:tblGrid>
+      <w:tr>
+        <w:trPr>
+          <w:tblHeader w:val="true"/>
+        </w:trPr>
+        <w:tc>
+          <w:tcPr>
+            <w:shd w:val="clear" w:fill="E9EEF6"/>
+          </w:tcPr>
+          <w:p>
+            <w:pPr>
+              <w:pStyle w:val="Compact"/>
+              <w:jc w:val="left"/>
+            </w:pPr>
+            <w:r>
+              <w:rPr>
+                <w:b/>
+                <w:sz w:val="19"/>
+              </w:rPr>
+              <w:t xml:space="preserve">Item</w:t>
+            </w:r>
+          </w:p>
+        </w:tc>
+        <w:tc>
+          <w:tcPr>
+            <w:shd w:val="clear" w:fill="E9EEF6"/>
+          </w:tcPr>
+          <w:p>
+            <w:pPr>
+              <w:pStyle w:val="Compact"/>
+              <w:jc w:val="left"/>
+            </w:pPr>
+            <w:r>
+              <w:rPr>
+                <w:b/>
+                <w:sz w:val="19"/>
+              </w:rPr>
+              <w:t xml:space="preserve">What it does</w:t>
+            </w:r>
+          </w:p>
+        </w:tc>
+      </w:tr>
+      <w:tr>
+        <w:tc>
+          <w:tcPr/>
+          <w:p>
+            <w:pPr>
+              <w:pStyle w:val="Compact"/>
+              <w:jc w:val="left"/>
+            </w:pPr>
+            <w:r>
+              <w:rPr>
+                <w:b/>
+                <w:sz w:val="19"/>
+              </w:rPr>
+              <w:t xml:space="preserve">Communicator</w:t>
+            </w:r>
+          </w:p>
+        </w:tc>
+        <w:tc>
+          <w:tcPr/>
+          <w:p>
+            <w:pPr>
+              <w:pStyle w:val="Compact"/>
+              <w:jc w:val="left"/>
+            </w:pPr>
+            <w:r>
+              <w:rPr>
+                <w:sz w:val="19"/>
+              </w:rPr>
+              <w:t xml:space="preserve">Talks to the ship and the away team within range, and gives the transporter a lock. Interference, shielding or distance can cut it off.</w:t>
+            </w:r>
+          </w:p>
+        </w:tc>
+      </w:tr>
+      <w:tr>
+        <w:tc>
+          <w:tcPr/>
+          <w:p>
+            <w:pPr>
+              <w:pStyle w:val="Compact"/>
+              <w:jc w:val="left"/>
+            </w:pPr>
+            <w:r>
+              <w:rPr>
+                <w:b/>
+                <w:sz w:val="19"/>
+              </w:rPr>
+              <w:t xml:space="preserve">Tricorder</w:t>
+            </w:r>
+          </w:p>
+        </w:tc>
+        <w:tc>
+          <w:tcPr/>
+          <w:p>
+            <w:pPr>
+              <w:pStyle w:val="Compact"/>
+              <w:jc w:val="left"/>
+            </w:pPr>
+            <w:r>
+              <w:rPr>
+                <w:sz w:val="19"/>
+              </w:rPr>
+              <w:t xml:space="preserve">Scans life signs, energy, materials and atmosphere at short range and records the data. Field Sensors rolls need one; without it most scans are impossible.</w:t>
+            </w:r>
+          </w:p>
+        </w:tc>
+      </w:tr>
+      <w:tr>
+        <w:tc>
+          <w:tcPr/>
+          <w:p>
+            <w:pPr>
+              <w:pStyle w:val="Compact"/>
+              <w:jc w:val="left"/>
+            </w:pPr>
+            <w:r>
+              <w:rPr>
+                <w:b/>
+                <w:sz w:val="19"/>
+              </w:rPr>
+              <w:t xml:space="preserve">Medical scanner</w:t>
+            </w:r>
+          </w:p>
+        </w:tc>
+        <w:tc>
+          <w:tcPr/>
+          <w:p>
+            <w:pPr>
+              <w:pStyle w:val="Compact"/>
+              <w:jc w:val="left"/>
+            </w:pPr>
+            <w:r>
+              <w:rPr>
+                <w:sz w:val="19"/>
+              </w:rPr>
+              <w:t xml:space="preserve">Identifies ordinary injuries automatically. Diagnosing unfamiliar physiology or disease without one is very difficult (−4) or impossible.</w:t>
+            </w:r>
+          </w:p>
+        </w:tc>
+      </w:tr>
+      <w:tr>
+        <w:tc>
+          <w:tcPr/>
+          <w:p>
+            <w:pPr>
+              <w:pStyle w:val="Compact"/>
+              <w:jc w:val="left"/>
+            </w:pPr>
+            <w:r>
+              <w:rPr>
+                <w:b/>
+                <w:sz w:val="19"/>
+              </w:rPr>
+              <w:t xml:space="preserve">Medical kit</w:t>
+            </w:r>
+          </w:p>
+        </w:tc>
+        <w:tc>
+          <w:tcPr/>
+          <w:p>
+            <w:pPr>
+              <w:pStyle w:val="Compact"/>
+              <w:jc w:val="left"/>
+            </w:pPr>
+            <w:r>
+              <w:rPr>
+                <w:sz w:val="19"/>
+              </w:rPr>
+              <w:t xml:space="preserve">Hyposprays, drugs and dressings. Needed for emergency stabilization and field treatment.</w:t>
+            </w:r>
+          </w:p>
+        </w:tc>
+      </w:tr>
+      <w:tr>
+        <w:tc>
+          <w:tcPr/>
+          <w:p>
+            <w:pPr>
+              <w:pStyle w:val="Compact"/>
+              <w:jc w:val="left"/>
+            </w:pPr>
+            <w:r>
+              <w:rPr>
+                <w:b/>
+                <w:sz w:val="19"/>
+              </w:rPr>
+              <w:t xml:space="preserve">Engineering kit</w:t>
+            </w:r>
+          </w:p>
+        </w:tc>
+        <w:tc>
+          <w:tcPr/>
+          <w:p>
+            <w:pPr>
+              <w:pStyle w:val="Compact"/>
+              <w:jc w:val="left"/>
+            </w:pPr>
+            <w:r>
+              <w:rPr>
+                <w:sz w:val="19"/>
+              </w:rPr>
+              <w:t xml:space="preserve">Hand tools, spare parts and test gear. Needed for most Engineering and Electronics repairs in the field.</w:t>
+            </w:r>
+          </w:p>
+        </w:tc>
+      </w:tr>
+      <w:tr>
+        <w:tc>
+          <w:tcPr/>
+          <w:p>
+            <w:pPr>
+              <w:pStyle w:val="Compact"/>
+              <w:jc w:val="left"/>
+            </w:pPr>
+            <w:r>
+              <w:rPr>
+                <w:b/>
+                <w:sz w:val="19"/>
+              </w:rPr>
+              <w:t xml:space="preserve">Hand phaser</w:t>
+            </w:r>
+          </w:p>
+        </w:tc>
+        <w:tc>
+          <w:tcPr/>
+          <w:p>
+            <w:pPr>
+              <w:pStyle w:val="Compact"/>
+              <w:jc w:val="left"/>
+            </w:pPr>
+            <w:r>
+              <w:rPr>
+                <w:sz w:val="19"/>
+              </w:rPr>
+              <w:t xml:space="preserve">Type 1 (8 power) or Type 2 (16). Settings and power costs are under Phaser power.</w:t>
+            </w:r>
+          </w:p>
+        </w:tc>
+      </w:tr>
+      <w:tr>
+        <w:tc>
+          <w:tcPr/>
+          <w:p>
+            <w:pPr>
+              <w:pStyle w:val="Compact"/>
+              <w:jc w:val="left"/>
+            </w:pPr>
+            <w:r>
+              <w:rPr>
+                <w:b/>
+                <w:sz w:val="19"/>
+              </w:rPr>
+              <w:t xml:space="preserve">Universal translator</w:t>
+            </w:r>
+          </w:p>
+        </w:tc>
+        <w:tc>
+          <w:tcPr/>
+          <w:p>
+            <w:pPr>
+              <w:pStyle w:val="Compact"/>
+              <w:jc w:val="left"/>
+            </w:pPr>
+            <w:r>
+              <w:rPr>
+                <w:sz w:val="19"/>
+              </w:rPr>
+              <w:t xml:space="preserve">Lets you talk with speakers of known languages. A new language takes time to learn; a Communications roll can speed it up.</w:t>
+            </w:r>
+          </w:p>
+        </w:tc>
+      </w:tr>
+      <w:tr>
+        <w:tc>
+          <w:tcPr/>
+          <w:p>
+            <w:pPr>
+              <w:pStyle w:val="Compact"/>
+              <w:jc w:val="left"/>
+            </w:pPr>
+            <w:r>
+              <w:rPr>
+                <w:b/>
+                <w:sz w:val="19"/>
+              </w:rPr>
+              <w:t xml:space="preserve">Environmental suit</w:t>
+            </w:r>
+          </w:p>
+        </w:tc>
+        <w:tc>
+          <w:tcPr/>
+          <w:p>
+            <w:pPr>
+              <w:pStyle w:val="Compact"/>
+              <w:jc w:val="left"/>
+            </w:pPr>
+            <w:r>
+              <w:rPr>
+                <w:sz w:val="19"/>
+              </w:rPr>
+              <w:t xml:space="preserve">Several hours in vacuum, toxic air, cold or radiation. −2 to Agility-based actions and Stealth while worn.</w:t>
+            </w:r>
+          </w:p>
+        </w:tc>
+      </w:tr>
+      <w:tr>
+        <w:tc>
+          <w:tcPr/>
+          <w:p>
+            <w:pPr>
+              <w:pStyle w:val="Compact"/>
+              <w:jc w:val="left"/>
+            </w:pPr>
+            <w:r>
+              <w:rPr>
+                <w:b/>
+                <w:sz w:val="19"/>
+              </w:rPr>
+              <w:t xml:space="preserve">Field kit</w:t>
+            </w:r>
+          </w:p>
+        </w:tc>
+        <w:tc>
+          <w:tcPr/>
+          <w:p>
+            <w:pPr>
+              <w:pStyle w:val="Compact"/>
+              <w:jc w:val="left"/>
+            </w:pPr>
+            <w:r>
+              <w:rPr>
+                <w:sz w:val="19"/>
+              </w:rPr>
+              <w:t xml:space="preserve">Rations, water, light, rope and climbing gear for a few days. Turns impossible survival and climbing tasks into ordinary ones; no bonus beyond that.</w:t>
+            </w:r>
+          </w:p>
+        </w:tc>
+      </w:tr>
+      <w:tr>
+        <w:tc>
+          <w:tcPr/>
+          <w:p>
+            <w:pPr>
+              <w:pStyle w:val="Compact"/>
+              <w:jc w:val="left"/>
+            </w:pPr>
+            <w:r>
+              <w:rPr>
+                <w:b/>
+                <w:sz w:val="19"/>
+              </w:rPr>
+              <w:t xml:space="preserve">Emergency transponder</w:t>
+            </w:r>
+          </w:p>
+        </w:tc>
+        <w:tc>
+          <w:tcPr/>
+          <w:p>
+            <w:pPr>
+              <w:pStyle w:val="Compact"/>
+              <w:jc w:val="left"/>
+            </w:pPr>
+            <w:r>
+              <w:rPr>
+                <w:sz w:val="19"/>
+              </w:rPr>
+              <w:t xml:space="preserve">Broadcasts your position to the ship and helps a transporter lock through light interference.</w:t>
+            </w:r>
+          </w:p>
+        </w:tc>
+      </w:tr>
+      <w:tr>
+        <w:tc>
+          <w:tcPr/>
+          <w:p>
+            <w:pPr>
+              <w:pStyle w:val="Compact"/>
+              <w:jc w:val="left"/>
+            </w:pPr>
+            <w:r>
+              <w:rPr>
+                <w:b/>
+                <w:sz w:val="19"/>
+              </w:rPr>
+              <w:t xml:space="preserve">Anti-grav sled</w:t>
+            </w:r>
+          </w:p>
+        </w:tc>
+        <w:tc>
+          <w:tcPr/>
+          <w:p>
+            <w:pPr>
+              <w:pStyle w:val="Compact"/>
+              <w:jc w:val="left"/>
+            </w:pPr>
+            <w:r>
+              <w:rPr>
+                <w:sz w:val="19"/>
+              </w:rPr>
+              <w:t xml:space="preserve">Carries heavy loads or a casualty at walking pace. Hard to move quietly (−2 Stealth).</w:t>
+            </w:r>
+          </w:p>
+        </w:tc>
+      </w:tr>
+    </w:tbl>
+    <w:p>
+      <w:pPr>
+        <w:pStyle w:val="BodyText"/>
+      </w:pPr>
+      <w:r>
+        <w:t xml:space="preserve">A tricorder finds readings; interpreting unusual results may still need a science skill. Spare power cells for phasers are listed under Phaser power.</w:t>
       </w:r>
     </w:p>
     <w:p>

</xml_diff>

<commit_message>
USS Pelion guide: add a Discord commands chapter for players and GMs
Lists the dice bot's player and GM commands with Pelion examples (Duty
points, ship status), and lets code in guide tables wrap on phones.

Co-Authored-By: Claude Opus 5.5 <noreply@anthropic.com>
Claude-Session: https://claude.ai/code/session_015SADCFzhKijkC2foUmXrpC
</commit_message>
<xml_diff>
--- a/uss-pelion/USS_Pelion_Players_Guide.docx
+++ b/uss-pelion/USS_Pelion_Players_Guide.docx
@@ -16863,6 +16863,1154 @@
     </w:p>
     <w:bookmarkEnd w:id="101"/>
     <w:bookmarkEnd w:id="102"/>
+    <w:bookmarkStart w:id="105" w:name="discord-commands"/>
+    <w:p>
+      <w:pPr>
+        <w:pStyle w:val="Heading1"/>
+      </w:pPr>
+      <w:r>
+        <w:t xml:space="preserve">Discord commands</w:t>
+      </w:r>
+    </w:p>
+    <w:p>
+      <w:pPr>
+        <w:pStyle w:val="FirstParagraph"/>
+      </w:pPr>
+      <w:r>
+        <w:t xml:space="preserve">The table’s Discord bot rolls the dice and keeps the shared Duty points, clocks and Ship status tracks for the server. Type</w:t>
+      </w:r>
+      <w:r>
+        <w:t xml:space="preserve"> </w:t>
+      </w:r>
+      <w:r>
+        <w:rPr>
+          <w:rStyle w:val="VerbatimChar"/>
+        </w:rPr>
+        <w:t xml:space="preserve">/</w:t>
+      </w:r>
+      <w:r>
+        <w:t xml:space="preserve"> </w:t>
+      </w:r>
+      <w:r>
+        <w:t xml:space="preserve">in a channel to see the commands; Discord shows each option as you fill it in. The bot doesn’t know your sheet, so you give it the target number.</w:t>
+      </w:r>
+    </w:p>
+    <w:bookmarkStart w:id="103" w:name="for-players"/>
+    <w:p>
+      <w:pPr>
+        <w:pStyle w:val="Heading2"/>
+      </w:pPr>
+      <w:r>
+        <w:t xml:space="preserve">For players</w:t>
+      </w:r>
+    </w:p>
+    <w:tbl>
+      <w:tblPr>
+        <w:tblStyle w:val="Table"/>
+        <w:tblW w:type="pct" w:w="5000"/>
+        <w:tblLook w:firstRow="1" w:lastRow="0" w:firstColumn="0" w:lastColumn="0" w:noHBand="0" w:noVBand="0" w:val="0020"/>
+        <w:jc w:val="start"/>
+        <w:tblBorders>
+          <w:top w:val="single" w:sz="4" w:color="B8C2D3"/>
+          <w:left w:val="single" w:sz="4" w:color="B8C2D3"/>
+          <w:bottom w:val="single" w:sz="4" w:color="B8C2D3"/>
+          <w:right w:val="single" w:sz="4" w:color="B8C2D3"/>
+          <w:insideH w:val="single" w:sz="4" w:color="B8C2D3"/>
+          <w:insideV w:val="single" w:sz="4" w:color="B8C2D3"/>
+        </w:tblBorders>
+      </w:tblPr>
+      <w:tblGrid>
+        <w:gridCol w:w="3960"/>
+        <w:gridCol w:w="3960"/>
+      </w:tblGrid>
+      <w:tr>
+        <w:trPr>
+          <w:tblHeader w:val="true"/>
+        </w:trPr>
+        <w:tc>
+          <w:tcPr>
+            <w:shd w:val="clear" w:fill="E9EEF6"/>
+          </w:tcPr>
+          <w:p>
+            <w:pPr>
+              <w:pStyle w:val="Compact"/>
+              <w:jc w:val="left"/>
+            </w:pPr>
+            <w:r>
+              <w:rPr>
+                <w:b/>
+                <w:sz w:val="19"/>
+              </w:rPr>
+              <w:t xml:space="preserve">Command</w:t>
+            </w:r>
+          </w:p>
+        </w:tc>
+        <w:tc>
+          <w:tcPr>
+            <w:shd w:val="clear" w:fill="E9EEF6"/>
+          </w:tcPr>
+          <w:p>
+            <w:pPr>
+              <w:pStyle w:val="Compact"/>
+              <w:jc w:val="left"/>
+            </w:pPr>
+            <w:r>
+              <w:rPr>
+                <w:b/>
+                <w:sz w:val="19"/>
+              </w:rPr>
+              <w:t xml:space="preserve">What it does</w:t>
+            </w:r>
+          </w:p>
+        </w:tc>
+      </w:tr>
+      <w:tr>
+        <w:tc>
+          <w:tcPr/>
+          <w:p>
+            <w:pPr>
+              <w:pStyle w:val="Compact"/>
+              <w:jc w:val="left"/>
+            </w:pPr>
+            <w:r>
+              <w:rPr>
+                <w:rStyle w:val="VerbatimChar"/>
+                <w:b/>
+                <w:sz w:val="19"/>
+              </w:rPr>
+              <w:t xml:space="preserve">/roll target:16 modifier:-2 label:Sensors</w:t>
+            </w:r>
+          </w:p>
+        </w:tc>
+        <w:tc>
+          <w:tcPr/>
+          <w:p>
+            <w:pPr>
+              <w:pStyle w:val="Compact"/>
+              <w:jc w:val="left"/>
+            </w:pPr>
+            <w:r>
+              <w:rPr>
+                <w:sz w:val="19"/>
+              </w:rPr>
+              <w:t xml:space="preserve">Roll 3d6 under your target. Use the number from your sheet, and add up every modifier yourself: circumstance, injury, assistance. The bot shows the result, the margin and your chance.</w:t>
+            </w:r>
+            <w:r>
+              <w:rPr>
+                <w:sz w:val="19"/>
+              </w:rPr>
+              <w:t xml:space="preserve"> </w:t>
+            </w:r>
+            <w:r>
+              <w:rPr>
+                <w:bCs/>
+                <w:b/>
+                <w:sz w:val="19"/>
+              </w:rPr>
+              <w:t xml:space="preserve">Spend a Duty point to reroll</w:t>
+            </w:r>
+            <w:r>
+              <w:rPr>
+                <w:sz w:val="19"/>
+              </w:rPr>
+              <w:t xml:space="preserve"> </w:t>
+            </w:r>
+            <w:r>
+              <w:rPr>
+                <w:sz w:val="19"/>
+              </w:rPr>
+              <w:t xml:space="preserve">lets you reroll once, and the second result stands.</w:t>
+            </w:r>
+          </w:p>
+        </w:tc>
+      </w:tr>
+      <w:tr>
+        <w:tc>
+          <w:tcPr/>
+          <w:p>
+            <w:pPr>
+              <w:pStyle w:val="Compact"/>
+              <w:jc w:val="left"/>
+            </w:pPr>
+            <w:r>
+              <w:rPr>
+                <w:rStyle w:val="VerbatimChar"/>
+                <w:b/>
+                <w:sz w:val="19"/>
+              </w:rPr>
+              <w:t xml:space="preserve">/contest target:16 opponent:13 opponent_name:"Klingon warrior" label:Grapple</w:t>
+            </w:r>
+          </w:p>
+        </w:tc>
+        <w:tc>
+          <w:tcPr/>
+          <w:p>
+            <w:pPr>
+              <w:pStyle w:val="Compact"/>
+              <w:jc w:val="left"/>
+            </w:pPr>
+            <w:r>
+              <w:rPr>
+                <w:sz w:val="19"/>
+              </w:rPr>
+              <w:t xml:space="preserve">An opposed roll. The bot rolls both sides and names the winner. Ties and double failures go to the defender, which is the opponent unless you add</w:t>
+            </w:r>
+            <w:r>
+              <w:rPr>
+                <w:sz w:val="19"/>
+              </w:rPr>
+              <w:t xml:space="preserve"> </w:t>
+            </w:r>
+            <w:r>
+              <w:rPr>
+                <w:rStyle w:val="VerbatimChar"/>
+                <w:sz w:val="19"/>
+              </w:rPr>
+              <w:t xml:space="preserve">defender:me</w:t>
+            </w:r>
+            <w:r>
+              <w:rPr>
+                <w:sz w:val="19"/>
+              </w:rPr>
+              <w:t xml:space="preserve">.</w:t>
+            </w:r>
+          </w:p>
+        </w:tc>
+      </w:tr>
+      <w:tr>
+        <w:tc>
+          <w:tcPr/>
+          <w:p>
+            <w:pPr>
+              <w:pStyle w:val="Compact"/>
+              <w:jc w:val="left"/>
+            </w:pPr>
+            <w:r>
+              <w:rPr>
+                <w:rStyle w:val="VerbatimChar"/>
+                <w:b/>
+                <w:sz w:val="19"/>
+              </w:rPr>
+              <w:t xml:space="preserve">/assist target:12 helper_target:14 helper:@name label:"Repair the overload"</w:t>
+            </w:r>
+          </w:p>
+        </w:tc>
+        <w:tc>
+          <w:tcPr/>
+          <w:p>
+            <w:pPr>
+              <w:pStyle w:val="Compact"/>
+              <w:jc w:val="left"/>
+            </w:pPr>
+            <w:r>
+              <w:rPr>
+                <w:sz w:val="19"/>
+              </w:rPr>
+              <w:t xml:space="preserve">Someone helps you. They roll first (Engineering, say): success gives +1, success by 5 or more +2, and a natural 18 brings a complication. Then you roll with their bonus.</w:t>
+            </w:r>
+          </w:p>
+        </w:tc>
+      </w:tr>
+      <w:tr>
+        <w:tc>
+          <w:tcPr/>
+          <w:p>
+            <w:pPr>
+              <w:pStyle w:val="Compact"/>
+              <w:jc w:val="left"/>
+            </w:pPr>
+            <w:r>
+              <w:rPr>
+                <w:rStyle w:val="VerbatimChar"/>
+                <w:b/>
+                <w:sz w:val="19"/>
+              </w:rPr>
+              <w:t xml:space="preserve">/points show</w:t>
+            </w:r>
+          </w:p>
+        </w:tc>
+        <w:tc>
+          <w:tcPr/>
+          <w:p>
+            <w:pPr>
+              <w:pStyle w:val="Compact"/>
+              <w:jc w:val="left"/>
+            </w:pPr>
+            <w:r>
+              <w:rPr>
+                <w:sz w:val="19"/>
+              </w:rPr>
+              <w:t xml:space="preserve">Your Duty points this session. Add</w:t>
+            </w:r>
+            <w:r>
+              <w:rPr>
+                <w:sz w:val="19"/>
+              </w:rPr>
+              <w:t xml:space="preserve"> </w:t>
+            </w:r>
+            <w:r>
+              <w:rPr>
+                <w:rStyle w:val="VerbatimChar"/>
+                <w:sz w:val="19"/>
+              </w:rPr>
+              <w:t xml:space="preserve">player:@name</w:t>
+            </w:r>
+            <w:r>
+              <w:rPr>
+                <w:sz w:val="19"/>
+              </w:rPr>
+              <w:t xml:space="preserve"> </w:t>
+            </w:r>
+            <w:r>
+              <w:rPr>
+                <w:sz w:val="19"/>
+              </w:rPr>
+              <w:t xml:space="preserve">to see someone else’s.</w:t>
+            </w:r>
+          </w:p>
+        </w:tc>
+      </w:tr>
+      <w:tr>
+        <w:tc>
+          <w:tcPr/>
+          <w:p>
+            <w:pPr>
+              <w:pStyle w:val="Compact"/>
+              <w:jc w:val="left"/>
+            </w:pPr>
+            <w:r>
+              <w:rPr>
+                <w:rStyle w:val="VerbatimChar"/>
+                <w:b/>
+                <w:sz w:val="19"/>
+              </w:rPr>
+              <w:t xml:space="preserve">/points spend</w:t>
+            </w:r>
+          </w:p>
+        </w:tc>
+        <w:tc>
+          <w:tcPr/>
+          <w:p>
+            <w:pPr>
+              <w:pStyle w:val="Compact"/>
+              <w:jc w:val="left"/>
+            </w:pPr>
+            <w:r>
+              <w:rPr>
+                <w:sz w:val="19"/>
+              </w:rPr>
+              <w:t xml:space="preserve">Spend a Duty point without rolling, e.g. to reduce an injury by one box or to establish a small preparation.</w:t>
+            </w:r>
+          </w:p>
+        </w:tc>
+      </w:tr>
+      <w:tr>
+        <w:tc>
+          <w:tcPr/>
+          <w:p>
+            <w:pPr>
+              <w:pStyle w:val="Compact"/>
+              <w:jc w:val="left"/>
+            </w:pPr>
+            <w:r>
+              <w:rPr>
+                <w:rStyle w:val="VerbatimChar"/>
+                <w:b/>
+                <w:sz w:val="19"/>
+              </w:rPr>
+              <w:t xml:space="preserve">/points gain</w:t>
+            </w:r>
+          </w:p>
+        </w:tc>
+        <w:tc>
+          <w:tcPr/>
+          <w:p>
+            <w:pPr>
+              <w:pStyle w:val="Compact"/>
+              <w:jc w:val="left"/>
+            </w:pPr>
+            <w:r>
+              <w:rPr>
+                <w:sz w:val="19"/>
+              </w:rPr>
+              <w:t xml:space="preserve">Gain a Duty point, e.g. when you accept a complication the GM offers. With Extra Duty, use it once at the start of a session.</w:t>
+            </w:r>
+          </w:p>
+        </w:tc>
+      </w:tr>
+      <w:tr>
+        <w:tc>
+          <w:tcPr/>
+          <w:p>
+            <w:pPr>
+              <w:pStyle w:val="Compact"/>
+              <w:jc w:val="left"/>
+            </w:pPr>
+            <w:r>
+              <w:rPr>
+                <w:rStyle w:val="VerbatimChar"/>
+                <w:b/>
+                <w:sz w:val="19"/>
+              </w:rPr>
+              <w:t xml:space="preserve">/clock show</w:t>
+            </w:r>
+          </w:p>
+        </w:tc>
+        <w:tc>
+          <w:tcPr/>
+          <w:p>
+            <w:pPr>
+              <w:pStyle w:val="Compact"/>
+              <w:jc w:val="left"/>
+            </w:pPr>
+            <w:r>
+              <w:rPr>
+                <w:sz w:val="19"/>
+              </w:rPr>
+              <w:t xml:space="preserve">Every clock the GM is running.</w:t>
+            </w:r>
+          </w:p>
+        </w:tc>
+      </w:tr>
+      <w:tr>
+        <w:tc>
+          <w:tcPr/>
+          <w:p>
+            <w:pPr>
+              <w:pStyle w:val="Compact"/>
+              <w:jc w:val="left"/>
+            </w:pPr>
+            <w:r>
+              <w:rPr>
+                <w:rStyle w:val="VerbatimChar"/>
+                <w:b/>
+                <w:sz w:val="19"/>
+              </w:rPr>
+              <w:t xml:space="preserve">/track show</w:t>
+            </w:r>
+          </w:p>
+        </w:tc>
+        <w:tc>
+          <w:tcPr/>
+          <w:p>
+            <w:pPr>
+              <w:pStyle w:val="Compact"/>
+              <w:jc w:val="left"/>
+            </w:pPr>
+            <w:r>
+              <w:rPr>
+                <w:sz w:val="19"/>
+              </w:rPr>
+              <w:t xml:space="preserve">The shared Ship status tracks (Shields, Hull, Weapons, Engines, Sensors, Communications, Transporters, Life support) and what each one means right now.</w:t>
+            </w:r>
+          </w:p>
+        </w:tc>
+      </w:tr>
+    </w:tbl>
+    <w:p>
+      <w:pPr>
+        <w:pStyle w:val="BodyText"/>
+      </w:pPr>
+      <w:r>
+        <w:t xml:space="preserve">The bot’s original names still work:</w:t>
+      </w:r>
+      <w:r>
+        <w:t xml:space="preserve"> </w:t>
+      </w:r>
+      <w:r>
+        <w:rPr>
+          <w:rStyle w:val="VerbatimChar"/>
+        </w:rPr>
+        <w:t xml:space="preserve">/pelion</w:t>
+      </w:r>
+      <w:r>
+        <w:t xml:space="preserve"> </w:t>
+      </w:r>
+      <w:r>
+        <w:t xml:space="preserve">is the same as</w:t>
+      </w:r>
+      <w:r>
+        <w:t xml:space="preserve"> </w:t>
+      </w:r>
+      <w:r>
+        <w:rPr>
+          <w:rStyle w:val="VerbatimChar"/>
+        </w:rPr>
+        <w:t xml:space="preserve">/roll</w:t>
+      </w:r>
+      <w:r>
+        <w:t xml:space="preserve">, and</w:t>
+      </w:r>
+      <w:r>
+        <w:t xml:space="preserve"> </w:t>
+      </w:r>
+      <w:r>
+        <w:rPr>
+          <w:rStyle w:val="VerbatimChar"/>
+        </w:rPr>
+        <w:t xml:space="preserve">/duty</w:t>
+      </w:r>
+      <w:r>
+        <w:t xml:space="preserve"> </w:t>
+      </w:r>
+      <w:r>
+        <w:t xml:space="preserve">is the same as</w:t>
+      </w:r>
+      <w:r>
+        <w:t xml:space="preserve"> </w:t>
+      </w:r>
+      <w:r>
+        <w:rPr>
+          <w:rStyle w:val="VerbatimChar"/>
+        </w:rPr>
+        <w:t xml:space="preserve">/points</w:t>
+      </w:r>
+      <w:r>
+        <w:t xml:space="preserve">.</w:t>
+      </w:r>
+    </w:p>
+    <w:p>
+      <w:pPr>
+        <w:pStyle w:val="BodyText"/>
+      </w:pPr>
+      <w:r>
+        <w:t xml:space="preserve">Only the player who rolled can press the reroll button. Rolls that miss by 1 or 2 remind the GM that success at a cost is on offer.</w:t>
+      </w:r>
+    </w:p>
+    <w:bookmarkEnd w:id="103"/>
+    <w:bookmarkStart w:id="104" w:name="for-the-gm"/>
+    <w:p>
+      <w:pPr>
+        <w:pStyle w:val="Heading2"/>
+      </w:pPr>
+      <w:r>
+        <w:t xml:space="preserve">For the GM</w:t>
+      </w:r>
+    </w:p>
+    <w:p>
+      <w:pPr>
+        <w:pStyle w:val="FirstParagraph"/>
+      </w:pPr>
+      <w:r>
+        <w:t xml:space="preserve">GM commands need the</w:t>
+      </w:r>
+      <w:r>
+        <w:t xml:space="preserve"> </w:t>
+      </w:r>
+      <w:r>
+        <w:rPr>
+          <w:bCs/>
+          <w:b/>
+        </w:rPr>
+        <w:t xml:space="preserve">Manage Server</w:t>
+      </w:r>
+      <w:r>
+        <w:t xml:space="preserve"> </w:t>
+      </w:r>
+      <w:r>
+        <w:t xml:space="preserve">permission on the Discord server. Everyone can see clocks, tracks and points.</w:t>
+      </w:r>
+    </w:p>
+    <w:tbl>
+      <w:tblPr>
+        <w:tblStyle w:val="Table"/>
+        <w:tblW w:type="pct" w:w="5000"/>
+        <w:tblLook w:firstRow="1" w:lastRow="0" w:firstColumn="0" w:lastColumn="0" w:noHBand="0" w:noVBand="0" w:val="0020"/>
+        <w:jc w:val="start"/>
+        <w:tblBorders>
+          <w:top w:val="single" w:sz="4" w:color="B8C2D3"/>
+          <w:left w:val="single" w:sz="4" w:color="B8C2D3"/>
+          <w:bottom w:val="single" w:sz="4" w:color="B8C2D3"/>
+          <w:right w:val="single" w:sz="4" w:color="B8C2D3"/>
+          <w:insideH w:val="single" w:sz="4" w:color="B8C2D3"/>
+          <w:insideV w:val="single" w:sz="4" w:color="B8C2D3"/>
+        </w:tblBorders>
+      </w:tblPr>
+      <w:tblGrid>
+        <w:gridCol w:w="3960"/>
+        <w:gridCol w:w="3960"/>
+      </w:tblGrid>
+      <w:tr>
+        <w:trPr>
+          <w:tblHeader w:val="true"/>
+        </w:trPr>
+        <w:tc>
+          <w:tcPr>
+            <w:shd w:val="clear" w:fill="E9EEF6"/>
+          </w:tcPr>
+          <w:p>
+            <w:pPr>
+              <w:pStyle w:val="Compact"/>
+              <w:jc w:val="left"/>
+            </w:pPr>
+            <w:r>
+              <w:rPr>
+                <w:b/>
+                <w:sz w:val="19"/>
+              </w:rPr>
+              <w:t xml:space="preserve">Command</w:t>
+            </w:r>
+          </w:p>
+        </w:tc>
+        <w:tc>
+          <w:tcPr>
+            <w:shd w:val="clear" w:fill="E9EEF6"/>
+          </w:tcPr>
+          <w:p>
+            <w:pPr>
+              <w:pStyle w:val="Compact"/>
+              <w:jc w:val="left"/>
+            </w:pPr>
+            <w:r>
+              <w:rPr>
+                <w:b/>
+                <w:sz w:val="19"/>
+              </w:rPr>
+              <w:t xml:space="preserve">What it does</w:t>
+            </w:r>
+          </w:p>
+        </w:tc>
+      </w:tr>
+      <w:tr>
+        <w:tc>
+          <w:tcPr/>
+          <w:p>
+            <w:pPr>
+              <w:pStyle w:val="Compact"/>
+              <w:jc w:val="left"/>
+            </w:pPr>
+            <w:r>
+              <w:rPr>
+                <w:rStyle w:val="VerbatimChar"/>
+                <w:b/>
+                <w:sz w:val="19"/>
+              </w:rPr>
+              <w:t xml:space="preserve">/game set game:USS Pelion</w:t>
+            </w:r>
+          </w:p>
+        </w:tc>
+        <w:tc>
+          <w:tcPr/>
+          <w:p>
+            <w:pPr>
+              <w:pStyle w:val="Compact"/>
+              <w:jc w:val="left"/>
+            </w:pPr>
+            <w:r>
+              <w:rPr>
+                <w:sz w:val="19"/>
+              </w:rPr>
+              <w:t xml:space="preserve">Choose this server’s game. Do it once;</w:t>
+            </w:r>
+            <w:r>
+              <w:rPr>
+                <w:sz w:val="19"/>
+              </w:rPr>
+              <w:t xml:space="preserve"> </w:t>
+            </w:r>
+            <w:r>
+              <w:rPr>
+                <w:rStyle w:val="VerbatimChar"/>
+                <w:sz w:val="19"/>
+              </w:rPr>
+              <w:t xml:space="preserve">/game show</w:t>
+            </w:r>
+            <w:r>
+              <w:rPr>
+                <w:sz w:val="19"/>
+              </w:rPr>
+              <w:t xml:space="preserve"> </w:t>
+            </w:r>
+            <w:r>
+              <w:rPr>
+                <w:sz w:val="19"/>
+              </w:rPr>
+              <w:t xml:space="preserve">checks it.</w:t>
+            </w:r>
+          </w:p>
+        </w:tc>
+      </w:tr>
+      <w:tr>
+        <w:tc>
+          <w:tcPr/>
+          <w:p>
+            <w:pPr>
+              <w:pStyle w:val="Compact"/>
+              <w:jc w:val="left"/>
+            </w:pPr>
+            <w:r>
+              <w:rPr>
+                <w:rStyle w:val="VerbatimChar"/>
+                <w:b/>
+                <w:sz w:val="19"/>
+              </w:rPr>
+              <w:t xml:space="preserve">/points newsession</w:t>
+            </w:r>
+          </w:p>
+        </w:tc>
+        <w:tc>
+          <w:tcPr/>
+          <w:p>
+            <w:pPr>
+              <w:pStyle w:val="Compact"/>
+              <w:jc w:val="left"/>
+            </w:pPr>
+            <w:r>
+              <w:rPr>
+                <w:sz w:val="19"/>
+              </w:rPr>
+              <w:t xml:space="preserve">Start a session: everyone goes back to two Duty points, and unused points are gone.</w:t>
+            </w:r>
+          </w:p>
+        </w:tc>
+      </w:tr>
+      <w:tr>
+        <w:tc>
+          <w:tcPr/>
+          <w:p>
+            <w:pPr>
+              <w:pStyle w:val="Compact"/>
+              <w:jc w:val="left"/>
+            </w:pPr>
+            <w:r>
+              <w:rPr>
+                <w:rStyle w:val="VerbatimChar"/>
+                <w:b/>
+                <w:sz w:val="19"/>
+              </w:rPr>
+              <w:t xml:space="preserve">/points gain player:@name</w:t>
+            </w:r>
+          </w:p>
+        </w:tc>
+        <w:tc>
+          <w:tcPr/>
+          <w:p>
+            <w:pPr>
+              <w:pStyle w:val="Compact"/>
+              <w:jc w:val="left"/>
+            </w:pPr>
+            <w:r>
+              <w:rPr>
+                <w:sz w:val="19"/>
+              </w:rPr>
+              <w:t xml:space="preserve">Award a Duty point, e.g. for an accepted complication.</w:t>
+            </w:r>
+          </w:p>
+        </w:tc>
+      </w:tr>
+      <w:tr>
+        <w:tc>
+          <w:tcPr/>
+          <w:p>
+            <w:pPr>
+              <w:pStyle w:val="Compact"/>
+              <w:jc w:val="left"/>
+            </w:pPr>
+            <w:r>
+              <w:rPr>
+                <w:rStyle w:val="VerbatimChar"/>
+                <w:b/>
+                <w:sz w:val="19"/>
+              </w:rPr>
+              <w:t xml:space="preserve">/points set player:@name points:3</w:t>
+            </w:r>
+          </w:p>
+        </w:tc>
+        <w:tc>
+          <w:tcPr/>
+          <w:p>
+            <w:pPr>
+              <w:pStyle w:val="Compact"/>
+              <w:jc w:val="left"/>
+            </w:pPr>
+            <w:r>
+              <w:rPr>
+                <w:sz w:val="19"/>
+              </w:rPr>
+              <w:t xml:space="preserve">Correct a player’s total.</w:t>
+            </w:r>
+          </w:p>
+        </w:tc>
+      </w:tr>
+      <w:tr>
+        <w:tc>
+          <w:tcPr/>
+          <w:p>
+            <w:pPr>
+              <w:pStyle w:val="Compact"/>
+              <w:jc w:val="left"/>
+            </w:pPr>
+            <w:r>
+              <w:rPr>
+                <w:rStyle w:val="VerbatimChar"/>
+                <w:b/>
+                <w:sz w:val="19"/>
+              </w:rPr>
+              <w:t xml:space="preserve">/clock new name:"Orbit decays" segments:6 kind:danger</w:t>
+            </w:r>
+          </w:p>
+        </w:tc>
+        <w:tc>
+          <w:tcPr/>
+          <w:p>
+            <w:pPr>
+              <w:pStyle w:val="Compact"/>
+              <w:jc w:val="left"/>
+            </w:pPr>
+            <w:r>
+              <w:rPr>
+                <w:sz w:val="19"/>
+              </w:rPr>
+              <w:t xml:space="preserve">Start a clock of 2, 4, 6 or 8 segments. Danger clocks fill on failures and time; use</w:t>
+            </w:r>
+            <w:r>
+              <w:rPr>
+                <w:sz w:val="19"/>
+              </w:rPr>
+              <w:t xml:space="preserve"> </w:t>
+            </w:r>
+            <w:r>
+              <w:rPr>
+                <w:rStyle w:val="VerbatimChar"/>
+                <w:sz w:val="19"/>
+              </w:rPr>
+              <w:t xml:space="preserve">kind:progress</w:t>
+            </w:r>
+            <w:r>
+              <w:rPr>
+                <w:sz w:val="19"/>
+              </w:rPr>
+              <w:t xml:space="preserve"> </w:t>
+            </w:r>
+            <w:r>
+              <w:rPr>
+                <w:sz w:val="19"/>
+              </w:rPr>
+              <w:t xml:space="preserve">for one that fills on successes.</w:t>
+            </w:r>
+          </w:p>
+        </w:tc>
+      </w:tr>
+      <w:tr>
+        <w:tc>
+          <w:tcPr/>
+          <w:p>
+            <w:pPr>
+              <w:pStyle w:val="Compact"/>
+              <w:jc w:val="left"/>
+            </w:pPr>
+            <w:r>
+              <w:rPr>
+                <w:rStyle w:val="VerbatimChar"/>
+                <w:b/>
+                <w:sz w:val="19"/>
+              </w:rPr>
+              <w:t xml:space="preserve">/clock tick name:"Orbit decays"</w:t>
+            </w:r>
+          </w:p>
+        </w:tc>
+        <w:tc>
+          <w:tcPr/>
+          <w:p>
+            <w:pPr>
+              <w:pStyle w:val="Compact"/>
+              <w:jc w:val="left"/>
+            </w:pPr>
+            <w:r>
+              <w:rPr>
+                <w:sz w:val="19"/>
+              </w:rPr>
+              <w:t xml:space="preserve">Fill one segment. Add</w:t>
+            </w:r>
+            <w:r>
+              <w:rPr>
+                <w:sz w:val="19"/>
+              </w:rPr>
+              <w:t xml:space="preserve"> </w:t>
+            </w:r>
+            <w:r>
+              <w:rPr>
+                <w:rStyle w:val="VerbatimChar"/>
+                <w:sz w:val="19"/>
+              </w:rPr>
+              <w:t xml:space="preserve">segments:2</w:t>
+            </w:r>
+            <w:r>
+              <w:rPr>
+                <w:sz w:val="19"/>
+              </w:rPr>
+              <w:t xml:space="preserve"> </w:t>
+            </w:r>
+            <w:r>
+              <w:rPr>
+                <w:sz w:val="19"/>
+              </w:rPr>
+              <w:t xml:space="preserve">for two, or</w:t>
+            </w:r>
+            <w:r>
+              <w:rPr>
+                <w:sz w:val="19"/>
+              </w:rPr>
+              <w:t xml:space="preserve"> </w:t>
+            </w:r>
+            <w:r>
+              <w:rPr>
+                <w:rStyle w:val="VerbatimChar"/>
+                <w:sz w:val="19"/>
+              </w:rPr>
+              <w:t xml:space="preserve">segments:-1</w:t>
+            </w:r>
+            <w:r>
+              <w:rPr>
+                <w:sz w:val="19"/>
+              </w:rPr>
+              <w:t xml:space="preserve"> </w:t>
+            </w:r>
+            <w:r>
+              <w:rPr>
+                <w:sz w:val="19"/>
+              </w:rPr>
+              <w:t xml:space="preserve">to undo.</w:t>
+            </w:r>
+            <w:r>
+              <w:rPr>
+                <w:sz w:val="19"/>
+              </w:rPr>
+              <w:t xml:space="preserve"> </w:t>
+            </w:r>
+            <w:r>
+              <w:rPr>
+                <w:rStyle w:val="VerbatimChar"/>
+                <w:sz w:val="19"/>
+              </w:rPr>
+              <w:t xml:space="preserve">/clock remove</w:t>
+            </w:r>
+            <w:r>
+              <w:rPr>
+                <w:sz w:val="19"/>
+              </w:rPr>
+              <w:t xml:space="preserve"> </w:t>
+            </w:r>
+            <w:r>
+              <w:rPr>
+                <w:sz w:val="19"/>
+              </w:rPr>
+              <w:t xml:space="preserve">deletes a clock.</w:t>
+            </w:r>
+          </w:p>
+        </w:tc>
+      </w:tr>
+      <w:tr>
+        <w:tc>
+          <w:tcPr/>
+          <w:p>
+            <w:pPr>
+              <w:pStyle w:val="Compact"/>
+              <w:jc w:val="left"/>
+            </w:pPr>
+            <w:r>
+              <w:rPr>
+                <w:rStyle w:val="VerbatimChar"/>
+                <w:b/>
+                <w:sz w:val="19"/>
+              </w:rPr>
+              <w:t xml:space="preserve">/track mark name:shields</w:t>
+            </w:r>
+          </w:p>
+        </w:tc>
+        <w:tc>
+          <w:tcPr/>
+          <w:p>
+            <w:pPr>
+              <w:pStyle w:val="Compact"/>
+              <w:jc w:val="left"/>
+            </w:pPr>
+            <w:r>
+              <w:rPr>
+                <w:sz w:val="19"/>
+              </w:rPr>
+              <w:t xml:space="preserve">Mark a box on a track; a partial name works (</w:t>
+            </w:r>
+            <w:r>
+              <w:rPr>
+                <w:sz w:val="19"/>
+              </w:rPr>
+              <w:t xml:space="preserve">“</w:t>
+            </w:r>
+            <w:r>
+              <w:rPr>
+                <w:sz w:val="19"/>
+              </w:rPr>
+              <w:t xml:space="preserve">shields</w:t>
+            </w:r>
+            <w:r>
+              <w:rPr>
+                <w:sz w:val="19"/>
+              </w:rPr>
+              <w:t xml:space="preserve">”</w:t>
+            </w:r>
+            <w:r>
+              <w:rPr>
+                <w:sz w:val="19"/>
+              </w:rPr>
+              <w:t xml:space="preserve"> </w:t>
+            </w:r>
+            <w:r>
+              <w:rPr>
+                <w:sz w:val="19"/>
+              </w:rPr>
+              <w:t xml:space="preserve">finds Shields).</w:t>
+            </w:r>
+            <w:r>
+              <w:rPr>
+                <w:sz w:val="19"/>
+              </w:rPr>
+              <w:t xml:space="preserve"> </w:t>
+            </w:r>
+            <w:r>
+              <w:rPr>
+                <w:rStyle w:val="VerbatimChar"/>
+                <w:sz w:val="19"/>
+              </w:rPr>
+              <w:t xml:space="preserve">/track clear</w:t>
+            </w:r>
+            <w:r>
+              <w:rPr>
+                <w:sz w:val="19"/>
+              </w:rPr>
+              <w:t xml:space="preserve"> </w:t>
+            </w:r>
+            <w:r>
+              <w:rPr>
+                <w:sz w:val="19"/>
+              </w:rPr>
+              <w:t xml:space="preserve">clears one, and</w:t>
+            </w:r>
+            <w:r>
+              <w:rPr>
+                <w:sz w:val="19"/>
+              </w:rPr>
+              <w:t xml:space="preserve"> </w:t>
+            </w:r>
+            <w:r>
+              <w:rPr>
+                <w:rStyle w:val="VerbatimChar"/>
+                <w:sz w:val="19"/>
+              </w:rPr>
+              <w:t xml:space="preserve">/track reset</w:t>
+            </w:r>
+            <w:r>
+              <w:rPr>
+                <w:sz w:val="19"/>
+              </w:rPr>
+              <w:t xml:space="preserve"> </w:t>
+            </w:r>
+            <w:r>
+              <w:rPr>
+                <w:sz w:val="19"/>
+              </w:rPr>
+              <w:t xml:space="preserve">clears them all.</w:t>
+            </w:r>
+          </w:p>
+        </w:tc>
+      </w:tr>
+      <w:tr>
+        <w:tc>
+          <w:tcPr/>
+          <w:p>
+            <w:pPr>
+              <w:pStyle w:val="Compact"/>
+              <w:jc w:val="left"/>
+            </w:pPr>
+            <w:r>
+              <w:rPr>
+                <w:rStyle w:val="VerbatimChar"/>
+                <w:b/>
+                <w:sz w:val="19"/>
+              </w:rPr>
+              <w:t xml:space="preserve">/seed</w:t>
+            </w:r>
+          </w:p>
+        </w:tc>
+        <w:tc>
+          <w:tcPr/>
+          <w:p>
+            <w:pPr>
+              <w:pStyle w:val="Compact"/>
+              <w:jc w:val="left"/>
+            </w:pPr>
+            <w:r>
+              <w:rPr>
+                <w:sz w:val="19"/>
+              </w:rPr>
+              <w:t xml:space="preserve">Roll an adventure seed: one line from each seed table, and the command to start its ticking clock.</w:t>
+            </w:r>
+          </w:p>
+        </w:tc>
+      </w:tr>
+      <w:tr>
+        <w:tc>
+          <w:tcPr/>
+          <w:p>
+            <w:pPr>
+              <w:pStyle w:val="Compact"/>
+              <w:jc w:val="left"/>
+            </w:pPr>
+            <w:r>
+              <w:rPr>
+                <w:rStyle w:val="VerbatimChar"/>
+                <w:b/>
+                <w:sz w:val="19"/>
+              </w:rPr>
+              <w:t xml:space="preserve">/contest ... defender:me</w:t>
+            </w:r>
+          </w:p>
+        </w:tc>
+        <w:tc>
+          <w:tcPr/>
+          <w:p>
+            <w:pPr>
+              <w:pStyle w:val="Compact"/>
+              <w:jc w:val="left"/>
+            </w:pPr>
+            <w:r>
+              <w:rPr>
+                <w:sz w:val="19"/>
+              </w:rPr>
+              <w:t xml:space="preserve">When a player resists you (a grapple, a lie, a chase), they are the defender: ties and double failures go to them.</w:t>
+            </w:r>
+          </w:p>
+        </w:tc>
+      </w:tr>
+    </w:tbl>
+    <w:p>
+      <w:pPr>
+        <w:pStyle w:val="BodyText"/>
+      </w:pPr>
+      <w:r>
+        <w:t xml:space="preserve">Each server keeps its own points, clocks and tracks. If a command is missing from Discord’s list, open the bot’s</w:t>
+      </w:r>
+      <w:r>
+        <w:t xml:space="preserve"> </w:t>
+      </w:r>
+      <w:r>
+        <w:rPr>
+          <w:rStyle w:val="VerbatimChar"/>
+        </w:rPr>
+        <w:t xml:space="preserve">/register</w:t>
+      </w:r>
+      <w:r>
+        <w:t xml:space="preserve"> </w:t>
+      </w:r>
+      <w:r>
+        <w:t xml:space="preserve">page once (see the bot’s README), then press Ctrl+R in Discord.</w:t>
+      </w:r>
+      <w:r>
+        <w:t xml:space="preserve"> </w:t>
+      </w:r>
+    </w:p>
+    <w:bookmarkEnd w:id="104"/>
+    <w:bookmarkEnd w:id="105"/>
     <w:sectPr/>
   </w:body>
 </w:document>

</xml_diff>

<commit_message>
USS Pelion: mark each department's core skills Trained when it is chosen
A new officer starts with their department's four core skills; changing
department swaps the ones the player hasn't changed. The guide's
department table lists them.

Co-Authored-By: Claude Opus 5.5 <noreply@anthropic.com>
Claude-Session: https://claude.ai/code/session_015SADCFzhKijkC2foUmXrpC
</commit_message>
<xml_diff>
--- a/uss-pelion/USS_Pelion_Players_Guide.docx
+++ b/uss-pelion/USS_Pelion_Players_Guide.docx
@@ -310,10 +310,11 @@
         </w:tblBorders>
       </w:tblPr>
       <w:tblGrid>
-        <w:gridCol w:w="1980"/>
-        <w:gridCol w:w="1980"/>
-        <w:gridCol w:w="1980"/>
-        <w:gridCol w:w="1980"/>
+        <w:gridCol w:w="1584"/>
+        <w:gridCol w:w="1584"/>
+        <w:gridCol w:w="1584"/>
+        <w:gridCol w:w="1584"/>
+        <w:gridCol w:w="1584"/>
       </w:tblGrid>
       <w:tr>
         <w:trPr>
@@ -391,6 +392,24 @@
             </w:r>
           </w:p>
         </w:tc>
+        <w:tc>
+          <w:tcPr>
+            <w:shd w:val="clear" w:fill="E9EEF6"/>
+          </w:tcPr>
+          <w:p>
+            <w:pPr>
+              <w:pStyle w:val="Compact"/>
+              <w:jc w:val="left"/>
+            </w:pPr>
+            <w:r>
+              <w:rPr>
+                <w:b/>
+                <w:sz w:val="19"/>
+              </w:rPr>
+              <w:t xml:space="preserve">Core skills</w:t>
+            </w:r>
+          </w:p>
+        </w:tc>
       </w:tr>
       <w:tr>
         <w:tc>
@@ -454,6 +473,21 @@
             </w:r>
           </w:p>
         </w:tc>
+        <w:tc>
+          <w:tcPr/>
+          <w:p>
+            <w:pPr>
+              <w:pStyle w:val="Compact"/>
+              <w:jc w:val="left"/>
+            </w:pPr>
+            <w:r>
+              <w:rPr>
+                <w:sz w:val="19"/>
+              </w:rPr>
+              <w:t xml:space="preserve">Leadership, Diplomacy, Psychology, Phasers</w:t>
+            </w:r>
+          </w:p>
+        </w:tc>
       </w:tr>
       <w:tr>
         <w:tc>
@@ -517,6 +551,21 @@
             </w:r>
           </w:p>
         </w:tc>
+        <w:tc>
+          <w:tcPr/>
+          <w:p>
+            <w:pPr>
+              <w:pStyle w:val="Compact"/>
+              <w:jc w:val="left"/>
+            </w:pPr>
+            <w:r>
+              <w:rPr>
+                <w:sz w:val="19"/>
+              </w:rPr>
+              <w:t xml:space="preserve">Helm, Navigation, Sensors, Phasers</w:t>
+            </w:r>
+          </w:p>
+        </w:tc>
       </w:tr>
       <w:tr>
         <w:tc>
@@ -580,6 +629,21 @@
             </w:r>
           </w:p>
         </w:tc>
+        <w:tc>
+          <w:tcPr/>
+          <w:p>
+            <w:pPr>
+              <w:pStyle w:val="Compact"/>
+              <w:jc w:val="left"/>
+            </w:pPr>
+            <w:r>
+              <w:rPr>
+                <w:sz w:val="19"/>
+              </w:rPr>
+              <w:t xml:space="preserve">Navigation, Sensors, Helm, Computers</w:t>
+            </w:r>
+          </w:p>
+        </w:tc>
       </w:tr>
       <w:tr>
         <w:tc>
@@ -643,6 +707,21 @@
             </w:r>
           </w:p>
         </w:tc>
+        <w:tc>
+          <w:tcPr/>
+          <w:p>
+            <w:pPr>
+              <w:pStyle w:val="Compact"/>
+              <w:jc w:val="left"/>
+            </w:pPr>
+            <w:r>
+              <w:rPr>
+                <w:sz w:val="19"/>
+              </w:rPr>
+              <w:t xml:space="preserve">Sensors, Physical Sciences, Life Sciences, Computers</w:t>
+            </w:r>
+          </w:p>
+        </w:tc>
       </w:tr>
       <w:tr>
         <w:tc>
@@ -706,6 +785,21 @@
             </w:r>
           </w:p>
         </w:tc>
+        <w:tc>
+          <w:tcPr/>
+          <w:p>
+            <w:pPr>
+              <w:pStyle w:val="Compact"/>
+              <w:jc w:val="left"/>
+            </w:pPr>
+            <w:r>
+              <w:rPr>
+                <w:sz w:val="19"/>
+              </w:rPr>
+              <w:t xml:space="preserve">Medicine, Life Sciences, Psychology, Sensors</w:t>
+            </w:r>
+          </w:p>
+        </w:tc>
       </w:tr>
       <w:tr>
         <w:tc>
@@ -769,6 +863,21 @@
             </w:r>
           </w:p>
         </w:tc>
+        <w:tc>
+          <w:tcPr/>
+          <w:p>
+            <w:pPr>
+              <w:pStyle w:val="Compact"/>
+              <w:jc w:val="left"/>
+            </w:pPr>
+            <w:r>
+              <w:rPr>
+                <w:sz w:val="19"/>
+              </w:rPr>
+              <w:t xml:space="preserve">Engineering, Electronics, Computers, Physical Sciences</w:t>
+            </w:r>
+          </w:p>
+        </w:tc>
       </w:tr>
       <w:tr>
         <w:tc>
@@ -832,6 +941,21 @@
             </w:r>
           </w:p>
         </w:tc>
+        <w:tc>
+          <w:tcPr/>
+          <w:p>
+            <w:pPr>
+              <w:pStyle w:val="Compact"/>
+              <w:jc w:val="left"/>
+            </w:pPr>
+            <w:r>
+              <w:rPr>
+                <w:sz w:val="19"/>
+              </w:rPr>
+              <w:t xml:space="preserve">Phasers, Unarmed Combat, Athletics, Stealth</w:t>
+            </w:r>
+          </w:p>
+        </w:tc>
       </w:tr>
       <w:tr>
         <w:tc>
@@ -895,6 +1019,21 @@
             </w:r>
           </w:p>
         </w:tc>
+        <w:tc>
+          <w:tcPr/>
+          <w:p>
+            <w:pPr>
+              <w:pStyle w:val="Compact"/>
+              <w:jc w:val="left"/>
+            </w:pPr>
+            <w:r>
+              <w:rPr>
+                <w:sz w:val="19"/>
+              </w:rPr>
+              <w:t xml:space="preserve">Communications, Electronics, Computers, Diplomacy</w:t>
+            </w:r>
+          </w:p>
+        </w:tc>
       </w:tr>
       <w:tr>
         <w:tc>
@@ -958,8 +1097,47 @@
             </w:r>
           </w:p>
         </w:tc>
+        <w:tc>
+          <w:tcPr/>
+          <w:p>
+            <w:pPr>
+              <w:pStyle w:val="Compact"/>
+              <w:jc w:val="left"/>
+            </w:pPr>
+            <w:r>
+              <w:rPr>
+                <w:sz w:val="19"/>
+              </w:rPr>
+              <w:t xml:space="preserve">Computers, Electronics, Athletics, Communications</w:t>
+            </w:r>
+          </w:p>
+        </w:tc>
       </w:tr>
     </w:tbl>
+    <w:p>
+      <w:pPr>
+        <w:pStyle w:val="BodyText"/>
+      </w:pPr>
+      <w:r>
+        <w:t xml:space="preserve">The creator marks your department’s four</w:t>
+      </w:r>
+      <w:r>
+        <w:t xml:space="preserve"> </w:t>
+      </w:r>
+      <w:r>
+        <w:rPr>
+          <w:bCs/>
+          <w:b/>
+        </w:rPr>
+        <w:t xml:space="preserve">core skills</w:t>
+      </w:r>
+      <w:r>
+        <w:t xml:space="preserve"> </w:t>
+      </w:r>
+      <w:r>
+        <w:t xml:space="preserve">(in the table above) Trained when you choose it. Keep them, raise one to your Specialty, or swap any of them for other skills; changing department swaps the core skills you haven’t changed.</w:t>
+      </w:r>
+    </w:p>
     <w:bookmarkStart w:id="23" w:name="officers-and-enlisted-crew"/>
     <w:p>
       <w:pPr>

</xml_diff>

<commit_message>
Make your own department/species: a Custom option in the creator and a guide chapter
Co-Authored-By: Claude Opus 5.5 <noreply@anthropic.com>
Claude-Session: https://claude.ai/code/session_015SADCFzhKijkC2foUmXrpC
</commit_message>
<xml_diff>
--- a/uss-pelion/USS_Pelion_Players_Guide.docx
+++ b/uss-pelion/USS_Pelion_Players_Guide.docx
@@ -2268,7 +2268,23 @@
         <w:pStyle w:val="FirstParagraph"/>
       </w:pPr>
       <w:r>
-        <w:t xml:space="preserve">Agree on a species with the GM and give it adjustments from −2 to +2 per attribute that total zero. The normal starting maximum and species base rules apply.</w:t>
+        <w:t xml:space="preserve">You can build your own species with the GM. See</w:t>
+      </w:r>
+      <w:r>
+        <w:t xml:space="preserve"> </w:t>
+      </w:r>
+      <w:r>
+        <w:rPr>
+          <w:iCs/>
+          <w:i/>
+        </w:rPr>
+        <w:t xml:space="preserve">Making your own</w:t>
+      </w:r>
+      <w:r>
+        <w:t xml:space="preserve"> </w:t>
+      </w:r>
+      <w:r>
+        <w:t xml:space="preserve">for the steps.</w:t>
       </w:r>
     </w:p>
     <w:bookmarkEnd w:id="29"/>
@@ -16050,7 +16066,587 @@
     </w:tbl>
     <w:bookmarkEnd w:id="95"/>
     <w:bookmarkEnd w:id="96"/>
-    <w:bookmarkStart w:id="98" w:name="complications"/>
+    <w:bookmarkStart w:id="105" w:name="making-your-own"/>
+    <w:p>
+      <w:pPr>
+        <w:pStyle w:val="Heading1"/>
+      </w:pPr>
+      <w:r>
+        <w:t xml:space="preserve">Making your own</w:t>
+      </w:r>
+    </w:p>
+    <w:p>
+      <w:pPr>
+        <w:pStyle w:val="FirstParagraph"/>
+      </w:pPr>
+      <w:r>
+        <w:t xml:space="preserve">The departments and species in this book are a starting point, not a limit. With the GM’s agreement, any player can create their own department or species. The creator has a</w:t>
+      </w:r>
+      <w:r>
+        <w:t xml:space="preserve"> </w:t>
+      </w:r>
+      <w:r>
+        <w:rPr>
+          <w:bCs/>
+          <w:b/>
+        </w:rPr>
+        <w:t xml:space="preserve">Custom</w:t>
+      </w:r>
+      <w:r>
+        <w:t xml:space="preserve"> </w:t>
+      </w:r>
+      <w:r>
+        <w:t xml:space="preserve">option at the end of each list, and its checklist holds a custom choice to the same rules as everything else.</w:t>
+      </w:r>
+    </w:p>
+    <w:bookmarkStart w:id="97" w:name="a-custom-department"/>
+    <w:p>
+      <w:pPr>
+        <w:pStyle w:val="Heading2"/>
+      </w:pPr>
+      <w:r>
+        <w:t xml:space="preserve">A custom department</w:t>
+      </w:r>
+    </w:p>
+    <w:p>
+      <w:pPr>
+        <w:pStyle w:val="FirstParagraph"/>
+      </w:pPr>
+      <w:r>
+        <w:t xml:space="preserve">A department is a concept, not a package of powers: it gives no bonus of its own. A custom one only needs a clear place in the group.</w:t>
+      </w:r>
+    </w:p>
+    <w:p>
+      <w:pPr>
+        <w:numPr>
+          <w:ilvl w:val="0"/>
+          <w:numId w:val="1018"/>
+        </w:numPr>
+        <w:pStyle w:val="Compact"/>
+      </w:pPr>
+      <w:r>
+        <w:rPr>
+          <w:bCs/>
+          <w:b/>
+        </w:rPr>
+        <w:t xml:space="preserve">Name it and describe it.</w:t>
+      </w:r>
+      <w:r>
+        <w:t xml:space="preserve"> </w:t>
+      </w:r>
+      <w:r>
+        <w:t xml:space="preserve">One sentence for what your character does that no one else does, in the style of the departments above:</w:t>
+      </w:r>
+      <w:r>
+        <w:t xml:space="preserve"> </w:t>
+      </w:r>
+      <w:r>
+        <w:rPr>
+          <w:iCs/>
+          <w:i/>
+        </w:rPr>
+        <w:t xml:space="preserve">“</w:t>
+      </w:r>
+      <w:r>
+        <w:rPr>
+          <w:iCs/>
+          <w:i/>
+        </w:rPr>
+        <w:t xml:space="preserve">Stellar Cartography: maps the unmapped, and knows which charts are lies.</w:t>
+      </w:r>
+      <w:r>
+        <w:rPr>
+          <w:iCs/>
+          <w:i/>
+        </w:rPr>
+        <w:t xml:space="preserve">”</w:t>
+      </w:r>
+    </w:p>
+    <w:p>
+      <w:pPr>
+        <w:numPr>
+          <w:ilvl w:val="0"/>
+          <w:numId w:val="1018"/>
+        </w:numPr>
+        <w:pStyle w:val="Compact"/>
+      </w:pPr>
+      <w:r>
+        <w:rPr>
+          <w:bCs/>
+          <w:b/>
+        </w:rPr>
+        <w:t xml:space="preserve">Choose a group.</w:t>
+      </w:r>
+      <w:r>
+        <w:t xml:space="preserve"> </w:t>
+      </w:r>
+      <w:r>
+        <w:t xml:space="preserve">Pick the one it belongs with: Command (gold), Sciences (blue) or Operations (red). The group only sets your sheet’s colors and emblem.</w:t>
+      </w:r>
+    </w:p>
+    <w:p>
+      <w:pPr>
+        <w:numPr>
+          <w:ilvl w:val="0"/>
+          <w:numId w:val="1018"/>
+        </w:numPr>
+        <w:pStyle w:val="Compact"/>
+      </w:pPr>
+      <w:r>
+        <w:rPr>
+          <w:bCs/>
+          <w:b/>
+        </w:rPr>
+        <w:t xml:space="preserve">Pick four core skills.</w:t>
+      </w:r>
+      <w:r>
+        <w:t xml:space="preserve"> </w:t>
+      </w:r>
+      <w:r>
+        <w:t xml:space="preserve">The skills it can’t do without. Mark them Trained yourself in step 3 (the built-in departments do this for you); they count toward your normal Trained skills.</w:t>
+      </w:r>
+    </w:p>
+    <w:p>
+      <w:pPr>
+        <w:numPr>
+          <w:ilvl w:val="0"/>
+          <w:numId w:val="1018"/>
+        </w:numPr>
+        <w:pStyle w:val="Compact"/>
+      </w:pPr>
+      <w:r>
+        <w:rPr>
+          <w:bCs/>
+          <w:b/>
+        </w:rPr>
+        <w:t xml:space="preserve">Check it with the GM.</w:t>
+      </w:r>
+      <w:r>
+        <w:t xml:space="preserve"> </w:t>
+      </w:r>
+      <w:r>
+        <w:t xml:space="preserve">It should fit the setting and overlap the existing departments as little as possible. A custom department uses the officer training (a Specialty and nine Trained); enlisted crew belong to General Services.</w:t>
+      </w:r>
+    </w:p>
+    <w:p>
+      <w:pPr>
+        <w:pStyle w:val="FirstParagraph"/>
+      </w:pPr>
+      <w:r>
+        <w:rPr>
+          <w:bCs/>
+          <w:b/>
+        </w:rPr>
+        <w:t xml:space="preserve">In the creator:</w:t>
+      </w:r>
+      <w:r>
+        <w:t xml:space="preserve"> </w:t>
+      </w:r>
+      <w:r>
+        <w:t xml:space="preserve">in step 1, choose</w:t>
+      </w:r>
+      <w:r>
+        <w:t xml:space="preserve"> </w:t>
+      </w:r>
+      <w:r>
+        <w:rPr>
+          <w:bCs/>
+          <w:b/>
+        </w:rPr>
+        <w:t xml:space="preserve">Custom department…</w:t>
+      </w:r>
+      <w:r>
+        <w:t xml:space="preserve"> </w:t>
+      </w:r>
+      <w:r>
+        <w:t xml:space="preserve">at the end of the Department list, then enter its name and group. Write the description in</w:t>
+      </w:r>
+      <w:r>
+        <w:t xml:space="preserve"> </w:t>
+      </w:r>
+      <w:r>
+        <w:rPr>
+          <w:iCs/>
+          <w:i/>
+        </w:rPr>
+        <w:t xml:space="preserve">What you bring</w:t>
+      </w:r>
+      <w:r>
+        <w:t xml:space="preserve">.</w:t>
+      </w:r>
+    </w:p>
+    <w:bookmarkEnd w:id="97"/>
+    <w:bookmarkStart w:id="104" w:name="a-custom-species"/>
+    <w:p>
+      <w:pPr>
+        <w:pStyle w:val="Heading2"/>
+      </w:pPr>
+      <w:r>
+        <w:t xml:space="preserve">A custom species</w:t>
+      </w:r>
+    </w:p>
+    <w:p>
+      <w:pPr>
+        <w:pStyle w:val="FirstParagraph"/>
+      </w:pPr>
+      <w:r>
+        <w:t xml:space="preserve">Build it with the GM, one step at a time.</w:t>
+      </w:r>
+    </w:p>
+    <w:bookmarkStart w:id="98" w:name="the-concept"/>
+    <w:p>
+      <w:pPr>
+        <w:pStyle w:val="Heading3"/>
+      </w:pPr>
+      <w:r>
+        <w:t xml:space="preserve">1. The concept</w:t>
+      </w:r>
+    </w:p>
+    <w:p>
+      <w:pPr>
+        <w:pStyle w:val="FirstParagraph"/>
+      </w:pPr>
+      <w:r>
+        <w:t xml:space="preserve">Two or three sentences: where they come from, what sets them apart, and how others see them. It should be something the species in this book don’t already cover.</w:t>
+      </w:r>
+    </w:p>
+    <w:bookmarkEnd w:id="98"/>
+    <w:bookmarkStart w:id="99" w:name="attribute-adjustments"/>
+    <w:p>
+      <w:pPr>
+        <w:pStyle w:val="Heading3"/>
+      </w:pPr>
+      <w:r>
+        <w:t xml:space="preserve">2. Attribute adjustments</w:t>
+      </w:r>
+    </w:p>
+    <w:p>
+      <w:pPr>
+        <w:pStyle w:val="FirstParagraph"/>
+      </w:pPr>
+      <w:r>
+        <w:t xml:space="preserve">Give adjustments from</w:t>
+      </w:r>
+      <w:r>
+        <w:t xml:space="preserve"> </w:t>
+      </w:r>
+      <w:r>
+        <w:rPr>
+          <w:bCs/>
+          <w:b/>
+        </w:rPr>
+        <w:t xml:space="preserve">−2 to +2</w:t>
+      </w:r>
+      <w:r>
+        <w:t xml:space="preserve"> </w:t>
+      </w:r>
+      <w:r>
+        <w:t xml:space="preserve">per attribute that</w:t>
+      </w:r>
+      <w:r>
+        <w:t xml:space="preserve"> </w:t>
+      </w:r>
+      <w:r>
+        <w:rPr>
+          <w:bCs/>
+          <w:b/>
+        </w:rPr>
+        <w:t xml:space="preserve">total zero</w:t>
+      </w:r>
+      <w:r>
+        <w:t xml:space="preserve">: a +2 needs a −2 or two −1s. The adjustments move the attribute’s base (+1 starts it at 11) and raise its starting maximum (13 plus the bonus). Most species change two to four attributes.</w:t>
+      </w:r>
+    </w:p>
+    <w:bookmarkEnd w:id="99"/>
+    <w:bookmarkStart w:id="100" w:name="core-rules"/>
+    <w:p>
+      <w:pPr>
+        <w:pStyle w:val="Heading3"/>
+      </w:pPr>
+      <w:r>
+        <w:t xml:space="preserve">3. Core rules</w:t>
+      </w:r>
+    </w:p>
+    <w:p>
+      <w:pPr>
+        <w:pStyle w:val="FirstParagraph"/>
+      </w:pPr>
+      <w:r>
+        <w:t xml:space="preserve">One to three short rules that always apply: what they can do (see in the dark, resist cold, a free Trained skill) and what it costs (a weakness, a people’s distrust, a hazard they can’t abide). A strength with no drawback is worth more than it looks.</w:t>
+      </w:r>
+    </w:p>
+    <w:bookmarkEnd w:id="100"/>
+    <w:bookmarkStart w:id="101" w:name="species-advantages-1"/>
+    <w:p>
+      <w:pPr>
+        <w:pStyle w:val="Heading3"/>
+      </w:pPr>
+      <w:r>
+        <w:t xml:space="preserve">4. Species advantages</w:t>
+      </w:r>
+    </w:p>
+    <w:p>
+      <w:pPr>
+        <w:pStyle w:val="FirstParagraph"/>
+      </w:pPr>
+      <w:r>
+        <w:t xml:space="preserve">Write one to three. Each works like a general advantage:</w:t>
+      </w:r>
+      <w:r>
+        <w:t xml:space="preserve"> </w:t>
+      </w:r>
+      <w:r>
+        <w:rPr>
+          <w:bCs/>
+          <w:b/>
+        </w:rPr>
+        <w:t xml:space="preserve">+2 to one skill in a narrow situation</w:t>
+      </w:r>
+      <w:r>
+        <w:t xml:space="preserve">, or a small, limited permission (</w:t>
+      </w:r>
+      <w:r>
+        <w:t xml:space="preserve">“</w:t>
+      </w:r>
+      <w:r>
+        <w:t xml:space="preserve">once per scene…</w:t>
+      </w:r>
+      <w:r>
+        <w:t xml:space="preserve">”</w:t>
+      </w:r>
+      <w:r>
+        <w:t xml:space="preserve">). Each comes with a</w:t>
+      </w:r>
+      <w:r>
+        <w:t xml:space="preserve"> </w:t>
+      </w:r>
+      <w:r>
+        <w:rPr>
+          <w:bCs/>
+          <w:b/>
+        </w:rPr>
+        <w:t xml:space="preserve">companion complication</w:t>
+      </w:r>
+      <w:r>
+        <w:t xml:space="preserve">: a problem the trait causes, with a clear trigger and a real consequence, which earns a Duty point when it bites, like any complication. A character takes one advantage, general or species, so make them distinct choices.</w:t>
+      </w:r>
+    </w:p>
+    <w:bookmarkEnd w:id="101"/>
+    <w:bookmarkStart w:id="102" w:name="in-the-creator"/>
+    <w:p>
+      <w:pPr>
+        <w:pStyle w:val="Heading3"/>
+      </w:pPr>
+      <w:r>
+        <w:t xml:space="preserve">In the creator</w:t>
+      </w:r>
+    </w:p>
+    <w:p>
+      <w:pPr>
+        <w:numPr>
+          <w:ilvl w:val="0"/>
+          <w:numId w:val="1019"/>
+        </w:numPr>
+        <w:pStyle w:val="Compact"/>
+      </w:pPr>
+      <w:r>
+        <w:t xml:space="preserve">In step 2, choose</w:t>
+      </w:r>
+      <w:r>
+        <w:t xml:space="preserve"> </w:t>
+      </w:r>
+      <w:r>
+        <w:rPr>
+          <w:bCs/>
+          <w:b/>
+        </w:rPr>
+        <w:t xml:space="preserve">Custom species…</w:t>
+      </w:r>
+      <w:r>
+        <w:t xml:space="preserve"> </w:t>
+      </w:r>
+      <w:r>
+        <w:t xml:space="preserve">at the end of the Species list.</w:t>
+      </w:r>
+    </w:p>
+    <w:p>
+      <w:pPr>
+        <w:numPr>
+          <w:ilvl w:val="0"/>
+          <w:numId w:val="1019"/>
+        </w:numPr>
+        <w:pStyle w:val="Compact"/>
+      </w:pPr>
+      <w:r>
+        <w:t xml:space="preserve">Name it and set its adjustments. The checklist confirms they total zero.</w:t>
+      </w:r>
+    </w:p>
+    <w:p>
+      <w:pPr>
+        <w:numPr>
+          <w:ilvl w:val="0"/>
+          <w:numId w:val="1019"/>
+        </w:numPr>
+        <w:pStyle w:val="Compact"/>
+      </w:pPr>
+      <w:r>
+        <w:t xml:space="preserve">Write its core rules in</w:t>
+      </w:r>
+      <w:r>
+        <w:t xml:space="preserve"> </w:t>
+      </w:r>
+      <w:r>
+        <w:rPr>
+          <w:bCs/>
+          <w:b/>
+        </w:rPr>
+        <w:t xml:space="preserve">Species ability (GM approval required)</w:t>
+      </w:r>
+      <w:r>
+        <w:t xml:space="preserve"> </w:t>
+      </w:r>
+      <w:r>
+        <w:t xml:space="preserve">in step 4.</w:t>
+      </w:r>
+    </w:p>
+    <w:p>
+      <w:pPr>
+        <w:numPr>
+          <w:ilvl w:val="0"/>
+          <w:numId w:val="1019"/>
+        </w:numPr>
+        <w:pStyle w:val="Compact"/>
+      </w:pPr>
+      <w:r>
+        <w:t xml:space="preserve">In step 4, choose</w:t>
+      </w:r>
+      <w:r>
+        <w:t xml:space="preserve"> </w:t>
+      </w:r>
+      <w:r>
+        <w:rPr>
+          <w:bCs/>
+          <w:b/>
+        </w:rPr>
+        <w:t xml:space="preserve">Custom species advantage…</w:t>
+      </w:r>
+      <w:r>
+        <w:t xml:space="preserve"> </w:t>
+      </w:r>
+      <w:r>
+        <w:t xml:space="preserve">and enter the advantage and its companion complication.</w:t>
+      </w:r>
+    </w:p>
+    <w:bookmarkEnd w:id="102"/>
+    <w:bookmarkStart w:id="103" w:name="example"/>
+    <w:p>
+      <w:pPr>
+        <w:pStyle w:val="Heading3"/>
+      </w:pPr>
+      <w:r>
+        <w:t xml:space="preserve">Example</w:t>
+      </w:r>
+    </w:p>
+    <w:p>
+      <w:pPr>
+        <w:pStyle w:val="FirstParagraph"/>
+      </w:pPr>
+      <w:r>
+        <w:rPr>
+          <w:bCs/>
+          <w:b/>
+        </w:rPr>
+        <w:t xml:space="preserve">Kethari.</w:t>
+      </w:r>
+      <w:r>
+        <w:t xml:space="preserve"> </w:t>
+      </w:r>
+      <w:r>
+        <w:t xml:space="preserve">Tall, silver-scaled people from a high-gravity ocean world, newly allied with the Federation.</w:t>
+      </w:r>
+      <w:r>
+        <w:t xml:space="preserve"> </w:t>
+      </w:r>
+      <w:r>
+        <w:rPr>
+          <w:iCs/>
+          <w:i/>
+        </w:rPr>
+        <w:t xml:space="preserve">Adjustments:</w:t>
+      </w:r>
+      <w:r>
+        <w:t xml:space="preserve"> </w:t>
+      </w:r>
+      <w:r>
+        <w:t xml:space="preserve">Body +1, Agility −1.</w:t>
+      </w:r>
+      <w:r>
+        <w:t xml:space="preserve"> </w:t>
+      </w:r>
+      <w:r>
+        <w:rPr>
+          <w:iCs/>
+          <w:i/>
+        </w:rPr>
+        <w:t xml:space="preserve">Core rule:</w:t>
+      </w:r>
+      <w:r>
+        <w:t xml:space="preserve"> </w:t>
+      </w:r>
+      <w:r>
+        <w:t xml:space="preserve">high-gravity muscles: +1 to Athletics in normal gravity, but cold slows them (−1 to all rolls in freezing conditions).</w:t>
+      </w:r>
+      <w:r>
+        <w:t xml:space="preserve"> </w:t>
+      </w:r>
+      <w:r>
+        <w:rPr>
+          <w:iCs/>
+          <w:i/>
+        </w:rPr>
+        <w:t xml:space="preserve">Species advantage:</w:t>
+      </w:r>
+      <w:r>
+        <w:t xml:space="preserve"> </w:t>
+      </w:r>
+      <w:r>
+        <w:rPr>
+          <w:bCs/>
+          <w:b/>
+        </w:rPr>
+        <w:t xml:space="preserve">Deep-Diver</w:t>
+      </w:r>
+      <w:r>
+        <w:t xml:space="preserve">: +2 to Athletics to swim and hold your breath.</w:t>
+      </w:r>
+      <w:r>
+        <w:t xml:space="preserve"> </w:t>
+      </w:r>
+      <w:r>
+        <w:rPr>
+          <w:iCs/>
+          <w:i/>
+        </w:rPr>
+        <w:t xml:space="preserve">Companion:</w:t>
+      </w:r>
+      <w:r>
+        <w:t xml:space="preserve"> </w:t>
+      </w:r>
+      <w:r>
+        <w:rPr>
+          <w:bCs/>
+          <w:b/>
+        </w:rPr>
+        <w:t xml:space="preserve">Homesick for the Sea</w:t>
+      </w:r>
+      <w:r>
+        <w:t xml:space="preserve">: dry, cramped ships wear on you; when it matters, accept the short temper or the mistake.</w:t>
+      </w:r>
+    </w:p>
+    <w:bookmarkEnd w:id="103"/>
+    <w:bookmarkEnd w:id="104"/>
+    <w:bookmarkEnd w:id="105"/>
+    <w:bookmarkStart w:id="107" w:name="complications"/>
     <w:p>
       <w:pPr>
         <w:pStyle w:val="Heading1"/>
@@ -16664,7 +17260,7 @@
         </w:tc>
       </w:tr>
     </w:tbl>
-    <w:bookmarkStart w:id="97" w:name="using-and-revising-traits"/>
+    <w:bookmarkStart w:id="106" w:name="using-and-revising-traits"/>
     <w:p>
       <w:pPr>
         <w:pStyle w:val="Heading2"/>
@@ -16681,9 +17277,9 @@
         <w:t xml:space="preserve">General advantages and complications describe individual crew members and can suit any species when appropriate. A Vulcan might choose Mental Discipline as a general advantage; species advantages are the only traits tied to a species. At a mission milestone, revise a trait when events change the character. Custom advantages follow the same narrow +2 benefit; custom complications need a clear trigger and a meaningful, accepted consequence.</w:t>
       </w:r>
     </w:p>
-    <w:bookmarkEnd w:id="97"/>
-    <w:bookmarkEnd w:id="98"/>
-    <w:bookmarkStart w:id="102" w:name="quick-reference"/>
+    <w:bookmarkEnd w:id="106"/>
+    <w:bookmarkEnd w:id="107"/>
+    <w:bookmarkStart w:id="111" w:name="quick-reference"/>
     <w:p>
       <w:pPr>
         <w:pStyle w:val="Heading1"/>
@@ -16692,7 +17288,7 @@
         <w:t xml:space="preserve">Quick reference</w:t>
       </w:r>
     </w:p>
-    <w:bookmarkStart w:id="99" w:name="will-and-mental-resistance"/>
+    <w:bookmarkStart w:id="108" w:name="will-and-mental-resistance"/>
     <w:p>
       <w:pPr>
         <w:pStyle w:val="Heading2"/>
@@ -16725,8 +17321,8 @@
         <w:t xml:space="preserve">Will protects your resolve; Presence influences others. Leadership and Diplomacy still use Presence. Species adjustments may change your starting Will, but mental advantages apply only to their agreed, narrow circumstances.</w:t>
       </w:r>
     </w:p>
-    <w:bookmarkEnd w:id="99"/>
-    <w:bookmarkStart w:id="100" w:name="at-the-table"/>
+    <w:bookmarkEnd w:id="108"/>
+    <w:bookmarkStart w:id="109" w:name="at-the-table"/>
     <w:p>
       <w:pPr>
         <w:pStyle w:val="Heading2"/>
@@ -16739,7 +17335,7 @@
       <w:pPr>
         <w:numPr>
           <w:ilvl w:val="0"/>
-          <w:numId w:val="1018"/>
+          <w:numId w:val="1020"/>
         </w:numPr>
         <w:pStyle w:val="Compact"/>
       </w:pPr>
@@ -16751,7 +17347,7 @@
       <w:pPr>
         <w:numPr>
           <w:ilvl w:val="0"/>
-          <w:numId w:val="1018"/>
+          <w:numId w:val="1020"/>
         </w:numPr>
         <w:pStyle w:val="Compact"/>
       </w:pPr>
@@ -16763,7 +17359,7 @@
       <w:pPr>
         <w:numPr>
           <w:ilvl w:val="0"/>
-          <w:numId w:val="1018"/>
+          <w:numId w:val="1020"/>
         </w:numPr>
         <w:pStyle w:val="Compact"/>
       </w:pPr>
@@ -16775,7 +17371,7 @@
       <w:pPr>
         <w:numPr>
           <w:ilvl w:val="0"/>
-          <w:numId w:val="1018"/>
+          <w:numId w:val="1020"/>
         </w:numPr>
         <w:pStyle w:val="Compact"/>
       </w:pPr>
@@ -16787,7 +17383,7 @@
       <w:pPr>
         <w:numPr>
           <w:ilvl w:val="0"/>
-          <w:numId w:val="1018"/>
+          <w:numId w:val="1020"/>
         </w:numPr>
         <w:pStyle w:val="Compact"/>
       </w:pPr>
@@ -16795,8 +17391,8 @@
         <w:t xml:space="preserve">Apply the result and describe what changes.</w:t>
       </w:r>
     </w:p>
-    <w:bookmarkEnd w:id="100"/>
-    <w:bookmarkStart w:id="101" w:name="summary"/>
+    <w:bookmarkEnd w:id="109"/>
+    <w:bookmarkStart w:id="110" w:name="summary"/>
     <w:p>
       <w:pPr>
         <w:pStyle w:val="Heading2"/>
@@ -17039,9 +17635,9 @@
         <w:t xml:space="preserve">start each session with two. Spend one to reroll, reduce an injury by one box, or establish a plausible preparation. Earn one when an accepted complication, including a companion complication, creates a meaningful problem.</w:t>
       </w:r>
     </w:p>
-    <w:bookmarkEnd w:id="101"/>
-    <w:bookmarkEnd w:id="102"/>
-    <w:bookmarkStart w:id="105" w:name="discord-commands"/>
+    <w:bookmarkEnd w:id="110"/>
+    <w:bookmarkEnd w:id="111"/>
+    <w:bookmarkStart w:id="114" w:name="discord-commands"/>
     <w:p>
       <w:pPr>
         <w:pStyle w:val="Heading1"/>
@@ -17073,7 +17669,7 @@
         <w:t xml:space="preserve">in a channel to see the commands; Discord shows each option as you fill it in. The bot doesn’t know your sheet, so you give it the target number.</w:t>
       </w:r>
     </w:p>
-    <w:bookmarkStart w:id="103" w:name="for-players"/>
+    <w:bookmarkStart w:id="112" w:name="for-players"/>
     <w:p>
       <w:pPr>
         <w:pStyle w:val="Heading2"/>
@@ -17555,8 +18151,8 @@
         <w:t xml:space="preserve">Only the player who rolled can press the reroll button. Rolls that miss by 1 or 2 remind the GM that success at a cost is on offer.</w:t>
       </w:r>
     </w:p>
-    <w:bookmarkEnd w:id="103"/>
-    <w:bookmarkStart w:id="104" w:name="for-the-gm"/>
+    <w:bookmarkEnd w:id="112"/>
+    <w:bookmarkStart w:id="113" w:name="for-the-gm"/>
     <w:p>
       <w:pPr>
         <w:pStyle w:val="Heading2"/>
@@ -18187,8 +18783,8 @@
         <w:t xml:space="preserve"> </w:t>
       </w:r>
     </w:p>
-    <w:bookmarkEnd w:id="104"/>
-    <w:bookmarkEnd w:id="105"/>
+    <w:bookmarkEnd w:id="113"/>
+    <w:bookmarkEnd w:id="114"/>
     <w:sectPr/>
   </w:body>
 </w:document>
@@ -18592,6 +19188,66 @@
     <w:abstractNumId w:val="991"/>
   </w:num>
   <w:num w:numId="1018">
+    <w:abstractNumId w:val="99411"/>
+    <w:lvlOverride w:ilvl="0">
+      <w:startOverride w:val="1"/>
+    </w:lvlOverride>
+    <w:lvlOverride w:ilvl="1">
+      <w:startOverride w:val="1"/>
+    </w:lvlOverride>
+    <w:lvlOverride w:ilvl="2">
+      <w:startOverride w:val="1"/>
+    </w:lvlOverride>
+    <w:lvlOverride w:ilvl="3">
+      <w:startOverride w:val="1"/>
+    </w:lvlOverride>
+    <w:lvlOverride w:ilvl="4">
+      <w:startOverride w:val="1"/>
+    </w:lvlOverride>
+    <w:lvlOverride w:ilvl="5">
+      <w:startOverride w:val="1"/>
+    </w:lvlOverride>
+    <w:lvlOverride w:ilvl="6">
+      <w:startOverride w:val="1"/>
+    </w:lvlOverride>
+    <w:lvlOverride w:ilvl="7">
+      <w:startOverride w:val="1"/>
+    </w:lvlOverride>
+    <w:lvlOverride w:ilvl="8">
+      <w:startOverride w:val="1"/>
+    </w:lvlOverride>
+  </w:num>
+  <w:num w:numId="1019">
+    <w:abstractNumId w:val="99411"/>
+    <w:lvlOverride w:ilvl="0">
+      <w:startOverride w:val="1"/>
+    </w:lvlOverride>
+    <w:lvlOverride w:ilvl="1">
+      <w:startOverride w:val="1"/>
+    </w:lvlOverride>
+    <w:lvlOverride w:ilvl="2">
+      <w:startOverride w:val="1"/>
+    </w:lvlOverride>
+    <w:lvlOverride w:ilvl="3">
+      <w:startOverride w:val="1"/>
+    </w:lvlOverride>
+    <w:lvlOverride w:ilvl="4">
+      <w:startOverride w:val="1"/>
+    </w:lvlOverride>
+    <w:lvlOverride w:ilvl="5">
+      <w:startOverride w:val="1"/>
+    </w:lvlOverride>
+    <w:lvlOverride w:ilvl="6">
+      <w:startOverride w:val="1"/>
+    </w:lvlOverride>
+    <w:lvlOverride w:ilvl="7">
+      <w:startOverride w:val="1"/>
+    </w:lvlOverride>
+    <w:lvlOverride w:ilvl="8">
+      <w:startOverride w:val="1"/>
+    </w:lvlOverride>
+  </w:num>
+  <w:num w:numId="1020">
     <w:abstractNumId w:val="99411"/>
     <w:lvlOverride w:ilvl="0">
       <w:startOverride w:val="1"/>

</xml_diff>

<commit_message>
Ship combat: Fracture Lines gets space range bands, ship weapons, a Hull track, captain's orders and a Ship Crew calling group; USS Pelion gets range bands (personal and space) and captain's orders
Co-Authored-By: Claude Opus 5.5 <noreply@anthropic.com>
Claude-Session: https://claude.ai/code/session_015SADCFzhKijkC2foUmXrpC
</commit_message>
<xml_diff>
--- a/uss-pelion/USS_Pelion_Players_Guide.docx
+++ b/uss-pelion/USS_Pelion_Players_Guide.docx
@@ -5206,7 +5206,7 @@
     </w:p>
     <w:bookmarkEnd w:id="48"/>
     <w:bookmarkEnd w:id="49"/>
-    <w:bookmarkStart w:id="57" w:name="personal-combat"/>
+    <w:bookmarkStart w:id="58" w:name="personal-combat"/>
     <w:p>
       <w:pPr>
         <w:pStyle w:val="Heading1"/>
@@ -5259,7 +5259,366 @@
       </w:r>
     </w:p>
     <w:bookmarkEnd w:id="51"/>
-    <w:bookmarkStart w:id="53" w:name="injury"/>
+    <w:bookmarkStart w:id="52" w:name="range"/>
+    <w:p>
+      <w:pPr>
+        <w:pStyle w:val="Heading2"/>
+      </w:pPr>
+      <w:r>
+        <w:t xml:space="preserve">Range</w:t>
+      </w:r>
+    </w:p>
+    <w:p>
+      <w:pPr>
+        <w:pStyle w:val="FirstParagraph"/>
+      </w:pPr>
+      <w:r>
+        <w:t xml:space="preserve">Distances fall into five bands:</w:t>
+      </w:r>
+    </w:p>
+    <w:tbl>
+      <w:tblPr>
+        <w:tblStyle w:val="Table"/>
+        <w:tblW w:type="pct" w:w="5000"/>
+        <w:tblLook w:firstRow="1" w:lastRow="0" w:firstColumn="0" w:lastColumn="0" w:noHBand="0" w:noVBand="0" w:val="0020"/>
+        <w:jc w:val="start"/>
+        <w:tblBorders>
+          <w:top w:val="single" w:sz="4" w:color="B8C2D3"/>
+          <w:left w:val="single" w:sz="4" w:color="B8C2D3"/>
+          <w:bottom w:val="single" w:sz="4" w:color="B8C2D3"/>
+          <w:right w:val="single" w:sz="4" w:color="B8C2D3"/>
+          <w:insideH w:val="single" w:sz="4" w:color="B8C2D3"/>
+          <w:insideV w:val="single" w:sz="4" w:color="B8C2D3"/>
+        </w:tblBorders>
+      </w:tblPr>
+      <w:tblGrid>
+        <w:gridCol w:w="2640"/>
+        <w:gridCol w:w="2640"/>
+        <w:gridCol w:w="2640"/>
+      </w:tblGrid>
+      <w:tr>
+        <w:trPr>
+          <w:tblHeader w:val="true"/>
+        </w:trPr>
+        <w:tc>
+          <w:tcPr>
+            <w:shd w:val="clear" w:fill="E9EEF6"/>
+          </w:tcPr>
+          <w:p>
+            <w:pPr>
+              <w:pStyle w:val="Compact"/>
+              <w:jc w:val="left"/>
+            </w:pPr>
+            <w:r>
+              <w:rPr>
+                <w:b/>
+                <w:sz w:val="19"/>
+              </w:rPr>
+              <w:t xml:space="preserve">Band</w:t>
+            </w:r>
+          </w:p>
+        </w:tc>
+        <w:tc>
+          <w:tcPr>
+            <w:shd w:val="clear" w:fill="E9EEF6"/>
+          </w:tcPr>
+          <w:p>
+            <w:pPr>
+              <w:pStyle w:val="Compact"/>
+              <w:jc w:val="left"/>
+            </w:pPr>
+            <w:r>
+              <w:rPr>
+                <w:b/>
+                <w:sz w:val="19"/>
+              </w:rPr>
+              <w:t xml:space="preserve">Distance</w:t>
+            </w:r>
+          </w:p>
+        </w:tc>
+        <w:tc>
+          <w:tcPr>
+            <w:shd w:val="clear" w:fill="E9EEF6"/>
+          </w:tcPr>
+          <w:p>
+            <w:pPr>
+              <w:pStyle w:val="Compact"/>
+              <w:jc w:val="left"/>
+            </w:pPr>
+            <w:r>
+              <w:rPr>
+                <w:b/>
+                <w:sz w:val="19"/>
+              </w:rPr>
+              <w:t xml:space="preserve">For example</w:t>
+            </w:r>
+          </w:p>
+        </w:tc>
+      </w:tr>
+      <w:tr>
+        <w:tc>
+          <w:tcPr/>
+          <w:p>
+            <w:pPr>
+              <w:pStyle w:val="Compact"/>
+              <w:jc w:val="left"/>
+            </w:pPr>
+            <w:r>
+              <w:rPr>
+                <w:b/>
+                <w:sz w:val="19"/>
+              </w:rPr>
+              <w:t xml:space="preserve">Close</w:t>
+            </w:r>
+          </w:p>
+        </w:tc>
+        <w:tc>
+          <w:tcPr/>
+          <w:p>
+            <w:pPr>
+              <w:pStyle w:val="Compact"/>
+              <w:jc w:val="left"/>
+            </w:pPr>
+            <w:r>
+              <w:rPr>
+                <w:sz w:val="19"/>
+              </w:rPr>
+              <w:t xml:space="preserve">Up to 10 yards</w:t>
+            </w:r>
+          </w:p>
+        </w:tc>
+        <w:tc>
+          <w:tcPr/>
+          <w:p>
+            <w:pPr>
+              <w:pStyle w:val="Compact"/>
+              <w:jc w:val="left"/>
+            </w:pPr>
+            <w:r>
+              <w:rPr>
+                <w:sz w:val="19"/>
+              </w:rPr>
+              <w:t xml:space="preserve">Across a room or a corridor junction; one move covers it</w:t>
+            </w:r>
+          </w:p>
+        </w:tc>
+      </w:tr>
+      <w:tr>
+        <w:tc>
+          <w:tcPr/>
+          <w:p>
+            <w:pPr>
+              <w:pStyle w:val="Compact"/>
+              <w:jc w:val="left"/>
+            </w:pPr>
+            <w:r>
+              <w:rPr>
+                <w:b/>
+                <w:sz w:val="19"/>
+              </w:rPr>
+              <w:t xml:space="preserve">Short</w:t>
+            </w:r>
+          </w:p>
+        </w:tc>
+        <w:tc>
+          <w:tcPr/>
+          <w:p>
+            <w:pPr>
+              <w:pStyle w:val="Compact"/>
+              <w:jc w:val="left"/>
+            </w:pPr>
+            <w:r>
+              <w:rPr>
+                <w:sz w:val="19"/>
+              </w:rPr>
+              <w:t xml:space="preserve">Up to 50 yards</w:t>
+            </w:r>
+          </w:p>
+        </w:tc>
+        <w:tc>
+          <w:tcPr/>
+          <w:p>
+            <w:pPr>
+              <w:pStyle w:val="Compact"/>
+              <w:jc w:val="left"/>
+            </w:pPr>
+            <w:r>
+              <w:rPr>
+                <w:sz w:val="19"/>
+              </w:rPr>
+              <w:t xml:space="preserve">Across a shuttle bay or a village square</w:t>
+            </w:r>
+          </w:p>
+        </w:tc>
+      </w:tr>
+      <w:tr>
+        <w:tc>
+          <w:tcPr/>
+          <w:p>
+            <w:pPr>
+              <w:pStyle w:val="Compact"/>
+              <w:jc w:val="left"/>
+            </w:pPr>
+            <w:r>
+              <w:rPr>
+                <w:b/>
+                <w:sz w:val="19"/>
+              </w:rPr>
+              <w:t xml:space="preserve">Medium</w:t>
+            </w:r>
+          </w:p>
+        </w:tc>
+        <w:tc>
+          <w:tcPr/>
+          <w:p>
+            <w:pPr>
+              <w:pStyle w:val="Compact"/>
+              <w:jc w:val="left"/>
+            </w:pPr>
+            <w:r>
+              <w:rPr>
+                <w:sz w:val="19"/>
+              </w:rPr>
+              <w:t xml:space="preserve">Up to 150 yards</w:t>
+            </w:r>
+          </w:p>
+        </w:tc>
+        <w:tc>
+          <w:tcPr/>
+          <w:p>
+            <w:pPr>
+              <w:pStyle w:val="Compact"/>
+              <w:jc w:val="left"/>
+            </w:pPr>
+            <w:r>
+              <w:rPr>
+                <w:sz w:val="19"/>
+              </w:rPr>
+              <w:t xml:space="preserve">Across a cargo hold or a city block</w:t>
+            </w:r>
+          </w:p>
+        </w:tc>
+      </w:tr>
+      <w:tr>
+        <w:tc>
+          <w:tcPr/>
+          <w:p>
+            <w:pPr>
+              <w:pStyle w:val="Compact"/>
+              <w:jc w:val="left"/>
+            </w:pPr>
+            <w:r>
+              <w:rPr>
+                <w:b/>
+                <w:sz w:val="19"/>
+              </w:rPr>
+              <w:t xml:space="preserve">Long</w:t>
+            </w:r>
+          </w:p>
+        </w:tc>
+        <w:tc>
+          <w:tcPr/>
+          <w:p>
+            <w:pPr>
+              <w:pStyle w:val="Compact"/>
+              <w:jc w:val="left"/>
+            </w:pPr>
+            <w:r>
+              <w:rPr>
+                <w:sz w:val="19"/>
+              </w:rPr>
+              <w:t xml:space="preserve">Up to 500 yards</w:t>
+            </w:r>
+          </w:p>
+        </w:tc>
+        <w:tc>
+          <w:tcPr/>
+          <w:p>
+            <w:pPr>
+              <w:pStyle w:val="Compact"/>
+              <w:jc w:val="left"/>
+            </w:pPr>
+            <w:r>
+              <w:rPr>
+                <w:sz w:val="19"/>
+              </w:rPr>
+              <w:t xml:space="preserve">Across a canyon or a landing field</w:t>
+            </w:r>
+          </w:p>
+        </w:tc>
+      </w:tr>
+      <w:tr>
+        <w:tc>
+          <w:tcPr/>
+          <w:p>
+            <w:pPr>
+              <w:pStyle w:val="Compact"/>
+              <w:jc w:val="left"/>
+            </w:pPr>
+            <w:r>
+              <w:rPr>
+                <w:b/>
+                <w:sz w:val="19"/>
+              </w:rPr>
+              <w:t xml:space="preserve">Extreme</w:t>
+            </w:r>
+          </w:p>
+        </w:tc>
+        <w:tc>
+          <w:tcPr/>
+          <w:p>
+            <w:pPr>
+              <w:pStyle w:val="Compact"/>
+              <w:jc w:val="left"/>
+            </w:pPr>
+            <w:r>
+              <w:rPr>
+                <w:sz w:val="19"/>
+              </w:rPr>
+              <w:t xml:space="preserve">Up to a mile, in line of sight</w:t>
+            </w:r>
+          </w:p>
+        </w:tc>
+        <w:tc>
+          <w:tcPr/>
+          <w:p>
+            <w:pPr>
+              <w:pStyle w:val="Compact"/>
+              <w:jc w:val="left"/>
+            </w:pPr>
+            <w:r>
+              <w:rPr>
+                <w:sz w:val="19"/>
+              </w:rPr>
+              <w:t xml:space="preserve">Ridge to ridge</w:t>
+            </w:r>
+          </w:p>
+        </w:tc>
+      </w:tr>
+    </w:tbl>
+    <w:p>
+      <w:pPr>
+        <w:pStyle w:val="BodyText"/>
+      </w:pPr>
+      <w:r>
+        <w:t xml:space="preserve">Every ranged weapon has an</w:t>
+      </w:r>
+      <w:r>
+        <w:t xml:space="preserve"> </w:t>
+      </w:r>
+      <w:r>
+        <w:rPr>
+          <w:bCs/>
+          <w:b/>
+        </w:rPr>
+        <w:t xml:space="preserve">effective band</w:t>
+      </w:r>
+      <w:r>
+        <w:t xml:space="preserve">, shown in the weapons table. Attacks within it take no penalty. One band beyond it is −2, two bands beyond is −4, and anything farther is out of range. Melee weapons and fists reach only someone next to you. Your move each turn covers the Close band; give up your action to run and you cover Short.</w:t>
+      </w:r>
+    </w:p>
+    <w:bookmarkEnd w:id="52"/>
+    <w:bookmarkStart w:id="54" w:name="injury"/>
     <w:p>
       <w:pPr>
         <w:pStyle w:val="Heading2"/>
@@ -5548,7 +5907,7 @@
         <w:t xml:space="preserve">A normal damaging hit marks one box. A powerful attack can mark two, and a killing weapon marks three (see Weapons and damage). Injury penalties replace each other rather than stacking. They apply to movement, attacks, Dodge, and other tasks the injury physically hinders. The GM announces especially lethal hazards before resolution where possible.</w:t>
       </w:r>
     </w:p>
-    <w:bookmarkStart w:id="52" w:name="dying-and-death"/>
+    <w:bookmarkStart w:id="53" w:name="dying-and-death"/>
     <w:p>
       <w:pPr>
         <w:pStyle w:val="Heading3"/>
@@ -5652,9 +6011,9 @@
         <w:t xml:space="preserve">Your protection is avoiding the hit: Dodge, cover, and a Duty point, which reduces a kill shot from three boxes to two, leaving you Seriously wounded but on your feet.</w:t>
       </w:r>
     </w:p>
-    <w:bookmarkEnd w:id="52"/>
     <w:bookmarkEnd w:id="53"/>
-    <w:bookmarkStart w:id="54" w:name="weapons-and-damage"/>
+    <w:bookmarkEnd w:id="54"/>
+    <w:bookmarkStart w:id="55" w:name="weapons-and-damage"/>
     <w:p>
       <w:pPr>
         <w:pStyle w:val="Heading2"/>
@@ -5700,9 +6059,10 @@
         </w:tblBorders>
       </w:tblPr>
       <w:tblGrid>
-        <w:gridCol w:w="2640"/>
-        <w:gridCol w:w="2640"/>
-        <w:gridCol w:w="2640"/>
+        <w:gridCol w:w="1980"/>
+        <w:gridCol w:w="1980"/>
+        <w:gridCol w:w="1980"/>
+        <w:gridCol w:w="1980"/>
       </w:tblGrid>
       <w:tr>
         <w:trPr>
@@ -5740,7 +6100,7 @@
                 <w:b/>
                 <w:sz w:val="19"/>
               </w:rPr>
-              <w:t xml:space="preserve">Boxes on a hit</w:t>
+              <w:t xml:space="preserve">Range</w:t>
             </w:r>
           </w:p>
         </w:tc>
@@ -5758,6 +6118,24 @@
                 <w:b/>
                 <w:sz w:val="19"/>
               </w:rPr>
+              <w:t xml:space="preserve">Boxes on a hit</w:t>
+            </w:r>
+          </w:p>
+        </w:tc>
+        <w:tc>
+          <w:tcPr>
+            <w:shd w:val="clear" w:fill="E9EEF6"/>
+          </w:tcPr>
+          <w:p>
+            <w:pPr>
+              <w:pStyle w:val="Compact"/>
+              <w:jc w:val="left"/>
+            </w:pPr>
+            <w:r>
+              <w:rPr>
+                <w:b/>
+                <w:sz w:val="19"/>
+              </w:rPr>
               <w:t xml:space="preserve">What the injury looks like</w:t>
             </w:r>
           </w:p>
@@ -5791,6 +6169,21 @@
               <w:rPr>
                 <w:sz w:val="19"/>
               </w:rPr>
+              <w:t xml:space="preserve">Melee</w:t>
+            </w:r>
+          </w:p>
+        </w:tc>
+        <w:tc>
+          <w:tcPr/>
+          <w:p>
+            <w:pPr>
+              <w:pStyle w:val="Compact"/>
+              <w:jc w:val="left"/>
+            </w:pPr>
+            <w:r>
+              <w:rPr>
+                <w:sz w:val="19"/>
+              </w:rPr>
               <w:t xml:space="preserve">1</w:t>
             </w:r>
           </w:p>
@@ -5839,6 +6232,21 @@
               <w:rPr>
                 <w:sz w:val="19"/>
               </w:rPr>
+              <w:t xml:space="preserve">Melee; rock Close thrown</w:t>
+            </w:r>
+          </w:p>
+        </w:tc>
+        <w:tc>
+          <w:tcPr/>
+          <w:p>
+            <w:pPr>
+              <w:pStyle w:val="Compact"/>
+              <w:jc w:val="left"/>
+            </w:pPr>
+            <w:r>
+              <w:rPr>
+                <w:sz w:val="19"/>
+              </w:rPr>
               <w:t xml:space="preserve">1</w:t>
             </w:r>
           </w:p>
@@ -5887,6 +6295,21 @@
               <w:rPr>
                 <w:sz w:val="19"/>
               </w:rPr>
+              <w:t xml:space="preserve">Melee; Close thrown</w:t>
+            </w:r>
+          </w:p>
+        </w:tc>
+        <w:tc>
+          <w:tcPr/>
+          <w:p>
+            <w:pPr>
+              <w:pStyle w:val="Compact"/>
+              <w:jc w:val="left"/>
+            </w:pPr>
+            <w:r>
+              <w:rPr>
+                <w:sz w:val="19"/>
+              </w:rPr>
               <w:t xml:space="preserve">1</w:t>
             </w:r>
           </w:p>
@@ -5935,6 +6358,21 @@
               <w:rPr>
                 <w:sz w:val="19"/>
               </w:rPr>
+              <w:t xml:space="preserve">Medium; spear Close thrown</w:t>
+            </w:r>
+          </w:p>
+        </w:tc>
+        <w:tc>
+          <w:tcPr/>
+          <w:p>
+            <w:pPr>
+              <w:pStyle w:val="Compact"/>
+              <w:jc w:val="left"/>
+            </w:pPr>
+            <w:r>
+              <w:rPr>
+                <w:sz w:val="19"/>
+              </w:rPr>
               <w:t xml:space="preserve">1</w:t>
             </w:r>
           </w:p>
@@ -5983,6 +6421,21 @@
               <w:rPr>
                 <w:sz w:val="19"/>
               </w:rPr>
+              <w:t xml:space="preserve">Melee</w:t>
+            </w:r>
+          </w:p>
+        </w:tc>
+        <w:tc>
+          <w:tcPr/>
+          <w:p>
+            <w:pPr>
+              <w:pStyle w:val="Compact"/>
+              <w:jc w:val="left"/>
+            </w:pPr>
+            <w:r>
+              <w:rPr>
+                <w:sz w:val="19"/>
+              </w:rPr>
               <w:t xml:space="preserve">2</w:t>
             </w:r>
           </w:p>
@@ -6031,6 +6484,21 @@
               <w:rPr>
                 <w:sz w:val="19"/>
               </w:rPr>
+              <w:t xml:space="preserve">Short (type 1), Medium (type 2)</w:t>
+            </w:r>
+          </w:p>
+        </w:tc>
+        <w:tc>
+          <w:tcPr/>
+          <w:p>
+            <w:pPr>
+              <w:pStyle w:val="Compact"/>
+              <w:jc w:val="left"/>
+            </w:pPr>
+            <w:r>
+              <w:rPr>
+                <w:sz w:val="19"/>
+              </w:rPr>
               <w:t xml:space="preserve">0</w:t>
             </w:r>
           </w:p>
@@ -6079,6 +6547,21 @@
               <w:rPr>
                 <w:sz w:val="19"/>
               </w:rPr>
+              <w:t xml:space="preserve">Short (type 1), Medium (type 2)</w:t>
+            </w:r>
+          </w:p>
+        </w:tc>
+        <w:tc>
+          <w:tcPr/>
+          <w:p>
+            <w:pPr>
+              <w:pStyle w:val="Compact"/>
+              <w:jc w:val="left"/>
+            </w:pPr>
+            <w:r>
+              <w:rPr>
+                <w:sz w:val="19"/>
+              </w:rPr>
               <w:t xml:space="preserve">3, and Dying</w:t>
             </w:r>
           </w:p>
@@ -6127,6 +6610,21 @@
               <w:rPr>
                 <w:sz w:val="19"/>
               </w:rPr>
+              <w:t xml:space="preserve">Medium</w:t>
+            </w:r>
+          </w:p>
+        </w:tc>
+        <w:tc>
+          <w:tcPr/>
+          <w:p>
+            <w:pPr>
+              <w:pStyle w:val="Compact"/>
+              <w:jc w:val="left"/>
+            </w:pPr>
+            <w:r>
+              <w:rPr>
+                <w:sz w:val="19"/>
+              </w:rPr>
               <w:t xml:space="preserve">3, and Dying</w:t>
             </w:r>
           </w:p>
@@ -6175,6 +6673,21 @@
               <w:rPr>
                 <w:sz w:val="19"/>
               </w:rPr>
+              <w:t xml:space="preserve">Long; ship’s weapon Extreme</w:t>
+            </w:r>
+          </w:p>
+        </w:tc>
+        <w:tc>
+          <w:tcPr/>
+          <w:p>
+            <w:pPr>
+              <w:pStyle w:val="Compact"/>
+              <w:jc w:val="left"/>
+            </w:pPr>
+            <w:r>
+              <w:rPr>
+                <w:sz w:val="19"/>
+              </w:rPr>
               <w:t xml:space="preserve">3 and Dying, or disintegration if the GM rules it</w:t>
             </w:r>
           </w:p>
@@ -6223,6 +6736,21 @@
               <w:rPr>
                 <w:sz w:val="19"/>
               </w:rPr>
+              <w:t xml:space="preserve">Close (thrown grenade)</w:t>
+            </w:r>
+          </w:p>
+        </w:tc>
+        <w:tc>
+          <w:tcPr/>
+          <w:p>
+            <w:pPr>
+              <w:pStyle w:val="Compact"/>
+              <w:jc w:val="left"/>
+            </w:pPr>
+            <w:r>
+              <w:rPr>
+                <w:sz w:val="19"/>
+              </w:rPr>
               <w:t xml:space="preserve">1 to everyone nearby, 2 at the centre</w:t>
             </w:r>
           </w:p>
@@ -6257,6 +6785,21 @@
                 <w:sz w:val="19"/>
               </w:rPr>
               <w:t xml:space="preserve">Fall</w:t>
+            </w:r>
+          </w:p>
+        </w:tc>
+        <w:tc>
+          <w:tcPr/>
+          <w:p>
+            <w:pPr>
+              <w:pStyle w:val="Compact"/>
+              <w:jc w:val="left"/>
+            </w:pPr>
+            <w:r>
+              <w:rPr>
+                <w:sz w:val="19"/>
+              </w:rPr>
+              <w:t xml:space="preserve">—</w:t>
             </w:r>
           </w:p>
         </w:tc>
@@ -6318,8 +6861,8 @@
         <w:t xml:space="preserve">To take someone down without hurting them, use a phaser on stun, a grapple, or the Vulcan nerve pinch rather than a weapon from this list.</w:t>
       </w:r>
     </w:p>
-    <w:bookmarkEnd w:id="54"/>
-    <w:bookmarkStart w:id="55" w:name="phaser-settings"/>
+    <w:bookmarkEnd w:id="55"/>
+    <w:bookmarkStart w:id="56" w:name="phaser-settings"/>
     <w:p>
       <w:pPr>
         <w:pStyle w:val="Heading2"/>
@@ -6496,8 +7039,8 @@
         <w:t xml:space="preserve">Declare the setting before firing. Stun effects do not stack; a later failed resistance roll still incapacitates the target. Unarmed strikes normally mark one box. A grapple uses an opposed Unarmed Combat contest; winning restrains the target while the hold is maintained. Escape uses an action and a new contest.</w:t>
       </w:r>
     </w:p>
-    <w:bookmarkEnd w:id="55"/>
-    <w:bookmarkStart w:id="56" w:name="phaser-power"/>
+    <w:bookmarkEnd w:id="56"/>
+    <w:bookmarkStart w:id="57" w:name="phaser-power"/>
     <w:p>
       <w:pPr>
         <w:pStyle w:val="Heading2"/>
@@ -6980,9 +7523,9 @@
         <w:t xml:space="preserve">A phaser with at least 4 power left can be set to overload: it whines for a round and explodes at the end of the next round, as an explosion (1 box to everyone nearby, 2 at the centre). The phaser is destroyed.</w:t>
       </w:r>
     </w:p>
-    <w:bookmarkEnd w:id="56"/>
     <w:bookmarkEnd w:id="57"/>
-    <w:bookmarkStart w:id="65" w:name="medical-care"/>
+    <w:bookmarkEnd w:id="58"/>
+    <w:bookmarkStart w:id="66" w:name="medical-care"/>
     <w:p>
       <w:pPr>
         <w:pStyle w:val="Heading1"/>
@@ -6999,7 +7542,7 @@
         <w:t xml:space="preserve">Starfleet physicians in 2268 have advanced diagnostic scanners, potent pharmaceuticals, portable emergency equipment, and sophisticated sickbay facilities. Familiar injuries often respond quickly to treatment. Severe trauma, incompatible biology, missing supplies, and unidentified conditions still challenge an experienced doctor. The treatment values below are campaign rules inspired by the series, rather than numerical rules stated in canon.</w:t>
       </w:r>
     </w:p>
-    <w:bookmarkStart w:id="58" w:name="diagnosis-and-stabilization"/>
+    <w:bookmarkStart w:id="59" w:name="diagnosis-and-stabilization"/>
     <w:p>
       <w:pPr>
         <w:pStyle w:val="Heading2"/>
@@ -7024,8 +7567,8 @@
         <w:t xml:space="preserve">Emergency stabilization takes one action and a successful Medicine roll with a medical kit. It prevents deterioration from the treated injury while the patient is protected from further harm, and it ends Dying. Stabilization alone removes no injury boxes. A patient at three boxes remains incapacitated until treatment clears a box.</w:t>
       </w:r>
     </w:p>
-    <w:bookmarkEnd w:id="58"/>
-    <w:bookmarkStart w:id="59" w:name="field-treatment"/>
+    <w:bookmarkEnd w:id="59"/>
+    <w:bookmarkStart w:id="60" w:name="field-treatment"/>
     <w:p>
       <w:pPr>
         <w:pStyle w:val="Heading2"/>
@@ -7042,8 +7585,8 @@
         <w:t xml:space="preserve">With a medical kit and several uninterrupted minutes, successful Medicine removes one injury box. Success by 5 or more removes two. Each injury receives one field-treatment attempt, even if that attempt fails; further attempts require changed circumstances such as better equipment, new diagnostic information, or access to sickbay. New injuries can receive their own treatment, but cannot justify treating an old injury repeatedly.</w:t>
       </w:r>
     </w:p>
-    <w:bookmarkEnd w:id="59"/>
-    <w:bookmarkStart w:id="60" w:name="sickbay-treatment"/>
+    <w:bookmarkEnd w:id="60"/>
+    <w:bookmarkStart w:id="61" w:name="sickbay-treatment"/>
     <w:p>
       <w:pPr>
         <w:pStyle w:val="Heading2"/>
@@ -7068,8 +7611,8 @@
         <w:t xml:space="preserve">Removing injury boxes removes their associated penalties, but major organ damage, severe burns, and complex internal trauma can still require a procedure and recovery period set by the GM. The physician determines whether the patient is fit for duty. Pain suppression does not itself heal an injury. Stun normally wears off at the end of the scene; prolonged unconsciousness requires assessment.</w:t>
       </w:r>
     </w:p>
-    <w:bookmarkEnd w:id="60"/>
-    <w:bookmarkStart w:id="61" w:name="natural-recovery"/>
+    <w:bookmarkEnd w:id="61"/>
+    <w:bookmarkStart w:id="62" w:name="natural-recovery"/>
     <w:p>
       <w:pPr>
         <w:pStyle w:val="Heading2"/>
@@ -7186,8 +7729,8 @@
         <w:t xml:space="preserve">Ensign Reyes ends a mission Seriously wounded (two boxes). Sickbay is busy with worse cases, so Reyes rests in quarters: one box clears the first day and the second the next, and Reyes is back on duty on the third day.</w:t>
       </w:r>
     </w:p>
-    <w:bookmarkEnd w:id="61"/>
-    <w:bookmarkStart w:id="62" w:name="alien-medicine-and-limits"/>
+    <w:bookmarkEnd w:id="62"/>
+    <w:bookmarkStart w:id="63" w:name="alien-medicine-and-limits"/>
     <w:p>
       <w:pPr>
         <w:pStyle w:val="Heading2"/>
@@ -7212,8 +7755,8 @@
         <w:t xml:space="preserve">Crew of other species may need care suited to their biology. An Alien Physiology Specialist, or a physician with access to the right species data, keeps that care from becoming guesswork.</w:t>
       </w:r>
     </w:p>
-    <w:bookmarkEnd w:id="62"/>
-    <w:bookmarkStart w:id="64" w:name="examples-from-the-original-series"/>
+    <w:bookmarkEnd w:id="63"/>
+    <w:bookmarkStart w:id="65" w:name="examples-from-the-original-series"/>
     <w:p>
       <w:pPr>
         <w:pStyle w:val="Heading2"/>
@@ -7312,7 +7855,7 @@
       <w:r>
         <w:t xml:space="preserve"> </w:t>
       </w:r>
-      <w:hyperlink r:id="rId63">
+      <w:hyperlink r:id="rId64">
         <w:r>
           <w:rPr>
             <w:rStyle w:val="Hyperlink"/>
@@ -7321,9 +7864,9 @@
         </w:r>
       </w:hyperlink>
     </w:p>
-    <w:bookmarkEnd w:id="64"/>
     <w:bookmarkEnd w:id="65"/>
-    <w:bookmarkStart w:id="70" w:name="duty-points-and-bridge-duty"/>
+    <w:bookmarkEnd w:id="66"/>
+    <w:bookmarkStart w:id="73" w:name="duty-points-and-bridge-duty"/>
     <w:p>
       <w:pPr>
         <w:pStyle w:val="Heading1"/>
@@ -7332,7 +7875,7 @@
         <w:t xml:space="preserve">Duty points and bridge duty</w:t>
       </w:r>
     </w:p>
-    <w:bookmarkStart w:id="66" w:name="using-duty-points"/>
+    <w:bookmarkStart w:id="67" w:name="using-duty-points"/>
     <w:p>
       <w:pPr>
         <w:pStyle w:val="Heading2"/>
@@ -7535,8 +8078,8 @@
         <w:t xml:space="preserve">your curiosity tempts you to remain beside an anomaly while the team withdraws. If you accept the resulting separation and danger, the GM awards one Duty point. The point does not remove that danger.</w:t>
       </w:r>
     </w:p>
-    <w:bookmarkEnd w:id="66"/>
-    <w:bookmarkStart w:id="67" w:name="working-on-the-bridge"/>
+    <w:bookmarkEnd w:id="67"/>
+    <w:bookmarkStart w:id="69" w:name="working-on-the-bridge"/>
     <w:p>
       <w:pPr>
         <w:pStyle w:val="Heading2"/>
@@ -7641,7 +8184,7 @@
               <w:rPr>
                 <w:sz w:val="19"/>
               </w:rPr>
-              <w:t xml:space="preserve">Leadership to coordinate; Diplomacy to negotiate</w:t>
+              <w:t xml:space="preserve">Orders each exchange: Command, Read the enemy, Hail or Rally (see The captain’s orders)</w:t>
             </w:r>
           </w:p>
         </w:tc>
@@ -7845,22 +8388,13 @@
         </w:tc>
       </w:tr>
     </w:tbl>
-    <w:p>
-      <w:pPr>
-        <w:pStyle w:val="BodyText"/>
-      </w:pPr>
-      <w:r>
-        <w:t xml:space="preserve">Leadership can assist another officer when orders or coordination meaningfully help. It uses the normal assistance rule and does not provide an automatic bonus to every station.</w:t>
-      </w:r>
-    </w:p>
-    <w:bookmarkEnd w:id="67"/>
-    <w:bookmarkStart w:id="68" w:name="the-uss-pelion"/>
-    <w:p>
-      <w:pPr>
-        <w:pStyle w:val="Heading2"/>
-      </w:pPr>
-      <w:r>
-        <w:t xml:space="preserve">The USS Pelion</w:t>
+    <w:bookmarkStart w:id="68" w:name="the-captains-orders"/>
+    <w:p>
+      <w:pPr>
+        <w:pStyle w:val="Heading3"/>
+      </w:pPr>
+      <w:r>
+        <w:t xml:space="preserve">The captain’s orders</w:t>
       </w:r>
     </w:p>
     <w:p>
@@ -7868,7 +8402,7 @@
         <w:pStyle w:val="FirstParagraph"/>
       </w:pPr>
       <w:r>
-        <w:t xml:space="preserve">The ship has its own sheet, tracked like an injury track. Encounters stay descriptive: the GM states what is at stake before rolls and narrates what each box means. This light structure is a campaign rule; detailed starship combat stays outside this guide.</w:t>
+        <w:t xml:space="preserve">The captain, or whoever has the conn, takes one of these each exchange:</w:t>
       </w:r>
     </w:p>
     <w:tbl>
@@ -7909,7 +8443,7 @@
                 <w:b/>
                 <w:sz w:val="19"/>
               </w:rPr>
-              <w:t xml:space="preserve">Track</w:t>
+              <w:t xml:space="preserve">Order</w:t>
             </w:r>
           </w:p>
         </w:tc>
@@ -7927,7 +8461,7 @@
                 <w:b/>
                 <w:sz w:val="19"/>
               </w:rPr>
-              <w:t xml:space="preserve">Boxes</w:t>
+              <w:t xml:space="preserve">Roll</w:t>
             </w:r>
           </w:p>
         </w:tc>
@@ -7945,6 +8479,305 @@
                 <w:b/>
                 <w:sz w:val="19"/>
               </w:rPr>
+              <w:t xml:space="preserve">Effect</w:t>
+            </w:r>
+          </w:p>
+        </w:tc>
+      </w:tr>
+      <w:tr>
+        <w:tc>
+          <w:tcPr/>
+          <w:p>
+            <w:pPr>
+              <w:pStyle w:val="Compact"/>
+              <w:jc w:val="left"/>
+            </w:pPr>
+            <w:r>
+              <w:rPr>
+                <w:b/>
+                <w:sz w:val="19"/>
+              </w:rPr>
+              <w:t xml:space="preserve">Command</w:t>
+            </w:r>
+          </w:p>
+        </w:tc>
+        <w:tc>
+          <w:tcPr/>
+          <w:p>
+            <w:pPr>
+              <w:pStyle w:val="Compact"/>
+              <w:jc w:val="left"/>
+            </w:pPr>
+            <w:r>
+              <w:rPr>
+                <w:sz w:val="19"/>
+              </w:rPr>
+              <w:t xml:space="preserve">Leadership</w:t>
+            </w:r>
+          </w:p>
+        </w:tc>
+        <w:tc>
+          <w:tcPr/>
+          <w:p>
+            <w:pPr>
+              <w:pStyle w:val="Compact"/>
+              <w:jc w:val="left"/>
+            </w:pPr>
+            <w:r>
+              <w:rPr>
+                <w:sz w:val="19"/>
+              </w:rPr>
+              <w:t xml:space="preserve">Success: one station gets +2 to its roll this exchange; success by 5, two stations.</w:t>
+            </w:r>
+          </w:p>
+        </w:tc>
+      </w:tr>
+      <w:tr>
+        <w:tc>
+          <w:tcPr/>
+          <w:p>
+            <w:pPr>
+              <w:pStyle w:val="Compact"/>
+              <w:jc w:val="left"/>
+            </w:pPr>
+            <w:r>
+              <w:rPr>
+                <w:b/>
+                <w:sz w:val="19"/>
+              </w:rPr>
+              <w:t xml:space="preserve">Read the enemy</w:t>
+            </w:r>
+          </w:p>
+        </w:tc>
+        <w:tc>
+          <w:tcPr/>
+          <w:p>
+            <w:pPr>
+              <w:pStyle w:val="Compact"/>
+              <w:jc w:val="left"/>
+            </w:pPr>
+            <w:r>
+              <w:rPr>
+                <w:sz w:val="19"/>
+              </w:rPr>
+              <w:t xml:space="preserve">Psychology</w:t>
+            </w:r>
+          </w:p>
+        </w:tc>
+        <w:tc>
+          <w:tcPr/>
+          <w:p>
+            <w:pPr>
+              <w:pStyle w:val="Compact"/>
+              <w:jc w:val="left"/>
+            </w:pPr>
+            <w:r>
+              <w:rPr>
+                <w:sz w:val="19"/>
+              </w:rPr>
+              <w:t xml:space="preserve">Success: you predict their next move. +2 to the pilot’s evade or range contest this exchange, or the gunner ignores one band of range penalty.</w:t>
+            </w:r>
+          </w:p>
+        </w:tc>
+      </w:tr>
+      <w:tr>
+        <w:tc>
+          <w:tcPr/>
+          <w:p>
+            <w:pPr>
+              <w:pStyle w:val="Compact"/>
+              <w:jc w:val="left"/>
+            </w:pPr>
+            <w:r>
+              <w:rPr>
+                <w:b/>
+                <w:sz w:val="19"/>
+              </w:rPr>
+              <w:t xml:space="preserve">Hail</w:t>
+            </w:r>
+          </w:p>
+        </w:tc>
+        <w:tc>
+          <w:tcPr/>
+          <w:p>
+            <w:pPr>
+              <w:pStyle w:val="Compact"/>
+              <w:jc w:val="left"/>
+            </w:pPr>
+            <w:r>
+              <w:rPr>
+                <w:sz w:val="19"/>
+              </w:rPr>
+              <w:t xml:space="preserve">Diplomacy (a bluff included)</w:t>
+            </w:r>
+          </w:p>
+        </w:tc>
+        <w:tc>
+          <w:tcPr/>
+          <w:p>
+            <w:pPr>
+              <w:pStyle w:val="Compact"/>
+              <w:jc w:val="left"/>
+            </w:pPr>
+            <w:r>
+              <w:rPr>
+                <w:sz w:val="19"/>
+              </w:rPr>
+              <w:t xml:space="preserve">Opposed by the enemy captain’s Will. Success: they pause to talk, hold fire for an exchange, or consider surrender; a bluff can make them believe what you say about your ship.</w:t>
+            </w:r>
+          </w:p>
+        </w:tc>
+      </w:tr>
+      <w:tr>
+        <w:tc>
+          <w:tcPr/>
+          <w:p>
+            <w:pPr>
+              <w:pStyle w:val="Compact"/>
+              <w:jc w:val="left"/>
+            </w:pPr>
+            <w:r>
+              <w:rPr>
+                <w:b/>
+                <w:sz w:val="19"/>
+              </w:rPr>
+              <w:t xml:space="preserve">Rally</w:t>
+            </w:r>
+          </w:p>
+        </w:tc>
+        <w:tc>
+          <w:tcPr/>
+          <w:p>
+            <w:pPr>
+              <w:pStyle w:val="Compact"/>
+              <w:jc w:val="left"/>
+            </w:pPr>
+            <w:r>
+              <w:rPr>
+                <w:sz w:val="19"/>
+              </w:rPr>
+              <w:t xml:space="preserve">Leadership</w:t>
+            </w:r>
+          </w:p>
+        </w:tc>
+        <w:tc>
+          <w:tcPr/>
+          <w:p>
+            <w:pPr>
+              <w:pStyle w:val="Compact"/>
+              <w:jc w:val="left"/>
+            </w:pPr>
+            <w:r>
+              <w:rPr>
+                <w:sz w:val="19"/>
+              </w:rPr>
+              <w:t xml:space="preserve">After a hit to the hull, steady the crew: anyone stunned or shaken by the hit acts normally again, and the next failed station roll this scene may be rerolled.</w:t>
+            </w:r>
+          </w:p>
+        </w:tc>
+      </w:tr>
+    </w:tbl>
+    <w:p>
+      <w:pPr>
+        <w:pStyle w:val="BodyText"/>
+      </w:pPr>
+      <w:r>
+        <w:t xml:space="preserve">A captain who takes an order doesn’t also work a station that exchange. Commanding well is the job.</w:t>
+      </w:r>
+    </w:p>
+    <w:bookmarkEnd w:id="68"/>
+    <w:bookmarkEnd w:id="69"/>
+    <w:bookmarkStart w:id="71" w:name="the-uss-pelion"/>
+    <w:p>
+      <w:pPr>
+        <w:pStyle w:val="Heading2"/>
+      </w:pPr>
+      <w:r>
+        <w:t xml:space="preserve">The USS Pelion</w:t>
+      </w:r>
+    </w:p>
+    <w:p>
+      <w:pPr>
+        <w:pStyle w:val="FirstParagraph"/>
+      </w:pPr>
+      <w:r>
+        <w:t xml:space="preserve">The ship has its own sheet, tracked like an injury track. Encounters stay descriptive: the GM states what is at stake before rolls and narrates what each box means. This light structure is a campaign rule; detailed starship combat stays outside this guide.</w:t>
+      </w:r>
+    </w:p>
+    <w:tbl>
+      <w:tblPr>
+        <w:tblStyle w:val="Table"/>
+        <w:tblW w:type="pct" w:w="5000"/>
+        <w:tblLook w:firstRow="1" w:lastRow="0" w:firstColumn="0" w:lastColumn="0" w:noHBand="0" w:noVBand="0" w:val="0020"/>
+        <w:jc w:val="start"/>
+        <w:tblBorders>
+          <w:top w:val="single" w:sz="4" w:color="B8C2D3"/>
+          <w:left w:val="single" w:sz="4" w:color="B8C2D3"/>
+          <w:bottom w:val="single" w:sz="4" w:color="B8C2D3"/>
+          <w:right w:val="single" w:sz="4" w:color="B8C2D3"/>
+          <w:insideH w:val="single" w:sz="4" w:color="B8C2D3"/>
+          <w:insideV w:val="single" w:sz="4" w:color="B8C2D3"/>
+        </w:tblBorders>
+      </w:tblPr>
+      <w:tblGrid>
+        <w:gridCol w:w="2640"/>
+        <w:gridCol w:w="2640"/>
+        <w:gridCol w:w="2640"/>
+      </w:tblGrid>
+      <w:tr>
+        <w:trPr>
+          <w:tblHeader w:val="true"/>
+        </w:trPr>
+        <w:tc>
+          <w:tcPr>
+            <w:shd w:val="clear" w:fill="E9EEF6"/>
+          </w:tcPr>
+          <w:p>
+            <w:pPr>
+              <w:pStyle w:val="Compact"/>
+              <w:jc w:val="left"/>
+            </w:pPr>
+            <w:r>
+              <w:rPr>
+                <w:b/>
+                <w:sz w:val="19"/>
+              </w:rPr>
+              <w:t xml:space="preserve">Track</w:t>
+            </w:r>
+          </w:p>
+        </w:tc>
+        <w:tc>
+          <w:tcPr>
+            <w:shd w:val="clear" w:fill="E9EEF6"/>
+          </w:tcPr>
+          <w:p>
+            <w:pPr>
+              <w:pStyle w:val="Compact"/>
+              <w:jc w:val="left"/>
+            </w:pPr>
+            <w:r>
+              <w:rPr>
+                <w:b/>
+                <w:sz w:val="19"/>
+              </w:rPr>
+              <w:t xml:space="preserve">Boxes</w:t>
+            </w:r>
+          </w:p>
+        </w:tc>
+        <w:tc>
+          <w:tcPr>
+            <w:shd w:val="clear" w:fill="E9EEF6"/>
+          </w:tcPr>
+          <w:p>
+            <w:pPr>
+              <w:pStyle w:val="Compact"/>
+              <w:jc w:val="left"/>
+            </w:pPr>
+            <w:r>
+              <w:rPr>
+                <w:b/>
+                <w:sz w:val="19"/>
+              </w:rPr>
               <w:t xml:space="preserve">Effect as boxes fill</w:t>
             </w:r>
           </w:p>
@@ -8301,8 +9134,913 @@
         <w:t xml:space="preserve">for ship weapons, against the enemy ship’s own tracks, which the GM keeps the same way.</w:t>
       </w:r>
     </w:p>
-    <w:bookmarkEnd w:id="68"/>
-    <w:bookmarkStart w:id="69" w:name="advancement"/>
+    <w:bookmarkStart w:id="70" w:name="range-in-space"/>
+    <w:p>
+      <w:pPr>
+        <w:pStyle w:val="Heading3"/>
+      </w:pPr>
+      <w:r>
+        <w:t xml:space="preserve">Range in space</w:t>
+      </w:r>
+    </w:p>
+    <w:tbl>
+      <w:tblPr>
+        <w:tblStyle w:val="Table"/>
+        <w:tblW w:type="pct" w:w="5000"/>
+        <w:tblLook w:firstRow="1" w:lastRow="0" w:firstColumn="0" w:lastColumn="0" w:noHBand="0" w:noVBand="0" w:val="0020"/>
+        <w:jc w:val="start"/>
+        <w:tblBorders>
+          <w:top w:val="single" w:sz="4" w:color="B8C2D3"/>
+          <w:left w:val="single" w:sz="4" w:color="B8C2D3"/>
+          <w:bottom w:val="single" w:sz="4" w:color="B8C2D3"/>
+          <w:right w:val="single" w:sz="4" w:color="B8C2D3"/>
+          <w:insideH w:val="single" w:sz="4" w:color="B8C2D3"/>
+          <w:insideV w:val="single" w:sz="4" w:color="B8C2D3"/>
+        </w:tblBorders>
+      </w:tblPr>
+      <w:tblGrid>
+        <w:gridCol w:w="2640"/>
+        <w:gridCol w:w="2640"/>
+        <w:gridCol w:w="2640"/>
+      </w:tblGrid>
+      <w:tr>
+        <w:trPr>
+          <w:tblHeader w:val="true"/>
+        </w:trPr>
+        <w:tc>
+          <w:tcPr>
+            <w:shd w:val="clear" w:fill="E9EEF6"/>
+          </w:tcPr>
+          <w:p>
+            <w:pPr>
+              <w:pStyle w:val="Compact"/>
+              <w:jc w:val="left"/>
+            </w:pPr>
+            <w:r>
+              <w:rPr>
+                <w:b/>
+                <w:sz w:val="19"/>
+              </w:rPr>
+              <w:t xml:space="preserve">Band</w:t>
+            </w:r>
+          </w:p>
+        </w:tc>
+        <w:tc>
+          <w:tcPr>
+            <w:shd w:val="clear" w:fill="E9EEF6"/>
+          </w:tcPr>
+          <w:p>
+            <w:pPr>
+              <w:pStyle w:val="Compact"/>
+              <w:jc w:val="left"/>
+            </w:pPr>
+            <w:r>
+              <w:rPr>
+                <w:b/>
+                <w:sz w:val="19"/>
+              </w:rPr>
+              <w:t xml:space="preserve">Distance</w:t>
+            </w:r>
+          </w:p>
+        </w:tc>
+        <w:tc>
+          <w:tcPr>
+            <w:shd w:val="clear" w:fill="E9EEF6"/>
+          </w:tcPr>
+          <w:p>
+            <w:pPr>
+              <w:pStyle w:val="Compact"/>
+              <w:jc w:val="left"/>
+            </w:pPr>
+            <w:r>
+              <w:rPr>
+                <w:b/>
+                <w:sz w:val="19"/>
+              </w:rPr>
+              <w:t xml:space="preserve">For example</w:t>
+            </w:r>
+          </w:p>
+        </w:tc>
+      </w:tr>
+      <w:tr>
+        <w:tc>
+          <w:tcPr/>
+          <w:p>
+            <w:pPr>
+              <w:pStyle w:val="Compact"/>
+              <w:jc w:val="left"/>
+            </w:pPr>
+            <w:r>
+              <w:rPr>
+                <w:b/>
+                <w:sz w:val="19"/>
+              </w:rPr>
+              <w:t xml:space="preserve">Close</w:t>
+            </w:r>
+          </w:p>
+        </w:tc>
+        <w:tc>
+          <w:tcPr/>
+          <w:p>
+            <w:pPr>
+              <w:pStyle w:val="Compact"/>
+              <w:jc w:val="left"/>
+            </w:pPr>
+            <w:r>
+              <w:rPr>
+                <w:sz w:val="19"/>
+              </w:rPr>
+              <w:t xml:space="preserve">Under 10 km</w:t>
+            </w:r>
+          </w:p>
+        </w:tc>
+        <w:tc>
+          <w:tcPr/>
+          <w:p>
+            <w:pPr>
+              <w:pStyle w:val="Compact"/>
+              <w:jc w:val="left"/>
+            </w:pPr>
+            <w:r>
+              <w:rPr>
+                <w:sz w:val="19"/>
+              </w:rPr>
+              <w:t xml:space="preserve">Docking, boarding, a knife fight between hulls</w:t>
+            </w:r>
+          </w:p>
+        </w:tc>
+      </w:tr>
+      <w:tr>
+        <w:tc>
+          <w:tcPr/>
+          <w:p>
+            <w:pPr>
+              <w:pStyle w:val="Compact"/>
+              <w:jc w:val="left"/>
+            </w:pPr>
+            <w:r>
+              <w:rPr>
+                <w:b/>
+                <w:sz w:val="19"/>
+              </w:rPr>
+              <w:t xml:space="preserve">Short</w:t>
+            </w:r>
+          </w:p>
+        </w:tc>
+        <w:tc>
+          <w:tcPr/>
+          <w:p>
+            <w:pPr>
+              <w:pStyle w:val="Compact"/>
+              <w:jc w:val="left"/>
+            </w:pPr>
+            <w:r>
+              <w:rPr>
+                <w:sz w:val="19"/>
+              </w:rPr>
+              <w:t xml:space="preserve">Up to 1,000 km</w:t>
+            </w:r>
+          </w:p>
+        </w:tc>
+        <w:tc>
+          <w:tcPr/>
+          <w:p>
+            <w:pPr>
+              <w:pStyle w:val="Compact"/>
+              <w:jc w:val="left"/>
+            </w:pPr>
+            <w:r>
+              <w:rPr>
+                <w:sz w:val="19"/>
+              </w:rPr>
+              <w:t xml:space="preserve">Formation flying; a ship is a visible point of light</w:t>
+            </w:r>
+          </w:p>
+        </w:tc>
+      </w:tr>
+      <w:tr>
+        <w:tc>
+          <w:tcPr/>
+          <w:p>
+            <w:pPr>
+              <w:pStyle w:val="Compact"/>
+              <w:jc w:val="left"/>
+            </w:pPr>
+            <w:r>
+              <w:rPr>
+                <w:b/>
+                <w:sz w:val="19"/>
+              </w:rPr>
+              <w:t xml:space="preserve">Medium</w:t>
+            </w:r>
+          </w:p>
+        </w:tc>
+        <w:tc>
+          <w:tcPr/>
+          <w:p>
+            <w:pPr>
+              <w:pStyle w:val="Compact"/>
+              <w:jc w:val="left"/>
+            </w:pPr>
+            <w:r>
+              <w:rPr>
+                <w:sz w:val="19"/>
+              </w:rPr>
+              <w:t xml:space="preserve">Up to 10,000 km</w:t>
+            </w:r>
+          </w:p>
+        </w:tc>
+        <w:tc>
+          <w:tcPr/>
+          <w:p>
+            <w:pPr>
+              <w:pStyle w:val="Compact"/>
+              <w:jc w:val="left"/>
+            </w:pPr>
+            <w:r>
+              <w:rPr>
+                <w:sz w:val="19"/>
+              </w:rPr>
+              <w:t xml:space="preserve">A planet’s near orbit</w:t>
+            </w:r>
+          </w:p>
+        </w:tc>
+      </w:tr>
+      <w:tr>
+        <w:tc>
+          <w:tcPr/>
+          <w:p>
+            <w:pPr>
+              <w:pStyle w:val="Compact"/>
+              <w:jc w:val="left"/>
+            </w:pPr>
+            <w:r>
+              <w:rPr>
+                <w:b/>
+                <w:sz w:val="19"/>
+              </w:rPr>
+              <w:t xml:space="preserve">Long</w:t>
+            </w:r>
+          </w:p>
+        </w:tc>
+        <w:tc>
+          <w:tcPr/>
+          <w:p>
+            <w:pPr>
+              <w:pStyle w:val="Compact"/>
+              <w:jc w:val="left"/>
+            </w:pPr>
+            <w:r>
+              <w:rPr>
+                <w:sz w:val="19"/>
+              </w:rPr>
+              <w:t xml:space="preserve">Up to 100,000 km</w:t>
+            </w:r>
+          </w:p>
+        </w:tc>
+        <w:tc>
+          <w:tcPr/>
+          <w:p>
+            <w:pPr>
+              <w:pStyle w:val="Compact"/>
+              <w:jc w:val="left"/>
+            </w:pPr>
+            <w:r>
+              <w:rPr>
+                <w:sz w:val="19"/>
+              </w:rPr>
+              <w:t xml:space="preserve">Across a planet’s moon system</w:t>
+            </w:r>
+          </w:p>
+        </w:tc>
+      </w:tr>
+      <w:tr>
+        <w:tc>
+          <w:tcPr/>
+          <w:p>
+            <w:pPr>
+              <w:pStyle w:val="Compact"/>
+              <w:jc w:val="left"/>
+            </w:pPr>
+            <w:r>
+              <w:rPr>
+                <w:b/>
+                <w:sz w:val="19"/>
+              </w:rPr>
+              <w:t xml:space="preserve">Extreme</w:t>
+            </w:r>
+          </w:p>
+        </w:tc>
+        <w:tc>
+          <w:tcPr/>
+          <w:p>
+            <w:pPr>
+              <w:pStyle w:val="Compact"/>
+              <w:jc w:val="left"/>
+            </w:pPr>
+            <w:r>
+              <w:rPr>
+                <w:sz w:val="19"/>
+              </w:rPr>
+              <w:t xml:space="preserve">About a light-second (300,000 km)</w:t>
+            </w:r>
+          </w:p>
+        </w:tc>
+        <w:tc>
+          <w:tcPr/>
+          <w:p>
+            <w:pPr>
+              <w:pStyle w:val="Compact"/>
+              <w:jc w:val="left"/>
+            </w:pPr>
+            <w:r>
+              <w:rPr>
+                <w:sz w:val="19"/>
+              </w:rPr>
+              <w:t xml:space="preserve">The limit of targeting; light lag makes beyond it guesswork</w:t>
+            </w:r>
+          </w:p>
+        </w:tc>
+      </w:tr>
+    </w:tbl>
+    <w:p>
+      <w:pPr>
+        <w:pStyle w:val="BodyText"/>
+      </w:pPr>
+      <w:r>
+        <w:t xml:space="preserve">As in personal combat, a weapon fires without penalty within its effective band, at −2 one band beyond and −4 two bands beyond; farther is out of range.</w:t>
+      </w:r>
+    </w:p>
+    <w:p>
+      <w:pPr>
+        <w:pStyle w:val="BodyText"/>
+      </w:pPr>
+      <w:r>
+        <w:rPr>
+          <w:bCs/>
+          <w:b/>
+        </w:rPr>
+        <w:t xml:space="preserve">Closing and opening.</w:t>
+      </w:r>
+      <w:r>
+        <w:t xml:space="preserve"> </w:t>
+      </w:r>
+      <w:r>
+        <w:t xml:space="preserve">At the start of each exchange, Helm rolls an opposed</w:t>
+      </w:r>
+      <w:r>
+        <w:t xml:space="preserve"> </w:t>
+      </w:r>
+      <w:r>
+        <w:rPr>
+          <w:bCs/>
+          <w:b/>
+        </w:rPr>
+        <w:t xml:space="preserve">Helm</w:t>
+      </w:r>
+      <w:r>
+        <w:t xml:space="preserve"> </w:t>
+      </w:r>
+      <w:r>
+        <w:t xml:space="preserve">contest with the enemy’s helm. The winner may shift the range one band, in or out. Winning at Extreme range by 5 or more lets the ship break away and go to warp.</w:t>
+      </w:r>
+    </w:p>
+    <w:tbl>
+      <w:tblPr>
+        <w:tblStyle w:val="Table"/>
+        <w:tblW w:type="pct" w:w="5000"/>
+        <w:tblLook w:firstRow="1" w:lastRow="0" w:firstColumn="0" w:lastColumn="0" w:noHBand="0" w:noVBand="0" w:val="0020"/>
+        <w:jc w:val="start"/>
+        <w:tblBorders>
+          <w:top w:val="single" w:sz="4" w:color="B8C2D3"/>
+          <w:left w:val="single" w:sz="4" w:color="B8C2D3"/>
+          <w:bottom w:val="single" w:sz="4" w:color="B8C2D3"/>
+          <w:right w:val="single" w:sz="4" w:color="B8C2D3"/>
+          <w:insideH w:val="single" w:sz="4" w:color="B8C2D3"/>
+          <w:insideV w:val="single" w:sz="4" w:color="B8C2D3"/>
+        </w:tblBorders>
+      </w:tblPr>
+      <w:tblGrid>
+        <w:gridCol w:w="1980"/>
+        <w:gridCol w:w="1980"/>
+        <w:gridCol w:w="1980"/>
+        <w:gridCol w:w="1980"/>
+      </w:tblGrid>
+      <w:tr>
+        <w:trPr>
+          <w:tblHeader w:val="true"/>
+        </w:trPr>
+        <w:tc>
+          <w:tcPr>
+            <w:shd w:val="clear" w:fill="E9EEF6"/>
+          </w:tcPr>
+          <w:p>
+            <w:pPr>
+              <w:pStyle w:val="Compact"/>
+              <w:jc w:val="left"/>
+            </w:pPr>
+            <w:r>
+              <w:rPr>
+                <w:b/>
+                <w:sz w:val="19"/>
+              </w:rPr>
+              <w:t xml:space="preserve">Ship system</w:t>
+            </w:r>
+          </w:p>
+        </w:tc>
+        <w:tc>
+          <w:tcPr>
+            <w:shd w:val="clear" w:fill="E9EEF6"/>
+          </w:tcPr>
+          <w:p>
+            <w:pPr>
+              <w:pStyle w:val="Compact"/>
+              <w:jc w:val="left"/>
+            </w:pPr>
+            <w:r>
+              <w:rPr>
+                <w:b/>
+                <w:sz w:val="19"/>
+              </w:rPr>
+              <w:t xml:space="preserve">Range</w:t>
+            </w:r>
+          </w:p>
+        </w:tc>
+        <w:tc>
+          <w:tcPr>
+            <w:shd w:val="clear" w:fill="E9EEF6"/>
+          </w:tcPr>
+          <w:p>
+            <w:pPr>
+              <w:pStyle w:val="Compact"/>
+              <w:jc w:val="left"/>
+            </w:pPr>
+            <w:r>
+              <w:rPr>
+                <w:b/>
+                <w:sz w:val="19"/>
+              </w:rPr>
+              <w:t xml:space="preserve">Hit</w:t>
+            </w:r>
+          </w:p>
+        </w:tc>
+        <w:tc>
+          <w:tcPr>
+            <w:shd w:val="clear" w:fill="E9EEF6"/>
+          </w:tcPr>
+          <w:p>
+            <w:pPr>
+              <w:pStyle w:val="Compact"/>
+              <w:jc w:val="left"/>
+            </w:pPr>
+            <w:r>
+              <w:rPr>
+                <w:b/>
+                <w:sz w:val="19"/>
+              </w:rPr>
+              <w:t xml:space="preserve">Notes</w:t>
+            </w:r>
+          </w:p>
+        </w:tc>
+      </w:tr>
+      <w:tr>
+        <w:tc>
+          <w:tcPr/>
+          <w:p>
+            <w:pPr>
+              <w:pStyle w:val="Compact"/>
+              <w:jc w:val="left"/>
+            </w:pPr>
+            <w:r>
+              <w:rPr>
+                <w:b/>
+                <w:sz w:val="19"/>
+              </w:rPr>
+              <w:t xml:space="preserve">Phaser banks</w:t>
+            </w:r>
+          </w:p>
+        </w:tc>
+        <w:tc>
+          <w:tcPr/>
+          <w:p>
+            <w:pPr>
+              <w:pStyle w:val="Compact"/>
+              <w:jc w:val="left"/>
+            </w:pPr>
+            <w:r>
+              <w:rPr>
+                <w:sz w:val="19"/>
+              </w:rPr>
+              <w:t xml:space="preserve">Long</w:t>
+            </w:r>
+          </w:p>
+        </w:tc>
+        <w:tc>
+          <w:tcPr/>
+          <w:p>
+            <w:pPr>
+              <w:pStyle w:val="Compact"/>
+              <w:jc w:val="left"/>
+            </w:pPr>
+            <w:r>
+              <w:rPr>
+                <w:sz w:val="19"/>
+              </w:rPr>
+              <w:t xml:space="preserve">Normal (1 box)</w:t>
+            </w:r>
+          </w:p>
+        </w:tc>
+        <w:tc>
+          <w:tcPr/>
+          <w:p>
+            <w:pPr>
+              <w:pStyle w:val="Compact"/>
+              <w:jc w:val="left"/>
+            </w:pPr>
+            <w:r>
+              <w:rPr>
+                <w:sz w:val="19"/>
+              </w:rPr>
+              <w:t xml:space="preserve">The ship’s main weapon.</w:t>
+            </w:r>
+          </w:p>
+        </w:tc>
+      </w:tr>
+      <w:tr>
+        <w:tc>
+          <w:tcPr/>
+          <w:p>
+            <w:pPr>
+              <w:pStyle w:val="Compact"/>
+              <w:jc w:val="left"/>
+            </w:pPr>
+            <w:r>
+              <w:rPr>
+                <w:b/>
+                <w:sz w:val="19"/>
+              </w:rPr>
+              <w:t xml:space="preserve">Photon torpedoes</w:t>
+            </w:r>
+          </w:p>
+        </w:tc>
+        <w:tc>
+          <w:tcPr/>
+          <w:p>
+            <w:pPr>
+              <w:pStyle w:val="Compact"/>
+              <w:jc w:val="left"/>
+            </w:pPr>
+            <w:r>
+              <w:rPr>
+                <w:sz w:val="19"/>
+              </w:rPr>
+              <w:t xml:space="preserve">Extreme</w:t>
+            </w:r>
+          </w:p>
+        </w:tc>
+        <w:tc>
+          <w:tcPr/>
+          <w:p>
+            <w:pPr>
+              <w:pStyle w:val="Compact"/>
+              <w:jc w:val="left"/>
+            </w:pPr>
+            <w:r>
+              <w:rPr>
+                <w:sz w:val="19"/>
+              </w:rPr>
+              <w:t xml:space="preserve">Heavy (2 boxes)</w:t>
+            </w:r>
+          </w:p>
+        </w:tc>
+        <w:tc>
+          <w:tcPr/>
+          <w:p>
+            <w:pPr>
+              <w:pStyle w:val="Compact"/>
+              <w:jc w:val="left"/>
+            </w:pPr>
+            <w:r>
+              <w:rPr>
+                <w:sz w:val="19"/>
+              </w:rPr>
+              <w:t xml:space="preserve">A volley of two counts as one heavy hit with +1 to hit.</w:t>
+            </w:r>
+          </w:p>
+        </w:tc>
+      </w:tr>
+      <w:tr>
+        <w:tc>
+          <w:tcPr/>
+          <w:p>
+            <w:pPr>
+              <w:pStyle w:val="Compact"/>
+              <w:jc w:val="left"/>
+            </w:pPr>
+            <w:r>
+              <w:rPr>
+                <w:b/>
+                <w:sz w:val="19"/>
+              </w:rPr>
+              <w:t xml:space="preserve">Klingon disruptors</w:t>
+            </w:r>
+          </w:p>
+        </w:tc>
+        <w:tc>
+          <w:tcPr/>
+          <w:p>
+            <w:pPr>
+              <w:pStyle w:val="Compact"/>
+              <w:jc w:val="left"/>
+            </w:pPr>
+            <w:r>
+              <w:rPr>
+                <w:sz w:val="19"/>
+              </w:rPr>
+              <w:t xml:space="preserve">Medium</w:t>
+            </w:r>
+          </w:p>
+        </w:tc>
+        <w:tc>
+          <w:tcPr/>
+          <w:p>
+            <w:pPr>
+              <w:pStyle w:val="Compact"/>
+              <w:jc w:val="left"/>
+            </w:pPr>
+            <w:r>
+              <w:rPr>
+                <w:sz w:val="19"/>
+              </w:rPr>
+              <w:t xml:space="preserve">Normal; a volley is heavy</w:t>
+            </w:r>
+          </w:p>
+        </w:tc>
+        <w:tc>
+          <w:tcPr/>
+          <w:p>
+            <w:pPr>
+              <w:pStyle w:val="Compact"/>
+            </w:pPr>
+          </w:p>
+        </w:tc>
+      </w:tr>
+      <w:tr>
+        <w:tc>
+          <w:tcPr/>
+          <w:p>
+            <w:pPr>
+              <w:pStyle w:val="Compact"/>
+              <w:jc w:val="left"/>
+            </w:pPr>
+            <w:r>
+              <w:rPr>
+                <w:b/>
+                <w:sz w:val="19"/>
+              </w:rPr>
+              <w:t xml:space="preserve">Romulan plasma torpedo</w:t>
+            </w:r>
+          </w:p>
+        </w:tc>
+        <w:tc>
+          <w:tcPr/>
+          <w:p>
+            <w:pPr>
+              <w:pStyle w:val="Compact"/>
+              <w:jc w:val="left"/>
+            </w:pPr>
+            <w:r>
+              <w:rPr>
+                <w:sz w:val="19"/>
+              </w:rPr>
+              <w:t xml:space="preserve">Long</w:t>
+            </w:r>
+          </w:p>
+        </w:tc>
+        <w:tc>
+          <w:tcPr/>
+          <w:p>
+            <w:pPr>
+              <w:pStyle w:val="Compact"/>
+              <w:jc w:val="left"/>
+            </w:pPr>
+            <w:r>
+              <w:rPr>
+                <w:sz w:val="19"/>
+              </w:rPr>
+              <w:t xml:space="preserve">Heavy, and a system goes Offline</w:t>
+            </w:r>
+          </w:p>
+        </w:tc>
+        <w:tc>
+          <w:tcPr/>
+          <w:p>
+            <w:pPr>
+              <w:pStyle w:val="Compact"/>
+              <w:jc w:val="left"/>
+            </w:pPr>
+            <w:r>
+              <w:rPr>
+                <w:sz w:val="19"/>
+              </w:rPr>
+              <w:t xml:space="preserve">Slow: Helm’s evade gets +2 against it.</w:t>
+            </w:r>
+          </w:p>
+        </w:tc>
+      </w:tr>
+      <w:tr>
+        <w:tc>
+          <w:tcPr/>
+          <w:p>
+            <w:pPr>
+              <w:pStyle w:val="Compact"/>
+              <w:jc w:val="left"/>
+            </w:pPr>
+            <w:r>
+              <w:rPr>
+                <w:b/>
+                <w:sz w:val="19"/>
+              </w:rPr>
+              <w:t xml:space="preserve">Tractor beam</w:t>
+            </w:r>
+          </w:p>
+        </w:tc>
+        <w:tc>
+          <w:tcPr/>
+          <w:p>
+            <w:pPr>
+              <w:pStyle w:val="Compact"/>
+              <w:jc w:val="left"/>
+            </w:pPr>
+            <w:r>
+              <w:rPr>
+                <w:sz w:val="19"/>
+              </w:rPr>
+              <w:t xml:space="preserve">Short</w:t>
+            </w:r>
+          </w:p>
+        </w:tc>
+        <w:tc>
+          <w:tcPr/>
+          <w:p>
+            <w:pPr>
+              <w:pStyle w:val="Compact"/>
+              <w:jc w:val="left"/>
+            </w:pPr>
+            <w:r>
+              <w:rPr>
+                <w:sz w:val="19"/>
+              </w:rPr>
+              <w:t xml:space="preserve">—</w:t>
+            </w:r>
+          </w:p>
+        </w:tc>
+        <w:tc>
+          <w:tcPr/>
+          <w:p>
+            <w:pPr>
+              <w:pStyle w:val="Compact"/>
+              <w:jc w:val="left"/>
+            </w:pPr>
+            <w:r>
+              <w:rPr>
+                <w:sz w:val="19"/>
+              </w:rPr>
+              <w:t xml:space="preserve">Holds a smaller ship; Helm contest to break free.</w:t>
+            </w:r>
+          </w:p>
+        </w:tc>
+      </w:tr>
+      <w:tr>
+        <w:tc>
+          <w:tcPr/>
+          <w:p>
+            <w:pPr>
+              <w:pStyle w:val="Compact"/>
+              <w:jc w:val="left"/>
+            </w:pPr>
+            <w:r>
+              <w:rPr>
+                <w:b/>
+                <w:sz w:val="19"/>
+              </w:rPr>
+              <w:t xml:space="preserve">Transporter</w:t>
+            </w:r>
+          </w:p>
+        </w:tc>
+        <w:tc>
+          <w:tcPr/>
+          <w:p>
+            <w:pPr>
+              <w:pStyle w:val="Compact"/>
+              <w:jc w:val="left"/>
+            </w:pPr>
+            <w:r>
+              <w:rPr>
+                <w:sz w:val="19"/>
+              </w:rPr>
+              <w:t xml:space="preserve">Medium</w:t>
+            </w:r>
+          </w:p>
+        </w:tc>
+        <w:tc>
+          <w:tcPr/>
+          <w:p>
+            <w:pPr>
+              <w:pStyle w:val="Compact"/>
+              <w:jc w:val="left"/>
+            </w:pPr>
+            <w:r>
+              <w:rPr>
+                <w:sz w:val="19"/>
+              </w:rPr>
+              <w:t xml:space="preserve">—</w:t>
+            </w:r>
+          </w:p>
+        </w:tc>
+        <w:tc>
+          <w:tcPr/>
+          <w:p>
+            <w:pPr>
+              <w:pStyle w:val="Compact"/>
+              <w:jc w:val="left"/>
+            </w:pPr>
+            <w:r>
+              <w:rPr>
+                <w:sz w:val="19"/>
+              </w:rPr>
+              <w:t xml:space="preserve">Only when the target’s shields are down.</w:t>
+            </w:r>
+          </w:p>
+        </w:tc>
+      </w:tr>
+      <w:tr>
+        <w:tc>
+          <w:tcPr/>
+          <w:p>
+            <w:pPr>
+              <w:pStyle w:val="Compact"/>
+              <w:jc w:val="left"/>
+            </w:pPr>
+            <w:r>
+              <w:rPr>
+                <w:b/>
+                <w:sz w:val="19"/>
+              </w:rPr>
+              <w:t xml:space="preserve">Ramming</w:t>
+            </w:r>
+          </w:p>
+        </w:tc>
+        <w:tc>
+          <w:tcPr/>
+          <w:p>
+            <w:pPr>
+              <w:pStyle w:val="Compact"/>
+              <w:jc w:val="left"/>
+            </w:pPr>
+            <w:r>
+              <w:rPr>
+                <w:sz w:val="19"/>
+              </w:rPr>
+              <w:t xml:space="preserve">Close</w:t>
+            </w:r>
+          </w:p>
+        </w:tc>
+        <w:tc>
+          <w:tcPr/>
+          <w:p>
+            <w:pPr>
+              <w:pStyle w:val="Compact"/>
+              <w:jc w:val="left"/>
+            </w:pPr>
+            <w:r>
+              <w:rPr>
+                <w:sz w:val="19"/>
+              </w:rPr>
+              <w:t xml:space="preserve">Heavy to both ships</w:t>
+            </w:r>
+          </w:p>
+        </w:tc>
+        <w:tc>
+          <w:tcPr/>
+          <w:p>
+            <w:pPr>
+              <w:pStyle w:val="Compact"/>
+              <w:jc w:val="left"/>
+            </w:pPr>
+            <w:r>
+              <w:rPr>
+                <w:sz w:val="19"/>
+              </w:rPr>
+              <w:t xml:space="preserve">A desperate measure.</w:t>
+            </w:r>
+          </w:p>
+        </w:tc>
+      </w:tr>
+    </w:tbl>
+    <w:bookmarkEnd w:id="70"/>
+    <w:bookmarkEnd w:id="71"/>
+    <w:bookmarkStart w:id="72" w:name="advancement"/>
     <w:p>
       <w:pPr>
         <w:pStyle w:val="Heading2"/>
@@ -8319,9 +10057,9 @@
         <w:t xml:space="preserve">After a significant mission, the GM may authorize one relevant skill to advance from Untrained to Trained or from Trained to Specialty, or allow revision of an advantage or complication to reflect events. Skills retain the same three training levels after advancement. Advancement follows mission milestones. Attribute and species changes require a separate agreement. General Services characters advance the same way, but only their starting skill is Expert; a skill raised later tops out at Specialty (+3) unless they are commissioned (see Step 3).</w:t>
       </w:r>
     </w:p>
-    <w:bookmarkEnd w:id="69"/>
-    <w:bookmarkEnd w:id="70"/>
-    <w:bookmarkStart w:id="73" w:name="running-missions"/>
+    <w:bookmarkEnd w:id="72"/>
+    <w:bookmarkEnd w:id="73"/>
+    <w:bookmarkStart w:id="76" w:name="running-missions"/>
     <w:p>
       <w:pPr>
         <w:pStyle w:val="Heading1"/>
@@ -8330,7 +10068,7 @@
         <w:t xml:space="preserve">Running missions</w:t>
       </w:r>
     </w:p>
-    <w:bookmarkStart w:id="71" w:name="mission-seeds"/>
+    <w:bookmarkStart w:id="74" w:name="mission-seeds"/>
     <w:p>
       <w:pPr>
         <w:pStyle w:val="Heading2"/>
@@ -10829,8 +12567,8 @@
         <w:t xml:space="preserve">is in the middle of it.</w:t>
       </w:r>
     </w:p>
-    <w:bookmarkEnd w:id="71"/>
-    <w:bookmarkStart w:id="72" w:name="captains-log"/>
+    <w:bookmarkEnd w:id="74"/>
+    <w:bookmarkStart w:id="75" w:name="captains-log"/>
     <w:p>
       <w:pPr>
         <w:pStyle w:val="Heading2"/>
@@ -10965,9 +12703,9 @@
         <w:t xml:space="preserve">The creator’s GM view keeps the log, applies each crew member’s advancement to the GM’s copy, and saves both with the crew file. Players record an approved advancement on their own sheet under Step 3, so their character still passes the checklist.</w:t>
       </w:r>
     </w:p>
-    <w:bookmarkEnd w:id="72"/>
-    <w:bookmarkEnd w:id="73"/>
-    <w:bookmarkStart w:id="80" w:name="ready-made-crew"/>
+    <w:bookmarkEnd w:id="75"/>
+    <w:bookmarkEnd w:id="76"/>
+    <w:bookmarkStart w:id="83" w:name="ready-made-crew"/>
     <w:p>
       <w:pPr>
         <w:pStyle w:val="Heading1"/>
@@ -11000,7 +12738,7 @@
         <w:t xml:space="preserve">to open one and make it your own.</w:t>
       </w:r>
     </w:p>
-    <w:bookmarkStart w:id="74" w:name="thelan-shvari"/>
+    <w:bookmarkStart w:id="77" w:name="thelan-shvari"/>
     <w:p>
       <w:pPr>
         <w:pStyle w:val="Heading2"/>
@@ -11163,8 +12901,8 @@
         <w:t xml:space="preserve">Took Yeoman Rrinn under their wing when Rrinn first came aboard.</w:t>
       </w:r>
     </w:p>
-    <w:bookmarkEnd w:id="74"/>
-    <w:bookmarkStart w:id="75" w:name="sevek"/>
+    <w:bookmarkEnd w:id="77"/>
+    <w:bookmarkStart w:id="78" w:name="sevek"/>
     <w:p>
       <w:pPr>
         <w:pStyle w:val="Heading2"/>
@@ -11327,8 +13065,8 @@
         <w:t xml:space="preserve">Friendly rivals with Lt. Grath: they argue every engineering theory, and both enjoy it.</w:t>
       </w:r>
     </w:p>
-    <w:bookmarkEnd w:id="75"/>
-    <w:bookmarkStart w:id="76" w:name="dr.-vessik"/>
+    <w:bookmarkEnd w:id="78"/>
+    <w:bookmarkStart w:id="79" w:name="dr.-vessik"/>
     <w:p>
       <w:pPr>
         <w:pStyle w:val="Heading2"/>
@@ -11491,8 +13229,8 @@
         <w:t xml:space="preserve">Pulled Lt. Reyes out of a burning shuttle on a survey mission; Reyes has never let the doctor pay for a drink since.</w:t>
       </w:r>
     </w:p>
-    <w:bookmarkEnd w:id="76"/>
-    <w:bookmarkStart w:id="77" w:name="grath"/>
+    <w:bookmarkEnd w:id="79"/>
+    <w:bookmarkStart w:id="80" w:name="grath"/>
     <w:p>
       <w:pPr>
         <w:pStyle w:val="Heading2"/>
@@ -11655,8 +13393,8 @@
         <w:t xml:space="preserve">Off-duty friends with Commander sh’Vari: a weekly game of Andorian chess in which both of them cheat.</w:t>
       </w:r>
     </w:p>
-    <w:bookmarkEnd w:id="77"/>
-    <w:bookmarkStart w:id="78" w:name="marisol-reyes"/>
+    <w:bookmarkEnd w:id="80"/>
+    <w:bookmarkStart w:id="81" w:name="marisol-reyes"/>
     <w:p>
       <w:pPr>
         <w:pStyle w:val="Heading2"/>
@@ -11819,8 +13557,8 @@
         <w:t xml:space="preserve">Owes Dr. Vessik their life after a shuttle crash, and never lets the doctor forget it.</w:t>
       </w:r>
     </w:p>
-    <w:bookmarkEnd w:id="78"/>
-    <w:bookmarkStart w:id="79" w:name="rrinn"/>
+    <w:bookmarkEnd w:id="81"/>
+    <w:bookmarkStart w:id="82" w:name="rrinn"/>
     <w:p>
       <w:pPr>
         <w:pStyle w:val="Heading2"/>
@@ -11983,9 +13721,9 @@
         <w:t xml:space="preserve">Shares a secret with Lt. Sevek from a mission neither of them talks about.</w:t>
       </w:r>
     </w:p>
-    <w:bookmarkEnd w:id="79"/>
-    <w:bookmarkEnd w:id="80"/>
-    <w:bookmarkStart w:id="81" w:name="threats"/>
+    <w:bookmarkEnd w:id="82"/>
+    <w:bookmarkEnd w:id="83"/>
+    <w:bookmarkStart w:id="84" w:name="threats"/>
     <w:p>
       <w:pPr>
         <w:pStyle w:val="Heading1"/>
@@ -13044,8 +14782,8 @@
         <w:t xml:space="preserve">For a tougher version, add +1 to its targets and one box; for a weaker one, subtract. Starships use the ship tracks above: a Klingon battle cruiser has Shields 3, Hull 4, and Phasers 12 for its gunners.</w:t>
       </w:r>
     </w:p>
-    <w:bookmarkEnd w:id="81"/>
-    <w:bookmarkStart w:id="82" w:name="advantages"/>
+    <w:bookmarkEnd w:id="84"/>
+    <w:bookmarkStart w:id="85" w:name="advantages"/>
     <w:p>
       <w:pPr>
         <w:pStyle w:val="Heading1"/>
@@ -13651,8 +15389,8 @@
         </w:tc>
       </w:tr>
     </w:tbl>
-    <w:bookmarkEnd w:id="82"/>
-    <w:bookmarkStart w:id="96" w:name="species-advantages"/>
+    <w:bookmarkEnd w:id="85"/>
+    <w:bookmarkStart w:id="99" w:name="species-advantages"/>
     <w:p>
       <w:pPr>
         <w:pStyle w:val="Heading1"/>
@@ -13717,7 +15455,7 @@
         <w:t xml:space="preserve">A custom species advantage follows the same pattern: a narrow +2 or an ability with agreed limits, paired with a companion complication that has a clear trigger and a real consequence.</w:t>
       </w:r>
     </w:p>
-    <w:bookmarkStart w:id="83" w:name="human"/>
+    <w:bookmarkStart w:id="86" w:name="human"/>
     <w:p>
       <w:pPr>
         <w:pStyle w:val="Heading2"/>
@@ -13930,8 +15668,8 @@
         </w:tc>
       </w:tr>
     </w:tbl>
-    <w:bookmarkEnd w:id="83"/>
-    <w:bookmarkStart w:id="84" w:name="vulcan"/>
+    <w:bookmarkEnd w:id="86"/>
+    <w:bookmarkStart w:id="87" w:name="vulcan"/>
     <w:p>
       <w:pPr>
         <w:pStyle w:val="Heading2"/>
@@ -14206,8 +15944,8 @@
         </w:tc>
       </w:tr>
     </w:tbl>
-    <w:bookmarkEnd w:id="84"/>
-    <w:bookmarkStart w:id="85" w:name="andorian"/>
+    <w:bookmarkEnd w:id="87"/>
+    <w:bookmarkStart w:id="88" w:name="andorian"/>
     <w:p>
       <w:pPr>
         <w:pStyle w:val="Heading2"/>
@@ -14420,8 +16158,8 @@
         </w:tc>
       </w:tr>
     </w:tbl>
-    <w:bookmarkEnd w:id="85"/>
-    <w:bookmarkStart w:id="86" w:name="tellarite"/>
+    <w:bookmarkEnd w:id="88"/>
+    <w:bookmarkStart w:id="89" w:name="tellarite"/>
     <w:p>
       <w:pPr>
         <w:pStyle w:val="Heading2"/>
@@ -14634,8 +16372,8 @@
         </w:tc>
       </w:tr>
     </w:tbl>
-    <w:bookmarkEnd w:id="86"/>
-    <w:bookmarkStart w:id="87" w:name="aenar"/>
+    <w:bookmarkEnd w:id="89"/>
+    <w:bookmarkStart w:id="90" w:name="aenar"/>
     <w:p>
       <w:pPr>
         <w:pStyle w:val="Heading2"/>
@@ -14848,8 +16586,8 @@
         </w:tc>
       </w:tr>
     </w:tbl>
-    <w:bookmarkEnd w:id="87"/>
-    <w:bookmarkStart w:id="88" w:name="illyrian"/>
+    <w:bookmarkEnd w:id="90"/>
+    <w:bookmarkStart w:id="91" w:name="illyrian"/>
     <w:p>
       <w:pPr>
         <w:pStyle w:val="Heading2"/>
@@ -15062,8 +16800,8 @@
         </w:tc>
       </w:tr>
     </w:tbl>
-    <w:bookmarkEnd w:id="88"/>
-    <w:bookmarkStart w:id="89" w:name="lanthanite"/>
+    <w:bookmarkEnd w:id="91"/>
+    <w:bookmarkStart w:id="92" w:name="lanthanite"/>
     <w:p>
       <w:pPr>
         <w:pStyle w:val="Heading2"/>
@@ -15276,8 +17014,8 @@
         </w:tc>
       </w:tr>
     </w:tbl>
-    <w:bookmarkEnd w:id="89"/>
-    <w:bookmarkStart w:id="90" w:name="caitian"/>
+    <w:bookmarkEnd w:id="92"/>
+    <w:bookmarkStart w:id="93" w:name="caitian"/>
     <w:p>
       <w:pPr>
         <w:pStyle w:val="Heading2"/>
@@ -15490,8 +17228,8 @@
         </w:tc>
       </w:tr>
     </w:tbl>
-    <w:bookmarkEnd w:id="90"/>
-    <w:bookmarkStart w:id="91" w:name="aurelian"/>
+    <w:bookmarkEnd w:id="93"/>
+    <w:bookmarkStart w:id="94" w:name="aurelian"/>
     <w:p>
       <w:pPr>
         <w:pStyle w:val="Heading2"/>
@@ -15704,8 +17442,8 @@
         </w:tc>
       </w:tr>
     </w:tbl>
-    <w:bookmarkEnd w:id="91"/>
-    <w:bookmarkStart w:id="92" w:name="orion"/>
+    <w:bookmarkEnd w:id="94"/>
+    <w:bookmarkStart w:id="95" w:name="orion"/>
     <w:p>
       <w:pPr>
         <w:pStyle w:val="Heading2"/>
@@ -15918,8 +17656,8 @@
         </w:tc>
       </w:tr>
     </w:tbl>
-    <w:bookmarkEnd w:id="92"/>
-    <w:bookmarkStart w:id="93" w:name="denobulan"/>
+    <w:bookmarkEnd w:id="95"/>
+    <w:bookmarkStart w:id="96" w:name="denobulan"/>
     <w:p>
       <w:pPr>
         <w:pStyle w:val="Heading2"/>
@@ -16132,8 +17870,8 @@
         </w:tc>
       </w:tr>
     </w:tbl>
-    <w:bookmarkEnd w:id="93"/>
-    <w:bookmarkStart w:id="94" w:name="trill"/>
+    <w:bookmarkEnd w:id="96"/>
+    <w:bookmarkStart w:id="97" w:name="trill"/>
     <w:p>
       <w:pPr>
         <w:pStyle w:val="Heading2"/>
@@ -16354,8 +18092,8 @@
         </w:tc>
       </w:tr>
     </w:tbl>
-    <w:bookmarkEnd w:id="94"/>
-    <w:bookmarkStart w:id="95" w:name="saurian"/>
+    <w:bookmarkEnd w:id="97"/>
+    <w:bookmarkStart w:id="98" w:name="saurian"/>
     <w:p>
       <w:pPr>
         <w:pStyle w:val="Heading2"/>
@@ -16568,9 +18306,9 @@
         </w:tc>
       </w:tr>
     </w:tbl>
-    <w:bookmarkEnd w:id="95"/>
-    <w:bookmarkEnd w:id="96"/>
-    <w:bookmarkStart w:id="105" w:name="making-your-own"/>
+    <w:bookmarkEnd w:id="98"/>
+    <w:bookmarkEnd w:id="99"/>
+    <w:bookmarkStart w:id="108" w:name="making-your-own"/>
     <w:p>
       <w:pPr>
         <w:pStyle w:val="Heading1"/>
@@ -16603,7 +18341,7 @@
         <w:t xml:space="preserve">option at the end of each list, and its checklist holds a custom choice to the same rules as everything else.</w:t>
       </w:r>
     </w:p>
-    <w:bookmarkStart w:id="97" w:name="a-custom-department"/>
+    <w:bookmarkStart w:id="100" w:name="a-custom-department"/>
     <w:p>
       <w:pPr>
         <w:pStyle w:val="Heading2"/>
@@ -16779,8 +18517,8 @@
         <w:t xml:space="preserve">.</w:t>
       </w:r>
     </w:p>
-    <w:bookmarkEnd w:id="97"/>
-    <w:bookmarkStart w:id="104" w:name="a-custom-species"/>
+    <w:bookmarkEnd w:id="100"/>
+    <w:bookmarkStart w:id="107" w:name="a-custom-species"/>
     <w:p>
       <w:pPr>
         <w:pStyle w:val="Heading2"/>
@@ -16797,7 +18535,7 @@
         <w:t xml:space="preserve">Build it with the GM, one step at a time.</w:t>
       </w:r>
     </w:p>
-    <w:bookmarkStart w:id="98" w:name="the-concept"/>
+    <w:bookmarkStart w:id="101" w:name="the-concept"/>
     <w:p>
       <w:pPr>
         <w:pStyle w:val="Heading3"/>
@@ -16814,8 +18552,8 @@
         <w:t xml:space="preserve">Two or three sentences: where they come from, what sets them apart, and how others see them. It should be something the species in this book don’t already cover.</w:t>
       </w:r>
     </w:p>
-    <w:bookmarkEnd w:id="98"/>
-    <w:bookmarkStart w:id="99" w:name="attribute-adjustments"/>
+    <w:bookmarkEnd w:id="101"/>
+    <w:bookmarkStart w:id="102" w:name="attribute-adjustments"/>
     <w:p>
       <w:pPr>
         <w:pStyle w:val="Heading3"/>
@@ -16861,8 +18599,8 @@
         <w:t xml:space="preserve">: a +2 needs a −2 or two −1s. The adjustments move the attribute’s base (+1 starts it at 11) and raise its starting maximum (13 plus the bonus). Most species change two to four attributes.</w:t>
       </w:r>
     </w:p>
-    <w:bookmarkEnd w:id="99"/>
-    <w:bookmarkStart w:id="100" w:name="core-rules"/>
+    <w:bookmarkEnd w:id="102"/>
+    <w:bookmarkStart w:id="103" w:name="core-rules"/>
     <w:p>
       <w:pPr>
         <w:pStyle w:val="Heading3"/>
@@ -16879,8 +18617,8 @@
         <w:t xml:space="preserve">One to three short rules that always apply: what they can do (see in the dark, resist cold, a free Trained skill) and what it costs (a weakness, a people’s distrust, a hazard they can’t abide). A strength with no drawback is worth more than it looks.</w:t>
       </w:r>
     </w:p>
-    <w:bookmarkEnd w:id="100"/>
-    <w:bookmarkStart w:id="101" w:name="species-advantages-1"/>
+    <w:bookmarkEnd w:id="103"/>
+    <w:bookmarkStart w:id="104" w:name="species-advantages-1"/>
     <w:p>
       <w:pPr>
         <w:pStyle w:val="Heading3"/>
@@ -16935,8 +18673,8 @@
         <w:t xml:space="preserve">: a problem the trait causes, with a clear trigger and a real consequence, which earns a Duty point when it bites, like any complication. A character takes one advantage, general or species, so make them distinct choices.</w:t>
       </w:r>
     </w:p>
-    <w:bookmarkEnd w:id="101"/>
-    <w:bookmarkStart w:id="102" w:name="in-the-creator"/>
+    <w:bookmarkEnd w:id="104"/>
+    <w:bookmarkStart w:id="105" w:name="in-the-creator"/>
     <w:p>
       <w:pPr>
         <w:pStyle w:val="Heading3"/>
@@ -17041,8 +18779,8 @@
         <w:t xml:space="preserve">and enter the advantage and its companion complication.</w:t>
       </w:r>
     </w:p>
-    <w:bookmarkEnd w:id="102"/>
-    <w:bookmarkStart w:id="103" w:name="example"/>
+    <w:bookmarkEnd w:id="105"/>
+    <w:bookmarkStart w:id="106" w:name="example"/>
     <w:p>
       <w:pPr>
         <w:pStyle w:val="Heading3"/>
@@ -17147,10 +18885,10 @@
         <w:t xml:space="preserve">: dry, cramped ships wear on you; when it matters, accept the short temper or the mistake.</w:t>
       </w:r>
     </w:p>
-    <w:bookmarkEnd w:id="103"/>
-    <w:bookmarkEnd w:id="104"/>
-    <w:bookmarkEnd w:id="105"/>
-    <w:bookmarkStart w:id="107" w:name="complications"/>
+    <w:bookmarkEnd w:id="106"/>
+    <w:bookmarkEnd w:id="107"/>
+    <w:bookmarkEnd w:id="108"/>
+    <w:bookmarkStart w:id="110" w:name="complications"/>
     <w:p>
       <w:pPr>
         <w:pStyle w:val="Heading1"/>
@@ -17764,7 +19502,7 @@
         </w:tc>
       </w:tr>
     </w:tbl>
-    <w:bookmarkStart w:id="106" w:name="using-and-revising-traits"/>
+    <w:bookmarkStart w:id="109" w:name="using-and-revising-traits"/>
     <w:p>
       <w:pPr>
         <w:pStyle w:val="Heading2"/>
@@ -17781,9 +19519,9 @@
         <w:t xml:space="preserve">General advantages and complications describe individual crew members and can suit any species when appropriate. A Vulcan might choose Mental Discipline as a general advantage; species advantages are the only traits tied to a species. At a mission milestone, revise a trait when events change the character. Custom advantages follow the same narrow +2 benefit; custom complications need a clear trigger and a meaningful, accepted consequence.</w:t>
       </w:r>
     </w:p>
-    <w:bookmarkEnd w:id="106"/>
-    <w:bookmarkEnd w:id="107"/>
-    <w:bookmarkStart w:id="111" w:name="quick-reference"/>
+    <w:bookmarkEnd w:id="109"/>
+    <w:bookmarkEnd w:id="110"/>
+    <w:bookmarkStart w:id="114" w:name="quick-reference"/>
     <w:p>
       <w:pPr>
         <w:pStyle w:val="Heading1"/>
@@ -17792,7 +19530,7 @@
         <w:t xml:space="preserve">Quick reference</w:t>
       </w:r>
     </w:p>
-    <w:bookmarkStart w:id="108" w:name="will-and-mental-resistance"/>
+    <w:bookmarkStart w:id="111" w:name="will-and-mental-resistance"/>
     <w:p>
       <w:pPr>
         <w:pStyle w:val="Heading2"/>
@@ -17825,8 +19563,8 @@
         <w:t xml:space="preserve">Will protects your resolve; Presence influences others. Leadership and Diplomacy still use Presence. Species adjustments may change your starting Will, but mental advantages apply only to their agreed, narrow circumstances.</w:t>
       </w:r>
     </w:p>
-    <w:bookmarkEnd w:id="108"/>
-    <w:bookmarkStart w:id="109" w:name="at-the-table"/>
+    <w:bookmarkEnd w:id="111"/>
+    <w:bookmarkStart w:id="112" w:name="at-the-table"/>
     <w:p>
       <w:pPr>
         <w:pStyle w:val="Heading2"/>
@@ -17895,8 +19633,8 @@
         <w:t xml:space="preserve">Apply the result and describe what changes.</w:t>
       </w:r>
     </w:p>
-    <w:bookmarkEnd w:id="109"/>
-    <w:bookmarkStart w:id="110" w:name="summary"/>
+    <w:bookmarkEnd w:id="112"/>
+    <w:bookmarkStart w:id="113" w:name="summary"/>
     <w:p>
       <w:pPr>
         <w:pStyle w:val="Heading2"/>
@@ -18139,8 +19877,8 @@
         <w:t xml:space="preserve">start each session with two. Spend one to reroll, reduce an injury by one box, or establish a plausible preparation. Earn one when an accepted complication, including a companion complication, creates a meaningful problem.</w:t>
       </w:r>
     </w:p>
-    <w:bookmarkEnd w:id="110"/>
-    <w:bookmarkEnd w:id="111"/>
+    <w:bookmarkEnd w:id="113"/>
+    <w:bookmarkEnd w:id="114"/>
     <w:sectPr/>
   </w:body>
 </w:document>

</xml_diff>

<commit_message>
USS Pelion: range bands for personal and starship combat, and the captain's orders
Co-Authored-By: Claude Opus 5.5 <noreply@anthropic.com>
Claude-Session: https://claude.ai/code/session_015SADCFzhKijkC2foUmXrpC
</commit_message>
<xml_diff>
--- a/uss-pelion/USS_Pelion_Players_Guide.docx
+++ b/uss-pelion/USS_Pelion_Players_Guide.docx
@@ -5206,7 +5206,7 @@
     </w:p>
     <w:bookmarkEnd w:id="48"/>
     <w:bookmarkEnd w:id="49"/>
-    <w:bookmarkStart w:id="57" w:name="personal-combat"/>
+    <w:bookmarkStart w:id="58" w:name="personal-combat"/>
     <w:p>
       <w:pPr>
         <w:pStyle w:val="Heading1"/>
@@ -5259,7 +5259,366 @@
       </w:r>
     </w:p>
     <w:bookmarkEnd w:id="51"/>
-    <w:bookmarkStart w:id="53" w:name="injury"/>
+    <w:bookmarkStart w:id="52" w:name="range"/>
+    <w:p>
+      <w:pPr>
+        <w:pStyle w:val="Heading2"/>
+      </w:pPr>
+      <w:r>
+        <w:t xml:space="preserve">Range</w:t>
+      </w:r>
+    </w:p>
+    <w:p>
+      <w:pPr>
+        <w:pStyle w:val="FirstParagraph"/>
+      </w:pPr>
+      <w:r>
+        <w:t xml:space="preserve">Distances fall into five bands:</w:t>
+      </w:r>
+    </w:p>
+    <w:tbl>
+      <w:tblPr>
+        <w:tblStyle w:val="Table"/>
+        <w:tblW w:type="pct" w:w="5000"/>
+        <w:tblLook w:firstRow="1" w:lastRow="0" w:firstColumn="0" w:lastColumn="0" w:noHBand="0" w:noVBand="0" w:val="0020"/>
+        <w:jc w:val="start"/>
+        <w:tblBorders>
+          <w:top w:val="single" w:sz="4" w:color="B8C2D3"/>
+          <w:left w:val="single" w:sz="4" w:color="B8C2D3"/>
+          <w:bottom w:val="single" w:sz="4" w:color="B8C2D3"/>
+          <w:right w:val="single" w:sz="4" w:color="B8C2D3"/>
+          <w:insideH w:val="single" w:sz="4" w:color="B8C2D3"/>
+          <w:insideV w:val="single" w:sz="4" w:color="B8C2D3"/>
+        </w:tblBorders>
+      </w:tblPr>
+      <w:tblGrid>
+        <w:gridCol w:w="2640"/>
+        <w:gridCol w:w="2640"/>
+        <w:gridCol w:w="2640"/>
+      </w:tblGrid>
+      <w:tr>
+        <w:trPr>
+          <w:tblHeader w:val="true"/>
+        </w:trPr>
+        <w:tc>
+          <w:tcPr>
+            <w:shd w:val="clear" w:fill="E9EEF6"/>
+          </w:tcPr>
+          <w:p>
+            <w:pPr>
+              <w:pStyle w:val="Compact"/>
+              <w:jc w:val="left"/>
+            </w:pPr>
+            <w:r>
+              <w:rPr>
+                <w:b/>
+                <w:sz w:val="19"/>
+              </w:rPr>
+              <w:t xml:space="preserve">Band</w:t>
+            </w:r>
+          </w:p>
+        </w:tc>
+        <w:tc>
+          <w:tcPr>
+            <w:shd w:val="clear" w:fill="E9EEF6"/>
+          </w:tcPr>
+          <w:p>
+            <w:pPr>
+              <w:pStyle w:val="Compact"/>
+              <w:jc w:val="left"/>
+            </w:pPr>
+            <w:r>
+              <w:rPr>
+                <w:b/>
+                <w:sz w:val="19"/>
+              </w:rPr>
+              <w:t xml:space="preserve">Distance</w:t>
+            </w:r>
+          </w:p>
+        </w:tc>
+        <w:tc>
+          <w:tcPr>
+            <w:shd w:val="clear" w:fill="E9EEF6"/>
+          </w:tcPr>
+          <w:p>
+            <w:pPr>
+              <w:pStyle w:val="Compact"/>
+              <w:jc w:val="left"/>
+            </w:pPr>
+            <w:r>
+              <w:rPr>
+                <w:b/>
+                <w:sz w:val="19"/>
+              </w:rPr>
+              <w:t xml:space="preserve">For example</w:t>
+            </w:r>
+          </w:p>
+        </w:tc>
+      </w:tr>
+      <w:tr>
+        <w:tc>
+          <w:tcPr/>
+          <w:p>
+            <w:pPr>
+              <w:pStyle w:val="Compact"/>
+              <w:jc w:val="left"/>
+            </w:pPr>
+            <w:r>
+              <w:rPr>
+                <w:b/>
+                <w:sz w:val="19"/>
+              </w:rPr>
+              <w:t xml:space="preserve">Close</w:t>
+            </w:r>
+          </w:p>
+        </w:tc>
+        <w:tc>
+          <w:tcPr/>
+          <w:p>
+            <w:pPr>
+              <w:pStyle w:val="Compact"/>
+              <w:jc w:val="left"/>
+            </w:pPr>
+            <w:r>
+              <w:rPr>
+                <w:sz w:val="19"/>
+              </w:rPr>
+              <w:t xml:space="preserve">Up to 10 yards</w:t>
+            </w:r>
+          </w:p>
+        </w:tc>
+        <w:tc>
+          <w:tcPr/>
+          <w:p>
+            <w:pPr>
+              <w:pStyle w:val="Compact"/>
+              <w:jc w:val="left"/>
+            </w:pPr>
+            <w:r>
+              <w:rPr>
+                <w:sz w:val="19"/>
+              </w:rPr>
+              <w:t xml:space="preserve">Across a room or a corridor junction; one move covers it</w:t>
+            </w:r>
+          </w:p>
+        </w:tc>
+      </w:tr>
+      <w:tr>
+        <w:tc>
+          <w:tcPr/>
+          <w:p>
+            <w:pPr>
+              <w:pStyle w:val="Compact"/>
+              <w:jc w:val="left"/>
+            </w:pPr>
+            <w:r>
+              <w:rPr>
+                <w:b/>
+                <w:sz w:val="19"/>
+              </w:rPr>
+              <w:t xml:space="preserve">Short</w:t>
+            </w:r>
+          </w:p>
+        </w:tc>
+        <w:tc>
+          <w:tcPr/>
+          <w:p>
+            <w:pPr>
+              <w:pStyle w:val="Compact"/>
+              <w:jc w:val="left"/>
+            </w:pPr>
+            <w:r>
+              <w:rPr>
+                <w:sz w:val="19"/>
+              </w:rPr>
+              <w:t xml:space="preserve">Up to 50 yards</w:t>
+            </w:r>
+          </w:p>
+        </w:tc>
+        <w:tc>
+          <w:tcPr/>
+          <w:p>
+            <w:pPr>
+              <w:pStyle w:val="Compact"/>
+              <w:jc w:val="left"/>
+            </w:pPr>
+            <w:r>
+              <w:rPr>
+                <w:sz w:val="19"/>
+              </w:rPr>
+              <w:t xml:space="preserve">Across a shuttle bay or a village square</w:t>
+            </w:r>
+          </w:p>
+        </w:tc>
+      </w:tr>
+      <w:tr>
+        <w:tc>
+          <w:tcPr/>
+          <w:p>
+            <w:pPr>
+              <w:pStyle w:val="Compact"/>
+              <w:jc w:val="left"/>
+            </w:pPr>
+            <w:r>
+              <w:rPr>
+                <w:b/>
+                <w:sz w:val="19"/>
+              </w:rPr>
+              <w:t xml:space="preserve">Medium</w:t>
+            </w:r>
+          </w:p>
+        </w:tc>
+        <w:tc>
+          <w:tcPr/>
+          <w:p>
+            <w:pPr>
+              <w:pStyle w:val="Compact"/>
+              <w:jc w:val="left"/>
+            </w:pPr>
+            <w:r>
+              <w:rPr>
+                <w:sz w:val="19"/>
+              </w:rPr>
+              <w:t xml:space="preserve">Up to 150 yards</w:t>
+            </w:r>
+          </w:p>
+        </w:tc>
+        <w:tc>
+          <w:tcPr/>
+          <w:p>
+            <w:pPr>
+              <w:pStyle w:val="Compact"/>
+              <w:jc w:val="left"/>
+            </w:pPr>
+            <w:r>
+              <w:rPr>
+                <w:sz w:val="19"/>
+              </w:rPr>
+              <w:t xml:space="preserve">Across a cargo hold or a city block</w:t>
+            </w:r>
+          </w:p>
+        </w:tc>
+      </w:tr>
+      <w:tr>
+        <w:tc>
+          <w:tcPr/>
+          <w:p>
+            <w:pPr>
+              <w:pStyle w:val="Compact"/>
+              <w:jc w:val="left"/>
+            </w:pPr>
+            <w:r>
+              <w:rPr>
+                <w:b/>
+                <w:sz w:val="19"/>
+              </w:rPr>
+              <w:t xml:space="preserve">Long</w:t>
+            </w:r>
+          </w:p>
+        </w:tc>
+        <w:tc>
+          <w:tcPr/>
+          <w:p>
+            <w:pPr>
+              <w:pStyle w:val="Compact"/>
+              <w:jc w:val="left"/>
+            </w:pPr>
+            <w:r>
+              <w:rPr>
+                <w:sz w:val="19"/>
+              </w:rPr>
+              <w:t xml:space="preserve">Up to 500 yards</w:t>
+            </w:r>
+          </w:p>
+        </w:tc>
+        <w:tc>
+          <w:tcPr/>
+          <w:p>
+            <w:pPr>
+              <w:pStyle w:val="Compact"/>
+              <w:jc w:val="left"/>
+            </w:pPr>
+            <w:r>
+              <w:rPr>
+                <w:sz w:val="19"/>
+              </w:rPr>
+              <w:t xml:space="preserve">Across a canyon or a landing field</w:t>
+            </w:r>
+          </w:p>
+        </w:tc>
+      </w:tr>
+      <w:tr>
+        <w:tc>
+          <w:tcPr/>
+          <w:p>
+            <w:pPr>
+              <w:pStyle w:val="Compact"/>
+              <w:jc w:val="left"/>
+            </w:pPr>
+            <w:r>
+              <w:rPr>
+                <w:b/>
+                <w:sz w:val="19"/>
+              </w:rPr>
+              <w:t xml:space="preserve">Extreme</w:t>
+            </w:r>
+          </w:p>
+        </w:tc>
+        <w:tc>
+          <w:tcPr/>
+          <w:p>
+            <w:pPr>
+              <w:pStyle w:val="Compact"/>
+              <w:jc w:val="left"/>
+            </w:pPr>
+            <w:r>
+              <w:rPr>
+                <w:sz w:val="19"/>
+              </w:rPr>
+              <w:t xml:space="preserve">Up to a mile, in line of sight</w:t>
+            </w:r>
+          </w:p>
+        </w:tc>
+        <w:tc>
+          <w:tcPr/>
+          <w:p>
+            <w:pPr>
+              <w:pStyle w:val="Compact"/>
+              <w:jc w:val="left"/>
+            </w:pPr>
+            <w:r>
+              <w:rPr>
+                <w:sz w:val="19"/>
+              </w:rPr>
+              <w:t xml:space="preserve">Ridge to ridge</w:t>
+            </w:r>
+          </w:p>
+        </w:tc>
+      </w:tr>
+    </w:tbl>
+    <w:p>
+      <w:pPr>
+        <w:pStyle w:val="BodyText"/>
+      </w:pPr>
+      <w:r>
+        <w:t xml:space="preserve">Every ranged weapon has an</w:t>
+      </w:r>
+      <w:r>
+        <w:t xml:space="preserve"> </w:t>
+      </w:r>
+      <w:r>
+        <w:rPr>
+          <w:bCs/>
+          <w:b/>
+        </w:rPr>
+        <w:t xml:space="preserve">effective band</w:t>
+      </w:r>
+      <w:r>
+        <w:t xml:space="preserve">, shown in the weapons table. Attacks within it take no penalty. One band beyond it is −2, two bands beyond is −4, and anything farther is out of range. Melee weapons and fists reach only someone next to you. Your move each turn covers the Close band; give up your action to run and you cover Short.</w:t>
+      </w:r>
+    </w:p>
+    <w:bookmarkEnd w:id="52"/>
+    <w:bookmarkStart w:id="54" w:name="injury"/>
     <w:p>
       <w:pPr>
         <w:pStyle w:val="Heading2"/>
@@ -5548,7 +5907,7 @@
         <w:t xml:space="preserve">A normal damaging hit marks one box. A powerful attack can mark two, and a killing weapon marks three (see Weapons and damage). Injury penalties replace each other rather than stacking. They apply to movement, attacks, Dodge, and other tasks the injury physically hinders. The GM announces especially lethal hazards before resolution where possible.</w:t>
       </w:r>
     </w:p>
-    <w:bookmarkStart w:id="52" w:name="dying-and-death"/>
+    <w:bookmarkStart w:id="53" w:name="dying-and-death"/>
     <w:p>
       <w:pPr>
         <w:pStyle w:val="Heading3"/>
@@ -5652,9 +6011,9 @@
         <w:t xml:space="preserve">Your protection is avoiding the hit: Dodge, cover, and a Duty point, which reduces a kill shot from three boxes to two, leaving you Seriously wounded but on your feet.</w:t>
       </w:r>
     </w:p>
-    <w:bookmarkEnd w:id="52"/>
     <w:bookmarkEnd w:id="53"/>
-    <w:bookmarkStart w:id="54" w:name="weapons-and-damage"/>
+    <w:bookmarkEnd w:id="54"/>
+    <w:bookmarkStart w:id="55" w:name="weapons-and-damage"/>
     <w:p>
       <w:pPr>
         <w:pStyle w:val="Heading2"/>
@@ -5700,9 +6059,10 @@
         </w:tblBorders>
       </w:tblPr>
       <w:tblGrid>
-        <w:gridCol w:w="2640"/>
-        <w:gridCol w:w="2640"/>
-        <w:gridCol w:w="2640"/>
+        <w:gridCol w:w="1980"/>
+        <w:gridCol w:w="1980"/>
+        <w:gridCol w:w="1980"/>
+        <w:gridCol w:w="1980"/>
       </w:tblGrid>
       <w:tr>
         <w:trPr>
@@ -5740,7 +6100,7 @@
                 <w:b/>
                 <w:sz w:val="19"/>
               </w:rPr>
-              <w:t xml:space="preserve">Boxes on a hit</w:t>
+              <w:t xml:space="preserve">Range</w:t>
             </w:r>
           </w:p>
         </w:tc>
@@ -5758,6 +6118,24 @@
                 <w:b/>
                 <w:sz w:val="19"/>
               </w:rPr>
+              <w:t xml:space="preserve">Boxes on a hit</w:t>
+            </w:r>
+          </w:p>
+        </w:tc>
+        <w:tc>
+          <w:tcPr>
+            <w:shd w:val="clear" w:fill="E9EEF6"/>
+          </w:tcPr>
+          <w:p>
+            <w:pPr>
+              <w:pStyle w:val="Compact"/>
+              <w:jc w:val="left"/>
+            </w:pPr>
+            <w:r>
+              <w:rPr>
+                <w:b/>
+                <w:sz w:val="19"/>
+              </w:rPr>
               <w:t xml:space="preserve">What the injury looks like</w:t>
             </w:r>
           </w:p>
@@ -5791,6 +6169,21 @@
               <w:rPr>
                 <w:sz w:val="19"/>
               </w:rPr>
+              <w:t xml:space="preserve">Melee</w:t>
+            </w:r>
+          </w:p>
+        </w:tc>
+        <w:tc>
+          <w:tcPr/>
+          <w:p>
+            <w:pPr>
+              <w:pStyle w:val="Compact"/>
+              <w:jc w:val="left"/>
+            </w:pPr>
+            <w:r>
+              <w:rPr>
+                <w:sz w:val="19"/>
+              </w:rPr>
               <w:t xml:space="preserve">1</w:t>
             </w:r>
           </w:p>
@@ -5839,6 +6232,21 @@
               <w:rPr>
                 <w:sz w:val="19"/>
               </w:rPr>
+              <w:t xml:space="preserve">Melee; rock Close thrown</w:t>
+            </w:r>
+          </w:p>
+        </w:tc>
+        <w:tc>
+          <w:tcPr/>
+          <w:p>
+            <w:pPr>
+              <w:pStyle w:val="Compact"/>
+              <w:jc w:val="left"/>
+            </w:pPr>
+            <w:r>
+              <w:rPr>
+                <w:sz w:val="19"/>
+              </w:rPr>
               <w:t xml:space="preserve">1</w:t>
             </w:r>
           </w:p>
@@ -5887,6 +6295,21 @@
               <w:rPr>
                 <w:sz w:val="19"/>
               </w:rPr>
+              <w:t xml:space="preserve">Melee; Close thrown</w:t>
+            </w:r>
+          </w:p>
+        </w:tc>
+        <w:tc>
+          <w:tcPr/>
+          <w:p>
+            <w:pPr>
+              <w:pStyle w:val="Compact"/>
+              <w:jc w:val="left"/>
+            </w:pPr>
+            <w:r>
+              <w:rPr>
+                <w:sz w:val="19"/>
+              </w:rPr>
               <w:t xml:space="preserve">1</w:t>
             </w:r>
           </w:p>
@@ -5935,6 +6358,21 @@
               <w:rPr>
                 <w:sz w:val="19"/>
               </w:rPr>
+              <w:t xml:space="preserve">Medium; spear Close thrown</w:t>
+            </w:r>
+          </w:p>
+        </w:tc>
+        <w:tc>
+          <w:tcPr/>
+          <w:p>
+            <w:pPr>
+              <w:pStyle w:val="Compact"/>
+              <w:jc w:val="left"/>
+            </w:pPr>
+            <w:r>
+              <w:rPr>
+                <w:sz w:val="19"/>
+              </w:rPr>
               <w:t xml:space="preserve">1</w:t>
             </w:r>
           </w:p>
@@ -5983,6 +6421,21 @@
               <w:rPr>
                 <w:sz w:val="19"/>
               </w:rPr>
+              <w:t xml:space="preserve">Melee</w:t>
+            </w:r>
+          </w:p>
+        </w:tc>
+        <w:tc>
+          <w:tcPr/>
+          <w:p>
+            <w:pPr>
+              <w:pStyle w:val="Compact"/>
+              <w:jc w:val="left"/>
+            </w:pPr>
+            <w:r>
+              <w:rPr>
+                <w:sz w:val="19"/>
+              </w:rPr>
               <w:t xml:space="preserve">2</w:t>
             </w:r>
           </w:p>
@@ -6031,6 +6484,21 @@
               <w:rPr>
                 <w:sz w:val="19"/>
               </w:rPr>
+              <w:t xml:space="preserve">Short (type 1), Medium (type 2)</w:t>
+            </w:r>
+          </w:p>
+        </w:tc>
+        <w:tc>
+          <w:tcPr/>
+          <w:p>
+            <w:pPr>
+              <w:pStyle w:val="Compact"/>
+              <w:jc w:val="left"/>
+            </w:pPr>
+            <w:r>
+              <w:rPr>
+                <w:sz w:val="19"/>
+              </w:rPr>
               <w:t xml:space="preserve">0</w:t>
             </w:r>
           </w:p>
@@ -6079,6 +6547,21 @@
               <w:rPr>
                 <w:sz w:val="19"/>
               </w:rPr>
+              <w:t xml:space="preserve">Short (type 1), Medium (type 2)</w:t>
+            </w:r>
+          </w:p>
+        </w:tc>
+        <w:tc>
+          <w:tcPr/>
+          <w:p>
+            <w:pPr>
+              <w:pStyle w:val="Compact"/>
+              <w:jc w:val="left"/>
+            </w:pPr>
+            <w:r>
+              <w:rPr>
+                <w:sz w:val="19"/>
+              </w:rPr>
               <w:t xml:space="preserve">3, and Dying</w:t>
             </w:r>
           </w:p>
@@ -6127,6 +6610,21 @@
               <w:rPr>
                 <w:sz w:val="19"/>
               </w:rPr>
+              <w:t xml:space="preserve">Medium</w:t>
+            </w:r>
+          </w:p>
+        </w:tc>
+        <w:tc>
+          <w:tcPr/>
+          <w:p>
+            <w:pPr>
+              <w:pStyle w:val="Compact"/>
+              <w:jc w:val="left"/>
+            </w:pPr>
+            <w:r>
+              <w:rPr>
+                <w:sz w:val="19"/>
+              </w:rPr>
               <w:t xml:space="preserve">3, and Dying</w:t>
             </w:r>
           </w:p>
@@ -6175,6 +6673,21 @@
               <w:rPr>
                 <w:sz w:val="19"/>
               </w:rPr>
+              <w:t xml:space="preserve">Long; ship’s weapon Extreme</w:t>
+            </w:r>
+          </w:p>
+        </w:tc>
+        <w:tc>
+          <w:tcPr/>
+          <w:p>
+            <w:pPr>
+              <w:pStyle w:val="Compact"/>
+              <w:jc w:val="left"/>
+            </w:pPr>
+            <w:r>
+              <w:rPr>
+                <w:sz w:val="19"/>
+              </w:rPr>
               <w:t xml:space="preserve">3 and Dying, or disintegration if the GM rules it</w:t>
             </w:r>
           </w:p>
@@ -6223,6 +6736,21 @@
               <w:rPr>
                 <w:sz w:val="19"/>
               </w:rPr>
+              <w:t xml:space="preserve">Close (thrown grenade)</w:t>
+            </w:r>
+          </w:p>
+        </w:tc>
+        <w:tc>
+          <w:tcPr/>
+          <w:p>
+            <w:pPr>
+              <w:pStyle w:val="Compact"/>
+              <w:jc w:val="left"/>
+            </w:pPr>
+            <w:r>
+              <w:rPr>
+                <w:sz w:val="19"/>
+              </w:rPr>
               <w:t xml:space="preserve">1 to everyone nearby, 2 at the centre</w:t>
             </w:r>
           </w:p>
@@ -6257,6 +6785,21 @@
                 <w:sz w:val="19"/>
               </w:rPr>
               <w:t xml:space="preserve">Fall</w:t>
+            </w:r>
+          </w:p>
+        </w:tc>
+        <w:tc>
+          <w:tcPr/>
+          <w:p>
+            <w:pPr>
+              <w:pStyle w:val="Compact"/>
+              <w:jc w:val="left"/>
+            </w:pPr>
+            <w:r>
+              <w:rPr>
+                <w:sz w:val="19"/>
+              </w:rPr>
+              <w:t xml:space="preserve">—</w:t>
             </w:r>
           </w:p>
         </w:tc>
@@ -6318,8 +6861,8 @@
         <w:t xml:space="preserve">To take someone down without hurting them, use a phaser on stun, a grapple, or the Vulcan nerve pinch rather than a weapon from this list.</w:t>
       </w:r>
     </w:p>
-    <w:bookmarkEnd w:id="54"/>
-    <w:bookmarkStart w:id="55" w:name="phaser-settings"/>
+    <w:bookmarkEnd w:id="55"/>
+    <w:bookmarkStart w:id="56" w:name="phaser-settings"/>
     <w:p>
       <w:pPr>
         <w:pStyle w:val="Heading2"/>
@@ -6496,8 +7039,8 @@
         <w:t xml:space="preserve">Declare the setting before firing. Stun effects do not stack; a later failed resistance roll still incapacitates the target. Unarmed strikes normally mark one box. A grapple uses an opposed Unarmed Combat contest; winning restrains the target while the hold is maintained. Escape uses an action and a new contest.</w:t>
       </w:r>
     </w:p>
-    <w:bookmarkEnd w:id="55"/>
-    <w:bookmarkStart w:id="56" w:name="phaser-power"/>
+    <w:bookmarkEnd w:id="56"/>
+    <w:bookmarkStart w:id="57" w:name="phaser-power"/>
     <w:p>
       <w:pPr>
         <w:pStyle w:val="Heading2"/>
@@ -6980,9 +7523,9 @@
         <w:t xml:space="preserve">A phaser with at least 4 power left can be set to overload: it whines for a round and explodes at the end of the next round, as an explosion (1 box to everyone nearby, 2 at the centre). The phaser is destroyed.</w:t>
       </w:r>
     </w:p>
-    <w:bookmarkEnd w:id="56"/>
     <w:bookmarkEnd w:id="57"/>
-    <w:bookmarkStart w:id="65" w:name="medical-care"/>
+    <w:bookmarkEnd w:id="58"/>
+    <w:bookmarkStart w:id="66" w:name="medical-care"/>
     <w:p>
       <w:pPr>
         <w:pStyle w:val="Heading1"/>
@@ -6999,7 +7542,7 @@
         <w:t xml:space="preserve">Starfleet physicians in 2268 have advanced diagnostic scanners, potent pharmaceuticals, portable emergency equipment, and sophisticated sickbay facilities. Familiar injuries often respond quickly to treatment. Severe trauma, incompatible biology, missing supplies, and unidentified conditions still challenge an experienced doctor. The treatment values below are campaign rules inspired by the series, rather than numerical rules stated in canon.</w:t>
       </w:r>
     </w:p>
-    <w:bookmarkStart w:id="58" w:name="diagnosis-and-stabilization"/>
+    <w:bookmarkStart w:id="59" w:name="diagnosis-and-stabilization"/>
     <w:p>
       <w:pPr>
         <w:pStyle w:val="Heading2"/>
@@ -7024,8 +7567,8 @@
         <w:t xml:space="preserve">Emergency stabilization takes one action and a successful Medicine roll with a medical kit. It prevents deterioration from the treated injury while the patient is protected from further harm, and it ends Dying. Stabilization alone removes no injury boxes. A patient at three boxes remains incapacitated until treatment clears a box.</w:t>
       </w:r>
     </w:p>
-    <w:bookmarkEnd w:id="58"/>
-    <w:bookmarkStart w:id="59" w:name="field-treatment"/>
+    <w:bookmarkEnd w:id="59"/>
+    <w:bookmarkStart w:id="60" w:name="field-treatment"/>
     <w:p>
       <w:pPr>
         <w:pStyle w:val="Heading2"/>
@@ -7042,8 +7585,8 @@
         <w:t xml:space="preserve">With a medical kit and several uninterrupted minutes, successful Medicine removes one injury box. Success by 5 or more removes two. Each injury receives one field-treatment attempt, even if that attempt fails; further attempts require changed circumstances such as better equipment, new diagnostic information, or access to sickbay. New injuries can receive their own treatment, but cannot justify treating an old injury repeatedly.</w:t>
       </w:r>
     </w:p>
-    <w:bookmarkEnd w:id="59"/>
-    <w:bookmarkStart w:id="60" w:name="sickbay-treatment"/>
+    <w:bookmarkEnd w:id="60"/>
+    <w:bookmarkStart w:id="61" w:name="sickbay-treatment"/>
     <w:p>
       <w:pPr>
         <w:pStyle w:val="Heading2"/>
@@ -7068,8 +7611,8 @@
         <w:t xml:space="preserve">Removing injury boxes removes their associated penalties, but major organ damage, severe burns, and complex internal trauma can still require a procedure and recovery period set by the GM. The physician determines whether the patient is fit for duty. Pain suppression does not itself heal an injury. Stun normally wears off at the end of the scene; prolonged unconsciousness requires assessment.</w:t>
       </w:r>
     </w:p>
-    <w:bookmarkEnd w:id="60"/>
-    <w:bookmarkStart w:id="61" w:name="natural-recovery"/>
+    <w:bookmarkEnd w:id="61"/>
+    <w:bookmarkStart w:id="62" w:name="natural-recovery"/>
     <w:p>
       <w:pPr>
         <w:pStyle w:val="Heading2"/>
@@ -7186,8 +7729,8 @@
         <w:t xml:space="preserve">Ensign Reyes ends a mission Seriously wounded (two boxes). Sickbay is busy with worse cases, so Reyes rests in quarters: one box clears the first day and the second the next, and Reyes is back on duty on the third day.</w:t>
       </w:r>
     </w:p>
-    <w:bookmarkEnd w:id="61"/>
-    <w:bookmarkStart w:id="62" w:name="alien-medicine-and-limits"/>
+    <w:bookmarkEnd w:id="62"/>
+    <w:bookmarkStart w:id="63" w:name="alien-medicine-and-limits"/>
     <w:p>
       <w:pPr>
         <w:pStyle w:val="Heading2"/>
@@ -7212,8 +7755,8 @@
         <w:t xml:space="preserve">Crew of other species may need care suited to their biology. An Alien Physiology Specialist, or a physician with access to the right species data, keeps that care from becoming guesswork.</w:t>
       </w:r>
     </w:p>
-    <w:bookmarkEnd w:id="62"/>
-    <w:bookmarkStart w:id="64" w:name="examples-from-the-original-series"/>
+    <w:bookmarkEnd w:id="63"/>
+    <w:bookmarkStart w:id="65" w:name="examples-from-the-original-series"/>
     <w:p>
       <w:pPr>
         <w:pStyle w:val="Heading2"/>
@@ -7312,7 +7855,7 @@
       <w:r>
         <w:t xml:space="preserve"> </w:t>
       </w:r>
-      <w:hyperlink r:id="rId63">
+      <w:hyperlink r:id="rId64">
         <w:r>
           <w:rPr>
             <w:rStyle w:val="Hyperlink"/>
@@ -7321,9 +7864,9 @@
         </w:r>
       </w:hyperlink>
     </w:p>
-    <w:bookmarkEnd w:id="64"/>
     <w:bookmarkEnd w:id="65"/>
-    <w:bookmarkStart w:id="70" w:name="duty-points-and-bridge-duty"/>
+    <w:bookmarkEnd w:id="66"/>
+    <w:bookmarkStart w:id="73" w:name="duty-points-and-bridge-duty"/>
     <w:p>
       <w:pPr>
         <w:pStyle w:val="Heading1"/>
@@ -7332,7 +7875,7 @@
         <w:t xml:space="preserve">Duty points and bridge duty</w:t>
       </w:r>
     </w:p>
-    <w:bookmarkStart w:id="66" w:name="using-duty-points"/>
+    <w:bookmarkStart w:id="67" w:name="using-duty-points"/>
     <w:p>
       <w:pPr>
         <w:pStyle w:val="Heading2"/>
@@ -7535,8 +8078,8 @@
         <w:t xml:space="preserve">your curiosity tempts you to remain beside an anomaly while the team withdraws. If you accept the resulting separation and danger, the GM awards one Duty point. The point does not remove that danger.</w:t>
       </w:r>
     </w:p>
-    <w:bookmarkEnd w:id="66"/>
-    <w:bookmarkStart w:id="67" w:name="working-on-the-bridge"/>
+    <w:bookmarkEnd w:id="67"/>
+    <w:bookmarkStart w:id="69" w:name="working-on-the-bridge"/>
     <w:p>
       <w:pPr>
         <w:pStyle w:val="Heading2"/>
@@ -7641,7 +8184,7 @@
               <w:rPr>
                 <w:sz w:val="19"/>
               </w:rPr>
-              <w:t xml:space="preserve">Leadership to coordinate; Diplomacy to negotiate</w:t>
+              <w:t xml:space="preserve">Orders each exchange: Command, Read the enemy, Hail or Rally (see The captain’s orders)</w:t>
             </w:r>
           </w:p>
         </w:tc>
@@ -7845,22 +8388,13 @@
         </w:tc>
       </w:tr>
     </w:tbl>
-    <w:p>
-      <w:pPr>
-        <w:pStyle w:val="BodyText"/>
-      </w:pPr>
-      <w:r>
-        <w:t xml:space="preserve">Leadership can assist another officer when orders or coordination meaningfully help. It uses the normal assistance rule and does not provide an automatic bonus to every station.</w:t>
-      </w:r>
-    </w:p>
-    <w:bookmarkEnd w:id="67"/>
-    <w:bookmarkStart w:id="68" w:name="the-uss-pelion"/>
-    <w:p>
-      <w:pPr>
-        <w:pStyle w:val="Heading2"/>
-      </w:pPr>
-      <w:r>
-        <w:t xml:space="preserve">The USS Pelion</w:t>
+    <w:bookmarkStart w:id="68" w:name="the-captains-orders"/>
+    <w:p>
+      <w:pPr>
+        <w:pStyle w:val="Heading3"/>
+      </w:pPr>
+      <w:r>
+        <w:t xml:space="preserve">The captain’s orders</w:t>
       </w:r>
     </w:p>
     <w:p>
@@ -7868,7 +8402,7 @@
         <w:pStyle w:val="FirstParagraph"/>
       </w:pPr>
       <w:r>
-        <w:t xml:space="preserve">The ship has its own sheet, tracked like an injury track. Encounters stay descriptive: the GM states what is at stake before rolls and narrates what each box means. This light structure is a campaign rule; detailed starship combat stays outside this guide.</w:t>
+        <w:t xml:space="preserve">The captain, or whoever has the conn, takes one of these each exchange:</w:t>
       </w:r>
     </w:p>
     <w:tbl>
@@ -7909,7 +8443,7 @@
                 <w:b/>
                 <w:sz w:val="19"/>
               </w:rPr>
-              <w:t xml:space="preserve">Track</w:t>
+              <w:t xml:space="preserve">Order</w:t>
             </w:r>
           </w:p>
         </w:tc>
@@ -7927,7 +8461,7 @@
                 <w:b/>
                 <w:sz w:val="19"/>
               </w:rPr>
-              <w:t xml:space="preserve">Boxes</w:t>
+              <w:t xml:space="preserve">Roll</w:t>
             </w:r>
           </w:p>
         </w:tc>
@@ -7945,6 +8479,305 @@
                 <w:b/>
                 <w:sz w:val="19"/>
               </w:rPr>
+              <w:t xml:space="preserve">Effect</w:t>
+            </w:r>
+          </w:p>
+        </w:tc>
+      </w:tr>
+      <w:tr>
+        <w:tc>
+          <w:tcPr/>
+          <w:p>
+            <w:pPr>
+              <w:pStyle w:val="Compact"/>
+              <w:jc w:val="left"/>
+            </w:pPr>
+            <w:r>
+              <w:rPr>
+                <w:b/>
+                <w:sz w:val="19"/>
+              </w:rPr>
+              <w:t xml:space="preserve">Command</w:t>
+            </w:r>
+          </w:p>
+        </w:tc>
+        <w:tc>
+          <w:tcPr/>
+          <w:p>
+            <w:pPr>
+              <w:pStyle w:val="Compact"/>
+              <w:jc w:val="left"/>
+            </w:pPr>
+            <w:r>
+              <w:rPr>
+                <w:sz w:val="19"/>
+              </w:rPr>
+              <w:t xml:space="preserve">Leadership</w:t>
+            </w:r>
+          </w:p>
+        </w:tc>
+        <w:tc>
+          <w:tcPr/>
+          <w:p>
+            <w:pPr>
+              <w:pStyle w:val="Compact"/>
+              <w:jc w:val="left"/>
+            </w:pPr>
+            <w:r>
+              <w:rPr>
+                <w:sz w:val="19"/>
+              </w:rPr>
+              <w:t xml:space="preserve">Success: one station gets +2 to its roll this exchange; success by 5, two stations.</w:t>
+            </w:r>
+          </w:p>
+        </w:tc>
+      </w:tr>
+      <w:tr>
+        <w:tc>
+          <w:tcPr/>
+          <w:p>
+            <w:pPr>
+              <w:pStyle w:val="Compact"/>
+              <w:jc w:val="left"/>
+            </w:pPr>
+            <w:r>
+              <w:rPr>
+                <w:b/>
+                <w:sz w:val="19"/>
+              </w:rPr>
+              <w:t xml:space="preserve">Read the enemy</w:t>
+            </w:r>
+          </w:p>
+        </w:tc>
+        <w:tc>
+          <w:tcPr/>
+          <w:p>
+            <w:pPr>
+              <w:pStyle w:val="Compact"/>
+              <w:jc w:val="left"/>
+            </w:pPr>
+            <w:r>
+              <w:rPr>
+                <w:sz w:val="19"/>
+              </w:rPr>
+              <w:t xml:space="preserve">Psychology</w:t>
+            </w:r>
+          </w:p>
+        </w:tc>
+        <w:tc>
+          <w:tcPr/>
+          <w:p>
+            <w:pPr>
+              <w:pStyle w:val="Compact"/>
+              <w:jc w:val="left"/>
+            </w:pPr>
+            <w:r>
+              <w:rPr>
+                <w:sz w:val="19"/>
+              </w:rPr>
+              <w:t xml:space="preserve">Success: you predict their next move. +2 to the pilot’s evade or range contest this exchange, or the gunner ignores one band of range penalty.</w:t>
+            </w:r>
+          </w:p>
+        </w:tc>
+      </w:tr>
+      <w:tr>
+        <w:tc>
+          <w:tcPr/>
+          <w:p>
+            <w:pPr>
+              <w:pStyle w:val="Compact"/>
+              <w:jc w:val="left"/>
+            </w:pPr>
+            <w:r>
+              <w:rPr>
+                <w:b/>
+                <w:sz w:val="19"/>
+              </w:rPr>
+              <w:t xml:space="preserve">Hail</w:t>
+            </w:r>
+          </w:p>
+        </w:tc>
+        <w:tc>
+          <w:tcPr/>
+          <w:p>
+            <w:pPr>
+              <w:pStyle w:val="Compact"/>
+              <w:jc w:val="left"/>
+            </w:pPr>
+            <w:r>
+              <w:rPr>
+                <w:sz w:val="19"/>
+              </w:rPr>
+              <w:t xml:space="preserve">Diplomacy (a bluff included)</w:t>
+            </w:r>
+          </w:p>
+        </w:tc>
+        <w:tc>
+          <w:tcPr/>
+          <w:p>
+            <w:pPr>
+              <w:pStyle w:val="Compact"/>
+              <w:jc w:val="left"/>
+            </w:pPr>
+            <w:r>
+              <w:rPr>
+                <w:sz w:val="19"/>
+              </w:rPr>
+              <w:t xml:space="preserve">Opposed by the enemy captain’s Will. Success: they pause to talk, hold fire for an exchange, or consider surrender; a bluff can make them believe what you say about your ship.</w:t>
+            </w:r>
+          </w:p>
+        </w:tc>
+      </w:tr>
+      <w:tr>
+        <w:tc>
+          <w:tcPr/>
+          <w:p>
+            <w:pPr>
+              <w:pStyle w:val="Compact"/>
+              <w:jc w:val="left"/>
+            </w:pPr>
+            <w:r>
+              <w:rPr>
+                <w:b/>
+                <w:sz w:val="19"/>
+              </w:rPr>
+              <w:t xml:space="preserve">Rally</w:t>
+            </w:r>
+          </w:p>
+        </w:tc>
+        <w:tc>
+          <w:tcPr/>
+          <w:p>
+            <w:pPr>
+              <w:pStyle w:val="Compact"/>
+              <w:jc w:val="left"/>
+            </w:pPr>
+            <w:r>
+              <w:rPr>
+                <w:sz w:val="19"/>
+              </w:rPr>
+              <w:t xml:space="preserve">Leadership</w:t>
+            </w:r>
+          </w:p>
+        </w:tc>
+        <w:tc>
+          <w:tcPr/>
+          <w:p>
+            <w:pPr>
+              <w:pStyle w:val="Compact"/>
+              <w:jc w:val="left"/>
+            </w:pPr>
+            <w:r>
+              <w:rPr>
+                <w:sz w:val="19"/>
+              </w:rPr>
+              <w:t xml:space="preserve">After a hit to the hull, steady the crew: anyone stunned or shaken by the hit acts normally again, and the next failed station roll this scene may be rerolled.</w:t>
+            </w:r>
+          </w:p>
+        </w:tc>
+      </w:tr>
+    </w:tbl>
+    <w:p>
+      <w:pPr>
+        <w:pStyle w:val="BodyText"/>
+      </w:pPr>
+      <w:r>
+        <w:t xml:space="preserve">A captain who takes an order doesn’t also work a station that exchange. Commanding well is the job.</w:t>
+      </w:r>
+    </w:p>
+    <w:bookmarkEnd w:id="68"/>
+    <w:bookmarkEnd w:id="69"/>
+    <w:bookmarkStart w:id="71" w:name="the-uss-pelion"/>
+    <w:p>
+      <w:pPr>
+        <w:pStyle w:val="Heading2"/>
+      </w:pPr>
+      <w:r>
+        <w:t xml:space="preserve">The USS Pelion</w:t>
+      </w:r>
+    </w:p>
+    <w:p>
+      <w:pPr>
+        <w:pStyle w:val="FirstParagraph"/>
+      </w:pPr>
+      <w:r>
+        <w:t xml:space="preserve">The ship has its own sheet, tracked like an injury track. Encounters stay descriptive: the GM states what is at stake before rolls and narrates what each box means. This light structure is a campaign rule; detailed starship combat stays outside this guide.</w:t>
+      </w:r>
+    </w:p>
+    <w:tbl>
+      <w:tblPr>
+        <w:tblStyle w:val="Table"/>
+        <w:tblW w:type="pct" w:w="5000"/>
+        <w:tblLook w:firstRow="1" w:lastRow="0" w:firstColumn="0" w:lastColumn="0" w:noHBand="0" w:noVBand="0" w:val="0020"/>
+        <w:jc w:val="start"/>
+        <w:tblBorders>
+          <w:top w:val="single" w:sz="4" w:color="B8C2D3"/>
+          <w:left w:val="single" w:sz="4" w:color="B8C2D3"/>
+          <w:bottom w:val="single" w:sz="4" w:color="B8C2D3"/>
+          <w:right w:val="single" w:sz="4" w:color="B8C2D3"/>
+          <w:insideH w:val="single" w:sz="4" w:color="B8C2D3"/>
+          <w:insideV w:val="single" w:sz="4" w:color="B8C2D3"/>
+        </w:tblBorders>
+      </w:tblPr>
+      <w:tblGrid>
+        <w:gridCol w:w="2640"/>
+        <w:gridCol w:w="2640"/>
+        <w:gridCol w:w="2640"/>
+      </w:tblGrid>
+      <w:tr>
+        <w:trPr>
+          <w:tblHeader w:val="true"/>
+        </w:trPr>
+        <w:tc>
+          <w:tcPr>
+            <w:shd w:val="clear" w:fill="E9EEF6"/>
+          </w:tcPr>
+          <w:p>
+            <w:pPr>
+              <w:pStyle w:val="Compact"/>
+              <w:jc w:val="left"/>
+            </w:pPr>
+            <w:r>
+              <w:rPr>
+                <w:b/>
+                <w:sz w:val="19"/>
+              </w:rPr>
+              <w:t xml:space="preserve">Track</w:t>
+            </w:r>
+          </w:p>
+        </w:tc>
+        <w:tc>
+          <w:tcPr>
+            <w:shd w:val="clear" w:fill="E9EEF6"/>
+          </w:tcPr>
+          <w:p>
+            <w:pPr>
+              <w:pStyle w:val="Compact"/>
+              <w:jc w:val="left"/>
+            </w:pPr>
+            <w:r>
+              <w:rPr>
+                <w:b/>
+                <w:sz w:val="19"/>
+              </w:rPr>
+              <w:t xml:space="preserve">Boxes</w:t>
+            </w:r>
+          </w:p>
+        </w:tc>
+        <w:tc>
+          <w:tcPr>
+            <w:shd w:val="clear" w:fill="E9EEF6"/>
+          </w:tcPr>
+          <w:p>
+            <w:pPr>
+              <w:pStyle w:val="Compact"/>
+              <w:jc w:val="left"/>
+            </w:pPr>
+            <w:r>
+              <w:rPr>
+                <w:b/>
+                <w:sz w:val="19"/>
+              </w:rPr>
               <w:t xml:space="preserve">Effect as boxes fill</w:t>
             </w:r>
           </w:p>
@@ -8301,8 +9134,913 @@
         <w:t xml:space="preserve">for ship weapons, against the enemy ship’s own tracks, which the GM keeps the same way.</w:t>
       </w:r>
     </w:p>
-    <w:bookmarkEnd w:id="68"/>
-    <w:bookmarkStart w:id="69" w:name="advancement"/>
+    <w:bookmarkStart w:id="70" w:name="range-in-space"/>
+    <w:p>
+      <w:pPr>
+        <w:pStyle w:val="Heading3"/>
+      </w:pPr>
+      <w:r>
+        <w:t xml:space="preserve">Range in space</w:t>
+      </w:r>
+    </w:p>
+    <w:tbl>
+      <w:tblPr>
+        <w:tblStyle w:val="Table"/>
+        <w:tblW w:type="pct" w:w="5000"/>
+        <w:tblLook w:firstRow="1" w:lastRow="0" w:firstColumn="0" w:lastColumn="0" w:noHBand="0" w:noVBand="0" w:val="0020"/>
+        <w:jc w:val="start"/>
+        <w:tblBorders>
+          <w:top w:val="single" w:sz="4" w:color="B8C2D3"/>
+          <w:left w:val="single" w:sz="4" w:color="B8C2D3"/>
+          <w:bottom w:val="single" w:sz="4" w:color="B8C2D3"/>
+          <w:right w:val="single" w:sz="4" w:color="B8C2D3"/>
+          <w:insideH w:val="single" w:sz="4" w:color="B8C2D3"/>
+          <w:insideV w:val="single" w:sz="4" w:color="B8C2D3"/>
+        </w:tblBorders>
+      </w:tblPr>
+      <w:tblGrid>
+        <w:gridCol w:w="2640"/>
+        <w:gridCol w:w="2640"/>
+        <w:gridCol w:w="2640"/>
+      </w:tblGrid>
+      <w:tr>
+        <w:trPr>
+          <w:tblHeader w:val="true"/>
+        </w:trPr>
+        <w:tc>
+          <w:tcPr>
+            <w:shd w:val="clear" w:fill="E9EEF6"/>
+          </w:tcPr>
+          <w:p>
+            <w:pPr>
+              <w:pStyle w:val="Compact"/>
+              <w:jc w:val="left"/>
+            </w:pPr>
+            <w:r>
+              <w:rPr>
+                <w:b/>
+                <w:sz w:val="19"/>
+              </w:rPr>
+              <w:t xml:space="preserve">Band</w:t>
+            </w:r>
+          </w:p>
+        </w:tc>
+        <w:tc>
+          <w:tcPr>
+            <w:shd w:val="clear" w:fill="E9EEF6"/>
+          </w:tcPr>
+          <w:p>
+            <w:pPr>
+              <w:pStyle w:val="Compact"/>
+              <w:jc w:val="left"/>
+            </w:pPr>
+            <w:r>
+              <w:rPr>
+                <w:b/>
+                <w:sz w:val="19"/>
+              </w:rPr>
+              <w:t xml:space="preserve">Distance</w:t>
+            </w:r>
+          </w:p>
+        </w:tc>
+        <w:tc>
+          <w:tcPr>
+            <w:shd w:val="clear" w:fill="E9EEF6"/>
+          </w:tcPr>
+          <w:p>
+            <w:pPr>
+              <w:pStyle w:val="Compact"/>
+              <w:jc w:val="left"/>
+            </w:pPr>
+            <w:r>
+              <w:rPr>
+                <w:b/>
+                <w:sz w:val="19"/>
+              </w:rPr>
+              <w:t xml:space="preserve">For example</w:t>
+            </w:r>
+          </w:p>
+        </w:tc>
+      </w:tr>
+      <w:tr>
+        <w:tc>
+          <w:tcPr/>
+          <w:p>
+            <w:pPr>
+              <w:pStyle w:val="Compact"/>
+              <w:jc w:val="left"/>
+            </w:pPr>
+            <w:r>
+              <w:rPr>
+                <w:b/>
+                <w:sz w:val="19"/>
+              </w:rPr>
+              <w:t xml:space="preserve">Close</w:t>
+            </w:r>
+          </w:p>
+        </w:tc>
+        <w:tc>
+          <w:tcPr/>
+          <w:p>
+            <w:pPr>
+              <w:pStyle w:val="Compact"/>
+              <w:jc w:val="left"/>
+            </w:pPr>
+            <w:r>
+              <w:rPr>
+                <w:sz w:val="19"/>
+              </w:rPr>
+              <w:t xml:space="preserve">Under 10 km</w:t>
+            </w:r>
+          </w:p>
+        </w:tc>
+        <w:tc>
+          <w:tcPr/>
+          <w:p>
+            <w:pPr>
+              <w:pStyle w:val="Compact"/>
+              <w:jc w:val="left"/>
+            </w:pPr>
+            <w:r>
+              <w:rPr>
+                <w:sz w:val="19"/>
+              </w:rPr>
+              <w:t xml:space="preserve">Docking, boarding, a knife fight between hulls</w:t>
+            </w:r>
+          </w:p>
+        </w:tc>
+      </w:tr>
+      <w:tr>
+        <w:tc>
+          <w:tcPr/>
+          <w:p>
+            <w:pPr>
+              <w:pStyle w:val="Compact"/>
+              <w:jc w:val="left"/>
+            </w:pPr>
+            <w:r>
+              <w:rPr>
+                <w:b/>
+                <w:sz w:val="19"/>
+              </w:rPr>
+              <w:t xml:space="preserve">Short</w:t>
+            </w:r>
+          </w:p>
+        </w:tc>
+        <w:tc>
+          <w:tcPr/>
+          <w:p>
+            <w:pPr>
+              <w:pStyle w:val="Compact"/>
+              <w:jc w:val="left"/>
+            </w:pPr>
+            <w:r>
+              <w:rPr>
+                <w:sz w:val="19"/>
+              </w:rPr>
+              <w:t xml:space="preserve">Up to 1,000 km</w:t>
+            </w:r>
+          </w:p>
+        </w:tc>
+        <w:tc>
+          <w:tcPr/>
+          <w:p>
+            <w:pPr>
+              <w:pStyle w:val="Compact"/>
+              <w:jc w:val="left"/>
+            </w:pPr>
+            <w:r>
+              <w:rPr>
+                <w:sz w:val="19"/>
+              </w:rPr>
+              <w:t xml:space="preserve">Formation flying; a ship is a visible point of light</w:t>
+            </w:r>
+          </w:p>
+        </w:tc>
+      </w:tr>
+      <w:tr>
+        <w:tc>
+          <w:tcPr/>
+          <w:p>
+            <w:pPr>
+              <w:pStyle w:val="Compact"/>
+              <w:jc w:val="left"/>
+            </w:pPr>
+            <w:r>
+              <w:rPr>
+                <w:b/>
+                <w:sz w:val="19"/>
+              </w:rPr>
+              <w:t xml:space="preserve">Medium</w:t>
+            </w:r>
+          </w:p>
+        </w:tc>
+        <w:tc>
+          <w:tcPr/>
+          <w:p>
+            <w:pPr>
+              <w:pStyle w:val="Compact"/>
+              <w:jc w:val="left"/>
+            </w:pPr>
+            <w:r>
+              <w:rPr>
+                <w:sz w:val="19"/>
+              </w:rPr>
+              <w:t xml:space="preserve">Up to 10,000 km</w:t>
+            </w:r>
+          </w:p>
+        </w:tc>
+        <w:tc>
+          <w:tcPr/>
+          <w:p>
+            <w:pPr>
+              <w:pStyle w:val="Compact"/>
+              <w:jc w:val="left"/>
+            </w:pPr>
+            <w:r>
+              <w:rPr>
+                <w:sz w:val="19"/>
+              </w:rPr>
+              <w:t xml:space="preserve">A planet’s near orbit</w:t>
+            </w:r>
+          </w:p>
+        </w:tc>
+      </w:tr>
+      <w:tr>
+        <w:tc>
+          <w:tcPr/>
+          <w:p>
+            <w:pPr>
+              <w:pStyle w:val="Compact"/>
+              <w:jc w:val="left"/>
+            </w:pPr>
+            <w:r>
+              <w:rPr>
+                <w:b/>
+                <w:sz w:val="19"/>
+              </w:rPr>
+              <w:t xml:space="preserve">Long</w:t>
+            </w:r>
+          </w:p>
+        </w:tc>
+        <w:tc>
+          <w:tcPr/>
+          <w:p>
+            <w:pPr>
+              <w:pStyle w:val="Compact"/>
+              <w:jc w:val="left"/>
+            </w:pPr>
+            <w:r>
+              <w:rPr>
+                <w:sz w:val="19"/>
+              </w:rPr>
+              <w:t xml:space="preserve">Up to 100,000 km</w:t>
+            </w:r>
+          </w:p>
+        </w:tc>
+        <w:tc>
+          <w:tcPr/>
+          <w:p>
+            <w:pPr>
+              <w:pStyle w:val="Compact"/>
+              <w:jc w:val="left"/>
+            </w:pPr>
+            <w:r>
+              <w:rPr>
+                <w:sz w:val="19"/>
+              </w:rPr>
+              <w:t xml:space="preserve">Across a planet’s moon system</w:t>
+            </w:r>
+          </w:p>
+        </w:tc>
+      </w:tr>
+      <w:tr>
+        <w:tc>
+          <w:tcPr/>
+          <w:p>
+            <w:pPr>
+              <w:pStyle w:val="Compact"/>
+              <w:jc w:val="left"/>
+            </w:pPr>
+            <w:r>
+              <w:rPr>
+                <w:b/>
+                <w:sz w:val="19"/>
+              </w:rPr>
+              <w:t xml:space="preserve">Extreme</w:t>
+            </w:r>
+          </w:p>
+        </w:tc>
+        <w:tc>
+          <w:tcPr/>
+          <w:p>
+            <w:pPr>
+              <w:pStyle w:val="Compact"/>
+              <w:jc w:val="left"/>
+            </w:pPr>
+            <w:r>
+              <w:rPr>
+                <w:sz w:val="19"/>
+              </w:rPr>
+              <w:t xml:space="preserve">About a light-second (300,000 km)</w:t>
+            </w:r>
+          </w:p>
+        </w:tc>
+        <w:tc>
+          <w:tcPr/>
+          <w:p>
+            <w:pPr>
+              <w:pStyle w:val="Compact"/>
+              <w:jc w:val="left"/>
+            </w:pPr>
+            <w:r>
+              <w:rPr>
+                <w:sz w:val="19"/>
+              </w:rPr>
+              <w:t xml:space="preserve">The limit of targeting; light lag makes beyond it guesswork</w:t>
+            </w:r>
+          </w:p>
+        </w:tc>
+      </w:tr>
+    </w:tbl>
+    <w:p>
+      <w:pPr>
+        <w:pStyle w:val="BodyText"/>
+      </w:pPr>
+      <w:r>
+        <w:t xml:space="preserve">As in personal combat, a weapon fires without penalty within its effective band, at −2 one band beyond and −4 two bands beyond; farther is out of range.</w:t>
+      </w:r>
+    </w:p>
+    <w:p>
+      <w:pPr>
+        <w:pStyle w:val="BodyText"/>
+      </w:pPr>
+      <w:r>
+        <w:rPr>
+          <w:bCs/>
+          <w:b/>
+        </w:rPr>
+        <w:t xml:space="preserve">Closing and opening.</w:t>
+      </w:r>
+      <w:r>
+        <w:t xml:space="preserve"> </w:t>
+      </w:r>
+      <w:r>
+        <w:t xml:space="preserve">At the start of each exchange, Helm rolls an opposed</w:t>
+      </w:r>
+      <w:r>
+        <w:t xml:space="preserve"> </w:t>
+      </w:r>
+      <w:r>
+        <w:rPr>
+          <w:bCs/>
+          <w:b/>
+        </w:rPr>
+        <w:t xml:space="preserve">Helm</w:t>
+      </w:r>
+      <w:r>
+        <w:t xml:space="preserve"> </w:t>
+      </w:r>
+      <w:r>
+        <w:t xml:space="preserve">contest with the enemy’s helm. The winner may shift the range one band, in or out. Winning at Extreme range by 5 or more lets the ship break away and go to warp.</w:t>
+      </w:r>
+    </w:p>
+    <w:tbl>
+      <w:tblPr>
+        <w:tblStyle w:val="Table"/>
+        <w:tblW w:type="pct" w:w="5000"/>
+        <w:tblLook w:firstRow="1" w:lastRow="0" w:firstColumn="0" w:lastColumn="0" w:noHBand="0" w:noVBand="0" w:val="0020"/>
+        <w:jc w:val="start"/>
+        <w:tblBorders>
+          <w:top w:val="single" w:sz="4" w:color="B8C2D3"/>
+          <w:left w:val="single" w:sz="4" w:color="B8C2D3"/>
+          <w:bottom w:val="single" w:sz="4" w:color="B8C2D3"/>
+          <w:right w:val="single" w:sz="4" w:color="B8C2D3"/>
+          <w:insideH w:val="single" w:sz="4" w:color="B8C2D3"/>
+          <w:insideV w:val="single" w:sz="4" w:color="B8C2D3"/>
+        </w:tblBorders>
+      </w:tblPr>
+      <w:tblGrid>
+        <w:gridCol w:w="1980"/>
+        <w:gridCol w:w="1980"/>
+        <w:gridCol w:w="1980"/>
+        <w:gridCol w:w="1980"/>
+      </w:tblGrid>
+      <w:tr>
+        <w:trPr>
+          <w:tblHeader w:val="true"/>
+        </w:trPr>
+        <w:tc>
+          <w:tcPr>
+            <w:shd w:val="clear" w:fill="E9EEF6"/>
+          </w:tcPr>
+          <w:p>
+            <w:pPr>
+              <w:pStyle w:val="Compact"/>
+              <w:jc w:val="left"/>
+            </w:pPr>
+            <w:r>
+              <w:rPr>
+                <w:b/>
+                <w:sz w:val="19"/>
+              </w:rPr>
+              <w:t xml:space="preserve">Ship system</w:t>
+            </w:r>
+          </w:p>
+        </w:tc>
+        <w:tc>
+          <w:tcPr>
+            <w:shd w:val="clear" w:fill="E9EEF6"/>
+          </w:tcPr>
+          <w:p>
+            <w:pPr>
+              <w:pStyle w:val="Compact"/>
+              <w:jc w:val="left"/>
+            </w:pPr>
+            <w:r>
+              <w:rPr>
+                <w:b/>
+                <w:sz w:val="19"/>
+              </w:rPr>
+              <w:t xml:space="preserve">Range</w:t>
+            </w:r>
+          </w:p>
+        </w:tc>
+        <w:tc>
+          <w:tcPr>
+            <w:shd w:val="clear" w:fill="E9EEF6"/>
+          </w:tcPr>
+          <w:p>
+            <w:pPr>
+              <w:pStyle w:val="Compact"/>
+              <w:jc w:val="left"/>
+            </w:pPr>
+            <w:r>
+              <w:rPr>
+                <w:b/>
+                <w:sz w:val="19"/>
+              </w:rPr>
+              <w:t xml:space="preserve">Hit</w:t>
+            </w:r>
+          </w:p>
+        </w:tc>
+        <w:tc>
+          <w:tcPr>
+            <w:shd w:val="clear" w:fill="E9EEF6"/>
+          </w:tcPr>
+          <w:p>
+            <w:pPr>
+              <w:pStyle w:val="Compact"/>
+              <w:jc w:val="left"/>
+            </w:pPr>
+            <w:r>
+              <w:rPr>
+                <w:b/>
+                <w:sz w:val="19"/>
+              </w:rPr>
+              <w:t xml:space="preserve">Notes</w:t>
+            </w:r>
+          </w:p>
+        </w:tc>
+      </w:tr>
+      <w:tr>
+        <w:tc>
+          <w:tcPr/>
+          <w:p>
+            <w:pPr>
+              <w:pStyle w:val="Compact"/>
+              <w:jc w:val="left"/>
+            </w:pPr>
+            <w:r>
+              <w:rPr>
+                <w:b/>
+                <w:sz w:val="19"/>
+              </w:rPr>
+              <w:t xml:space="preserve">Phaser banks</w:t>
+            </w:r>
+          </w:p>
+        </w:tc>
+        <w:tc>
+          <w:tcPr/>
+          <w:p>
+            <w:pPr>
+              <w:pStyle w:val="Compact"/>
+              <w:jc w:val="left"/>
+            </w:pPr>
+            <w:r>
+              <w:rPr>
+                <w:sz w:val="19"/>
+              </w:rPr>
+              <w:t xml:space="preserve">Long</w:t>
+            </w:r>
+          </w:p>
+        </w:tc>
+        <w:tc>
+          <w:tcPr/>
+          <w:p>
+            <w:pPr>
+              <w:pStyle w:val="Compact"/>
+              <w:jc w:val="left"/>
+            </w:pPr>
+            <w:r>
+              <w:rPr>
+                <w:sz w:val="19"/>
+              </w:rPr>
+              <w:t xml:space="preserve">Normal (1 box)</w:t>
+            </w:r>
+          </w:p>
+        </w:tc>
+        <w:tc>
+          <w:tcPr/>
+          <w:p>
+            <w:pPr>
+              <w:pStyle w:val="Compact"/>
+              <w:jc w:val="left"/>
+            </w:pPr>
+            <w:r>
+              <w:rPr>
+                <w:sz w:val="19"/>
+              </w:rPr>
+              <w:t xml:space="preserve">The ship’s main weapon.</w:t>
+            </w:r>
+          </w:p>
+        </w:tc>
+      </w:tr>
+      <w:tr>
+        <w:tc>
+          <w:tcPr/>
+          <w:p>
+            <w:pPr>
+              <w:pStyle w:val="Compact"/>
+              <w:jc w:val="left"/>
+            </w:pPr>
+            <w:r>
+              <w:rPr>
+                <w:b/>
+                <w:sz w:val="19"/>
+              </w:rPr>
+              <w:t xml:space="preserve">Photon torpedoes</w:t>
+            </w:r>
+          </w:p>
+        </w:tc>
+        <w:tc>
+          <w:tcPr/>
+          <w:p>
+            <w:pPr>
+              <w:pStyle w:val="Compact"/>
+              <w:jc w:val="left"/>
+            </w:pPr>
+            <w:r>
+              <w:rPr>
+                <w:sz w:val="19"/>
+              </w:rPr>
+              <w:t xml:space="preserve">Extreme</w:t>
+            </w:r>
+          </w:p>
+        </w:tc>
+        <w:tc>
+          <w:tcPr/>
+          <w:p>
+            <w:pPr>
+              <w:pStyle w:val="Compact"/>
+              <w:jc w:val="left"/>
+            </w:pPr>
+            <w:r>
+              <w:rPr>
+                <w:sz w:val="19"/>
+              </w:rPr>
+              <w:t xml:space="preserve">Heavy (2 boxes)</w:t>
+            </w:r>
+          </w:p>
+        </w:tc>
+        <w:tc>
+          <w:tcPr/>
+          <w:p>
+            <w:pPr>
+              <w:pStyle w:val="Compact"/>
+              <w:jc w:val="left"/>
+            </w:pPr>
+            <w:r>
+              <w:rPr>
+                <w:sz w:val="19"/>
+              </w:rPr>
+              <w:t xml:space="preserve">A volley of two counts as one heavy hit with +1 to hit.</w:t>
+            </w:r>
+          </w:p>
+        </w:tc>
+      </w:tr>
+      <w:tr>
+        <w:tc>
+          <w:tcPr/>
+          <w:p>
+            <w:pPr>
+              <w:pStyle w:val="Compact"/>
+              <w:jc w:val="left"/>
+            </w:pPr>
+            <w:r>
+              <w:rPr>
+                <w:b/>
+                <w:sz w:val="19"/>
+              </w:rPr>
+              <w:t xml:space="preserve">Klingon disruptors</w:t>
+            </w:r>
+          </w:p>
+        </w:tc>
+        <w:tc>
+          <w:tcPr/>
+          <w:p>
+            <w:pPr>
+              <w:pStyle w:val="Compact"/>
+              <w:jc w:val="left"/>
+            </w:pPr>
+            <w:r>
+              <w:rPr>
+                <w:sz w:val="19"/>
+              </w:rPr>
+              <w:t xml:space="preserve">Medium</w:t>
+            </w:r>
+          </w:p>
+        </w:tc>
+        <w:tc>
+          <w:tcPr/>
+          <w:p>
+            <w:pPr>
+              <w:pStyle w:val="Compact"/>
+              <w:jc w:val="left"/>
+            </w:pPr>
+            <w:r>
+              <w:rPr>
+                <w:sz w:val="19"/>
+              </w:rPr>
+              <w:t xml:space="preserve">Normal; a volley is heavy</w:t>
+            </w:r>
+          </w:p>
+        </w:tc>
+        <w:tc>
+          <w:tcPr/>
+          <w:p>
+            <w:pPr>
+              <w:pStyle w:val="Compact"/>
+            </w:pPr>
+          </w:p>
+        </w:tc>
+      </w:tr>
+      <w:tr>
+        <w:tc>
+          <w:tcPr/>
+          <w:p>
+            <w:pPr>
+              <w:pStyle w:val="Compact"/>
+              <w:jc w:val="left"/>
+            </w:pPr>
+            <w:r>
+              <w:rPr>
+                <w:b/>
+                <w:sz w:val="19"/>
+              </w:rPr>
+              <w:t xml:space="preserve">Romulan plasma torpedo</w:t>
+            </w:r>
+          </w:p>
+        </w:tc>
+        <w:tc>
+          <w:tcPr/>
+          <w:p>
+            <w:pPr>
+              <w:pStyle w:val="Compact"/>
+              <w:jc w:val="left"/>
+            </w:pPr>
+            <w:r>
+              <w:rPr>
+                <w:sz w:val="19"/>
+              </w:rPr>
+              <w:t xml:space="preserve">Long</w:t>
+            </w:r>
+          </w:p>
+        </w:tc>
+        <w:tc>
+          <w:tcPr/>
+          <w:p>
+            <w:pPr>
+              <w:pStyle w:val="Compact"/>
+              <w:jc w:val="left"/>
+            </w:pPr>
+            <w:r>
+              <w:rPr>
+                <w:sz w:val="19"/>
+              </w:rPr>
+              <w:t xml:space="preserve">Heavy, and a system goes Offline</w:t>
+            </w:r>
+          </w:p>
+        </w:tc>
+        <w:tc>
+          <w:tcPr/>
+          <w:p>
+            <w:pPr>
+              <w:pStyle w:val="Compact"/>
+              <w:jc w:val="left"/>
+            </w:pPr>
+            <w:r>
+              <w:rPr>
+                <w:sz w:val="19"/>
+              </w:rPr>
+              <w:t xml:space="preserve">Slow: Helm’s evade gets +2 against it.</w:t>
+            </w:r>
+          </w:p>
+        </w:tc>
+      </w:tr>
+      <w:tr>
+        <w:tc>
+          <w:tcPr/>
+          <w:p>
+            <w:pPr>
+              <w:pStyle w:val="Compact"/>
+              <w:jc w:val="left"/>
+            </w:pPr>
+            <w:r>
+              <w:rPr>
+                <w:b/>
+                <w:sz w:val="19"/>
+              </w:rPr>
+              <w:t xml:space="preserve">Tractor beam</w:t>
+            </w:r>
+          </w:p>
+        </w:tc>
+        <w:tc>
+          <w:tcPr/>
+          <w:p>
+            <w:pPr>
+              <w:pStyle w:val="Compact"/>
+              <w:jc w:val="left"/>
+            </w:pPr>
+            <w:r>
+              <w:rPr>
+                <w:sz w:val="19"/>
+              </w:rPr>
+              <w:t xml:space="preserve">Short</w:t>
+            </w:r>
+          </w:p>
+        </w:tc>
+        <w:tc>
+          <w:tcPr/>
+          <w:p>
+            <w:pPr>
+              <w:pStyle w:val="Compact"/>
+              <w:jc w:val="left"/>
+            </w:pPr>
+            <w:r>
+              <w:rPr>
+                <w:sz w:val="19"/>
+              </w:rPr>
+              <w:t xml:space="preserve">—</w:t>
+            </w:r>
+          </w:p>
+        </w:tc>
+        <w:tc>
+          <w:tcPr/>
+          <w:p>
+            <w:pPr>
+              <w:pStyle w:val="Compact"/>
+              <w:jc w:val="left"/>
+            </w:pPr>
+            <w:r>
+              <w:rPr>
+                <w:sz w:val="19"/>
+              </w:rPr>
+              <w:t xml:space="preserve">Holds a smaller ship; Helm contest to break free.</w:t>
+            </w:r>
+          </w:p>
+        </w:tc>
+      </w:tr>
+      <w:tr>
+        <w:tc>
+          <w:tcPr/>
+          <w:p>
+            <w:pPr>
+              <w:pStyle w:val="Compact"/>
+              <w:jc w:val="left"/>
+            </w:pPr>
+            <w:r>
+              <w:rPr>
+                <w:b/>
+                <w:sz w:val="19"/>
+              </w:rPr>
+              <w:t xml:space="preserve">Transporter</w:t>
+            </w:r>
+          </w:p>
+        </w:tc>
+        <w:tc>
+          <w:tcPr/>
+          <w:p>
+            <w:pPr>
+              <w:pStyle w:val="Compact"/>
+              <w:jc w:val="left"/>
+            </w:pPr>
+            <w:r>
+              <w:rPr>
+                <w:sz w:val="19"/>
+              </w:rPr>
+              <w:t xml:space="preserve">Medium</w:t>
+            </w:r>
+          </w:p>
+        </w:tc>
+        <w:tc>
+          <w:tcPr/>
+          <w:p>
+            <w:pPr>
+              <w:pStyle w:val="Compact"/>
+              <w:jc w:val="left"/>
+            </w:pPr>
+            <w:r>
+              <w:rPr>
+                <w:sz w:val="19"/>
+              </w:rPr>
+              <w:t xml:space="preserve">—</w:t>
+            </w:r>
+          </w:p>
+        </w:tc>
+        <w:tc>
+          <w:tcPr/>
+          <w:p>
+            <w:pPr>
+              <w:pStyle w:val="Compact"/>
+              <w:jc w:val="left"/>
+            </w:pPr>
+            <w:r>
+              <w:rPr>
+                <w:sz w:val="19"/>
+              </w:rPr>
+              <w:t xml:space="preserve">Only when the target’s shields are down.</w:t>
+            </w:r>
+          </w:p>
+        </w:tc>
+      </w:tr>
+      <w:tr>
+        <w:tc>
+          <w:tcPr/>
+          <w:p>
+            <w:pPr>
+              <w:pStyle w:val="Compact"/>
+              <w:jc w:val="left"/>
+            </w:pPr>
+            <w:r>
+              <w:rPr>
+                <w:b/>
+                <w:sz w:val="19"/>
+              </w:rPr>
+              <w:t xml:space="preserve">Ramming</w:t>
+            </w:r>
+          </w:p>
+        </w:tc>
+        <w:tc>
+          <w:tcPr/>
+          <w:p>
+            <w:pPr>
+              <w:pStyle w:val="Compact"/>
+              <w:jc w:val="left"/>
+            </w:pPr>
+            <w:r>
+              <w:rPr>
+                <w:sz w:val="19"/>
+              </w:rPr>
+              <w:t xml:space="preserve">Close</w:t>
+            </w:r>
+          </w:p>
+        </w:tc>
+        <w:tc>
+          <w:tcPr/>
+          <w:p>
+            <w:pPr>
+              <w:pStyle w:val="Compact"/>
+              <w:jc w:val="left"/>
+            </w:pPr>
+            <w:r>
+              <w:rPr>
+                <w:sz w:val="19"/>
+              </w:rPr>
+              <w:t xml:space="preserve">Heavy to both ships</w:t>
+            </w:r>
+          </w:p>
+        </w:tc>
+        <w:tc>
+          <w:tcPr/>
+          <w:p>
+            <w:pPr>
+              <w:pStyle w:val="Compact"/>
+              <w:jc w:val="left"/>
+            </w:pPr>
+            <w:r>
+              <w:rPr>
+                <w:sz w:val="19"/>
+              </w:rPr>
+              <w:t xml:space="preserve">A desperate measure.</w:t>
+            </w:r>
+          </w:p>
+        </w:tc>
+      </w:tr>
+    </w:tbl>
+    <w:bookmarkEnd w:id="70"/>
+    <w:bookmarkEnd w:id="71"/>
+    <w:bookmarkStart w:id="72" w:name="advancement"/>
     <w:p>
       <w:pPr>
         <w:pStyle w:val="Heading2"/>
@@ -8319,9 +10057,9 @@
         <w:t xml:space="preserve">After a significant mission, the GM may authorize one relevant skill to advance from Untrained to Trained or from Trained to Specialty, or allow revision of an advantage or complication to reflect events. Skills retain the same three training levels after advancement. Advancement follows mission milestones. Attribute and species changes require a separate agreement. General Services characters advance the same way, but only their starting skill is Expert; a skill raised later tops out at Specialty (+3) unless they are commissioned (see Step 3).</w:t>
       </w:r>
     </w:p>
-    <w:bookmarkEnd w:id="69"/>
-    <w:bookmarkEnd w:id="70"/>
-    <w:bookmarkStart w:id="73" w:name="running-missions"/>
+    <w:bookmarkEnd w:id="72"/>
+    <w:bookmarkEnd w:id="73"/>
+    <w:bookmarkStart w:id="76" w:name="running-missions"/>
     <w:p>
       <w:pPr>
         <w:pStyle w:val="Heading1"/>
@@ -8330,7 +10068,7 @@
         <w:t xml:space="preserve">Running missions</w:t>
       </w:r>
     </w:p>
-    <w:bookmarkStart w:id="71" w:name="mission-seeds"/>
+    <w:bookmarkStart w:id="74" w:name="mission-seeds"/>
     <w:p>
       <w:pPr>
         <w:pStyle w:val="Heading2"/>
@@ -10829,8 +12567,8 @@
         <w:t xml:space="preserve">is in the middle of it.</w:t>
       </w:r>
     </w:p>
-    <w:bookmarkEnd w:id="71"/>
-    <w:bookmarkStart w:id="72" w:name="captains-log"/>
+    <w:bookmarkEnd w:id="74"/>
+    <w:bookmarkStart w:id="75" w:name="captains-log"/>
     <w:p>
       <w:pPr>
         <w:pStyle w:val="Heading2"/>
@@ -10965,9 +12703,9 @@
         <w:t xml:space="preserve">The creator’s GM view keeps the log, applies each crew member’s advancement to the GM’s copy, and saves both with the crew file. Players record an approved advancement on their own sheet under Step 3, so their character still passes the checklist.</w:t>
       </w:r>
     </w:p>
-    <w:bookmarkEnd w:id="72"/>
-    <w:bookmarkEnd w:id="73"/>
-    <w:bookmarkStart w:id="80" w:name="ready-made-crew"/>
+    <w:bookmarkEnd w:id="75"/>
+    <w:bookmarkEnd w:id="76"/>
+    <w:bookmarkStart w:id="83" w:name="ready-made-crew"/>
     <w:p>
       <w:pPr>
         <w:pStyle w:val="Heading1"/>
@@ -11000,7 +12738,7 @@
         <w:t xml:space="preserve">to open one and make it your own.</w:t>
       </w:r>
     </w:p>
-    <w:bookmarkStart w:id="74" w:name="thelan-shvari"/>
+    <w:bookmarkStart w:id="77" w:name="thelan-shvari"/>
     <w:p>
       <w:pPr>
         <w:pStyle w:val="Heading2"/>
@@ -11163,8 +12901,8 @@
         <w:t xml:space="preserve">Took Yeoman Rrinn under their wing when Rrinn first came aboard.</w:t>
       </w:r>
     </w:p>
-    <w:bookmarkEnd w:id="74"/>
-    <w:bookmarkStart w:id="75" w:name="sevek"/>
+    <w:bookmarkEnd w:id="77"/>
+    <w:bookmarkStart w:id="78" w:name="sevek"/>
     <w:p>
       <w:pPr>
         <w:pStyle w:val="Heading2"/>
@@ -11327,8 +13065,8 @@
         <w:t xml:space="preserve">Friendly rivals with Lt. Grath: they argue every engineering theory, and both enjoy it.</w:t>
       </w:r>
     </w:p>
-    <w:bookmarkEnd w:id="75"/>
-    <w:bookmarkStart w:id="76" w:name="dr.-vessik"/>
+    <w:bookmarkEnd w:id="78"/>
+    <w:bookmarkStart w:id="79" w:name="dr.-vessik"/>
     <w:p>
       <w:pPr>
         <w:pStyle w:val="Heading2"/>
@@ -11491,8 +13229,8 @@
         <w:t xml:space="preserve">Pulled Lt. Reyes out of a burning shuttle on a survey mission; Reyes has never let the doctor pay for a drink since.</w:t>
       </w:r>
     </w:p>
-    <w:bookmarkEnd w:id="76"/>
-    <w:bookmarkStart w:id="77" w:name="grath"/>
+    <w:bookmarkEnd w:id="79"/>
+    <w:bookmarkStart w:id="80" w:name="grath"/>
     <w:p>
       <w:pPr>
         <w:pStyle w:val="Heading2"/>
@@ -11655,8 +13393,8 @@
         <w:t xml:space="preserve">Off-duty friends with Commander sh’Vari: a weekly game of Andorian chess in which both of them cheat.</w:t>
       </w:r>
     </w:p>
-    <w:bookmarkEnd w:id="77"/>
-    <w:bookmarkStart w:id="78" w:name="marisol-reyes"/>
+    <w:bookmarkEnd w:id="80"/>
+    <w:bookmarkStart w:id="81" w:name="marisol-reyes"/>
     <w:p>
       <w:pPr>
         <w:pStyle w:val="Heading2"/>
@@ -11819,8 +13557,8 @@
         <w:t xml:space="preserve">Owes Dr. Vessik their life after a shuttle crash, and never lets the doctor forget it.</w:t>
       </w:r>
     </w:p>
-    <w:bookmarkEnd w:id="78"/>
-    <w:bookmarkStart w:id="79" w:name="rrinn"/>
+    <w:bookmarkEnd w:id="81"/>
+    <w:bookmarkStart w:id="82" w:name="rrinn"/>
     <w:p>
       <w:pPr>
         <w:pStyle w:val="Heading2"/>
@@ -11983,9 +13721,9 @@
         <w:t xml:space="preserve">Shares a secret with Lt. Sevek from a mission neither of them talks about.</w:t>
       </w:r>
     </w:p>
-    <w:bookmarkEnd w:id="79"/>
-    <w:bookmarkEnd w:id="80"/>
-    <w:bookmarkStart w:id="81" w:name="threats"/>
+    <w:bookmarkEnd w:id="82"/>
+    <w:bookmarkEnd w:id="83"/>
+    <w:bookmarkStart w:id="84" w:name="threats"/>
     <w:p>
       <w:pPr>
         <w:pStyle w:val="Heading1"/>
@@ -13044,8 +14782,8 @@
         <w:t xml:space="preserve">For a tougher version, add +1 to its targets and one box; for a weaker one, subtract. Starships use the ship tracks above: a Klingon battle cruiser has Shields 3, Hull 4, and Phasers 12 for its gunners.</w:t>
       </w:r>
     </w:p>
-    <w:bookmarkEnd w:id="81"/>
-    <w:bookmarkStart w:id="82" w:name="advantages"/>
+    <w:bookmarkEnd w:id="84"/>
+    <w:bookmarkStart w:id="85" w:name="advantages"/>
     <w:p>
       <w:pPr>
         <w:pStyle w:val="Heading1"/>
@@ -13651,8 +15389,8 @@
         </w:tc>
       </w:tr>
     </w:tbl>
-    <w:bookmarkEnd w:id="82"/>
-    <w:bookmarkStart w:id="96" w:name="species-advantages"/>
+    <w:bookmarkEnd w:id="85"/>
+    <w:bookmarkStart w:id="99" w:name="species-advantages"/>
     <w:p>
       <w:pPr>
         <w:pStyle w:val="Heading1"/>
@@ -13717,7 +15455,7 @@
         <w:t xml:space="preserve">A custom species advantage follows the same pattern: a narrow +2 or an ability with agreed limits, paired with a companion complication that has a clear trigger and a real consequence.</w:t>
       </w:r>
     </w:p>
-    <w:bookmarkStart w:id="83" w:name="human"/>
+    <w:bookmarkStart w:id="86" w:name="human"/>
     <w:p>
       <w:pPr>
         <w:pStyle w:val="Heading2"/>
@@ -13930,8 +15668,8 @@
         </w:tc>
       </w:tr>
     </w:tbl>
-    <w:bookmarkEnd w:id="83"/>
-    <w:bookmarkStart w:id="84" w:name="vulcan"/>
+    <w:bookmarkEnd w:id="86"/>
+    <w:bookmarkStart w:id="87" w:name="vulcan"/>
     <w:p>
       <w:pPr>
         <w:pStyle w:val="Heading2"/>
@@ -14206,8 +15944,8 @@
         </w:tc>
       </w:tr>
     </w:tbl>
-    <w:bookmarkEnd w:id="84"/>
-    <w:bookmarkStart w:id="85" w:name="andorian"/>
+    <w:bookmarkEnd w:id="87"/>
+    <w:bookmarkStart w:id="88" w:name="andorian"/>
     <w:p>
       <w:pPr>
         <w:pStyle w:val="Heading2"/>
@@ -14420,8 +16158,8 @@
         </w:tc>
       </w:tr>
     </w:tbl>
-    <w:bookmarkEnd w:id="85"/>
-    <w:bookmarkStart w:id="86" w:name="tellarite"/>
+    <w:bookmarkEnd w:id="88"/>
+    <w:bookmarkStart w:id="89" w:name="tellarite"/>
     <w:p>
       <w:pPr>
         <w:pStyle w:val="Heading2"/>
@@ -14634,8 +16372,8 @@
         </w:tc>
       </w:tr>
     </w:tbl>
-    <w:bookmarkEnd w:id="86"/>
-    <w:bookmarkStart w:id="87" w:name="aenar"/>
+    <w:bookmarkEnd w:id="89"/>
+    <w:bookmarkStart w:id="90" w:name="aenar"/>
     <w:p>
       <w:pPr>
         <w:pStyle w:val="Heading2"/>
@@ -14848,8 +16586,8 @@
         </w:tc>
       </w:tr>
     </w:tbl>
-    <w:bookmarkEnd w:id="87"/>
-    <w:bookmarkStart w:id="88" w:name="illyrian"/>
+    <w:bookmarkEnd w:id="90"/>
+    <w:bookmarkStart w:id="91" w:name="illyrian"/>
     <w:p>
       <w:pPr>
         <w:pStyle w:val="Heading2"/>
@@ -15062,8 +16800,8 @@
         </w:tc>
       </w:tr>
     </w:tbl>
-    <w:bookmarkEnd w:id="88"/>
-    <w:bookmarkStart w:id="89" w:name="lanthanite"/>
+    <w:bookmarkEnd w:id="91"/>
+    <w:bookmarkStart w:id="92" w:name="lanthanite"/>
     <w:p>
       <w:pPr>
         <w:pStyle w:val="Heading2"/>
@@ -15276,8 +17014,8 @@
         </w:tc>
       </w:tr>
     </w:tbl>
-    <w:bookmarkEnd w:id="89"/>
-    <w:bookmarkStart w:id="90" w:name="caitian"/>
+    <w:bookmarkEnd w:id="92"/>
+    <w:bookmarkStart w:id="93" w:name="caitian"/>
     <w:p>
       <w:pPr>
         <w:pStyle w:val="Heading2"/>
@@ -15490,8 +17228,8 @@
         </w:tc>
       </w:tr>
     </w:tbl>
-    <w:bookmarkEnd w:id="90"/>
-    <w:bookmarkStart w:id="91" w:name="aurelian"/>
+    <w:bookmarkEnd w:id="93"/>
+    <w:bookmarkStart w:id="94" w:name="aurelian"/>
     <w:p>
       <w:pPr>
         <w:pStyle w:val="Heading2"/>
@@ -15704,8 +17442,8 @@
         </w:tc>
       </w:tr>
     </w:tbl>
-    <w:bookmarkEnd w:id="91"/>
-    <w:bookmarkStart w:id="92" w:name="orion"/>
+    <w:bookmarkEnd w:id="94"/>
+    <w:bookmarkStart w:id="95" w:name="orion"/>
     <w:p>
       <w:pPr>
         <w:pStyle w:val="Heading2"/>
@@ -15918,8 +17656,8 @@
         </w:tc>
       </w:tr>
     </w:tbl>
-    <w:bookmarkEnd w:id="92"/>
-    <w:bookmarkStart w:id="93" w:name="denobulan"/>
+    <w:bookmarkEnd w:id="95"/>
+    <w:bookmarkStart w:id="96" w:name="denobulan"/>
     <w:p>
       <w:pPr>
         <w:pStyle w:val="Heading2"/>
@@ -16132,8 +17870,8 @@
         </w:tc>
       </w:tr>
     </w:tbl>
-    <w:bookmarkEnd w:id="93"/>
-    <w:bookmarkStart w:id="94" w:name="trill"/>
+    <w:bookmarkEnd w:id="96"/>
+    <w:bookmarkStart w:id="97" w:name="trill"/>
     <w:p>
       <w:pPr>
         <w:pStyle w:val="Heading2"/>
@@ -16354,8 +18092,8 @@
         </w:tc>
       </w:tr>
     </w:tbl>
-    <w:bookmarkEnd w:id="94"/>
-    <w:bookmarkStart w:id="95" w:name="saurian"/>
+    <w:bookmarkEnd w:id="97"/>
+    <w:bookmarkStart w:id="98" w:name="saurian"/>
     <w:p>
       <w:pPr>
         <w:pStyle w:val="Heading2"/>
@@ -16568,9 +18306,9 @@
         </w:tc>
       </w:tr>
     </w:tbl>
-    <w:bookmarkEnd w:id="95"/>
-    <w:bookmarkEnd w:id="96"/>
-    <w:bookmarkStart w:id="105" w:name="making-your-own"/>
+    <w:bookmarkEnd w:id="98"/>
+    <w:bookmarkEnd w:id="99"/>
+    <w:bookmarkStart w:id="108" w:name="making-your-own"/>
     <w:p>
       <w:pPr>
         <w:pStyle w:val="Heading1"/>
@@ -16603,7 +18341,7 @@
         <w:t xml:space="preserve">option at the end of each list, and its checklist holds a custom choice to the same rules as everything else.</w:t>
       </w:r>
     </w:p>
-    <w:bookmarkStart w:id="97" w:name="a-custom-department"/>
+    <w:bookmarkStart w:id="100" w:name="a-custom-department"/>
     <w:p>
       <w:pPr>
         <w:pStyle w:val="Heading2"/>
@@ -16779,8 +18517,8 @@
         <w:t xml:space="preserve">.</w:t>
       </w:r>
     </w:p>
-    <w:bookmarkEnd w:id="97"/>
-    <w:bookmarkStart w:id="104" w:name="a-custom-species"/>
+    <w:bookmarkEnd w:id="100"/>
+    <w:bookmarkStart w:id="107" w:name="a-custom-species"/>
     <w:p>
       <w:pPr>
         <w:pStyle w:val="Heading2"/>
@@ -16797,7 +18535,7 @@
         <w:t xml:space="preserve">Build it with the GM, one step at a time.</w:t>
       </w:r>
     </w:p>
-    <w:bookmarkStart w:id="98" w:name="the-concept"/>
+    <w:bookmarkStart w:id="101" w:name="the-concept"/>
     <w:p>
       <w:pPr>
         <w:pStyle w:val="Heading3"/>
@@ -16814,8 +18552,8 @@
         <w:t xml:space="preserve">Two or three sentences: where they come from, what sets them apart, and how others see them. It should be something the species in this book don’t already cover.</w:t>
       </w:r>
     </w:p>
-    <w:bookmarkEnd w:id="98"/>
-    <w:bookmarkStart w:id="99" w:name="attribute-adjustments"/>
+    <w:bookmarkEnd w:id="101"/>
+    <w:bookmarkStart w:id="102" w:name="attribute-adjustments"/>
     <w:p>
       <w:pPr>
         <w:pStyle w:val="Heading3"/>
@@ -16861,8 +18599,8 @@
         <w:t xml:space="preserve">: a +2 needs a −2 or two −1s. The adjustments move the attribute’s base (+1 starts it at 11) and raise its starting maximum (13 plus the bonus). Most species change two to four attributes.</w:t>
       </w:r>
     </w:p>
-    <w:bookmarkEnd w:id="99"/>
-    <w:bookmarkStart w:id="100" w:name="core-rules"/>
+    <w:bookmarkEnd w:id="102"/>
+    <w:bookmarkStart w:id="103" w:name="core-rules"/>
     <w:p>
       <w:pPr>
         <w:pStyle w:val="Heading3"/>
@@ -16879,8 +18617,8 @@
         <w:t xml:space="preserve">One to three short rules that always apply: what they can do (see in the dark, resist cold, a free Trained skill) and what it costs (a weakness, a people’s distrust, a hazard they can’t abide). A strength with no drawback is worth more than it looks.</w:t>
       </w:r>
     </w:p>
-    <w:bookmarkEnd w:id="100"/>
-    <w:bookmarkStart w:id="101" w:name="species-advantages-1"/>
+    <w:bookmarkEnd w:id="103"/>
+    <w:bookmarkStart w:id="104" w:name="species-advantages-1"/>
     <w:p>
       <w:pPr>
         <w:pStyle w:val="Heading3"/>
@@ -16935,8 +18673,8 @@
         <w:t xml:space="preserve">: a problem the trait causes, with a clear trigger and a real consequence, which earns a Duty point when it bites, like any complication. A character takes one advantage, general or species, so make them distinct choices.</w:t>
       </w:r>
     </w:p>
-    <w:bookmarkEnd w:id="101"/>
-    <w:bookmarkStart w:id="102" w:name="in-the-creator"/>
+    <w:bookmarkEnd w:id="104"/>
+    <w:bookmarkStart w:id="105" w:name="in-the-creator"/>
     <w:p>
       <w:pPr>
         <w:pStyle w:val="Heading3"/>
@@ -17041,8 +18779,8 @@
         <w:t xml:space="preserve">and enter the advantage and its companion complication.</w:t>
       </w:r>
     </w:p>
-    <w:bookmarkEnd w:id="102"/>
-    <w:bookmarkStart w:id="103" w:name="example"/>
+    <w:bookmarkEnd w:id="105"/>
+    <w:bookmarkStart w:id="106" w:name="example"/>
     <w:p>
       <w:pPr>
         <w:pStyle w:val="Heading3"/>
@@ -17147,10 +18885,10 @@
         <w:t xml:space="preserve">: dry, cramped ships wear on you; when it matters, accept the short temper or the mistake.</w:t>
       </w:r>
     </w:p>
-    <w:bookmarkEnd w:id="103"/>
-    <w:bookmarkEnd w:id="104"/>
-    <w:bookmarkEnd w:id="105"/>
-    <w:bookmarkStart w:id="107" w:name="complications"/>
+    <w:bookmarkEnd w:id="106"/>
+    <w:bookmarkEnd w:id="107"/>
+    <w:bookmarkEnd w:id="108"/>
+    <w:bookmarkStart w:id="110" w:name="complications"/>
     <w:p>
       <w:pPr>
         <w:pStyle w:val="Heading1"/>
@@ -17764,7 +19502,7 @@
         </w:tc>
       </w:tr>
     </w:tbl>
-    <w:bookmarkStart w:id="106" w:name="using-and-revising-traits"/>
+    <w:bookmarkStart w:id="109" w:name="using-and-revising-traits"/>
     <w:p>
       <w:pPr>
         <w:pStyle w:val="Heading2"/>
@@ -17781,9 +19519,9 @@
         <w:t xml:space="preserve">General advantages and complications describe individual crew members and can suit any species when appropriate. A Vulcan might choose Mental Discipline as a general advantage; species advantages are the only traits tied to a species. At a mission milestone, revise a trait when events change the character. Custom advantages follow the same narrow +2 benefit; custom complications need a clear trigger and a meaningful, accepted consequence.</w:t>
       </w:r>
     </w:p>
-    <w:bookmarkEnd w:id="106"/>
-    <w:bookmarkEnd w:id="107"/>
-    <w:bookmarkStart w:id="111" w:name="quick-reference"/>
+    <w:bookmarkEnd w:id="109"/>
+    <w:bookmarkEnd w:id="110"/>
+    <w:bookmarkStart w:id="114" w:name="quick-reference"/>
     <w:p>
       <w:pPr>
         <w:pStyle w:val="Heading1"/>
@@ -17792,7 +19530,7 @@
         <w:t xml:space="preserve">Quick reference</w:t>
       </w:r>
     </w:p>
-    <w:bookmarkStart w:id="108" w:name="will-and-mental-resistance"/>
+    <w:bookmarkStart w:id="111" w:name="will-and-mental-resistance"/>
     <w:p>
       <w:pPr>
         <w:pStyle w:val="Heading2"/>
@@ -17825,8 +19563,8 @@
         <w:t xml:space="preserve">Will protects your resolve; Presence influences others. Leadership and Diplomacy still use Presence. Species adjustments may change your starting Will, but mental advantages apply only to their agreed, narrow circumstances.</w:t>
       </w:r>
     </w:p>
-    <w:bookmarkEnd w:id="108"/>
-    <w:bookmarkStart w:id="109" w:name="at-the-table"/>
+    <w:bookmarkEnd w:id="111"/>
+    <w:bookmarkStart w:id="112" w:name="at-the-table"/>
     <w:p>
       <w:pPr>
         <w:pStyle w:val="Heading2"/>
@@ -17895,8 +19633,8 @@
         <w:t xml:space="preserve">Apply the result and describe what changes.</w:t>
       </w:r>
     </w:p>
-    <w:bookmarkEnd w:id="109"/>
-    <w:bookmarkStart w:id="110" w:name="summary"/>
+    <w:bookmarkEnd w:id="112"/>
+    <w:bookmarkStart w:id="113" w:name="summary"/>
     <w:p>
       <w:pPr>
         <w:pStyle w:val="Heading2"/>
@@ -18139,8 +19877,8 @@
         <w:t xml:space="preserve">start each session with two. Spend one to reroll, reduce an injury by one box, or establish a plausible preparation. Earn one when an accepted complication, including a companion complication, creates a meaningful problem.</w:t>
       </w:r>
     </w:p>
-    <w:bookmarkEnd w:id="110"/>
-    <w:bookmarkEnd w:id="111"/>
+    <w:bookmarkEnd w:id="113"/>
+    <w:bookmarkEnd w:id="114"/>
     <w:sectPr/>
   </w:body>
 </w:document>

</xml_diff>

<commit_message>
Pelion: say it's an unofficial fan game
Co-Authored-By: Claude Opus 5.5 <noreply@anthropic.com>
Claude-Session: https://claude.ai/code/session_015SADCFzhKijkC2foUmXrpC
</commit_message>
<xml_diff>
--- a/uss-pelion/USS_Pelion_Players_Guide.docx
+++ b/uss-pelion/USS_Pelion_Players_Guide.docx
@@ -102,6 +102,27 @@
       </w:pPr>
       <w:r>
         <w:t xml:space="preserve">You are a member of Starfleet aboard USS Pelion, NCC-1750. Explore unfamiliar worlds, investigate strange phenomena, protect your crewmates, and make difficult decisions when orders and circumstances collide. Your training matters, and the crew succeeds by working together.</w:t>
+      </w:r>
+    </w:p>
+    <w:p>
+      <w:pPr>
+        <w:pStyle w:val="BodyText"/>
+      </w:pPr>
+      <w:r>
+        <w:t xml:space="preserve">This is an unofficial fan game inspired by</w:t>
+      </w:r>
+      <w:r>
+        <w:t xml:space="preserve"> </w:t>
+      </w:r>
+      <w:r>
+        <w:rPr>
+          <w:iCs/>
+          <w:i/>
+        </w:rPr>
+        <w:t xml:space="preserve">Star Trek</w:t>
+      </w:r>
+      <w:r>
+        <w:t xml:space="preserve">. It is not affiliated with or endorsed by Paramount or CBS Studios, who own Star Trek.</w:t>
       </w:r>
     </w:p>
     <w:p>

</xml_diff>